<commit_message>
req 3 y 6 documentaicon
</commit_message>
<xml_diff>
--- a/Docs/ISIS1225 - AnalisisReto-TEMPLATE RETO.docx
+++ b/Docs/ISIS1225 - AnalisisReto-TEMPLATE RETO.docx
@@ -9,7 +9,6 @@
         <w:rPr>
           <w:b/>
           <w:bCs/>
-          <w:lang w:val="pt-BR"/>
         </w:rPr>
       </w:pPr>
       <w:r>
@@ -17,57 +16,59 @@
           <w:b/>
           <w:bCs/>
           <w:caps w:val="0"/>
-          <w:lang w:val="pt-BR"/>
         </w:rPr>
         <w:t>ANÁLISIS DEL RETO</w:t>
       </w:r>
     </w:p>
     <w:p>
       <w:pPr>
-        <w:jc w:val="right"/>
-        <w:rPr>
-          <w:rStyle w:val="nfasis"/>
-          <w:lang w:val="pt-BR"/>
-        </w:rPr>
-      </w:pPr>
-      <w:r>
-        <w:rPr>
-          <w:rStyle w:val="nfasis"/>
-          <w:lang w:val="pt-BR"/>
-        </w:rPr>
-        <w:t>Estudiante 1, código 1, email 1</w:t>
+        <w:pStyle w:val="selectable-text"/>
+      </w:pPr>
+      <w:r>
+        <w:rPr>
+          <w:rStyle w:val="selectable-text1"/>
+        </w:rPr>
+        <w:t xml:space="preserve">Juan Andrés Ospina </w:t>
+      </w:r>
+      <w:r>
+        <w:rPr>
+          <w:rStyle w:val="selectable-text1"/>
+        </w:rPr>
+        <w:t>Ramírez</w:t>
+      </w:r>
+      <w:r>
+        <w:rPr>
+          <w:rStyle w:val="selectable-text1"/>
+        </w:rPr>
+        <w:t xml:space="preserve"> - J.ospinar2@uniandes.edu.co - 202614830</w:t>
       </w:r>
     </w:p>
     <w:p>
       <w:pPr>
-        <w:jc w:val="right"/>
-        <w:rPr>
-          <w:rStyle w:val="nfasis"/>
-          <w:lang w:val="pt-BR"/>
-        </w:rPr>
-      </w:pPr>
-      <w:r>
-        <w:rPr>
-          <w:rStyle w:val="nfasis"/>
-          <w:lang w:val="pt-BR"/>
-        </w:rPr>
-        <w:t>Estudiante 2, código 2, email 2</w:t>
+        <w:pStyle w:val="selectable-text"/>
+      </w:pPr>
+      <w:r>
+        <w:rPr>
+          <w:rStyle w:val="selectable-text1"/>
+        </w:rPr>
+        <w:t>José</w:t>
+      </w:r>
+      <w:r>
+        <w:rPr>
+          <w:rStyle w:val="selectable-text1"/>
+        </w:rPr>
+        <w:t xml:space="preserve"> Alexander Santos Cobos - j.santosc2@uniandes.edu.co - 202613656</w:t>
       </w:r>
     </w:p>
     <w:p>
       <w:pPr>
-        <w:jc w:val="right"/>
-        <w:rPr>
-          <w:rStyle w:val="nfasis"/>
-          <w:lang w:val="pt-BR"/>
-        </w:rPr>
-      </w:pPr>
-      <w:r>
-        <w:rPr>
-          <w:rStyle w:val="nfasis"/>
-          <w:lang w:val="pt-BR"/>
-        </w:rPr>
-        <w:t>Estudiante 3, código 3, email 3</w:t>
+        <w:pStyle w:val="selectable-text"/>
+      </w:pPr>
+      <w:r>
+        <w:rPr>
+          <w:rStyle w:val="selectable-text1"/>
+        </w:rPr>
+        <w:t>Juan Esteban Lesmes Chaves - je.lesmesc1@uniandes.edu.co - 202614029</w:t>
       </w:r>
     </w:p>
     <w:p>
@@ -76,14 +77,12 @@
         <w:rPr>
           <w:b/>
           <w:bCs/>
-          <w:lang w:val="es-419"/>
         </w:rPr>
       </w:pPr>
       <w:r>
         <w:rPr>
           <w:b/>
           <w:bCs/>
-          <w:lang w:val="es-419"/>
         </w:rPr>
         <w:t xml:space="preserve">Requerimiento </w:t>
       </w:r>
@@ -91,80 +90,39 @@
         <w:rPr>
           <w:b/>
           <w:bCs/>
-          <w:lang w:val="es-419"/>
-        </w:rPr>
-        <w:t>&lt;&lt;</w:t>
-      </w:r>
-      <w:r>
+        </w:rPr>
+        <w:t>1</w:t>
+      </w:r>
+    </w:p>
+    <w:p>
+      <w:r>
+        <w:t>Plantilla para el documentar y analizar cada uno de los requerimientos.</w:t>
+      </w:r>
+    </w:p>
+    <w:p>
+      <w:pPr>
+        <w:pStyle w:val="Ttulo2"/>
         <w:rPr>
           <w:b/>
           <w:bCs/>
-          <w:lang w:val="es-419"/>
-        </w:rPr>
-        <w:t>n</w:t>
-      </w:r>
+        </w:rPr>
+      </w:pPr>
       <w:r>
         <w:rPr>
           <w:b/>
           <w:bCs/>
-          <w:lang w:val="es-419"/>
-        </w:rPr>
-        <w:t>&gt;&gt;</w:t>
+        </w:rPr>
+        <w:t>Descripción</w:t>
       </w:r>
     </w:p>
     <w:p>
-      <w:pPr>
-        <w:rPr>
-          <w:lang w:val="es-419"/>
-        </w:rPr>
-      </w:pPr>
-      <w:r>
-        <w:rPr>
-          <w:lang w:val="es-419"/>
-        </w:rPr>
-        <w:t>Plantilla para el documentar y analizar cada uno de los requerimientos.</w:t>
-      </w:r>
-    </w:p>
-    <w:p>
-      <w:pPr>
-        <w:pStyle w:val="Ttulo2"/>
-        <w:rPr>
-          <w:b/>
-          <w:bCs/>
-          <w:lang w:val="es-419"/>
-        </w:rPr>
-      </w:pPr>
-      <w:r>
-        <w:rPr>
-          <w:b/>
-          <w:bCs/>
-          <w:lang w:val="es-419"/>
-        </w:rPr>
-        <w:t>Descripción</w:t>
-      </w:r>
-    </w:p>
-    <w:p>
-      <w:pPr>
-        <w:rPr>
-          <w:lang w:val="es-419"/>
-        </w:rPr>
-      </w:pPr>
-      <w:r>
-        <w:rPr>
-          <w:lang w:val="es-419"/>
-        </w:rPr>
+      <w:r>
         <w:t xml:space="preserve">Breve </w:t>
       </w:r>
       <w:r>
-        <w:rPr>
-          <w:lang w:val="es-419"/>
-        </w:rPr>
         <w:t>descripción</w:t>
       </w:r>
       <w:r>
-        <w:rPr>
-          <w:lang w:val="es-419"/>
-        </w:rPr>
         <w:t xml:space="preserve"> de como abordaron la implementación del requerimiento</w:t>
       </w:r>
     </w:p>
@@ -189,14 +147,12 @@
               <w:rPr>
                 <w:b/>
                 <w:bCs/>
-                <w:lang w:val="es-419"/>
               </w:rPr>
             </w:pPr>
             <w:r>
               <w:rPr>
                 <w:b/>
                 <w:bCs/>
-                <w:lang w:val="es-419"/>
               </w:rPr>
               <w:t>E</w:t>
             </w:r>
@@ -204,7 +160,6 @@
               <w:rPr>
                 <w:b/>
                 <w:bCs/>
-                <w:lang w:val="es-419"/>
               </w:rPr>
               <w:t xml:space="preserve">ntrada </w:t>
             </w:r>
@@ -215,21 +170,10 @@
             <w:tcW w:w="6300" w:type="dxa"/>
           </w:tcPr>
           <w:p>
-            <w:pPr>
-              <w:rPr>
-                <w:lang w:val="es-419"/>
-              </w:rPr>
-            </w:pPr>
-            <w:r>
-              <w:rPr>
-                <w:lang w:val="es-419"/>
-              </w:rPr>
+            <w:r>
               <w:t>Parámetros</w:t>
             </w:r>
             <w:r>
-              <w:rPr>
-                <w:lang w:val="es-419"/>
-              </w:rPr>
               <w:t xml:space="preserve"> necesarios para resolver el requerimiento.</w:t>
             </w:r>
           </w:p>
@@ -245,14 +189,12 @@
               <w:rPr>
                 <w:b/>
                 <w:bCs/>
-                <w:lang w:val="es-419"/>
               </w:rPr>
             </w:pPr>
             <w:r>
               <w:rPr>
                 <w:b/>
                 <w:bCs/>
-                <w:lang w:val="es-419"/>
               </w:rPr>
               <w:t>S</w:t>
             </w:r>
@@ -260,7 +202,6 @@
               <w:rPr>
                 <w:b/>
                 <w:bCs/>
-                <w:lang w:val="es-419"/>
               </w:rPr>
               <w:t>alidas</w:t>
             </w:r>
@@ -271,15 +212,7 @@
             <w:tcW w:w="6300" w:type="dxa"/>
           </w:tcPr>
           <w:p>
-            <w:pPr>
-              <w:rPr>
-                <w:lang w:val="es-419"/>
-              </w:rPr>
-            </w:pPr>
-            <w:r>
-              <w:rPr>
-                <w:lang w:val="es-419"/>
-              </w:rPr>
+            <w:r>
               <w:t>Respuesta esperada del algoritmo.</w:t>
             </w:r>
           </w:p>
@@ -295,14 +228,12 @@
               <w:rPr>
                 <w:b/>
                 <w:bCs/>
-                <w:lang w:val="es-419"/>
               </w:rPr>
             </w:pPr>
             <w:r>
               <w:rPr>
                 <w:b/>
                 <w:bCs/>
-                <w:lang w:val="es-419"/>
               </w:rPr>
               <w:t>Implementado (Sí/No)</w:t>
             </w:r>
@@ -313,80 +244,44 @@
             <w:tcW w:w="6300" w:type="dxa"/>
           </w:tcPr>
           <w:p>
-            <w:pPr>
-              <w:rPr>
-                <w:lang w:val="es-419"/>
-              </w:rPr>
-            </w:pPr>
-            <w:r>
-              <w:rPr>
-                <w:lang w:val="es-419"/>
-              </w:rPr>
+            <w:r>
               <w:t xml:space="preserve">Si se </w:t>
             </w:r>
             <w:r>
-              <w:rPr>
-                <w:lang w:val="es-419"/>
-              </w:rPr>
               <w:t>implementó</w:t>
             </w:r>
             <w:r>
-              <w:rPr>
-                <w:lang w:val="es-419"/>
-              </w:rPr>
               <w:t xml:space="preserve"> y quien lo hizo.</w:t>
             </w:r>
           </w:p>
         </w:tc>
       </w:tr>
     </w:tbl>
+    <w:p/>
     <w:p>
       <w:pPr>
-        <w:rPr>
-          <w:lang w:val="es-419"/>
-        </w:rPr>
-      </w:pPr>
+        <w:pStyle w:val="Ttulo2"/>
+        <w:rPr>
+          <w:b/>
+          <w:bCs/>
+        </w:rPr>
+      </w:pPr>
+      <w:r>
+        <w:rPr>
+          <w:b/>
+          <w:bCs/>
+        </w:rPr>
+        <w:t>Análisis de complejidad</w:t>
+      </w:r>
     </w:p>
     <w:p>
-      <w:pPr>
-        <w:pStyle w:val="Ttulo2"/>
-        <w:rPr>
-          <w:b/>
-          <w:bCs/>
-          <w:lang w:val="es-419"/>
-        </w:rPr>
-      </w:pPr>
-      <w:r>
-        <w:rPr>
-          <w:b/>
-          <w:bCs/>
-          <w:lang w:val="es-419"/>
-        </w:rPr>
-        <w:t>Análisis de complejidad</w:t>
-      </w:r>
-    </w:p>
-    <w:p>
-      <w:pPr>
-        <w:rPr>
-          <w:lang w:val="es-419"/>
-        </w:rPr>
-      </w:pPr>
-      <w:r>
-        <w:rPr>
-          <w:lang w:val="es-419"/>
-        </w:rPr>
+      <w:r>
         <w:t>Análisis</w:t>
       </w:r>
       <w:r>
-        <w:rPr>
-          <w:lang w:val="es-419"/>
-        </w:rPr>
         <w:t xml:space="preserve"> de complejidad d</w:t>
       </w:r>
       <w:r>
-        <w:rPr>
-          <w:lang w:val="es-419"/>
-        </w:rPr>
         <w:t>e cada uno de los pasos del algoritmo</w:t>
       </w:r>
     </w:p>
@@ -411,14 +306,12 @@
               <w:rPr>
                 <w:b/>
                 <w:bCs/>
-                <w:lang w:val="es-419"/>
               </w:rPr>
             </w:pPr>
             <w:r>
               <w:rPr>
                 <w:b/>
                 <w:bCs/>
-                <w:lang w:val="es-419"/>
               </w:rPr>
               <w:t>Pasos</w:t>
             </w:r>
@@ -433,14 +326,12 @@
               <w:rPr>
                 <w:b/>
                 <w:bCs/>
-                <w:lang w:val="es-419"/>
               </w:rPr>
             </w:pPr>
             <w:r>
               <w:rPr>
                 <w:b/>
                 <w:bCs/>
-                <w:lang w:val="es-419"/>
               </w:rPr>
               <w:t>Complejidad</w:t>
             </w:r>
@@ -453,15 +344,7 @@
             <w:tcW w:w="5070" w:type="dxa"/>
           </w:tcPr>
           <w:p>
-            <w:pPr>
-              <w:rPr>
-                <w:lang w:val="es-419"/>
-              </w:rPr>
-            </w:pPr>
-            <w:r>
-              <w:rPr>
-                <w:lang w:val="es-419"/>
-              </w:rPr>
+            <w:r>
               <w:t>Paso 1</w:t>
             </w:r>
           </w:p>
@@ -471,15 +354,7 @@
             <w:tcW w:w="4275" w:type="dxa"/>
           </w:tcPr>
           <w:p>
-            <w:pPr>
-              <w:rPr>
-                <w:lang w:val="es-419"/>
-              </w:rPr>
-            </w:pPr>
-            <w:r>
-              <w:rPr>
-                <w:lang w:val="es-419"/>
-              </w:rPr>
+            <w:r>
               <w:t>O(...)</w:t>
             </w:r>
           </w:p>
@@ -491,15 +366,7 @@
             <w:tcW w:w="5070" w:type="dxa"/>
           </w:tcPr>
           <w:p>
-            <w:pPr>
-              <w:rPr>
-                <w:lang w:val="es-419"/>
-              </w:rPr>
-            </w:pPr>
-            <w:r>
-              <w:rPr>
-                <w:lang w:val="es-419"/>
-              </w:rPr>
+            <w:r>
               <w:t xml:space="preserve">Paso 2 </w:t>
             </w:r>
           </w:p>
@@ -509,15 +376,7 @@
             <w:tcW w:w="4275" w:type="dxa"/>
           </w:tcPr>
           <w:p>
-            <w:pPr>
-              <w:rPr>
-                <w:lang w:val="es-419"/>
-              </w:rPr>
-            </w:pPr>
-            <w:r>
-              <w:rPr>
-                <w:lang w:val="es-419"/>
-              </w:rPr>
+            <w:r>
               <w:t>O(...)</w:t>
             </w:r>
           </w:p>
@@ -529,15 +388,7 @@
             <w:tcW w:w="5070" w:type="dxa"/>
           </w:tcPr>
           <w:p>
-            <w:pPr>
-              <w:rPr>
-                <w:lang w:val="es-419"/>
-              </w:rPr>
-            </w:pPr>
-            <w:r>
-              <w:rPr>
-                <w:lang w:val="es-419"/>
-              </w:rPr>
+            <w:r>
               <w:t>Paso ….</w:t>
             </w:r>
           </w:p>
@@ -547,15 +398,7 @@
             <w:tcW w:w="4275" w:type="dxa"/>
           </w:tcPr>
           <w:p>
-            <w:pPr>
-              <w:rPr>
-                <w:lang w:val="es-419"/>
-              </w:rPr>
-            </w:pPr>
-            <w:r>
-              <w:rPr>
-                <w:lang w:val="es-419"/>
-              </w:rPr>
+            <w:r>
               <w:t>O(...)</w:t>
             </w:r>
           </w:p>
@@ -573,7 +416,6 @@
                 <w:bCs/>
                 <w:i/>
                 <w:iCs/>
-                <w:lang w:val="es-419"/>
               </w:rPr>
             </w:pPr>
             <w:r>
@@ -582,7 +424,6 @@
                 <w:bCs/>
                 <w:i/>
                 <w:iCs/>
-                <w:lang w:val="es-419"/>
               </w:rPr>
               <w:t>TOTAL</w:t>
             </w:r>
@@ -599,7 +440,6 @@
                 <w:bCs/>
                 <w:i/>
                 <w:iCs/>
-                <w:lang w:val="es-419"/>
               </w:rPr>
             </w:pPr>
             <w:r>
@@ -608,7 +448,6 @@
                 <w:bCs/>
                 <w:i/>
                 <w:iCs/>
-                <w:lang w:val="es-419"/>
               </w:rPr>
               <w:t>O(...)</w:t>
             </w:r>
@@ -620,7 +459,6 @@
       <w:pPr>
         <w:rPr>
           <w:rFonts w:ascii="Dax-Regular" w:hAnsi="Dax-Regular"/>
-          <w:lang w:val="es-419"/>
         </w:rPr>
       </w:pPr>
     </w:p>
@@ -630,28 +468,18 @@
         <w:rPr>
           <w:b/>
           <w:bCs/>
-          <w:lang w:val="es-419"/>
         </w:rPr>
       </w:pPr>
       <w:r>
         <w:rPr>
           <w:b/>
           <w:bCs/>
-          <w:lang w:val="es-419"/>
         </w:rPr>
         <w:t>Análisis</w:t>
       </w:r>
     </w:p>
     <w:p>
-      <w:pPr>
-        <w:rPr>
-          <w:lang w:val="es-419"/>
-        </w:rPr>
-      </w:pPr>
-      <w:r>
-        <w:rPr>
-          <w:lang w:val="es-419"/>
-        </w:rPr>
+      <w:r>
         <w:t>Análisis de resultados de la implementación, tener cuenta las pruebas realizadas y el analisis de complejidad.</w:t>
       </w:r>
     </w:p>
@@ -661,14 +489,12 @@
         <w:rPr>
           <w:b/>
           <w:bCs/>
-          <w:lang w:val="es-419"/>
         </w:rPr>
       </w:pPr>
       <w:r>
         <w:rPr>
           <w:b/>
           <w:bCs/>
-          <w:lang w:val="es-419"/>
         </w:rPr>
         <w:t xml:space="preserve">Requerimiento </w:t>
       </w:r>
@@ -676,17 +502,14 @@
         <w:rPr>
           <w:b/>
           <w:bCs/>
-          <w:lang w:val="es-419"/>
-        </w:rPr>
-        <w:t>Ejemplo</w:t>
+        </w:rPr>
+        <w:t>2</w:t>
       </w:r>
     </w:p>
     <w:p>
-      <w:pPr>
-        <w:rPr>
-          <w:lang w:val="es-419"/>
-        </w:rPr>
-      </w:pPr>
+      <w:r>
+        <w:t>Plantilla para el documentar y analizar cada uno de los requerimientos.</w:t>
+      </w:r>
     </w:p>
     <w:p>
       <w:pPr>
@@ -694,129 +517,19 @@
         <w:rPr>
           <w:b/>
           <w:bCs/>
-          <w:lang w:val="es-419"/>
         </w:rPr>
       </w:pPr>
       <w:r>
         <w:rPr>
           <w:b/>
           <w:bCs/>
-          <w:lang w:val="es-419"/>
-        </w:rPr>
-        <w:lastRenderedPageBreak/>
+        </w:rPr>
         <w:t>Descripción</w:t>
       </w:r>
     </w:p>
     <w:p>
-      <w:pPr>
-        <w:ind w:left="1440" w:hanging="1440"/>
-        <w:jc w:val="center"/>
-        <w:rPr>
-          <w:lang w:val="es-419"/>
-        </w:rPr>
-      </w:pPr>
-      <w:r>
-        <w:rPr>
-          <w:noProof/>
-          <w:lang w:val="es-419"/>
-        </w:rPr>
-        <w:drawing>
-          <wp:inline distT="0" distB="0" distL="0" distR="0" wp14:anchorId="35ECC59E" wp14:editId="0A0A9058">
-            <wp:extent cx="3547872" cy="1385413"/>
-            <wp:effectExtent l="0" t="0" r="0" b="5715"/>
-            <wp:docPr id="1" name="Picture 1"/>
-            <wp:cNvGraphicFramePr>
-              <a:graphicFrameLocks xmlns:a="http://schemas.openxmlformats.org/drawingml/2006/main" noChangeAspect="1"/>
-            </wp:cNvGraphicFramePr>
-            <a:graphic xmlns:a="http://schemas.openxmlformats.org/drawingml/2006/main">
-              <a:graphicData uri="http://schemas.openxmlformats.org/drawingml/2006/picture">
-                <pic:pic xmlns:pic="http://schemas.openxmlformats.org/drawingml/2006/picture">
-                  <pic:nvPicPr>
-                    <pic:cNvPr id="1" name=""/>
-                    <pic:cNvPicPr/>
-                  </pic:nvPicPr>
-                  <pic:blipFill>
-                    <a:blip r:embed="rId11"/>
-                    <a:stretch>
-                      <a:fillRect/>
-                    </a:stretch>
-                  </pic:blipFill>
-                  <pic:spPr>
-                    <a:xfrm>
-                      <a:off x="0" y="0"/>
-                      <a:ext cx="3585430" cy="1400079"/>
-                    </a:xfrm>
-                    <a:prstGeom prst="rect">
-                      <a:avLst/>
-                    </a:prstGeom>
-                  </pic:spPr>
-                </pic:pic>
-              </a:graphicData>
-            </a:graphic>
-          </wp:inline>
-        </w:drawing>
-      </w:r>
-    </w:p>
-    <w:p>
-      <w:pPr>
-        <w:spacing w:line="276" w:lineRule="auto"/>
-        <w:rPr>
-          <w:lang w:val="es-419"/>
-        </w:rPr>
-      </w:pPr>
-      <w:r>
-        <w:rPr>
-          <w:lang w:val="es-419"/>
-        </w:rPr>
-        <w:t>Este requerimiento se encarga de retornar un dato de una lista dado su ID. Lo primero que hace es verificar si el elemento existe. Dado el caso que exista</w:t>
-      </w:r>
-      <w:r>
-        <w:rPr>
-          <w:lang w:val="es-419"/>
-        </w:rPr>
-        <w:t>, retorna su posición,</w:t>
-      </w:r>
-      <w:r>
-        <w:rPr>
-          <w:lang w:val="es-419"/>
-        </w:rPr>
-        <w:t xml:space="preserve"> lo busca en la lista y lo retorna</w:t>
-      </w:r>
-      <w:r>
-        <w:rPr>
-          <w:lang w:val="es-419"/>
-        </w:rPr>
-        <w:t>.</w:t>
-      </w:r>
-      <w:r>
-        <w:rPr>
-          <w:lang w:val="es-419"/>
-        </w:rPr>
-        <w:t xml:space="preserve"> </w:t>
-      </w:r>
-      <w:r>
-        <w:rPr>
-          <w:lang w:val="es-419"/>
-        </w:rPr>
-        <w:t>D</w:t>
-      </w:r>
-      <w:r>
-        <w:rPr>
-          <w:lang w:val="es-419"/>
-        </w:rPr>
-        <w:t>e lo contrario</w:t>
-      </w:r>
-      <w:r>
-        <w:rPr>
-          <w:lang w:val="es-419"/>
-        </w:rPr>
-        <w:t>,</w:t>
-      </w:r>
-      <w:r>
-        <w:rPr>
-          <w:lang w:val="es-419"/>
-        </w:rPr>
-        <w:t xml:space="preserve"> retorna None.</w:t>
+      <w:r>
+        <w:t>Breve descripción de como abordaron la implementación del requerimiento</w:t>
       </w:r>
     </w:p>
     <w:tbl>
@@ -840,14 +553,12 @@
               <w:rPr>
                 <w:b/>
                 <w:bCs/>
-                <w:lang w:val="es-419"/>
               </w:rPr>
             </w:pPr>
             <w:r>
               <w:rPr>
                 <w:b/>
                 <w:bCs/>
-                <w:lang w:val="es-419"/>
               </w:rPr>
               <w:t xml:space="preserve">Entrada </w:t>
             </w:r>
@@ -858,22 +569,8 @@
             <w:tcW w:w="6300" w:type="dxa"/>
           </w:tcPr>
           <w:p>
-            <w:pPr>
-              <w:rPr>
-                <w:lang w:val="es-419"/>
-              </w:rPr>
-            </w:pPr>
-            <w:r>
-              <w:rPr>
-                <w:lang w:val="es-419"/>
-              </w:rPr>
-              <w:t>Estructuras de datos del modelo</w:t>
-            </w:r>
-            <w:r>
-              <w:rPr>
-                <w:lang w:val="es-419"/>
-              </w:rPr>
-              <w:t>, ID.</w:t>
+            <w:r>
+              <w:t>Parámetros necesarios para resolver el requerimiento.</w:t>
             </w:r>
           </w:p>
         </w:tc>
@@ -888,14 +585,12 @@
               <w:rPr>
                 <w:b/>
                 <w:bCs/>
-                <w:lang w:val="es-419"/>
               </w:rPr>
             </w:pPr>
             <w:r>
               <w:rPr>
                 <w:b/>
                 <w:bCs/>
-                <w:lang w:val="es-419"/>
               </w:rPr>
               <w:t>Salidas</w:t>
             </w:r>
@@ -906,16 +601,8 @@
             <w:tcW w:w="6300" w:type="dxa"/>
           </w:tcPr>
           <w:p>
-            <w:pPr>
-              <w:rPr>
-                <w:lang w:val="es-419"/>
-              </w:rPr>
-            </w:pPr>
-            <w:r>
-              <w:rPr>
-                <w:lang w:val="es-419"/>
-              </w:rPr>
-              <w:t>El elemento con el ID dado, si no existe se retorna None</w:t>
+            <w:r>
+              <w:t>Respuesta esperada del algoritmo.</w:t>
             </w:r>
           </w:p>
         </w:tc>
@@ -930,15 +617,14 @@
               <w:rPr>
                 <w:b/>
                 <w:bCs/>
-                <w:lang w:val="es-419"/>
               </w:rPr>
             </w:pPr>
             <w:r>
               <w:rPr>
                 <w:b/>
                 <w:bCs/>
-                <w:lang w:val="es-419"/>
-              </w:rPr>
+              </w:rPr>
+              <w:lastRenderedPageBreak/>
               <w:t>Implementado (Sí/No)</w:t>
             </w:r>
           </w:p>
@@ -948,68 +634,32 @@
             <w:tcW w:w="6300" w:type="dxa"/>
           </w:tcPr>
           <w:p>
-            <w:pPr>
-              <w:rPr>
-                <w:lang w:val="es-419"/>
-              </w:rPr>
-            </w:pPr>
-            <w:r>
-              <w:rPr>
-                <w:lang w:val="es-419"/>
-              </w:rPr>
-              <w:t>Si</w:t>
-            </w:r>
-            <w:r>
-              <w:rPr>
-                <w:lang w:val="es-419"/>
-              </w:rPr>
-              <w:t xml:space="preserve">. Implementado por Juan </w:t>
-            </w:r>
-            <w:r>
-              <w:rPr>
-                <w:lang w:val="es-419"/>
-              </w:rPr>
-              <w:t>Andrés Ariza</w:t>
+            <w:r>
+              <w:t>Si se implementó y quien lo hizo.</w:t>
             </w:r>
           </w:p>
         </w:tc>
       </w:tr>
     </w:tbl>
+    <w:p/>
     <w:p>
       <w:pPr>
-        <w:rPr>
-          <w:lang w:val="es-419"/>
-        </w:rPr>
-      </w:pPr>
+        <w:pStyle w:val="Ttulo2"/>
+        <w:rPr>
+          <w:b/>
+          <w:bCs/>
+        </w:rPr>
+      </w:pPr>
+      <w:r>
+        <w:rPr>
+          <w:b/>
+          <w:bCs/>
+        </w:rPr>
+        <w:t>Análisis de complejidad</w:t>
+      </w:r>
     </w:p>
     <w:p>
-      <w:pPr>
-        <w:pStyle w:val="Ttulo2"/>
-        <w:rPr>
-          <w:b/>
-          <w:bCs/>
-          <w:lang w:val="es-419"/>
-        </w:rPr>
-      </w:pPr>
-      <w:r>
-        <w:rPr>
-          <w:b/>
-          <w:bCs/>
-          <w:lang w:val="es-419"/>
-        </w:rPr>
-        <w:t>Análisis de complejidad</w:t>
-      </w:r>
-    </w:p>
-    <w:p>
-      <w:pPr>
-        <w:rPr>
-          <w:lang w:val="es-419"/>
-        </w:rPr>
-      </w:pPr>
-      <w:r>
-        <w:rPr>
-          <w:lang w:val="es-419"/>
-        </w:rPr>
+      <w:r>
         <w:t>Análisis de complejidad de cada uno de los pasos del algoritmo</w:t>
       </w:r>
     </w:p>
@@ -1034,14 +684,12 @@
               <w:rPr>
                 <w:b/>
                 <w:bCs/>
-                <w:lang w:val="es-419"/>
               </w:rPr>
             </w:pPr>
             <w:r>
               <w:rPr>
                 <w:b/>
                 <w:bCs/>
-                <w:lang w:val="es-419"/>
               </w:rPr>
               <w:t>Pasos</w:t>
             </w:r>
@@ -1056,14 +704,12 @@
               <w:rPr>
                 <w:b/>
                 <w:bCs/>
-                <w:lang w:val="es-419"/>
               </w:rPr>
             </w:pPr>
             <w:r>
               <w:rPr>
                 <w:b/>
                 <w:bCs/>
-                <w:lang w:val="es-419"/>
               </w:rPr>
               <w:t>Complejidad</w:t>
             </w:r>
@@ -1076,16 +722,8 @@
             <w:tcW w:w="5070" w:type="dxa"/>
           </w:tcPr>
           <w:p>
-            <w:pPr>
-              <w:rPr>
-                <w:lang w:val="es-419"/>
-              </w:rPr>
-            </w:pPr>
-            <w:r>
-              <w:rPr>
-                <w:lang w:val="es-419"/>
-              </w:rPr>
-              <w:t>Buscar si el elemento existe (isPresent)</w:t>
+            <w:r>
+              <w:t>Paso 1</w:t>
             </w:r>
           </w:p>
         </w:tc>
@@ -1094,28 +732,8 @@
             <w:tcW w:w="4275" w:type="dxa"/>
           </w:tcPr>
           <w:p>
-            <w:pPr>
-              <w:rPr>
-                <w:lang w:val="es-419"/>
-              </w:rPr>
-            </w:pPr>
-            <w:r>
-              <w:rPr>
-                <w:lang w:val="es-419"/>
-              </w:rPr>
-              <w:t>O(</w:t>
-            </w:r>
-            <w:r>
-              <w:rPr>
-                <w:lang w:val="es-419"/>
-              </w:rPr>
-              <w:t>n</w:t>
-            </w:r>
-            <w:r>
-              <w:rPr>
-                <w:lang w:val="es-419"/>
-              </w:rPr>
-              <w:t>)</w:t>
+            <w:r>
+              <w:t>O(...)</w:t>
             </w:r>
           </w:p>
         </w:tc>
@@ -1126,22 +744,8 @@
             <w:tcW w:w="5070" w:type="dxa"/>
           </w:tcPr>
           <w:p>
-            <w:pPr>
-              <w:rPr>
-                <w:lang w:val="es-419"/>
-              </w:rPr>
-            </w:pPr>
-            <w:r>
-              <w:rPr>
-                <w:lang w:val="es-419"/>
-              </w:rPr>
-              <w:t>Obtener el elemento (getElement)</w:t>
-            </w:r>
-            <w:r>
-              <w:rPr>
-                <w:lang w:val="es-419"/>
-              </w:rPr>
-              <w:t xml:space="preserve"> </w:t>
+            <w:r>
+              <w:t xml:space="preserve">Paso 2 </w:t>
             </w:r>
           </w:p>
         </w:tc>
@@ -1150,28 +754,8 @@
             <w:tcW w:w="4275" w:type="dxa"/>
           </w:tcPr>
           <w:p>
-            <w:pPr>
-              <w:rPr>
-                <w:lang w:val="es-419"/>
-              </w:rPr>
-            </w:pPr>
-            <w:r>
-              <w:rPr>
-                <w:lang w:val="es-419"/>
-              </w:rPr>
-              <w:t>O(</w:t>
-            </w:r>
-            <w:r>
-              <w:rPr>
-                <w:lang w:val="es-419"/>
-              </w:rPr>
-              <w:t>1</w:t>
-            </w:r>
-            <w:r>
-              <w:rPr>
-                <w:lang w:val="es-419"/>
-              </w:rPr>
-              <w:t>)</w:t>
+            <w:r>
+              <w:t>O(...)</w:t>
             </w:r>
           </w:p>
         </w:tc>
@@ -1182,13 +766,34 @@
             <w:tcW w:w="5070" w:type="dxa"/>
           </w:tcPr>
           <w:p>
+            <w:r>
+              <w:t>Paso ….</w:t>
+            </w:r>
+          </w:p>
+        </w:tc>
+        <w:tc>
+          <w:tcPr>
+            <w:tcW w:w="4275" w:type="dxa"/>
+          </w:tcPr>
+          <w:p>
+            <w:r>
+              <w:t>O(...)</w:t>
+            </w:r>
+          </w:p>
+        </w:tc>
+      </w:tr>
+      <w:tr>
+        <w:tc>
+          <w:tcPr>
+            <w:tcW w:w="5070" w:type="dxa"/>
+          </w:tcPr>
+          <w:p>
             <w:pPr>
               <w:rPr>
                 <w:b/>
                 <w:bCs/>
                 <w:i/>
                 <w:iCs/>
-                <w:lang w:val="es-419"/>
               </w:rPr>
             </w:pPr>
             <w:r>
@@ -1197,7 +802,6 @@
                 <w:bCs/>
                 <w:i/>
                 <w:iCs/>
-                <w:lang w:val="es-419"/>
               </w:rPr>
               <w:t>TOTAL</w:t>
             </w:r>
@@ -1214,7 +818,6 @@
                 <w:bCs/>
                 <w:i/>
                 <w:iCs/>
-                <w:lang w:val="es-419"/>
               </w:rPr>
             </w:pPr>
             <w:r>
@@ -1223,29 +826,8 @@
                 <w:bCs/>
                 <w:i/>
                 <w:iCs/>
-                <w:lang w:val="es-419"/>
-              </w:rPr>
-              <w:t>O(</w:t>
-            </w:r>
-            <w:r>
-              <w:rPr>
-                <w:b/>
-                <w:bCs/>
-                <w:i/>
-                <w:iCs/>
-                <w:lang w:val="es-419"/>
-              </w:rPr>
-              <w:t>n</w:t>
-            </w:r>
-            <w:r>
-              <w:rPr>
-                <w:b/>
-                <w:bCs/>
-                <w:i/>
-                <w:iCs/>
-                <w:lang w:val="es-419"/>
-              </w:rPr>
-              <w:t>)</w:t>
+              </w:rPr>
+              <w:t>O(...)</w:t>
             </w:r>
           </w:p>
         </w:tc>
@@ -1255,7 +837,6 @@
       <w:pPr>
         <w:rPr>
           <w:rFonts w:ascii="Dax-Regular" w:hAnsi="Dax-Regular"/>
-          <w:lang w:val="es-419"/>
         </w:rPr>
       </w:pPr>
     </w:p>
@@ -1265,175 +846,1982 @@
         <w:rPr>
           <w:b/>
           <w:bCs/>
-          <w:lang w:val="es-419"/>
         </w:rPr>
       </w:pPr>
       <w:r>
         <w:rPr>
           <w:b/>
           <w:bCs/>
-          <w:lang w:val="es-419"/>
         </w:rPr>
         <w:t>Análisis</w:t>
       </w:r>
     </w:p>
     <w:p>
-      <w:pPr>
-        <w:jc w:val="both"/>
-        <w:rPr>
-          <w:lang w:val="es-419"/>
-        </w:rPr>
-      </w:pPr>
-      <w:r>
-        <w:rPr>
-          <w:lang w:val="es-419"/>
-        </w:rPr>
-        <w:t xml:space="preserve">A pesar </w:t>
-      </w:r>
-      <w:r>
-        <w:rPr>
-          <w:lang w:val="es-419"/>
-        </w:rPr>
-        <w:t>de que</w:t>
-      </w:r>
-      <w:r>
-        <w:rPr>
-          <w:lang w:val="es-419"/>
-        </w:rPr>
-        <w:t xml:space="preserve"> </w:t>
-      </w:r>
-      <w:r>
-        <w:rPr>
-          <w:lang w:val="es-419"/>
-        </w:rPr>
-        <w:t xml:space="preserve">obtener un elemento en </w:t>
-      </w:r>
-      <w:r>
-        <w:rPr>
-          <w:lang w:val="es-419"/>
-        </w:rPr>
-        <w:t xml:space="preserve">un </w:t>
-      </w:r>
-      <w:r>
-        <w:rPr>
-          <w:i/>
-          <w:iCs/>
-          <w:lang w:val="es-419"/>
-        </w:rPr>
-        <w:t>ArrayList</w:t>
-      </w:r>
-      <w:r>
-        <w:rPr>
-          <w:i/>
-          <w:iCs/>
-          <w:lang w:val="es-419"/>
-        </w:rPr>
-        <w:t>,</w:t>
-      </w:r>
-      <w:r>
-        <w:rPr>
-          <w:i/>
-          <w:iCs/>
-          <w:lang w:val="es-419"/>
-        </w:rPr>
-        <w:t xml:space="preserve"> </w:t>
-      </w:r>
-      <w:r>
-        <w:rPr>
-          <w:lang w:val="es-419"/>
-        </w:rPr>
-        <w:t>dada su posición</w:t>
-      </w:r>
-      <w:r>
-        <w:rPr>
-          <w:lang w:val="es-419"/>
-        </w:rPr>
-        <w:t>,</w:t>
-      </w:r>
-      <w:r>
-        <w:rPr>
-          <w:lang w:val="es-419"/>
-        </w:rPr>
-        <w:t xml:space="preserve"> tiene complejidad constante</w:t>
-      </w:r>
-      <w:r>
-        <w:rPr>
-          <w:lang w:val="es-419"/>
-        </w:rPr>
-        <w:t xml:space="preserve">, </w:t>
-      </w:r>
-      <w:r>
-        <w:rPr>
-          <w:lang w:val="es-419"/>
-        </w:rPr>
-        <w:t xml:space="preserve">la </w:t>
-      </w:r>
-      <w:r>
-        <w:rPr>
-          <w:lang w:val="es-419"/>
-        </w:rPr>
-        <w:t>implementación de este requerimiento tiene un orden lineal O(n).</w:t>
-      </w:r>
-      <w:r>
-        <w:rPr>
-          <w:lang w:val="es-419"/>
-        </w:rPr>
-        <w:t xml:space="preserve"> Esto debido a que</w:t>
-      </w:r>
-      <w:r>
-        <w:rPr>
-          <w:lang w:val="es-419"/>
-        </w:rPr>
-        <w:t>,</w:t>
-      </w:r>
-      <w:r>
-        <w:rPr>
-          <w:lang w:val="es-419"/>
-        </w:rPr>
-        <w:t xml:space="preserve"> </w:t>
-      </w:r>
-      <w:r>
-        <w:rPr>
-          <w:lang w:val="es-419"/>
-        </w:rPr>
-        <w:t xml:space="preserve">lo primero que se hace es verificar si el elemento hace parte de la lista. </w:t>
-      </w:r>
-      <w:r>
-        <w:rPr>
-          <w:lang w:val="es-419"/>
-        </w:rPr>
-        <w:t xml:space="preserve">Específicamente, </w:t>
-      </w:r>
-      <w:r>
-        <w:rPr>
-          <w:lang w:val="es-419"/>
-        </w:rPr>
-        <w:t xml:space="preserve">a la hora de buscar un elemento en una lista, en el peor de los casos </w:t>
-      </w:r>
-      <w:r>
-        <w:rPr>
-          <w:lang w:val="es-419"/>
-        </w:rPr>
-        <w:t>es necesario recorrer toda la lista</w:t>
-      </w:r>
-      <w:r>
-        <w:rPr>
-          <w:lang w:val="es-419"/>
-        </w:rPr>
-        <w:t>, es decir, complejidad lineal</w:t>
-      </w:r>
-      <w:r>
-        <w:rPr>
-          <w:lang w:val="es-419"/>
-        </w:rPr>
-        <w:t xml:space="preserve">. </w:t>
+      <w:r>
+        <w:t>Análisis de resultados de la implementación, tener cuenta las pruebas realizadas y el analisis de complejidad.</w:t>
+      </w:r>
+    </w:p>
+    <w:p>
+      <w:pPr>
+        <w:pStyle w:val="Ttulo1"/>
+        <w:rPr>
+          <w:b/>
+          <w:bCs/>
+        </w:rPr>
+      </w:pPr>
+      <w:r>
+        <w:rPr>
+          <w:b/>
+          <w:bCs/>
+        </w:rPr>
+        <w:lastRenderedPageBreak/>
+        <w:t xml:space="preserve">Requerimiento </w:t>
+      </w:r>
+      <w:r>
+        <w:rPr>
+          <w:b/>
+          <w:bCs/>
+        </w:rPr>
+        <w:t>3</w:t>
+      </w:r>
+    </w:p>
+    <w:p>
+      <w:r>
+        <w:drawing>
+          <wp:inline distT="0" distB="0" distL="0" distR="0" wp14:anchorId="32E42CF1" wp14:editId="4B51FDC5">
+            <wp:extent cx="5943600" cy="5572760"/>
+            <wp:effectExtent l="0" t="0" r="0" b="8890"/>
+            <wp:docPr id="1021929889" name="Imagen 1"/>
+            <wp:cNvGraphicFramePr>
+              <a:graphicFrameLocks xmlns:a="http://schemas.openxmlformats.org/drawingml/2006/main" noChangeAspect="1"/>
+            </wp:cNvGraphicFramePr>
+            <a:graphic xmlns:a="http://schemas.openxmlformats.org/drawingml/2006/main">
+              <a:graphicData uri="http://schemas.openxmlformats.org/drawingml/2006/picture">
+                <pic:pic xmlns:pic="http://schemas.openxmlformats.org/drawingml/2006/picture">
+                  <pic:nvPicPr>
+                    <pic:cNvPr id="1021929889" name=""/>
+                    <pic:cNvPicPr/>
+                  </pic:nvPicPr>
+                  <pic:blipFill>
+                    <a:blip r:embed="rId11"/>
+                    <a:stretch>
+                      <a:fillRect/>
+                    </a:stretch>
+                  </pic:blipFill>
+                  <pic:spPr>
+                    <a:xfrm>
+                      <a:off x="0" y="0"/>
+                      <a:ext cx="5943600" cy="5572760"/>
+                    </a:xfrm>
+                    <a:prstGeom prst="rect">
+                      <a:avLst/>
+                    </a:prstGeom>
+                  </pic:spPr>
+                </pic:pic>
+              </a:graphicData>
+            </a:graphic>
+          </wp:inline>
+        </w:drawing>
+      </w:r>
+    </w:p>
+    <w:p>
+      <w:r>
+        <w:lastRenderedPageBreak/>
+        <w:drawing>
+          <wp:inline distT="0" distB="0" distL="0" distR="0" wp14:anchorId="015BF759" wp14:editId="22BBA569">
+            <wp:extent cx="5943600" cy="2989580"/>
+            <wp:effectExtent l="0" t="0" r="0" b="1270"/>
+            <wp:docPr id="60643227" name="Imagen 1"/>
+            <wp:cNvGraphicFramePr>
+              <a:graphicFrameLocks xmlns:a="http://schemas.openxmlformats.org/drawingml/2006/main" noChangeAspect="1"/>
+            </wp:cNvGraphicFramePr>
+            <a:graphic xmlns:a="http://schemas.openxmlformats.org/drawingml/2006/main">
+              <a:graphicData uri="http://schemas.openxmlformats.org/drawingml/2006/picture">
+                <pic:pic xmlns:pic="http://schemas.openxmlformats.org/drawingml/2006/picture">
+                  <pic:nvPicPr>
+                    <pic:cNvPr id="60643227" name=""/>
+                    <pic:cNvPicPr/>
+                  </pic:nvPicPr>
+                  <pic:blipFill>
+                    <a:blip r:embed="rId12"/>
+                    <a:stretch>
+                      <a:fillRect/>
+                    </a:stretch>
+                  </pic:blipFill>
+                  <pic:spPr>
+                    <a:xfrm>
+                      <a:off x="0" y="0"/>
+                      <a:ext cx="5943600" cy="2989580"/>
+                    </a:xfrm>
+                    <a:prstGeom prst="rect">
+                      <a:avLst/>
+                    </a:prstGeom>
+                  </pic:spPr>
+                </pic:pic>
+              </a:graphicData>
+            </a:graphic>
+          </wp:inline>
+        </w:drawing>
+      </w:r>
+    </w:p>
+    <w:p>
+      <w:pPr>
+        <w:pStyle w:val="Ttulo2"/>
+        <w:rPr>
+          <w:b/>
+          <w:bCs/>
+        </w:rPr>
+      </w:pPr>
+      <w:r>
+        <w:rPr>
+          <w:b/>
+          <w:bCs/>
+        </w:rPr>
+        <w:t>Descripción</w:t>
+      </w:r>
+    </w:p>
+    <w:p>
+      <w:pPr>
+        <w:pStyle w:val="Ttulo2"/>
+        <w:rPr>
+          <w:rFonts w:asciiTheme="minorHAnsi" w:eastAsiaTheme="minorEastAsia" w:hAnsiTheme="minorHAnsi" w:cstheme="minorBidi"/>
+          <w:color w:val="auto"/>
+          <w:sz w:val="22"/>
+          <w:szCs w:val="22"/>
+        </w:rPr>
+      </w:pPr>
+      <w:r>
+        <w:rPr>
+          <w:rFonts w:asciiTheme="minorHAnsi" w:eastAsiaTheme="minorEastAsia" w:hAnsiTheme="minorHAnsi" w:cstheme="minorBidi"/>
+          <w:color w:val="auto"/>
+          <w:sz w:val="22"/>
+          <w:szCs w:val="22"/>
+        </w:rPr>
+        <w:t>Se implementó un algoritmo que filtra los pedidos según una fecha específica y un rango de montos. Luego, ordena los resultados por monto y aporte comercial, mostrando los primeros</w:t>
+      </w:r>
+      <w:r>
+        <w:rPr>
+          <w:rFonts w:asciiTheme="minorHAnsi" w:eastAsiaTheme="minorEastAsia" w:hAnsiTheme="minorHAnsi" w:cstheme="minorBidi"/>
+          <w:color w:val="auto"/>
+          <w:sz w:val="22"/>
+          <w:szCs w:val="22"/>
+        </w:rPr>
+        <w:t xml:space="preserve"> 10 </w:t>
+      </w:r>
+      <w:r>
+        <w:rPr>
+          <w:rFonts w:asciiTheme="minorHAnsi" w:eastAsiaTheme="minorEastAsia" w:hAnsiTheme="minorHAnsi" w:cstheme="minorBidi"/>
+          <w:color w:val="auto"/>
+          <w:sz w:val="22"/>
+          <w:szCs w:val="22"/>
+        </w:rPr>
+        <w:t xml:space="preserve"> y </w:t>
+      </w:r>
+      <w:r>
+        <w:rPr>
+          <w:rFonts w:asciiTheme="minorHAnsi" w:eastAsiaTheme="minorEastAsia" w:hAnsiTheme="minorHAnsi" w:cstheme="minorBidi"/>
+          <w:color w:val="auto"/>
+          <w:sz w:val="22"/>
+          <w:szCs w:val="22"/>
+        </w:rPr>
+        <w:t xml:space="preserve">los </w:t>
+      </w:r>
+      <w:r>
+        <w:rPr>
+          <w:rFonts w:asciiTheme="minorHAnsi" w:eastAsiaTheme="minorEastAsia" w:hAnsiTheme="minorHAnsi" w:cstheme="minorBidi"/>
+          <w:color w:val="auto"/>
+          <w:sz w:val="22"/>
+          <w:szCs w:val="22"/>
+        </w:rPr>
+        <w:t xml:space="preserve">últimos </w:t>
+      </w:r>
+      <w:r>
+        <w:rPr>
+          <w:rFonts w:asciiTheme="minorHAnsi" w:eastAsiaTheme="minorEastAsia" w:hAnsiTheme="minorHAnsi" w:cstheme="minorBidi"/>
+          <w:color w:val="auto"/>
+          <w:sz w:val="22"/>
+          <w:szCs w:val="22"/>
+        </w:rPr>
+        <w:t xml:space="preserve">10 </w:t>
+      </w:r>
+      <w:r>
+        <w:rPr>
+          <w:rFonts w:asciiTheme="minorHAnsi" w:eastAsiaTheme="minorEastAsia" w:hAnsiTheme="minorHAnsi" w:cstheme="minorBidi"/>
+          <w:color w:val="auto"/>
+          <w:sz w:val="22"/>
+          <w:szCs w:val="22"/>
+        </w:rPr>
+        <w:t>pedidos según el criterio de ordenamiento</w:t>
+      </w:r>
+      <w:r>
+        <w:rPr>
+          <w:rFonts w:asciiTheme="minorHAnsi" w:eastAsiaTheme="minorEastAsia" w:hAnsiTheme="minorHAnsi" w:cstheme="minorBidi"/>
+          <w:color w:val="auto"/>
+          <w:sz w:val="22"/>
+          <w:szCs w:val="22"/>
+        </w:rPr>
+        <w:t xml:space="preserve"> que nos proporcionan.</w:t>
+      </w:r>
+    </w:p>
+    <w:tbl>
+      <w:tblPr>
+        <w:tblStyle w:val="Tablaconcuadrcula"/>
+        <w:tblW w:w="9360" w:type="dxa"/>
+        <w:tblLayout w:type="fixed"/>
+        <w:tblLook w:val="06A0" w:firstRow="1" w:lastRow="0" w:firstColumn="1" w:lastColumn="0" w:noHBand="1" w:noVBand="1"/>
+      </w:tblPr>
+      <w:tblGrid>
+        <w:gridCol w:w="3060"/>
+        <w:gridCol w:w="6300"/>
+      </w:tblGrid>
+      <w:tr>
+        <w:tc>
+          <w:tcPr>
+            <w:tcW w:w="3060" w:type="dxa"/>
+          </w:tcPr>
+          <w:p>
+            <w:pPr>
+              <w:rPr>
+                <w:b/>
+                <w:bCs/>
+              </w:rPr>
+            </w:pPr>
+            <w:r>
+              <w:rPr>
+                <w:b/>
+                <w:bCs/>
+              </w:rPr>
+              <w:t xml:space="preserve">Entrada </w:t>
+            </w:r>
+          </w:p>
+        </w:tc>
+        <w:tc>
+          <w:tcPr>
+            <w:tcW w:w="6300" w:type="dxa"/>
+          </w:tcPr>
+          <w:p>
+            <w:r>
+              <w:t>catalog, fecha, min_amount, max_amount</w:t>
+            </w:r>
+          </w:p>
+        </w:tc>
+      </w:tr>
+      <w:tr>
+        <w:tc>
+          <w:tcPr>
+            <w:tcW w:w="3060" w:type="dxa"/>
+          </w:tcPr>
+          <w:p>
+            <w:pPr>
+              <w:rPr>
+                <w:b/>
+                <w:bCs/>
+              </w:rPr>
+            </w:pPr>
+            <w:r>
+              <w:rPr>
+                <w:b/>
+                <w:bCs/>
+              </w:rPr>
+              <w:t>Salidas</w:t>
+            </w:r>
+          </w:p>
+        </w:tc>
+        <w:tc>
+          <w:tcPr>
+            <w:tcW w:w="6300" w:type="dxa"/>
+          </w:tcPr>
+          <w:p>
+            <w:r>
+              <w:t>Lista de pedidos filtrados y ordenados.</w:t>
+            </w:r>
+          </w:p>
+          <w:p>
+            <w:r>
+              <w:t>Totales de monto, marketing y aporte comercial.</w:t>
+            </w:r>
+          </w:p>
+          <w:p>
+            <w:r>
+              <w:t>Tiempo de ejecución del algoritmo.</w:t>
+            </w:r>
+          </w:p>
+          <w:p/>
+        </w:tc>
+      </w:tr>
+      <w:tr>
+        <w:tc>
+          <w:tcPr>
+            <w:tcW w:w="3060" w:type="dxa"/>
+          </w:tcPr>
+          <w:p>
+            <w:pPr>
+              <w:rPr>
+                <w:b/>
+                <w:bCs/>
+              </w:rPr>
+            </w:pPr>
+            <w:r>
+              <w:rPr>
+                <w:b/>
+                <w:bCs/>
+              </w:rPr>
+              <w:t>Implementado (Sí/No)</w:t>
+            </w:r>
+          </w:p>
+        </w:tc>
+        <w:tc>
+          <w:tcPr>
+            <w:tcW w:w="6300" w:type="dxa"/>
+          </w:tcPr>
+          <w:p>
+            <w:r>
+              <w:t>Si, implementado por Juan Ospina</w:t>
+            </w:r>
+          </w:p>
+        </w:tc>
+      </w:tr>
+    </w:tbl>
+    <w:p/>
+    <w:p>
+      <w:pPr>
+        <w:pStyle w:val="Ttulo2"/>
+        <w:rPr>
+          <w:b/>
+          <w:bCs/>
+        </w:rPr>
+      </w:pPr>
+      <w:r>
+        <w:rPr>
+          <w:b/>
+          <w:bCs/>
+        </w:rPr>
+        <w:t>Análisis de complejidad</w:t>
+      </w:r>
+    </w:p>
+    <w:p>
+      <w:r>
+        <w:t>Análisis de complejidad de cada uno de los pasos del algoritmo</w:t>
+      </w:r>
+    </w:p>
+    <w:tbl>
+      <w:tblPr>
+        <w:tblStyle w:val="Tablaconcuadrcula"/>
+        <w:tblW w:w="0" w:type="auto"/>
+        <w:tblLayout w:type="fixed"/>
+        <w:tblLook w:val="06A0" w:firstRow="1" w:lastRow="0" w:firstColumn="1" w:lastColumn="0" w:noHBand="1" w:noVBand="1"/>
+      </w:tblPr>
+      <w:tblGrid>
+        <w:gridCol w:w="5070"/>
+        <w:gridCol w:w="4275"/>
+      </w:tblGrid>
+      <w:tr>
+        <w:tc>
+          <w:tcPr>
+            <w:tcW w:w="5070" w:type="dxa"/>
+          </w:tcPr>
+          <w:p>
+            <w:pPr>
+              <w:rPr>
+                <w:b/>
+                <w:bCs/>
+              </w:rPr>
+            </w:pPr>
+            <w:r>
+              <w:rPr>
+                <w:b/>
+                <w:bCs/>
+              </w:rPr>
+              <w:t>Pasos</w:t>
+            </w:r>
+          </w:p>
+        </w:tc>
+        <w:tc>
+          <w:tcPr>
+            <w:tcW w:w="4275" w:type="dxa"/>
+          </w:tcPr>
+          <w:p>
+            <w:pPr>
+              <w:rPr>
+                <w:b/>
+                <w:bCs/>
+              </w:rPr>
+            </w:pPr>
+            <w:r>
+              <w:rPr>
+                <w:b/>
+                <w:bCs/>
+              </w:rPr>
+              <w:t>Complejidad</w:t>
+            </w:r>
+          </w:p>
+        </w:tc>
+      </w:tr>
+      <w:tr>
+        <w:tc>
+          <w:tcPr>
+            <w:tcW w:w="5070" w:type="dxa"/>
+          </w:tcPr>
+          <w:p>
+            <w:r>
+              <w:t>Recorrer todos los pedidos en el catálogo</w:t>
+            </w:r>
+          </w:p>
+        </w:tc>
+        <w:tc>
+          <w:tcPr>
+            <w:tcW w:w="4275" w:type="dxa"/>
+          </w:tcPr>
+          <w:p>
+            <w:r>
+              <w:t>O(n)</w:t>
+            </w:r>
+          </w:p>
+        </w:tc>
+      </w:tr>
+      <w:tr>
+        <w:tc>
+          <w:tcPr>
+            <w:tcW w:w="5070" w:type="dxa"/>
+          </w:tcPr>
+          <w:p>
+            <w:r>
+              <w:t>Filtrar por fecha y rango de montos</w:t>
+            </w:r>
+          </w:p>
+        </w:tc>
+        <w:tc>
+          <w:tcPr>
+            <w:tcW w:w="4275" w:type="dxa"/>
+          </w:tcPr>
+          <w:p>
+            <w:r>
+              <w:t>O(n)</w:t>
+            </w:r>
+          </w:p>
+        </w:tc>
+      </w:tr>
+      <w:tr>
+        <w:tc>
+          <w:tcPr>
+            <w:tcW w:w="5070" w:type="dxa"/>
+          </w:tcPr>
+          <w:p>
+            <w:r>
+              <w:t>Calcular totales (suma de campos)</w:t>
+            </w:r>
+          </w:p>
+        </w:tc>
+        <w:tc>
+          <w:tcPr>
+            <w:tcW w:w="4275" w:type="dxa"/>
+          </w:tcPr>
+          <w:p>
+            <w:r>
+              <w:t>O(n)</w:t>
+            </w:r>
+          </w:p>
+        </w:tc>
+      </w:tr>
+      <w:tr>
+        <w:tc>
+          <w:tcPr>
+            <w:tcW w:w="5070" w:type="dxa"/>
+          </w:tcPr>
+          <w:p>
+            <w:r>
+              <w:t>Ordenar los pedidos filtrados</w:t>
+            </w:r>
+            <w:r>
+              <w:t xml:space="preserve"> con merge sort</w:t>
+            </w:r>
+          </w:p>
+        </w:tc>
+        <w:tc>
+          <w:tcPr>
+            <w:tcW w:w="4275" w:type="dxa"/>
+          </w:tcPr>
+          <w:p>
+            <w:r>
+              <w:t>O(n log n)</w:t>
+            </w:r>
+          </w:p>
+        </w:tc>
+      </w:tr>
+      <w:tr>
+        <w:tc>
+          <w:tcPr>
+            <w:tcW w:w="5070" w:type="dxa"/>
+          </w:tcPr>
+          <w:p>
+            <w:pPr>
+              <w:rPr>
+                <w:b/>
+                <w:bCs/>
+                <w:i/>
+                <w:iCs/>
+              </w:rPr>
+            </w:pPr>
+            <w:r>
+              <w:rPr>
+                <w:b/>
+                <w:bCs/>
+                <w:i/>
+                <w:iCs/>
+              </w:rPr>
+              <w:t>TOTAL</w:t>
+            </w:r>
+          </w:p>
+        </w:tc>
+        <w:tc>
+          <w:tcPr>
+            <w:tcW w:w="4275" w:type="dxa"/>
+          </w:tcPr>
+          <w:p>
+            <w:pPr>
+              <w:rPr>
+                <w:b/>
+                <w:bCs/>
+                <w:i/>
+                <w:iCs/>
+              </w:rPr>
+            </w:pPr>
+            <w:r>
+              <w:rPr>
+                <w:b/>
+                <w:bCs/>
+                <w:i/>
+                <w:iCs/>
+              </w:rPr>
+              <w:t>O(</w:t>
+            </w:r>
+            <w:r>
+              <w:rPr>
+                <w:b/>
+                <w:bCs/>
+                <w:i/>
+                <w:iCs/>
+              </w:rPr>
+              <w:t>n log n</w:t>
+            </w:r>
+            <w:r>
+              <w:rPr>
+                <w:b/>
+                <w:bCs/>
+                <w:i/>
+                <w:iCs/>
+              </w:rPr>
+              <w:t>)</w:t>
+            </w:r>
+          </w:p>
+        </w:tc>
+      </w:tr>
+    </w:tbl>
+    <w:p>
+      <w:pPr>
+        <w:rPr>
+          <w:rFonts w:ascii="Dax-Regular" w:hAnsi="Dax-Regular"/>
+        </w:rPr>
+      </w:pPr>
+    </w:p>
+    <w:p>
+      <w:pPr>
+        <w:pStyle w:val="Ttulo2"/>
+        <w:rPr>
+          <w:b/>
+          <w:bCs/>
+        </w:rPr>
+      </w:pPr>
+      <w:r>
+        <w:rPr>
+          <w:b/>
+          <w:bCs/>
+        </w:rPr>
+        <w:t>Análisis</w:t>
+      </w:r>
+    </w:p>
+    <w:p>
+      <w:r>
+        <w:t>Considero que el algoritmo esta bien implementado, manteniendo una complejidad normal, diría que hasta ideal teniendo en cu</w:t>
+      </w:r>
+      <w:r>
+        <w:t>en</w:t>
+      </w:r>
+      <w:r>
+        <w:t xml:space="preserve">ta que al tener </w:t>
+      </w:r>
+      <w:r>
+        <w:t>que realizar un ordenamiento mantiene la complejidad en n log n lo cual es lo mínimo de complejidad de lo que vimos para algoritmos que estén desordenados aleatoriamente</w:t>
+      </w:r>
+    </w:p>
+    <w:p>
+      <w:pPr>
+        <w:pStyle w:val="Ttulo1"/>
+        <w:rPr>
+          <w:b/>
+          <w:bCs/>
+        </w:rPr>
+      </w:pPr>
+      <w:r>
+        <w:rPr>
+          <w:b/>
+          <w:bCs/>
+        </w:rPr>
+        <w:lastRenderedPageBreak/>
+        <w:t xml:space="preserve">Requerimiento </w:t>
+      </w:r>
+      <w:r>
+        <w:rPr>
+          <w:b/>
+          <w:bCs/>
+        </w:rPr>
+        <w:t>4</w:t>
+      </w:r>
+    </w:p>
+    <w:p>
+      <w:r>
+        <w:t>Plantilla para el documentar y analizar cada uno de los requerimientos.</w:t>
+      </w:r>
+    </w:p>
+    <w:p>
+      <w:pPr>
+        <w:pStyle w:val="Ttulo2"/>
+        <w:rPr>
+          <w:b/>
+          <w:bCs/>
+        </w:rPr>
+      </w:pPr>
+      <w:r>
+        <w:rPr>
+          <w:b/>
+          <w:bCs/>
+        </w:rPr>
+        <w:t>Descripción</w:t>
+      </w:r>
+    </w:p>
+    <w:p>
+      <w:r>
+        <w:t>Breve descripción de como abordaron la implementación del requerimiento</w:t>
+      </w:r>
+    </w:p>
+    <w:tbl>
+      <w:tblPr>
+        <w:tblStyle w:val="Tablaconcuadrcula"/>
+        <w:tblW w:w="9360" w:type="dxa"/>
+        <w:tblLayout w:type="fixed"/>
+        <w:tblLook w:val="06A0" w:firstRow="1" w:lastRow="0" w:firstColumn="1" w:lastColumn="0" w:noHBand="1" w:noVBand="1"/>
+      </w:tblPr>
+      <w:tblGrid>
+        <w:gridCol w:w="3060"/>
+        <w:gridCol w:w="6300"/>
+      </w:tblGrid>
+      <w:tr>
+        <w:tc>
+          <w:tcPr>
+            <w:tcW w:w="3060" w:type="dxa"/>
+          </w:tcPr>
+          <w:p>
+            <w:pPr>
+              <w:rPr>
+                <w:b/>
+                <w:bCs/>
+              </w:rPr>
+            </w:pPr>
+            <w:r>
+              <w:rPr>
+                <w:b/>
+                <w:bCs/>
+              </w:rPr>
+              <w:t xml:space="preserve">Entrada </w:t>
+            </w:r>
+          </w:p>
+        </w:tc>
+        <w:tc>
+          <w:tcPr>
+            <w:tcW w:w="6300" w:type="dxa"/>
+          </w:tcPr>
+          <w:p>
+            <w:r>
+              <w:t>Parámetros necesarios para resolver el requerimiento.</w:t>
+            </w:r>
+          </w:p>
+        </w:tc>
+      </w:tr>
+      <w:tr>
+        <w:tc>
+          <w:tcPr>
+            <w:tcW w:w="3060" w:type="dxa"/>
+          </w:tcPr>
+          <w:p>
+            <w:pPr>
+              <w:rPr>
+                <w:b/>
+                <w:bCs/>
+              </w:rPr>
+            </w:pPr>
+            <w:r>
+              <w:rPr>
+                <w:b/>
+                <w:bCs/>
+              </w:rPr>
+              <w:t>Salidas</w:t>
+            </w:r>
+          </w:p>
+        </w:tc>
+        <w:tc>
+          <w:tcPr>
+            <w:tcW w:w="6300" w:type="dxa"/>
+          </w:tcPr>
+          <w:p>
+            <w:r>
+              <w:t>Respuesta esperada del algoritmo.</w:t>
+            </w:r>
+          </w:p>
+        </w:tc>
+      </w:tr>
+      <w:tr>
+        <w:tc>
+          <w:tcPr>
+            <w:tcW w:w="3060" w:type="dxa"/>
+          </w:tcPr>
+          <w:p>
+            <w:pPr>
+              <w:rPr>
+                <w:b/>
+                <w:bCs/>
+              </w:rPr>
+            </w:pPr>
+            <w:r>
+              <w:rPr>
+                <w:b/>
+                <w:bCs/>
+              </w:rPr>
+              <w:t>Implementado (Sí/No)</w:t>
+            </w:r>
+          </w:p>
+        </w:tc>
+        <w:tc>
+          <w:tcPr>
+            <w:tcW w:w="6300" w:type="dxa"/>
+          </w:tcPr>
+          <w:p>
+            <w:r>
+              <w:t>Si se implementó y quien lo hizo.</w:t>
+            </w:r>
+          </w:p>
+        </w:tc>
+      </w:tr>
+    </w:tbl>
+    <w:p/>
+    <w:p>
+      <w:pPr>
+        <w:pStyle w:val="Ttulo2"/>
+        <w:rPr>
+          <w:b/>
+          <w:bCs/>
+        </w:rPr>
+      </w:pPr>
+      <w:r>
+        <w:rPr>
+          <w:b/>
+          <w:bCs/>
+        </w:rPr>
+        <w:t>Análisis de complejidad</w:t>
+      </w:r>
+    </w:p>
+    <w:p>
+      <w:r>
+        <w:t>Análisis de complejidad de cada uno de los pasos del algoritmo</w:t>
+      </w:r>
+    </w:p>
+    <w:tbl>
+      <w:tblPr>
+        <w:tblStyle w:val="Tablaconcuadrcula"/>
+        <w:tblW w:w="0" w:type="auto"/>
+        <w:tblLayout w:type="fixed"/>
+        <w:tblLook w:val="06A0" w:firstRow="1" w:lastRow="0" w:firstColumn="1" w:lastColumn="0" w:noHBand="1" w:noVBand="1"/>
+      </w:tblPr>
+      <w:tblGrid>
+        <w:gridCol w:w="5070"/>
+        <w:gridCol w:w="4275"/>
+      </w:tblGrid>
+      <w:tr>
+        <w:tc>
+          <w:tcPr>
+            <w:tcW w:w="5070" w:type="dxa"/>
+          </w:tcPr>
+          <w:p>
+            <w:pPr>
+              <w:rPr>
+                <w:b/>
+                <w:bCs/>
+              </w:rPr>
+            </w:pPr>
+            <w:r>
+              <w:rPr>
+                <w:b/>
+                <w:bCs/>
+              </w:rPr>
+              <w:t>Pasos</w:t>
+            </w:r>
+          </w:p>
+        </w:tc>
+        <w:tc>
+          <w:tcPr>
+            <w:tcW w:w="4275" w:type="dxa"/>
+          </w:tcPr>
+          <w:p>
+            <w:pPr>
+              <w:rPr>
+                <w:b/>
+                <w:bCs/>
+              </w:rPr>
+            </w:pPr>
+            <w:r>
+              <w:rPr>
+                <w:b/>
+                <w:bCs/>
+              </w:rPr>
+              <w:t>Complejidad</w:t>
+            </w:r>
+          </w:p>
+        </w:tc>
+      </w:tr>
+      <w:tr>
+        <w:tc>
+          <w:tcPr>
+            <w:tcW w:w="5070" w:type="dxa"/>
+          </w:tcPr>
+          <w:p>
+            <w:r>
+              <w:t>Paso 1</w:t>
+            </w:r>
+          </w:p>
+        </w:tc>
+        <w:tc>
+          <w:tcPr>
+            <w:tcW w:w="4275" w:type="dxa"/>
+          </w:tcPr>
+          <w:p>
+            <w:r>
+              <w:t>O(...)</w:t>
+            </w:r>
+          </w:p>
+        </w:tc>
+      </w:tr>
+      <w:tr>
+        <w:tc>
+          <w:tcPr>
+            <w:tcW w:w="5070" w:type="dxa"/>
+          </w:tcPr>
+          <w:p>
+            <w:r>
+              <w:t xml:space="preserve">Paso 2 </w:t>
+            </w:r>
+          </w:p>
+        </w:tc>
+        <w:tc>
+          <w:tcPr>
+            <w:tcW w:w="4275" w:type="dxa"/>
+          </w:tcPr>
+          <w:p>
+            <w:r>
+              <w:t>O(...)</w:t>
+            </w:r>
+          </w:p>
+        </w:tc>
+      </w:tr>
+      <w:tr>
+        <w:tc>
+          <w:tcPr>
+            <w:tcW w:w="5070" w:type="dxa"/>
+          </w:tcPr>
+          <w:p>
+            <w:r>
+              <w:t>Paso ….</w:t>
+            </w:r>
+          </w:p>
+        </w:tc>
+        <w:tc>
+          <w:tcPr>
+            <w:tcW w:w="4275" w:type="dxa"/>
+          </w:tcPr>
+          <w:p>
+            <w:r>
+              <w:t>O(...)</w:t>
+            </w:r>
+          </w:p>
+        </w:tc>
+      </w:tr>
+      <w:tr>
+        <w:tc>
+          <w:tcPr>
+            <w:tcW w:w="5070" w:type="dxa"/>
+          </w:tcPr>
+          <w:p>
+            <w:pPr>
+              <w:rPr>
+                <w:b/>
+                <w:bCs/>
+                <w:i/>
+                <w:iCs/>
+              </w:rPr>
+            </w:pPr>
+            <w:r>
+              <w:rPr>
+                <w:b/>
+                <w:bCs/>
+                <w:i/>
+                <w:iCs/>
+              </w:rPr>
+              <w:t>TOTAL</w:t>
+            </w:r>
+          </w:p>
+        </w:tc>
+        <w:tc>
+          <w:tcPr>
+            <w:tcW w:w="4275" w:type="dxa"/>
+          </w:tcPr>
+          <w:p>
+            <w:pPr>
+              <w:rPr>
+                <w:b/>
+                <w:bCs/>
+                <w:i/>
+                <w:iCs/>
+              </w:rPr>
+            </w:pPr>
+            <w:r>
+              <w:rPr>
+                <w:b/>
+                <w:bCs/>
+                <w:i/>
+                <w:iCs/>
+              </w:rPr>
+              <w:t>O(...)</w:t>
+            </w:r>
+          </w:p>
+        </w:tc>
+      </w:tr>
+    </w:tbl>
+    <w:p>
+      <w:pPr>
+        <w:rPr>
+          <w:rFonts w:ascii="Dax-Regular" w:hAnsi="Dax-Regular"/>
+        </w:rPr>
+      </w:pPr>
+    </w:p>
+    <w:p>
+      <w:pPr>
+        <w:pStyle w:val="Ttulo2"/>
+        <w:rPr>
+          <w:b/>
+          <w:bCs/>
+        </w:rPr>
+      </w:pPr>
+      <w:r>
+        <w:rPr>
+          <w:b/>
+          <w:bCs/>
+        </w:rPr>
+        <w:t>Análisis</w:t>
+      </w:r>
+    </w:p>
+    <w:p>
+      <w:r>
+        <w:t>Análisis de resultados de la implementación, tener cuenta las pruebas realizadas y el analisis de complejidad.</w:t>
+      </w:r>
+    </w:p>
+    <w:p>
+      <w:pPr>
+        <w:pStyle w:val="Ttulo1"/>
+        <w:rPr>
+          <w:b/>
+          <w:bCs/>
+        </w:rPr>
+      </w:pPr>
+      <w:r>
+        <w:rPr>
+          <w:b/>
+          <w:bCs/>
+        </w:rPr>
+        <w:t xml:space="preserve">Requerimiento </w:t>
+      </w:r>
+      <w:r>
+        <w:rPr>
+          <w:b/>
+          <w:bCs/>
+        </w:rPr>
+        <w:t>5</w:t>
+      </w:r>
+    </w:p>
+    <w:p>
+      <w:r>
+        <w:t>Plantilla para el documentar y analizar cada uno de los requerimientos.</w:t>
+      </w:r>
+    </w:p>
+    <w:p>
+      <w:pPr>
+        <w:pStyle w:val="Ttulo2"/>
+        <w:rPr>
+          <w:b/>
+          <w:bCs/>
+        </w:rPr>
+      </w:pPr>
+      <w:r>
+        <w:rPr>
+          <w:b/>
+          <w:bCs/>
+        </w:rPr>
+        <w:t>Descripción</w:t>
+      </w:r>
+    </w:p>
+    <w:p>
+      <w:r>
+        <w:t>Breve descripción de como abordaron la implementación del requerimiento</w:t>
+      </w:r>
+    </w:p>
+    <w:tbl>
+      <w:tblPr>
+        <w:tblStyle w:val="Tablaconcuadrcula"/>
+        <w:tblW w:w="9360" w:type="dxa"/>
+        <w:tblLayout w:type="fixed"/>
+        <w:tblLook w:val="06A0" w:firstRow="1" w:lastRow="0" w:firstColumn="1" w:lastColumn="0" w:noHBand="1" w:noVBand="1"/>
+      </w:tblPr>
+      <w:tblGrid>
+        <w:gridCol w:w="3060"/>
+        <w:gridCol w:w="6300"/>
+      </w:tblGrid>
+      <w:tr>
+        <w:tc>
+          <w:tcPr>
+            <w:tcW w:w="3060" w:type="dxa"/>
+          </w:tcPr>
+          <w:p>
+            <w:pPr>
+              <w:rPr>
+                <w:b/>
+                <w:bCs/>
+              </w:rPr>
+            </w:pPr>
+            <w:r>
+              <w:rPr>
+                <w:b/>
+                <w:bCs/>
+              </w:rPr>
+              <w:t xml:space="preserve">Entrada </w:t>
+            </w:r>
+          </w:p>
+        </w:tc>
+        <w:tc>
+          <w:tcPr>
+            <w:tcW w:w="6300" w:type="dxa"/>
+          </w:tcPr>
+          <w:p>
+            <w:r>
+              <w:t>Parámetros necesarios para resolver el requerimiento.</w:t>
+            </w:r>
+          </w:p>
+        </w:tc>
+      </w:tr>
+      <w:tr>
+        <w:tc>
+          <w:tcPr>
+            <w:tcW w:w="3060" w:type="dxa"/>
+          </w:tcPr>
+          <w:p>
+            <w:pPr>
+              <w:rPr>
+                <w:b/>
+                <w:bCs/>
+              </w:rPr>
+            </w:pPr>
+            <w:r>
+              <w:rPr>
+                <w:b/>
+                <w:bCs/>
+              </w:rPr>
+              <w:t>Salidas</w:t>
+            </w:r>
+          </w:p>
+        </w:tc>
+        <w:tc>
+          <w:tcPr>
+            <w:tcW w:w="6300" w:type="dxa"/>
+          </w:tcPr>
+          <w:p>
+            <w:r>
+              <w:t>Respuesta esperada del algoritmo.</w:t>
+            </w:r>
+          </w:p>
+        </w:tc>
+      </w:tr>
+      <w:tr>
+        <w:tc>
+          <w:tcPr>
+            <w:tcW w:w="3060" w:type="dxa"/>
+          </w:tcPr>
+          <w:p>
+            <w:pPr>
+              <w:rPr>
+                <w:b/>
+                <w:bCs/>
+              </w:rPr>
+            </w:pPr>
+            <w:r>
+              <w:rPr>
+                <w:b/>
+                <w:bCs/>
+              </w:rPr>
+              <w:t>Implementado (Sí/No)</w:t>
+            </w:r>
+          </w:p>
+        </w:tc>
+        <w:tc>
+          <w:tcPr>
+            <w:tcW w:w="6300" w:type="dxa"/>
+          </w:tcPr>
+          <w:p>
+            <w:r>
+              <w:t>Si se implementó y quien lo hizo.</w:t>
+            </w:r>
+          </w:p>
+        </w:tc>
+      </w:tr>
+    </w:tbl>
+    <w:p/>
+    <w:p>
+      <w:pPr>
+        <w:pStyle w:val="Ttulo2"/>
+        <w:rPr>
+          <w:b/>
+          <w:bCs/>
+        </w:rPr>
+      </w:pPr>
+      <w:r>
+        <w:rPr>
+          <w:b/>
+          <w:bCs/>
+        </w:rPr>
+        <w:t>Análisis de complejidad</w:t>
+      </w:r>
+    </w:p>
+    <w:p>
+      <w:r>
+        <w:t>Análisis de complejidad de cada uno de los pasos del algoritmo</w:t>
+      </w:r>
+    </w:p>
+    <w:tbl>
+      <w:tblPr>
+        <w:tblStyle w:val="Tablaconcuadrcula"/>
+        <w:tblW w:w="0" w:type="auto"/>
+        <w:tblLayout w:type="fixed"/>
+        <w:tblLook w:val="06A0" w:firstRow="1" w:lastRow="0" w:firstColumn="1" w:lastColumn="0" w:noHBand="1" w:noVBand="1"/>
+      </w:tblPr>
+      <w:tblGrid>
+        <w:gridCol w:w="5070"/>
+        <w:gridCol w:w="4275"/>
+      </w:tblGrid>
+      <w:tr>
+        <w:tc>
+          <w:tcPr>
+            <w:tcW w:w="5070" w:type="dxa"/>
+          </w:tcPr>
+          <w:p>
+            <w:pPr>
+              <w:rPr>
+                <w:b/>
+                <w:bCs/>
+              </w:rPr>
+            </w:pPr>
+            <w:r>
+              <w:rPr>
+                <w:b/>
+                <w:bCs/>
+              </w:rPr>
+              <w:t>Pasos</w:t>
+            </w:r>
+          </w:p>
+        </w:tc>
+        <w:tc>
+          <w:tcPr>
+            <w:tcW w:w="4275" w:type="dxa"/>
+          </w:tcPr>
+          <w:p>
+            <w:pPr>
+              <w:rPr>
+                <w:b/>
+                <w:bCs/>
+              </w:rPr>
+            </w:pPr>
+            <w:r>
+              <w:rPr>
+                <w:b/>
+                <w:bCs/>
+              </w:rPr>
+              <w:t>Complejidad</w:t>
+            </w:r>
+          </w:p>
+        </w:tc>
+      </w:tr>
+      <w:tr>
+        <w:tc>
+          <w:tcPr>
+            <w:tcW w:w="5070" w:type="dxa"/>
+          </w:tcPr>
+          <w:p>
+            <w:r>
+              <w:t>Paso 1</w:t>
+            </w:r>
+          </w:p>
+        </w:tc>
+        <w:tc>
+          <w:tcPr>
+            <w:tcW w:w="4275" w:type="dxa"/>
+          </w:tcPr>
+          <w:p>
+            <w:r>
+              <w:t>O(...)</w:t>
+            </w:r>
+          </w:p>
+        </w:tc>
+      </w:tr>
+      <w:tr>
+        <w:tc>
+          <w:tcPr>
+            <w:tcW w:w="5070" w:type="dxa"/>
+          </w:tcPr>
+          <w:p>
+            <w:r>
+              <w:t xml:space="preserve">Paso 2 </w:t>
+            </w:r>
+          </w:p>
+        </w:tc>
+        <w:tc>
+          <w:tcPr>
+            <w:tcW w:w="4275" w:type="dxa"/>
+          </w:tcPr>
+          <w:p>
+            <w:r>
+              <w:t>O(...)</w:t>
+            </w:r>
+          </w:p>
+        </w:tc>
+      </w:tr>
+      <w:tr>
+        <w:tc>
+          <w:tcPr>
+            <w:tcW w:w="5070" w:type="dxa"/>
+          </w:tcPr>
+          <w:p>
+            <w:r>
+              <w:t>Paso ….</w:t>
+            </w:r>
+          </w:p>
+        </w:tc>
+        <w:tc>
+          <w:tcPr>
+            <w:tcW w:w="4275" w:type="dxa"/>
+          </w:tcPr>
+          <w:p>
+            <w:r>
+              <w:t>O(...)</w:t>
+            </w:r>
+          </w:p>
+        </w:tc>
+      </w:tr>
+      <w:tr>
+        <w:tc>
+          <w:tcPr>
+            <w:tcW w:w="5070" w:type="dxa"/>
+          </w:tcPr>
+          <w:p>
+            <w:pPr>
+              <w:rPr>
+                <w:b/>
+                <w:bCs/>
+                <w:i/>
+                <w:iCs/>
+              </w:rPr>
+            </w:pPr>
+            <w:r>
+              <w:rPr>
+                <w:b/>
+                <w:bCs/>
+                <w:i/>
+                <w:iCs/>
+              </w:rPr>
+              <w:t>TOTAL</w:t>
+            </w:r>
+          </w:p>
+        </w:tc>
+        <w:tc>
+          <w:tcPr>
+            <w:tcW w:w="4275" w:type="dxa"/>
+          </w:tcPr>
+          <w:p>
+            <w:pPr>
+              <w:rPr>
+                <w:b/>
+                <w:bCs/>
+                <w:i/>
+                <w:iCs/>
+              </w:rPr>
+            </w:pPr>
+            <w:r>
+              <w:rPr>
+                <w:b/>
+                <w:bCs/>
+                <w:i/>
+                <w:iCs/>
+              </w:rPr>
+              <w:t>O(...)</w:t>
+            </w:r>
+          </w:p>
+        </w:tc>
+      </w:tr>
+    </w:tbl>
+    <w:p>
+      <w:pPr>
+        <w:rPr>
+          <w:rFonts w:ascii="Dax-Regular" w:hAnsi="Dax-Regular"/>
+        </w:rPr>
+      </w:pPr>
+    </w:p>
+    <w:p>
+      <w:pPr>
+        <w:pStyle w:val="Ttulo2"/>
+        <w:rPr>
+          <w:b/>
+          <w:bCs/>
+        </w:rPr>
+      </w:pPr>
+      <w:r>
+        <w:rPr>
+          <w:b/>
+          <w:bCs/>
+        </w:rPr>
+        <w:lastRenderedPageBreak/>
+        <w:t>Análisis</w:t>
+      </w:r>
+    </w:p>
+    <w:p>
+      <w:r>
+        <w:t>Análisis de resultados de la implementación, tener cuenta las pruebas realizadas y el analisis de complejidad.</w:t>
+      </w:r>
+    </w:p>
+    <w:p>
+      <w:pPr>
+        <w:pStyle w:val="Ttulo1"/>
+        <w:rPr>
+          <w:b/>
+          <w:bCs/>
+        </w:rPr>
+      </w:pPr>
+      <w:r>
+        <w:rPr>
+          <w:b/>
+          <w:bCs/>
+        </w:rPr>
+        <w:t xml:space="preserve">Requerimiento </w:t>
+      </w:r>
+      <w:r>
+        <w:rPr>
+          <w:b/>
+          <w:bCs/>
+        </w:rPr>
+        <w:t>6</w:t>
+      </w:r>
+    </w:p>
+    <w:p>
+      <w:r>
+        <w:drawing>
+          <wp:inline distT="0" distB="0" distL="0" distR="0" wp14:anchorId="6EF84D38" wp14:editId="06AD751B">
+            <wp:extent cx="5943600" cy="4467860"/>
+            <wp:effectExtent l="0" t="0" r="0" b="8890"/>
+            <wp:docPr id="2147089180" name="Imagen 1"/>
+            <wp:cNvGraphicFramePr>
+              <a:graphicFrameLocks xmlns:a="http://schemas.openxmlformats.org/drawingml/2006/main" noChangeAspect="1"/>
+            </wp:cNvGraphicFramePr>
+            <a:graphic xmlns:a="http://schemas.openxmlformats.org/drawingml/2006/main">
+              <a:graphicData uri="http://schemas.openxmlformats.org/drawingml/2006/picture">
+                <pic:pic xmlns:pic="http://schemas.openxmlformats.org/drawingml/2006/picture">
+                  <pic:nvPicPr>
+                    <pic:cNvPr id="2147089180" name=""/>
+                    <pic:cNvPicPr/>
+                  </pic:nvPicPr>
+                  <pic:blipFill>
+                    <a:blip r:embed="rId13"/>
+                    <a:stretch>
+                      <a:fillRect/>
+                    </a:stretch>
+                  </pic:blipFill>
+                  <pic:spPr>
+                    <a:xfrm>
+                      <a:off x="0" y="0"/>
+                      <a:ext cx="5943600" cy="4467860"/>
+                    </a:xfrm>
+                    <a:prstGeom prst="rect">
+                      <a:avLst/>
+                    </a:prstGeom>
+                  </pic:spPr>
+                </pic:pic>
+              </a:graphicData>
+            </a:graphic>
+          </wp:inline>
+        </w:drawing>
+      </w:r>
+    </w:p>
+    <w:p>
+      <w:r>
+        <w:lastRenderedPageBreak/>
+        <w:drawing>
+          <wp:inline distT="0" distB="0" distL="0" distR="0" wp14:anchorId="7DEC7738" wp14:editId="4F9BC1BE">
+            <wp:extent cx="5943600" cy="6049010"/>
+            <wp:effectExtent l="0" t="0" r="0" b="8890"/>
+            <wp:docPr id="1104194702" name="Imagen 1"/>
+            <wp:cNvGraphicFramePr>
+              <a:graphicFrameLocks xmlns:a="http://schemas.openxmlformats.org/drawingml/2006/main" noChangeAspect="1"/>
+            </wp:cNvGraphicFramePr>
+            <a:graphic xmlns:a="http://schemas.openxmlformats.org/drawingml/2006/main">
+              <a:graphicData uri="http://schemas.openxmlformats.org/drawingml/2006/picture">
+                <pic:pic xmlns:pic="http://schemas.openxmlformats.org/drawingml/2006/picture">
+                  <pic:nvPicPr>
+                    <pic:cNvPr id="1104194702" name=""/>
+                    <pic:cNvPicPr/>
+                  </pic:nvPicPr>
+                  <pic:blipFill>
+                    <a:blip r:embed="rId14"/>
+                    <a:stretch>
+                      <a:fillRect/>
+                    </a:stretch>
+                  </pic:blipFill>
+                  <pic:spPr>
+                    <a:xfrm>
+                      <a:off x="0" y="0"/>
+                      <a:ext cx="5943600" cy="6049010"/>
+                    </a:xfrm>
+                    <a:prstGeom prst="rect">
+                      <a:avLst/>
+                    </a:prstGeom>
+                  </pic:spPr>
+                </pic:pic>
+              </a:graphicData>
+            </a:graphic>
+          </wp:inline>
+        </w:drawing>
+      </w:r>
+    </w:p>
+    <w:p>
+      <w:r>
+        <w:drawing>
+          <wp:inline distT="0" distB="0" distL="0" distR="0" wp14:anchorId="366E6A10" wp14:editId="44E7B73D">
+            <wp:extent cx="4997707" cy="1663786"/>
+            <wp:effectExtent l="0" t="0" r="0" b="0"/>
+            <wp:docPr id="156958340" name="Imagen 1"/>
+            <wp:cNvGraphicFramePr>
+              <a:graphicFrameLocks xmlns:a="http://schemas.openxmlformats.org/drawingml/2006/main" noChangeAspect="1"/>
+            </wp:cNvGraphicFramePr>
+            <a:graphic xmlns:a="http://schemas.openxmlformats.org/drawingml/2006/main">
+              <a:graphicData uri="http://schemas.openxmlformats.org/drawingml/2006/picture">
+                <pic:pic xmlns:pic="http://schemas.openxmlformats.org/drawingml/2006/picture">
+                  <pic:nvPicPr>
+                    <pic:cNvPr id="156958340" name=""/>
+                    <pic:cNvPicPr/>
+                  </pic:nvPicPr>
+                  <pic:blipFill>
+                    <a:blip r:embed="rId15"/>
+                    <a:stretch>
+                      <a:fillRect/>
+                    </a:stretch>
+                  </pic:blipFill>
+                  <pic:spPr>
+                    <a:xfrm>
+                      <a:off x="0" y="0"/>
+                      <a:ext cx="4997707" cy="1663786"/>
+                    </a:xfrm>
+                    <a:prstGeom prst="rect">
+                      <a:avLst/>
+                    </a:prstGeom>
+                  </pic:spPr>
+                </pic:pic>
+              </a:graphicData>
+            </a:graphic>
+          </wp:inline>
+        </w:drawing>
+      </w:r>
+    </w:p>
+    <w:p>
+      <w:pPr>
+        <w:pStyle w:val="Ttulo2"/>
+        <w:rPr>
+          <w:b/>
+          <w:bCs/>
+        </w:rPr>
+      </w:pPr>
+      <w:r>
+        <w:rPr>
+          <w:b/>
+          <w:bCs/>
+        </w:rPr>
+        <w:lastRenderedPageBreak/>
+        <w:t>Descripción</w:t>
+      </w:r>
+    </w:p>
+    <w:p>
+      <w:r>
+        <w:t>Se desarrolló un algoritmo que filtra los pedidos por producto y rango de fechas, agrupa los resultados por país y calcula total de pedidos, monto, marketing, cajas y eficiencia. Finalmente, ordena los países por eficiencia de mercadeo y muestra los más destacados</w:t>
+      </w:r>
+    </w:p>
+    <w:tbl>
+      <w:tblPr>
+        <w:tblStyle w:val="Tablaconcuadrcula"/>
+        <w:tblW w:w="9360" w:type="dxa"/>
+        <w:tblLayout w:type="fixed"/>
+        <w:tblLook w:val="06A0" w:firstRow="1" w:lastRow="0" w:firstColumn="1" w:lastColumn="0" w:noHBand="1" w:noVBand="1"/>
+      </w:tblPr>
+      <w:tblGrid>
+        <w:gridCol w:w="3060"/>
+        <w:gridCol w:w="6300"/>
+      </w:tblGrid>
+      <w:tr>
+        <w:tc>
+          <w:tcPr>
+            <w:tcW w:w="3060" w:type="dxa"/>
+          </w:tcPr>
+          <w:p>
+            <w:pPr>
+              <w:rPr>
+                <w:b/>
+                <w:bCs/>
+              </w:rPr>
+            </w:pPr>
+            <w:r>
+              <w:rPr>
+                <w:b/>
+                <w:bCs/>
+              </w:rPr>
+              <w:t xml:space="preserve">Entrada </w:t>
+            </w:r>
+          </w:p>
+        </w:tc>
+        <w:tc>
+          <w:tcPr>
+            <w:tcW w:w="6300" w:type="dxa"/>
+          </w:tcPr>
+          <w:p>
+            <w:r>
+              <w:t>producto: Nombre del producto a analizar.</w:t>
+            </w:r>
+          </w:p>
+          <w:p>
+            <w:r>
+              <w:t>F</w:t>
+            </w:r>
+            <w:r>
+              <w:t>echa</w:t>
+            </w:r>
+            <w:r>
+              <w:t xml:space="preserve"> </w:t>
+            </w:r>
+            <w:r>
+              <w:t>inicial: Fecha mínima del rango.</w:t>
+            </w:r>
+          </w:p>
+          <w:p>
+            <w:r>
+              <w:t>F</w:t>
+            </w:r>
+            <w:r>
+              <w:t>echa</w:t>
+            </w:r>
+            <w:r>
+              <w:t xml:space="preserve"> </w:t>
+            </w:r>
+            <w:r>
+              <w:t>final: Fecha máxima del rango.</w:t>
+            </w:r>
+          </w:p>
+          <w:p>
+            <w:r>
+              <w:t xml:space="preserve">n: Número de países </w:t>
+            </w:r>
+            <w:r>
+              <w:t xml:space="preserve">destacados </w:t>
+            </w:r>
+            <w:r>
+              <w:t>a mostrar.</w:t>
+            </w:r>
+          </w:p>
+          <w:p>
+            <w:r>
+              <w:t>catalog</w:t>
+            </w:r>
+            <w:r>
+              <w:t>o</w:t>
+            </w:r>
+            <w:r>
+              <w:t>: Estructura principal con los pedidos cargados.</w:t>
+            </w:r>
+          </w:p>
+          <w:p/>
+        </w:tc>
+      </w:tr>
+      <w:tr>
+        <w:tc>
+          <w:tcPr>
+            <w:tcW w:w="3060" w:type="dxa"/>
+          </w:tcPr>
+          <w:p>
+            <w:pPr>
+              <w:rPr>
+                <w:b/>
+                <w:bCs/>
+              </w:rPr>
+            </w:pPr>
+            <w:r>
+              <w:rPr>
+                <w:b/>
+                <w:bCs/>
+              </w:rPr>
+              <w:t>Salidas</w:t>
+            </w:r>
+          </w:p>
+        </w:tc>
+        <w:tc>
+          <w:tcPr>
+            <w:tcW w:w="6300" w:type="dxa"/>
+          </w:tcPr>
+          <w:p>
+            <w:r>
+              <w:t>Lista de países con sus métrica</w:t>
+            </w:r>
+            <w:r>
+              <w:t>s</w:t>
+            </w:r>
+            <w:r>
+              <w:t xml:space="preserve"> </w:t>
+            </w:r>
+            <w:r>
+              <w:t>requeridas</w:t>
+            </w:r>
+            <w:r>
+              <w:t>.</w:t>
+            </w:r>
+          </w:p>
+          <w:p>
+            <w:r>
+              <w:t>Top n países con mayor eficiencia de mercadeo.</w:t>
+            </w:r>
+          </w:p>
+          <w:p>
+            <w:r>
+              <w:t>Totales globales de monto y marketing.</w:t>
+            </w:r>
+          </w:p>
+          <w:p>
+            <w:r>
+              <w:t>Tiempo de ejecución del algoritmo.</w:t>
+            </w:r>
+          </w:p>
+          <w:p/>
+        </w:tc>
+      </w:tr>
+      <w:tr>
+        <w:tc>
+          <w:tcPr>
+            <w:tcW w:w="3060" w:type="dxa"/>
+          </w:tcPr>
+          <w:p>
+            <w:pPr>
+              <w:rPr>
+                <w:b/>
+                <w:bCs/>
+              </w:rPr>
+            </w:pPr>
+            <w:r>
+              <w:rPr>
+                <w:b/>
+                <w:bCs/>
+              </w:rPr>
+              <w:t>Implementado (Sí/No)</w:t>
+            </w:r>
+          </w:p>
+        </w:tc>
+        <w:tc>
+          <w:tcPr>
+            <w:tcW w:w="6300" w:type="dxa"/>
+          </w:tcPr>
+          <w:p>
+            <w:r>
+              <w:t>Si</w:t>
+            </w:r>
+            <w:r>
+              <w:t>, se implemento</w:t>
+            </w:r>
+          </w:p>
+        </w:tc>
+      </w:tr>
+    </w:tbl>
+    <w:p/>
+    <w:p>
+      <w:pPr>
+        <w:pStyle w:val="Ttulo2"/>
+        <w:rPr>
+          <w:b/>
+          <w:bCs/>
+        </w:rPr>
+      </w:pPr>
+      <w:r>
+        <w:rPr>
+          <w:b/>
+          <w:bCs/>
+        </w:rPr>
+        <w:t>Análisis de complejidad</w:t>
+      </w:r>
+    </w:p>
+    <w:p>
+      <w:r>
+        <w:t>Análisis de complejidad de cada uno de los pasos del algoritmo</w:t>
+      </w:r>
+    </w:p>
+    <w:tbl>
+      <w:tblPr>
+        <w:tblStyle w:val="Tablaconcuadrcula"/>
+        <w:tblW w:w="0" w:type="auto"/>
+        <w:tblLayout w:type="fixed"/>
+        <w:tblLook w:val="06A0" w:firstRow="1" w:lastRow="0" w:firstColumn="1" w:lastColumn="0" w:noHBand="1" w:noVBand="1"/>
+      </w:tblPr>
+      <w:tblGrid>
+        <w:gridCol w:w="5070"/>
+        <w:gridCol w:w="4275"/>
+      </w:tblGrid>
+      <w:tr>
+        <w:tc>
+          <w:tcPr>
+            <w:tcW w:w="5070" w:type="dxa"/>
+          </w:tcPr>
+          <w:p>
+            <w:pPr>
+              <w:rPr>
+                <w:b/>
+                <w:bCs/>
+              </w:rPr>
+            </w:pPr>
+            <w:r>
+              <w:rPr>
+                <w:b/>
+                <w:bCs/>
+              </w:rPr>
+              <w:t>Pasos</w:t>
+            </w:r>
+          </w:p>
+        </w:tc>
+        <w:tc>
+          <w:tcPr>
+            <w:tcW w:w="4275" w:type="dxa"/>
+          </w:tcPr>
+          <w:p>
+            <w:pPr>
+              <w:rPr>
+                <w:b/>
+                <w:bCs/>
+              </w:rPr>
+            </w:pPr>
+            <w:r>
+              <w:rPr>
+                <w:b/>
+                <w:bCs/>
+              </w:rPr>
+              <w:t>Complejidad</w:t>
+            </w:r>
+          </w:p>
+        </w:tc>
+      </w:tr>
+      <w:tr>
+        <w:tc>
+          <w:tcPr>
+            <w:tcW w:w="5070" w:type="dxa"/>
+          </w:tcPr>
+          <w:p>
+            <w:r>
+              <w:t>Recorrer todos los pedidos en el catálogo</w:t>
+            </w:r>
+          </w:p>
+        </w:tc>
+        <w:tc>
+          <w:tcPr>
+            <w:tcW w:w="4275" w:type="dxa"/>
+          </w:tcPr>
+          <w:p>
+            <w:r>
+              <w:t>O(n)</w:t>
+            </w:r>
+          </w:p>
+        </w:tc>
+      </w:tr>
+      <w:tr>
+        <w:tc>
+          <w:tcPr>
+            <w:tcW w:w="5070" w:type="dxa"/>
+          </w:tcPr>
+          <w:p>
+            <w:r>
+              <w:t>Filtrar por producto y rango de fechas</w:t>
+            </w:r>
+          </w:p>
+        </w:tc>
+        <w:tc>
+          <w:tcPr>
+            <w:tcW w:w="4275" w:type="dxa"/>
+          </w:tcPr>
+          <w:p>
+            <w:r>
+              <w:t>O(n</w:t>
+            </w:r>
+            <w:r>
+              <w:t>)</w:t>
+            </w:r>
+          </w:p>
+        </w:tc>
+      </w:tr>
+      <w:tr>
+        <w:tc>
+          <w:tcPr>
+            <w:tcW w:w="5070" w:type="dxa"/>
+          </w:tcPr>
+          <w:p>
+            <w:r>
+              <w:t>Agrupar por país y acumular métricas</w:t>
+            </w:r>
+          </w:p>
+        </w:tc>
+        <w:tc>
+          <w:tcPr>
+            <w:tcW w:w="4275" w:type="dxa"/>
+          </w:tcPr>
+          <w:p>
+            <w:r>
+              <w:t>O(n)</w:t>
+            </w:r>
+          </w:p>
+        </w:tc>
+      </w:tr>
+      <w:tr>
+        <w:tc>
+          <w:tcPr>
+            <w:tcW w:w="5070" w:type="dxa"/>
+          </w:tcPr>
+          <w:p>
+            <w:r>
+              <w:t>Calcular eficiencia y ordenar países</w:t>
+            </w:r>
+          </w:p>
+        </w:tc>
+        <w:tc>
+          <w:tcPr>
+            <w:tcW w:w="4275" w:type="dxa"/>
+          </w:tcPr>
+          <w:p>
+            <w:r>
+              <w:t>O(m log m), donde m = número de paíse</w:t>
+            </w:r>
+            <w:r>
+              <w:t>s</w:t>
+            </w:r>
+          </w:p>
+        </w:tc>
+      </w:tr>
+      <w:tr>
+        <w:tc>
+          <w:tcPr>
+            <w:tcW w:w="5070" w:type="dxa"/>
+          </w:tcPr>
+          <w:p>
+            <w:pPr>
+              <w:rPr>
+                <w:b/>
+                <w:bCs/>
+                <w:i/>
+                <w:iCs/>
+              </w:rPr>
+            </w:pPr>
+            <w:r>
+              <w:rPr>
+                <w:b/>
+                <w:bCs/>
+                <w:i/>
+                <w:iCs/>
+              </w:rPr>
+              <w:t>TOTAL</w:t>
+            </w:r>
+          </w:p>
+        </w:tc>
+        <w:tc>
+          <w:tcPr>
+            <w:tcW w:w="4275" w:type="dxa"/>
+          </w:tcPr>
+          <w:p>
+            <w:pPr>
+              <w:rPr>
+                <w:b/>
+                <w:bCs/>
+                <w:i/>
+                <w:iCs/>
+              </w:rPr>
+            </w:pPr>
+            <w:r>
+              <w:rPr>
+                <w:b/>
+                <w:bCs/>
+                <w:i/>
+                <w:iCs/>
+              </w:rPr>
+              <w:t>O(n + m log m)</w:t>
+            </w:r>
+          </w:p>
+        </w:tc>
+      </w:tr>
+    </w:tbl>
+    <w:p>
+      <w:pPr>
+        <w:rPr>
+          <w:rFonts w:ascii="Dax-Regular" w:hAnsi="Dax-Regular"/>
+        </w:rPr>
+      </w:pPr>
+    </w:p>
+    <w:p>
+      <w:pPr>
+        <w:pStyle w:val="Ttulo2"/>
+        <w:rPr>
+          <w:b/>
+          <w:bCs/>
+        </w:rPr>
+      </w:pPr>
+      <w:r>
+        <w:rPr>
+          <w:b/>
+          <w:bCs/>
+        </w:rPr>
+        <w:t>Análisis</w:t>
+      </w:r>
+    </w:p>
+    <w:p>
+      <w:r>
+        <w:t>El algoritmo funciona con una complejidad bastante optima</w:t>
+      </w:r>
+      <w:r>
+        <w:t xml:space="preserve">, manteniendo una complejidad de </w:t>
+      </w:r>
+      <w:r>
+        <w:t>O(N) en la parte de filtrado de productos y una complejidad de m log m en la parte del número de países que nos piden</w:t>
       </w:r>
     </w:p>
     <w:sectPr>
-      <w:headerReference w:type="default" r:id="rId12"/>
-      <w:footerReference w:type="default" r:id="rId13"/>
-      <w:headerReference w:type="first" r:id="rId14"/>
-      <w:footerReference w:type="first" r:id="rId15"/>
+      <w:headerReference w:type="default" r:id="rId16"/>
+      <w:footerReference w:type="default" r:id="rId17"/>
+      <w:headerReference w:type="first" r:id="rId18"/>
+      <w:footerReference w:type="first" r:id="rId19"/>
       <w:pgSz w:w="12240" w:h="15840"/>
       <w:pgMar w:top="1440" w:right="1440" w:bottom="1440" w:left="1440" w:header="720" w:footer="720" w:gutter="0"/>
       <w:cols w:space="720"/>
@@ -1715,9 +3103,6 @@
         </w:tcPr>
         <w:p>
           <w:r>
-            <w:rPr>
-              <w:noProof/>
-            </w:rPr>
             <w:drawing>
               <wp:inline distT="0" distB="0" distL="0" distR="0" wp14:anchorId="3BB22A4B" wp14:editId="3C60B0AD">
                 <wp:extent cx="1260000" cy="587046"/>
@@ -1771,7 +3156,6 @@
             <w:rPr>
               <w:rFonts w:ascii="Dax-Regular" w:hAnsi="Dax-Regular"/>
               <w:color w:val="000000" w:themeColor="text1"/>
-              <w:lang w:val="es-CO"/>
             </w:rPr>
           </w:pPr>
           <w:r>
@@ -1780,7 +3164,6 @@
               <w:b/>
               <w:bCs/>
               <w:color w:val="000000" w:themeColor="text1"/>
-              <w:lang w:val="es-CO"/>
             </w:rPr>
             <w:t>Departamento de Ingeniería de Sistemas y Computación</w:t>
           </w:r>
@@ -1792,7 +3175,6 @@
               <w:b/>
               <w:bCs/>
               <w:color w:val="000000" w:themeColor="text1"/>
-              <w:lang w:val="es-CO"/>
             </w:rPr>
           </w:pPr>
           <w:r>
@@ -1801,7 +3183,6 @@
               <w:b/>
               <w:bCs/>
               <w:color w:val="000000" w:themeColor="text1"/>
-              <w:lang w:val="es-CO"/>
             </w:rPr>
             <w:t>Estructuras de Datos y Algoritmos</w:t>
           </w:r>
@@ -1813,7 +3194,6 @@
               <w:b/>
               <w:bCs/>
               <w:color w:val="000000" w:themeColor="text1"/>
-              <w:lang w:val="es-CO"/>
             </w:rPr>
           </w:pPr>
           <w:r>
@@ -1822,7 +3202,6 @@
               <w:b/>
               <w:bCs/>
               <w:color w:val="000000" w:themeColor="text1"/>
-              <w:lang w:val="es-CO"/>
             </w:rPr>
             <w:t>ISIS-1225</w:t>
           </w:r>
@@ -1838,8 +3217,7 @@
           </w:pPr>
           <w:r>
             <w:rPr>
-              <w:noProof/>
-              <w:lang w:val="es-CO" w:eastAsia="es-CO"/>
+              <w:lang w:eastAsia="es-CO"/>
             </w:rPr>
             <w:drawing>
               <wp:inline distT="0" distB="0" distL="0" distR="0" wp14:anchorId="42B26317" wp14:editId="50903508">
@@ -4053,6 +5431,9 @@
     <w:name w:val="Normal"/>
     <w:qFormat/>
     <w:rsid w:val="00B317A4"/>
+    <w:rPr>
+      <w:lang w:val="es-CO"/>
+    </w:rPr>
   </w:style>
   <w:style w:type="paragraph" w:styleId="Ttulo1">
     <w:name w:val="heading 1"/>
@@ -4261,7 +5642,6 @@
   <w:style w:type="character" w:default="1" w:styleId="Fuentedeprrafopredeter">
     <w:name w:val="Default Paragraph Font"/>
     <w:uiPriority w:val="1"/>
-    <w:semiHidden/>
     <w:unhideWhenUsed/>
   </w:style>
   <w:style w:type="table" w:default="1" w:styleId="Tablanormal">
@@ -4507,7 +5887,7 @@
       <w:szCs w:val="28"/>
     </w:rPr>
   </w:style>
-  <w:style w:type="character" w:styleId="Textoennegrita">
+  <w:style w:type="character" w:styleId="Fuerte">
     <w:name w:val="Strong"/>
     <w:basedOn w:val="Fuentedeprrafopredeter"/>
     <w:uiPriority w:val="22"/>
@@ -5378,6 +6758,25 @@
       <w:color w:val="605E5C"/>
       <w:shd w:val="clear" w:color="auto" w:fill="E1DFDD"/>
     </w:rPr>
+  </w:style>
+  <w:style w:type="paragraph" w:customStyle="1" w:styleId="selectable-text">
+    <w:name w:val="selectable-text"/>
+    <w:basedOn w:val="Normal"/>
+    <w:rsid w:val="00A63B69"/>
+    <w:pPr>
+      <w:spacing w:before="100" w:beforeAutospacing="1" w:after="100" w:afterAutospacing="1" w:line="240" w:lineRule="auto"/>
+    </w:pPr>
+    <w:rPr>
+      <w:rFonts w:ascii="Times New Roman" w:eastAsia="Times New Roman" w:hAnsi="Times New Roman" w:cs="Times New Roman"/>
+      <w:sz w:val="24"/>
+      <w:szCs w:val="24"/>
+      <w:lang w:eastAsia="es-CO"/>
+    </w:rPr>
+  </w:style>
+  <w:style w:type="character" w:customStyle="1" w:styleId="selectable-text1">
+    <w:name w:val="selectable-text1"/>
+    <w:basedOn w:val="Fuentedeprrafopredeter"/>
+    <w:rsid w:val="00A63B69"/>
   </w:style>
 </w:styles>
 </file>
@@ -5678,19 +7077,54 @@
 </file>
 
 <file path=customXml/item1.xml><?xml version="1.0" encoding="utf-8"?>
-<?mso-contentType ?>
-<FormTemplates xmlns="http://schemas.microsoft.com/sharepoint/v3/contenttype/forms">
-  <Display>DocumentLibraryForm</Display>
-  <Edit>DocumentLibraryForm</Edit>
-  <New>DocumentLibraryForm</New>
-</FormTemplates>
+<p:properties xmlns:p="http://schemas.microsoft.com/office/2006/metadata/properties" xmlns:xsi="http://www.w3.org/2001/XMLSchema-instance" xmlns:pc="http://schemas.microsoft.com/office/infopath/2007/PartnerControls">
+  <documentManagement>
+    <SharedWithUsers xmlns="85e30bcc-d76c-4413-8e4d-2dce22fb0743">
+      <UserInfo>
+        <DisplayName>Dario Ernesto Correal Torres</DisplayName>
+        <AccountId>15</AccountId>
+        <AccountType/>
+      </UserInfo>
+      <UserInfo>
+        <DisplayName>Carlos Andres Lozano Garzon</DisplayName>
+        <AccountId>13</AccountId>
+        <AccountType/>
+      </UserInfo>
+      <UserInfo>
+        <DisplayName>Mario  Fernando De la rosa Rosero</DisplayName>
+        <AccountId>16</AccountId>
+        <AccountType/>
+      </UserInfo>
+      <UserInfo>
+        <DisplayName>Arturo Henao Chaparro</DisplayName>
+        <AccountId>48</AccountId>
+        <AccountType/>
+      </UserInfo>
+      <UserInfo>
+        <DisplayName>Luis Esteban Florez Salamanca</DisplayName>
+        <AccountId>33</AccountId>
+        <AccountType/>
+      </UserInfo>
+      <UserInfo>
+        <DisplayName>Christian Camilo Aparicio Baquen</DisplayName>
+        <AccountId>50</AccountId>
+        <AccountType/>
+      </UserInfo>
+      <UserInfo>
+        <DisplayName>Ivan David Salazar Cardenas</DisplayName>
+        <AccountId>52</AccountId>
+        <AccountType/>
+      </UserInfo>
+    </SharedWithUsers>
+    <TaxCatchAll xmlns="85e30bcc-d76c-4413-8e4d-2dce22fb0743" xsi:nil="true"/>
+    <lcf76f155ced4ddcb4097134ff3c332f xmlns="164883f8-7691-4ecf-b54a-664c0d0edefe">
+      <Terms xmlns="http://schemas.microsoft.com/office/infopath/2007/PartnerControls"/>
+    </lcf76f155ced4ddcb4097134ff3c332f>
+  </documentManagement>
+</p:properties>
 </file>
 
 <file path=customXml/item2.xml><?xml version="1.0" encoding="utf-8"?>
-<b:Sources xmlns:b="http://schemas.openxmlformats.org/officeDocument/2006/bibliography" xmlns="http://schemas.openxmlformats.org/officeDocument/2006/bibliography" SelectedStyle="\APASixthEditionOfficeOnline.xsl" StyleName="APA" Version="6"/>
-</file>
-
-<file path=customXml/item3.xml><?xml version="1.0" encoding="utf-8"?>
 <ct:contentTypeSchema xmlns:ct="http://schemas.microsoft.com/office/2006/metadata/contentType" xmlns:ma="http://schemas.microsoft.com/office/2006/metadata/properties/metaAttributes" ct:_="" ma:_="" ma:contentTypeName="Documento" ma:contentTypeID="0x01010023858CF01A2EF24688B692775F4C60A4" ma:contentTypeVersion="15" ma:contentTypeDescription="Crear nuevo documento." ma:contentTypeScope="" ma:versionID="a4df9e4b793c0fa050084ef4feafa589">
   <xsd:schema xmlns:xsd="http://www.w3.org/2001/XMLSchema" xmlns:xs="http://www.w3.org/2001/XMLSchema" xmlns:p="http://schemas.microsoft.com/office/2006/metadata/properties" xmlns:ns2="164883f8-7691-4ecf-b54a-664c0d0edefe" xmlns:ns3="85e30bcc-d76c-4413-8e4d-2dce22fb0743" targetNamespace="http://schemas.microsoft.com/office/2006/metadata/properties" ma:root="true" ma:fieldsID="067b7080d2289f9ba15465beea7d18a8" ns2:_="" ns3:_="">
     <xsd:import namespace="164883f8-7691-4ecf-b54a-664c0d0edefe"/>
@@ -5927,71 +7361,31 @@
 </ct:contentTypeSchema>
 </file>
 
+<file path=customXml/item3.xml><?xml version="1.0" encoding="utf-8"?>
+<b:Sources xmlns:b="http://schemas.openxmlformats.org/officeDocument/2006/bibliography" xmlns="http://schemas.openxmlformats.org/officeDocument/2006/bibliography" SelectedStyle="\APASixthEditionOfficeOnline.xsl" StyleName="APA" Version="6"/>
+</file>
+
 <file path=customXml/item4.xml><?xml version="1.0" encoding="utf-8"?>
-<p:properties xmlns:p="http://schemas.microsoft.com/office/2006/metadata/properties" xmlns:xsi="http://www.w3.org/2001/XMLSchema-instance" xmlns:pc="http://schemas.microsoft.com/office/infopath/2007/PartnerControls">
-  <documentManagement>
-    <SharedWithUsers xmlns="85e30bcc-d76c-4413-8e4d-2dce22fb0743">
-      <UserInfo>
-        <DisplayName>Dario Ernesto Correal Torres</DisplayName>
-        <AccountId>15</AccountId>
-        <AccountType/>
-      </UserInfo>
-      <UserInfo>
-        <DisplayName>Carlos Andres Lozano Garzon</DisplayName>
-        <AccountId>13</AccountId>
-        <AccountType/>
-      </UserInfo>
-      <UserInfo>
-        <DisplayName>Mario  Fernando De la rosa Rosero</DisplayName>
-        <AccountId>16</AccountId>
-        <AccountType/>
-      </UserInfo>
-      <UserInfo>
-        <DisplayName>Arturo Henao Chaparro</DisplayName>
-        <AccountId>48</AccountId>
-        <AccountType/>
-      </UserInfo>
-      <UserInfo>
-        <DisplayName>Luis Esteban Florez Salamanca</DisplayName>
-        <AccountId>33</AccountId>
-        <AccountType/>
-      </UserInfo>
-      <UserInfo>
-        <DisplayName>Christian Camilo Aparicio Baquen</DisplayName>
-        <AccountId>50</AccountId>
-        <AccountType/>
-      </UserInfo>
-      <UserInfo>
-        <DisplayName>Ivan David Salazar Cardenas</DisplayName>
-        <AccountId>52</AccountId>
-        <AccountType/>
-      </UserInfo>
-    </SharedWithUsers>
-    <TaxCatchAll xmlns="85e30bcc-d76c-4413-8e4d-2dce22fb0743" xsi:nil="true"/>
-    <lcf76f155ced4ddcb4097134ff3c332f xmlns="164883f8-7691-4ecf-b54a-664c0d0edefe">
-      <Terms xmlns="http://schemas.microsoft.com/office/infopath/2007/PartnerControls"/>
-    </lcf76f155ced4ddcb4097134ff3c332f>
-  </documentManagement>
-</p:properties>
+<?mso-contentType ?>
+<FormTemplates xmlns="http://schemas.microsoft.com/sharepoint/v3/contenttype/forms">
+  <Display>DocumentLibraryForm</Display>
+  <Edit>DocumentLibraryForm</Edit>
+  <New>DocumentLibraryForm</New>
+</FormTemplates>
 </file>
 
 <file path=customXml/itemProps1.xml><?xml version="1.0" encoding="utf-8"?>
-<ds:datastoreItem xmlns:ds="http://schemas.openxmlformats.org/officeDocument/2006/customXml" ds:itemID="{58AFF83A-2C1F-4B0C-9BCE-EE49F5226348}">
+<ds:datastoreItem xmlns:ds="http://schemas.openxmlformats.org/officeDocument/2006/customXml" ds:itemID="{D3B4676A-CA48-4E6B-BABE-1535A7A288F6}">
   <ds:schemaRefs>
-    <ds:schemaRef ds:uri="http://schemas.microsoft.com/sharepoint/v3/contenttype/forms"/>
+    <ds:schemaRef ds:uri="http://schemas.microsoft.com/office/2006/metadata/properties"/>
+    <ds:schemaRef ds:uri="http://schemas.microsoft.com/office/infopath/2007/PartnerControls"/>
+    <ds:schemaRef ds:uri="85e30bcc-d76c-4413-8e4d-2dce22fb0743"/>
+    <ds:schemaRef ds:uri="164883f8-7691-4ecf-b54a-664c0d0edefe"/>
   </ds:schemaRefs>
 </ds:datastoreItem>
 </file>
 
 <file path=customXml/itemProps2.xml><?xml version="1.0" encoding="utf-8"?>
-<ds:datastoreItem xmlns:ds="http://schemas.openxmlformats.org/officeDocument/2006/customXml" ds:itemID="{794BE61C-5254-4531-868C-EC2590174185}">
-  <ds:schemaRefs>
-    <ds:schemaRef ds:uri="http://schemas.openxmlformats.org/officeDocument/2006/bibliography"/>
-  </ds:schemaRefs>
-</ds:datastoreItem>
-</file>
-
-<file path=customXml/itemProps3.xml><?xml version="1.0" encoding="utf-8"?>
 <ds:datastoreItem xmlns:ds="http://schemas.openxmlformats.org/officeDocument/2006/customXml" ds:itemID="{62F3E371-4CEE-4871-A936-27DA1639FADD}">
   <ds:schemaRefs>
     <ds:schemaRef ds:uri="http://schemas.microsoft.com/office/2006/metadata/contentType"/>
@@ -6010,13 +7404,18 @@
 </ds:datastoreItem>
 </file>
 
+<file path=customXml/itemProps3.xml><?xml version="1.0" encoding="utf-8"?>
+<ds:datastoreItem xmlns:ds="http://schemas.openxmlformats.org/officeDocument/2006/customXml" ds:itemID="{794BE61C-5254-4531-868C-EC2590174185}">
+  <ds:schemaRefs>
+    <ds:schemaRef ds:uri="http://schemas.openxmlformats.org/officeDocument/2006/bibliography"/>
+  </ds:schemaRefs>
+</ds:datastoreItem>
+</file>
+
 <file path=customXml/itemProps4.xml><?xml version="1.0" encoding="utf-8"?>
-<ds:datastoreItem xmlns:ds="http://schemas.openxmlformats.org/officeDocument/2006/customXml" ds:itemID="{D3B4676A-CA48-4E6B-BABE-1535A7A288F6}">
+<ds:datastoreItem xmlns:ds="http://schemas.openxmlformats.org/officeDocument/2006/customXml" ds:itemID="{58AFF83A-2C1F-4B0C-9BCE-EE49F5226348}">
   <ds:schemaRefs>
-    <ds:schemaRef ds:uri="http://schemas.microsoft.com/office/2006/metadata/properties"/>
-    <ds:schemaRef ds:uri="http://schemas.microsoft.com/office/infopath/2007/PartnerControls"/>
-    <ds:schemaRef ds:uri="85e30bcc-d76c-4413-8e4d-2dce22fb0743"/>
-    <ds:schemaRef ds:uri="164883f8-7691-4ecf-b54a-664c0d0edefe"/>
+    <ds:schemaRef ds:uri="http://schemas.microsoft.com/sharepoint/v3/contenttype/forms"/>
   </ds:schemaRefs>
 </ds:datastoreItem>
 </file>
</xml_diff>

<commit_message>
Analisis requerimientos 1 y 4
</commit_message>
<xml_diff>
--- a/Docs/ISIS1225 - AnalisisReto-TEMPLATE RETO.docx
+++ b/Docs/ISIS1225 - AnalisisReto-TEMPLATE RETO.docx
@@ -78,34 +78,7 @@
     </w:p>
     <w:p>
       <w:r>
-        <w:t>Plantilla para el documentar y analizar cada uno de los requerimientos.</w:t>
-      </w:r>
-    </w:p>
-    <w:p>
-      <w:pPr>
-        <w:pStyle w:val="Ttulo2"/>
-        <w:rPr>
-          <w:b/>
-          <w:bCs/>
-        </w:rPr>
-      </w:pPr>
-      <w:r>
-        <w:rPr>
-          <w:b/>
-          <w:bCs/>
-        </w:rPr>
-        <w:t>Descripción</w:t>
-      </w:r>
-    </w:p>
-    <w:p>
-      <w:r>
-        <w:t xml:space="preserve">Breve </w:t>
-      </w:r>
-      <w:r>
-        <w:t>descripción</w:t>
-      </w:r>
-      <w:r>
-        <w:t xml:space="preserve"> de como abordaron la implementación del requerimiento</w:t>
+        <w:t>Al cargar, agrupé los pedidos por producto y país en otra tabla de hash. Al consultar, fui directo a su lista, calculé los promedios y ordené por monto para mostrar los dos más altos.</w:t>
       </w:r>
     </w:p>
     <w:tbl>
@@ -145,15 +118,43 @@
             <w:tcW w:w="6300" w:type="dxa"/>
           </w:tcPr>
           <w:p>
+            <w:proofErr w:type="spellStart"/>
+            <w:proofErr w:type="gramStart"/>
             <w:r>
               <w:t>Catalog</w:t>
             </w:r>
+            <w:proofErr w:type="spellEnd"/>
             <w:r>
               <w:t xml:space="preserve"> </w:t>
             </w:r>
             <w:r>
-              <w:t>, anio, mes, descuento_min, descuento_max</w:t>
-            </w:r>
+              <w:t>,</w:t>
+            </w:r>
+            <w:proofErr w:type="gramEnd"/>
+            <w:r>
+              <w:t xml:space="preserve"> </w:t>
+            </w:r>
+            <w:proofErr w:type="spellStart"/>
+            <w:r>
+              <w:t>anio</w:t>
+            </w:r>
+            <w:proofErr w:type="spellEnd"/>
+            <w:r>
+              <w:t xml:space="preserve">, mes, </w:t>
+            </w:r>
+            <w:proofErr w:type="spellStart"/>
+            <w:r>
+              <w:t>descuento_min</w:t>
+            </w:r>
+            <w:proofErr w:type="spellEnd"/>
+            <w:r>
+              <w:t xml:space="preserve">, </w:t>
+            </w:r>
+            <w:proofErr w:type="spellStart"/>
+            <w:r>
+              <w:t>descuento_max</w:t>
+            </w:r>
+            <w:proofErr w:type="spellEnd"/>
           </w:p>
         </w:tc>
       </w:tr>
@@ -184,19 +185,99 @@
           </w:tcPr>
           <w:p>
             <w:r>
-              <w:t xml:space="preserve">Lista “resultado” con tiempo de ejecución del requerimiento en milisegundos, número total de pedidos que cumplieron el filtro, precio promedio de Price_per_Box, promedio de Discount_Pct, promedio de Marketing_Spend, promedio de Boxes_Shipped y los dos criterios con mayor amount de los que cumplen el criterio con los datos Order_ID, </w:t>
-            </w:r>
-            <w:r>
-              <w:t>Canal (Channel)</w:t>
+              <w:t xml:space="preserve">Lista “resultado” con tiempo de ejecución del requerimiento en milisegundos, número total de pedidos que cumplieron el filtro, precio promedio de </w:t>
+            </w:r>
+            <w:proofErr w:type="spellStart"/>
+            <w:r>
+              <w:t>Price_per_Box</w:t>
+            </w:r>
+            <w:proofErr w:type="spellEnd"/>
+            <w:r>
+              <w:t xml:space="preserve">, promedio de </w:t>
+            </w:r>
+            <w:proofErr w:type="spellStart"/>
+            <w:r>
+              <w:t>Discount_Pct</w:t>
+            </w:r>
+            <w:proofErr w:type="spellEnd"/>
+            <w:r>
+              <w:t xml:space="preserve">, promedio de </w:t>
+            </w:r>
+            <w:proofErr w:type="spellStart"/>
+            <w:r>
+              <w:t>Marketing_Spend</w:t>
+            </w:r>
+            <w:proofErr w:type="spellEnd"/>
+            <w:r>
+              <w:t xml:space="preserve">, promedio de </w:t>
+            </w:r>
+            <w:proofErr w:type="spellStart"/>
+            <w:r>
+              <w:t>Boxes_Shipped</w:t>
+            </w:r>
+            <w:proofErr w:type="spellEnd"/>
+            <w:r>
+              <w:t xml:space="preserve"> y los dos criterios con mayor </w:t>
+            </w:r>
+            <w:proofErr w:type="spellStart"/>
+            <w:r>
+              <w:t>amount</w:t>
+            </w:r>
+            <w:proofErr w:type="spellEnd"/>
+            <w:r>
+              <w:t xml:space="preserve"> de los que cumplen el criterio con los datos </w:t>
+            </w:r>
+            <w:proofErr w:type="spellStart"/>
+            <w:r>
+              <w:t>Order_ID</w:t>
+            </w:r>
+            <w:proofErr w:type="spellEnd"/>
+            <w:r>
+              <w:t xml:space="preserve">, </w:t>
+            </w:r>
+            <w:r>
+              <w:t>Canal (</w:t>
+            </w:r>
+            <w:proofErr w:type="spellStart"/>
+            <w:r>
+              <w:t>Channel</w:t>
+            </w:r>
+            <w:proofErr w:type="spellEnd"/>
+            <w:r>
+              <w:t>)</w:t>
             </w:r>
             <w:r>
               <w:t>,</w:t>
             </w:r>
             <w:r>
-              <w:t xml:space="preserve"> Fecha (Order_Date)</w:t>
-            </w:r>
-            <w:r>
-              <w:t>, Cajas enviadas (Boxes_Shipped) y Monto (Amount)</w:t>
+              <w:t xml:space="preserve"> Fecha (</w:t>
+            </w:r>
+            <w:proofErr w:type="spellStart"/>
+            <w:r>
+              <w:t>Order_Date</w:t>
+            </w:r>
+            <w:proofErr w:type="spellEnd"/>
+            <w:r>
+              <w:t>)</w:t>
+            </w:r>
+            <w:r>
+              <w:t>, Cajas enviadas (</w:t>
+            </w:r>
+            <w:proofErr w:type="spellStart"/>
+            <w:r>
+              <w:t>Boxes_Shipped</w:t>
+            </w:r>
+            <w:proofErr w:type="spellEnd"/>
+            <w:r>
+              <w:t>) y Monto (</w:t>
+            </w:r>
+            <w:proofErr w:type="spellStart"/>
+            <w:r>
+              <w:t>Amount</w:t>
+            </w:r>
+            <w:proofErr w:type="spellEnd"/>
+            <w:r>
+              <w:t>)</w:t>
             </w:r>
           </w:p>
         </w:tc>
@@ -349,6 +430,7 @@
                 <w:bCs/>
               </w:rPr>
             </w:pPr>
+            <w:proofErr w:type="gramStart"/>
             <w:r>
               <w:rPr>
                 <w:rFonts w:ascii="Arial" w:eastAsia="Times New Roman" w:hAnsi="Arial" w:cs="Arial"/>
@@ -356,23 +438,9 @@
                 <w:szCs w:val="20"/>
                 <w:lang w:eastAsia="es-CO"/>
               </w:rPr>
-              <w:t>O(1)</w:t>
-            </w:r>
-          </w:p>
-        </w:tc>
-      </w:tr>
-      <w:tr>
-        <w:tc>
-          <w:tcPr>
-            <w:tcW w:w="5070" w:type="dxa"/>
-          </w:tcPr>
-          <w:p>
-            <w:pPr>
-              <w:rPr>
-                <w:b/>
-                <w:bCs/>
-              </w:rPr>
-            </w:pPr>
+              <w:t>O(</w:t>
+            </w:r>
+            <w:proofErr w:type="gramEnd"/>
             <w:r>
               <w:rPr>
                 <w:rFonts w:ascii="Arial" w:eastAsia="Times New Roman" w:hAnsi="Arial" w:cs="Arial"/>
@@ -380,13 +448,15 @@
                 <w:szCs w:val="20"/>
                 <w:lang w:eastAsia="es-CO"/>
               </w:rPr>
-              <w:t>Paso 2: Se busca la llave en la tabla de hash de Linear Probing y se obtiene la lista de pedidos de ese mes</w:t>
-            </w:r>
-          </w:p>
-        </w:tc>
-        <w:tc>
-          <w:tcPr>
-            <w:tcW w:w="4275" w:type="dxa"/>
+              <w:t>1)</w:t>
+            </w:r>
+          </w:p>
+        </w:tc>
+      </w:tr>
+      <w:tr>
+        <w:tc>
+          <w:tcPr>
+            <w:tcW w:w="5070" w:type="dxa"/>
           </w:tcPr>
           <w:p>
             <w:pPr>
@@ -402,23 +472,9 @@
                 <w:szCs w:val="20"/>
                 <w:lang w:eastAsia="es-CO"/>
               </w:rPr>
-              <w:t xml:space="preserve">O(1) </w:t>
-            </w:r>
-          </w:p>
-        </w:tc>
-      </w:tr>
-      <w:tr>
-        <w:tc>
-          <w:tcPr>
-            <w:tcW w:w="5070" w:type="dxa"/>
-          </w:tcPr>
-          <w:p>
-            <w:pPr>
-              <w:rPr>
-                <w:b/>
-                <w:bCs/>
-              </w:rPr>
-            </w:pPr>
+              <w:t xml:space="preserve">Paso 2: Se busca la llave en la tabla de hash de Linear </w:t>
+            </w:r>
+            <w:proofErr w:type="spellStart"/>
             <w:r>
               <w:rPr>
                 <w:rFonts w:ascii="Arial" w:eastAsia="Times New Roman" w:hAnsi="Arial" w:cs="Arial"/>
@@ -426,21 +482,9 @@
                 <w:szCs w:val="20"/>
                 <w:lang w:eastAsia="es-CO"/>
               </w:rPr>
-              <w:t>Paso 3: Se crea la lista vacía de filtrados y se inicializa el acumulador del monto</w:t>
-            </w:r>
-          </w:p>
-        </w:tc>
-        <w:tc>
-          <w:tcPr>
-            <w:tcW w:w="4275" w:type="dxa"/>
-          </w:tcPr>
-          <w:p>
-            <w:pPr>
-              <w:rPr>
-                <w:b/>
-                <w:bCs/>
-              </w:rPr>
-            </w:pPr>
+              <w:t>Probing</w:t>
+            </w:r>
+            <w:proofErr w:type="spellEnd"/>
             <w:r>
               <w:rPr>
                 <w:rFonts w:ascii="Arial" w:eastAsia="Times New Roman" w:hAnsi="Arial" w:cs="Arial"/>
@@ -448,15 +492,13 @@
                 <w:szCs w:val="20"/>
                 <w:lang w:eastAsia="es-CO"/>
               </w:rPr>
-              <w:t>O(1)</w:t>
-            </w:r>
-          </w:p>
-        </w:tc>
-      </w:tr>
-      <w:tr>
-        <w:tc>
-          <w:tcPr>
-            <w:tcW w:w="5070" w:type="dxa"/>
+              <w:t xml:space="preserve"> y se obtiene la lista de pedidos de ese mes</w:t>
+            </w:r>
+          </w:p>
+        </w:tc>
+        <w:tc>
+          <w:tcPr>
+            <w:tcW w:w="4275" w:type="dxa"/>
           </w:tcPr>
           <w:p>
             <w:pPr>
@@ -465,6 +507,7 @@
                 <w:bCs/>
               </w:rPr>
             </w:pPr>
+            <w:proofErr w:type="gramStart"/>
             <w:r>
               <w:rPr>
                 <w:rFonts w:ascii="Arial" w:eastAsia="Times New Roman" w:hAnsi="Arial" w:cs="Arial"/>
@@ -472,8 +515,9 @@
                 <w:szCs w:val="20"/>
                 <w:lang w:eastAsia="es-CO"/>
               </w:rPr>
-              <w:t>Paso 4: Se recorren los m pedidos del mes</w:t>
-            </w:r>
+              <w:t>O(</w:t>
+            </w:r>
+            <w:proofErr w:type="gramEnd"/>
             <w:r>
               <w:rPr>
                 <w:rFonts w:ascii="Arial" w:eastAsia="Times New Roman" w:hAnsi="Arial" w:cs="Arial"/>
@@ -481,8 +525,23 @@
                 <w:szCs w:val="20"/>
                 <w:lang w:eastAsia="es-CO"/>
               </w:rPr>
-              <w:t xml:space="preserve">, se </w:t>
-            </w:r>
+              <w:t xml:space="preserve">1) </w:t>
+            </w:r>
+          </w:p>
+        </w:tc>
+      </w:tr>
+      <w:tr>
+        <w:tc>
+          <w:tcPr>
+            <w:tcW w:w="5070" w:type="dxa"/>
+          </w:tcPr>
+          <w:p>
+            <w:pPr>
+              <w:rPr>
+                <w:b/>
+                <w:bCs/>
+              </w:rPr>
+            </w:pPr>
             <w:r>
               <w:rPr>
                 <w:rFonts w:ascii="Arial" w:eastAsia="Times New Roman" w:hAnsi="Arial" w:cs="Arial"/>
@@ -490,7 +549,7 @@
                 <w:szCs w:val="20"/>
                 <w:lang w:eastAsia="es-CO"/>
               </w:rPr>
-              <w:t>lee el descuento, se compara con el rango y, si cumple, se agrega al final de filtrados y se suma su Amount</w:t>
+              <w:t>Paso 3: Se crea la lista vacía de filtrados y se inicializa el acumulador del monto</w:t>
             </w:r>
           </w:p>
         </w:tc>
@@ -505,6 +564,7 @@
                 <w:bCs/>
               </w:rPr>
             </w:pPr>
+            <w:proofErr w:type="gramStart"/>
             <w:r>
               <w:rPr>
                 <w:rFonts w:ascii="Arial" w:eastAsia="Times New Roman" w:hAnsi="Arial" w:cs="Arial"/>
@@ -512,8 +572,9 @@
                 <w:szCs w:val="20"/>
                 <w:lang w:eastAsia="es-CO"/>
               </w:rPr>
-              <w:t>O(m)</w:t>
-            </w:r>
+              <w:t>O(</w:t>
+            </w:r>
+            <w:proofErr w:type="gramEnd"/>
             <w:r>
               <w:rPr>
                 <w:rFonts w:ascii="Arial" w:eastAsia="Times New Roman" w:hAnsi="Arial" w:cs="Arial"/>
@@ -521,7 +582,7 @@
                 <w:szCs w:val="20"/>
                 <w:lang w:eastAsia="es-CO"/>
               </w:rPr>
-              <w:t>, donde m = pedidos filtrados del mes</w:t>
+              <w:t>1)</w:t>
             </w:r>
           </w:p>
         </w:tc>
@@ -545,21 +606,8 @@
                 <w:szCs w:val="20"/>
                 <w:lang w:eastAsia="es-CO"/>
               </w:rPr>
-              <w:t>Paso 5: Se arma el diccionario de resultado con el total y el monto acumulado</w:t>
-            </w:r>
-          </w:p>
-        </w:tc>
-        <w:tc>
-          <w:tcPr>
-            <w:tcW w:w="4275" w:type="dxa"/>
-          </w:tcPr>
-          <w:p>
-            <w:pPr>
-              <w:rPr>
-                <w:b/>
-                <w:bCs/>
-              </w:rPr>
-            </w:pPr>
+              <w:t>Paso 4: Se recorren los m pedidos del mes</w:t>
+            </w:r>
             <w:r>
               <w:rPr>
                 <w:rFonts w:ascii="Arial" w:eastAsia="Times New Roman" w:hAnsi="Arial" w:cs="Arial"/>
@@ -567,23 +615,8 @@
                 <w:szCs w:val="20"/>
                 <w:lang w:eastAsia="es-CO"/>
               </w:rPr>
-              <w:t>O(1)</w:t>
-            </w:r>
-          </w:p>
-        </w:tc>
-      </w:tr>
-      <w:tr>
-        <w:tc>
-          <w:tcPr>
-            <w:tcW w:w="5070" w:type="dxa"/>
-          </w:tcPr>
-          <w:p>
-            <w:pPr>
-              <w:rPr>
-                <w:b/>
-                <w:bCs/>
-              </w:rPr>
-            </w:pPr>
+              <w:t xml:space="preserve">, se </w:t>
+            </w:r>
             <w:r>
               <w:rPr>
                 <w:rFonts w:ascii="Arial" w:eastAsia="Times New Roman" w:hAnsi="Arial" w:cs="Arial"/>
@@ -591,22 +624,31 @@
                 <w:szCs w:val="20"/>
                 <w:lang w:eastAsia="es-CO"/>
               </w:rPr>
-              <w:t>Paso 6: Se recorren los pedidos filtrados para sumar Price_per_Box y Boxes_Shipped</w:t>
-            </w:r>
-          </w:p>
-        </w:tc>
-        <w:tc>
-          <w:tcPr>
-            <w:tcW w:w="4275" w:type="dxa"/>
-          </w:tcPr>
-          <w:p>
-            <w:pPr>
+              <w:t xml:space="preserve">lee el descuento, se compara con el rango y, si cumple, se agrega al final de filtrados y se suma su </w:t>
+            </w:r>
+            <w:proofErr w:type="spellStart"/>
+            <w:r>
               <w:rPr>
                 <w:rFonts w:ascii="Arial" w:eastAsia="Times New Roman" w:hAnsi="Arial" w:cs="Arial"/>
                 <w:sz w:val="20"/>
                 <w:szCs w:val="20"/>
                 <w:lang w:eastAsia="es-CO"/>
               </w:rPr>
+              <w:t>Amount</w:t>
+            </w:r>
+            <w:proofErr w:type="spellEnd"/>
+          </w:p>
+        </w:tc>
+        <w:tc>
+          <w:tcPr>
+            <w:tcW w:w="4275" w:type="dxa"/>
+          </w:tcPr>
+          <w:p>
+            <w:pPr>
+              <w:rPr>
+                <w:b/>
+                <w:bCs/>
+              </w:rPr>
             </w:pPr>
             <w:r>
               <w:rPr>
@@ -615,7 +657,7 @@
                 <w:szCs w:val="20"/>
                 <w:lang w:eastAsia="es-CO"/>
               </w:rPr>
-              <w:t>O(</w:t>
+              <w:t>O(m)</w:t>
             </w:r>
             <w:r>
               <w:rPr>
@@ -624,8 +666,23 @@
                 <w:szCs w:val="20"/>
                 <w:lang w:eastAsia="es-CO"/>
               </w:rPr>
-              <w:t>n</w:t>
-            </w:r>
+              <w:t>, donde m = pedidos filtrados del mes</w:t>
+            </w:r>
+          </w:p>
+        </w:tc>
+      </w:tr>
+      <w:tr>
+        <w:tc>
+          <w:tcPr>
+            <w:tcW w:w="5070" w:type="dxa"/>
+          </w:tcPr>
+          <w:p>
+            <w:pPr>
+              <w:rPr>
+                <w:b/>
+                <w:bCs/>
+              </w:rPr>
+            </w:pPr>
             <w:r>
               <w:rPr>
                 <w:rFonts w:ascii="Arial" w:eastAsia="Times New Roman" w:hAnsi="Arial" w:cs="Arial"/>
@@ -633,8 +690,22 @@
                 <w:szCs w:val="20"/>
                 <w:lang w:eastAsia="es-CO"/>
               </w:rPr>
-              <w:t>)</w:t>
-            </w:r>
+              <w:t>Paso 5: Se arma el diccionario de resultado con el total y el monto acumulado</w:t>
+            </w:r>
+          </w:p>
+        </w:tc>
+        <w:tc>
+          <w:tcPr>
+            <w:tcW w:w="4275" w:type="dxa"/>
+          </w:tcPr>
+          <w:p>
+            <w:pPr>
+              <w:rPr>
+                <w:b/>
+                <w:bCs/>
+              </w:rPr>
+            </w:pPr>
+            <w:proofErr w:type="gramStart"/>
             <w:r>
               <w:rPr>
                 <w:rFonts w:ascii="Arial" w:eastAsia="Times New Roman" w:hAnsi="Arial" w:cs="Arial"/>
@@ -642,6 +713,122 @@
                 <w:szCs w:val="20"/>
                 <w:lang w:eastAsia="es-CO"/>
               </w:rPr>
+              <w:t>O(</w:t>
+            </w:r>
+            <w:proofErr w:type="gramEnd"/>
+            <w:r>
+              <w:rPr>
+                <w:rFonts w:ascii="Arial" w:eastAsia="Times New Roman" w:hAnsi="Arial" w:cs="Arial"/>
+                <w:sz w:val="20"/>
+                <w:szCs w:val="20"/>
+                <w:lang w:eastAsia="es-CO"/>
+              </w:rPr>
+              <w:t>1)</w:t>
+            </w:r>
+          </w:p>
+        </w:tc>
+      </w:tr>
+      <w:tr>
+        <w:tc>
+          <w:tcPr>
+            <w:tcW w:w="5070" w:type="dxa"/>
+          </w:tcPr>
+          <w:p>
+            <w:pPr>
+              <w:rPr>
+                <w:b/>
+                <w:bCs/>
+              </w:rPr>
+            </w:pPr>
+            <w:r>
+              <w:rPr>
+                <w:rFonts w:ascii="Arial" w:eastAsia="Times New Roman" w:hAnsi="Arial" w:cs="Arial"/>
+                <w:sz w:val="20"/>
+                <w:szCs w:val="20"/>
+                <w:lang w:eastAsia="es-CO"/>
+              </w:rPr>
+              <w:t xml:space="preserve">Paso 6: Se recorren los pedidos filtrados para sumar </w:t>
+            </w:r>
+            <w:proofErr w:type="spellStart"/>
+            <w:r>
+              <w:rPr>
+                <w:rFonts w:ascii="Arial" w:eastAsia="Times New Roman" w:hAnsi="Arial" w:cs="Arial"/>
+                <w:sz w:val="20"/>
+                <w:szCs w:val="20"/>
+                <w:lang w:eastAsia="es-CO"/>
+              </w:rPr>
+              <w:t>Price_per_Box</w:t>
+            </w:r>
+            <w:proofErr w:type="spellEnd"/>
+            <w:r>
+              <w:rPr>
+                <w:rFonts w:ascii="Arial" w:eastAsia="Times New Roman" w:hAnsi="Arial" w:cs="Arial"/>
+                <w:sz w:val="20"/>
+                <w:szCs w:val="20"/>
+                <w:lang w:eastAsia="es-CO"/>
+              </w:rPr>
+              <w:t xml:space="preserve"> y </w:t>
+            </w:r>
+            <w:proofErr w:type="spellStart"/>
+            <w:r>
+              <w:rPr>
+                <w:rFonts w:ascii="Arial" w:eastAsia="Times New Roman" w:hAnsi="Arial" w:cs="Arial"/>
+                <w:sz w:val="20"/>
+                <w:szCs w:val="20"/>
+                <w:lang w:eastAsia="es-CO"/>
+              </w:rPr>
+              <w:t>Boxes_Shipped</w:t>
+            </w:r>
+            <w:proofErr w:type="spellEnd"/>
+          </w:p>
+        </w:tc>
+        <w:tc>
+          <w:tcPr>
+            <w:tcW w:w="4275" w:type="dxa"/>
+          </w:tcPr>
+          <w:p>
+            <w:pPr>
+              <w:rPr>
+                <w:rFonts w:ascii="Arial" w:eastAsia="Times New Roman" w:hAnsi="Arial" w:cs="Arial"/>
+                <w:sz w:val="20"/>
+                <w:szCs w:val="20"/>
+                <w:lang w:eastAsia="es-CO"/>
+              </w:rPr>
+            </w:pPr>
+            <w:r>
+              <w:rPr>
+                <w:rFonts w:ascii="Arial" w:eastAsia="Times New Roman" w:hAnsi="Arial" w:cs="Arial"/>
+                <w:sz w:val="20"/>
+                <w:szCs w:val="20"/>
+                <w:lang w:eastAsia="es-CO"/>
+              </w:rPr>
+              <w:t>O(</w:t>
+            </w:r>
+            <w:r>
+              <w:rPr>
+                <w:rFonts w:ascii="Arial" w:eastAsia="Times New Roman" w:hAnsi="Arial" w:cs="Arial"/>
+                <w:sz w:val="20"/>
+                <w:szCs w:val="20"/>
+                <w:lang w:eastAsia="es-CO"/>
+              </w:rPr>
+              <w:t>n</w:t>
+            </w:r>
+            <w:r>
+              <w:rPr>
+                <w:rFonts w:ascii="Arial" w:eastAsia="Times New Roman" w:hAnsi="Arial" w:cs="Arial"/>
+                <w:sz w:val="20"/>
+                <w:szCs w:val="20"/>
+                <w:lang w:eastAsia="es-CO"/>
+              </w:rPr>
+              <w:t>)</w:t>
+            </w:r>
+            <w:r>
+              <w:rPr>
+                <w:rFonts w:ascii="Arial" w:eastAsia="Times New Roman" w:hAnsi="Arial" w:cs="Arial"/>
+                <w:sz w:val="20"/>
+                <w:szCs w:val="20"/>
+                <w:lang w:eastAsia="es-CO"/>
+              </w:rPr>
               <w:t xml:space="preserve">, donde n = pedidos filtrados para </w:t>
             </w:r>
           </w:p>
@@ -653,6 +840,7 @@
                 <w:lang w:val="en-US"/>
               </w:rPr>
             </w:pPr>
+            <w:proofErr w:type="spellStart"/>
             <w:r>
               <w:rPr>
                 <w:rFonts w:ascii="Arial" w:eastAsia="Times New Roman" w:hAnsi="Arial" w:cs="Arial"/>
@@ -660,8 +848,9 @@
                 <w:szCs w:val="20"/>
                 <w:lang w:val="en-US" w:eastAsia="es-CO"/>
               </w:rPr>
-              <w:t>Price_per_Box y Boxes_Shipped</w:t>
-            </w:r>
+              <w:t>Price_per_Box</w:t>
+            </w:r>
+            <w:proofErr w:type="spellEnd"/>
             <w:r>
               <w:rPr>
                 <w:rFonts w:ascii="Arial" w:eastAsia="Times New Roman" w:hAnsi="Arial" w:cs="Arial"/>
@@ -669,6 +858,26 @@
                 <w:szCs w:val="20"/>
                 <w:lang w:val="en-US" w:eastAsia="es-CO"/>
               </w:rPr>
+              <w:t xml:space="preserve"> y </w:t>
+            </w:r>
+            <w:proofErr w:type="spellStart"/>
+            <w:r>
+              <w:rPr>
+                <w:rFonts w:ascii="Arial" w:eastAsia="Times New Roman" w:hAnsi="Arial" w:cs="Arial"/>
+                <w:sz w:val="20"/>
+                <w:szCs w:val="20"/>
+                <w:lang w:val="en-US" w:eastAsia="es-CO"/>
+              </w:rPr>
+              <w:t>Boxes_Shipped</w:t>
+            </w:r>
+            <w:proofErr w:type="spellEnd"/>
+            <w:r>
+              <w:rPr>
+                <w:rFonts w:ascii="Arial" w:eastAsia="Times New Roman" w:hAnsi="Arial" w:cs="Arial"/>
+                <w:sz w:val="20"/>
+                <w:szCs w:val="20"/>
+                <w:lang w:val="en-US" w:eastAsia="es-CO"/>
+              </w:rPr>
               <w:t xml:space="preserve"> </w:t>
             </w:r>
           </w:p>
@@ -693,7 +902,6 @@
                 <w:szCs w:val="20"/>
                 <w:lang w:eastAsia="es-CO"/>
               </w:rPr>
-              <w:lastRenderedPageBreak/>
               <w:t>Paso 7: Se calculan los dos promedios con una división cada uno</w:t>
             </w:r>
           </w:p>
@@ -709,6 +917,7 @@
                 <w:bCs/>
               </w:rPr>
             </w:pPr>
+            <w:proofErr w:type="gramStart"/>
             <w:r>
               <w:rPr>
                 <w:rFonts w:ascii="Arial" w:eastAsia="Times New Roman" w:hAnsi="Arial" w:cs="Arial"/>
@@ -716,17 +925,9 @@
                 <w:szCs w:val="20"/>
                 <w:lang w:eastAsia="es-CO"/>
               </w:rPr>
-              <w:t>O(1)</w:t>
-            </w:r>
-          </w:p>
-        </w:tc>
-      </w:tr>
-      <w:tr>
-        <w:tc>
-          <w:tcPr>
-            <w:tcW w:w="5070" w:type="dxa"/>
-          </w:tcPr>
-          <w:p>
+              <w:t>O(</w:t>
+            </w:r>
+            <w:proofErr w:type="gramEnd"/>
             <w:r>
               <w:rPr>
                 <w:rFonts w:ascii="Arial" w:eastAsia="Times New Roman" w:hAnsi="Arial" w:cs="Arial"/>
@@ -734,8 +935,17 @@
                 <w:szCs w:val="20"/>
                 <w:lang w:eastAsia="es-CO"/>
               </w:rPr>
-              <w:t xml:space="preserve">Paso 8: Se ordenan los filtrados con Merge Sort </w:t>
-            </w:r>
+              <w:t>1)</w:t>
+            </w:r>
+          </w:p>
+        </w:tc>
+      </w:tr>
+      <w:tr>
+        <w:tc>
+          <w:tcPr>
+            <w:tcW w:w="5070" w:type="dxa"/>
+          </w:tcPr>
+          <w:p>
             <w:r>
               <w:rPr>
                 <w:rFonts w:ascii="Arial" w:eastAsia="Times New Roman" w:hAnsi="Arial" w:cs="Arial"/>
@@ -743,8 +953,10 @@
                 <w:szCs w:val="20"/>
                 <w:lang w:eastAsia="es-CO"/>
               </w:rPr>
-              <w:t xml:space="preserve">con el criterio </w:t>
-            </w:r>
+              <w:lastRenderedPageBreak/>
+              <w:t xml:space="preserve">Paso 8: Se ordenan los filtrados con </w:t>
+            </w:r>
+            <w:proofErr w:type="spellStart"/>
             <w:r>
               <w:rPr>
                 <w:rFonts w:ascii="Arial" w:eastAsia="Times New Roman" w:hAnsi="Arial" w:cs="Arial"/>
@@ -752,8 +964,9 @@
                 <w:szCs w:val="20"/>
                 <w:lang w:eastAsia="es-CO"/>
               </w:rPr>
-              <w:t>Discount_Pct descendente,</w:t>
-            </w:r>
+              <w:t>Merge</w:t>
+            </w:r>
+            <w:proofErr w:type="spellEnd"/>
             <w:r>
               <w:rPr>
                 <w:rFonts w:ascii="Arial" w:eastAsia="Times New Roman" w:hAnsi="Arial" w:cs="Arial"/>
@@ -761,8 +974,9 @@
                 <w:szCs w:val="20"/>
                 <w:lang w:eastAsia="es-CO"/>
               </w:rPr>
-              <w:t xml:space="preserve"> si son iguales</w:t>
-            </w:r>
+              <w:t xml:space="preserve"> </w:t>
+            </w:r>
+            <w:proofErr w:type="spellStart"/>
             <w:r>
               <w:rPr>
                 <w:rFonts w:ascii="Arial" w:eastAsia="Times New Roman" w:hAnsi="Arial" w:cs="Arial"/>
@@ -770,8 +984,9 @@
                 <w:szCs w:val="20"/>
                 <w:lang w:eastAsia="es-CO"/>
               </w:rPr>
-              <w:t xml:space="preserve"> Amount descendente,</w:t>
-            </w:r>
+              <w:t>Sort</w:t>
+            </w:r>
+            <w:proofErr w:type="spellEnd"/>
             <w:r>
               <w:rPr>
                 <w:rFonts w:ascii="Arial" w:eastAsia="Times New Roman" w:hAnsi="Arial" w:cs="Arial"/>
@@ -779,7 +994,7 @@
                 <w:szCs w:val="20"/>
                 <w:lang w:eastAsia="es-CO"/>
               </w:rPr>
-              <w:t xml:space="preserve"> y si siguen siendo iguales</w:t>
+              <w:t xml:space="preserve"> </w:t>
             </w:r>
             <w:r>
               <w:rPr>
@@ -788,23 +1003,19 @@
                 <w:szCs w:val="20"/>
                 <w:lang w:eastAsia="es-CO"/>
               </w:rPr>
-              <w:t xml:space="preserve"> luego Order_ID ascendente</w:t>
-            </w:r>
-          </w:p>
-        </w:tc>
-        <w:tc>
-          <w:tcPr>
-            <w:tcW w:w="4275" w:type="dxa"/>
-          </w:tcPr>
-          <w:p>
-            <w:pPr>
+              <w:t xml:space="preserve">con el criterio </w:t>
+            </w:r>
+            <w:proofErr w:type="spellStart"/>
+            <w:r>
               <w:rPr>
                 <w:rFonts w:ascii="Arial" w:eastAsia="Times New Roman" w:hAnsi="Arial" w:cs="Arial"/>
                 <w:sz w:val="20"/>
                 <w:szCs w:val="20"/>
                 <w:lang w:eastAsia="es-CO"/>
               </w:rPr>
-            </w:pPr>
+              <w:t>Discount_Pct</w:t>
+            </w:r>
+            <w:proofErr w:type="spellEnd"/>
             <w:r>
               <w:rPr>
                 <w:rFonts w:ascii="Arial" w:eastAsia="Times New Roman" w:hAnsi="Arial" w:cs="Arial"/>
@@ -812,7 +1023,7 @@
                 <w:szCs w:val="20"/>
                 <w:lang w:eastAsia="es-CO"/>
               </w:rPr>
-              <w:t>O</w:t>
+              <w:t xml:space="preserve"> descendente,</w:t>
             </w:r>
             <w:r>
               <w:rPr>
@@ -821,7 +1032,7 @@
                 <w:szCs w:val="20"/>
                 <w:lang w:eastAsia="es-CO"/>
               </w:rPr>
-              <w:t>(n log n</w:t>
+              <w:t xml:space="preserve"> si son iguales</w:t>
             </w:r>
             <w:r>
               <w:rPr>
@@ -830,8 +1041,9 @@
                 <w:szCs w:val="20"/>
                 <w:lang w:eastAsia="es-CO"/>
               </w:rPr>
-              <w:t>)</w:t>
-            </w:r>
+              <w:t xml:space="preserve"> </w:t>
+            </w:r>
+            <w:proofErr w:type="spellStart"/>
             <w:r>
               <w:rPr>
                 <w:rFonts w:ascii="Arial" w:eastAsia="Times New Roman" w:hAnsi="Arial" w:cs="Arial"/>
@@ -839,8 +1051,9 @@
                 <w:szCs w:val="20"/>
                 <w:lang w:eastAsia="es-CO"/>
               </w:rPr>
-              <w:t xml:space="preserve">, donde n = pedidos filtrados </w:t>
-            </w:r>
+              <w:t>Amount</w:t>
+            </w:r>
+            <w:proofErr w:type="spellEnd"/>
             <w:r>
               <w:rPr>
                 <w:rFonts w:ascii="Arial" w:eastAsia="Times New Roman" w:hAnsi="Arial" w:cs="Arial"/>
@@ -848,6 +1061,115 @@
                 <w:szCs w:val="20"/>
                 <w:lang w:eastAsia="es-CO"/>
               </w:rPr>
+              <w:t xml:space="preserve"> descendente,</w:t>
+            </w:r>
+            <w:r>
+              <w:rPr>
+                <w:rFonts w:ascii="Arial" w:eastAsia="Times New Roman" w:hAnsi="Arial" w:cs="Arial"/>
+                <w:sz w:val="20"/>
+                <w:szCs w:val="20"/>
+                <w:lang w:eastAsia="es-CO"/>
+              </w:rPr>
+              <w:t xml:space="preserve"> y si siguen siendo iguales</w:t>
+            </w:r>
+            <w:r>
+              <w:rPr>
+                <w:rFonts w:ascii="Arial" w:eastAsia="Times New Roman" w:hAnsi="Arial" w:cs="Arial"/>
+                <w:sz w:val="20"/>
+                <w:szCs w:val="20"/>
+                <w:lang w:eastAsia="es-CO"/>
+              </w:rPr>
+              <w:t xml:space="preserve"> luego </w:t>
+            </w:r>
+            <w:proofErr w:type="spellStart"/>
+            <w:r>
+              <w:rPr>
+                <w:rFonts w:ascii="Arial" w:eastAsia="Times New Roman" w:hAnsi="Arial" w:cs="Arial"/>
+                <w:sz w:val="20"/>
+                <w:szCs w:val="20"/>
+                <w:lang w:eastAsia="es-CO"/>
+              </w:rPr>
+              <w:t>Order_ID</w:t>
+            </w:r>
+            <w:proofErr w:type="spellEnd"/>
+            <w:r>
+              <w:rPr>
+                <w:rFonts w:ascii="Arial" w:eastAsia="Times New Roman" w:hAnsi="Arial" w:cs="Arial"/>
+                <w:sz w:val="20"/>
+                <w:szCs w:val="20"/>
+                <w:lang w:eastAsia="es-CO"/>
+              </w:rPr>
+              <w:t xml:space="preserve"> ascendente</w:t>
+            </w:r>
+          </w:p>
+        </w:tc>
+        <w:tc>
+          <w:tcPr>
+            <w:tcW w:w="4275" w:type="dxa"/>
+          </w:tcPr>
+          <w:p>
+            <w:pPr>
+              <w:rPr>
+                <w:rFonts w:ascii="Arial" w:eastAsia="Times New Roman" w:hAnsi="Arial" w:cs="Arial"/>
+                <w:sz w:val="20"/>
+                <w:szCs w:val="20"/>
+                <w:lang w:eastAsia="es-CO"/>
+              </w:rPr>
+            </w:pPr>
+            <w:proofErr w:type="gramStart"/>
+            <w:r>
+              <w:rPr>
+                <w:rFonts w:ascii="Arial" w:eastAsia="Times New Roman" w:hAnsi="Arial" w:cs="Arial"/>
+                <w:sz w:val="20"/>
+                <w:szCs w:val="20"/>
+                <w:lang w:eastAsia="es-CO"/>
+              </w:rPr>
+              <w:t>O</w:t>
+            </w:r>
+            <w:r>
+              <w:rPr>
+                <w:rFonts w:ascii="Arial" w:eastAsia="Times New Roman" w:hAnsi="Arial" w:cs="Arial"/>
+                <w:sz w:val="20"/>
+                <w:szCs w:val="20"/>
+                <w:lang w:eastAsia="es-CO"/>
+              </w:rPr>
+              <w:t>(</w:t>
+            </w:r>
+            <w:proofErr w:type="gramEnd"/>
+            <w:r>
+              <w:rPr>
+                <w:rFonts w:ascii="Arial" w:eastAsia="Times New Roman" w:hAnsi="Arial" w:cs="Arial"/>
+                <w:sz w:val="20"/>
+                <w:szCs w:val="20"/>
+                <w:lang w:eastAsia="es-CO"/>
+              </w:rPr>
+              <w:t>n log n</w:t>
+            </w:r>
+            <w:r>
+              <w:rPr>
+                <w:rFonts w:ascii="Arial" w:eastAsia="Times New Roman" w:hAnsi="Arial" w:cs="Arial"/>
+                <w:sz w:val="20"/>
+                <w:szCs w:val="20"/>
+                <w:lang w:eastAsia="es-CO"/>
+              </w:rPr>
+              <w:t>)</w:t>
+            </w:r>
+            <w:r>
+              <w:rPr>
+                <w:rFonts w:ascii="Arial" w:eastAsia="Times New Roman" w:hAnsi="Arial" w:cs="Arial"/>
+                <w:sz w:val="20"/>
+                <w:szCs w:val="20"/>
+                <w:lang w:eastAsia="es-CO"/>
+              </w:rPr>
+              <w:t xml:space="preserve">, donde n = pedidos filtrados </w:t>
+            </w:r>
+            <w:r>
+              <w:rPr>
+                <w:rFonts w:ascii="Arial" w:eastAsia="Times New Roman" w:hAnsi="Arial" w:cs="Arial"/>
+                <w:sz w:val="20"/>
+                <w:szCs w:val="20"/>
+                <w:lang w:eastAsia="es-CO"/>
+              </w:rPr>
               <w:t xml:space="preserve">para </w:t>
             </w:r>
           </w:p>
@@ -857,6 +1179,7 @@
                 <w:lang w:val="en-US"/>
               </w:rPr>
             </w:pPr>
+            <w:proofErr w:type="spellStart"/>
             <w:r>
               <w:rPr>
                 <w:rFonts w:ascii="Arial" w:eastAsia="Times New Roman" w:hAnsi="Arial" w:cs="Arial"/>
@@ -864,8 +1187,29 @@
                 <w:szCs w:val="20"/>
                 <w:lang w:val="en-US" w:eastAsia="es-CO"/>
               </w:rPr>
-              <w:t>Price_per_Box y Boxes_Shipped</w:t>
-            </w:r>
+              <w:t>Price_per_Box</w:t>
+            </w:r>
+            <w:proofErr w:type="spellEnd"/>
+            <w:r>
+              <w:rPr>
+                <w:rFonts w:ascii="Arial" w:eastAsia="Times New Roman" w:hAnsi="Arial" w:cs="Arial"/>
+                <w:sz w:val="20"/>
+                <w:szCs w:val="20"/>
+                <w:lang w:val="en-US" w:eastAsia="es-CO"/>
+              </w:rPr>
+              <w:t xml:space="preserve"> y </w:t>
+            </w:r>
+            <w:proofErr w:type="spellStart"/>
+            <w:r>
+              <w:rPr>
+                <w:rFonts w:ascii="Arial" w:eastAsia="Times New Roman" w:hAnsi="Arial" w:cs="Arial"/>
+                <w:sz w:val="20"/>
+                <w:szCs w:val="20"/>
+                <w:lang w:val="en-US" w:eastAsia="es-CO"/>
+              </w:rPr>
+              <w:t>Boxes_Shipped</w:t>
+            </w:r>
+            <w:proofErr w:type="spellEnd"/>
           </w:p>
         </w:tc>
       </w:tr>
@@ -882,15 +1226,9 @@
                 <w:szCs w:val="20"/>
                 <w:lang w:eastAsia="es-CO"/>
               </w:rPr>
-              <w:t xml:space="preserve">Paso 9: Si hay más de 20, se toman los primeros 10 y los últimos 10 con sub_list. </w:t>
-            </w:r>
-          </w:p>
-        </w:tc>
-        <w:tc>
-          <w:tcPr>
-            <w:tcW w:w="4275" w:type="dxa"/>
-          </w:tcPr>
-          <w:p>
+              <w:t xml:space="preserve">Paso 9: Si hay más de 20, se toman los primeros 10 y los últimos 10 con </w:t>
+            </w:r>
+            <w:proofErr w:type="spellStart"/>
             <w:r>
               <w:rPr>
                 <w:rFonts w:ascii="Arial" w:eastAsia="Times New Roman" w:hAnsi="Arial" w:cs="Arial"/>
@@ -898,17 +1236,9 @@
                 <w:szCs w:val="20"/>
                 <w:lang w:eastAsia="es-CO"/>
               </w:rPr>
-              <w:t>O(1)</w:t>
-            </w:r>
-          </w:p>
-        </w:tc>
-      </w:tr>
-      <w:tr>
-        <w:tc>
-          <w:tcPr>
-            <w:tcW w:w="5070" w:type="dxa"/>
-          </w:tcPr>
-          <w:p>
+              <w:t>sub_list</w:t>
+            </w:r>
+            <w:proofErr w:type="spellEnd"/>
             <w:r>
               <w:rPr>
                 <w:rFonts w:ascii="Arial" w:eastAsia="Times New Roman" w:hAnsi="Arial" w:cs="Arial"/>
@@ -916,7 +1246,7 @@
                 <w:szCs w:val="20"/>
                 <w:lang w:eastAsia="es-CO"/>
               </w:rPr>
-              <w:t>Paso 10: Se detiene el cronómetro y se calcula el tiempo</w:t>
+              <w:t xml:space="preserve">. </w:t>
             </w:r>
           </w:p>
         </w:tc>
@@ -925,6 +1255,7 @@
             <w:tcW w:w="4275" w:type="dxa"/>
           </w:tcPr>
           <w:p>
+            <w:proofErr w:type="gramStart"/>
             <w:r>
               <w:rPr>
                 <w:rFonts w:ascii="Arial" w:eastAsia="Times New Roman" w:hAnsi="Arial" w:cs="Arial"/>
@@ -932,7 +1263,17 @@
                 <w:szCs w:val="20"/>
                 <w:lang w:eastAsia="es-CO"/>
               </w:rPr>
-              <w:t>O(1)</w:t>
+              <w:t>O(</w:t>
+            </w:r>
+            <w:proofErr w:type="gramEnd"/>
+            <w:r>
+              <w:rPr>
+                <w:rFonts w:ascii="Arial" w:eastAsia="Times New Roman" w:hAnsi="Arial" w:cs="Arial"/>
+                <w:sz w:val="20"/>
+                <w:szCs w:val="20"/>
+                <w:lang w:eastAsia="es-CO"/>
+              </w:rPr>
+              <w:t>1)</w:t>
             </w:r>
           </w:p>
         </w:tc>
@@ -943,6 +1284,51 @@
             <w:tcW w:w="5070" w:type="dxa"/>
           </w:tcPr>
           <w:p>
+            <w:r>
+              <w:rPr>
+                <w:rFonts w:ascii="Arial" w:eastAsia="Times New Roman" w:hAnsi="Arial" w:cs="Arial"/>
+                <w:sz w:val="20"/>
+                <w:szCs w:val="20"/>
+                <w:lang w:eastAsia="es-CO"/>
+              </w:rPr>
+              <w:t>Paso 10: Se detiene el cronómetro y se calcula el tiempo</w:t>
+            </w:r>
+          </w:p>
+        </w:tc>
+        <w:tc>
+          <w:tcPr>
+            <w:tcW w:w="4275" w:type="dxa"/>
+          </w:tcPr>
+          <w:p>
+            <w:proofErr w:type="gramStart"/>
+            <w:r>
+              <w:rPr>
+                <w:rFonts w:ascii="Arial" w:eastAsia="Times New Roman" w:hAnsi="Arial" w:cs="Arial"/>
+                <w:sz w:val="20"/>
+                <w:szCs w:val="20"/>
+                <w:lang w:eastAsia="es-CO"/>
+              </w:rPr>
+              <w:t>O(</w:t>
+            </w:r>
+            <w:proofErr w:type="gramEnd"/>
+            <w:r>
+              <w:rPr>
+                <w:rFonts w:ascii="Arial" w:eastAsia="Times New Roman" w:hAnsi="Arial" w:cs="Arial"/>
+                <w:sz w:val="20"/>
+                <w:szCs w:val="20"/>
+                <w:lang w:eastAsia="es-CO"/>
+              </w:rPr>
+              <w:t>1)</w:t>
+            </w:r>
+          </w:p>
+        </w:tc>
+      </w:tr>
+      <w:tr>
+        <w:tc>
+          <w:tcPr>
+            <w:tcW w:w="5070" w:type="dxa"/>
+          </w:tcPr>
+          <w:p>
             <w:pPr>
               <w:rPr>
                 <w:b/>
@@ -975,6 +1361,7 @@
                 <w:iCs/>
               </w:rPr>
             </w:pPr>
+            <w:proofErr w:type="gramStart"/>
             <w:r>
               <w:rPr>
                 <w:b/>
@@ -984,6 +1371,7 @@
               </w:rPr>
               <w:t>O(</w:t>
             </w:r>
+            <w:proofErr w:type="gramEnd"/>
             <w:r>
               <w:rPr>
                 <w:b/>
@@ -1343,8 +1731,13 @@
           </w:tcPr>
           <w:p>
             <w:r>
-              <w:t>Paso ….</w:t>
-            </w:r>
+              <w:t>Paso</w:t>
+            </w:r>
+            <w:proofErr w:type="gramStart"/>
+            <w:r>
+              <w:t xml:space="preserve"> ….</w:t>
+            </w:r>
+            <w:proofErr w:type="gramEnd"/>
           </w:p>
         </w:tc>
         <w:tc>
@@ -1434,7 +1827,15 @@
     </w:p>
     <w:p>
       <w:r>
-        <w:t>Análisis de resultados de la implementación, tener cuenta las pruebas realizadas y el analisis de complejidad.</w:t>
+        <w:t xml:space="preserve">Análisis de resultados de la implementación, tener cuenta las pruebas realizadas y el </w:t>
+      </w:r>
+      <w:proofErr w:type="spellStart"/>
+      <w:r>
+        <w:t>analisis</w:t>
+      </w:r>
+      <w:proofErr w:type="spellEnd"/>
+      <w:r>
+        <w:t xml:space="preserve"> de complejidad.</w:t>
       </w:r>
     </w:p>
     <w:p>
@@ -1581,7 +1982,17 @@
           <w:sz w:val="22"/>
           <w:szCs w:val="22"/>
         </w:rPr>
-        <w:t xml:space="preserve"> 10 </w:t>
+        <w:t xml:space="preserve"> </w:t>
+      </w:r>
+      <w:proofErr w:type="gramStart"/>
+      <w:r>
+        <w:rPr>
+          <w:rFonts w:asciiTheme="minorHAnsi" w:eastAsiaTheme="minorEastAsia" w:hAnsiTheme="minorHAnsi" w:cstheme="minorBidi"/>
+          <w:color w:val="auto"/>
+          <w:sz w:val="22"/>
+          <w:szCs w:val="22"/>
+        </w:rPr>
+        <w:t xml:space="preserve">10 </w:t>
       </w:r>
       <w:r>
         <w:rPr>
@@ -1590,7 +2001,17 @@
           <w:sz w:val="22"/>
           <w:szCs w:val="22"/>
         </w:rPr>
-        <w:t xml:space="preserve"> y </w:t>
+        <w:t xml:space="preserve"> y</w:t>
+      </w:r>
+      <w:proofErr w:type="gramEnd"/>
+      <w:r>
+        <w:rPr>
+          <w:rFonts w:asciiTheme="minorHAnsi" w:eastAsiaTheme="minorEastAsia" w:hAnsiTheme="minorHAnsi" w:cstheme="minorBidi"/>
+          <w:color w:val="auto"/>
+          <w:sz w:val="22"/>
+          <w:szCs w:val="22"/>
+        </w:rPr>
+        <w:t xml:space="preserve"> </w:t>
       </w:r>
       <w:r>
         <w:rPr>
@@ -1684,8 +2105,44 @@
               <w:rPr>
                 <w:lang w:val="en-US"/>
               </w:rPr>
-              <w:t>catalog, fecha, min_amount, max_amount</w:t>
-            </w:r>
+              <w:t xml:space="preserve">catalog, </w:t>
+            </w:r>
+            <w:proofErr w:type="spellStart"/>
+            <w:r>
+              <w:rPr>
+                <w:lang w:val="en-US"/>
+              </w:rPr>
+              <w:t>fecha</w:t>
+            </w:r>
+            <w:proofErr w:type="spellEnd"/>
+            <w:r>
+              <w:rPr>
+                <w:lang w:val="en-US"/>
+              </w:rPr>
+              <w:t xml:space="preserve">, </w:t>
+            </w:r>
+            <w:proofErr w:type="spellStart"/>
+            <w:r>
+              <w:rPr>
+                <w:lang w:val="en-US"/>
+              </w:rPr>
+              <w:t>min_amount</w:t>
+            </w:r>
+            <w:proofErr w:type="spellEnd"/>
+            <w:r>
+              <w:rPr>
+                <w:lang w:val="en-US"/>
+              </w:rPr>
+              <w:t xml:space="preserve">, </w:t>
+            </w:r>
+            <w:proofErr w:type="spellStart"/>
+            <w:r>
+              <w:rPr>
+                <w:lang w:val="en-US"/>
+              </w:rPr>
+              <w:t>max_amount</w:t>
+            </w:r>
+            <w:proofErr w:type="spellEnd"/>
           </w:p>
         </w:tc>
       </w:tr>
@@ -1916,8 +2373,21 @@
               <w:t>Ordenar los pedidos filtrados</w:t>
             </w:r>
             <w:r>
-              <w:t xml:space="preserve"> con merge sort</w:t>
-            </w:r>
+              <w:t xml:space="preserve"> con </w:t>
+            </w:r>
+            <w:proofErr w:type="spellStart"/>
+            <w:r>
+              <w:t>merge</w:t>
+            </w:r>
+            <w:proofErr w:type="spellEnd"/>
+            <w:r>
+              <w:t xml:space="preserve"> </w:t>
+            </w:r>
+            <w:proofErr w:type="spellStart"/>
+            <w:r>
+              <w:t>sort</w:t>
+            </w:r>
+            <w:proofErr w:type="spellEnd"/>
           </w:p>
         </w:tc>
         <w:tc>
@@ -1925,8 +2395,13 @@
             <w:tcW w:w="4275" w:type="dxa"/>
           </w:tcPr>
           <w:p>
-            <w:r>
-              <w:t>O(n log n)</w:t>
+            <w:proofErr w:type="gramStart"/>
+            <w:r>
+              <w:t>O(</w:t>
+            </w:r>
+            <w:proofErr w:type="gramEnd"/>
+            <w:r>
+              <w:t>n log n)</w:t>
             </w:r>
           </w:p>
         </w:tc>
@@ -1969,6 +2444,7 @@
                 <w:iCs/>
               </w:rPr>
             </w:pPr>
+            <w:proofErr w:type="gramStart"/>
             <w:r>
               <w:rPr>
                 <w:b/>
@@ -1978,6 +2454,7 @@
               </w:rPr>
               <w:t>O(</w:t>
             </w:r>
+            <w:proofErr w:type="gramEnd"/>
             <w:r>
               <w:rPr>
                 <w:b/>
@@ -2117,8 +2594,30 @@
               <w:rPr>
                 <w:lang w:val="en-US"/>
               </w:rPr>
-              <w:t xml:space="preserve"> producto, pais</w:t>
-            </w:r>
+              <w:t xml:space="preserve"> </w:t>
+            </w:r>
+            <w:proofErr w:type="spellStart"/>
+            <w:r>
+              <w:rPr>
+                <w:lang w:val="en-US"/>
+              </w:rPr>
+              <w:t>producto</w:t>
+            </w:r>
+            <w:proofErr w:type="spellEnd"/>
+            <w:r>
+              <w:rPr>
+                <w:lang w:val="en-US"/>
+              </w:rPr>
+              <w:t xml:space="preserve">, </w:t>
+            </w:r>
+            <w:proofErr w:type="spellStart"/>
+            <w:r>
+              <w:rPr>
+                <w:lang w:val="en-US"/>
+              </w:rPr>
+              <w:t>pais</w:t>
+            </w:r>
+            <w:proofErr w:type="spellEnd"/>
           </w:p>
         </w:tc>
       </w:tr>
@@ -2149,30 +2648,55 @@
           </w:tcPr>
           <w:p>
             <w:r>
-              <w:t>Número total de pedidos que cumplen el filtro</w:t>
-            </w:r>
-            <w:r>
-              <w:t>, p</w:t>
-            </w:r>
-            <w:r>
-              <w:t>romedio de Price_per_Box, Discount_Pct, Marketing_Spend y Boxes_Shipped</w:t>
-            </w:r>
+              <w:t>Número total de pedidos que cumplen el filtro, p</w:t>
+            </w:r>
+            <w:r>
+              <w:t xml:space="preserve">romedio de </w:t>
+            </w:r>
+            <w:proofErr w:type="spellStart"/>
+            <w:r>
+              <w:t>Price_per_Box</w:t>
+            </w:r>
+            <w:proofErr w:type="spellEnd"/>
+            <w:r>
+              <w:t xml:space="preserve">, </w:t>
+            </w:r>
+            <w:proofErr w:type="spellStart"/>
+            <w:r>
+              <w:t>Discount_Pct</w:t>
+            </w:r>
+            <w:proofErr w:type="spellEnd"/>
+            <w:r>
+              <w:t xml:space="preserve">, </w:t>
+            </w:r>
+            <w:proofErr w:type="spellStart"/>
+            <w:r>
+              <w:t>Marketing_Spend</w:t>
+            </w:r>
+            <w:proofErr w:type="spellEnd"/>
+            <w:r>
+              <w:t xml:space="preserve"> y </w:t>
+            </w:r>
+            <w:proofErr w:type="spellStart"/>
+            <w:r>
+              <w:t>Boxes_Shipped</w:t>
+            </w:r>
+            <w:proofErr w:type="spellEnd"/>
             <w:r>
               <w:t>,</w:t>
             </w:r>
           </w:p>
           <w:p>
             <w:r>
-              <w:t>l</w:t>
-            </w:r>
-            <w:r>
-              <w:t>os dos pedidos de mayor Amount</w:t>
-            </w:r>
-            <w:r>
-              <w:t>, t</w:t>
-            </w:r>
-            <w:r>
-              <w:t>iempo de ejecución del algoritmo</w:t>
+              <w:t xml:space="preserve">los dos pedidos de mayor </w:t>
+            </w:r>
+            <w:proofErr w:type="spellStart"/>
+            <w:r>
+              <w:t>Amount</w:t>
+            </w:r>
+            <w:proofErr w:type="spellEnd"/>
+            <w:r>
+              <w:t>, tiempo de ejecución del algoritmo</w:t>
             </w:r>
           </w:p>
         </w:tc>
@@ -2230,9 +2754,10 @@
         <w:t>Descripción</w:t>
       </w:r>
     </w:p>
+    <w:p/>
     <w:p>
       <w:r>
-        <w:t>Breve descripción de como abordaron la implementación del requerimiento</w:t>
+        <w:t>Cuando cargué, guardé los pedidos agrupados por producto y por país en otra tabla hash. Cuando consulté, fui a su lista, calculé los promedios y los ordené por monto mostrando los dos más altos.</w:t>
       </w:r>
     </w:p>
     <w:p/>
@@ -2336,8 +2861,13 @@
             <w:r>
               <w:t xml:space="preserve"> - </w:t>
             </w:r>
-            <w:r>
-              <w:t>pais" concatenando dos textos</w:t>
+            <w:proofErr w:type="spellStart"/>
+            <w:r>
+              <w:t>pais</w:t>
+            </w:r>
+            <w:proofErr w:type="spellEnd"/>
+            <w:r>
+              <w:t>" concatenando dos textos</w:t>
             </w:r>
           </w:p>
         </w:tc>
@@ -2354,8 +2884,13 @@
                 <w:lang w:eastAsia="es-CO"/>
               </w:rPr>
             </w:pPr>
-            <w:r>
-              <w:t>O(1)</w:t>
+            <w:proofErr w:type="gramStart"/>
+            <w:r>
+              <w:t>O(</w:t>
+            </w:r>
+            <w:proofErr w:type="gramEnd"/>
+            <w:r>
+              <w:t>1)</w:t>
             </w:r>
           </w:p>
         </w:tc>
@@ -2381,7 +2916,15 @@
               </w:rPr>
             </w:pPr>
             <w:r>
-              <w:t>Paso 2: Se busca la llave en la tabla de hash de Linear Probing y se obtiene la lista de pedidos de esa combinación</w:t>
+              <w:t xml:space="preserve">Paso 2: Se busca la llave en la tabla de hash de Linear </w:t>
+            </w:r>
+            <w:proofErr w:type="spellStart"/>
+            <w:r>
+              <w:t>Probing</w:t>
+            </w:r>
+            <w:proofErr w:type="spellEnd"/>
+            <w:r>
+              <w:t xml:space="preserve"> y se obtiene la lista de pedidos de esa combinación</w:t>
             </w:r>
           </w:p>
         </w:tc>
@@ -2398,8 +2941,13 @@
                 <w:lang w:eastAsia="es-CO"/>
               </w:rPr>
             </w:pPr>
-            <w:r>
-              <w:t>O(1) promedio</w:t>
+            <w:proofErr w:type="gramStart"/>
+            <w:r>
+              <w:t>O(</w:t>
+            </w:r>
+            <w:proofErr w:type="gramEnd"/>
+            <w:r>
+              <w:t>1) promedio</w:t>
             </w:r>
           </w:p>
         </w:tc>
@@ -2442,8 +2990,13 @@
                 <w:lang w:eastAsia="es-CO"/>
               </w:rPr>
             </w:pPr>
-            <w:r>
-              <w:t>O(1)</w:t>
+            <w:proofErr w:type="gramStart"/>
+            <w:r>
+              <w:t>O(</w:t>
+            </w:r>
+            <w:proofErr w:type="gramEnd"/>
+            <w:r>
+              <w:t>1)</w:t>
             </w:r>
           </w:p>
         </w:tc>
@@ -2465,7 +3018,7 @@
                 <w:rFonts w:ascii="Arial" w:eastAsia="Times New Roman" w:hAnsi="Arial" w:cs="Arial"/>
                 <w:sz w:val="20"/>
                 <w:szCs w:val="20"/>
-                <w:lang w:eastAsia="es-CO"/>
+                <w:lang w:val="en-US" w:eastAsia="es-CO"/>
               </w:rPr>
             </w:pPr>
             <w:r>
@@ -2475,8 +3028,86 @@
               <w:rPr>
                 <w:lang w:val="en-US"/>
               </w:rPr>
-              <w:t>Por cada uno se suman, si no son None, Price_per_Box, Discount_Pct, Marketing_Spend y Boxes_Shipped</w:t>
-            </w:r>
+              <w:t xml:space="preserve">Por </w:t>
+            </w:r>
+            <w:proofErr w:type="spellStart"/>
+            <w:r>
+              <w:rPr>
+                <w:lang w:val="en-US"/>
+              </w:rPr>
+              <w:t>cada</w:t>
+            </w:r>
+            <w:proofErr w:type="spellEnd"/>
+            <w:r>
+              <w:rPr>
+                <w:lang w:val="en-US"/>
+              </w:rPr>
+              <w:t xml:space="preserve"> uno se suman, </w:t>
+            </w:r>
+            <w:proofErr w:type="spellStart"/>
+            <w:r>
+              <w:rPr>
+                <w:lang w:val="en-US"/>
+              </w:rPr>
+              <w:t>si</w:t>
+            </w:r>
+            <w:proofErr w:type="spellEnd"/>
+            <w:r>
+              <w:rPr>
+                <w:lang w:val="en-US"/>
+              </w:rPr>
+              <w:t xml:space="preserve"> no son None, </w:t>
+            </w:r>
+            <w:proofErr w:type="spellStart"/>
+            <w:r>
+              <w:rPr>
+                <w:lang w:val="en-US"/>
+              </w:rPr>
+              <w:t>Price_per_Box</w:t>
+            </w:r>
+            <w:proofErr w:type="spellEnd"/>
+            <w:r>
+              <w:rPr>
+                <w:lang w:val="en-US"/>
+              </w:rPr>
+              <w:t xml:space="preserve">, </w:t>
+            </w:r>
+            <w:proofErr w:type="spellStart"/>
+            <w:r>
+              <w:rPr>
+                <w:lang w:val="en-US"/>
+              </w:rPr>
+              <w:t>Discount_Pct</w:t>
+            </w:r>
+            <w:proofErr w:type="spellEnd"/>
+            <w:r>
+              <w:rPr>
+                <w:lang w:val="en-US"/>
+              </w:rPr>
+              <w:t xml:space="preserve">, </w:t>
+            </w:r>
+            <w:proofErr w:type="spellStart"/>
+            <w:r>
+              <w:rPr>
+                <w:lang w:val="en-US"/>
+              </w:rPr>
+              <w:t>Marketing_Spend</w:t>
+            </w:r>
+            <w:proofErr w:type="spellEnd"/>
+            <w:r>
+              <w:rPr>
+                <w:lang w:val="en-US"/>
+              </w:rPr>
+              <w:t xml:space="preserve"> y </w:t>
+            </w:r>
+            <w:proofErr w:type="spellStart"/>
+            <w:r>
+              <w:rPr>
+                <w:lang w:val="en-US"/>
+              </w:rPr>
+              <w:t>Boxes_Shipped</w:t>
+            </w:r>
+            <w:proofErr w:type="spellEnd"/>
           </w:p>
         </w:tc>
         <w:tc>
@@ -2536,8 +3167,13 @@
                 <w:lang w:eastAsia="es-CO"/>
               </w:rPr>
             </w:pPr>
-            <w:r>
-              <w:t>O(1)</w:t>
+            <w:proofErr w:type="gramStart"/>
+            <w:r>
+              <w:t>O(</w:t>
+            </w:r>
+            <w:proofErr w:type="gramEnd"/>
+            <w:r>
+              <w:t>1)</w:t>
             </w:r>
           </w:p>
         </w:tc>
@@ -2563,25 +3199,67 @@
               </w:rPr>
             </w:pPr>
             <w:r>
-              <w:t xml:space="preserve">Paso 6: Se ordenan los p pedidos con Merge Sort </w:t>
-            </w:r>
-            <w:r>
-              <w:t xml:space="preserve"> en orden </w:t>
-            </w:r>
-            <w:r>
-              <w:t xml:space="preserve">Amount descendente, </w:t>
+              <w:t xml:space="preserve">Paso 6: Se ordenan los p pedidos con </w:t>
+            </w:r>
+            <w:proofErr w:type="spellStart"/>
+            <w:r>
+              <w:t>Merge</w:t>
+            </w:r>
+            <w:proofErr w:type="spellEnd"/>
+            <w:r>
+              <w:t xml:space="preserve"> </w:t>
+            </w:r>
+            <w:proofErr w:type="spellStart"/>
+            <w:proofErr w:type="gramStart"/>
+            <w:r>
+              <w:t>Sort</w:t>
+            </w:r>
+            <w:proofErr w:type="spellEnd"/>
+            <w:r>
+              <w:t xml:space="preserve"> </w:t>
+            </w:r>
+            <w:r>
+              <w:t xml:space="preserve"> en</w:t>
+            </w:r>
+            <w:proofErr w:type="gramEnd"/>
+            <w:r>
+              <w:t xml:space="preserve"> orden </w:t>
+            </w:r>
+            <w:proofErr w:type="spellStart"/>
+            <w:r>
+              <w:t>Amount</w:t>
+            </w:r>
+            <w:proofErr w:type="spellEnd"/>
+            <w:r>
+              <w:t xml:space="preserve"> descendente, </w:t>
             </w:r>
             <w:r>
               <w:t xml:space="preserve">si es igual, </w:t>
             </w:r>
             <w:r>
-              <w:t xml:space="preserve">luego Marketing_Spend ascendente, </w:t>
+              <w:t xml:space="preserve">luego </w:t>
+            </w:r>
+            <w:proofErr w:type="spellStart"/>
+            <w:r>
+              <w:t>Marketing_Spend</w:t>
+            </w:r>
+            <w:proofErr w:type="spellEnd"/>
+            <w:r>
+              <w:t xml:space="preserve"> ascendente, </w:t>
             </w:r>
             <w:r>
               <w:t xml:space="preserve">si es igual, </w:t>
             </w:r>
             <w:r>
-              <w:t>luego Order_ID ascendente)</w:t>
+              <w:t xml:space="preserve">luego </w:t>
+            </w:r>
+            <w:proofErr w:type="spellStart"/>
+            <w:r>
+              <w:t>Order_ID</w:t>
+            </w:r>
+            <w:proofErr w:type="spellEnd"/>
+            <w:r>
+              <w:t xml:space="preserve"> ascendente)</w:t>
             </w:r>
           </w:p>
         </w:tc>
@@ -2598,8 +3276,13 @@
                 <w:lang w:eastAsia="es-CO"/>
               </w:rPr>
             </w:pPr>
-            <w:r>
-              <w:t>O(p log p)</w:t>
+            <w:proofErr w:type="gramStart"/>
+            <w:r>
+              <w:t>O(</w:t>
+            </w:r>
+            <w:proofErr w:type="gramEnd"/>
+            <w:r>
+              <w:t>p log p)</w:t>
             </w:r>
           </w:p>
         </w:tc>
@@ -2625,8 +3308,13 @@
               </w:rPr>
             </w:pPr>
             <w:r>
-              <w:t>Paso 7: Se toman los dos primeros con sub_list</w:t>
-            </w:r>
+              <w:t xml:space="preserve">Paso 7: Se toman los dos primeros con </w:t>
+            </w:r>
+            <w:proofErr w:type="spellStart"/>
+            <w:r>
+              <w:t>sub_list</w:t>
+            </w:r>
+            <w:proofErr w:type="spellEnd"/>
           </w:p>
         </w:tc>
         <w:tc>
@@ -2642,8 +3330,13 @@
                 <w:lang w:eastAsia="es-CO"/>
               </w:rPr>
             </w:pPr>
-            <w:r>
-              <w:t>O(1)</w:t>
+            <w:proofErr w:type="gramStart"/>
+            <w:r>
+              <w:t>O(</w:t>
+            </w:r>
+            <w:proofErr w:type="gramEnd"/>
+            <w:r>
+              <w:t>1)</w:t>
             </w:r>
           </w:p>
         </w:tc>
@@ -2686,8 +3379,13 @@
                 <w:lang w:eastAsia="es-CO"/>
               </w:rPr>
             </w:pPr>
-            <w:r>
-              <w:t>O(1)</w:t>
+            <w:proofErr w:type="gramStart"/>
+            <w:r>
+              <w:t>O(</w:t>
+            </w:r>
+            <w:proofErr w:type="gramEnd"/>
+            <w:r>
+              <w:t>1)</w:t>
             </w:r>
           </w:p>
         </w:tc>
@@ -2730,8 +3428,13 @@
                 <w:lang w:eastAsia="es-CO"/>
               </w:rPr>
             </w:pPr>
-            <w:r>
-              <w:t>O(1)</w:t>
+            <w:proofErr w:type="gramStart"/>
+            <w:r>
+              <w:t>O(</w:t>
+            </w:r>
+            <w:proofErr w:type="gramEnd"/>
+            <w:r>
+              <w:t>1)</w:t>
             </w:r>
           </w:p>
         </w:tc>
@@ -2763,6 +3466,7 @@
                 <w:b/>
                 <w:bCs/>
               </w:rPr>
+              <w:lastRenderedPageBreak/>
               <w:t xml:space="preserve">TOTAL: </w:t>
             </w:r>
           </w:p>
@@ -2782,12 +3486,21 @@
                 <w:lang w:eastAsia="es-CO"/>
               </w:rPr>
             </w:pPr>
-            <w:r>
-              <w:rPr>
-                <w:b/>
-                <w:bCs/>
-              </w:rPr>
-              <w:t>O(p log p)</w:t>
+            <w:proofErr w:type="gramStart"/>
+            <w:r>
+              <w:rPr>
+                <w:b/>
+                <w:bCs/>
+              </w:rPr>
+              <w:t>O(</w:t>
+            </w:r>
+            <w:proofErr w:type="gramEnd"/>
+            <w:r>
+              <w:rPr>
+                <w:b/>
+                <w:bCs/>
+              </w:rPr>
+              <w:t>p log p)</w:t>
             </w:r>
           </w:p>
         </w:tc>
@@ -2813,13 +3526,20 @@
           <w:b/>
           <w:bCs/>
         </w:rPr>
-        <w:lastRenderedPageBreak/>
         <w:t>Análisis</w:t>
       </w:r>
     </w:p>
     <w:p>
       <w:r>
-        <w:t>Análisis de resultados de la implementación, tener cuenta las pruebas realizadas y el analisis de complejidad.</w:t>
+        <w:t xml:space="preserve">Análisis de resultados de la implementación, tener cuenta las pruebas realizadas y el </w:t>
+      </w:r>
+      <w:proofErr w:type="spellStart"/>
+      <w:r>
+        <w:t>analisis</w:t>
+      </w:r>
+      <w:proofErr w:type="spellEnd"/>
+      <w:r>
+        <w:t xml:space="preserve"> de complejidad.</w:t>
       </w:r>
     </w:p>
     <w:p>
@@ -3098,8 +3818,13 @@
           </w:tcPr>
           <w:p>
             <w:r>
-              <w:t>Paso ….</w:t>
-            </w:r>
+              <w:t>Paso</w:t>
+            </w:r>
+            <w:proofErr w:type="gramStart"/>
+            <w:r>
+              <w:t xml:space="preserve"> ….</w:t>
+            </w:r>
+            <w:proofErr w:type="gramEnd"/>
           </w:p>
         </w:tc>
         <w:tc>
@@ -3189,7 +3914,15 @@
     </w:p>
     <w:p>
       <w:r>
-        <w:t>Análisis de resultados de la implementación, tener cuenta las pruebas realizadas y el analisis de complejidad.</w:t>
+        <w:t xml:space="preserve">Análisis de resultados de la implementación, tener cuenta las pruebas realizadas y el </w:t>
+      </w:r>
+      <w:proofErr w:type="spellStart"/>
+      <w:r>
+        <w:t>analisis</w:t>
+      </w:r>
+      <w:proofErr w:type="spellEnd"/>
+      <w:r>
+        <w:t xml:space="preserve"> de complejidad.</w:t>
       </w:r>
     </w:p>
     <w:p>
@@ -3702,8 +4435,13 @@
             <w:tcW w:w="4275" w:type="dxa"/>
           </w:tcPr>
           <w:p>
-            <w:r>
-              <w:t>O(m log m), donde m = número de paíse</w:t>
+            <w:proofErr w:type="gramStart"/>
+            <w:r>
+              <w:t>O(</w:t>
+            </w:r>
+            <w:proofErr w:type="gramEnd"/>
+            <w:r>
+              <w:t>m log m), donde m = número de paíse</w:t>
             </w:r>
             <w:r>
               <w:t>s</w:t>
@@ -3749,6 +4487,7 @@
                 <w:iCs/>
               </w:rPr>
             </w:pPr>
+            <w:proofErr w:type="gramStart"/>
             <w:r>
               <w:rPr>
                 <w:b/>
@@ -3756,7 +4495,17 @@
                 <w:i/>
                 <w:iCs/>
               </w:rPr>
-              <w:t>O(n + m log m)</w:t>
+              <w:t>O(</w:t>
+            </w:r>
+            <w:proofErr w:type="gramEnd"/>
+            <w:r>
+              <w:rPr>
+                <w:b/>
+                <w:bCs/>
+                <w:i/>
+                <w:iCs/>
+              </w:rPr>
+              <w:t>n + m log m)</w:t>
             </w:r>
           </w:p>
         </w:tc>
@@ -8061,19 +8810,54 @@
 </file>
 
 <file path=customXml/item1.xml><?xml version="1.0" encoding="utf-8"?>
-<?mso-contentType ?>
-<FormTemplates xmlns="http://schemas.microsoft.com/sharepoint/v3/contenttype/forms">
-  <Display>DocumentLibraryForm</Display>
-  <Edit>DocumentLibraryForm</Edit>
-  <New>DocumentLibraryForm</New>
-</FormTemplates>
+<p:properties xmlns:p="http://schemas.microsoft.com/office/2006/metadata/properties" xmlns:xsi="http://www.w3.org/2001/XMLSchema-instance" xmlns:pc="http://schemas.microsoft.com/office/infopath/2007/PartnerControls">
+  <documentManagement>
+    <SharedWithUsers xmlns="85e30bcc-d76c-4413-8e4d-2dce22fb0743">
+      <UserInfo>
+        <DisplayName>Dario Ernesto Correal Torres</DisplayName>
+        <AccountId>15</AccountId>
+        <AccountType/>
+      </UserInfo>
+      <UserInfo>
+        <DisplayName>Carlos Andres Lozano Garzon</DisplayName>
+        <AccountId>13</AccountId>
+        <AccountType/>
+      </UserInfo>
+      <UserInfo>
+        <DisplayName>Mario  Fernando De la rosa Rosero</DisplayName>
+        <AccountId>16</AccountId>
+        <AccountType/>
+      </UserInfo>
+      <UserInfo>
+        <DisplayName>Arturo Henao Chaparro</DisplayName>
+        <AccountId>48</AccountId>
+        <AccountType/>
+      </UserInfo>
+      <UserInfo>
+        <DisplayName>Luis Esteban Florez Salamanca</DisplayName>
+        <AccountId>33</AccountId>
+        <AccountType/>
+      </UserInfo>
+      <UserInfo>
+        <DisplayName>Christian Camilo Aparicio Baquen</DisplayName>
+        <AccountId>50</AccountId>
+        <AccountType/>
+      </UserInfo>
+      <UserInfo>
+        <DisplayName>Ivan David Salazar Cardenas</DisplayName>
+        <AccountId>52</AccountId>
+        <AccountType/>
+      </UserInfo>
+    </SharedWithUsers>
+    <TaxCatchAll xmlns="85e30bcc-d76c-4413-8e4d-2dce22fb0743" xsi:nil="true"/>
+    <lcf76f155ced4ddcb4097134ff3c332f xmlns="164883f8-7691-4ecf-b54a-664c0d0edefe">
+      <Terms xmlns="http://schemas.microsoft.com/office/infopath/2007/PartnerControls"/>
+    </lcf76f155ced4ddcb4097134ff3c332f>
+  </documentManagement>
+</p:properties>
 </file>
 
 <file path=customXml/item2.xml><?xml version="1.0" encoding="utf-8"?>
-<b:Sources xmlns:b="http://schemas.openxmlformats.org/officeDocument/2006/bibliography" xmlns="http://schemas.openxmlformats.org/officeDocument/2006/bibliography" SelectedStyle="\APASixthEditionOfficeOnline.xsl" StyleName="APA" Version="6"/>
-</file>
-
-<file path=customXml/item3.xml><?xml version="1.0" encoding="utf-8"?>
 <ct:contentTypeSchema xmlns:ct="http://schemas.microsoft.com/office/2006/metadata/contentType" xmlns:ma="http://schemas.microsoft.com/office/2006/metadata/properties/metaAttributes" ct:_="" ma:_="" ma:contentTypeName="Documento" ma:contentTypeID="0x01010023858CF01A2EF24688B692775F4C60A4" ma:contentTypeVersion="15" ma:contentTypeDescription="Crear nuevo documento." ma:contentTypeScope="" ma:versionID="a4df9e4b793c0fa050084ef4feafa589">
   <xsd:schema xmlns:xsd="http://www.w3.org/2001/XMLSchema" xmlns:xs="http://www.w3.org/2001/XMLSchema" xmlns:p="http://schemas.microsoft.com/office/2006/metadata/properties" xmlns:ns2="164883f8-7691-4ecf-b54a-664c0d0edefe" xmlns:ns3="85e30bcc-d76c-4413-8e4d-2dce22fb0743" targetNamespace="http://schemas.microsoft.com/office/2006/metadata/properties" ma:root="true" ma:fieldsID="067b7080d2289f9ba15465beea7d18a8" ns2:_="" ns3:_="">
     <xsd:import namespace="164883f8-7691-4ecf-b54a-664c0d0edefe"/>
@@ -8310,71 +9094,31 @@
 </ct:contentTypeSchema>
 </file>
 
+<file path=customXml/item3.xml><?xml version="1.0" encoding="utf-8"?>
+<b:Sources xmlns:b="http://schemas.openxmlformats.org/officeDocument/2006/bibliography" xmlns="http://schemas.openxmlformats.org/officeDocument/2006/bibliography" SelectedStyle="\APASixthEditionOfficeOnline.xsl" StyleName="APA" Version="6"/>
+</file>
+
 <file path=customXml/item4.xml><?xml version="1.0" encoding="utf-8"?>
-<p:properties xmlns:p="http://schemas.microsoft.com/office/2006/metadata/properties" xmlns:xsi="http://www.w3.org/2001/XMLSchema-instance" xmlns:pc="http://schemas.microsoft.com/office/infopath/2007/PartnerControls">
-  <documentManagement>
-    <SharedWithUsers xmlns="85e30bcc-d76c-4413-8e4d-2dce22fb0743">
-      <UserInfo>
-        <DisplayName>Dario Ernesto Correal Torres</DisplayName>
-        <AccountId>15</AccountId>
-        <AccountType/>
-      </UserInfo>
-      <UserInfo>
-        <DisplayName>Carlos Andres Lozano Garzon</DisplayName>
-        <AccountId>13</AccountId>
-        <AccountType/>
-      </UserInfo>
-      <UserInfo>
-        <DisplayName>Mario  Fernando De la rosa Rosero</DisplayName>
-        <AccountId>16</AccountId>
-        <AccountType/>
-      </UserInfo>
-      <UserInfo>
-        <DisplayName>Arturo Henao Chaparro</DisplayName>
-        <AccountId>48</AccountId>
-        <AccountType/>
-      </UserInfo>
-      <UserInfo>
-        <DisplayName>Luis Esteban Florez Salamanca</DisplayName>
-        <AccountId>33</AccountId>
-        <AccountType/>
-      </UserInfo>
-      <UserInfo>
-        <DisplayName>Christian Camilo Aparicio Baquen</DisplayName>
-        <AccountId>50</AccountId>
-        <AccountType/>
-      </UserInfo>
-      <UserInfo>
-        <DisplayName>Ivan David Salazar Cardenas</DisplayName>
-        <AccountId>52</AccountId>
-        <AccountType/>
-      </UserInfo>
-    </SharedWithUsers>
-    <TaxCatchAll xmlns="85e30bcc-d76c-4413-8e4d-2dce22fb0743" xsi:nil="true"/>
-    <lcf76f155ced4ddcb4097134ff3c332f xmlns="164883f8-7691-4ecf-b54a-664c0d0edefe">
-      <Terms xmlns="http://schemas.microsoft.com/office/infopath/2007/PartnerControls"/>
-    </lcf76f155ced4ddcb4097134ff3c332f>
-  </documentManagement>
-</p:properties>
+<?mso-contentType ?>
+<FormTemplates xmlns="http://schemas.microsoft.com/sharepoint/v3/contenttype/forms">
+  <Display>DocumentLibraryForm</Display>
+  <Edit>DocumentLibraryForm</Edit>
+  <New>DocumentLibraryForm</New>
+</FormTemplates>
 </file>
 
 <file path=customXml/itemProps1.xml><?xml version="1.0" encoding="utf-8"?>
-<ds:datastoreItem xmlns:ds="http://schemas.openxmlformats.org/officeDocument/2006/customXml" ds:itemID="{58AFF83A-2C1F-4B0C-9BCE-EE49F5226348}">
+<ds:datastoreItem xmlns:ds="http://schemas.openxmlformats.org/officeDocument/2006/customXml" ds:itemID="{D3B4676A-CA48-4E6B-BABE-1535A7A288F6}">
   <ds:schemaRefs>
-    <ds:schemaRef ds:uri="http://schemas.microsoft.com/sharepoint/v3/contenttype/forms"/>
+    <ds:schemaRef ds:uri="http://schemas.microsoft.com/office/2006/metadata/properties"/>
+    <ds:schemaRef ds:uri="http://schemas.microsoft.com/office/infopath/2007/PartnerControls"/>
+    <ds:schemaRef ds:uri="85e30bcc-d76c-4413-8e4d-2dce22fb0743"/>
+    <ds:schemaRef ds:uri="164883f8-7691-4ecf-b54a-664c0d0edefe"/>
   </ds:schemaRefs>
 </ds:datastoreItem>
 </file>
 
 <file path=customXml/itemProps2.xml><?xml version="1.0" encoding="utf-8"?>
-<ds:datastoreItem xmlns:ds="http://schemas.openxmlformats.org/officeDocument/2006/customXml" ds:itemID="{794BE61C-5254-4531-868C-EC2590174185}">
-  <ds:schemaRefs>
-    <ds:schemaRef ds:uri="http://schemas.openxmlformats.org/officeDocument/2006/bibliography"/>
-  </ds:schemaRefs>
-</ds:datastoreItem>
-</file>
-
-<file path=customXml/itemProps3.xml><?xml version="1.0" encoding="utf-8"?>
 <ds:datastoreItem xmlns:ds="http://schemas.openxmlformats.org/officeDocument/2006/customXml" ds:itemID="{62F3E371-4CEE-4871-A936-27DA1639FADD}">
   <ds:schemaRefs>
     <ds:schemaRef ds:uri="http://schemas.microsoft.com/office/2006/metadata/contentType"/>
@@ -8393,13 +9137,18 @@
 </ds:datastoreItem>
 </file>
 
+<file path=customXml/itemProps3.xml><?xml version="1.0" encoding="utf-8"?>
+<ds:datastoreItem xmlns:ds="http://schemas.openxmlformats.org/officeDocument/2006/customXml" ds:itemID="{794BE61C-5254-4531-868C-EC2590174185}">
+  <ds:schemaRefs>
+    <ds:schemaRef ds:uri="http://schemas.openxmlformats.org/officeDocument/2006/bibliography"/>
+  </ds:schemaRefs>
+</ds:datastoreItem>
+</file>
+
 <file path=customXml/itemProps4.xml><?xml version="1.0" encoding="utf-8"?>
-<ds:datastoreItem xmlns:ds="http://schemas.openxmlformats.org/officeDocument/2006/customXml" ds:itemID="{D3B4676A-CA48-4E6B-BABE-1535A7A288F6}">
+<ds:datastoreItem xmlns:ds="http://schemas.openxmlformats.org/officeDocument/2006/customXml" ds:itemID="{58AFF83A-2C1F-4B0C-9BCE-EE49F5226348}">
   <ds:schemaRefs>
-    <ds:schemaRef ds:uri="http://schemas.microsoft.com/office/2006/metadata/properties"/>
-    <ds:schemaRef ds:uri="http://schemas.microsoft.com/office/infopath/2007/PartnerControls"/>
-    <ds:schemaRef ds:uri="85e30bcc-d76c-4413-8e4d-2dce22fb0743"/>
-    <ds:schemaRef ds:uri="164883f8-7691-4ecf-b54a-664c0d0edefe"/>
+    <ds:schemaRef ds:uri="http://schemas.microsoft.com/sharepoint/v3/contenttype/forms"/>
   </ds:schemaRefs>
 </ds:datastoreItem>
 </file>
</xml_diff>

<commit_message>
req 6 corregido y documentacion de req 3 y 6
</commit_message>
<xml_diff>
--- a/Docs/ISIS1225 - AnalisisReto-TEMPLATE RETO.docx
+++ b/Docs/ISIS1225 - AnalisisReto-TEMPLATE RETO.docx
@@ -1,6 +1,6 @@
 
 <file path=word/document.xml><?xml version="1.0" encoding="utf-8"?>
-<w:document xmlns:wpc="http://schemas.microsoft.com/office/word/2010/wordprocessingCanvas" xmlns:cx="http://schemas.microsoft.com/office/drawing/2014/chartex" xmlns:cx1="http://schemas.microsoft.com/office/drawing/2015/9/8/chartex" xmlns:cx2="http://schemas.microsoft.com/office/drawing/2015/10/21/chartex" xmlns:cx3="http://schemas.microsoft.com/office/drawing/2016/5/9/chartex" xmlns:cx4="http://schemas.microsoft.com/office/drawing/2016/5/10/chartex" xmlns:cx5="http://schemas.microsoft.com/office/drawing/2016/5/11/chartex" xmlns:cx6="http://schemas.microsoft.com/office/drawing/2016/5/12/chartex" xmlns:cx7="http://schemas.microsoft.com/office/drawing/2016/5/13/chartex" xmlns:cx8="http://schemas.microsoft.com/office/drawing/2016/5/14/chartex" xmlns:mc="http://schemas.openxmlformats.org/markup-compatibility/2006" xmlns:aink="http://schemas.microsoft.com/office/drawing/2016/ink" xmlns:am3d="http://schemas.microsoft.com/office/drawing/2017/model3d" xmlns:o="urn:schemas-microsoft-com:office:office" xmlns:r="http://schemas.openxmlformats.org/officeDocument/2006/relationships" xmlns:m="http://schemas.openxmlformats.org/officeDocument/2006/math" xmlns:v="urn:schemas-microsoft-com:vml" xmlns:wp14="http://schemas.microsoft.com/office/word/2010/wordprocessingDrawing" xmlns:wp="http://schemas.openxmlformats.org/drawingml/2006/wordprocessingDrawing" xmlns:w10="urn:schemas-microsoft-com:office:word" xmlns:w="http://schemas.openxmlformats.org/wordprocessingml/2006/main" xmlns:w14="http://schemas.microsoft.com/office/word/2010/wordml" xmlns:w15="http://schemas.microsoft.com/office/word/2012/wordml" xmlns:w16cex="http://schemas.microsoft.com/office/word/2018/wordml/cex" xmlns:w16cid="http://schemas.microsoft.com/office/word/2016/wordml/cid" xmlns:w16="http://schemas.microsoft.com/office/word/2018/wordml" xmlns:w16sdtdh="http://schemas.microsoft.com/office/word/2020/wordml/sdtdatahash" xmlns:w16se="http://schemas.microsoft.com/office/word/2015/wordml/symex" xmlns:wpg="http://schemas.microsoft.com/office/word/2010/wordprocessingGroup" xmlns:wpi="http://schemas.microsoft.com/office/word/2010/wordprocessingInk" xmlns:wne="http://schemas.microsoft.com/office/word/2006/wordml" xmlns:wps="http://schemas.microsoft.com/office/word/2010/wordprocessingShape" mc:Ignorable="w14 w15 w16se w16cid w16 w16cex w16sdtdh wp14">
+<w:document xmlns:wpc="http://schemas.microsoft.com/office/word/2010/wordprocessingCanvas" xmlns:cx="http://schemas.microsoft.com/office/drawing/2014/chartex" xmlns:cx1="http://schemas.microsoft.com/office/drawing/2015/9/8/chartex" xmlns:cx2="http://schemas.microsoft.com/office/drawing/2015/10/21/chartex" xmlns:cx3="http://schemas.microsoft.com/office/drawing/2016/5/9/chartex" xmlns:cx4="http://schemas.microsoft.com/office/drawing/2016/5/10/chartex" xmlns:cx5="http://schemas.microsoft.com/office/drawing/2016/5/11/chartex" xmlns:cx6="http://schemas.microsoft.com/office/drawing/2016/5/12/chartex" xmlns:cx7="http://schemas.microsoft.com/office/drawing/2016/5/13/chartex" xmlns:cx8="http://schemas.microsoft.com/office/drawing/2016/5/14/chartex" xmlns:mc="http://schemas.openxmlformats.org/markup-compatibility/2006" xmlns:aink="http://schemas.microsoft.com/office/drawing/2016/ink" xmlns:am3d="http://schemas.microsoft.com/office/drawing/2017/model3d" xmlns:o="urn:schemas-microsoft-com:office:office" xmlns:oel="http://schemas.microsoft.com/office/2019/extlst" xmlns:r="http://schemas.openxmlformats.org/officeDocument/2006/relationships" xmlns:m="http://schemas.openxmlformats.org/officeDocument/2006/math" xmlns:v="urn:schemas-microsoft-com:vml" xmlns:wp14="http://schemas.microsoft.com/office/word/2010/wordprocessingDrawing" xmlns:wp="http://schemas.openxmlformats.org/drawingml/2006/wordprocessingDrawing" xmlns:w10="urn:schemas-microsoft-com:office:word" xmlns:w="http://schemas.openxmlformats.org/wordprocessingml/2006/main" xmlns:w14="http://schemas.microsoft.com/office/word/2010/wordml" xmlns:w15="http://schemas.microsoft.com/office/word/2012/wordml" xmlns:w16cex="http://schemas.microsoft.com/office/word/2018/wordml/cex" xmlns:w16cid="http://schemas.microsoft.com/office/word/2016/wordml/cid" xmlns:w16="http://schemas.microsoft.com/office/word/2018/wordml" xmlns:w16du="http://schemas.microsoft.com/office/word/2023/wordml/word16du" xmlns:w16sdtdh="http://schemas.microsoft.com/office/word/2020/wordml/sdtdatahash" xmlns:w16sdtfl="http://schemas.microsoft.com/office/word/2024/wordml/sdtformatlock" xmlns:w16se="http://schemas.microsoft.com/office/word/2015/wordml/symex" xmlns:wpg="http://schemas.microsoft.com/office/word/2010/wordprocessingGroup" xmlns:wpi="http://schemas.microsoft.com/office/word/2010/wordprocessingInk" xmlns:wne="http://schemas.microsoft.com/office/word/2006/wordml" xmlns:wps="http://schemas.microsoft.com/office/word/2010/wordprocessingShape" mc:Ignorable="w14 w15 w16se w16cid w16 w16cex w16sdtdh w16sdtfl w16du wp14">
   <w:body>
     <w:p>
       <w:pPr>
@@ -118,43 +118,15 @@
             <w:tcW w:w="6300" w:type="dxa"/>
           </w:tcPr>
           <w:p>
-            <w:proofErr w:type="spellStart"/>
-            <w:proofErr w:type="gramStart"/>
             <w:r>
               <w:t>Catalog</w:t>
             </w:r>
-            <w:proofErr w:type="spellEnd"/>
             <w:r>
               <w:t xml:space="preserve"> </w:t>
             </w:r>
             <w:r>
-              <w:t>,</w:t>
-            </w:r>
-            <w:proofErr w:type="gramEnd"/>
-            <w:r>
-              <w:t xml:space="preserve"> </w:t>
-            </w:r>
-            <w:proofErr w:type="spellStart"/>
-            <w:r>
-              <w:t>anio</w:t>
-            </w:r>
-            <w:proofErr w:type="spellEnd"/>
-            <w:r>
-              <w:t xml:space="preserve">, mes, </w:t>
-            </w:r>
-            <w:proofErr w:type="spellStart"/>
-            <w:r>
-              <w:t>descuento_min</w:t>
-            </w:r>
-            <w:proofErr w:type="spellEnd"/>
-            <w:r>
-              <w:t xml:space="preserve">, </w:t>
-            </w:r>
-            <w:proofErr w:type="spellStart"/>
-            <w:r>
-              <w:t>descuento_max</w:t>
-            </w:r>
-            <w:proofErr w:type="spellEnd"/>
+              <w:t>, anio, mes, descuento_min, descuento_max</w:t>
+            </w:r>
           </w:p>
         </w:tc>
       </w:tr>
@@ -185,99 +157,19 @@
           </w:tcPr>
           <w:p>
             <w:r>
-              <w:t xml:space="preserve">Lista “resultado” con tiempo de ejecución del requerimiento en milisegundos, número total de pedidos que cumplieron el filtro, precio promedio de </w:t>
-            </w:r>
-            <w:proofErr w:type="spellStart"/>
-            <w:r>
-              <w:t>Price_per_Box</w:t>
-            </w:r>
-            <w:proofErr w:type="spellEnd"/>
-            <w:r>
-              <w:t xml:space="preserve">, promedio de </w:t>
-            </w:r>
-            <w:proofErr w:type="spellStart"/>
-            <w:r>
-              <w:t>Discount_Pct</w:t>
-            </w:r>
-            <w:proofErr w:type="spellEnd"/>
-            <w:r>
-              <w:t xml:space="preserve">, promedio de </w:t>
-            </w:r>
-            <w:proofErr w:type="spellStart"/>
-            <w:r>
-              <w:t>Marketing_Spend</w:t>
-            </w:r>
-            <w:proofErr w:type="spellEnd"/>
-            <w:r>
-              <w:t xml:space="preserve">, promedio de </w:t>
-            </w:r>
-            <w:proofErr w:type="spellStart"/>
-            <w:r>
-              <w:t>Boxes_Shipped</w:t>
-            </w:r>
-            <w:proofErr w:type="spellEnd"/>
-            <w:r>
-              <w:t xml:space="preserve"> y los dos criterios con mayor </w:t>
-            </w:r>
-            <w:proofErr w:type="spellStart"/>
-            <w:r>
-              <w:t>amount</w:t>
-            </w:r>
-            <w:proofErr w:type="spellEnd"/>
-            <w:r>
-              <w:t xml:space="preserve"> de los que cumplen el criterio con los datos </w:t>
-            </w:r>
-            <w:proofErr w:type="spellStart"/>
-            <w:r>
-              <w:t>Order_ID</w:t>
-            </w:r>
-            <w:proofErr w:type="spellEnd"/>
-            <w:r>
-              <w:t xml:space="preserve">, </w:t>
-            </w:r>
-            <w:r>
-              <w:t>Canal (</w:t>
-            </w:r>
-            <w:proofErr w:type="spellStart"/>
-            <w:r>
-              <w:t>Channel</w:t>
-            </w:r>
-            <w:proofErr w:type="spellEnd"/>
-            <w:r>
-              <w:t>)</w:t>
+              <w:t xml:space="preserve">Lista “resultado” con tiempo de ejecución del requerimiento en milisegundos, número total de pedidos que cumplieron el filtro, precio promedio de Price_per_Box, promedio de Discount_Pct, promedio de Marketing_Spend, promedio de Boxes_Shipped y los dos criterios con mayor amount de los que cumplen el criterio con los datos Order_ID, </w:t>
+            </w:r>
+            <w:r>
+              <w:t>Canal (Channel)</w:t>
             </w:r>
             <w:r>
               <w:t>,</w:t>
             </w:r>
             <w:r>
-              <w:t xml:space="preserve"> Fecha (</w:t>
-            </w:r>
-            <w:proofErr w:type="spellStart"/>
-            <w:r>
-              <w:t>Order_Date</w:t>
-            </w:r>
-            <w:proofErr w:type="spellEnd"/>
-            <w:r>
-              <w:t>)</w:t>
-            </w:r>
-            <w:r>
-              <w:t>, Cajas enviadas (</w:t>
-            </w:r>
-            <w:proofErr w:type="spellStart"/>
-            <w:r>
-              <w:t>Boxes_Shipped</w:t>
-            </w:r>
-            <w:proofErr w:type="spellEnd"/>
-            <w:r>
-              <w:t>) y Monto (</w:t>
-            </w:r>
-            <w:proofErr w:type="spellStart"/>
-            <w:r>
-              <w:t>Amount</w:t>
-            </w:r>
-            <w:proofErr w:type="spellEnd"/>
-            <w:r>
-              <w:t>)</w:t>
+              <w:t xml:space="preserve"> Fecha (Order_Date)</w:t>
+            </w:r>
+            <w:r>
+              <w:t>, Cajas enviadas (Boxes_Shipped) y Monto (Amount)</w:t>
             </w:r>
           </w:p>
         </w:tc>
@@ -430,7 +322,6 @@
                 <w:bCs/>
               </w:rPr>
             </w:pPr>
-            <w:proofErr w:type="gramStart"/>
             <w:r>
               <w:rPr>
                 <w:rFonts w:ascii="Arial" w:eastAsia="Times New Roman" w:hAnsi="Arial" w:cs="Arial"/>
@@ -438,9 +329,23 @@
                 <w:szCs w:val="20"/>
                 <w:lang w:eastAsia="es-CO"/>
               </w:rPr>
-              <w:t>O(</w:t>
-            </w:r>
-            <w:proofErr w:type="gramEnd"/>
+              <w:t>O(1)</w:t>
+            </w:r>
+          </w:p>
+        </w:tc>
+      </w:tr>
+      <w:tr>
+        <w:tc>
+          <w:tcPr>
+            <w:tcW w:w="5070" w:type="dxa"/>
+          </w:tcPr>
+          <w:p>
+            <w:pPr>
+              <w:rPr>
+                <w:b/>
+                <w:bCs/>
+              </w:rPr>
+            </w:pPr>
             <w:r>
               <w:rPr>
                 <w:rFonts w:ascii="Arial" w:eastAsia="Times New Roman" w:hAnsi="Arial" w:cs="Arial"/>
@@ -448,15 +353,13 @@
                 <w:szCs w:val="20"/>
                 <w:lang w:eastAsia="es-CO"/>
               </w:rPr>
-              <w:t>1)</w:t>
-            </w:r>
-          </w:p>
-        </w:tc>
-      </w:tr>
-      <w:tr>
-        <w:tc>
-          <w:tcPr>
-            <w:tcW w:w="5070" w:type="dxa"/>
+              <w:t>Paso 2: Se busca la llave en la tabla de hash de Linear Probing y se obtiene la lista de pedidos de ese mes</w:t>
+            </w:r>
+          </w:p>
+        </w:tc>
+        <w:tc>
+          <w:tcPr>
+            <w:tcW w:w="4275" w:type="dxa"/>
           </w:tcPr>
           <w:p>
             <w:pPr>
@@ -472,9 +375,23 @@
                 <w:szCs w:val="20"/>
                 <w:lang w:eastAsia="es-CO"/>
               </w:rPr>
-              <w:t xml:space="preserve">Paso 2: Se busca la llave en la tabla de hash de Linear </w:t>
-            </w:r>
-            <w:proofErr w:type="spellStart"/>
+              <w:t xml:space="preserve">O(1) </w:t>
+            </w:r>
+          </w:p>
+        </w:tc>
+      </w:tr>
+      <w:tr>
+        <w:tc>
+          <w:tcPr>
+            <w:tcW w:w="5070" w:type="dxa"/>
+          </w:tcPr>
+          <w:p>
+            <w:pPr>
+              <w:rPr>
+                <w:b/>
+                <w:bCs/>
+              </w:rPr>
+            </w:pPr>
             <w:r>
               <w:rPr>
                 <w:rFonts w:ascii="Arial" w:eastAsia="Times New Roman" w:hAnsi="Arial" w:cs="Arial"/>
@@ -482,9 +399,21 @@
                 <w:szCs w:val="20"/>
                 <w:lang w:eastAsia="es-CO"/>
               </w:rPr>
-              <w:t>Probing</w:t>
-            </w:r>
-            <w:proofErr w:type="spellEnd"/>
+              <w:t>Paso 3: Se crea la lista vacía de filtrados y se inicializa el acumulador del monto</w:t>
+            </w:r>
+          </w:p>
+        </w:tc>
+        <w:tc>
+          <w:tcPr>
+            <w:tcW w:w="4275" w:type="dxa"/>
+          </w:tcPr>
+          <w:p>
+            <w:pPr>
+              <w:rPr>
+                <w:b/>
+                <w:bCs/>
+              </w:rPr>
+            </w:pPr>
             <w:r>
               <w:rPr>
                 <w:rFonts w:ascii="Arial" w:eastAsia="Times New Roman" w:hAnsi="Arial" w:cs="Arial"/>
@@ -492,13 +421,15 @@
                 <w:szCs w:val="20"/>
                 <w:lang w:eastAsia="es-CO"/>
               </w:rPr>
-              <w:t xml:space="preserve"> y se obtiene la lista de pedidos de ese mes</w:t>
-            </w:r>
-          </w:p>
-        </w:tc>
-        <w:tc>
-          <w:tcPr>
-            <w:tcW w:w="4275" w:type="dxa"/>
+              <w:t>O(1)</w:t>
+            </w:r>
+          </w:p>
+        </w:tc>
+      </w:tr>
+      <w:tr>
+        <w:tc>
+          <w:tcPr>
+            <w:tcW w:w="5070" w:type="dxa"/>
           </w:tcPr>
           <w:p>
             <w:pPr>
@@ -507,7 +438,6 @@
                 <w:bCs/>
               </w:rPr>
             </w:pPr>
-            <w:proofErr w:type="gramStart"/>
             <w:r>
               <w:rPr>
                 <w:rFonts w:ascii="Arial" w:eastAsia="Times New Roman" w:hAnsi="Arial" w:cs="Arial"/>
@@ -515,9 +445,8 @@
                 <w:szCs w:val="20"/>
                 <w:lang w:eastAsia="es-CO"/>
               </w:rPr>
-              <w:t>O(</w:t>
-            </w:r>
-            <w:proofErr w:type="gramEnd"/>
+              <w:t>Paso 4: Se recorren los m pedidos del mes</w:t>
+            </w:r>
             <w:r>
               <w:rPr>
                 <w:rFonts w:ascii="Arial" w:eastAsia="Times New Roman" w:hAnsi="Arial" w:cs="Arial"/>
@@ -525,23 +454,8 @@
                 <w:szCs w:val="20"/>
                 <w:lang w:eastAsia="es-CO"/>
               </w:rPr>
-              <w:t xml:space="preserve">1) </w:t>
-            </w:r>
-          </w:p>
-        </w:tc>
-      </w:tr>
-      <w:tr>
-        <w:tc>
-          <w:tcPr>
-            <w:tcW w:w="5070" w:type="dxa"/>
-          </w:tcPr>
-          <w:p>
-            <w:pPr>
-              <w:rPr>
-                <w:b/>
-                <w:bCs/>
-              </w:rPr>
-            </w:pPr>
+              <w:t xml:space="preserve">, se </w:t>
+            </w:r>
             <w:r>
               <w:rPr>
                 <w:rFonts w:ascii="Arial" w:eastAsia="Times New Roman" w:hAnsi="Arial" w:cs="Arial"/>
@@ -549,7 +463,7 @@
                 <w:szCs w:val="20"/>
                 <w:lang w:eastAsia="es-CO"/>
               </w:rPr>
-              <w:t>Paso 3: Se crea la lista vacía de filtrados y se inicializa el acumulador del monto</w:t>
+              <w:t>lee el descuento, se compara con el rango y, si cumple, se agrega al final de filtrados y se suma su Amount</w:t>
             </w:r>
           </w:p>
         </w:tc>
@@ -564,7 +478,6 @@
                 <w:bCs/>
               </w:rPr>
             </w:pPr>
-            <w:proofErr w:type="gramStart"/>
             <w:r>
               <w:rPr>
                 <w:rFonts w:ascii="Arial" w:eastAsia="Times New Roman" w:hAnsi="Arial" w:cs="Arial"/>
@@ -572,9 +485,8 @@
                 <w:szCs w:val="20"/>
                 <w:lang w:eastAsia="es-CO"/>
               </w:rPr>
-              <w:t>O(</w:t>
-            </w:r>
-            <w:proofErr w:type="gramEnd"/>
+              <w:t>O(m)</w:t>
+            </w:r>
             <w:r>
               <w:rPr>
                 <w:rFonts w:ascii="Arial" w:eastAsia="Times New Roman" w:hAnsi="Arial" w:cs="Arial"/>
@@ -582,7 +494,7 @@
                 <w:szCs w:val="20"/>
                 <w:lang w:eastAsia="es-CO"/>
               </w:rPr>
-              <w:t>1)</w:t>
+              <w:t>, donde m = pedidos filtrados del mes</w:t>
             </w:r>
           </w:p>
         </w:tc>
@@ -606,8 +518,21 @@
                 <w:szCs w:val="20"/>
                 <w:lang w:eastAsia="es-CO"/>
               </w:rPr>
-              <w:t>Paso 4: Se recorren los m pedidos del mes</w:t>
-            </w:r>
+              <w:t>Paso 5: Se arma el diccionario de resultado con el total y el monto acumulado</w:t>
+            </w:r>
+          </w:p>
+        </w:tc>
+        <w:tc>
+          <w:tcPr>
+            <w:tcW w:w="4275" w:type="dxa"/>
+          </w:tcPr>
+          <w:p>
+            <w:pPr>
+              <w:rPr>
+                <w:b/>
+                <w:bCs/>
+              </w:rPr>
+            </w:pPr>
             <w:r>
               <w:rPr>
                 <w:rFonts w:ascii="Arial" w:eastAsia="Times New Roman" w:hAnsi="Arial" w:cs="Arial"/>
@@ -615,8 +540,23 @@
                 <w:szCs w:val="20"/>
                 <w:lang w:eastAsia="es-CO"/>
               </w:rPr>
-              <w:t xml:space="preserve">, se </w:t>
-            </w:r>
+              <w:t>O(1)</w:t>
+            </w:r>
+          </w:p>
+        </w:tc>
+      </w:tr>
+      <w:tr>
+        <w:tc>
+          <w:tcPr>
+            <w:tcW w:w="5070" w:type="dxa"/>
+          </w:tcPr>
+          <w:p>
+            <w:pPr>
+              <w:rPr>
+                <w:b/>
+                <w:bCs/>
+              </w:rPr>
+            </w:pPr>
             <w:r>
               <w:rPr>
                 <w:rFonts w:ascii="Arial" w:eastAsia="Times New Roman" w:hAnsi="Arial" w:cs="Arial"/>
@@ -624,31 +564,22 @@
                 <w:szCs w:val="20"/>
                 <w:lang w:eastAsia="es-CO"/>
               </w:rPr>
-              <w:t xml:space="preserve">lee el descuento, se compara con el rango y, si cumple, se agrega al final de filtrados y se suma su </w:t>
-            </w:r>
-            <w:proofErr w:type="spellStart"/>
-            <w:r>
+              <w:t>Paso 6: Se recorren los pedidos filtrados para sumar Price_per_Box y Boxes_Shipped</w:t>
+            </w:r>
+          </w:p>
+        </w:tc>
+        <w:tc>
+          <w:tcPr>
+            <w:tcW w:w="4275" w:type="dxa"/>
+          </w:tcPr>
+          <w:p>
+            <w:pPr>
               <w:rPr>
                 <w:rFonts w:ascii="Arial" w:eastAsia="Times New Roman" w:hAnsi="Arial" w:cs="Arial"/>
                 <w:sz w:val="20"/>
                 <w:szCs w:val="20"/>
                 <w:lang w:eastAsia="es-CO"/>
               </w:rPr>
-              <w:t>Amount</w:t>
-            </w:r>
-            <w:proofErr w:type="spellEnd"/>
-          </w:p>
-        </w:tc>
-        <w:tc>
-          <w:tcPr>
-            <w:tcW w:w="4275" w:type="dxa"/>
-          </w:tcPr>
-          <w:p>
-            <w:pPr>
-              <w:rPr>
-                <w:b/>
-                <w:bCs/>
-              </w:rPr>
             </w:pPr>
             <w:r>
               <w:rPr>
@@ -657,7 +588,7 @@
                 <w:szCs w:val="20"/>
                 <w:lang w:eastAsia="es-CO"/>
               </w:rPr>
-              <w:t>O(m)</w:t>
+              <w:t>O(</w:t>
             </w:r>
             <w:r>
               <w:rPr>
@@ -666,23 +597,8 @@
                 <w:szCs w:val="20"/>
                 <w:lang w:eastAsia="es-CO"/>
               </w:rPr>
-              <w:t>, donde m = pedidos filtrados del mes</w:t>
-            </w:r>
-          </w:p>
-        </w:tc>
-      </w:tr>
-      <w:tr>
-        <w:tc>
-          <w:tcPr>
-            <w:tcW w:w="5070" w:type="dxa"/>
-          </w:tcPr>
-          <w:p>
-            <w:pPr>
-              <w:rPr>
-                <w:b/>
-                <w:bCs/>
-              </w:rPr>
-            </w:pPr>
+              <w:t>n</w:t>
+            </w:r>
             <w:r>
               <w:rPr>
                 <w:rFonts w:ascii="Arial" w:eastAsia="Times New Roman" w:hAnsi="Arial" w:cs="Arial"/>
@@ -690,22 +606,8 @@
                 <w:szCs w:val="20"/>
                 <w:lang w:eastAsia="es-CO"/>
               </w:rPr>
-              <w:t>Paso 5: Se arma el diccionario de resultado con el total y el monto acumulado</w:t>
-            </w:r>
-          </w:p>
-        </w:tc>
-        <w:tc>
-          <w:tcPr>
-            <w:tcW w:w="4275" w:type="dxa"/>
-          </w:tcPr>
-          <w:p>
-            <w:pPr>
-              <w:rPr>
-                <w:b/>
-                <w:bCs/>
-              </w:rPr>
-            </w:pPr>
-            <w:proofErr w:type="gramStart"/>
+              <w:t>)</w:t>
+            </w:r>
             <w:r>
               <w:rPr>
                 <w:rFonts w:ascii="Arial" w:eastAsia="Times New Roman" w:hAnsi="Arial" w:cs="Arial"/>
@@ -713,9 +615,50 @@
                 <w:szCs w:val="20"/>
                 <w:lang w:eastAsia="es-CO"/>
               </w:rPr>
-              <w:t>O(</w:t>
-            </w:r>
-            <w:proofErr w:type="gramEnd"/>
+              <w:t xml:space="preserve">, donde n = pedidos filtrados para </w:t>
+            </w:r>
+          </w:p>
+          <w:p>
+            <w:pPr>
+              <w:rPr>
+                <w:b/>
+                <w:bCs/>
+                <w:lang w:val="en-US"/>
+              </w:rPr>
+            </w:pPr>
+            <w:r>
+              <w:rPr>
+                <w:rFonts w:ascii="Arial" w:eastAsia="Times New Roman" w:hAnsi="Arial" w:cs="Arial"/>
+                <w:sz w:val="20"/>
+                <w:szCs w:val="20"/>
+                <w:lang w:val="en-US" w:eastAsia="es-CO"/>
+              </w:rPr>
+              <w:t>Price_per_Box y Boxes_Shipped</w:t>
+            </w:r>
+            <w:r>
+              <w:rPr>
+                <w:rFonts w:ascii="Arial" w:eastAsia="Times New Roman" w:hAnsi="Arial" w:cs="Arial"/>
+                <w:sz w:val="20"/>
+                <w:szCs w:val="20"/>
+                <w:lang w:val="en-US" w:eastAsia="es-CO"/>
+              </w:rPr>
+              <w:t xml:space="preserve"> </w:t>
+            </w:r>
+          </w:p>
+        </w:tc>
+      </w:tr>
+      <w:tr>
+        <w:tc>
+          <w:tcPr>
+            <w:tcW w:w="5070" w:type="dxa"/>
+          </w:tcPr>
+          <w:p>
+            <w:pPr>
+              <w:rPr>
+                <w:b/>
+                <w:bCs/>
+              </w:rPr>
+            </w:pPr>
             <w:r>
               <w:rPr>
                 <w:rFonts w:ascii="Arial" w:eastAsia="Times New Roman" w:hAnsi="Arial" w:cs="Arial"/>
@@ -723,15 +666,13 @@
                 <w:szCs w:val="20"/>
                 <w:lang w:eastAsia="es-CO"/>
               </w:rPr>
-              <w:t>1)</w:t>
-            </w:r>
-          </w:p>
-        </w:tc>
-      </w:tr>
-      <w:tr>
-        <w:tc>
-          <w:tcPr>
-            <w:tcW w:w="5070" w:type="dxa"/>
+              <w:t>Paso 7: Se calculan los dos promedios con una división cada uno</w:t>
+            </w:r>
+          </w:p>
+        </w:tc>
+        <w:tc>
+          <w:tcPr>
+            <w:tcW w:w="4275" w:type="dxa"/>
           </w:tcPr>
           <w:p>
             <w:pPr>
@@ -747,9 +688,17 @@
                 <w:szCs w:val="20"/>
                 <w:lang w:eastAsia="es-CO"/>
               </w:rPr>
-              <w:t xml:space="preserve">Paso 6: Se recorren los pedidos filtrados para sumar </w:t>
-            </w:r>
-            <w:proofErr w:type="spellStart"/>
+              <w:t>O(1)</w:t>
+            </w:r>
+          </w:p>
+        </w:tc>
+      </w:tr>
+      <w:tr>
+        <w:tc>
+          <w:tcPr>
+            <w:tcW w:w="5070" w:type="dxa"/>
+          </w:tcPr>
+          <w:p>
             <w:r>
               <w:rPr>
                 <w:rFonts w:ascii="Arial" w:eastAsia="Times New Roman" w:hAnsi="Arial" w:cs="Arial"/>
@@ -757,9 +706,9 @@
                 <w:szCs w:val="20"/>
                 <w:lang w:eastAsia="es-CO"/>
               </w:rPr>
-              <w:t>Price_per_Box</w:t>
-            </w:r>
-            <w:proofErr w:type="spellEnd"/>
+              <w:lastRenderedPageBreak/>
+              <w:t xml:space="preserve">Paso 8: Se ordenan los filtrados con Merge Sort </w:t>
+            </w:r>
             <w:r>
               <w:rPr>
                 <w:rFonts w:ascii="Arial" w:eastAsia="Times New Roman" w:hAnsi="Arial" w:cs="Arial"/>
@@ -767,9 +716,8 @@
                 <w:szCs w:val="20"/>
                 <w:lang w:eastAsia="es-CO"/>
               </w:rPr>
-              <w:t xml:space="preserve"> y </w:t>
-            </w:r>
-            <w:proofErr w:type="spellStart"/>
+              <w:t xml:space="preserve">con el criterio </w:t>
+            </w:r>
             <w:r>
               <w:rPr>
                 <w:rFonts w:ascii="Arial" w:eastAsia="Times New Roman" w:hAnsi="Arial" w:cs="Arial"/>
@@ -777,24 +725,17 @@
                 <w:szCs w:val="20"/>
                 <w:lang w:eastAsia="es-CO"/>
               </w:rPr>
-              <w:t>Boxes_Shipped</w:t>
-            </w:r>
-            <w:proofErr w:type="spellEnd"/>
-          </w:p>
-        </w:tc>
-        <w:tc>
-          <w:tcPr>
-            <w:tcW w:w="4275" w:type="dxa"/>
-          </w:tcPr>
-          <w:p>
-            <w:pPr>
+              <w:t>Discount_Pct descendente,</w:t>
+            </w:r>
+            <w:r>
               <w:rPr>
                 <w:rFonts w:ascii="Arial" w:eastAsia="Times New Roman" w:hAnsi="Arial" w:cs="Arial"/>
                 <w:sz w:val="20"/>
                 <w:szCs w:val="20"/>
                 <w:lang w:eastAsia="es-CO"/>
               </w:rPr>
-            </w:pPr>
+              <w:t xml:space="preserve"> si son iguales</w:t>
+            </w:r>
             <w:r>
               <w:rPr>
                 <w:rFonts w:ascii="Arial" w:eastAsia="Times New Roman" w:hAnsi="Arial" w:cs="Arial"/>
@@ -802,7 +743,7 @@
                 <w:szCs w:val="20"/>
                 <w:lang w:eastAsia="es-CO"/>
               </w:rPr>
-              <w:t>O(</w:t>
+              <w:t xml:space="preserve"> Amount descendente,</w:t>
             </w:r>
             <w:r>
               <w:rPr>
@@ -811,7 +752,7 @@
                 <w:szCs w:val="20"/>
                 <w:lang w:eastAsia="es-CO"/>
               </w:rPr>
-              <w:t>n</w:t>
+              <w:t xml:space="preserve"> y si siguen siendo iguales</w:t>
             </w:r>
             <w:r>
               <w:rPr>
@@ -820,27 +761,75 @@
                 <w:szCs w:val="20"/>
                 <w:lang w:eastAsia="es-CO"/>
               </w:rPr>
-              <w:t>)</w:t>
-            </w:r>
-            <w:r>
+              <w:t xml:space="preserve"> luego Order_ID ascendente</w:t>
+            </w:r>
+          </w:p>
+        </w:tc>
+        <w:tc>
+          <w:tcPr>
+            <w:tcW w:w="4275" w:type="dxa"/>
+          </w:tcPr>
+          <w:p>
+            <w:pPr>
               <w:rPr>
                 <w:rFonts w:ascii="Arial" w:eastAsia="Times New Roman" w:hAnsi="Arial" w:cs="Arial"/>
                 <w:sz w:val="20"/>
                 <w:szCs w:val="20"/>
                 <w:lang w:eastAsia="es-CO"/>
               </w:rPr>
-              <w:t xml:space="preserve">, donde n = pedidos filtrados para </w:t>
+            </w:pPr>
+            <w:r>
+              <w:rPr>
+                <w:rFonts w:ascii="Arial" w:eastAsia="Times New Roman" w:hAnsi="Arial" w:cs="Arial"/>
+                <w:sz w:val="20"/>
+                <w:szCs w:val="20"/>
+                <w:lang w:eastAsia="es-CO"/>
+              </w:rPr>
+              <w:t>O</w:t>
+            </w:r>
+            <w:r>
+              <w:rPr>
+                <w:rFonts w:ascii="Arial" w:eastAsia="Times New Roman" w:hAnsi="Arial" w:cs="Arial"/>
+                <w:sz w:val="20"/>
+                <w:szCs w:val="20"/>
+                <w:lang w:eastAsia="es-CO"/>
+              </w:rPr>
+              <w:t>(n log n</w:t>
+            </w:r>
+            <w:r>
+              <w:rPr>
+                <w:rFonts w:ascii="Arial" w:eastAsia="Times New Roman" w:hAnsi="Arial" w:cs="Arial"/>
+                <w:sz w:val="20"/>
+                <w:szCs w:val="20"/>
+                <w:lang w:eastAsia="es-CO"/>
+              </w:rPr>
+              <w:t>)</w:t>
+            </w:r>
+            <w:r>
+              <w:rPr>
+                <w:rFonts w:ascii="Arial" w:eastAsia="Times New Roman" w:hAnsi="Arial" w:cs="Arial"/>
+                <w:sz w:val="20"/>
+                <w:szCs w:val="20"/>
+                <w:lang w:eastAsia="es-CO"/>
+              </w:rPr>
+              <w:t xml:space="preserve">, donde n = pedidos filtrados </w:t>
+            </w:r>
+            <w:r>
+              <w:rPr>
+                <w:rFonts w:ascii="Arial" w:eastAsia="Times New Roman" w:hAnsi="Arial" w:cs="Arial"/>
+                <w:sz w:val="20"/>
+                <w:szCs w:val="20"/>
+                <w:lang w:eastAsia="es-CO"/>
+              </w:rPr>
+              <w:t xml:space="preserve">para </w:t>
             </w:r>
           </w:p>
           <w:p>
             <w:pPr>
               <w:rPr>
-                <w:b/>
-                <w:bCs/>
                 <w:lang w:val="en-US"/>
               </w:rPr>
             </w:pPr>
-            <w:proofErr w:type="spellStart"/>
             <w:r>
               <w:rPr>
                 <w:rFonts w:ascii="Arial" w:eastAsia="Times New Roman" w:hAnsi="Arial" w:cs="Arial"/>
@@ -848,37 +837,7 @@
                 <w:szCs w:val="20"/>
                 <w:lang w:val="en-US" w:eastAsia="es-CO"/>
               </w:rPr>
-              <w:t>Price_per_Box</w:t>
-            </w:r>
-            <w:proofErr w:type="spellEnd"/>
-            <w:r>
-              <w:rPr>
-                <w:rFonts w:ascii="Arial" w:eastAsia="Times New Roman" w:hAnsi="Arial" w:cs="Arial"/>
-                <w:sz w:val="20"/>
-                <w:szCs w:val="20"/>
-                <w:lang w:val="en-US" w:eastAsia="es-CO"/>
-              </w:rPr>
-              <w:t xml:space="preserve"> y </w:t>
-            </w:r>
-            <w:proofErr w:type="spellStart"/>
-            <w:r>
-              <w:rPr>
-                <w:rFonts w:ascii="Arial" w:eastAsia="Times New Roman" w:hAnsi="Arial" w:cs="Arial"/>
-                <w:sz w:val="20"/>
-                <w:szCs w:val="20"/>
-                <w:lang w:val="en-US" w:eastAsia="es-CO"/>
-              </w:rPr>
-              <w:t>Boxes_Shipped</w:t>
-            </w:r>
-            <w:proofErr w:type="spellEnd"/>
-            <w:r>
-              <w:rPr>
-                <w:rFonts w:ascii="Arial" w:eastAsia="Times New Roman" w:hAnsi="Arial" w:cs="Arial"/>
-                <w:sz w:val="20"/>
-                <w:szCs w:val="20"/>
-                <w:lang w:val="en-US" w:eastAsia="es-CO"/>
-              </w:rPr>
-              <w:t xml:space="preserve"> </w:t>
+              <w:t>Price_per_Box y Boxes_Shipped</w:t>
             </w:r>
           </w:p>
         </w:tc>
@@ -889,12 +848,6 @@
             <w:tcW w:w="5070" w:type="dxa"/>
           </w:tcPr>
           <w:p>
-            <w:pPr>
-              <w:rPr>
-                <w:b/>
-                <w:bCs/>
-              </w:rPr>
-            </w:pPr>
             <w:r>
               <w:rPr>
                 <w:rFonts w:ascii="Arial" w:eastAsia="Times New Roman" w:hAnsi="Arial" w:cs="Arial"/>
@@ -902,7 +855,7 @@
                 <w:szCs w:val="20"/>
                 <w:lang w:eastAsia="es-CO"/>
               </w:rPr>
-              <w:t>Paso 7: Se calculan los dos promedios con una división cada uno</w:t>
+              <w:t xml:space="preserve">Paso 9: Si hay más de 20, se toman los primeros 10 y los últimos 10 con sub_list. </w:t>
             </w:r>
           </w:p>
         </w:tc>
@@ -911,13 +864,6 @@
             <w:tcW w:w="4275" w:type="dxa"/>
           </w:tcPr>
           <w:p>
-            <w:pPr>
-              <w:rPr>
-                <w:b/>
-                <w:bCs/>
-              </w:rPr>
-            </w:pPr>
-            <w:proofErr w:type="gramStart"/>
             <w:r>
               <w:rPr>
                 <w:rFonts w:ascii="Arial" w:eastAsia="Times New Roman" w:hAnsi="Arial" w:cs="Arial"/>
@@ -925,9 +871,17 @@
                 <w:szCs w:val="20"/>
                 <w:lang w:eastAsia="es-CO"/>
               </w:rPr>
-              <w:t>O(</w:t>
-            </w:r>
-            <w:proofErr w:type="gramEnd"/>
+              <w:t>O(1)</w:t>
+            </w:r>
+          </w:p>
+        </w:tc>
+      </w:tr>
+      <w:tr>
+        <w:tc>
+          <w:tcPr>
+            <w:tcW w:w="5070" w:type="dxa"/>
+          </w:tcPr>
+          <w:p>
             <w:r>
               <w:rPr>
                 <w:rFonts w:ascii="Arial" w:eastAsia="Times New Roman" w:hAnsi="Arial" w:cs="Arial"/>
@@ -935,15 +889,13 @@
                 <w:szCs w:val="20"/>
                 <w:lang w:eastAsia="es-CO"/>
               </w:rPr>
-              <w:t>1)</w:t>
-            </w:r>
-          </w:p>
-        </w:tc>
-      </w:tr>
-      <w:tr>
-        <w:tc>
-          <w:tcPr>
-            <w:tcW w:w="5070" w:type="dxa"/>
+              <w:t>Paso 10: Se detiene el cronómetro y se calcula el tiempo</w:t>
+            </w:r>
+          </w:p>
+        </w:tc>
+        <w:tc>
+          <w:tcPr>
+            <w:tcW w:w="4275" w:type="dxa"/>
           </w:tcPr>
           <w:p>
             <w:r>
@@ -953,263 +905,8 @@
                 <w:szCs w:val="20"/>
                 <w:lang w:eastAsia="es-CO"/>
               </w:rPr>
-              <w:lastRenderedPageBreak/>
-              <w:t xml:space="preserve">Paso 8: Se ordenan los filtrados con </w:t>
-            </w:r>
-            <w:proofErr w:type="spellStart"/>
-            <w:r>
-              <w:rPr>
-                <w:rFonts w:ascii="Arial" w:eastAsia="Times New Roman" w:hAnsi="Arial" w:cs="Arial"/>
-                <w:sz w:val="20"/>
-                <w:szCs w:val="20"/>
-                <w:lang w:eastAsia="es-CO"/>
-              </w:rPr>
-              <w:t>Merge</w:t>
-            </w:r>
-            <w:proofErr w:type="spellEnd"/>
-            <w:r>
-              <w:rPr>
-                <w:rFonts w:ascii="Arial" w:eastAsia="Times New Roman" w:hAnsi="Arial" w:cs="Arial"/>
-                <w:sz w:val="20"/>
-                <w:szCs w:val="20"/>
-                <w:lang w:eastAsia="es-CO"/>
-              </w:rPr>
-              <w:t xml:space="preserve"> </w:t>
-            </w:r>
-            <w:proofErr w:type="spellStart"/>
-            <w:r>
-              <w:rPr>
-                <w:rFonts w:ascii="Arial" w:eastAsia="Times New Roman" w:hAnsi="Arial" w:cs="Arial"/>
-                <w:sz w:val="20"/>
-                <w:szCs w:val="20"/>
-                <w:lang w:eastAsia="es-CO"/>
-              </w:rPr>
-              <w:t>Sort</w:t>
-            </w:r>
-            <w:proofErr w:type="spellEnd"/>
-            <w:r>
-              <w:rPr>
-                <w:rFonts w:ascii="Arial" w:eastAsia="Times New Roman" w:hAnsi="Arial" w:cs="Arial"/>
-                <w:sz w:val="20"/>
-                <w:szCs w:val="20"/>
-                <w:lang w:eastAsia="es-CO"/>
-              </w:rPr>
-              <w:t xml:space="preserve"> </w:t>
-            </w:r>
-            <w:r>
-              <w:rPr>
-                <w:rFonts w:ascii="Arial" w:eastAsia="Times New Roman" w:hAnsi="Arial" w:cs="Arial"/>
-                <w:sz w:val="20"/>
-                <w:szCs w:val="20"/>
-                <w:lang w:eastAsia="es-CO"/>
-              </w:rPr>
-              <w:t xml:space="preserve">con el criterio </w:t>
-            </w:r>
-            <w:proofErr w:type="spellStart"/>
-            <w:r>
-              <w:rPr>
-                <w:rFonts w:ascii="Arial" w:eastAsia="Times New Roman" w:hAnsi="Arial" w:cs="Arial"/>
-                <w:sz w:val="20"/>
-                <w:szCs w:val="20"/>
-                <w:lang w:eastAsia="es-CO"/>
-              </w:rPr>
-              <w:t>Discount_Pct</w:t>
-            </w:r>
-            <w:proofErr w:type="spellEnd"/>
-            <w:r>
-              <w:rPr>
-                <w:rFonts w:ascii="Arial" w:eastAsia="Times New Roman" w:hAnsi="Arial" w:cs="Arial"/>
-                <w:sz w:val="20"/>
-                <w:szCs w:val="20"/>
-                <w:lang w:eastAsia="es-CO"/>
-              </w:rPr>
-              <w:t xml:space="preserve"> descendente,</w:t>
-            </w:r>
-            <w:r>
-              <w:rPr>
-                <w:rFonts w:ascii="Arial" w:eastAsia="Times New Roman" w:hAnsi="Arial" w:cs="Arial"/>
-                <w:sz w:val="20"/>
-                <w:szCs w:val="20"/>
-                <w:lang w:eastAsia="es-CO"/>
-              </w:rPr>
-              <w:t xml:space="preserve"> si son iguales</w:t>
-            </w:r>
-            <w:r>
-              <w:rPr>
-                <w:rFonts w:ascii="Arial" w:eastAsia="Times New Roman" w:hAnsi="Arial" w:cs="Arial"/>
-                <w:sz w:val="20"/>
-                <w:szCs w:val="20"/>
-                <w:lang w:eastAsia="es-CO"/>
-              </w:rPr>
-              <w:t xml:space="preserve"> </w:t>
-            </w:r>
-            <w:proofErr w:type="spellStart"/>
-            <w:r>
-              <w:rPr>
-                <w:rFonts w:ascii="Arial" w:eastAsia="Times New Roman" w:hAnsi="Arial" w:cs="Arial"/>
-                <w:sz w:val="20"/>
-                <w:szCs w:val="20"/>
-                <w:lang w:eastAsia="es-CO"/>
-              </w:rPr>
-              <w:t>Amount</w:t>
-            </w:r>
-            <w:proofErr w:type="spellEnd"/>
-            <w:r>
-              <w:rPr>
-                <w:rFonts w:ascii="Arial" w:eastAsia="Times New Roman" w:hAnsi="Arial" w:cs="Arial"/>
-                <w:sz w:val="20"/>
-                <w:szCs w:val="20"/>
-                <w:lang w:eastAsia="es-CO"/>
-              </w:rPr>
-              <w:t xml:space="preserve"> descendente,</w:t>
-            </w:r>
-            <w:r>
-              <w:rPr>
-                <w:rFonts w:ascii="Arial" w:eastAsia="Times New Roman" w:hAnsi="Arial" w:cs="Arial"/>
-                <w:sz w:val="20"/>
-                <w:szCs w:val="20"/>
-                <w:lang w:eastAsia="es-CO"/>
-              </w:rPr>
-              <w:t xml:space="preserve"> y si siguen siendo iguales</w:t>
-            </w:r>
-            <w:r>
-              <w:rPr>
-                <w:rFonts w:ascii="Arial" w:eastAsia="Times New Roman" w:hAnsi="Arial" w:cs="Arial"/>
-                <w:sz w:val="20"/>
-                <w:szCs w:val="20"/>
-                <w:lang w:eastAsia="es-CO"/>
-              </w:rPr>
-              <w:t xml:space="preserve"> luego </w:t>
-            </w:r>
-            <w:proofErr w:type="spellStart"/>
-            <w:r>
-              <w:rPr>
-                <w:rFonts w:ascii="Arial" w:eastAsia="Times New Roman" w:hAnsi="Arial" w:cs="Arial"/>
-                <w:sz w:val="20"/>
-                <w:szCs w:val="20"/>
-                <w:lang w:eastAsia="es-CO"/>
-              </w:rPr>
-              <w:t>Order_ID</w:t>
-            </w:r>
-            <w:proofErr w:type="spellEnd"/>
-            <w:r>
-              <w:rPr>
-                <w:rFonts w:ascii="Arial" w:eastAsia="Times New Roman" w:hAnsi="Arial" w:cs="Arial"/>
-                <w:sz w:val="20"/>
-                <w:szCs w:val="20"/>
-                <w:lang w:eastAsia="es-CO"/>
-              </w:rPr>
-              <w:t xml:space="preserve"> ascendente</w:t>
-            </w:r>
-          </w:p>
-        </w:tc>
-        <w:tc>
-          <w:tcPr>
-            <w:tcW w:w="4275" w:type="dxa"/>
-          </w:tcPr>
-          <w:p>
-            <w:pPr>
-              <w:rPr>
-                <w:rFonts w:ascii="Arial" w:eastAsia="Times New Roman" w:hAnsi="Arial" w:cs="Arial"/>
-                <w:sz w:val="20"/>
-                <w:szCs w:val="20"/>
-                <w:lang w:eastAsia="es-CO"/>
-              </w:rPr>
-            </w:pPr>
-            <w:proofErr w:type="gramStart"/>
-            <w:r>
-              <w:rPr>
-                <w:rFonts w:ascii="Arial" w:eastAsia="Times New Roman" w:hAnsi="Arial" w:cs="Arial"/>
-                <w:sz w:val="20"/>
-                <w:szCs w:val="20"/>
-                <w:lang w:eastAsia="es-CO"/>
-              </w:rPr>
-              <w:t>O</w:t>
-            </w:r>
-            <w:r>
-              <w:rPr>
-                <w:rFonts w:ascii="Arial" w:eastAsia="Times New Roman" w:hAnsi="Arial" w:cs="Arial"/>
-                <w:sz w:val="20"/>
-                <w:szCs w:val="20"/>
-                <w:lang w:eastAsia="es-CO"/>
-              </w:rPr>
-              <w:t>(</w:t>
-            </w:r>
-            <w:proofErr w:type="gramEnd"/>
-            <w:r>
-              <w:rPr>
-                <w:rFonts w:ascii="Arial" w:eastAsia="Times New Roman" w:hAnsi="Arial" w:cs="Arial"/>
-                <w:sz w:val="20"/>
-                <w:szCs w:val="20"/>
-                <w:lang w:eastAsia="es-CO"/>
-              </w:rPr>
-              <w:t>n log n</w:t>
-            </w:r>
-            <w:r>
-              <w:rPr>
-                <w:rFonts w:ascii="Arial" w:eastAsia="Times New Roman" w:hAnsi="Arial" w:cs="Arial"/>
-                <w:sz w:val="20"/>
-                <w:szCs w:val="20"/>
-                <w:lang w:eastAsia="es-CO"/>
-              </w:rPr>
-              <w:t>)</w:t>
-            </w:r>
-            <w:r>
-              <w:rPr>
-                <w:rFonts w:ascii="Arial" w:eastAsia="Times New Roman" w:hAnsi="Arial" w:cs="Arial"/>
-                <w:sz w:val="20"/>
-                <w:szCs w:val="20"/>
-                <w:lang w:eastAsia="es-CO"/>
-              </w:rPr>
-              <w:t xml:space="preserve">, donde n = pedidos filtrados </w:t>
-            </w:r>
-            <w:r>
-              <w:rPr>
-                <w:rFonts w:ascii="Arial" w:eastAsia="Times New Roman" w:hAnsi="Arial" w:cs="Arial"/>
-                <w:sz w:val="20"/>
-                <w:szCs w:val="20"/>
-                <w:lang w:eastAsia="es-CO"/>
-              </w:rPr>
-              <w:t xml:space="preserve">para </w:t>
-            </w:r>
-          </w:p>
-          <w:p>
-            <w:pPr>
-              <w:rPr>
-                <w:lang w:val="en-US"/>
-              </w:rPr>
-            </w:pPr>
-            <w:proofErr w:type="spellStart"/>
-            <w:r>
-              <w:rPr>
-                <w:rFonts w:ascii="Arial" w:eastAsia="Times New Roman" w:hAnsi="Arial" w:cs="Arial"/>
-                <w:sz w:val="20"/>
-                <w:szCs w:val="20"/>
-                <w:lang w:val="en-US" w:eastAsia="es-CO"/>
-              </w:rPr>
-              <w:t>Price_per_Box</w:t>
-            </w:r>
-            <w:proofErr w:type="spellEnd"/>
-            <w:r>
-              <w:rPr>
-                <w:rFonts w:ascii="Arial" w:eastAsia="Times New Roman" w:hAnsi="Arial" w:cs="Arial"/>
-                <w:sz w:val="20"/>
-                <w:szCs w:val="20"/>
-                <w:lang w:val="en-US" w:eastAsia="es-CO"/>
-              </w:rPr>
-              <w:t xml:space="preserve"> y </w:t>
-            </w:r>
-            <w:proofErr w:type="spellStart"/>
-            <w:r>
-              <w:rPr>
-                <w:rFonts w:ascii="Arial" w:eastAsia="Times New Roman" w:hAnsi="Arial" w:cs="Arial"/>
-                <w:sz w:val="20"/>
-                <w:szCs w:val="20"/>
-                <w:lang w:val="en-US" w:eastAsia="es-CO"/>
-              </w:rPr>
-              <w:t>Boxes_Shipped</w:t>
-            </w:r>
-            <w:proofErr w:type="spellEnd"/>
+              <w:t>O(1)</w:t>
+            </w:r>
           </w:p>
         </w:tc>
       </w:tr>
@@ -1219,116 +916,6 @@
             <w:tcW w:w="5070" w:type="dxa"/>
           </w:tcPr>
           <w:p>
-            <w:r>
-              <w:rPr>
-                <w:rFonts w:ascii="Arial" w:eastAsia="Times New Roman" w:hAnsi="Arial" w:cs="Arial"/>
-                <w:sz w:val="20"/>
-                <w:szCs w:val="20"/>
-                <w:lang w:eastAsia="es-CO"/>
-              </w:rPr>
-              <w:t xml:space="preserve">Paso 9: Si hay más de 20, se toman los primeros 10 y los últimos 10 con </w:t>
-            </w:r>
-            <w:proofErr w:type="spellStart"/>
-            <w:r>
-              <w:rPr>
-                <w:rFonts w:ascii="Arial" w:eastAsia="Times New Roman" w:hAnsi="Arial" w:cs="Arial"/>
-                <w:sz w:val="20"/>
-                <w:szCs w:val="20"/>
-                <w:lang w:eastAsia="es-CO"/>
-              </w:rPr>
-              <w:t>sub_list</w:t>
-            </w:r>
-            <w:proofErr w:type="spellEnd"/>
-            <w:r>
-              <w:rPr>
-                <w:rFonts w:ascii="Arial" w:eastAsia="Times New Roman" w:hAnsi="Arial" w:cs="Arial"/>
-                <w:sz w:val="20"/>
-                <w:szCs w:val="20"/>
-                <w:lang w:eastAsia="es-CO"/>
-              </w:rPr>
-              <w:t xml:space="preserve">. </w:t>
-            </w:r>
-          </w:p>
-        </w:tc>
-        <w:tc>
-          <w:tcPr>
-            <w:tcW w:w="4275" w:type="dxa"/>
-          </w:tcPr>
-          <w:p>
-            <w:proofErr w:type="gramStart"/>
-            <w:r>
-              <w:rPr>
-                <w:rFonts w:ascii="Arial" w:eastAsia="Times New Roman" w:hAnsi="Arial" w:cs="Arial"/>
-                <w:sz w:val="20"/>
-                <w:szCs w:val="20"/>
-                <w:lang w:eastAsia="es-CO"/>
-              </w:rPr>
-              <w:t>O(</w:t>
-            </w:r>
-            <w:proofErr w:type="gramEnd"/>
-            <w:r>
-              <w:rPr>
-                <w:rFonts w:ascii="Arial" w:eastAsia="Times New Roman" w:hAnsi="Arial" w:cs="Arial"/>
-                <w:sz w:val="20"/>
-                <w:szCs w:val="20"/>
-                <w:lang w:eastAsia="es-CO"/>
-              </w:rPr>
-              <w:t>1)</w:t>
-            </w:r>
-          </w:p>
-        </w:tc>
-      </w:tr>
-      <w:tr>
-        <w:tc>
-          <w:tcPr>
-            <w:tcW w:w="5070" w:type="dxa"/>
-          </w:tcPr>
-          <w:p>
-            <w:r>
-              <w:rPr>
-                <w:rFonts w:ascii="Arial" w:eastAsia="Times New Roman" w:hAnsi="Arial" w:cs="Arial"/>
-                <w:sz w:val="20"/>
-                <w:szCs w:val="20"/>
-                <w:lang w:eastAsia="es-CO"/>
-              </w:rPr>
-              <w:t>Paso 10: Se detiene el cronómetro y se calcula el tiempo</w:t>
-            </w:r>
-          </w:p>
-        </w:tc>
-        <w:tc>
-          <w:tcPr>
-            <w:tcW w:w="4275" w:type="dxa"/>
-          </w:tcPr>
-          <w:p>
-            <w:proofErr w:type="gramStart"/>
-            <w:r>
-              <w:rPr>
-                <w:rFonts w:ascii="Arial" w:eastAsia="Times New Roman" w:hAnsi="Arial" w:cs="Arial"/>
-                <w:sz w:val="20"/>
-                <w:szCs w:val="20"/>
-                <w:lang w:eastAsia="es-CO"/>
-              </w:rPr>
-              <w:t>O(</w:t>
-            </w:r>
-            <w:proofErr w:type="gramEnd"/>
-            <w:r>
-              <w:rPr>
-                <w:rFonts w:ascii="Arial" w:eastAsia="Times New Roman" w:hAnsi="Arial" w:cs="Arial"/>
-                <w:sz w:val="20"/>
-                <w:szCs w:val="20"/>
-                <w:lang w:eastAsia="es-CO"/>
-              </w:rPr>
-              <w:t>1)</w:t>
-            </w:r>
-          </w:p>
-        </w:tc>
-      </w:tr>
-      <w:tr>
-        <w:tc>
-          <w:tcPr>
-            <w:tcW w:w="5070" w:type="dxa"/>
-          </w:tcPr>
-          <w:p>
             <w:pPr>
               <w:rPr>
                 <w:b/>
@@ -1361,7 +948,6 @@
                 <w:iCs/>
               </w:rPr>
             </w:pPr>
-            <w:proofErr w:type="gramStart"/>
             <w:r>
               <w:rPr>
                 <w:b/>
@@ -1371,7 +957,6 @@
               </w:rPr>
               <w:t>O(</w:t>
             </w:r>
-            <w:proofErr w:type="gramEnd"/>
             <w:r>
               <w:rPr>
                 <w:b/>
@@ -1731,13 +1316,8 @@
           </w:tcPr>
           <w:p>
             <w:r>
-              <w:t>Paso</w:t>
-            </w:r>
-            <w:proofErr w:type="gramStart"/>
-            <w:r>
-              <w:t xml:space="preserve"> ….</w:t>
-            </w:r>
-            <w:proofErr w:type="gramEnd"/>
+              <w:t>Paso ….</w:t>
+            </w:r>
           </w:p>
         </w:tc>
         <w:tc>
@@ -1827,15 +1407,7 @@
     </w:p>
     <w:p>
       <w:r>
-        <w:t xml:space="preserve">Análisis de resultados de la implementación, tener cuenta las pruebas realizadas y el </w:t>
-      </w:r>
-      <w:proofErr w:type="spellStart"/>
-      <w:r>
-        <w:t>analisis</w:t>
-      </w:r>
-      <w:proofErr w:type="spellEnd"/>
-      <w:r>
-        <w:t xml:space="preserve"> de complejidad.</w:t>
+        <w:t>Análisis de resultados de la implementación, tener cuenta las pruebas realizadas y el analisis de complejidad.</w:t>
       </w:r>
     </w:p>
     <w:p>
@@ -1854,17 +1426,12 @@
         <w:lastRenderedPageBreak/>
         <w:t>Requerimiento 3</w:t>
       </w:r>
-    </w:p>
-    <w:p>
       <w:r>
-        <w:rPr>
-          <w:noProof/>
-        </w:rPr>
         <w:drawing>
-          <wp:inline distT="0" distB="0" distL="0" distR="0" wp14:anchorId="32E42CF1" wp14:editId="4B51FDC5">
-            <wp:extent cx="5943600" cy="5572760"/>
-            <wp:effectExtent l="0" t="0" r="0" b="8890"/>
-            <wp:docPr id="1021929889" name="Imagen 1"/>
+          <wp:inline distT="0" distB="0" distL="0" distR="0" wp14:anchorId="3625489B" wp14:editId="4F5F3601">
+            <wp:extent cx="4553184" cy="1987652"/>
+            <wp:effectExtent l="0" t="0" r="0" b="0"/>
+            <wp:docPr id="1459851681" name="Imagen 1"/>
             <wp:cNvGraphicFramePr>
               <a:graphicFrameLocks xmlns:a="http://schemas.openxmlformats.org/drawingml/2006/main" noChangeAspect="1"/>
             </wp:cNvGraphicFramePr>
@@ -1872,7 +1439,7 @@
               <a:graphicData uri="http://schemas.openxmlformats.org/drawingml/2006/picture">
                 <pic:pic xmlns:pic="http://schemas.openxmlformats.org/drawingml/2006/picture">
                   <pic:nvPicPr>
-                    <pic:cNvPr id="1021929889" name=""/>
+                    <pic:cNvPr id="1459851681" name=""/>
                     <pic:cNvPicPr/>
                   </pic:nvPicPr>
                   <pic:blipFill>
@@ -1884,7 +1451,44 @@
                   <pic:spPr>
                     <a:xfrm>
                       <a:off x="0" y="0"/>
-                      <a:ext cx="5943600" cy="5572760"/>
+                      <a:ext cx="4553184" cy="1987652"/>
+                    </a:xfrm>
+                    <a:prstGeom prst="rect">
+                      <a:avLst/>
+                    </a:prstGeom>
+                  </pic:spPr>
+                </pic:pic>
+              </a:graphicData>
+            </a:graphic>
+          </wp:inline>
+        </w:drawing>
+      </w:r>
+      <w:r>
+        <w:drawing>
+          <wp:inline distT="0" distB="0" distL="0" distR="0" wp14:anchorId="68E7C1CA" wp14:editId="786A4354">
+            <wp:extent cx="4559300" cy="5130566"/>
+            <wp:effectExtent l="0" t="0" r="0" b="0"/>
+            <wp:docPr id="103131238" name="Imagen 1"/>
+            <wp:cNvGraphicFramePr>
+              <a:graphicFrameLocks xmlns:a="http://schemas.openxmlformats.org/drawingml/2006/main" noChangeAspect="1"/>
+            </wp:cNvGraphicFramePr>
+            <a:graphic xmlns:a="http://schemas.openxmlformats.org/drawingml/2006/main">
+              <a:graphicData uri="http://schemas.openxmlformats.org/drawingml/2006/picture">
+                <pic:pic xmlns:pic="http://schemas.openxmlformats.org/drawingml/2006/picture">
+                  <pic:nvPicPr>
+                    <pic:cNvPr id="103131238" name=""/>
+                    <pic:cNvPicPr/>
+                  </pic:nvPicPr>
+                  <pic:blipFill>
+                    <a:blip r:embed="rId12"/>
+                    <a:stretch>
+                      <a:fillRect/>
+                    </a:stretch>
+                  </pic:blipFill>
+                  <pic:spPr>
+                    <a:xfrm>
+                      <a:off x="0" y="0"/>
+                      <a:ext cx="4568957" cy="5141433"/>
                     </a:xfrm>
                     <a:prstGeom prst="rect">
                       <a:avLst/>
@@ -1899,15 +1503,12 @@
     </w:p>
     <w:p>
       <w:r>
-        <w:rPr>
-          <w:noProof/>
-        </w:rPr>
         <w:lastRenderedPageBreak/>
         <w:drawing>
-          <wp:inline distT="0" distB="0" distL="0" distR="0" wp14:anchorId="015BF759" wp14:editId="22BBA569">
-            <wp:extent cx="5943600" cy="2989580"/>
-            <wp:effectExtent l="0" t="0" r="0" b="1270"/>
-            <wp:docPr id="60643227" name="Imagen 1"/>
+          <wp:inline distT="0" distB="0" distL="0" distR="0" wp14:anchorId="22FB1E4D" wp14:editId="45DB1C21">
+            <wp:extent cx="5943600" cy="2087880"/>
+            <wp:effectExtent l="0" t="0" r="0" b="7620"/>
+            <wp:docPr id="510307944" name="Imagen 1"/>
             <wp:cNvGraphicFramePr>
               <a:graphicFrameLocks xmlns:a="http://schemas.openxmlformats.org/drawingml/2006/main" noChangeAspect="1"/>
             </wp:cNvGraphicFramePr>
@@ -1915,11 +1516,11 @@
               <a:graphicData uri="http://schemas.openxmlformats.org/drawingml/2006/picture">
                 <pic:pic xmlns:pic="http://schemas.openxmlformats.org/drawingml/2006/picture">
                   <pic:nvPicPr>
-                    <pic:cNvPr id="60643227" name=""/>
+                    <pic:cNvPr id="510307944" name=""/>
                     <pic:cNvPicPr/>
                   </pic:nvPicPr>
                   <pic:blipFill>
-                    <a:blip r:embed="rId12"/>
+                    <a:blip r:embed="rId13"/>
                     <a:stretch>
                       <a:fillRect/>
                     </a:stretch>
@@ -1927,7 +1528,7 @@
                   <pic:spPr>
                     <a:xfrm>
                       <a:off x="0" y="0"/>
-                      <a:ext cx="5943600" cy="2989580"/>
+                      <a:ext cx="5943600" cy="2087880"/>
                     </a:xfrm>
                     <a:prstGeom prst="rect">
                       <a:avLst/>
@@ -1982,17 +1583,7 @@
           <w:sz w:val="22"/>
           <w:szCs w:val="22"/>
         </w:rPr>
-        <w:t xml:space="preserve"> </w:t>
-      </w:r>
-      <w:proofErr w:type="gramStart"/>
-      <w:r>
-        <w:rPr>
-          <w:rFonts w:asciiTheme="minorHAnsi" w:eastAsiaTheme="minorEastAsia" w:hAnsiTheme="minorHAnsi" w:cstheme="minorBidi"/>
-          <w:color w:val="auto"/>
-          <w:sz w:val="22"/>
-          <w:szCs w:val="22"/>
-        </w:rPr>
-        <w:t xml:space="preserve">10 </w:t>
+        <w:t xml:space="preserve"> 10 </w:t>
       </w:r>
       <w:r>
         <w:rPr>
@@ -2001,17 +1592,7 @@
           <w:sz w:val="22"/>
           <w:szCs w:val="22"/>
         </w:rPr>
-        <w:t xml:space="preserve"> y</w:t>
-      </w:r>
-      <w:proofErr w:type="gramEnd"/>
-      <w:r>
-        <w:rPr>
-          <w:rFonts w:asciiTheme="minorHAnsi" w:eastAsiaTheme="minorEastAsia" w:hAnsiTheme="minorHAnsi" w:cstheme="minorBidi"/>
-          <w:color w:val="auto"/>
-          <w:sz w:val="22"/>
-          <w:szCs w:val="22"/>
-        </w:rPr>
-        <w:t xml:space="preserve"> </w:t>
+        <w:t xml:space="preserve"> y </w:t>
       </w:r>
       <w:r>
         <w:rPr>
@@ -2105,44 +1686,8 @@
               <w:rPr>
                 <w:lang w:val="en-US"/>
               </w:rPr>
-              <w:t xml:space="preserve">catalog, </w:t>
-            </w:r>
-            <w:proofErr w:type="spellStart"/>
-            <w:r>
-              <w:rPr>
-                <w:lang w:val="en-US"/>
-              </w:rPr>
-              <w:t>fecha</w:t>
-            </w:r>
-            <w:proofErr w:type="spellEnd"/>
-            <w:r>
-              <w:rPr>
-                <w:lang w:val="en-US"/>
-              </w:rPr>
-              <w:t xml:space="preserve">, </w:t>
-            </w:r>
-            <w:proofErr w:type="spellStart"/>
-            <w:r>
-              <w:rPr>
-                <w:lang w:val="en-US"/>
-              </w:rPr>
-              <w:t>min_amount</w:t>
-            </w:r>
-            <w:proofErr w:type="spellEnd"/>
-            <w:r>
-              <w:rPr>
-                <w:lang w:val="en-US"/>
-              </w:rPr>
-              <w:t xml:space="preserve">, </w:t>
-            </w:r>
-            <w:proofErr w:type="spellStart"/>
-            <w:r>
-              <w:rPr>
-                <w:lang w:val="en-US"/>
-              </w:rPr>
-              <w:t>max_amount</w:t>
-            </w:r>
-            <w:proofErr w:type="spellEnd"/>
+              <w:t>catalog, fecha, min_amount, max_amount</w:t>
+            </w:r>
           </w:p>
         </w:tc>
       </w:tr>
@@ -2304,7 +1849,7 @@
           </w:tcPr>
           <w:p>
             <w:r>
-              <w:t>Recorrer todos los pedidos en el catálogo</w:t>
+              <w:t xml:space="preserve">Acceder a la lista de pedidos por fecha desde el mapa </w:t>
             </w:r>
           </w:p>
         </w:tc>
@@ -2313,8 +1858,20 @@
             <w:tcW w:w="4275" w:type="dxa"/>
           </w:tcPr>
           <w:p>
-            <w:r>
-              <w:t>O(n)</w:t>
+            <w:pPr>
+              <w:rPr>
+                <w:i/>
+                <w:iCs/>
+                <w:u w:val="single"/>
+              </w:rPr>
+            </w:pPr>
+            <w:r>
+              <w:rPr>
+                <w:i/>
+                <w:iCs/>
+                <w:u w:val="single"/>
+              </w:rPr>
+              <w:t>O(1)</w:t>
             </w:r>
           </w:p>
         </w:tc>
@@ -2326,7 +1883,13 @@
           </w:tcPr>
           <w:p>
             <w:r>
-              <w:t>Filtrar por fecha y rango de montos</w:t>
+              <w:t>Filtrar por</w:t>
+            </w:r>
+            <w:r>
+              <w:t xml:space="preserve"> </w:t>
+            </w:r>
+            <w:r>
+              <w:t>rango de montos</w:t>
             </w:r>
           </w:p>
         </w:tc>
@@ -2373,21 +1936,8 @@
               <w:t>Ordenar los pedidos filtrados</w:t>
             </w:r>
             <w:r>
-              <w:t xml:space="preserve"> con </w:t>
-            </w:r>
-            <w:proofErr w:type="spellStart"/>
-            <w:r>
-              <w:t>merge</w:t>
-            </w:r>
-            <w:proofErr w:type="spellEnd"/>
-            <w:r>
-              <w:t xml:space="preserve"> </w:t>
-            </w:r>
-            <w:proofErr w:type="spellStart"/>
-            <w:r>
-              <w:t>sort</w:t>
-            </w:r>
-            <w:proofErr w:type="spellEnd"/>
+              <w:t xml:space="preserve"> con merge sort</w:t>
+            </w:r>
           </w:p>
         </w:tc>
         <w:tc>
@@ -2395,13 +1945,8 @@
             <w:tcW w:w="4275" w:type="dxa"/>
           </w:tcPr>
           <w:p>
-            <w:proofErr w:type="gramStart"/>
-            <w:r>
-              <w:t>O(</w:t>
-            </w:r>
-            <w:proofErr w:type="gramEnd"/>
-            <w:r>
-              <w:t>n log n)</w:t>
+            <w:r>
+              <w:t>O(n log n)</w:t>
             </w:r>
           </w:p>
         </w:tc>
@@ -2412,14 +1957,22 @@
             <w:tcW w:w="5070" w:type="dxa"/>
           </w:tcPr>
           <w:p>
-            <w:pPr>
+            <w:r>
               <w:rPr>
                 <w:b/>
                 <w:bCs/>
                 <w:i/>
                 <w:iCs/>
               </w:rPr>
-            </w:pPr>
+              <w:t>TOTAL</w:t>
+            </w:r>
+          </w:p>
+        </w:tc>
+        <w:tc>
+          <w:tcPr>
+            <w:tcW w:w="4275" w:type="dxa"/>
+          </w:tcPr>
+          <w:p>
             <w:r>
               <w:rPr>
                 <w:b/>
@@ -2427,24 +1980,17 @@
                 <w:i/>
                 <w:iCs/>
               </w:rPr>
-              <w:t>TOTAL</w:t>
-            </w:r>
-          </w:p>
-        </w:tc>
-        <w:tc>
-          <w:tcPr>
-            <w:tcW w:w="4275" w:type="dxa"/>
-          </w:tcPr>
-          <w:p>
-            <w:pPr>
+              <w:t>O(</w:t>
+            </w:r>
+            <w:r>
               <w:rPr>
                 <w:b/>
                 <w:bCs/>
                 <w:i/>
                 <w:iCs/>
               </w:rPr>
-            </w:pPr>
-            <w:proofErr w:type="gramStart"/>
+              <w:t>n log n</w:t>
+            </w:r>
             <w:r>
               <w:rPr>
                 <w:b/>
@@ -2452,27 +1998,40 @@
                 <w:i/>
                 <w:iCs/>
               </w:rPr>
-              <w:t>O(</w:t>
-            </w:r>
-            <w:proofErr w:type="gramEnd"/>
-            <w:r>
+              <w:t>)</w:t>
+            </w:r>
+          </w:p>
+        </w:tc>
+      </w:tr>
+      <w:tr>
+        <w:tc>
+          <w:tcPr>
+            <w:tcW w:w="5070" w:type="dxa"/>
+          </w:tcPr>
+          <w:p>
+            <w:pPr>
               <w:rPr>
                 <w:b/>
                 <w:bCs/>
                 <w:i/>
                 <w:iCs/>
               </w:rPr>
-              <w:t>n log n</w:t>
-            </w:r>
-            <w:r>
+            </w:pPr>
+          </w:p>
+        </w:tc>
+        <w:tc>
+          <w:tcPr>
+            <w:tcW w:w="4275" w:type="dxa"/>
+          </w:tcPr>
+          <w:p>
+            <w:pPr>
               <w:rPr>
                 <w:b/>
                 <w:bCs/>
                 <w:i/>
                 <w:iCs/>
               </w:rPr>
-              <w:t>)</w:t>
-            </w:r>
+            </w:pPr>
           </w:p>
         </w:tc>
       </w:tr>
@@ -2500,24 +2059,19 @@
         <w:t>Análisis</w:t>
       </w:r>
     </w:p>
+    <w:p/>
     <w:p>
       <w:r>
-        <w:t xml:space="preserve">Considero que el algoritmo </w:t>
+        <w:t xml:space="preserve">Al usar un mapa de hash que definimos desde la carga de datos nos ayuda a reducir la complejidad, ya que aunque en el peor de los casos igualmente se filtran todos los pedidos seria un caso muy raro ya que en la mayoría de los casos los pedidos </w:t>
       </w:r>
       <w:r>
-        <w:t>está</w:t>
+        <w:t xml:space="preserve">no tienen la misma fecha, lo que permite que el mapa de hash si le quite complejidad al algoritmo, el resto de </w:t>
       </w:r>
       <w:r>
-        <w:t xml:space="preserve"> bien implementado, manteniendo una complejidad normal, diría que hasta ideal teniendo en cu</w:t>
+        <w:t xml:space="preserve">el algoritmo si mantiene complejidad lineal y el merge sort </w:t>
       </w:r>
       <w:r>
-        <w:t>en</w:t>
-      </w:r>
-      <w:r>
-        <w:t xml:space="preserve">ta que al tener </w:t>
-      </w:r>
-      <w:r>
-        <w:t>que realizar un ordenamiento mantiene la complejidad en n log n lo cual es lo mínimo de complejidad de lo que vimos para algoritmos que estén desordenados aleatoriamente</w:t>
+        <w:t>usa una complejidad de n log n en todos los casos, lo que hace que la complejidad final sea de n log n</w:t>
       </w:r>
     </w:p>
     <w:p>
@@ -2594,30 +2148,8 @@
               <w:rPr>
                 <w:lang w:val="en-US"/>
               </w:rPr>
-              <w:t xml:space="preserve"> </w:t>
-            </w:r>
-            <w:proofErr w:type="spellStart"/>
-            <w:r>
-              <w:rPr>
-                <w:lang w:val="en-US"/>
-              </w:rPr>
-              <w:t>producto</w:t>
-            </w:r>
-            <w:proofErr w:type="spellEnd"/>
-            <w:r>
-              <w:rPr>
-                <w:lang w:val="en-US"/>
-              </w:rPr>
-              <w:t xml:space="preserve">, </w:t>
-            </w:r>
-            <w:proofErr w:type="spellStart"/>
-            <w:r>
-              <w:rPr>
-                <w:lang w:val="en-US"/>
-              </w:rPr>
-              <w:t>pais</w:t>
-            </w:r>
-            <w:proofErr w:type="spellEnd"/>
+              <w:t xml:space="preserve"> producto, pais</w:t>
+            </w:r>
           </w:p>
         </w:tc>
       </w:tr>
@@ -2651,52 +2183,15 @@
               <w:t>Número total de pedidos que cumplen el filtro, p</w:t>
             </w:r>
             <w:r>
-              <w:t xml:space="preserve">romedio de </w:t>
-            </w:r>
-            <w:proofErr w:type="spellStart"/>
-            <w:r>
-              <w:t>Price_per_Box</w:t>
-            </w:r>
-            <w:proofErr w:type="spellEnd"/>
-            <w:r>
-              <w:t xml:space="preserve">, </w:t>
-            </w:r>
-            <w:proofErr w:type="spellStart"/>
-            <w:r>
-              <w:t>Discount_Pct</w:t>
-            </w:r>
-            <w:proofErr w:type="spellEnd"/>
-            <w:r>
-              <w:t xml:space="preserve">, </w:t>
-            </w:r>
-            <w:proofErr w:type="spellStart"/>
-            <w:r>
-              <w:t>Marketing_Spend</w:t>
-            </w:r>
-            <w:proofErr w:type="spellEnd"/>
-            <w:r>
-              <w:t xml:space="preserve"> y </w:t>
-            </w:r>
-            <w:proofErr w:type="spellStart"/>
-            <w:r>
-              <w:t>Boxes_Shipped</w:t>
-            </w:r>
-            <w:proofErr w:type="spellEnd"/>
+              <w:t>romedio de Price_per_Box, Discount_Pct, Marketing_Spend y Boxes_Shipped</w:t>
+            </w:r>
             <w:r>
               <w:t>,</w:t>
             </w:r>
           </w:p>
           <w:p>
             <w:r>
-              <w:t xml:space="preserve">los dos pedidos de mayor </w:t>
-            </w:r>
-            <w:proofErr w:type="spellStart"/>
-            <w:r>
-              <w:t>Amount</w:t>
-            </w:r>
-            <w:proofErr w:type="spellEnd"/>
-            <w:r>
-              <w:t>, tiempo de ejecución del algoritmo</w:t>
+              <w:t>los dos pedidos de mayor Amount, tiempo de ejecución del algoritmo</w:t>
             </w:r>
           </w:p>
         </w:tc>
@@ -2861,13 +2356,8 @@
             <w:r>
               <w:t xml:space="preserve"> - </w:t>
             </w:r>
-            <w:proofErr w:type="spellStart"/>
-            <w:r>
-              <w:t>pais</w:t>
-            </w:r>
-            <w:proofErr w:type="spellEnd"/>
-            <w:r>
-              <w:t>" concatenando dos textos</w:t>
+            <w:r>
+              <w:t>pais" concatenando dos textos</w:t>
             </w:r>
           </w:p>
         </w:tc>
@@ -2884,13 +2374,8 @@
                 <w:lang w:eastAsia="es-CO"/>
               </w:rPr>
             </w:pPr>
-            <w:proofErr w:type="gramStart"/>
-            <w:r>
-              <w:t>O(</w:t>
-            </w:r>
-            <w:proofErr w:type="gramEnd"/>
-            <w:r>
-              <w:t>1)</w:t>
+            <w:r>
+              <w:t>O(1)</w:t>
             </w:r>
           </w:p>
         </w:tc>
@@ -2916,15 +2401,7 @@
               </w:rPr>
             </w:pPr>
             <w:r>
-              <w:t xml:space="preserve">Paso 2: Se busca la llave en la tabla de hash de Linear </w:t>
-            </w:r>
-            <w:proofErr w:type="spellStart"/>
-            <w:r>
-              <w:t>Probing</w:t>
-            </w:r>
-            <w:proofErr w:type="spellEnd"/>
-            <w:r>
-              <w:t xml:space="preserve"> y se obtiene la lista de pedidos de esa combinación</w:t>
+              <w:t>Paso 2: Se busca la llave en la tabla de hash de Linear Probing y se obtiene la lista de pedidos de esa combinación</w:t>
             </w:r>
           </w:p>
         </w:tc>
@@ -2941,13 +2418,8 @@
                 <w:lang w:eastAsia="es-CO"/>
               </w:rPr>
             </w:pPr>
-            <w:proofErr w:type="gramStart"/>
-            <w:r>
-              <w:t>O(</w:t>
-            </w:r>
-            <w:proofErr w:type="gramEnd"/>
-            <w:r>
-              <w:t>1) promedio</w:t>
+            <w:r>
+              <w:t>O(1) promedio</w:t>
             </w:r>
           </w:p>
         </w:tc>
@@ -2990,13 +2462,8 @@
                 <w:lang w:eastAsia="es-CO"/>
               </w:rPr>
             </w:pPr>
-            <w:proofErr w:type="gramStart"/>
-            <w:r>
-              <w:t>O(</w:t>
-            </w:r>
-            <w:proofErr w:type="gramEnd"/>
-            <w:r>
-              <w:t>1)</w:t>
+            <w:r>
+              <w:t>O(1)</w:t>
             </w:r>
           </w:p>
         </w:tc>
@@ -3028,86 +2495,8 @@
               <w:rPr>
                 <w:lang w:val="en-US"/>
               </w:rPr>
-              <w:t xml:space="preserve">Por </w:t>
-            </w:r>
-            <w:proofErr w:type="spellStart"/>
-            <w:r>
-              <w:rPr>
-                <w:lang w:val="en-US"/>
-              </w:rPr>
-              <w:t>cada</w:t>
-            </w:r>
-            <w:proofErr w:type="spellEnd"/>
-            <w:r>
-              <w:rPr>
-                <w:lang w:val="en-US"/>
-              </w:rPr>
-              <w:t xml:space="preserve"> uno se suman, </w:t>
-            </w:r>
-            <w:proofErr w:type="spellStart"/>
-            <w:r>
-              <w:rPr>
-                <w:lang w:val="en-US"/>
-              </w:rPr>
-              <w:t>si</w:t>
-            </w:r>
-            <w:proofErr w:type="spellEnd"/>
-            <w:r>
-              <w:rPr>
-                <w:lang w:val="en-US"/>
-              </w:rPr>
-              <w:t xml:space="preserve"> no son None, </w:t>
-            </w:r>
-            <w:proofErr w:type="spellStart"/>
-            <w:r>
-              <w:rPr>
-                <w:lang w:val="en-US"/>
-              </w:rPr>
-              <w:t>Price_per_Box</w:t>
-            </w:r>
-            <w:proofErr w:type="spellEnd"/>
-            <w:r>
-              <w:rPr>
-                <w:lang w:val="en-US"/>
-              </w:rPr>
-              <w:t xml:space="preserve">, </w:t>
-            </w:r>
-            <w:proofErr w:type="spellStart"/>
-            <w:r>
-              <w:rPr>
-                <w:lang w:val="en-US"/>
-              </w:rPr>
-              <w:t>Discount_Pct</w:t>
-            </w:r>
-            <w:proofErr w:type="spellEnd"/>
-            <w:r>
-              <w:rPr>
-                <w:lang w:val="en-US"/>
-              </w:rPr>
-              <w:t xml:space="preserve">, </w:t>
-            </w:r>
-            <w:proofErr w:type="spellStart"/>
-            <w:r>
-              <w:rPr>
-                <w:lang w:val="en-US"/>
-              </w:rPr>
-              <w:t>Marketing_Spend</w:t>
-            </w:r>
-            <w:proofErr w:type="spellEnd"/>
-            <w:r>
-              <w:rPr>
-                <w:lang w:val="en-US"/>
-              </w:rPr>
-              <w:t xml:space="preserve"> y </w:t>
-            </w:r>
-            <w:proofErr w:type="spellStart"/>
-            <w:r>
-              <w:rPr>
-                <w:lang w:val="en-US"/>
-              </w:rPr>
-              <w:t>Boxes_Shipped</w:t>
-            </w:r>
-            <w:proofErr w:type="spellEnd"/>
+              <w:t>Por cada uno se suman, si no son None, Price_per_Box, Discount_Pct, Marketing_Spend y Boxes_Shipped</w:t>
+            </w:r>
           </w:p>
         </w:tc>
         <w:tc>
@@ -3167,13 +2556,8 @@
                 <w:lang w:eastAsia="es-CO"/>
               </w:rPr>
             </w:pPr>
-            <w:proofErr w:type="gramStart"/>
-            <w:r>
-              <w:t>O(</w:t>
-            </w:r>
-            <w:proofErr w:type="gramEnd"/>
-            <w:r>
-              <w:t>1)</w:t>
+            <w:r>
+              <w:t>O(1)</w:t>
             </w:r>
           </w:p>
         </w:tc>
@@ -3199,67 +2583,25 @@
               </w:rPr>
             </w:pPr>
             <w:r>
-              <w:t xml:space="preserve">Paso 6: Se ordenan los p pedidos con </w:t>
-            </w:r>
-            <w:proofErr w:type="spellStart"/>
-            <w:r>
-              <w:t>Merge</w:t>
-            </w:r>
-            <w:proofErr w:type="spellEnd"/>
-            <w:r>
-              <w:t xml:space="preserve"> </w:t>
-            </w:r>
-            <w:proofErr w:type="spellStart"/>
-            <w:proofErr w:type="gramStart"/>
-            <w:r>
-              <w:t>Sort</w:t>
-            </w:r>
-            <w:proofErr w:type="spellEnd"/>
-            <w:r>
-              <w:t xml:space="preserve"> </w:t>
-            </w:r>
-            <w:r>
-              <w:t xml:space="preserve"> en</w:t>
-            </w:r>
-            <w:proofErr w:type="gramEnd"/>
-            <w:r>
-              <w:t xml:space="preserve"> orden </w:t>
-            </w:r>
-            <w:proofErr w:type="spellStart"/>
-            <w:r>
-              <w:t>Amount</w:t>
-            </w:r>
-            <w:proofErr w:type="spellEnd"/>
-            <w:r>
-              <w:t xml:space="preserve"> descendente, </w:t>
+              <w:t xml:space="preserve">Paso 6: Se ordenan los p pedidos con Merge Sort </w:t>
+            </w:r>
+            <w:r>
+              <w:t xml:space="preserve"> en orden </w:t>
+            </w:r>
+            <w:r>
+              <w:t xml:space="preserve">Amount descendente, </w:t>
             </w:r>
             <w:r>
               <w:t xml:space="preserve">si es igual, </w:t>
             </w:r>
             <w:r>
-              <w:t xml:space="preserve">luego </w:t>
-            </w:r>
-            <w:proofErr w:type="spellStart"/>
-            <w:r>
-              <w:t>Marketing_Spend</w:t>
-            </w:r>
-            <w:proofErr w:type="spellEnd"/>
-            <w:r>
-              <w:t xml:space="preserve"> ascendente, </w:t>
+              <w:t xml:space="preserve">luego Marketing_Spend ascendente, </w:t>
             </w:r>
             <w:r>
               <w:t xml:space="preserve">si es igual, </w:t>
             </w:r>
             <w:r>
-              <w:t xml:space="preserve">luego </w:t>
-            </w:r>
-            <w:proofErr w:type="spellStart"/>
-            <w:r>
-              <w:t>Order_ID</w:t>
-            </w:r>
-            <w:proofErr w:type="spellEnd"/>
-            <w:r>
-              <w:t xml:space="preserve"> ascendente)</w:t>
+              <w:t>luego Order_ID ascendente)</w:t>
             </w:r>
           </w:p>
         </w:tc>
@@ -3276,13 +2618,8 @@
                 <w:lang w:eastAsia="es-CO"/>
               </w:rPr>
             </w:pPr>
-            <w:proofErr w:type="gramStart"/>
-            <w:r>
-              <w:t>O(</w:t>
-            </w:r>
-            <w:proofErr w:type="gramEnd"/>
-            <w:r>
-              <w:t>p log p)</w:t>
+            <w:r>
+              <w:t>O(p log p)</w:t>
             </w:r>
           </w:p>
         </w:tc>
@@ -3308,13 +2645,8 @@
               </w:rPr>
             </w:pPr>
             <w:r>
-              <w:t xml:space="preserve">Paso 7: Se toman los dos primeros con </w:t>
-            </w:r>
-            <w:proofErr w:type="spellStart"/>
-            <w:r>
-              <w:t>sub_list</w:t>
-            </w:r>
-            <w:proofErr w:type="spellEnd"/>
+              <w:t>Paso 7: Se toman los dos primeros con sub_list</w:t>
+            </w:r>
           </w:p>
         </w:tc>
         <w:tc>
@@ -3330,13 +2662,8 @@
                 <w:lang w:eastAsia="es-CO"/>
               </w:rPr>
             </w:pPr>
-            <w:proofErr w:type="gramStart"/>
-            <w:r>
-              <w:t>O(</w:t>
-            </w:r>
-            <w:proofErr w:type="gramEnd"/>
-            <w:r>
-              <w:t>1)</w:t>
+            <w:r>
+              <w:t>O(1)</w:t>
             </w:r>
           </w:p>
         </w:tc>
@@ -3379,13 +2706,8 @@
                 <w:lang w:eastAsia="es-CO"/>
               </w:rPr>
             </w:pPr>
-            <w:proofErr w:type="gramStart"/>
-            <w:r>
-              <w:t>O(</w:t>
-            </w:r>
-            <w:proofErr w:type="gramEnd"/>
-            <w:r>
-              <w:t>1)</w:t>
+            <w:r>
+              <w:t>O(1)</w:t>
             </w:r>
           </w:p>
         </w:tc>
@@ -3428,13 +2750,8 @@
                 <w:lang w:eastAsia="es-CO"/>
               </w:rPr>
             </w:pPr>
-            <w:proofErr w:type="gramStart"/>
-            <w:r>
-              <w:t>O(</w:t>
-            </w:r>
-            <w:proofErr w:type="gramEnd"/>
-            <w:r>
-              <w:t>1)</w:t>
+            <w:r>
+              <w:t>O(1)</w:t>
             </w:r>
           </w:p>
         </w:tc>
@@ -3486,21 +2803,12 @@
                 <w:lang w:eastAsia="es-CO"/>
               </w:rPr>
             </w:pPr>
-            <w:proofErr w:type="gramStart"/>
-            <w:r>
-              <w:rPr>
-                <w:b/>
-                <w:bCs/>
-              </w:rPr>
-              <w:t>O(</w:t>
-            </w:r>
-            <w:proofErr w:type="gramEnd"/>
-            <w:r>
-              <w:rPr>
-                <w:b/>
-                <w:bCs/>
-              </w:rPr>
-              <w:t>p log p)</w:t>
+            <w:r>
+              <w:rPr>
+                <w:b/>
+                <w:bCs/>
+              </w:rPr>
+              <w:t>O(p log p)</w:t>
             </w:r>
           </w:p>
         </w:tc>
@@ -3531,15 +2839,7 @@
     </w:p>
     <w:p>
       <w:r>
-        <w:t xml:space="preserve">Análisis de resultados de la implementación, tener cuenta las pruebas realizadas y el </w:t>
-      </w:r>
-      <w:proofErr w:type="spellStart"/>
-      <w:r>
-        <w:t>analisis</w:t>
-      </w:r>
-      <w:proofErr w:type="spellEnd"/>
-      <w:r>
-        <w:t xml:space="preserve"> de complejidad.</w:t>
+        <w:t>Análisis de resultados de la implementación, tener cuenta las pruebas realizadas y el analisis de complejidad.</w:t>
       </w:r>
     </w:p>
     <w:p>
@@ -3818,13 +3118,8 @@
           </w:tcPr>
           <w:p>
             <w:r>
-              <w:t>Paso</w:t>
-            </w:r>
-            <w:proofErr w:type="gramStart"/>
-            <w:r>
-              <w:t xml:space="preserve"> ….</w:t>
-            </w:r>
-            <w:proofErr w:type="gramEnd"/>
+              <w:t>Paso ….</w:t>
+            </w:r>
           </w:p>
         </w:tc>
         <w:tc>
@@ -3914,15 +3209,7 @@
     </w:p>
     <w:p>
       <w:r>
-        <w:t xml:space="preserve">Análisis de resultados de la implementación, tener cuenta las pruebas realizadas y el </w:t>
-      </w:r>
-      <w:proofErr w:type="spellStart"/>
-      <w:r>
-        <w:t>analisis</w:t>
-      </w:r>
-      <w:proofErr w:type="spellEnd"/>
-      <w:r>
-        <w:t xml:space="preserve"> de complejidad.</w:t>
+        <w:t>Análisis de resultados de la implementación, tener cuenta las pruebas realizadas y el analisis de complejidad.</w:t>
       </w:r>
     </w:p>
     <w:p>
@@ -3944,14 +3231,11 @@
     </w:p>
     <w:p>
       <w:r>
-        <w:rPr>
-          <w:noProof/>
-        </w:rPr>
         <w:drawing>
-          <wp:inline distT="0" distB="0" distL="0" distR="0" wp14:anchorId="6EF84D38" wp14:editId="06AD751B">
-            <wp:extent cx="5943600" cy="4467860"/>
-            <wp:effectExtent l="0" t="0" r="0" b="8890"/>
-            <wp:docPr id="2147089180" name="Imagen 1"/>
+          <wp:inline distT="0" distB="0" distL="0" distR="0" wp14:anchorId="328C8C51" wp14:editId="54EFBE97">
+            <wp:extent cx="5258070" cy="7258423"/>
+            <wp:effectExtent l="0" t="0" r="0" b="0"/>
+            <wp:docPr id="1711934450" name="Imagen 1"/>
             <wp:cNvGraphicFramePr>
               <a:graphicFrameLocks xmlns:a="http://schemas.openxmlformats.org/drawingml/2006/main" noChangeAspect="1"/>
             </wp:cNvGraphicFramePr>
@@ -3959,11 +3243,11 @@
               <a:graphicData uri="http://schemas.openxmlformats.org/drawingml/2006/picture">
                 <pic:pic xmlns:pic="http://schemas.openxmlformats.org/drawingml/2006/picture">
                   <pic:nvPicPr>
-                    <pic:cNvPr id="2147089180" name=""/>
+                    <pic:cNvPr id="1711934450" name=""/>
                     <pic:cNvPicPr/>
                   </pic:nvPicPr>
                   <pic:blipFill>
-                    <a:blip r:embed="rId13"/>
+                    <a:blip r:embed="rId14"/>
                     <a:stretch>
                       <a:fillRect/>
                     </a:stretch>
@@ -3971,7 +3255,7 @@
                   <pic:spPr>
                     <a:xfrm>
                       <a:off x="0" y="0"/>
-                      <a:ext cx="5943600" cy="4467860"/>
+                      <a:ext cx="5258070" cy="7258423"/>
                     </a:xfrm>
                     <a:prstGeom prst="rect">
                       <a:avLst/>
@@ -3986,15 +3270,12 @@
     </w:p>
     <w:p>
       <w:r>
-        <w:rPr>
-          <w:noProof/>
-        </w:rPr>
         <w:lastRenderedPageBreak/>
         <w:drawing>
-          <wp:inline distT="0" distB="0" distL="0" distR="0" wp14:anchorId="7DEC7738" wp14:editId="4F9BC1BE">
-            <wp:extent cx="5943600" cy="6049010"/>
-            <wp:effectExtent l="0" t="0" r="0" b="8890"/>
-            <wp:docPr id="1104194702" name="Imagen 1"/>
+          <wp:inline distT="0" distB="0" distL="0" distR="0" wp14:anchorId="6883EC4B" wp14:editId="280CF5B4">
+            <wp:extent cx="5893103" cy="6058211"/>
+            <wp:effectExtent l="0" t="0" r="0" b="0"/>
+            <wp:docPr id="1430169598" name="Imagen 1"/>
             <wp:cNvGraphicFramePr>
               <a:graphicFrameLocks xmlns:a="http://schemas.openxmlformats.org/drawingml/2006/main" noChangeAspect="1"/>
             </wp:cNvGraphicFramePr>
@@ -4002,11 +3283,11 @@
               <a:graphicData uri="http://schemas.openxmlformats.org/drawingml/2006/picture">
                 <pic:pic xmlns:pic="http://schemas.openxmlformats.org/drawingml/2006/picture">
                   <pic:nvPicPr>
-                    <pic:cNvPr id="1104194702" name=""/>
+                    <pic:cNvPr id="1430169598" name=""/>
                     <pic:cNvPicPr/>
                   </pic:nvPicPr>
                   <pic:blipFill>
-                    <a:blip r:embed="rId14"/>
+                    <a:blip r:embed="rId15"/>
                     <a:stretch>
                       <a:fillRect/>
                     </a:stretch>
@@ -4014,7 +3295,7 @@
                   <pic:spPr>
                     <a:xfrm>
                       <a:off x="0" y="0"/>
-                      <a:ext cx="5943600" cy="6049010"/>
+                      <a:ext cx="5893103" cy="6058211"/>
                     </a:xfrm>
                     <a:prstGeom prst="rect">
                       <a:avLst/>
@@ -4029,14 +3310,11 @@
     </w:p>
     <w:p>
       <w:r>
-        <w:rPr>
-          <w:noProof/>
-        </w:rPr>
         <w:drawing>
-          <wp:inline distT="0" distB="0" distL="0" distR="0" wp14:anchorId="366E6A10" wp14:editId="44E7B73D">
-            <wp:extent cx="4997707" cy="1663786"/>
+          <wp:inline distT="0" distB="0" distL="0" distR="0" wp14:anchorId="43FE61B3" wp14:editId="10F6D81D">
+            <wp:extent cx="5150115" cy="1854295"/>
             <wp:effectExtent l="0" t="0" r="0" b="0"/>
-            <wp:docPr id="156958340" name="Imagen 1"/>
+            <wp:docPr id="2069308592" name="Imagen 1"/>
             <wp:cNvGraphicFramePr>
               <a:graphicFrameLocks xmlns:a="http://schemas.openxmlformats.org/drawingml/2006/main" noChangeAspect="1"/>
             </wp:cNvGraphicFramePr>
@@ -4044,11 +3322,11 @@
               <a:graphicData uri="http://schemas.openxmlformats.org/drawingml/2006/picture">
                 <pic:pic xmlns:pic="http://schemas.openxmlformats.org/drawingml/2006/picture">
                   <pic:nvPicPr>
-                    <pic:cNvPr id="156958340" name=""/>
+                    <pic:cNvPr id="2069308592" name=""/>
                     <pic:cNvPicPr/>
                   </pic:nvPicPr>
                   <pic:blipFill>
-                    <a:blip r:embed="rId15"/>
+                    <a:blip r:embed="rId16"/>
                     <a:stretch>
                       <a:fillRect/>
                     </a:stretch>
@@ -4056,7 +3334,7 @@
                   <pic:spPr>
                     <a:xfrm>
                       <a:off x="0" y="0"/>
-                      <a:ext cx="4997707" cy="1663786"/>
+                      <a:ext cx="5150115" cy="1854295"/>
                     </a:xfrm>
                     <a:prstGeom prst="rect">
                       <a:avLst/>
@@ -4357,7 +3635,7 @@
           </w:tcPr>
           <w:p>
             <w:r>
-              <w:t>Recorrer todos los pedidos en el catálogo</w:t>
+              <w:t>Usar el mapa por productos para filtrar</w:t>
             </w:r>
           </w:p>
         </w:tc>
@@ -4367,7 +3645,13 @@
           </w:tcPr>
           <w:p>
             <w:r>
-              <w:t>O(n)</w:t>
+              <w:t>O(</w:t>
+            </w:r>
+            <w:r>
+              <w:t>1</w:t>
+            </w:r>
+            <w:r>
+              <w:t>)</w:t>
             </w:r>
           </w:p>
         </w:tc>
@@ -4379,7 +3663,13 @@
           </w:tcPr>
           <w:p>
             <w:r>
-              <w:t>Filtrar por producto y rango de fechas</w:t>
+              <w:t>Filtrar por</w:t>
+            </w:r>
+            <w:r>
+              <w:t xml:space="preserve"> </w:t>
+            </w:r>
+            <w:r>
+              <w:t>rango de fechas</w:t>
             </w:r>
           </w:p>
         </w:tc>
@@ -4435,13 +3725,8 @@
             <w:tcW w:w="4275" w:type="dxa"/>
           </w:tcPr>
           <w:p>
-            <w:proofErr w:type="gramStart"/>
-            <w:r>
-              <w:t>O(</w:t>
-            </w:r>
-            <w:proofErr w:type="gramEnd"/>
-            <w:r>
-              <w:t>m log m), donde m = número de paíse</w:t>
+            <w:r>
+              <w:t>O(m log m), donde m = número de paíse</w:t>
             </w:r>
             <w:r>
               <w:t>s</w:t>
@@ -4487,7 +3772,6 @@
                 <w:iCs/>
               </w:rPr>
             </w:pPr>
-            <w:proofErr w:type="gramStart"/>
             <w:r>
               <w:rPr>
                 <w:b/>
@@ -4495,17 +3779,7 @@
                 <w:i/>
                 <w:iCs/>
               </w:rPr>
-              <w:t>O(</w:t>
-            </w:r>
-            <w:proofErr w:type="gramEnd"/>
-            <w:r>
-              <w:rPr>
-                <w:b/>
-                <w:bCs/>
-                <w:i/>
-                <w:iCs/>
-              </w:rPr>
-              <w:t>n + m log m)</w:t>
+              <w:t>O(n + m log m)</w:t>
             </w:r>
           </w:p>
         </w:tc>
@@ -4536,20 +3810,23 @@
     </w:p>
     <w:p>
       <w:r>
-        <w:t>El algoritmo funciona con una complejidad bastante optima</w:t>
+        <w:t xml:space="preserve">En el algoritmo usamos separate chaining para organizar los </w:t>
       </w:r>
       <w:r>
-        <w:t xml:space="preserve">, manteniendo una complejidad de </w:t>
+        <w:t xml:space="preserve">pedidos por productos, lo que nos ayuda a mantener el filtro de por productos en una complejidad O(1), lo que ya reduce en buena parte la complejidad, el otro filtro se mantiene en O(N) y </w:t>
       </w:r>
       <w:r>
-        <w:t>O(N) en la parte de filtrado de productos y una complejidad de m log m en la parte del número de países que nos piden</w:t>
+        <w:t xml:space="preserve">al final el organizar por países la complejidad pasa a ser la de el algoritmo de ordenamiento, </w:t>
+      </w:r>
+      <w:r>
+        <w:t>lo tomamos como un numero diferente porque consideramos muy raro que para cada producto que se encuentre sea de un país diferente, por eso la complejidad final seria O(N+ M LOG M)</w:t>
       </w:r>
     </w:p>
     <w:sectPr>
-      <w:headerReference w:type="default" r:id="rId16"/>
-      <w:footerReference w:type="default" r:id="rId17"/>
-      <w:headerReference w:type="first" r:id="rId18"/>
-      <w:footerReference w:type="first" r:id="rId19"/>
+      <w:headerReference w:type="default" r:id="rId17"/>
+      <w:footerReference w:type="default" r:id="rId18"/>
+      <w:headerReference w:type="first" r:id="rId19"/>
+      <w:footerReference w:type="first" r:id="rId20"/>
       <w:pgSz w:w="12240" w:h="15840"/>
       <w:pgMar w:top="1440" w:right="1440" w:bottom="1440" w:left="1440" w:header="720" w:footer="720" w:gutter="0"/>
       <w:cols w:space="720"/>
@@ -4561,7 +3838,7 @@
 </file>
 
 <file path=word/endnotes.xml><?xml version="1.0" encoding="utf-8"?>
-<w:endnotes xmlns:wpc="http://schemas.microsoft.com/office/word/2010/wordprocessingCanvas" xmlns:cx="http://schemas.microsoft.com/office/drawing/2014/chartex" xmlns:cx1="http://schemas.microsoft.com/office/drawing/2015/9/8/chartex" xmlns:cx2="http://schemas.microsoft.com/office/drawing/2015/10/21/chartex" xmlns:cx3="http://schemas.microsoft.com/office/drawing/2016/5/9/chartex" xmlns:cx4="http://schemas.microsoft.com/office/drawing/2016/5/10/chartex" xmlns:cx5="http://schemas.microsoft.com/office/drawing/2016/5/11/chartex" xmlns:cx6="http://schemas.microsoft.com/office/drawing/2016/5/12/chartex" xmlns:cx7="http://schemas.microsoft.com/office/drawing/2016/5/13/chartex" xmlns:cx8="http://schemas.microsoft.com/office/drawing/2016/5/14/chartex" xmlns:mc="http://schemas.openxmlformats.org/markup-compatibility/2006" xmlns:aink="http://schemas.microsoft.com/office/drawing/2016/ink" xmlns:am3d="http://schemas.microsoft.com/office/drawing/2017/model3d" xmlns:o="urn:schemas-microsoft-com:office:office" xmlns:r="http://schemas.openxmlformats.org/officeDocument/2006/relationships" xmlns:m="http://schemas.openxmlformats.org/officeDocument/2006/math" xmlns:v="urn:schemas-microsoft-com:vml" xmlns:wp14="http://schemas.microsoft.com/office/word/2010/wordprocessingDrawing" xmlns:wp="http://schemas.openxmlformats.org/drawingml/2006/wordprocessingDrawing" xmlns:w10="urn:schemas-microsoft-com:office:word" xmlns:w="http://schemas.openxmlformats.org/wordprocessingml/2006/main" xmlns:w14="http://schemas.microsoft.com/office/word/2010/wordml" xmlns:w15="http://schemas.microsoft.com/office/word/2012/wordml" xmlns:w16cex="http://schemas.microsoft.com/office/word/2018/wordml/cex" xmlns:w16cid="http://schemas.microsoft.com/office/word/2016/wordml/cid" xmlns:w16="http://schemas.microsoft.com/office/word/2018/wordml" xmlns:w16sdtdh="http://schemas.microsoft.com/office/word/2020/wordml/sdtdatahash" xmlns:w16se="http://schemas.microsoft.com/office/word/2015/wordml/symex" xmlns:wpg="http://schemas.microsoft.com/office/word/2010/wordprocessingGroup" xmlns:wpi="http://schemas.microsoft.com/office/word/2010/wordprocessingInk" xmlns:wne="http://schemas.microsoft.com/office/word/2006/wordml" xmlns:wps="http://schemas.microsoft.com/office/word/2010/wordprocessingShape" mc:Ignorable="w14 w15 w16se w16cid w16 w16cex w16sdtdh wp14">
+<w:endnotes xmlns:wpc="http://schemas.microsoft.com/office/word/2010/wordprocessingCanvas" xmlns:cx="http://schemas.microsoft.com/office/drawing/2014/chartex" xmlns:cx1="http://schemas.microsoft.com/office/drawing/2015/9/8/chartex" xmlns:cx2="http://schemas.microsoft.com/office/drawing/2015/10/21/chartex" xmlns:cx3="http://schemas.microsoft.com/office/drawing/2016/5/9/chartex" xmlns:cx4="http://schemas.microsoft.com/office/drawing/2016/5/10/chartex" xmlns:cx5="http://schemas.microsoft.com/office/drawing/2016/5/11/chartex" xmlns:cx6="http://schemas.microsoft.com/office/drawing/2016/5/12/chartex" xmlns:cx7="http://schemas.microsoft.com/office/drawing/2016/5/13/chartex" xmlns:cx8="http://schemas.microsoft.com/office/drawing/2016/5/14/chartex" xmlns:mc="http://schemas.openxmlformats.org/markup-compatibility/2006" xmlns:aink="http://schemas.microsoft.com/office/drawing/2016/ink" xmlns:am3d="http://schemas.microsoft.com/office/drawing/2017/model3d" xmlns:o="urn:schemas-microsoft-com:office:office" xmlns:oel="http://schemas.microsoft.com/office/2019/extlst" xmlns:r="http://schemas.openxmlformats.org/officeDocument/2006/relationships" xmlns:m="http://schemas.openxmlformats.org/officeDocument/2006/math" xmlns:v="urn:schemas-microsoft-com:vml" xmlns:wp14="http://schemas.microsoft.com/office/word/2010/wordprocessingDrawing" xmlns:wp="http://schemas.openxmlformats.org/drawingml/2006/wordprocessingDrawing" xmlns:w10="urn:schemas-microsoft-com:office:word" xmlns:w="http://schemas.openxmlformats.org/wordprocessingml/2006/main" xmlns:w14="http://schemas.microsoft.com/office/word/2010/wordml" xmlns:w15="http://schemas.microsoft.com/office/word/2012/wordml" xmlns:w16cex="http://schemas.microsoft.com/office/word/2018/wordml/cex" xmlns:w16cid="http://schemas.microsoft.com/office/word/2016/wordml/cid" xmlns:w16="http://schemas.microsoft.com/office/word/2018/wordml" xmlns:w16du="http://schemas.microsoft.com/office/word/2023/wordml/word16du" xmlns:w16sdtdh="http://schemas.microsoft.com/office/word/2020/wordml/sdtdatahash" xmlns:w16sdtfl="http://schemas.microsoft.com/office/word/2024/wordml/sdtformatlock" xmlns:w16se="http://schemas.microsoft.com/office/word/2015/wordml/symex" xmlns:wpg="http://schemas.microsoft.com/office/word/2010/wordprocessingGroup" xmlns:wpi="http://schemas.microsoft.com/office/word/2010/wordprocessingInk" xmlns:wne="http://schemas.microsoft.com/office/word/2006/wordml" xmlns:wps="http://schemas.microsoft.com/office/word/2010/wordprocessingShape" mc:Ignorable="w14 w15 w16se w16cid w16 w16cex w16sdtdh w16sdtfl w16du wp14">
   <w:endnote w:type="separator" w:id="-1">
     <w:p>
       <w:pPr>
@@ -4593,7 +3870,7 @@
 </file>
 
 <file path=word/footer1.xml><?xml version="1.0" encoding="utf-8"?>
-<w:ftr xmlns:wpc="http://schemas.microsoft.com/office/word/2010/wordprocessingCanvas" xmlns:cx="http://schemas.microsoft.com/office/drawing/2014/chartex" xmlns:cx1="http://schemas.microsoft.com/office/drawing/2015/9/8/chartex" xmlns:cx2="http://schemas.microsoft.com/office/drawing/2015/10/21/chartex" xmlns:cx3="http://schemas.microsoft.com/office/drawing/2016/5/9/chartex" xmlns:cx4="http://schemas.microsoft.com/office/drawing/2016/5/10/chartex" xmlns:cx5="http://schemas.microsoft.com/office/drawing/2016/5/11/chartex" xmlns:cx6="http://schemas.microsoft.com/office/drawing/2016/5/12/chartex" xmlns:cx7="http://schemas.microsoft.com/office/drawing/2016/5/13/chartex" xmlns:cx8="http://schemas.microsoft.com/office/drawing/2016/5/14/chartex" xmlns:mc="http://schemas.openxmlformats.org/markup-compatibility/2006" xmlns:aink="http://schemas.microsoft.com/office/drawing/2016/ink" xmlns:am3d="http://schemas.microsoft.com/office/drawing/2017/model3d" xmlns:o="urn:schemas-microsoft-com:office:office" xmlns:r="http://schemas.openxmlformats.org/officeDocument/2006/relationships" xmlns:m="http://schemas.openxmlformats.org/officeDocument/2006/math" xmlns:v="urn:schemas-microsoft-com:vml" xmlns:wp14="http://schemas.microsoft.com/office/word/2010/wordprocessingDrawing" xmlns:wp="http://schemas.openxmlformats.org/drawingml/2006/wordprocessingDrawing" xmlns:w10="urn:schemas-microsoft-com:office:word" xmlns:w="http://schemas.openxmlformats.org/wordprocessingml/2006/main" xmlns:w14="http://schemas.microsoft.com/office/word/2010/wordml" xmlns:w15="http://schemas.microsoft.com/office/word/2012/wordml" xmlns:w16cex="http://schemas.microsoft.com/office/word/2018/wordml/cex" xmlns:w16cid="http://schemas.microsoft.com/office/word/2016/wordml/cid" xmlns:w16="http://schemas.microsoft.com/office/word/2018/wordml" xmlns:w16sdtdh="http://schemas.microsoft.com/office/word/2020/wordml/sdtdatahash" xmlns:w16se="http://schemas.microsoft.com/office/word/2015/wordml/symex" xmlns:wpg="http://schemas.microsoft.com/office/word/2010/wordprocessingGroup" xmlns:wpi="http://schemas.microsoft.com/office/word/2010/wordprocessingInk" xmlns:wne="http://schemas.microsoft.com/office/word/2006/wordml" xmlns:wps="http://schemas.microsoft.com/office/word/2010/wordprocessingShape" mc:Ignorable="w14 w15 w16se w16cid w16 w16cex w16sdtdh wp14">
+<w:ftr xmlns:wpc="http://schemas.microsoft.com/office/word/2010/wordprocessingCanvas" xmlns:cx="http://schemas.microsoft.com/office/drawing/2014/chartex" xmlns:cx1="http://schemas.microsoft.com/office/drawing/2015/9/8/chartex" xmlns:cx2="http://schemas.microsoft.com/office/drawing/2015/10/21/chartex" xmlns:cx3="http://schemas.microsoft.com/office/drawing/2016/5/9/chartex" xmlns:cx4="http://schemas.microsoft.com/office/drawing/2016/5/10/chartex" xmlns:cx5="http://schemas.microsoft.com/office/drawing/2016/5/11/chartex" xmlns:cx6="http://schemas.microsoft.com/office/drawing/2016/5/12/chartex" xmlns:cx7="http://schemas.microsoft.com/office/drawing/2016/5/13/chartex" xmlns:cx8="http://schemas.microsoft.com/office/drawing/2016/5/14/chartex" xmlns:mc="http://schemas.openxmlformats.org/markup-compatibility/2006" xmlns:aink="http://schemas.microsoft.com/office/drawing/2016/ink" xmlns:am3d="http://schemas.microsoft.com/office/drawing/2017/model3d" xmlns:o="urn:schemas-microsoft-com:office:office" xmlns:oel="http://schemas.microsoft.com/office/2019/extlst" xmlns:r="http://schemas.openxmlformats.org/officeDocument/2006/relationships" xmlns:m="http://schemas.openxmlformats.org/officeDocument/2006/math" xmlns:v="urn:schemas-microsoft-com:vml" xmlns:wp14="http://schemas.microsoft.com/office/word/2010/wordprocessingDrawing" xmlns:wp="http://schemas.openxmlformats.org/drawingml/2006/wordprocessingDrawing" xmlns:w10="urn:schemas-microsoft-com:office:word" xmlns:w="http://schemas.openxmlformats.org/wordprocessingml/2006/main" xmlns:w14="http://schemas.microsoft.com/office/word/2010/wordml" xmlns:w15="http://schemas.microsoft.com/office/word/2012/wordml" xmlns:w16cex="http://schemas.microsoft.com/office/word/2018/wordml/cex" xmlns:w16cid="http://schemas.microsoft.com/office/word/2016/wordml/cid" xmlns:w16="http://schemas.microsoft.com/office/word/2018/wordml" xmlns:w16du="http://schemas.microsoft.com/office/word/2023/wordml/word16du" xmlns:w16sdtdh="http://schemas.microsoft.com/office/word/2020/wordml/sdtdatahash" xmlns:w16sdtfl="http://schemas.microsoft.com/office/word/2024/wordml/sdtformatlock" xmlns:w16se="http://schemas.microsoft.com/office/word/2015/wordml/symex" xmlns:wpg="http://schemas.microsoft.com/office/word/2010/wordprocessingGroup" xmlns:wpi="http://schemas.microsoft.com/office/word/2010/wordprocessingInk" xmlns:wne="http://schemas.microsoft.com/office/word/2006/wordml" xmlns:wps="http://schemas.microsoft.com/office/word/2010/wordprocessingShape" mc:Ignorable="w14 w15 w16se w16cid w16 w16cex w16sdtdh w16sdtfl w16du wp14">
   <w:tbl>
     <w:tblPr>
       <w:tblW w:w="0" w:type="auto"/>
@@ -4651,7 +3928,7 @@
 </file>
 
 <file path=word/footer2.xml><?xml version="1.0" encoding="utf-8"?>
-<w:ftr xmlns:wpc="http://schemas.microsoft.com/office/word/2010/wordprocessingCanvas" xmlns:cx="http://schemas.microsoft.com/office/drawing/2014/chartex" xmlns:cx1="http://schemas.microsoft.com/office/drawing/2015/9/8/chartex" xmlns:cx2="http://schemas.microsoft.com/office/drawing/2015/10/21/chartex" xmlns:cx3="http://schemas.microsoft.com/office/drawing/2016/5/9/chartex" xmlns:cx4="http://schemas.microsoft.com/office/drawing/2016/5/10/chartex" xmlns:cx5="http://schemas.microsoft.com/office/drawing/2016/5/11/chartex" xmlns:cx6="http://schemas.microsoft.com/office/drawing/2016/5/12/chartex" xmlns:cx7="http://schemas.microsoft.com/office/drawing/2016/5/13/chartex" xmlns:cx8="http://schemas.microsoft.com/office/drawing/2016/5/14/chartex" xmlns:mc="http://schemas.openxmlformats.org/markup-compatibility/2006" xmlns:aink="http://schemas.microsoft.com/office/drawing/2016/ink" xmlns:am3d="http://schemas.microsoft.com/office/drawing/2017/model3d" xmlns:o="urn:schemas-microsoft-com:office:office" xmlns:r="http://schemas.openxmlformats.org/officeDocument/2006/relationships" xmlns:m="http://schemas.openxmlformats.org/officeDocument/2006/math" xmlns:v="urn:schemas-microsoft-com:vml" xmlns:wp14="http://schemas.microsoft.com/office/word/2010/wordprocessingDrawing" xmlns:wp="http://schemas.openxmlformats.org/drawingml/2006/wordprocessingDrawing" xmlns:w10="urn:schemas-microsoft-com:office:word" xmlns:w="http://schemas.openxmlformats.org/wordprocessingml/2006/main" xmlns:w14="http://schemas.microsoft.com/office/word/2010/wordml" xmlns:w15="http://schemas.microsoft.com/office/word/2012/wordml" xmlns:w16cex="http://schemas.microsoft.com/office/word/2018/wordml/cex" xmlns:w16cid="http://schemas.microsoft.com/office/word/2016/wordml/cid" xmlns:w16="http://schemas.microsoft.com/office/word/2018/wordml" xmlns:w16sdtdh="http://schemas.microsoft.com/office/word/2020/wordml/sdtdatahash" xmlns:w16se="http://schemas.microsoft.com/office/word/2015/wordml/symex" xmlns:wpg="http://schemas.microsoft.com/office/word/2010/wordprocessingGroup" xmlns:wpi="http://schemas.microsoft.com/office/word/2010/wordprocessingInk" xmlns:wne="http://schemas.microsoft.com/office/word/2006/wordml" xmlns:wps="http://schemas.microsoft.com/office/word/2010/wordprocessingShape" mc:Ignorable="w14 w15 w16se w16cid w16 w16cex w16sdtdh wp14">
+<w:ftr xmlns:wpc="http://schemas.microsoft.com/office/word/2010/wordprocessingCanvas" xmlns:cx="http://schemas.microsoft.com/office/drawing/2014/chartex" xmlns:cx1="http://schemas.microsoft.com/office/drawing/2015/9/8/chartex" xmlns:cx2="http://schemas.microsoft.com/office/drawing/2015/10/21/chartex" xmlns:cx3="http://schemas.microsoft.com/office/drawing/2016/5/9/chartex" xmlns:cx4="http://schemas.microsoft.com/office/drawing/2016/5/10/chartex" xmlns:cx5="http://schemas.microsoft.com/office/drawing/2016/5/11/chartex" xmlns:cx6="http://schemas.microsoft.com/office/drawing/2016/5/12/chartex" xmlns:cx7="http://schemas.microsoft.com/office/drawing/2016/5/13/chartex" xmlns:cx8="http://schemas.microsoft.com/office/drawing/2016/5/14/chartex" xmlns:mc="http://schemas.openxmlformats.org/markup-compatibility/2006" xmlns:aink="http://schemas.microsoft.com/office/drawing/2016/ink" xmlns:am3d="http://schemas.microsoft.com/office/drawing/2017/model3d" xmlns:o="urn:schemas-microsoft-com:office:office" xmlns:oel="http://schemas.microsoft.com/office/2019/extlst" xmlns:r="http://schemas.openxmlformats.org/officeDocument/2006/relationships" xmlns:m="http://schemas.openxmlformats.org/officeDocument/2006/math" xmlns:v="urn:schemas-microsoft-com:vml" xmlns:wp14="http://schemas.microsoft.com/office/word/2010/wordprocessingDrawing" xmlns:wp="http://schemas.openxmlformats.org/drawingml/2006/wordprocessingDrawing" xmlns:w10="urn:schemas-microsoft-com:office:word" xmlns:w="http://schemas.openxmlformats.org/wordprocessingml/2006/main" xmlns:w14="http://schemas.microsoft.com/office/word/2010/wordml" xmlns:w15="http://schemas.microsoft.com/office/word/2012/wordml" xmlns:w16cex="http://schemas.microsoft.com/office/word/2018/wordml/cex" xmlns:w16cid="http://schemas.microsoft.com/office/word/2016/wordml/cid" xmlns:w16="http://schemas.microsoft.com/office/word/2018/wordml" xmlns:w16du="http://schemas.microsoft.com/office/word/2023/wordml/word16du" xmlns:w16sdtdh="http://schemas.microsoft.com/office/word/2020/wordml/sdtdatahash" xmlns:w16sdtfl="http://schemas.microsoft.com/office/word/2024/wordml/sdtformatlock" xmlns:w16se="http://schemas.microsoft.com/office/word/2015/wordml/symex" xmlns:wpg="http://schemas.microsoft.com/office/word/2010/wordprocessingGroup" xmlns:wpi="http://schemas.microsoft.com/office/word/2010/wordprocessingInk" xmlns:wne="http://schemas.microsoft.com/office/word/2006/wordml" xmlns:wps="http://schemas.microsoft.com/office/word/2010/wordprocessingShape" mc:Ignorable="w14 w15 w16se w16cid w16 w16cex w16sdtdh w16sdtfl w16du wp14">
   <w:tbl>
     <w:tblPr>
       <w:tblW w:w="0" w:type="auto"/>
@@ -4709,7 +3986,7 @@
 </file>
 
 <file path=word/footnotes.xml><?xml version="1.0" encoding="utf-8"?>
-<w:footnotes xmlns:wpc="http://schemas.microsoft.com/office/word/2010/wordprocessingCanvas" xmlns:cx="http://schemas.microsoft.com/office/drawing/2014/chartex" xmlns:cx1="http://schemas.microsoft.com/office/drawing/2015/9/8/chartex" xmlns:cx2="http://schemas.microsoft.com/office/drawing/2015/10/21/chartex" xmlns:cx3="http://schemas.microsoft.com/office/drawing/2016/5/9/chartex" xmlns:cx4="http://schemas.microsoft.com/office/drawing/2016/5/10/chartex" xmlns:cx5="http://schemas.microsoft.com/office/drawing/2016/5/11/chartex" xmlns:cx6="http://schemas.microsoft.com/office/drawing/2016/5/12/chartex" xmlns:cx7="http://schemas.microsoft.com/office/drawing/2016/5/13/chartex" xmlns:cx8="http://schemas.microsoft.com/office/drawing/2016/5/14/chartex" xmlns:mc="http://schemas.openxmlformats.org/markup-compatibility/2006" xmlns:aink="http://schemas.microsoft.com/office/drawing/2016/ink" xmlns:am3d="http://schemas.microsoft.com/office/drawing/2017/model3d" xmlns:o="urn:schemas-microsoft-com:office:office" xmlns:r="http://schemas.openxmlformats.org/officeDocument/2006/relationships" xmlns:m="http://schemas.openxmlformats.org/officeDocument/2006/math" xmlns:v="urn:schemas-microsoft-com:vml" xmlns:wp14="http://schemas.microsoft.com/office/word/2010/wordprocessingDrawing" xmlns:wp="http://schemas.openxmlformats.org/drawingml/2006/wordprocessingDrawing" xmlns:w10="urn:schemas-microsoft-com:office:word" xmlns:w="http://schemas.openxmlformats.org/wordprocessingml/2006/main" xmlns:w14="http://schemas.microsoft.com/office/word/2010/wordml" xmlns:w15="http://schemas.microsoft.com/office/word/2012/wordml" xmlns:w16cex="http://schemas.microsoft.com/office/word/2018/wordml/cex" xmlns:w16cid="http://schemas.microsoft.com/office/word/2016/wordml/cid" xmlns:w16="http://schemas.microsoft.com/office/word/2018/wordml" xmlns:w16sdtdh="http://schemas.microsoft.com/office/word/2020/wordml/sdtdatahash" xmlns:w16se="http://schemas.microsoft.com/office/word/2015/wordml/symex" xmlns:wpg="http://schemas.microsoft.com/office/word/2010/wordprocessingGroup" xmlns:wpi="http://schemas.microsoft.com/office/word/2010/wordprocessingInk" xmlns:wne="http://schemas.microsoft.com/office/word/2006/wordml" xmlns:wps="http://schemas.microsoft.com/office/word/2010/wordprocessingShape" mc:Ignorable="w14 w15 w16se w16cid w16 w16cex w16sdtdh wp14">
+<w:footnotes xmlns:wpc="http://schemas.microsoft.com/office/word/2010/wordprocessingCanvas" xmlns:cx="http://schemas.microsoft.com/office/drawing/2014/chartex" xmlns:cx1="http://schemas.microsoft.com/office/drawing/2015/9/8/chartex" xmlns:cx2="http://schemas.microsoft.com/office/drawing/2015/10/21/chartex" xmlns:cx3="http://schemas.microsoft.com/office/drawing/2016/5/9/chartex" xmlns:cx4="http://schemas.microsoft.com/office/drawing/2016/5/10/chartex" xmlns:cx5="http://schemas.microsoft.com/office/drawing/2016/5/11/chartex" xmlns:cx6="http://schemas.microsoft.com/office/drawing/2016/5/12/chartex" xmlns:cx7="http://schemas.microsoft.com/office/drawing/2016/5/13/chartex" xmlns:cx8="http://schemas.microsoft.com/office/drawing/2016/5/14/chartex" xmlns:mc="http://schemas.openxmlformats.org/markup-compatibility/2006" xmlns:aink="http://schemas.microsoft.com/office/drawing/2016/ink" xmlns:am3d="http://schemas.microsoft.com/office/drawing/2017/model3d" xmlns:o="urn:schemas-microsoft-com:office:office" xmlns:oel="http://schemas.microsoft.com/office/2019/extlst" xmlns:r="http://schemas.openxmlformats.org/officeDocument/2006/relationships" xmlns:m="http://schemas.openxmlformats.org/officeDocument/2006/math" xmlns:v="urn:schemas-microsoft-com:vml" xmlns:wp14="http://schemas.microsoft.com/office/word/2010/wordprocessingDrawing" xmlns:wp="http://schemas.openxmlformats.org/drawingml/2006/wordprocessingDrawing" xmlns:w10="urn:schemas-microsoft-com:office:word" xmlns:w="http://schemas.openxmlformats.org/wordprocessingml/2006/main" xmlns:w14="http://schemas.microsoft.com/office/word/2010/wordml" xmlns:w15="http://schemas.microsoft.com/office/word/2012/wordml" xmlns:w16cex="http://schemas.microsoft.com/office/word/2018/wordml/cex" xmlns:w16cid="http://schemas.microsoft.com/office/word/2016/wordml/cid" xmlns:w16="http://schemas.microsoft.com/office/word/2018/wordml" xmlns:w16du="http://schemas.microsoft.com/office/word/2023/wordml/word16du" xmlns:w16sdtdh="http://schemas.microsoft.com/office/word/2020/wordml/sdtdatahash" xmlns:w16sdtfl="http://schemas.microsoft.com/office/word/2024/wordml/sdtformatlock" xmlns:w16se="http://schemas.microsoft.com/office/word/2015/wordml/symex" xmlns:wpg="http://schemas.microsoft.com/office/word/2010/wordprocessingGroup" xmlns:wpi="http://schemas.microsoft.com/office/word/2010/wordprocessingInk" xmlns:wne="http://schemas.microsoft.com/office/word/2006/wordml" xmlns:wps="http://schemas.microsoft.com/office/word/2010/wordprocessingShape" mc:Ignorable="w14 w15 w16se w16cid w16 w16cex w16sdtdh w16sdtfl w16du wp14">
   <w:footnote w:type="separator" w:id="-1">
     <w:p>
       <w:pPr>
@@ -4741,7 +4018,7 @@
 </file>
 
 <file path=word/header1.xml><?xml version="1.0" encoding="utf-8"?>
-<w:hdr xmlns:wpc="http://schemas.microsoft.com/office/word/2010/wordprocessingCanvas" xmlns:cx="http://schemas.microsoft.com/office/drawing/2014/chartex" xmlns:cx1="http://schemas.microsoft.com/office/drawing/2015/9/8/chartex" xmlns:cx2="http://schemas.microsoft.com/office/drawing/2015/10/21/chartex" xmlns:cx3="http://schemas.microsoft.com/office/drawing/2016/5/9/chartex" xmlns:cx4="http://schemas.microsoft.com/office/drawing/2016/5/10/chartex" xmlns:cx5="http://schemas.microsoft.com/office/drawing/2016/5/11/chartex" xmlns:cx6="http://schemas.microsoft.com/office/drawing/2016/5/12/chartex" xmlns:cx7="http://schemas.microsoft.com/office/drawing/2016/5/13/chartex" xmlns:cx8="http://schemas.microsoft.com/office/drawing/2016/5/14/chartex" xmlns:mc="http://schemas.openxmlformats.org/markup-compatibility/2006" xmlns:aink="http://schemas.microsoft.com/office/drawing/2016/ink" xmlns:am3d="http://schemas.microsoft.com/office/drawing/2017/model3d" xmlns:o="urn:schemas-microsoft-com:office:office" xmlns:r="http://schemas.openxmlformats.org/officeDocument/2006/relationships" xmlns:m="http://schemas.openxmlformats.org/officeDocument/2006/math" xmlns:v="urn:schemas-microsoft-com:vml" xmlns:wp14="http://schemas.microsoft.com/office/word/2010/wordprocessingDrawing" xmlns:wp="http://schemas.openxmlformats.org/drawingml/2006/wordprocessingDrawing" xmlns:w10="urn:schemas-microsoft-com:office:word" xmlns:w="http://schemas.openxmlformats.org/wordprocessingml/2006/main" xmlns:w14="http://schemas.microsoft.com/office/word/2010/wordml" xmlns:w15="http://schemas.microsoft.com/office/word/2012/wordml" xmlns:w16cex="http://schemas.microsoft.com/office/word/2018/wordml/cex" xmlns:w16cid="http://schemas.microsoft.com/office/word/2016/wordml/cid" xmlns:w16="http://schemas.microsoft.com/office/word/2018/wordml" xmlns:w16sdtdh="http://schemas.microsoft.com/office/word/2020/wordml/sdtdatahash" xmlns:w16se="http://schemas.microsoft.com/office/word/2015/wordml/symex" xmlns:wpg="http://schemas.microsoft.com/office/word/2010/wordprocessingGroup" xmlns:wpi="http://schemas.microsoft.com/office/word/2010/wordprocessingInk" xmlns:wne="http://schemas.microsoft.com/office/word/2006/wordml" xmlns:wps="http://schemas.microsoft.com/office/word/2010/wordprocessingShape" mc:Ignorable="w14 w15 w16se w16cid w16 w16cex w16sdtdh wp14">
+<w:hdr xmlns:wpc="http://schemas.microsoft.com/office/word/2010/wordprocessingCanvas" xmlns:cx="http://schemas.microsoft.com/office/drawing/2014/chartex" xmlns:cx1="http://schemas.microsoft.com/office/drawing/2015/9/8/chartex" xmlns:cx2="http://schemas.microsoft.com/office/drawing/2015/10/21/chartex" xmlns:cx3="http://schemas.microsoft.com/office/drawing/2016/5/9/chartex" xmlns:cx4="http://schemas.microsoft.com/office/drawing/2016/5/10/chartex" xmlns:cx5="http://schemas.microsoft.com/office/drawing/2016/5/11/chartex" xmlns:cx6="http://schemas.microsoft.com/office/drawing/2016/5/12/chartex" xmlns:cx7="http://schemas.microsoft.com/office/drawing/2016/5/13/chartex" xmlns:cx8="http://schemas.microsoft.com/office/drawing/2016/5/14/chartex" xmlns:mc="http://schemas.openxmlformats.org/markup-compatibility/2006" xmlns:aink="http://schemas.microsoft.com/office/drawing/2016/ink" xmlns:am3d="http://schemas.microsoft.com/office/drawing/2017/model3d" xmlns:o="urn:schemas-microsoft-com:office:office" xmlns:oel="http://schemas.microsoft.com/office/2019/extlst" xmlns:r="http://schemas.openxmlformats.org/officeDocument/2006/relationships" xmlns:m="http://schemas.openxmlformats.org/officeDocument/2006/math" xmlns:v="urn:schemas-microsoft-com:vml" xmlns:wp14="http://schemas.microsoft.com/office/word/2010/wordprocessingDrawing" xmlns:wp="http://schemas.openxmlformats.org/drawingml/2006/wordprocessingDrawing" xmlns:w10="urn:schemas-microsoft-com:office:word" xmlns:w="http://schemas.openxmlformats.org/wordprocessingml/2006/main" xmlns:w14="http://schemas.microsoft.com/office/word/2010/wordml" xmlns:w15="http://schemas.microsoft.com/office/word/2012/wordml" xmlns:w16cex="http://schemas.microsoft.com/office/word/2018/wordml/cex" xmlns:w16cid="http://schemas.microsoft.com/office/word/2016/wordml/cid" xmlns:w16="http://schemas.microsoft.com/office/word/2018/wordml" xmlns:w16du="http://schemas.microsoft.com/office/word/2023/wordml/word16du" xmlns:w16sdtdh="http://schemas.microsoft.com/office/word/2020/wordml/sdtdatahash" xmlns:w16sdtfl="http://schemas.microsoft.com/office/word/2024/wordml/sdtformatlock" xmlns:w16se="http://schemas.microsoft.com/office/word/2015/wordml/symex" xmlns:wpg="http://schemas.microsoft.com/office/word/2010/wordprocessingGroup" xmlns:wpi="http://schemas.microsoft.com/office/word/2010/wordprocessingInk" xmlns:wne="http://schemas.microsoft.com/office/word/2006/wordml" xmlns:wps="http://schemas.microsoft.com/office/word/2010/wordprocessingShape" mc:Ignorable="w14 w15 w16se w16cid w16 w16cex w16sdtdh w16sdtfl w16du wp14">
   <w:tbl>
     <w:tblPr>
       <w:tblW w:w="0" w:type="auto"/>
@@ -4799,7 +4076,7 @@
 </file>
 
 <file path=word/header2.xml><?xml version="1.0" encoding="utf-8"?>
-<w:hdr xmlns:wpc="http://schemas.microsoft.com/office/word/2010/wordprocessingCanvas" xmlns:cx="http://schemas.microsoft.com/office/drawing/2014/chartex" xmlns:cx1="http://schemas.microsoft.com/office/drawing/2015/9/8/chartex" xmlns:cx2="http://schemas.microsoft.com/office/drawing/2015/10/21/chartex" xmlns:cx3="http://schemas.microsoft.com/office/drawing/2016/5/9/chartex" xmlns:cx4="http://schemas.microsoft.com/office/drawing/2016/5/10/chartex" xmlns:cx5="http://schemas.microsoft.com/office/drawing/2016/5/11/chartex" xmlns:cx6="http://schemas.microsoft.com/office/drawing/2016/5/12/chartex" xmlns:cx7="http://schemas.microsoft.com/office/drawing/2016/5/13/chartex" xmlns:cx8="http://schemas.microsoft.com/office/drawing/2016/5/14/chartex" xmlns:mc="http://schemas.openxmlformats.org/markup-compatibility/2006" xmlns:aink="http://schemas.microsoft.com/office/drawing/2016/ink" xmlns:am3d="http://schemas.microsoft.com/office/drawing/2017/model3d" xmlns:o="urn:schemas-microsoft-com:office:office" xmlns:r="http://schemas.openxmlformats.org/officeDocument/2006/relationships" xmlns:m="http://schemas.openxmlformats.org/officeDocument/2006/math" xmlns:v="urn:schemas-microsoft-com:vml" xmlns:wp14="http://schemas.microsoft.com/office/word/2010/wordprocessingDrawing" xmlns:wp="http://schemas.openxmlformats.org/drawingml/2006/wordprocessingDrawing" xmlns:w10="urn:schemas-microsoft-com:office:word" xmlns:w="http://schemas.openxmlformats.org/wordprocessingml/2006/main" xmlns:w14="http://schemas.microsoft.com/office/word/2010/wordml" xmlns:w15="http://schemas.microsoft.com/office/word/2012/wordml" xmlns:w16cex="http://schemas.microsoft.com/office/word/2018/wordml/cex" xmlns:w16cid="http://schemas.microsoft.com/office/word/2016/wordml/cid" xmlns:w16="http://schemas.microsoft.com/office/word/2018/wordml" xmlns:w16sdtdh="http://schemas.microsoft.com/office/word/2020/wordml/sdtdatahash" xmlns:w16se="http://schemas.microsoft.com/office/word/2015/wordml/symex" xmlns:wpg="http://schemas.microsoft.com/office/word/2010/wordprocessingGroup" xmlns:wpi="http://schemas.microsoft.com/office/word/2010/wordprocessingInk" xmlns:wne="http://schemas.microsoft.com/office/word/2006/wordml" xmlns:wps="http://schemas.microsoft.com/office/word/2010/wordprocessingShape" mc:Ignorable="w14 w15 w16se w16cid w16 w16cex w16sdtdh wp14">
+<w:hdr xmlns:wpc="http://schemas.microsoft.com/office/word/2010/wordprocessingCanvas" xmlns:cx="http://schemas.microsoft.com/office/drawing/2014/chartex" xmlns:cx1="http://schemas.microsoft.com/office/drawing/2015/9/8/chartex" xmlns:cx2="http://schemas.microsoft.com/office/drawing/2015/10/21/chartex" xmlns:cx3="http://schemas.microsoft.com/office/drawing/2016/5/9/chartex" xmlns:cx4="http://schemas.microsoft.com/office/drawing/2016/5/10/chartex" xmlns:cx5="http://schemas.microsoft.com/office/drawing/2016/5/11/chartex" xmlns:cx6="http://schemas.microsoft.com/office/drawing/2016/5/12/chartex" xmlns:cx7="http://schemas.microsoft.com/office/drawing/2016/5/13/chartex" xmlns:cx8="http://schemas.microsoft.com/office/drawing/2016/5/14/chartex" xmlns:mc="http://schemas.openxmlformats.org/markup-compatibility/2006" xmlns:aink="http://schemas.microsoft.com/office/drawing/2016/ink" xmlns:am3d="http://schemas.microsoft.com/office/drawing/2017/model3d" xmlns:o="urn:schemas-microsoft-com:office:office" xmlns:oel="http://schemas.microsoft.com/office/2019/extlst" xmlns:r="http://schemas.openxmlformats.org/officeDocument/2006/relationships" xmlns:m="http://schemas.openxmlformats.org/officeDocument/2006/math" xmlns:v="urn:schemas-microsoft-com:vml" xmlns:wp14="http://schemas.microsoft.com/office/word/2010/wordprocessingDrawing" xmlns:wp="http://schemas.openxmlformats.org/drawingml/2006/wordprocessingDrawing" xmlns:w10="urn:schemas-microsoft-com:office:word" xmlns:w="http://schemas.openxmlformats.org/wordprocessingml/2006/main" xmlns:w14="http://schemas.microsoft.com/office/word/2010/wordml" xmlns:w15="http://schemas.microsoft.com/office/word/2012/wordml" xmlns:w16cex="http://schemas.microsoft.com/office/word/2018/wordml/cex" xmlns:w16cid="http://schemas.microsoft.com/office/word/2016/wordml/cid" xmlns:w16="http://schemas.microsoft.com/office/word/2018/wordml" xmlns:w16du="http://schemas.microsoft.com/office/word/2023/wordml/word16du" xmlns:w16sdtdh="http://schemas.microsoft.com/office/word/2020/wordml/sdtdatahash" xmlns:w16sdtfl="http://schemas.microsoft.com/office/word/2024/wordml/sdtformatlock" xmlns:w16se="http://schemas.microsoft.com/office/word/2015/wordml/symex" xmlns:wpg="http://schemas.microsoft.com/office/word/2010/wordprocessingGroup" xmlns:wpi="http://schemas.microsoft.com/office/word/2010/wordprocessingInk" xmlns:wne="http://schemas.microsoft.com/office/word/2006/wordml" xmlns:wps="http://schemas.microsoft.com/office/word/2010/wordprocessingShape" mc:Ignorable="w14 w15 w16se w16cid w16 w16cex w16sdtdh w16sdtfl w16du wp14">
   <w:tbl>
     <w:tblPr>
       <w:tblStyle w:val="Tablaconcuadrcula"/>
@@ -5047,7 +4324,7 @@
 </file>
 
 <file path=word/numbering.xml><?xml version="1.0" encoding="utf-8"?>
-<w:numbering xmlns:wpc="http://schemas.microsoft.com/office/word/2010/wordprocessingCanvas" xmlns:cx="http://schemas.microsoft.com/office/drawing/2014/chartex" xmlns:cx1="http://schemas.microsoft.com/office/drawing/2015/9/8/chartex" xmlns:cx2="http://schemas.microsoft.com/office/drawing/2015/10/21/chartex" xmlns:cx3="http://schemas.microsoft.com/office/drawing/2016/5/9/chartex" xmlns:cx4="http://schemas.microsoft.com/office/drawing/2016/5/10/chartex" xmlns:cx5="http://schemas.microsoft.com/office/drawing/2016/5/11/chartex" xmlns:cx6="http://schemas.microsoft.com/office/drawing/2016/5/12/chartex" xmlns:cx7="http://schemas.microsoft.com/office/drawing/2016/5/13/chartex" xmlns:cx8="http://schemas.microsoft.com/office/drawing/2016/5/14/chartex" xmlns:mc="http://schemas.openxmlformats.org/markup-compatibility/2006" xmlns:aink="http://schemas.microsoft.com/office/drawing/2016/ink" xmlns:am3d="http://schemas.microsoft.com/office/drawing/2017/model3d" xmlns:o="urn:schemas-microsoft-com:office:office" xmlns:r="http://schemas.openxmlformats.org/officeDocument/2006/relationships" xmlns:m="http://schemas.openxmlformats.org/officeDocument/2006/math" xmlns:v="urn:schemas-microsoft-com:vml" xmlns:wp14="http://schemas.microsoft.com/office/word/2010/wordprocessingDrawing" xmlns:wp="http://schemas.openxmlformats.org/drawingml/2006/wordprocessingDrawing" xmlns:w10="urn:schemas-microsoft-com:office:word" xmlns:w="http://schemas.openxmlformats.org/wordprocessingml/2006/main" xmlns:w14="http://schemas.microsoft.com/office/word/2010/wordml" xmlns:w15="http://schemas.microsoft.com/office/word/2012/wordml" xmlns:w16cex="http://schemas.microsoft.com/office/word/2018/wordml/cex" xmlns:w16cid="http://schemas.microsoft.com/office/word/2016/wordml/cid" xmlns:w16="http://schemas.microsoft.com/office/word/2018/wordml" xmlns:w16sdtdh="http://schemas.microsoft.com/office/word/2020/wordml/sdtdatahash" xmlns:w16se="http://schemas.microsoft.com/office/word/2015/wordml/symex" xmlns:wpg="http://schemas.microsoft.com/office/word/2010/wordprocessingGroup" xmlns:wpi="http://schemas.microsoft.com/office/word/2010/wordprocessingInk" xmlns:wne="http://schemas.microsoft.com/office/word/2006/wordml" xmlns:wps="http://schemas.microsoft.com/office/word/2010/wordprocessingShape" mc:Ignorable="w14 w15 w16se w16cid w16 w16cex w16sdtdh wp14">
+<w:numbering xmlns:wpc="http://schemas.microsoft.com/office/word/2010/wordprocessingCanvas" xmlns:cx="http://schemas.microsoft.com/office/drawing/2014/chartex" xmlns:cx1="http://schemas.microsoft.com/office/drawing/2015/9/8/chartex" xmlns:cx2="http://schemas.microsoft.com/office/drawing/2015/10/21/chartex" xmlns:cx3="http://schemas.microsoft.com/office/drawing/2016/5/9/chartex" xmlns:cx4="http://schemas.microsoft.com/office/drawing/2016/5/10/chartex" xmlns:cx5="http://schemas.microsoft.com/office/drawing/2016/5/11/chartex" xmlns:cx6="http://schemas.microsoft.com/office/drawing/2016/5/12/chartex" xmlns:cx7="http://schemas.microsoft.com/office/drawing/2016/5/13/chartex" xmlns:cx8="http://schemas.microsoft.com/office/drawing/2016/5/14/chartex" xmlns:mc="http://schemas.openxmlformats.org/markup-compatibility/2006" xmlns:aink="http://schemas.microsoft.com/office/drawing/2016/ink" xmlns:am3d="http://schemas.microsoft.com/office/drawing/2017/model3d" xmlns:o="urn:schemas-microsoft-com:office:office" xmlns:oel="http://schemas.microsoft.com/office/2019/extlst" xmlns:r="http://schemas.openxmlformats.org/officeDocument/2006/relationships" xmlns:m="http://schemas.openxmlformats.org/officeDocument/2006/math" xmlns:v="urn:schemas-microsoft-com:vml" xmlns:wp14="http://schemas.microsoft.com/office/word/2010/wordprocessingDrawing" xmlns:wp="http://schemas.openxmlformats.org/drawingml/2006/wordprocessingDrawing" xmlns:w10="urn:schemas-microsoft-com:office:word" xmlns:w="http://schemas.openxmlformats.org/wordprocessingml/2006/main" xmlns:w14="http://schemas.microsoft.com/office/word/2010/wordml" xmlns:w15="http://schemas.microsoft.com/office/word/2012/wordml" xmlns:w16cex="http://schemas.microsoft.com/office/word/2018/wordml/cex" xmlns:w16cid="http://schemas.microsoft.com/office/word/2016/wordml/cid" xmlns:w16="http://schemas.microsoft.com/office/word/2018/wordml" xmlns:w16du="http://schemas.microsoft.com/office/word/2023/wordml/word16du" xmlns:w16sdtdh="http://schemas.microsoft.com/office/word/2020/wordml/sdtdatahash" xmlns:w16sdtfl="http://schemas.microsoft.com/office/word/2024/wordml/sdtformatlock" xmlns:w16se="http://schemas.microsoft.com/office/word/2015/wordml/symex" xmlns:wpg="http://schemas.microsoft.com/office/word/2010/wordprocessingGroup" xmlns:wpi="http://schemas.microsoft.com/office/word/2010/wordprocessingInk" xmlns:wne="http://schemas.microsoft.com/office/word/2006/wordml" xmlns:wps="http://schemas.microsoft.com/office/word/2010/wordprocessingShape" mc:Ignorable="w14 w15 w16se w16cid w16 w16cex w16sdtdh w16sdtfl w16du wp14">
   <w:abstractNum w:abstractNumId="0" w15:restartNumberingAfterBreak="0">
     <w:nsid w:val="02646EBE"/>
     <w:multiLevelType w:val="hybridMultilevel"/>
@@ -6709,55 +5986,55 @@
       </w:pPr>
     </w:lvl>
   </w:abstractNum>
-  <w:num w:numId="1">
+  <w:num w:numId="1" w16cid:durableId="632256094">
     <w:abstractNumId w:val="9"/>
   </w:num>
-  <w:num w:numId="2">
+  <w:num w:numId="2" w16cid:durableId="1756122770">
     <w:abstractNumId w:val="5"/>
   </w:num>
-  <w:num w:numId="3">
+  <w:num w:numId="3" w16cid:durableId="355430894">
     <w:abstractNumId w:val="3"/>
   </w:num>
-  <w:num w:numId="4">
+  <w:num w:numId="4" w16cid:durableId="1364287550">
     <w:abstractNumId w:val="12"/>
   </w:num>
-  <w:num w:numId="5">
+  <w:num w:numId="5" w16cid:durableId="533228022">
     <w:abstractNumId w:val="0"/>
   </w:num>
-  <w:num w:numId="6">
+  <w:num w:numId="6" w16cid:durableId="1599096272">
     <w:abstractNumId w:val="1"/>
   </w:num>
-  <w:num w:numId="7">
+  <w:num w:numId="7" w16cid:durableId="1296178246">
     <w:abstractNumId w:val="6"/>
   </w:num>
-  <w:num w:numId="8">
+  <w:num w:numId="8" w16cid:durableId="1350063515">
     <w:abstractNumId w:val="4"/>
   </w:num>
-  <w:num w:numId="9">
+  <w:num w:numId="9" w16cid:durableId="237330710">
     <w:abstractNumId w:val="13"/>
   </w:num>
-  <w:num w:numId="10">
+  <w:num w:numId="10" w16cid:durableId="474373757">
     <w:abstractNumId w:val="15"/>
   </w:num>
-  <w:num w:numId="11">
+  <w:num w:numId="11" w16cid:durableId="829714030">
     <w:abstractNumId w:val="8"/>
   </w:num>
-  <w:num w:numId="12">
+  <w:num w:numId="12" w16cid:durableId="1523394689">
     <w:abstractNumId w:val="10"/>
   </w:num>
-  <w:num w:numId="13">
+  <w:num w:numId="13" w16cid:durableId="1821573983">
     <w:abstractNumId w:val="16"/>
   </w:num>
-  <w:num w:numId="14">
+  <w:num w:numId="14" w16cid:durableId="2020885365">
     <w:abstractNumId w:val="11"/>
   </w:num>
-  <w:num w:numId="15">
+  <w:num w:numId="15" w16cid:durableId="1978410333">
     <w:abstractNumId w:val="7"/>
   </w:num>
-  <w:num w:numId="16">
+  <w:num w:numId="16" w16cid:durableId="479730601">
     <w:abstractNumId w:val="14"/>
   </w:num>
-  <w:num w:numId="17">
+  <w:num w:numId="17" w16cid:durableId="1615481842">
     <w:abstractNumId w:val="2"/>
   </w:num>
   <w:numIdMacAtCleanup w:val="8"/>
@@ -6765,7 +6042,7 @@
 </file>
 
 <file path=word/styles.xml><?xml version="1.0" encoding="utf-8"?>
-<w:styles xmlns:mc="http://schemas.openxmlformats.org/markup-compatibility/2006" xmlns:r="http://schemas.openxmlformats.org/officeDocument/2006/relationships" xmlns:w="http://schemas.openxmlformats.org/wordprocessingml/2006/main" xmlns:w14="http://schemas.microsoft.com/office/word/2010/wordml" xmlns:w15="http://schemas.microsoft.com/office/word/2012/wordml" xmlns:w16cex="http://schemas.microsoft.com/office/word/2018/wordml/cex" xmlns:w16cid="http://schemas.microsoft.com/office/word/2016/wordml/cid" xmlns:w16="http://schemas.microsoft.com/office/word/2018/wordml" xmlns:w16sdtdh="http://schemas.microsoft.com/office/word/2020/wordml/sdtdatahash" xmlns:w16se="http://schemas.microsoft.com/office/word/2015/wordml/symex" mc:Ignorable="w14 w15 w16se w16cid w16 w16cex w16sdtdh">
+<w:styles xmlns:mc="http://schemas.openxmlformats.org/markup-compatibility/2006" xmlns:r="http://schemas.openxmlformats.org/officeDocument/2006/relationships" xmlns:w="http://schemas.openxmlformats.org/wordprocessingml/2006/main" xmlns:w14="http://schemas.microsoft.com/office/word/2010/wordml" xmlns:w15="http://schemas.microsoft.com/office/word/2012/wordml" xmlns:w16cex="http://schemas.microsoft.com/office/word/2018/wordml/cex" xmlns:w16cid="http://schemas.microsoft.com/office/word/2016/wordml/cid" xmlns:w16="http://schemas.microsoft.com/office/word/2018/wordml" xmlns:w16du="http://schemas.microsoft.com/office/word/2023/wordml/word16du" xmlns:w16sdtdh="http://schemas.microsoft.com/office/word/2020/wordml/sdtdatahash" xmlns:w16sdtfl="http://schemas.microsoft.com/office/word/2024/wordml/sdtformatlock" xmlns:w16se="http://schemas.microsoft.com/office/word/2015/wordml/symex" mc:Ignorable="w14 w15 w16se w16cid w16 w16cex w16sdtdh w16sdtfl w16du">
   <w:docDefaults>
     <w:rPrDefault>
       <w:rPr>
@@ -7374,7 +6651,6 @@
   <w:style w:type="character" w:default="1" w:styleId="Fuentedeprrafopredeter">
     <w:name w:val="Default Paragraph Font"/>
     <w:uiPriority w:val="1"/>
-    <w:semiHidden/>
     <w:unhideWhenUsed/>
   </w:style>
   <w:style w:type="table" w:default="1" w:styleId="Tablanormal">
@@ -7620,7 +6896,7 @@
       <w:szCs w:val="28"/>
     </w:rPr>
   </w:style>
-  <w:style w:type="character" w:styleId="Textoennegrita">
+  <w:style w:type="character" w:styleId="Fuerte">
     <w:name w:val="Strong"/>
     <w:basedOn w:val="Fuentedeprrafopredeter"/>
     <w:uiPriority w:val="22"/>
@@ -8858,6 +8134,19 @@
 </file>
 
 <file path=customXml/item2.xml><?xml version="1.0" encoding="utf-8"?>
+<?mso-contentType ?>
+<FormTemplates xmlns="http://schemas.microsoft.com/sharepoint/v3/contenttype/forms">
+  <Display>DocumentLibraryForm</Display>
+  <Edit>DocumentLibraryForm</Edit>
+  <New>DocumentLibraryForm</New>
+</FormTemplates>
+</file>
+
+<file path=customXml/item3.xml><?xml version="1.0" encoding="utf-8"?>
+<b:Sources xmlns:b="http://schemas.openxmlformats.org/officeDocument/2006/bibliography" xmlns="http://schemas.openxmlformats.org/officeDocument/2006/bibliography" SelectedStyle="\APASixthEditionOfficeOnline.xsl" StyleName="APA" Version="6"/>
+</file>
+
+<file path=customXml/item4.xml><?xml version="1.0" encoding="utf-8"?>
 <ct:contentTypeSchema xmlns:ct="http://schemas.microsoft.com/office/2006/metadata/contentType" xmlns:ma="http://schemas.microsoft.com/office/2006/metadata/properties/metaAttributes" ct:_="" ma:_="" ma:contentTypeName="Documento" ma:contentTypeID="0x01010023858CF01A2EF24688B692775F4C60A4" ma:contentTypeVersion="15" ma:contentTypeDescription="Crear nuevo documento." ma:contentTypeScope="" ma:versionID="a4df9e4b793c0fa050084ef4feafa589">
   <xsd:schema xmlns:xsd="http://www.w3.org/2001/XMLSchema" xmlns:xs="http://www.w3.org/2001/XMLSchema" xmlns:p="http://schemas.microsoft.com/office/2006/metadata/properties" xmlns:ns2="164883f8-7691-4ecf-b54a-664c0d0edefe" xmlns:ns3="85e30bcc-d76c-4413-8e4d-2dce22fb0743" targetNamespace="http://schemas.microsoft.com/office/2006/metadata/properties" ma:root="true" ma:fieldsID="067b7080d2289f9ba15465beea7d18a8" ns2:_="" ns3:_="">
     <xsd:import namespace="164883f8-7691-4ecf-b54a-664c0d0edefe"/>
@@ -9094,19 +8383,6 @@
 </ct:contentTypeSchema>
 </file>
 
-<file path=customXml/item3.xml><?xml version="1.0" encoding="utf-8"?>
-<b:Sources xmlns:b="http://schemas.openxmlformats.org/officeDocument/2006/bibliography" xmlns="http://schemas.openxmlformats.org/officeDocument/2006/bibliography" SelectedStyle="\APASixthEditionOfficeOnline.xsl" StyleName="APA" Version="6"/>
-</file>
-
-<file path=customXml/item4.xml><?xml version="1.0" encoding="utf-8"?>
-<?mso-contentType ?>
-<FormTemplates xmlns="http://schemas.microsoft.com/sharepoint/v3/contenttype/forms">
-  <Display>DocumentLibraryForm</Display>
-  <Edit>DocumentLibraryForm</Edit>
-  <New>DocumentLibraryForm</New>
-</FormTemplates>
-</file>
-
 <file path=customXml/itemProps1.xml><?xml version="1.0" encoding="utf-8"?>
 <ds:datastoreItem xmlns:ds="http://schemas.openxmlformats.org/officeDocument/2006/customXml" ds:itemID="{D3B4676A-CA48-4E6B-BABE-1535A7A288F6}">
   <ds:schemaRefs>
@@ -9119,6 +8395,22 @@
 </file>
 
 <file path=customXml/itemProps2.xml><?xml version="1.0" encoding="utf-8"?>
+<ds:datastoreItem xmlns:ds="http://schemas.openxmlformats.org/officeDocument/2006/customXml" ds:itemID="{58AFF83A-2C1F-4B0C-9BCE-EE49F5226348}">
+  <ds:schemaRefs>
+    <ds:schemaRef ds:uri="http://schemas.microsoft.com/sharepoint/v3/contenttype/forms"/>
+  </ds:schemaRefs>
+</ds:datastoreItem>
+</file>
+
+<file path=customXml/itemProps3.xml><?xml version="1.0" encoding="utf-8"?>
+<ds:datastoreItem xmlns:ds="http://schemas.openxmlformats.org/officeDocument/2006/customXml" ds:itemID="{794BE61C-5254-4531-868C-EC2590174185}">
+  <ds:schemaRefs>
+    <ds:schemaRef ds:uri="http://schemas.openxmlformats.org/officeDocument/2006/bibliography"/>
+  </ds:schemaRefs>
+</ds:datastoreItem>
+</file>
+
+<file path=customXml/itemProps4.xml><?xml version="1.0" encoding="utf-8"?>
 <ds:datastoreItem xmlns:ds="http://schemas.openxmlformats.org/officeDocument/2006/customXml" ds:itemID="{62F3E371-4CEE-4871-A936-27DA1639FADD}">
   <ds:schemaRefs>
     <ds:schemaRef ds:uri="http://schemas.microsoft.com/office/2006/metadata/contentType"/>
@@ -9135,20 +8427,4 @@
     <ds:schemaRef ds:uri="http://schemas.microsoft.com/internal/obd"/>
   </ds:schemaRefs>
 </ds:datastoreItem>
-</file>
-
-<file path=customXml/itemProps3.xml><?xml version="1.0" encoding="utf-8"?>
-<ds:datastoreItem xmlns:ds="http://schemas.openxmlformats.org/officeDocument/2006/customXml" ds:itemID="{794BE61C-5254-4531-868C-EC2590174185}">
-  <ds:schemaRefs>
-    <ds:schemaRef ds:uri="http://schemas.openxmlformats.org/officeDocument/2006/bibliography"/>
-  </ds:schemaRefs>
-</ds:datastoreItem>
-</file>
-
-<file path=customXml/itemProps4.xml><?xml version="1.0" encoding="utf-8"?>
-<ds:datastoreItem xmlns:ds="http://schemas.openxmlformats.org/officeDocument/2006/customXml" ds:itemID="{58AFF83A-2C1F-4B0C-9BCE-EE49F5226348}">
-  <ds:schemaRefs>
-    <ds:schemaRef ds:uri="http://schemas.microsoft.com/sharepoint/v3/contenttype/forms"/>
-  </ds:schemaRefs>
-</ds:datastoreItem>
 </file>
</xml_diff>

<commit_message>
Análisis de complejidad REQ2,5
</commit_message>
<xml_diff>
--- a/Docs/ISIS1225 - AnalisisReto-TEMPLATE RETO.docx
+++ b/Docs/ISIS1225 - AnalisisReto-TEMPLATE RETO.docx
@@ -4,7 +4,7 @@
   <w:body>
     <w:p>
       <w:pPr>
-        <w:pStyle w:val="Ttulo"/>
+        <w:pStyle w:val="Title"/>
         <w:jc w:val="center"/>
         <w:rPr>
           <w:b/>
@@ -55,7 +55,7 @@
     </w:p>
     <w:p>
       <w:pPr>
-        <w:pStyle w:val="Ttulo1"/>
+        <w:pStyle w:val="Heading1"/>
         <w:rPr>
           <w:b/>
           <w:bCs/>
@@ -83,7 +83,7 @@
     </w:p>
     <w:tbl>
       <w:tblPr>
-        <w:tblStyle w:val="Tablaconcuadrcula"/>
+        <w:tblStyle w:val="TableGrid"/>
         <w:tblW w:w="9360" w:type="dxa"/>
         <w:tblLayout w:type="fixed"/>
         <w:tblLook w:val="06A0" w:firstRow="1" w:lastRow="0" w:firstColumn="1" w:lastColumn="0" w:noHBand="1" w:noVBand="1"/>
@@ -118,15 +118,38 @@
             <w:tcW w:w="6300" w:type="dxa"/>
           </w:tcPr>
           <w:p>
+            <w:proofErr w:type="spellStart"/>
             <w:r>
               <w:t>Catalog</w:t>
             </w:r>
+            <w:proofErr w:type="spellEnd"/>
             <w:r>
               <w:t xml:space="preserve"> </w:t>
             </w:r>
             <w:r>
-              <w:t>, anio, mes, descuento_min, descuento_max</w:t>
-            </w:r>
+              <w:t xml:space="preserve">, </w:t>
+            </w:r>
+            <w:proofErr w:type="spellStart"/>
+            <w:r>
+              <w:t>anio</w:t>
+            </w:r>
+            <w:proofErr w:type="spellEnd"/>
+            <w:r>
+              <w:t xml:space="preserve">, mes, </w:t>
+            </w:r>
+            <w:proofErr w:type="spellStart"/>
+            <w:r>
+              <w:t>descuento_min</w:t>
+            </w:r>
+            <w:proofErr w:type="spellEnd"/>
+            <w:r>
+              <w:t xml:space="preserve">, </w:t>
+            </w:r>
+            <w:proofErr w:type="spellStart"/>
+            <w:r>
+              <w:t>descuento_max</w:t>
+            </w:r>
+            <w:proofErr w:type="spellEnd"/>
           </w:p>
         </w:tc>
       </w:tr>
@@ -157,7 +180,55 @@
           </w:tcPr>
           <w:p>
             <w:r>
-              <w:t xml:space="preserve">Lista “resultado” con tiempo de ejecución del requerimiento en milisegundos, número total de pedidos que cumplieron el filtro, precio promedio de Price_per_Box, promedio de Discount_Pct, promedio de Marketing_Spend, promedio de Boxes_Shipped y los dos criterios con mayor amount de los que cumplen el criterio con los datos Order_ID, </w:t>
+              <w:t xml:space="preserve">Lista “resultado” con tiempo de ejecución del requerimiento en milisegundos, número total de pedidos que cumplieron el filtro, precio promedio de </w:t>
+            </w:r>
+            <w:proofErr w:type="spellStart"/>
+            <w:r>
+              <w:t>Price_per_Box</w:t>
+            </w:r>
+            <w:proofErr w:type="spellEnd"/>
+            <w:r>
+              <w:t xml:space="preserve">, promedio de </w:t>
+            </w:r>
+            <w:proofErr w:type="spellStart"/>
+            <w:r>
+              <w:t>Discount_Pct</w:t>
+            </w:r>
+            <w:proofErr w:type="spellEnd"/>
+            <w:r>
+              <w:t xml:space="preserve">, promedio de </w:t>
+            </w:r>
+            <w:proofErr w:type="spellStart"/>
+            <w:r>
+              <w:t>Marketing_Spend</w:t>
+            </w:r>
+            <w:proofErr w:type="spellEnd"/>
+            <w:r>
+              <w:t xml:space="preserve">, promedio de </w:t>
+            </w:r>
+            <w:proofErr w:type="spellStart"/>
+            <w:r>
+              <w:t>Boxes_Shipped</w:t>
+            </w:r>
+            <w:proofErr w:type="spellEnd"/>
+            <w:r>
+              <w:t xml:space="preserve"> y los dos criterios con mayor </w:t>
+            </w:r>
+            <w:proofErr w:type="spellStart"/>
+            <w:r>
+              <w:t>amount</w:t>
+            </w:r>
+            <w:proofErr w:type="spellEnd"/>
+            <w:r>
+              <w:t xml:space="preserve"> de los que cumplen el criterio con los datos </w:t>
+            </w:r>
+            <w:proofErr w:type="spellStart"/>
+            <w:r>
+              <w:t>Order_ID</w:t>
+            </w:r>
+            <w:proofErr w:type="spellEnd"/>
+            <w:r>
+              <w:t xml:space="preserve">, </w:t>
             </w:r>
             <w:r>
               <w:t>Canal (Channel)</w:t>
@@ -166,10 +237,34 @@
               <w:t>,</w:t>
             </w:r>
             <w:r>
-              <w:t xml:space="preserve"> Fecha (Order_Date)</w:t>
-            </w:r>
-            <w:r>
-              <w:t>, Cajas enviadas (Boxes_Shipped) y Monto (Amount)</w:t>
+              <w:t xml:space="preserve"> Fecha (</w:t>
+            </w:r>
+            <w:proofErr w:type="spellStart"/>
+            <w:r>
+              <w:t>Order_Date</w:t>
+            </w:r>
+            <w:proofErr w:type="spellEnd"/>
+            <w:r>
+              <w:t>)</w:t>
+            </w:r>
+            <w:r>
+              <w:t>, Cajas enviadas (</w:t>
+            </w:r>
+            <w:proofErr w:type="spellStart"/>
+            <w:r>
+              <w:t>Boxes_Shipped</w:t>
+            </w:r>
+            <w:proofErr w:type="spellEnd"/>
+            <w:r>
+              <w:t>) y Monto (</w:t>
+            </w:r>
+            <w:proofErr w:type="spellStart"/>
+            <w:r>
+              <w:t>Amount</w:t>
+            </w:r>
+            <w:proofErr w:type="spellEnd"/>
+            <w:r>
+              <w:t>)</w:t>
             </w:r>
           </w:p>
         </w:tc>
@@ -201,7 +296,15 @@
           </w:tcPr>
           <w:p>
             <w:r>
-              <w:t>Si, Jose Alexander Santos Cobos</w:t>
+              <w:t xml:space="preserve">Si, </w:t>
+            </w:r>
+            <w:proofErr w:type="spellStart"/>
+            <w:r>
+              <w:t>Jose</w:t>
+            </w:r>
+            <w:proofErr w:type="spellEnd"/>
+            <w:r>
+              <w:t xml:space="preserve"> Alexander Santos Cobos</w:t>
             </w:r>
           </w:p>
         </w:tc>
@@ -210,7 +313,7 @@
     <w:p/>
     <w:p>
       <w:pPr>
-        <w:pStyle w:val="Ttulo2"/>
+        <w:pStyle w:val="Heading2"/>
         <w:rPr>
           <w:b/>
           <w:bCs/>
@@ -237,7 +340,7 @@
     </w:p>
     <w:tbl>
       <w:tblPr>
-        <w:tblStyle w:val="Tablaconcuadrcula"/>
+        <w:tblStyle w:val="TableGrid"/>
         <w:tblW w:w="0" w:type="auto"/>
         <w:tblLayout w:type="fixed"/>
         <w:tblLook w:val="06A0" w:firstRow="1" w:lastRow="0" w:firstColumn="1" w:lastColumn="0" w:noHBand="1" w:noVBand="1"/>
@@ -353,21 +456,9 @@
                 <w:szCs w:val="20"/>
                 <w:lang w:eastAsia="es-CO"/>
               </w:rPr>
-              <w:t>Paso 2: Se busca la llave en la tabla de hash de Linear Probing y se obtiene la lista de pedidos de ese mes</w:t>
-            </w:r>
-          </w:p>
-        </w:tc>
-        <w:tc>
-          <w:tcPr>
-            <w:tcW w:w="4275" w:type="dxa"/>
-          </w:tcPr>
-          <w:p>
-            <w:pPr>
-              <w:rPr>
-                <w:b/>
-                <w:bCs/>
-              </w:rPr>
-            </w:pPr>
+              <w:t xml:space="preserve">Paso 2: Se busca la llave en la tabla de hash de Linear </w:t>
+            </w:r>
+            <w:proofErr w:type="spellStart"/>
             <w:r>
               <w:rPr>
                 <w:rFonts w:ascii="Arial" w:eastAsia="Times New Roman" w:hAnsi="Arial" w:cs="Arial"/>
@@ -375,23 +466,9 @@
                 <w:szCs w:val="20"/>
                 <w:lang w:eastAsia="es-CO"/>
               </w:rPr>
-              <w:t xml:space="preserve">O(1) </w:t>
-            </w:r>
-          </w:p>
-        </w:tc>
-      </w:tr>
-      <w:tr>
-        <w:tc>
-          <w:tcPr>
-            <w:tcW w:w="5070" w:type="dxa"/>
-          </w:tcPr>
-          <w:p>
-            <w:pPr>
-              <w:rPr>
-                <w:b/>
-                <w:bCs/>
-              </w:rPr>
-            </w:pPr>
+              <w:t>Probing</w:t>
+            </w:r>
+            <w:proofErr w:type="spellEnd"/>
             <w:r>
               <w:rPr>
                 <w:rFonts w:ascii="Arial" w:eastAsia="Times New Roman" w:hAnsi="Arial" w:cs="Arial"/>
@@ -399,7 +476,7 @@
                 <w:szCs w:val="20"/>
                 <w:lang w:eastAsia="es-CO"/>
               </w:rPr>
-              <w:t>Paso 3: Se crea la lista vacía de filtrados y se inicializa el acumulador del monto</w:t>
+              <w:t xml:space="preserve"> y se obtiene la lista de pedidos de ese mes</w:t>
             </w:r>
           </w:p>
         </w:tc>
@@ -421,7 +498,7 @@
                 <w:szCs w:val="20"/>
                 <w:lang w:eastAsia="es-CO"/>
               </w:rPr>
-              <w:t>O(1)</w:t>
+              <w:t xml:space="preserve">O(1) </w:t>
             </w:r>
           </w:p>
         </w:tc>
@@ -445,8 +522,21 @@
                 <w:szCs w:val="20"/>
                 <w:lang w:eastAsia="es-CO"/>
               </w:rPr>
-              <w:t>Paso 4: Se recorren los m pedidos del mes</w:t>
-            </w:r>
+              <w:t>Paso 3: Se crea la lista vacía de filtrados y se inicializa el acumulador del monto</w:t>
+            </w:r>
+          </w:p>
+        </w:tc>
+        <w:tc>
+          <w:tcPr>
+            <w:tcW w:w="4275" w:type="dxa"/>
+          </w:tcPr>
+          <w:p>
+            <w:pPr>
+              <w:rPr>
+                <w:b/>
+                <w:bCs/>
+              </w:rPr>
+            </w:pPr>
             <w:r>
               <w:rPr>
                 <w:rFonts w:ascii="Arial" w:eastAsia="Times New Roman" w:hAnsi="Arial" w:cs="Arial"/>
@@ -454,8 +544,23 @@
                 <w:szCs w:val="20"/>
                 <w:lang w:eastAsia="es-CO"/>
               </w:rPr>
-              <w:t xml:space="preserve">, se </w:t>
-            </w:r>
+              <w:t>O(1)</w:t>
+            </w:r>
+          </w:p>
+        </w:tc>
+      </w:tr>
+      <w:tr>
+        <w:tc>
+          <w:tcPr>
+            <w:tcW w:w="5070" w:type="dxa"/>
+          </w:tcPr>
+          <w:p>
+            <w:pPr>
+              <w:rPr>
+                <w:b/>
+                <w:bCs/>
+              </w:rPr>
+            </w:pPr>
             <w:r>
               <w:rPr>
                 <w:rFonts w:ascii="Arial" w:eastAsia="Times New Roman" w:hAnsi="Arial" w:cs="Arial"/>
@@ -463,21 +568,8 @@
                 <w:szCs w:val="20"/>
                 <w:lang w:eastAsia="es-CO"/>
               </w:rPr>
-              <w:t>lee el descuento, se compara con el rango y, si cumple, se agrega al final de filtrados y se suma su Amount</w:t>
-            </w:r>
-          </w:p>
-        </w:tc>
-        <w:tc>
-          <w:tcPr>
-            <w:tcW w:w="4275" w:type="dxa"/>
-          </w:tcPr>
-          <w:p>
-            <w:pPr>
-              <w:rPr>
-                <w:b/>
-                <w:bCs/>
-              </w:rPr>
-            </w:pPr>
+              <w:t>Paso 4: Se recorren los m pedidos del mes</w:t>
+            </w:r>
             <w:r>
               <w:rPr>
                 <w:rFonts w:ascii="Arial" w:eastAsia="Times New Roman" w:hAnsi="Arial" w:cs="Arial"/>
@@ -485,7 +577,7 @@
                 <w:szCs w:val="20"/>
                 <w:lang w:eastAsia="es-CO"/>
               </w:rPr>
-              <w:t>O(m)</w:t>
+              <w:t xml:space="preserve">, se </w:t>
             </w:r>
             <w:r>
               <w:rPr>
@@ -494,23 +586,9 @@
                 <w:szCs w:val="20"/>
                 <w:lang w:eastAsia="es-CO"/>
               </w:rPr>
-              <w:t>, donde m = pedidos filtrados del mes</w:t>
-            </w:r>
-          </w:p>
-        </w:tc>
-      </w:tr>
-      <w:tr>
-        <w:tc>
-          <w:tcPr>
-            <w:tcW w:w="5070" w:type="dxa"/>
-          </w:tcPr>
-          <w:p>
-            <w:pPr>
-              <w:rPr>
-                <w:b/>
-                <w:bCs/>
-              </w:rPr>
-            </w:pPr>
+              <w:t xml:space="preserve">lee el descuento, se compara con el rango y, si cumple, se agrega al final de filtrados y se suma su </w:t>
+            </w:r>
+            <w:proofErr w:type="spellStart"/>
             <w:r>
               <w:rPr>
                 <w:rFonts w:ascii="Arial" w:eastAsia="Times New Roman" w:hAnsi="Arial" w:cs="Arial"/>
@@ -518,8 +596,9 @@
                 <w:szCs w:val="20"/>
                 <w:lang w:eastAsia="es-CO"/>
               </w:rPr>
-              <w:t>Paso 5: Se arma el diccionario de resultado con el total y el monto acumulado</w:t>
-            </w:r>
+              <w:t>Amount</w:t>
+            </w:r>
+            <w:proofErr w:type="spellEnd"/>
           </w:p>
         </w:tc>
         <w:tc>
@@ -540,23 +619,8 @@
                 <w:szCs w:val="20"/>
                 <w:lang w:eastAsia="es-CO"/>
               </w:rPr>
-              <w:t>O(1)</w:t>
-            </w:r>
-          </w:p>
-        </w:tc>
-      </w:tr>
-      <w:tr>
-        <w:tc>
-          <w:tcPr>
-            <w:tcW w:w="5070" w:type="dxa"/>
-          </w:tcPr>
-          <w:p>
-            <w:pPr>
-              <w:rPr>
-                <w:b/>
-                <w:bCs/>
-              </w:rPr>
-            </w:pPr>
+              <w:t>O(m)</w:t>
+            </w:r>
             <w:r>
               <w:rPr>
                 <w:rFonts w:ascii="Arial" w:eastAsia="Times New Roman" w:hAnsi="Arial" w:cs="Arial"/>
@@ -564,22 +628,44 @@
                 <w:szCs w:val="20"/>
                 <w:lang w:eastAsia="es-CO"/>
               </w:rPr>
-              <w:t>Paso 6: Se recorren los pedidos filtrados para sumar Price_per_Box y Boxes_Shipped</w:t>
-            </w:r>
-          </w:p>
-        </w:tc>
-        <w:tc>
-          <w:tcPr>
-            <w:tcW w:w="4275" w:type="dxa"/>
+              <w:t>, donde m = pedidos filtrados del mes</w:t>
+            </w:r>
+          </w:p>
+        </w:tc>
+      </w:tr>
+      <w:tr>
+        <w:tc>
+          <w:tcPr>
+            <w:tcW w:w="5070" w:type="dxa"/>
           </w:tcPr>
           <w:p>
             <w:pPr>
+              <w:rPr>
+                <w:b/>
+                <w:bCs/>
+              </w:rPr>
+            </w:pPr>
+            <w:r>
               <w:rPr>
                 <w:rFonts w:ascii="Arial" w:eastAsia="Times New Roman" w:hAnsi="Arial" w:cs="Arial"/>
                 <w:sz w:val="20"/>
                 <w:szCs w:val="20"/>
                 <w:lang w:eastAsia="es-CO"/>
               </w:rPr>
+              <w:t>Paso 5: Se arma el diccionario de resultado con el total y el monto acumulado</w:t>
+            </w:r>
+          </w:p>
+        </w:tc>
+        <w:tc>
+          <w:tcPr>
+            <w:tcW w:w="4275" w:type="dxa"/>
+          </w:tcPr>
+          <w:p>
+            <w:pPr>
+              <w:rPr>
+                <w:b/>
+                <w:bCs/>
+              </w:rPr>
             </w:pPr>
             <w:r>
               <w:rPr>
@@ -588,8 +674,23 @@
                 <w:szCs w:val="20"/>
                 <w:lang w:eastAsia="es-CO"/>
               </w:rPr>
-              <w:t>O(</w:t>
-            </w:r>
+              <w:t>O(1)</w:t>
+            </w:r>
+          </w:p>
+        </w:tc>
+      </w:tr>
+      <w:tr>
+        <w:tc>
+          <w:tcPr>
+            <w:tcW w:w="5070" w:type="dxa"/>
+          </w:tcPr>
+          <w:p>
+            <w:pPr>
+              <w:rPr>
+                <w:b/>
+                <w:bCs/>
+              </w:rPr>
+            </w:pPr>
             <w:r>
               <w:rPr>
                 <w:rFonts w:ascii="Arial" w:eastAsia="Times New Roman" w:hAnsi="Arial" w:cs="Arial"/>
@@ -597,8 +698,9 @@
                 <w:szCs w:val="20"/>
                 <w:lang w:eastAsia="es-CO"/>
               </w:rPr>
-              <w:t>n</w:t>
-            </w:r>
+              <w:t xml:space="preserve">Paso 6: Se recorren los pedidos filtrados para sumar </w:t>
+            </w:r>
+            <w:proofErr w:type="spellStart"/>
             <w:r>
               <w:rPr>
                 <w:rFonts w:ascii="Arial" w:eastAsia="Times New Roman" w:hAnsi="Arial" w:cs="Arial"/>
@@ -606,8 +708,9 @@
                 <w:szCs w:val="20"/>
                 <w:lang w:eastAsia="es-CO"/>
               </w:rPr>
-              <w:t>)</w:t>
-            </w:r>
+              <w:t>Price_per_Box</w:t>
+            </w:r>
+            <w:proofErr w:type="spellEnd"/>
             <w:r>
               <w:rPr>
                 <w:rFonts w:ascii="Arial" w:eastAsia="Times New Roman" w:hAnsi="Arial" w:cs="Arial"/>
@@ -615,6 +718,68 @@
                 <w:szCs w:val="20"/>
                 <w:lang w:eastAsia="es-CO"/>
               </w:rPr>
+              <w:t xml:space="preserve"> y </w:t>
+            </w:r>
+            <w:proofErr w:type="spellStart"/>
+            <w:r>
+              <w:rPr>
+                <w:rFonts w:ascii="Arial" w:eastAsia="Times New Roman" w:hAnsi="Arial" w:cs="Arial"/>
+                <w:sz w:val="20"/>
+                <w:szCs w:val="20"/>
+                <w:lang w:eastAsia="es-CO"/>
+              </w:rPr>
+              <w:t>Boxes_Shipped</w:t>
+            </w:r>
+            <w:proofErr w:type="spellEnd"/>
+          </w:p>
+        </w:tc>
+        <w:tc>
+          <w:tcPr>
+            <w:tcW w:w="4275" w:type="dxa"/>
+          </w:tcPr>
+          <w:p>
+            <w:pPr>
+              <w:rPr>
+                <w:rFonts w:ascii="Arial" w:eastAsia="Times New Roman" w:hAnsi="Arial" w:cs="Arial"/>
+                <w:sz w:val="20"/>
+                <w:szCs w:val="20"/>
+                <w:lang w:eastAsia="es-CO"/>
+              </w:rPr>
+            </w:pPr>
+            <w:r>
+              <w:rPr>
+                <w:rFonts w:ascii="Arial" w:eastAsia="Times New Roman" w:hAnsi="Arial" w:cs="Arial"/>
+                <w:sz w:val="20"/>
+                <w:szCs w:val="20"/>
+                <w:lang w:eastAsia="es-CO"/>
+              </w:rPr>
+              <w:t>O(</w:t>
+            </w:r>
+            <w:r>
+              <w:rPr>
+                <w:rFonts w:ascii="Arial" w:eastAsia="Times New Roman" w:hAnsi="Arial" w:cs="Arial"/>
+                <w:sz w:val="20"/>
+                <w:szCs w:val="20"/>
+                <w:lang w:eastAsia="es-CO"/>
+              </w:rPr>
+              <w:t>n</w:t>
+            </w:r>
+            <w:r>
+              <w:rPr>
+                <w:rFonts w:ascii="Arial" w:eastAsia="Times New Roman" w:hAnsi="Arial" w:cs="Arial"/>
+                <w:sz w:val="20"/>
+                <w:szCs w:val="20"/>
+                <w:lang w:eastAsia="es-CO"/>
+              </w:rPr>
+              <w:t>)</w:t>
+            </w:r>
+            <w:r>
+              <w:rPr>
+                <w:rFonts w:ascii="Arial" w:eastAsia="Times New Roman" w:hAnsi="Arial" w:cs="Arial"/>
+                <w:sz w:val="20"/>
+                <w:szCs w:val="20"/>
+                <w:lang w:eastAsia="es-CO"/>
+              </w:rPr>
               <w:t xml:space="preserve">, donde n = pedidos filtrados para </w:t>
             </w:r>
           </w:p>
@@ -626,6 +791,7 @@
                 <w:lang w:val="en-US"/>
               </w:rPr>
             </w:pPr>
+            <w:proofErr w:type="spellStart"/>
             <w:r>
               <w:rPr>
                 <w:rFonts w:ascii="Arial" w:eastAsia="Times New Roman" w:hAnsi="Arial" w:cs="Arial"/>
@@ -633,8 +799,9 @@
                 <w:szCs w:val="20"/>
                 <w:lang w:val="en-US" w:eastAsia="es-CO"/>
               </w:rPr>
-              <w:t>Price_per_Box y Boxes_Shipped</w:t>
-            </w:r>
+              <w:t>Price_per_Box</w:t>
+            </w:r>
+            <w:proofErr w:type="spellEnd"/>
             <w:r>
               <w:rPr>
                 <w:rFonts w:ascii="Arial" w:eastAsia="Times New Roman" w:hAnsi="Arial" w:cs="Arial"/>
@@ -642,6 +809,26 @@
                 <w:szCs w:val="20"/>
                 <w:lang w:val="en-US" w:eastAsia="es-CO"/>
               </w:rPr>
+              <w:t xml:space="preserve"> y </w:t>
+            </w:r>
+            <w:proofErr w:type="spellStart"/>
+            <w:r>
+              <w:rPr>
+                <w:rFonts w:ascii="Arial" w:eastAsia="Times New Roman" w:hAnsi="Arial" w:cs="Arial"/>
+                <w:sz w:val="20"/>
+                <w:szCs w:val="20"/>
+                <w:lang w:val="en-US" w:eastAsia="es-CO"/>
+              </w:rPr>
+              <w:t>Boxes_Shipped</w:t>
+            </w:r>
+            <w:proofErr w:type="spellEnd"/>
+            <w:r>
+              <w:rPr>
+                <w:rFonts w:ascii="Arial" w:eastAsia="Times New Roman" w:hAnsi="Arial" w:cs="Arial"/>
+                <w:sz w:val="20"/>
+                <w:szCs w:val="20"/>
+                <w:lang w:val="en-US" w:eastAsia="es-CO"/>
+              </w:rPr>
               <w:t xml:space="preserve"> </w:t>
             </w:r>
           </w:p>
@@ -707,8 +894,9 @@
                 <w:lang w:eastAsia="es-CO"/>
               </w:rPr>
               <w:lastRenderedPageBreak/>
-              <w:t xml:space="preserve">Paso 8: Se ordenan los filtrados con Merge Sort </w:t>
-            </w:r>
+              <w:t xml:space="preserve">Paso 8: Se ordenan los filtrados con </w:t>
+            </w:r>
+            <w:proofErr w:type="spellStart"/>
             <w:r>
               <w:rPr>
                 <w:rFonts w:ascii="Arial" w:eastAsia="Times New Roman" w:hAnsi="Arial" w:cs="Arial"/>
@@ -716,8 +904,9 @@
                 <w:szCs w:val="20"/>
                 <w:lang w:eastAsia="es-CO"/>
               </w:rPr>
-              <w:t xml:space="preserve">con el criterio </w:t>
-            </w:r>
+              <w:t>Merge</w:t>
+            </w:r>
+            <w:proofErr w:type="spellEnd"/>
             <w:r>
               <w:rPr>
                 <w:rFonts w:ascii="Arial" w:eastAsia="Times New Roman" w:hAnsi="Arial" w:cs="Arial"/>
@@ -725,7 +914,7 @@
                 <w:szCs w:val="20"/>
                 <w:lang w:eastAsia="es-CO"/>
               </w:rPr>
-              <w:t>Discount_Pct descendente,</w:t>
+              <w:t xml:space="preserve"> Sort </w:t>
             </w:r>
             <w:r>
               <w:rPr>
@@ -734,8 +923,9 @@
                 <w:szCs w:val="20"/>
                 <w:lang w:eastAsia="es-CO"/>
               </w:rPr>
-              <w:t xml:space="preserve"> si son iguales</w:t>
-            </w:r>
+              <w:t xml:space="preserve">con el criterio </w:t>
+            </w:r>
+            <w:proofErr w:type="spellStart"/>
             <w:r>
               <w:rPr>
                 <w:rFonts w:ascii="Arial" w:eastAsia="Times New Roman" w:hAnsi="Arial" w:cs="Arial"/>
@@ -743,8 +933,9 @@
                 <w:szCs w:val="20"/>
                 <w:lang w:eastAsia="es-CO"/>
               </w:rPr>
-              <w:t xml:space="preserve"> Amount descendente,</w:t>
-            </w:r>
+              <w:t>Discount_Pct</w:t>
+            </w:r>
+            <w:proofErr w:type="spellEnd"/>
             <w:r>
               <w:rPr>
                 <w:rFonts w:ascii="Arial" w:eastAsia="Times New Roman" w:hAnsi="Arial" w:cs="Arial"/>
@@ -752,7 +943,7 @@
                 <w:szCs w:val="20"/>
                 <w:lang w:eastAsia="es-CO"/>
               </w:rPr>
-              <w:t xml:space="preserve"> y si siguen siendo iguales</w:t>
+              <w:t xml:space="preserve"> descendente,</w:t>
             </w:r>
             <w:r>
               <w:rPr>
@@ -761,23 +952,18 @@
                 <w:szCs w:val="20"/>
                 <w:lang w:eastAsia="es-CO"/>
               </w:rPr>
-              <w:t xml:space="preserve"> luego Order_ID ascendente</w:t>
-            </w:r>
-          </w:p>
-        </w:tc>
-        <w:tc>
-          <w:tcPr>
-            <w:tcW w:w="4275" w:type="dxa"/>
-          </w:tcPr>
-          <w:p>
-            <w:pPr>
+              <w:t xml:space="preserve"> si son iguales</w:t>
+            </w:r>
+            <w:r>
               <w:rPr>
                 <w:rFonts w:ascii="Arial" w:eastAsia="Times New Roman" w:hAnsi="Arial" w:cs="Arial"/>
                 <w:sz w:val="20"/>
                 <w:szCs w:val="20"/>
                 <w:lang w:eastAsia="es-CO"/>
               </w:rPr>
-            </w:pPr>
+              <w:t xml:space="preserve"> </w:t>
+            </w:r>
+            <w:proofErr w:type="spellStart"/>
             <w:r>
               <w:rPr>
                 <w:rFonts w:ascii="Arial" w:eastAsia="Times New Roman" w:hAnsi="Arial" w:cs="Arial"/>
@@ -785,8 +971,9 @@
                 <w:szCs w:val="20"/>
                 <w:lang w:eastAsia="es-CO"/>
               </w:rPr>
-              <w:t>O</w:t>
-            </w:r>
+              <w:t>Amount</w:t>
+            </w:r>
+            <w:proofErr w:type="spellEnd"/>
             <w:r>
               <w:rPr>
                 <w:rFonts w:ascii="Arial" w:eastAsia="Times New Roman" w:hAnsi="Arial" w:cs="Arial"/>
@@ -794,7 +981,7 @@
                 <w:szCs w:val="20"/>
                 <w:lang w:eastAsia="es-CO"/>
               </w:rPr>
-              <w:t>(n log n</w:t>
+              <w:t xml:space="preserve"> descendente,</w:t>
             </w:r>
             <w:r>
               <w:rPr>
@@ -803,7 +990,7 @@
                 <w:szCs w:val="20"/>
                 <w:lang w:eastAsia="es-CO"/>
               </w:rPr>
-              <w:t>)</w:t>
+              <w:t xml:space="preserve"> y si siguen siendo iguales</w:t>
             </w:r>
             <w:r>
               <w:rPr>
@@ -812,8 +999,9 @@
                 <w:szCs w:val="20"/>
                 <w:lang w:eastAsia="es-CO"/>
               </w:rPr>
-              <w:t xml:space="preserve">, donde n = pedidos filtrados </w:t>
-            </w:r>
+              <w:t xml:space="preserve"> luego </w:t>
+            </w:r>
+            <w:proofErr w:type="spellStart"/>
             <w:r>
               <w:rPr>
                 <w:rFonts w:ascii="Arial" w:eastAsia="Times New Roman" w:hAnsi="Arial" w:cs="Arial"/>
@@ -821,6 +1009,76 @@
                 <w:szCs w:val="20"/>
                 <w:lang w:eastAsia="es-CO"/>
               </w:rPr>
+              <w:t>Order_ID</w:t>
+            </w:r>
+            <w:proofErr w:type="spellEnd"/>
+            <w:r>
+              <w:rPr>
+                <w:rFonts w:ascii="Arial" w:eastAsia="Times New Roman" w:hAnsi="Arial" w:cs="Arial"/>
+                <w:sz w:val="20"/>
+                <w:szCs w:val="20"/>
+                <w:lang w:eastAsia="es-CO"/>
+              </w:rPr>
+              <w:t xml:space="preserve"> ascendente</w:t>
+            </w:r>
+          </w:p>
+        </w:tc>
+        <w:tc>
+          <w:tcPr>
+            <w:tcW w:w="4275" w:type="dxa"/>
+          </w:tcPr>
+          <w:p>
+            <w:pPr>
+              <w:rPr>
+                <w:rFonts w:ascii="Arial" w:eastAsia="Times New Roman" w:hAnsi="Arial" w:cs="Arial"/>
+                <w:sz w:val="20"/>
+                <w:szCs w:val="20"/>
+                <w:lang w:eastAsia="es-CO"/>
+              </w:rPr>
+            </w:pPr>
+            <w:r>
+              <w:rPr>
+                <w:rFonts w:ascii="Arial" w:eastAsia="Times New Roman" w:hAnsi="Arial" w:cs="Arial"/>
+                <w:sz w:val="20"/>
+                <w:szCs w:val="20"/>
+                <w:lang w:eastAsia="es-CO"/>
+              </w:rPr>
+              <w:t>O</w:t>
+            </w:r>
+            <w:r>
+              <w:rPr>
+                <w:rFonts w:ascii="Arial" w:eastAsia="Times New Roman" w:hAnsi="Arial" w:cs="Arial"/>
+                <w:sz w:val="20"/>
+                <w:szCs w:val="20"/>
+                <w:lang w:eastAsia="es-CO"/>
+              </w:rPr>
+              <w:t>(n log n</w:t>
+            </w:r>
+            <w:r>
+              <w:rPr>
+                <w:rFonts w:ascii="Arial" w:eastAsia="Times New Roman" w:hAnsi="Arial" w:cs="Arial"/>
+                <w:sz w:val="20"/>
+                <w:szCs w:val="20"/>
+                <w:lang w:eastAsia="es-CO"/>
+              </w:rPr>
+              <w:t>)</w:t>
+            </w:r>
+            <w:r>
+              <w:rPr>
+                <w:rFonts w:ascii="Arial" w:eastAsia="Times New Roman" w:hAnsi="Arial" w:cs="Arial"/>
+                <w:sz w:val="20"/>
+                <w:szCs w:val="20"/>
+                <w:lang w:eastAsia="es-CO"/>
+              </w:rPr>
+              <w:t xml:space="preserve">, donde n = pedidos filtrados </w:t>
+            </w:r>
+            <w:r>
+              <w:rPr>
+                <w:rFonts w:ascii="Arial" w:eastAsia="Times New Roman" w:hAnsi="Arial" w:cs="Arial"/>
+                <w:sz w:val="20"/>
+                <w:szCs w:val="20"/>
+                <w:lang w:eastAsia="es-CO"/>
+              </w:rPr>
               <w:t xml:space="preserve">para </w:t>
             </w:r>
           </w:p>
@@ -830,6 +1088,7 @@
                 <w:lang w:val="en-US"/>
               </w:rPr>
             </w:pPr>
+            <w:proofErr w:type="spellStart"/>
             <w:r>
               <w:rPr>
                 <w:rFonts w:ascii="Arial" w:eastAsia="Times New Roman" w:hAnsi="Arial" w:cs="Arial"/>
@@ -837,8 +1096,29 @@
                 <w:szCs w:val="20"/>
                 <w:lang w:val="en-US" w:eastAsia="es-CO"/>
               </w:rPr>
-              <w:t>Price_per_Box y Boxes_Shipped</w:t>
-            </w:r>
+              <w:t>Price_per_Box</w:t>
+            </w:r>
+            <w:proofErr w:type="spellEnd"/>
+            <w:r>
+              <w:rPr>
+                <w:rFonts w:ascii="Arial" w:eastAsia="Times New Roman" w:hAnsi="Arial" w:cs="Arial"/>
+                <w:sz w:val="20"/>
+                <w:szCs w:val="20"/>
+                <w:lang w:val="en-US" w:eastAsia="es-CO"/>
+              </w:rPr>
+              <w:t xml:space="preserve"> y </w:t>
+            </w:r>
+            <w:proofErr w:type="spellStart"/>
+            <w:r>
+              <w:rPr>
+                <w:rFonts w:ascii="Arial" w:eastAsia="Times New Roman" w:hAnsi="Arial" w:cs="Arial"/>
+                <w:sz w:val="20"/>
+                <w:szCs w:val="20"/>
+                <w:lang w:val="en-US" w:eastAsia="es-CO"/>
+              </w:rPr>
+              <w:t>Boxes_Shipped</w:t>
+            </w:r>
+            <w:proofErr w:type="spellEnd"/>
           </w:p>
         </w:tc>
       </w:tr>
@@ -855,15 +1135,9 @@
                 <w:szCs w:val="20"/>
                 <w:lang w:eastAsia="es-CO"/>
               </w:rPr>
-              <w:t xml:space="preserve">Paso 9: Si hay más de 20, se toman los primeros 10 y los últimos 10 con sub_list. </w:t>
-            </w:r>
-          </w:p>
-        </w:tc>
-        <w:tc>
-          <w:tcPr>
-            <w:tcW w:w="4275" w:type="dxa"/>
-          </w:tcPr>
-          <w:p>
+              <w:t xml:space="preserve">Paso 9: Si hay más de 20, se toman los primeros 10 y los últimos 10 con </w:t>
+            </w:r>
+            <w:proofErr w:type="spellStart"/>
             <w:r>
               <w:rPr>
                 <w:rFonts w:ascii="Arial" w:eastAsia="Times New Roman" w:hAnsi="Arial" w:cs="Arial"/>
@@ -871,17 +1145,9 @@
                 <w:szCs w:val="20"/>
                 <w:lang w:eastAsia="es-CO"/>
               </w:rPr>
-              <w:t>O(1)</w:t>
-            </w:r>
-          </w:p>
-        </w:tc>
-      </w:tr>
-      <w:tr>
-        <w:tc>
-          <w:tcPr>
-            <w:tcW w:w="5070" w:type="dxa"/>
-          </w:tcPr>
-          <w:p>
+              <w:t>sub_list</w:t>
+            </w:r>
+            <w:proofErr w:type="spellEnd"/>
             <w:r>
               <w:rPr>
                 <w:rFonts w:ascii="Arial" w:eastAsia="Times New Roman" w:hAnsi="Arial" w:cs="Arial"/>
@@ -889,7 +1155,7 @@
                 <w:szCs w:val="20"/>
                 <w:lang w:eastAsia="es-CO"/>
               </w:rPr>
-              <w:t>Paso 10: Se detiene el cronómetro y se calcula el tiempo</w:t>
+              <w:t xml:space="preserve">. </w:t>
             </w:r>
           </w:p>
         </w:tc>
@@ -916,6 +1182,40 @@
             <w:tcW w:w="5070" w:type="dxa"/>
           </w:tcPr>
           <w:p>
+            <w:r>
+              <w:rPr>
+                <w:rFonts w:ascii="Arial" w:eastAsia="Times New Roman" w:hAnsi="Arial" w:cs="Arial"/>
+                <w:sz w:val="20"/>
+                <w:szCs w:val="20"/>
+                <w:lang w:eastAsia="es-CO"/>
+              </w:rPr>
+              <w:t>Paso 10: Se detiene el cronómetro y se calcula el tiempo</w:t>
+            </w:r>
+          </w:p>
+        </w:tc>
+        <w:tc>
+          <w:tcPr>
+            <w:tcW w:w="4275" w:type="dxa"/>
+          </w:tcPr>
+          <w:p>
+            <w:r>
+              <w:rPr>
+                <w:rFonts w:ascii="Arial" w:eastAsia="Times New Roman" w:hAnsi="Arial" w:cs="Arial"/>
+                <w:sz w:val="20"/>
+                <w:szCs w:val="20"/>
+                <w:lang w:eastAsia="es-CO"/>
+              </w:rPr>
+              <w:t>O(1)</w:t>
+            </w:r>
+          </w:p>
+        </w:tc>
+      </w:tr>
+      <w:tr>
+        <w:tc>
+          <w:tcPr>
+            <w:tcW w:w="5070" w:type="dxa"/>
+          </w:tcPr>
+          <w:p>
             <w:pPr>
               <w:rPr>
                 <w:b/>
@@ -1015,7 +1315,7 @@
     </w:p>
     <w:p>
       <w:pPr>
-        <w:pStyle w:val="Ttulo2"/>
+        <w:pStyle w:val="Heading2"/>
         <w:rPr>
           <w:b/>
           <w:bCs/>
@@ -1042,7 +1342,7 @@
     </w:p>
     <w:p>
       <w:pPr>
-        <w:pStyle w:val="Ttulo1"/>
+        <w:pStyle w:val="Heading1"/>
         <w:rPr>
           <w:b/>
           <w:bCs/>
@@ -1063,7 +1363,7 @@
     </w:p>
     <w:p>
       <w:pPr>
-        <w:pStyle w:val="Ttulo2"/>
+        <w:pStyle w:val="Heading2"/>
         <w:rPr>
           <w:b/>
           <w:bCs/>
@@ -1084,7 +1384,7 @@
     </w:p>
     <w:tbl>
       <w:tblPr>
-        <w:tblStyle w:val="Tablaconcuadrcula"/>
+        <w:tblStyle w:val="TableGrid"/>
         <w:tblW w:w="9360" w:type="dxa"/>
         <w:tblLayout w:type="fixed"/>
         <w:tblLook w:val="06A0" w:firstRow="1" w:lastRow="0" w:firstColumn="1" w:lastColumn="0" w:noHBand="1" w:noVBand="1"/>
@@ -1119,9 +1419,27 @@
             <w:tcW w:w="6300" w:type="dxa"/>
           </w:tcPr>
           <w:p>
-            <w:r>
-              <w:t>Parámetros necesarios para resolver el requerimiento.</w:t>
-            </w:r>
+            <w:proofErr w:type="spellStart"/>
+            <w:r>
+              <w:t>Catalog</w:t>
+            </w:r>
+            <w:proofErr w:type="spellEnd"/>
+            <w:r>
+              <w:t xml:space="preserve">, país, </w:t>
+            </w:r>
+            <w:proofErr w:type="spellStart"/>
+            <w:r>
+              <w:t>min_cajas</w:t>
+            </w:r>
+            <w:proofErr w:type="spellEnd"/>
+            <w:r>
+              <w:t xml:space="preserve">, </w:t>
+            </w:r>
+            <w:proofErr w:type="spellStart"/>
+            <w:r>
+              <w:t>max_cajas</w:t>
+            </w:r>
+            <w:proofErr w:type="spellEnd"/>
           </w:p>
         </w:tc>
       </w:tr>
@@ -1152,7 +1470,87 @@
           </w:tcPr>
           <w:p>
             <w:r>
-              <w:t>Respuesta esperada del algoritmo.</w:t>
+              <w:t xml:space="preserve">Un diccionario con el tiempo de ejecución, número total de pedidos que pasaron el filtro, número de productos diferentes presentes en el resultado, promedios de </w:t>
+            </w:r>
+            <w:proofErr w:type="spellStart"/>
+            <w:r>
+              <w:t>marketing_spend</w:t>
+            </w:r>
+            <w:proofErr w:type="spellEnd"/>
+            <w:r>
+              <w:t xml:space="preserve"> y </w:t>
+            </w:r>
+            <w:proofErr w:type="spellStart"/>
+            <w:r>
+              <w:t>amount</w:t>
+            </w:r>
+            <w:proofErr w:type="spellEnd"/>
+            <w:r>
+              <w:t xml:space="preserve">, producto más frecuente, entre los pedidos filtrados y número de pedidos de este producto, para cada pedido que cumple la consulta, mostrar ordenado ascendentemente por </w:t>
+            </w:r>
+            <w:proofErr w:type="spellStart"/>
+            <w:r>
+              <w:t>Boxes_Shipped</w:t>
+            </w:r>
+            <w:proofErr w:type="spellEnd"/>
+            <w:r>
+              <w:t xml:space="preserve"> con lo siguiente: </w:t>
+            </w:r>
+            <w:proofErr w:type="spellStart"/>
+            <w:r>
+              <w:t>Order_ID</w:t>
+            </w:r>
+            <w:proofErr w:type="spellEnd"/>
+            <w:r>
+              <w:t xml:space="preserve">, </w:t>
+            </w:r>
+            <w:proofErr w:type="spellStart"/>
+            <w:r>
+              <w:t>Product</w:t>
+            </w:r>
+            <w:proofErr w:type="spellEnd"/>
+            <w:r>
+              <w:t xml:space="preserve">, Channel, </w:t>
+            </w:r>
+            <w:proofErr w:type="spellStart"/>
+            <w:r>
+              <w:t>Order_date</w:t>
+            </w:r>
+            <w:proofErr w:type="spellEnd"/>
+            <w:r>
+              <w:t xml:space="preserve">, </w:t>
+            </w:r>
+            <w:proofErr w:type="spellStart"/>
+            <w:r>
+              <w:t>Boxes_Shipped</w:t>
+            </w:r>
+            <w:proofErr w:type="spellEnd"/>
+            <w:r>
+              <w:t xml:space="preserve">, </w:t>
+            </w:r>
+            <w:proofErr w:type="spellStart"/>
+            <w:r>
+              <w:t>Price_per_box</w:t>
+            </w:r>
+            <w:proofErr w:type="spellEnd"/>
+            <w:r>
+              <w:t xml:space="preserve">, </w:t>
+            </w:r>
+            <w:proofErr w:type="spellStart"/>
+            <w:r>
+              <w:t>Marketing_Spend</w:t>
+            </w:r>
+            <w:proofErr w:type="spellEnd"/>
+            <w:r>
+              <w:t xml:space="preserve"> y el </w:t>
+            </w:r>
+            <w:proofErr w:type="spellStart"/>
+            <w:r>
+              <w:t>amount</w:t>
+            </w:r>
+            <w:proofErr w:type="spellEnd"/>
+            <w:r>
+              <w:t xml:space="preserve">. </w:t>
             </w:r>
           </w:p>
         </w:tc>
@@ -1184,16 +1582,37 @@
           </w:tcPr>
           <w:p>
             <w:r>
-              <w:t>Si se implementó y quien lo hizo.</w:t>
-            </w:r>
-          </w:p>
+              <w:t>Implementado por Juan Lesmes</w:t>
+            </w:r>
+          </w:p>
+        </w:tc>
+      </w:tr>
+      <w:tr>
+        <w:tc>
+          <w:tcPr>
+            <w:tcW w:w="3060" w:type="dxa"/>
+          </w:tcPr>
+          <w:p>
+            <w:pPr>
+              <w:rPr>
+                <w:b/>
+                <w:bCs/>
+              </w:rPr>
+            </w:pPr>
+          </w:p>
+        </w:tc>
+        <w:tc>
+          <w:tcPr>
+            <w:tcW w:w="6300" w:type="dxa"/>
+          </w:tcPr>
+          <w:p/>
         </w:tc>
       </w:tr>
     </w:tbl>
     <w:p/>
     <w:p>
       <w:pPr>
-        <w:pStyle w:val="Ttulo2"/>
+        <w:pStyle w:val="Heading2"/>
         <w:rPr>
           <w:b/>
           <w:bCs/>
@@ -1214,7 +1633,7 @@
     </w:p>
     <w:tbl>
       <w:tblPr>
-        <w:tblStyle w:val="Tablaconcuadrcula"/>
+        <w:tblStyle w:val="TableGrid"/>
         <w:tblW w:w="0" w:type="auto"/>
         <w:tblLayout w:type="fixed"/>
         <w:tblLook w:val="06A0" w:firstRow="1" w:lastRow="0" w:firstColumn="1" w:lastColumn="0" w:noHBand="1" w:noVBand="1"/>
@@ -1266,13 +1685,16 @@
         </w:tc>
       </w:tr>
       <w:tr>
+        <w:trPr>
+          <w:trHeight w:val="307"/>
+        </w:trPr>
         <w:tc>
           <w:tcPr>
             <w:tcW w:w="5070" w:type="dxa"/>
           </w:tcPr>
           <w:p>
             <w:r>
-              <w:t>Paso 1</w:t>
+              <w:t>Acceso al país en la tabla hash.</w:t>
             </w:r>
           </w:p>
         </w:tc>
@@ -1282,7 +1704,13 @@
           </w:tcPr>
           <w:p>
             <w:r>
-              <w:t>O(...)</w:t>
+              <w:t>O(</w:t>
+            </w:r>
+            <w:r>
+              <w:t>1</w:t>
+            </w:r>
+            <w:r>
+              <w:t>)</w:t>
             </w:r>
           </w:p>
         </w:tc>
@@ -1294,7 +1722,7 @@
           </w:tcPr>
           <w:p>
             <w:r>
-              <w:t xml:space="preserve">Paso 2 </w:t>
+              <w:t>Filtrar por rango de cajas y acumular</w:t>
             </w:r>
           </w:p>
         </w:tc>
@@ -1304,7 +1732,13 @@
           </w:tcPr>
           <w:p>
             <w:r>
-              <w:t>O(...)</w:t>
+              <w:t>O(</w:t>
+            </w:r>
+            <w:r>
+              <w:t>a</w:t>
+            </w:r>
+            <w:r>
+              <w:t>)</w:t>
             </w:r>
           </w:p>
         </w:tc>
@@ -1316,7 +1750,7 @@
           </w:tcPr>
           <w:p>
             <w:r>
-              <w:t>Paso ….</w:t>
+              <w:t>Sacar producto más frecuente y promedios</w:t>
             </w:r>
           </w:p>
         </w:tc>
@@ -1326,7 +1760,10 @@
           </w:tcPr>
           <w:p>
             <w:r>
-              <w:t>O(...)</w:t>
+              <w:t>O(</w:t>
+            </w:r>
+            <w:r>
+              <w:t>b)</w:t>
             </w:r>
           </w:p>
         </w:tc>
@@ -1337,6 +1774,70 @@
             <w:tcW w:w="5070" w:type="dxa"/>
           </w:tcPr>
           <w:p>
+            <w:r>
+              <w:t xml:space="preserve">Ordenar con </w:t>
+            </w:r>
+            <w:proofErr w:type="spellStart"/>
+            <w:r>
+              <w:t>merge_sort</w:t>
+            </w:r>
+            <w:proofErr w:type="spellEnd"/>
+            <w:r>
+              <w:t>()</w:t>
+            </w:r>
+          </w:p>
+        </w:tc>
+        <w:tc>
+          <w:tcPr>
+            <w:tcW w:w="4275" w:type="dxa"/>
+          </w:tcPr>
+          <w:p>
+            <w:r>
+              <w:t>O(</w:t>
+            </w:r>
+            <w:r>
+              <w:t>m log m</w:t>
+            </w:r>
+            <w:r>
+              <w:t>)</w:t>
+            </w:r>
+          </w:p>
+        </w:tc>
+      </w:tr>
+      <w:tr>
+        <w:tc>
+          <w:tcPr>
+            <w:tcW w:w="5070" w:type="dxa"/>
+          </w:tcPr>
+          <w:p>
+            <w:r>
+              <w:t>Armar el resultado final (primeros 10 y último 10)</w:t>
+            </w:r>
+          </w:p>
+        </w:tc>
+        <w:tc>
+          <w:tcPr>
+            <w:tcW w:w="4275" w:type="dxa"/>
+          </w:tcPr>
+          <w:p>
+            <w:r>
+              <w:t>O(</w:t>
+            </w:r>
+            <w:r>
+              <w:t>1</w:t>
+            </w:r>
+            <w:r>
+              <w:t>)</w:t>
+            </w:r>
+          </w:p>
+        </w:tc>
+      </w:tr>
+      <w:tr>
+        <w:tc>
+          <w:tcPr>
+            <w:tcW w:w="5070" w:type="dxa"/>
+          </w:tcPr>
+          <w:p>
             <w:pPr>
               <w:rPr>
                 <w:b/>
@@ -1376,7 +1877,25 @@
                 <w:i/>
                 <w:iCs/>
               </w:rPr>
-              <w:t>O(...)</w:t>
+              <w:t>O(</w:t>
+            </w:r>
+            <w:r>
+              <w:rPr>
+                <w:b/>
+                <w:bCs/>
+                <w:i/>
+                <w:iCs/>
+              </w:rPr>
+              <w:t>a + m log m</w:t>
+            </w:r>
+            <w:r>
+              <w:rPr>
+                <w:b/>
+                <w:bCs/>
+                <w:i/>
+                <w:iCs/>
+              </w:rPr>
+              <w:t>)</w:t>
             </w:r>
           </w:p>
         </w:tc>
@@ -1391,7 +1910,7 @@
     </w:p>
     <w:p>
       <w:pPr>
-        <w:pStyle w:val="Ttulo2"/>
+        <w:pStyle w:val="Heading2"/>
         <w:rPr>
           <w:b/>
           <w:bCs/>
@@ -1402,17 +1921,213 @@
           <w:b/>
           <w:bCs/>
         </w:rPr>
+        <w:lastRenderedPageBreak/>
         <w:t>Análisis</w:t>
       </w:r>
     </w:p>
     <w:p>
       <w:r>
-        <w:t>Análisis de resultados de la implementación, tener cuenta las pruebas realizadas y el analisis de complejidad.</w:t>
+        <w:t xml:space="preserve">Análisis de resultados de la implementación, tener cuenta las pruebas realizadas y el </w:t>
+      </w:r>
+      <w:r>
+        <w:t>análisis</w:t>
+      </w:r>
+      <w:r>
+        <w:t xml:space="preserve"> de complejidad.</w:t>
       </w:r>
     </w:p>
+    <w:p/>
     <w:p>
-      <w:pPr>
-        <w:pStyle w:val="Ttulo1"/>
+      <w:r>
+        <w:t>El Req2 tiene una complejidad de O(</w:t>
+      </w:r>
+      <w:r>
+        <w:t>a</w:t>
+      </w:r>
+      <w:r>
+        <w:t xml:space="preserve"> + m log m), donde </w:t>
+      </w:r>
+      <w:r>
+        <w:t>a</w:t>
+      </w:r>
+      <w:r>
+        <w:t xml:space="preserve"> es el número de pedidos del país </w:t>
+      </w:r>
+      <w:r>
+        <w:t>busca</w:t>
+      </w:r>
+      <w:r>
+        <w:t>do</w:t>
+      </w:r>
+      <w:r>
+        <w:t xml:space="preserve"> y m los pedidos que cumplen el rango de cajas. El acceso al país en la tabla hash es O(1) promedio, el filtrado y la acumulación recorren solo los </w:t>
+      </w:r>
+      <w:r>
+        <w:rPr>
+          <w:b/>
+          <w:bCs/>
+        </w:rPr>
+        <w:t>a</w:t>
+      </w:r>
+      <w:r>
+        <w:t xml:space="preserve"> pedidos de ese país (nunca la lista principal</w:t>
+      </w:r>
+      <w:r>
+        <w:t>, usamos la filtrada</w:t>
+      </w:r>
+      <w:r>
+        <w:t xml:space="preserve">), y el </w:t>
+      </w:r>
+      <w:proofErr w:type="spellStart"/>
+      <w:r>
+        <w:t>merge</w:t>
+      </w:r>
+      <w:proofErr w:type="spellEnd"/>
+      <w:r>
+        <w:t xml:space="preserve"> </w:t>
+      </w:r>
+      <w:proofErr w:type="spellStart"/>
+      <w:r>
+        <w:t>sort</w:t>
+      </w:r>
+      <w:proofErr w:type="spellEnd"/>
+      <w:r>
+        <w:t xml:space="preserve"> ordena los m pedidos filtrados </w:t>
+      </w:r>
+      <w:r>
+        <w:t xml:space="preserve">con complejidad </w:t>
+      </w:r>
+      <w:r>
+        <w:t xml:space="preserve">O(m log m). En las pruebas realizadas con el archivo del 100%, la </w:t>
+      </w:r>
+      <w:r>
+        <w:t xml:space="preserve">implementación con </w:t>
+      </w:r>
+      <w:proofErr w:type="spellStart"/>
+      <w:r>
+        <w:t>Separate</w:t>
+      </w:r>
+      <w:proofErr w:type="spellEnd"/>
+      <w:r>
+        <w:t xml:space="preserve"> </w:t>
+      </w:r>
+      <w:proofErr w:type="spellStart"/>
+      <w:r>
+        <w:t>Chaining</w:t>
+      </w:r>
+      <w:proofErr w:type="spellEnd"/>
+      <w:r>
+        <w:t xml:space="preserve"> resultó aproximadamente 5 ms más rápida que la de Linear </w:t>
+      </w:r>
+      <w:proofErr w:type="spellStart"/>
+      <w:r>
+        <w:t>Probing</w:t>
+      </w:r>
+      <w:proofErr w:type="spellEnd"/>
+      <w:r>
+        <w:t xml:space="preserve">. Esto se </w:t>
+      </w:r>
+      <w:r>
+        <w:t xml:space="preserve">debe a que </w:t>
+      </w:r>
+      <w:r>
+        <w:t>por cada pedido filtrado</w:t>
+      </w:r>
+      <w:r>
+        <w:t xml:space="preserve"> </w:t>
+      </w:r>
+      <w:r>
+        <w:t xml:space="preserve">el requerimiento hace un </w:t>
+      </w:r>
+      <w:proofErr w:type="spellStart"/>
+      <w:r>
+        <w:t>get</w:t>
+      </w:r>
+      <w:proofErr w:type="spellEnd"/>
+      <w:r>
+        <w:t xml:space="preserve"> y un </w:t>
+      </w:r>
+      <w:proofErr w:type="spellStart"/>
+      <w:r>
+        <w:t>put</w:t>
+      </w:r>
+      <w:proofErr w:type="spellEnd"/>
+      <w:r>
+        <w:t xml:space="preserve"> sobre el mapa auxiliar de conteo por producto, y el </w:t>
+      </w:r>
+      <w:proofErr w:type="spellStart"/>
+      <w:r>
+        <w:t>put</w:t>
+      </w:r>
+      <w:proofErr w:type="spellEnd"/>
+      <w:r>
+        <w:t xml:space="preserve"> sobre una llave </w:t>
+      </w:r>
+      <w:r>
+        <w:t xml:space="preserve">que ya existe </w:t>
+      </w:r>
+      <w:r>
+        <w:t xml:space="preserve">en Linear </w:t>
+      </w:r>
+      <w:proofErr w:type="spellStart"/>
+      <w:r>
+        <w:t>Probing</w:t>
+      </w:r>
+      <w:proofErr w:type="spellEnd"/>
+      <w:r>
+        <w:t xml:space="preserve"> implica más llamadas </w:t>
+      </w:r>
+      <w:r>
+        <w:t xml:space="preserve">por dentro </w:t>
+      </w:r>
+      <w:r>
+        <w:t xml:space="preserve">que </w:t>
+      </w:r>
+      <w:r>
+        <w:t xml:space="preserve">las que hay al </w:t>
+      </w:r>
+      <w:r>
+        <w:t xml:space="preserve">recorrer una </w:t>
+      </w:r>
+      <w:r>
+        <w:t>SLL</w:t>
+      </w:r>
+      <w:r>
+        <w:t xml:space="preserve"> corta en </w:t>
+      </w:r>
+      <w:proofErr w:type="spellStart"/>
+      <w:r>
+        <w:t>Separate</w:t>
+      </w:r>
+      <w:proofErr w:type="spellEnd"/>
+      <w:r>
+        <w:t xml:space="preserve"> </w:t>
+      </w:r>
+      <w:proofErr w:type="spellStart"/>
+      <w:r>
+        <w:t>Chaining</w:t>
+      </w:r>
+      <w:proofErr w:type="spellEnd"/>
+      <w:r>
+        <w:t xml:space="preserve">. Como ambas </w:t>
+      </w:r>
+      <w:r>
+        <w:t>implementaciones</w:t>
+      </w:r>
+      <w:r>
+        <w:t xml:space="preserve"> tienen acceso O(1) promedio, la diferencia </w:t>
+      </w:r>
+      <w:r>
+        <w:t xml:space="preserve">puede ser de </w:t>
+      </w:r>
+      <w:r>
+        <w:t>implementación y no de orden de complejidad.</w:t>
+      </w:r>
+    </w:p>
+    <w:p/>
+    <w:p>
+      <w:pPr>
+        <w:pStyle w:val="Heading1"/>
         <w:rPr>
           <w:b/>
           <w:bCs/>
@@ -1427,6 +2142,9 @@
         <w:t>Requerimiento 3</w:t>
       </w:r>
       <w:r>
+        <w:rPr>
+          <w:noProof/>
+        </w:rPr>
         <w:drawing>
           <wp:inline distT="0" distB="0" distL="0" distR="0" wp14:anchorId="3625489B" wp14:editId="4F5F3601">
             <wp:extent cx="4553184" cy="1987652"/>
@@ -1464,6 +2182,9 @@
         </w:drawing>
       </w:r>
       <w:r>
+        <w:rPr>
+          <w:noProof/>
+        </w:rPr>
         <w:drawing>
           <wp:inline distT="0" distB="0" distL="0" distR="0" wp14:anchorId="68E7C1CA" wp14:editId="786A4354">
             <wp:extent cx="4559300" cy="5130566"/>
@@ -1503,6 +2224,9 @@
     </w:p>
     <w:p>
       <w:r>
+        <w:rPr>
+          <w:noProof/>
+        </w:rPr>
         <w:lastRenderedPageBreak/>
         <w:drawing>
           <wp:inline distT="0" distB="0" distL="0" distR="0" wp14:anchorId="22FB1E4D" wp14:editId="45DB1C21">
@@ -1543,7 +2267,7 @@
     </w:p>
     <w:p>
       <w:pPr>
-        <w:pStyle w:val="Ttulo2"/>
+        <w:pStyle w:val="Heading2"/>
         <w:rPr>
           <w:b/>
           <w:bCs/>
@@ -1559,7 +2283,7 @@
     </w:p>
     <w:p>
       <w:pPr>
-        <w:pStyle w:val="Ttulo2"/>
+        <w:pStyle w:val="Heading2"/>
         <w:rPr>
           <w:rFonts w:asciiTheme="minorHAnsi" w:eastAsiaTheme="minorEastAsia" w:hAnsiTheme="minorHAnsi" w:cstheme="minorBidi"/>
           <w:color w:val="auto"/>
@@ -1642,7 +2366,7 @@
     </w:p>
     <w:tbl>
       <w:tblPr>
-        <w:tblStyle w:val="Tablaconcuadrcula"/>
+        <w:tblStyle w:val="TableGrid"/>
         <w:tblW w:w="9360" w:type="dxa"/>
         <w:tblLayout w:type="fixed"/>
         <w:tblLook w:val="06A0" w:firstRow="1" w:lastRow="0" w:firstColumn="1" w:lastColumn="0" w:noHBand="1" w:noVBand="1"/>
@@ -1686,8 +2410,44 @@
               <w:rPr>
                 <w:lang w:val="en-US"/>
               </w:rPr>
-              <w:t>catalog, fecha, min_amount, max_amount</w:t>
-            </w:r>
+              <w:t xml:space="preserve">catalog, </w:t>
+            </w:r>
+            <w:proofErr w:type="spellStart"/>
+            <w:r>
+              <w:rPr>
+                <w:lang w:val="en-US"/>
+              </w:rPr>
+              <w:t>fecha</w:t>
+            </w:r>
+            <w:proofErr w:type="spellEnd"/>
+            <w:r>
+              <w:rPr>
+                <w:lang w:val="en-US"/>
+              </w:rPr>
+              <w:t xml:space="preserve">, </w:t>
+            </w:r>
+            <w:proofErr w:type="spellStart"/>
+            <w:r>
+              <w:rPr>
+                <w:lang w:val="en-US"/>
+              </w:rPr>
+              <w:t>min_amount</w:t>
+            </w:r>
+            <w:proofErr w:type="spellEnd"/>
+            <w:r>
+              <w:rPr>
+                <w:lang w:val="en-US"/>
+              </w:rPr>
+              <w:t xml:space="preserve">, </w:t>
+            </w:r>
+            <w:proofErr w:type="spellStart"/>
+            <w:r>
+              <w:rPr>
+                <w:lang w:val="en-US"/>
+              </w:rPr>
+              <w:t>max_amount</w:t>
+            </w:r>
+            <w:proofErr w:type="spellEnd"/>
           </w:p>
         </w:tc>
       </w:tr>
@@ -1770,7 +2530,7 @@
     <w:p/>
     <w:p>
       <w:pPr>
-        <w:pStyle w:val="Ttulo2"/>
+        <w:pStyle w:val="Heading2"/>
         <w:rPr>
           <w:b/>
           <w:bCs/>
@@ -1791,7 +2551,7 @@
     </w:p>
     <w:tbl>
       <w:tblPr>
-        <w:tblStyle w:val="Tablaconcuadrcula"/>
+        <w:tblStyle w:val="TableGrid"/>
         <w:tblW w:w="0" w:type="auto"/>
         <w:tblLayout w:type="fixed"/>
         <w:tblLook w:val="06A0" w:firstRow="1" w:lastRow="0" w:firstColumn="1" w:lastColumn="0" w:noHBand="1" w:noVBand="1"/>
@@ -1936,8 +2696,21 @@
               <w:t>Ordenar los pedidos filtrados</w:t>
             </w:r>
             <w:r>
-              <w:t xml:space="preserve"> con merge sort</w:t>
-            </w:r>
+              <w:t xml:space="preserve"> con </w:t>
+            </w:r>
+            <w:proofErr w:type="spellStart"/>
+            <w:r>
+              <w:t>merge</w:t>
+            </w:r>
+            <w:proofErr w:type="spellEnd"/>
+            <w:r>
+              <w:t xml:space="preserve"> </w:t>
+            </w:r>
+            <w:proofErr w:type="spellStart"/>
+            <w:r>
+              <w:t>sort</w:t>
+            </w:r>
+            <w:proofErr w:type="spellEnd"/>
           </w:p>
         </w:tc>
         <w:tc>
@@ -2045,7 +2818,7 @@
     </w:p>
     <w:p>
       <w:pPr>
-        <w:pStyle w:val="Ttulo2"/>
+        <w:pStyle w:val="Heading2"/>
         <w:rPr>
           <w:b/>
           <w:bCs/>
@@ -2062,13 +2835,45 @@
     <w:p/>
     <w:p>
       <w:r>
-        <w:t xml:space="preserve">Al usar un mapa de hash que definimos desde la carga de datos nos ayuda a reducir la complejidad, ya que aunque en el peor de los casos igualmente se filtran todos los pedidos seria un caso muy raro ya que en la mayoría de los casos los pedidos </w:t>
-      </w:r>
-      <w:r>
-        <w:t xml:space="preserve">no tienen la misma fecha, lo que permite que el mapa de hash si le quite complejidad al algoritmo, el resto de </w:t>
-      </w:r>
-      <w:r>
-        <w:t xml:space="preserve">el algoritmo si mantiene complejidad lineal y el merge sort </w:t>
+        <w:t xml:space="preserve">Al usar un mapa de hash que definimos desde la carga de datos nos ayuda a reducir la complejidad, ya que aunque en el peor de los casos igualmente se filtran todos los pedidos </w:t>
+      </w:r>
+      <w:proofErr w:type="spellStart"/>
+      <w:r>
+        <w:t>seria</w:t>
+      </w:r>
+      <w:proofErr w:type="spellEnd"/>
+      <w:r>
+        <w:t xml:space="preserve"> un caso muy raro ya que en la mayoría de los casos los pedidos </w:t>
+      </w:r>
+      <w:r>
+        <w:t xml:space="preserve">no tienen la misma fecha, lo que permite que el mapa de hash si le quite complejidad al algoritmo, el resto </w:t>
+      </w:r>
+      <w:proofErr w:type="spellStart"/>
+      <w:r>
+        <w:t xml:space="preserve">de </w:t>
+      </w:r>
+      <w:r>
+        <w:t>el</w:t>
+      </w:r>
+      <w:proofErr w:type="spellEnd"/>
+      <w:r>
+        <w:t xml:space="preserve"> algoritmo si mantiene complejidad lineal y el </w:t>
+      </w:r>
+      <w:proofErr w:type="spellStart"/>
+      <w:r>
+        <w:t>merge</w:t>
+      </w:r>
+      <w:proofErr w:type="spellEnd"/>
+      <w:r>
+        <w:t xml:space="preserve"> </w:t>
+      </w:r>
+      <w:proofErr w:type="spellStart"/>
+      <w:r>
+        <w:t>sort</w:t>
+      </w:r>
+      <w:proofErr w:type="spellEnd"/>
+      <w:r>
+        <w:t xml:space="preserve"> </w:t>
       </w:r>
       <w:r>
         <w:t>usa una complejidad de n log n en todos los casos, lo que hace que la complejidad final sea de n log n</w:t>
@@ -2076,7 +2881,7 @@
     </w:p>
     <w:p>
       <w:pPr>
-        <w:pStyle w:val="Ttulo1"/>
+        <w:pStyle w:val="Heading1"/>
         <w:rPr>
           <w:b/>
           <w:bCs/>
@@ -2098,7 +2903,7 @@
     </w:p>
     <w:tbl>
       <w:tblPr>
-        <w:tblStyle w:val="Tablaconcuadrcula"/>
+        <w:tblStyle w:val="TableGrid"/>
         <w:tblW w:w="9360" w:type="dxa"/>
         <w:tblLayout w:type="fixed"/>
         <w:tblLook w:val="06A0" w:firstRow="1" w:lastRow="0" w:firstColumn="1" w:lastColumn="0" w:noHBand="1" w:noVBand="1"/>
@@ -2148,8 +2953,30 @@
               <w:rPr>
                 <w:lang w:val="en-US"/>
               </w:rPr>
-              <w:t xml:space="preserve"> producto, pais</w:t>
-            </w:r>
+              <w:t xml:space="preserve"> </w:t>
+            </w:r>
+            <w:proofErr w:type="spellStart"/>
+            <w:r>
+              <w:rPr>
+                <w:lang w:val="en-US"/>
+              </w:rPr>
+              <w:t>producto</w:t>
+            </w:r>
+            <w:proofErr w:type="spellEnd"/>
+            <w:r>
+              <w:rPr>
+                <w:lang w:val="en-US"/>
+              </w:rPr>
+              <w:t xml:space="preserve">, </w:t>
+            </w:r>
+            <w:proofErr w:type="spellStart"/>
+            <w:r>
+              <w:rPr>
+                <w:lang w:val="en-US"/>
+              </w:rPr>
+              <w:t>pais</w:t>
+            </w:r>
+            <w:proofErr w:type="spellEnd"/>
           </w:p>
         </w:tc>
       </w:tr>
@@ -2183,15 +3010,52 @@
               <w:t>Número total de pedidos que cumplen el filtro, p</w:t>
             </w:r>
             <w:r>
-              <w:t>romedio de Price_per_Box, Discount_Pct, Marketing_Spend y Boxes_Shipped</w:t>
-            </w:r>
+              <w:t xml:space="preserve">romedio de </w:t>
+            </w:r>
+            <w:proofErr w:type="spellStart"/>
+            <w:r>
+              <w:t>Price_per_Box</w:t>
+            </w:r>
+            <w:proofErr w:type="spellEnd"/>
+            <w:r>
+              <w:t xml:space="preserve">, </w:t>
+            </w:r>
+            <w:proofErr w:type="spellStart"/>
+            <w:r>
+              <w:t>Discount_Pct</w:t>
+            </w:r>
+            <w:proofErr w:type="spellEnd"/>
+            <w:r>
+              <w:t xml:space="preserve">, </w:t>
+            </w:r>
+            <w:proofErr w:type="spellStart"/>
+            <w:r>
+              <w:t>Marketing_Spend</w:t>
+            </w:r>
+            <w:proofErr w:type="spellEnd"/>
+            <w:r>
+              <w:t xml:space="preserve"> y </w:t>
+            </w:r>
+            <w:proofErr w:type="spellStart"/>
+            <w:r>
+              <w:t>Boxes_Shipped</w:t>
+            </w:r>
+            <w:proofErr w:type="spellEnd"/>
             <w:r>
               <w:t>,</w:t>
             </w:r>
           </w:p>
           <w:p>
             <w:r>
-              <w:t>los dos pedidos de mayor Amount, tiempo de ejecución del algoritmo</w:t>
+              <w:t xml:space="preserve">los dos pedidos de mayor </w:t>
+            </w:r>
+            <w:proofErr w:type="spellStart"/>
+            <w:r>
+              <w:t>Amount</w:t>
+            </w:r>
+            <w:proofErr w:type="spellEnd"/>
+            <w:r>
+              <w:t>, tiempo de ejecución del algoritmo</w:t>
             </w:r>
           </w:p>
         </w:tc>
@@ -2225,8 +3089,13 @@
             <w:r>
               <w:t xml:space="preserve">Si, </w:t>
             </w:r>
-            <w:r>
-              <w:t>Jose Alexander Santos Cobos</w:t>
+            <w:proofErr w:type="spellStart"/>
+            <w:r>
+              <w:t>Jose</w:t>
+            </w:r>
+            <w:proofErr w:type="spellEnd"/>
+            <w:r>
+              <w:t xml:space="preserve"> Alexander Santos Cobos</w:t>
             </w:r>
           </w:p>
         </w:tc>
@@ -2235,7 +3104,7 @@
     <w:p/>
     <w:p>
       <w:pPr>
-        <w:pStyle w:val="Ttulo2"/>
+        <w:pStyle w:val="Heading2"/>
         <w:rPr>
           <w:b/>
           <w:bCs/>
@@ -2258,7 +3127,7 @@
     <w:p/>
     <w:p>
       <w:pPr>
-        <w:pStyle w:val="Ttulo2"/>
+        <w:pStyle w:val="Heading2"/>
         <w:rPr>
           <w:b/>
           <w:bCs/>
@@ -2279,7 +3148,7 @@
     </w:p>
     <w:tbl>
       <w:tblPr>
-        <w:tblStyle w:val="Tablaconcuadrcula"/>
+        <w:tblStyle w:val="TableGrid"/>
         <w:tblW w:w="0" w:type="auto"/>
         <w:tblLayout w:type="fixed"/>
         <w:tblLook w:val="06A0" w:firstRow="1" w:lastRow="0" w:firstColumn="1" w:lastColumn="0" w:noHBand="1" w:noVBand="1"/>
@@ -2356,8 +3225,13 @@
             <w:r>
               <w:t xml:space="preserve"> - </w:t>
             </w:r>
-            <w:r>
-              <w:t>pais" concatenando dos textos</w:t>
+            <w:proofErr w:type="spellStart"/>
+            <w:r>
+              <w:t>pais</w:t>
+            </w:r>
+            <w:proofErr w:type="spellEnd"/>
+            <w:r>
+              <w:t>" concatenando dos textos</w:t>
             </w:r>
           </w:p>
         </w:tc>
@@ -2401,7 +3275,15 @@
               </w:rPr>
             </w:pPr>
             <w:r>
-              <w:t>Paso 2: Se busca la llave en la tabla de hash de Linear Probing y se obtiene la lista de pedidos de esa combinación</w:t>
+              <w:t xml:space="preserve">Paso 2: Se busca la llave en la tabla de hash de Linear </w:t>
+            </w:r>
+            <w:proofErr w:type="spellStart"/>
+            <w:r>
+              <w:t>Probing</w:t>
+            </w:r>
+            <w:proofErr w:type="spellEnd"/>
+            <w:r>
+              <w:t xml:space="preserve"> y se obtiene la lista de pedidos de esa combinación</w:t>
             </w:r>
           </w:p>
         </w:tc>
@@ -2495,8 +3377,86 @@
               <w:rPr>
                 <w:lang w:val="en-US"/>
               </w:rPr>
-              <w:t>Por cada uno se suman, si no son None, Price_per_Box, Discount_Pct, Marketing_Spend y Boxes_Shipped</w:t>
-            </w:r>
+              <w:t xml:space="preserve">Por </w:t>
+            </w:r>
+            <w:proofErr w:type="spellStart"/>
+            <w:r>
+              <w:rPr>
+                <w:lang w:val="en-US"/>
+              </w:rPr>
+              <w:t>cada</w:t>
+            </w:r>
+            <w:proofErr w:type="spellEnd"/>
+            <w:r>
+              <w:rPr>
+                <w:lang w:val="en-US"/>
+              </w:rPr>
+              <w:t xml:space="preserve"> uno se suman, </w:t>
+            </w:r>
+            <w:proofErr w:type="spellStart"/>
+            <w:r>
+              <w:rPr>
+                <w:lang w:val="en-US"/>
+              </w:rPr>
+              <w:t>si</w:t>
+            </w:r>
+            <w:proofErr w:type="spellEnd"/>
+            <w:r>
+              <w:rPr>
+                <w:lang w:val="en-US"/>
+              </w:rPr>
+              <w:t xml:space="preserve"> no son None, </w:t>
+            </w:r>
+            <w:proofErr w:type="spellStart"/>
+            <w:r>
+              <w:rPr>
+                <w:lang w:val="en-US"/>
+              </w:rPr>
+              <w:t>Price_per_Box</w:t>
+            </w:r>
+            <w:proofErr w:type="spellEnd"/>
+            <w:r>
+              <w:rPr>
+                <w:lang w:val="en-US"/>
+              </w:rPr>
+              <w:t xml:space="preserve">, </w:t>
+            </w:r>
+            <w:proofErr w:type="spellStart"/>
+            <w:r>
+              <w:rPr>
+                <w:lang w:val="en-US"/>
+              </w:rPr>
+              <w:t>Discount_Pct</w:t>
+            </w:r>
+            <w:proofErr w:type="spellEnd"/>
+            <w:r>
+              <w:rPr>
+                <w:lang w:val="en-US"/>
+              </w:rPr>
+              <w:t xml:space="preserve">, </w:t>
+            </w:r>
+            <w:proofErr w:type="spellStart"/>
+            <w:r>
+              <w:rPr>
+                <w:lang w:val="en-US"/>
+              </w:rPr>
+              <w:t>Marketing_Spend</w:t>
+            </w:r>
+            <w:proofErr w:type="spellEnd"/>
+            <w:r>
+              <w:rPr>
+                <w:lang w:val="en-US"/>
+              </w:rPr>
+              <w:t xml:space="preserve"> y </w:t>
+            </w:r>
+            <w:proofErr w:type="spellStart"/>
+            <w:r>
+              <w:rPr>
+                <w:lang w:val="en-US"/>
+              </w:rPr>
+              <w:t>Boxes_Shipped</w:t>
+            </w:r>
+            <w:proofErr w:type="spellEnd"/>
           </w:p>
         </w:tc>
         <w:tc>
@@ -2583,25 +3543,54 @@
               </w:rPr>
             </w:pPr>
             <w:r>
-              <w:t xml:space="preserve">Paso 6: Se ordenan los p pedidos con Merge Sort </w:t>
+              <w:t xml:space="preserve">Paso 6: Se ordenan los p pedidos con </w:t>
+            </w:r>
+            <w:proofErr w:type="spellStart"/>
+            <w:r>
+              <w:t>Merge</w:t>
+            </w:r>
+            <w:proofErr w:type="spellEnd"/>
+            <w:r>
+              <w:t xml:space="preserve"> Sort </w:t>
             </w:r>
             <w:r>
               <w:t xml:space="preserve"> en orden </w:t>
             </w:r>
-            <w:r>
-              <w:t xml:space="preserve">Amount descendente, </w:t>
+            <w:proofErr w:type="spellStart"/>
+            <w:r>
+              <w:t>Amount</w:t>
+            </w:r>
+            <w:proofErr w:type="spellEnd"/>
+            <w:r>
+              <w:t xml:space="preserve"> descendente, </w:t>
             </w:r>
             <w:r>
               <w:t xml:space="preserve">si es igual, </w:t>
             </w:r>
             <w:r>
-              <w:t xml:space="preserve">luego Marketing_Spend ascendente, </w:t>
+              <w:t xml:space="preserve">luego </w:t>
+            </w:r>
+            <w:proofErr w:type="spellStart"/>
+            <w:r>
+              <w:t>Marketing_Spend</w:t>
+            </w:r>
+            <w:proofErr w:type="spellEnd"/>
+            <w:r>
+              <w:t xml:space="preserve"> ascendente, </w:t>
             </w:r>
             <w:r>
               <w:t xml:space="preserve">si es igual, </w:t>
             </w:r>
             <w:r>
-              <w:t>luego Order_ID ascendente)</w:t>
+              <w:t xml:space="preserve">luego </w:t>
+            </w:r>
+            <w:proofErr w:type="spellStart"/>
+            <w:r>
+              <w:t>Order_ID</w:t>
+            </w:r>
+            <w:proofErr w:type="spellEnd"/>
+            <w:r>
+              <w:t xml:space="preserve"> ascendente)</w:t>
             </w:r>
           </w:p>
         </w:tc>
@@ -2645,8 +3634,13 @@
               </w:rPr>
             </w:pPr>
             <w:r>
-              <w:t>Paso 7: Se toman los dos primeros con sub_list</w:t>
-            </w:r>
+              <w:t xml:space="preserve">Paso 7: Se toman los dos primeros con </w:t>
+            </w:r>
+            <w:proofErr w:type="spellStart"/>
+            <w:r>
+              <w:t>sub_list</w:t>
+            </w:r>
+            <w:proofErr w:type="spellEnd"/>
           </w:p>
         </w:tc>
         <w:tc>
@@ -2823,7 +3817,7 @@
     </w:p>
     <w:p>
       <w:pPr>
-        <w:pStyle w:val="Ttulo2"/>
+        <w:pStyle w:val="Heading2"/>
         <w:rPr>
           <w:b/>
           <w:bCs/>
@@ -2839,12 +3833,20 @@
     </w:p>
     <w:p>
       <w:r>
-        <w:t>Análisis de resultados de la implementación, tener cuenta las pruebas realizadas y el analisis de complejidad.</w:t>
+        <w:t xml:space="preserve">Análisis de resultados de la implementación, tener cuenta las pruebas realizadas y el </w:t>
+      </w:r>
+      <w:proofErr w:type="spellStart"/>
+      <w:r>
+        <w:t>analisis</w:t>
+      </w:r>
+      <w:proofErr w:type="spellEnd"/>
+      <w:r>
+        <w:t xml:space="preserve"> de complejidad.</w:t>
       </w:r>
     </w:p>
     <w:p>
       <w:pPr>
-        <w:pStyle w:val="Ttulo1"/>
+        <w:pStyle w:val="Heading1"/>
         <w:rPr>
           <w:b/>
           <w:bCs/>
@@ -2865,7 +3867,7 @@
     </w:p>
     <w:p>
       <w:pPr>
-        <w:pStyle w:val="Ttulo2"/>
+        <w:pStyle w:val="Heading2"/>
         <w:rPr>
           <w:b/>
           <w:bCs/>
@@ -2886,7 +3888,7 @@
     </w:p>
     <w:tbl>
       <w:tblPr>
-        <w:tblStyle w:val="Tablaconcuadrcula"/>
+        <w:tblStyle w:val="TableGrid"/>
         <w:tblW w:w="9360" w:type="dxa"/>
         <w:tblLayout w:type="fixed"/>
         <w:tblLook w:val="06A0" w:firstRow="1" w:lastRow="0" w:firstColumn="1" w:lastColumn="0" w:noHBand="1" w:noVBand="1"/>
@@ -2921,9 +3923,33 @@
             <w:tcW w:w="6300" w:type="dxa"/>
           </w:tcPr>
           <w:p>
-            <w:r>
-              <w:t>Parámetros necesarios para resolver el requerimiento.</w:t>
-            </w:r>
+            <w:proofErr w:type="spellStart"/>
+            <w:r>
+              <w:t>Catalog</w:t>
+            </w:r>
+            <w:proofErr w:type="spellEnd"/>
+            <w:r>
+              <w:t xml:space="preserve">, </w:t>
+            </w:r>
+            <w:r>
+              <w:t>N</w:t>
+            </w:r>
+            <w:r>
+              <w:t xml:space="preserve"> (productos a consultar), país, </w:t>
+            </w:r>
+            <w:proofErr w:type="spellStart"/>
+            <w:r>
+              <w:t>fecha_inicio</w:t>
+            </w:r>
+            <w:proofErr w:type="spellEnd"/>
+            <w:r>
+              <w:t xml:space="preserve">, </w:t>
+            </w:r>
+            <w:proofErr w:type="spellStart"/>
+            <w:r>
+              <w:t>fecha_fin</w:t>
+            </w:r>
+            <w:proofErr w:type="spellEnd"/>
           </w:p>
         </w:tc>
       </w:tr>
@@ -2954,7 +3980,42 @@
           </w:tcPr>
           <w:p>
             <w:r>
-              <w:t>Respuesta esperada del algoritmo.</w:t>
+              <w:t>Tiempo de ejecución en MS, número total de pedidos que cumplen el filtro por país y el rango de las fechas, número total de producto</w:t>
+            </w:r>
+            <w:r>
+              <w:t xml:space="preserve">s diferentes encontrados, la suma de </w:t>
+            </w:r>
+            <w:proofErr w:type="spellStart"/>
+            <w:r>
+              <w:t>amount</w:t>
+            </w:r>
+            <w:proofErr w:type="spellEnd"/>
+            <w:r>
+              <w:t xml:space="preserve"> de todos los pedidos filtrados, cada producto del top N por recaudo, mostrar el producto, el número de pedidos, el recaudo total, el </w:t>
+            </w:r>
+            <w:proofErr w:type="spellStart"/>
+            <w:r>
+              <w:t>Price_per_box</w:t>
+            </w:r>
+            <w:proofErr w:type="spellEnd"/>
+            <w:r>
+              <w:t xml:space="preserve"> promedio, el </w:t>
+            </w:r>
+            <w:proofErr w:type="spellStart"/>
+            <w:r>
+              <w:t>discount_pct</w:t>
+            </w:r>
+            <w:proofErr w:type="spellEnd"/>
+            <w:r>
+              <w:t xml:space="preserve"> y el marketing </w:t>
+            </w:r>
+            <w:proofErr w:type="spellStart"/>
+            <w:r>
+              <w:t>spend</w:t>
+            </w:r>
+            <w:proofErr w:type="spellEnd"/>
+            <w:r>
+              <w:t xml:space="preserve"> total. </w:t>
             </w:r>
           </w:p>
         </w:tc>
@@ -2986,7 +4047,7 @@
           </w:tcPr>
           <w:p>
             <w:r>
-              <w:t>Si se implementó y quien lo hizo.</w:t>
+              <w:t xml:space="preserve"> Sí, se implementó grupalmente</w:t>
             </w:r>
           </w:p>
         </w:tc>
@@ -2995,7 +4056,7 @@
     <w:p/>
     <w:p>
       <w:pPr>
-        <w:pStyle w:val="Ttulo2"/>
+        <w:pStyle w:val="Heading2"/>
         <w:rPr>
           <w:b/>
           <w:bCs/>
@@ -3016,7 +4077,7 @@
     </w:p>
     <w:tbl>
       <w:tblPr>
-        <w:tblStyle w:val="Tablaconcuadrcula"/>
+        <w:tblStyle w:val="TableGrid"/>
         <w:tblW w:w="0" w:type="auto"/>
         <w:tblLayout w:type="fixed"/>
         <w:tblLook w:val="06A0" w:firstRow="1" w:lastRow="0" w:firstColumn="1" w:lastColumn="0" w:noHBand="1" w:noVBand="1"/>
@@ -3074,7 +4135,7 @@
           </w:tcPr>
           <w:p>
             <w:r>
-              <w:t>Paso 1</w:t>
+              <w:t>Acceso al país en la tabla hash</w:t>
             </w:r>
           </w:p>
         </w:tc>
@@ -3084,7 +4145,13 @@
           </w:tcPr>
           <w:p>
             <w:r>
-              <w:t>O(...)</w:t>
+              <w:t>O(</w:t>
+            </w:r>
+            <w:r>
+              <w:t>1</w:t>
+            </w:r>
+            <w:r>
+              <w:t>)</w:t>
             </w:r>
           </w:p>
         </w:tc>
@@ -3096,7 +4163,7 @@
           </w:tcPr>
           <w:p>
             <w:r>
-              <w:t xml:space="preserve">Paso 2 </w:t>
+              <w:t>Filtrar por rango de fechas y acumular por producto</w:t>
             </w:r>
           </w:p>
         </w:tc>
@@ -3106,7 +4173,13 @@
           </w:tcPr>
           <w:p>
             <w:r>
-              <w:t>O(...)</w:t>
+              <w:t>O(</w:t>
+            </w:r>
+            <w:r>
+              <w:t>a</w:t>
+            </w:r>
+            <w:r>
+              <w:t>)</w:t>
             </w:r>
           </w:p>
         </w:tc>
@@ -3118,7 +4191,7 @@
           </w:tcPr>
           <w:p>
             <w:r>
-              <w:t>Paso ….</w:t>
+              <w:t>Calcular promedios y armar la lista de acumuladores</w:t>
             </w:r>
           </w:p>
         </w:tc>
@@ -3128,7 +4201,13 @@
           </w:tcPr>
           <w:p>
             <w:r>
-              <w:t>O(...)</w:t>
+              <w:t>O(</w:t>
+            </w:r>
+            <w:r>
+              <w:t>n</w:t>
+            </w:r>
+            <w:r>
+              <w:t>)</w:t>
             </w:r>
           </w:p>
         </w:tc>
@@ -3139,6 +4218,64 @@
             <w:tcW w:w="5070" w:type="dxa"/>
           </w:tcPr>
           <w:p>
+            <w:r>
+              <w:t xml:space="preserve">Ordenar con </w:t>
+            </w:r>
+            <w:proofErr w:type="spellStart"/>
+            <w:r>
+              <w:t>merge_sort</w:t>
+            </w:r>
+            <w:proofErr w:type="spellEnd"/>
+            <w:r>
+              <w:t>()</w:t>
+            </w:r>
+          </w:p>
+        </w:tc>
+        <w:tc>
+          <w:tcPr>
+            <w:tcW w:w="4275" w:type="dxa"/>
+          </w:tcPr>
+          <w:p>
+            <w:r>
+              <w:t>O(</w:t>
+            </w:r>
+            <w:r>
+              <w:t>b log b</w:t>
+            </w:r>
+            <w:r>
+              <w:t>)</w:t>
+            </w:r>
+          </w:p>
+        </w:tc>
+      </w:tr>
+      <w:tr>
+        <w:tc>
+          <w:tcPr>
+            <w:tcW w:w="5070" w:type="dxa"/>
+          </w:tcPr>
+          <w:p>
+            <w:r>
+              <w:t>Tomar el top N</w:t>
+            </w:r>
+          </w:p>
+        </w:tc>
+        <w:tc>
+          <w:tcPr>
+            <w:tcW w:w="4275" w:type="dxa"/>
+          </w:tcPr>
+          <w:p>
+            <w:r>
+              <w:t>O(P)</w:t>
+            </w:r>
+          </w:p>
+        </w:tc>
+      </w:tr>
+      <w:tr>
+        <w:tc>
+          <w:tcPr>
+            <w:tcW w:w="5070" w:type="dxa"/>
+          </w:tcPr>
+          <w:p>
             <w:pPr>
               <w:rPr>
                 <w:b/>
@@ -3178,7 +4315,25 @@
                 <w:i/>
                 <w:iCs/>
               </w:rPr>
-              <w:t>O(...)</w:t>
+              <w:t>O(</w:t>
+            </w:r>
+            <w:r>
+              <w:rPr>
+                <w:b/>
+                <w:bCs/>
+                <w:i/>
+                <w:iCs/>
+              </w:rPr>
+              <w:t>a + n log n</w:t>
+            </w:r>
+            <w:r>
+              <w:rPr>
+                <w:b/>
+                <w:bCs/>
+                <w:i/>
+                <w:iCs/>
+              </w:rPr>
+              <w:t>)</w:t>
             </w:r>
           </w:p>
         </w:tc>
@@ -3193,7 +4348,7 @@
     </w:p>
     <w:p>
       <w:pPr>
-        <w:pStyle w:val="Ttulo2"/>
+        <w:pStyle w:val="Heading2"/>
         <w:rPr>
           <w:b/>
           <w:bCs/>
@@ -3209,12 +4364,239 @@
     </w:p>
     <w:p>
       <w:r>
-        <w:t>Análisis de resultados de la implementación, tener cuenta las pruebas realizadas y el analisis de complejidad.</w:t>
+        <w:t xml:space="preserve">Análisis de resultados de la implementación, tener cuenta las pruebas realizadas y el </w:t>
+      </w:r>
+      <w:r>
+        <w:t>análisis</w:t>
+      </w:r>
+      <w:r>
+        <w:t xml:space="preserve"> de complejidad.</w:t>
+      </w:r>
+    </w:p>
+    <w:p/>
+    <w:p>
+      <w:r>
+        <w:t xml:space="preserve">El </w:t>
+      </w:r>
+      <w:proofErr w:type="spellStart"/>
+      <w:r>
+        <w:t>Req</w:t>
+      </w:r>
+      <w:proofErr w:type="spellEnd"/>
+      <w:r>
+        <w:t>. 5 tiene una complejidad de O(</w:t>
+      </w:r>
+      <w:r>
+        <w:t>a</w:t>
+      </w:r>
+      <w:r>
+        <w:t xml:space="preserve"> + </w:t>
+      </w:r>
+      <w:r>
+        <w:t>n</w:t>
+      </w:r>
+      <w:r>
+        <w:t xml:space="preserve"> log </w:t>
+      </w:r>
+      <w:r>
+        <w:t>n</w:t>
+      </w:r>
+      <w:r>
+        <w:t xml:space="preserve">), donde  es el número de pedidos del país y </w:t>
+      </w:r>
+      <w:r>
+        <w:t>n</w:t>
+      </w:r>
+      <w:r>
+        <w:t xml:space="preserve"> el número de productos distintos en el rango de fechas. El acceso al país es O(1) promedio, el recorrido con filtro por fechas y acumulación por producto </w:t>
+      </w:r>
+      <w:r>
+        <w:t>tiene complejidad</w:t>
+      </w:r>
+      <w:r>
+        <w:t xml:space="preserve"> O(</w:t>
+      </w:r>
+      <w:r>
+        <w:t>a</w:t>
+      </w:r>
+      <w:r>
+        <w:t>)</w:t>
+      </w:r>
+      <w:r>
+        <w:t xml:space="preserve"> </w:t>
+      </w:r>
+      <w:r>
+        <w:t xml:space="preserve">y el </w:t>
+      </w:r>
+      <w:proofErr w:type="spellStart"/>
+      <w:r>
+        <w:t>merge</w:t>
+      </w:r>
+      <w:proofErr w:type="spellEnd"/>
+      <w:r>
+        <w:t xml:space="preserve"> </w:t>
+      </w:r>
+      <w:proofErr w:type="spellStart"/>
+      <w:r>
+        <w:t>sort</w:t>
+      </w:r>
+      <w:proofErr w:type="spellEnd"/>
+      <w:r>
+        <w:t xml:space="preserve"> se aplica solo sobre los </w:t>
+      </w:r>
+      <w:r>
+        <w:t>n</w:t>
+      </w:r>
+      <w:r>
+        <w:t xml:space="preserve"> acumuladores</w:t>
+      </w:r>
+      <w:r>
+        <w:t xml:space="preserve"> y </w:t>
+      </w:r>
+      <w:r>
+        <w:t>no sobre los pedidos</w:t>
+      </w:r>
+      <w:r>
+        <w:t xml:space="preserve"> </w:t>
+      </w:r>
+      <w:r>
+        <w:t>con un</w:t>
+      </w:r>
+      <w:r>
+        <w:t xml:space="preserve">a complejidad </w:t>
+      </w:r>
+      <w:r>
+        <w:t>de O(</w:t>
+      </w:r>
+      <w:r>
+        <w:t>n</w:t>
+      </w:r>
+      <w:r>
+        <w:t xml:space="preserve"> log </w:t>
+      </w:r>
+      <w:r>
+        <w:t>n</w:t>
+      </w:r>
+      <w:r>
+        <w:t xml:space="preserve">). En las pruebas con el archivo del 100%, la implementación con Linear </w:t>
+      </w:r>
+      <w:proofErr w:type="spellStart"/>
+      <w:r>
+        <w:t>Probing</w:t>
+      </w:r>
+      <w:proofErr w:type="spellEnd"/>
+      <w:r>
+        <w:t xml:space="preserve"> fue entre 20 y 30 ms más rápida que la de </w:t>
+      </w:r>
+      <w:proofErr w:type="spellStart"/>
+      <w:r>
+        <w:t>Separate</w:t>
+      </w:r>
+      <w:proofErr w:type="spellEnd"/>
+      <w:r>
+        <w:t xml:space="preserve"> </w:t>
+      </w:r>
+      <w:proofErr w:type="spellStart"/>
+      <w:r>
+        <w:lastRenderedPageBreak/>
+        <w:t>Chaining</w:t>
+      </w:r>
+      <w:proofErr w:type="spellEnd"/>
+      <w:r>
+        <w:t xml:space="preserve">. Esto </w:t>
+      </w:r>
+      <w:r>
+        <w:t xml:space="preserve">es gracias a que </w:t>
+      </w:r>
+      <w:r>
+        <w:t xml:space="preserve">en este requerimiento el recorrido </w:t>
+      </w:r>
+      <w:r>
+        <w:t>hace</w:t>
+      </w:r>
+      <w:r>
+        <w:t xml:space="preserve"> casi solo operaciones </w:t>
+      </w:r>
+      <w:proofErr w:type="spellStart"/>
+      <w:r>
+        <w:t>get</w:t>
+      </w:r>
+      <w:proofErr w:type="spellEnd"/>
+      <w:r>
+        <w:t xml:space="preserve"> sobre el mapa de acumuladores (el </w:t>
+      </w:r>
+      <w:proofErr w:type="spellStart"/>
+      <w:r>
+        <w:t>put</w:t>
+      </w:r>
+      <w:proofErr w:type="spellEnd"/>
+      <w:r>
+        <w:t xml:space="preserve"> ocurre únicamente la primera vez que aparece cada producto), y con pocas llaves y factor de carga bajo</w:t>
+      </w:r>
+      <w:r>
+        <w:t xml:space="preserve"> pues</w:t>
+      </w:r>
+      <w:r>
+        <w:t xml:space="preserve"> Linear </w:t>
+      </w:r>
+      <w:proofErr w:type="spellStart"/>
+      <w:r>
+        <w:t>Probing</w:t>
+      </w:r>
+      <w:proofErr w:type="spellEnd"/>
+      <w:r>
+        <w:t xml:space="preserve"> </w:t>
+      </w:r>
+      <w:r>
+        <w:t>tiende a</w:t>
+      </w:r>
+      <w:r>
+        <w:t xml:space="preserve"> encontrar el producto en la primera casilla, mientras que </w:t>
+      </w:r>
+      <w:proofErr w:type="spellStart"/>
+      <w:r>
+        <w:t>Separate</w:t>
+      </w:r>
+      <w:proofErr w:type="spellEnd"/>
+      <w:r>
+        <w:t xml:space="preserve"> </w:t>
+      </w:r>
+      <w:proofErr w:type="spellStart"/>
+      <w:r>
+        <w:t>Chaining</w:t>
+      </w:r>
+      <w:proofErr w:type="spellEnd"/>
+      <w:r>
+        <w:t xml:space="preserve"> debe recorrer </w:t>
+      </w:r>
+      <w:r>
+        <w:t xml:space="preserve">los </w:t>
+      </w:r>
+      <w:r>
+        <w:t xml:space="preserve">nodos de la </w:t>
+      </w:r>
+      <w:r>
+        <w:t xml:space="preserve">SSL </w:t>
+      </w:r>
+      <w:r>
+        <w:t xml:space="preserve">cuando hay colisiones. Aun así, ambas </w:t>
+      </w:r>
+      <w:r>
+        <w:t>implementaciones</w:t>
+      </w:r>
+      <w:r>
+        <w:t xml:space="preserve"> son O(1) promedio por acceso, por lo que la diferencia </w:t>
+      </w:r>
+      <w:r>
+        <w:t xml:space="preserve">es por cómo se haya hecho la </w:t>
+      </w:r>
+      <w:r>
+        <w:t>implementación y no al orden de complejidad.</w:t>
       </w:r>
     </w:p>
     <w:p>
       <w:pPr>
-        <w:pStyle w:val="Ttulo1"/>
+        <w:pStyle w:val="Heading1"/>
         <w:rPr>
           <w:b/>
           <w:bCs/>
@@ -3231,6 +4613,9 @@
     </w:p>
     <w:p>
       <w:r>
+        <w:rPr>
+          <w:noProof/>
+        </w:rPr>
         <w:drawing>
           <wp:inline distT="0" distB="0" distL="0" distR="0" wp14:anchorId="328C8C51" wp14:editId="54EFBE97">
             <wp:extent cx="5258070" cy="7258423"/>
@@ -3270,6 +4655,9 @@
     </w:p>
     <w:p>
       <w:r>
+        <w:rPr>
+          <w:noProof/>
+        </w:rPr>
         <w:lastRenderedPageBreak/>
         <w:drawing>
           <wp:inline distT="0" distB="0" distL="0" distR="0" wp14:anchorId="6883EC4B" wp14:editId="280CF5B4">
@@ -3310,6 +4698,9 @@
     </w:p>
     <w:p>
       <w:r>
+        <w:rPr>
+          <w:noProof/>
+        </w:rPr>
         <w:drawing>
           <wp:inline distT="0" distB="0" distL="0" distR="0" wp14:anchorId="43FE61B3" wp14:editId="10F6D81D">
             <wp:extent cx="5150115" cy="1854295"/>
@@ -3349,7 +4740,7 @@
     </w:p>
     <w:p>
       <w:pPr>
-        <w:pStyle w:val="Ttulo2"/>
+        <w:pStyle w:val="Heading2"/>
         <w:rPr>
           <w:b/>
           <w:bCs/>
@@ -3371,7 +4762,7 @@
     </w:p>
     <w:tbl>
       <w:tblPr>
-        <w:tblStyle w:val="Tablaconcuadrcula"/>
+        <w:tblStyle w:val="TableGrid"/>
         <w:tblW w:w="9360" w:type="dxa"/>
         <w:tblLayout w:type="fixed"/>
         <w:tblLook w:val="06A0" w:firstRow="1" w:lastRow="0" w:firstColumn="1" w:lastColumn="0" w:noHBand="1" w:noVBand="1"/>
@@ -3556,7 +4947,7 @@
     <w:p/>
     <w:p>
       <w:pPr>
-        <w:pStyle w:val="Ttulo2"/>
+        <w:pStyle w:val="Heading2"/>
         <w:rPr>
           <w:b/>
           <w:bCs/>
@@ -3577,7 +4968,7 @@
     </w:p>
     <w:tbl>
       <w:tblPr>
-        <w:tblStyle w:val="Tablaconcuadrcula"/>
+        <w:tblStyle w:val="TableGrid"/>
         <w:tblW w:w="0" w:type="auto"/>
         <w:tblLayout w:type="fixed"/>
         <w:tblLook w:val="06A0" w:firstRow="1" w:lastRow="0" w:firstColumn="1" w:lastColumn="0" w:noHBand="1" w:noVBand="1"/>
@@ -3794,7 +5185,7 @@
     </w:p>
     <w:p>
       <w:pPr>
-        <w:pStyle w:val="Ttulo2"/>
+        <w:pStyle w:val="Heading2"/>
         <w:rPr>
           <w:b/>
           <w:bCs/>
@@ -3810,13 +5201,37 @@
     </w:p>
     <w:p>
       <w:r>
-        <w:t xml:space="preserve">En el algoritmo usamos separate chaining para organizar los </w:t>
+        <w:t xml:space="preserve">En el algoritmo usamos </w:t>
+      </w:r>
+      <w:proofErr w:type="spellStart"/>
+      <w:r>
+        <w:t>separate</w:t>
+      </w:r>
+      <w:proofErr w:type="spellEnd"/>
+      <w:r>
+        <w:t xml:space="preserve"> </w:t>
+      </w:r>
+      <w:proofErr w:type="spellStart"/>
+      <w:r>
+        <w:t>chaining</w:t>
+      </w:r>
+      <w:proofErr w:type="spellEnd"/>
+      <w:r>
+        <w:t xml:space="preserve"> para organizar los </w:t>
       </w:r>
       <w:r>
         <w:t xml:space="preserve">pedidos por productos, lo que nos ayuda a mantener el filtro de por productos en una complejidad O(1), lo que ya reduce en buena parte la complejidad, el otro filtro se mantiene en O(N) y </w:t>
       </w:r>
       <w:r>
-        <w:t xml:space="preserve">al final el organizar por países la complejidad pasa a ser la de el algoritmo de ordenamiento, </w:t>
+        <w:t xml:space="preserve">al final el organizar por países la complejidad pasa a ser la </w:t>
+      </w:r>
+      <w:proofErr w:type="spellStart"/>
+      <w:r>
+        <w:t>de el</w:t>
+      </w:r>
+      <w:proofErr w:type="spellEnd"/>
+      <w:r>
+        <w:t xml:space="preserve"> algoritmo de ordenamiento, </w:t>
       </w:r>
       <w:r>
         <w:t>lo tomamos como un numero diferente porque consideramos muy raro que para cada producto que se encuentre sea de un país diferente, por eso la complejidad final seria O(N+ M LOG M)</w:t>
@@ -3889,7 +5304,7 @@
         </w:tcPr>
         <w:p>
           <w:pPr>
-            <w:pStyle w:val="Encabezado"/>
+            <w:pStyle w:val="Header"/>
             <w:ind w:left="-115"/>
           </w:pPr>
         </w:p>
@@ -3900,7 +5315,7 @@
         </w:tcPr>
         <w:p>
           <w:pPr>
-            <w:pStyle w:val="Encabezado"/>
+            <w:pStyle w:val="Header"/>
             <w:jc w:val="center"/>
           </w:pPr>
         </w:p>
@@ -3911,7 +5326,7 @@
         </w:tcPr>
         <w:p>
           <w:pPr>
-            <w:pStyle w:val="Encabezado"/>
+            <w:pStyle w:val="Header"/>
             <w:ind w:right="-115"/>
             <w:jc w:val="right"/>
           </w:pPr>
@@ -3921,7 +5336,7 @@
   </w:tbl>
   <w:p>
     <w:pPr>
-      <w:pStyle w:val="Piedepgina"/>
+      <w:pStyle w:val="Footer"/>
     </w:pPr>
   </w:p>
 </w:ftr>
@@ -3947,7 +5362,7 @@
         </w:tcPr>
         <w:p>
           <w:pPr>
-            <w:pStyle w:val="Encabezado"/>
+            <w:pStyle w:val="Header"/>
             <w:ind w:left="-115"/>
           </w:pPr>
         </w:p>
@@ -3958,7 +5373,7 @@
         </w:tcPr>
         <w:p>
           <w:pPr>
-            <w:pStyle w:val="Encabezado"/>
+            <w:pStyle w:val="Header"/>
             <w:jc w:val="center"/>
           </w:pPr>
         </w:p>
@@ -3969,7 +5384,7 @@
         </w:tcPr>
         <w:p>
           <w:pPr>
-            <w:pStyle w:val="Encabezado"/>
+            <w:pStyle w:val="Header"/>
             <w:ind w:right="-115"/>
             <w:jc w:val="right"/>
           </w:pPr>
@@ -3979,7 +5394,7 @@
   </w:tbl>
   <w:p>
     <w:pPr>
-      <w:pStyle w:val="Piedepgina"/>
+      <w:pStyle w:val="Footer"/>
     </w:pPr>
   </w:p>
 </w:ftr>
@@ -4037,7 +5452,7 @@
         </w:tcPr>
         <w:p>
           <w:pPr>
-            <w:pStyle w:val="Encabezado"/>
+            <w:pStyle w:val="Header"/>
             <w:ind w:left="-115"/>
           </w:pPr>
         </w:p>
@@ -4048,7 +5463,7 @@
         </w:tcPr>
         <w:p>
           <w:pPr>
-            <w:pStyle w:val="Encabezado"/>
+            <w:pStyle w:val="Header"/>
             <w:jc w:val="center"/>
           </w:pPr>
         </w:p>
@@ -4059,7 +5474,7 @@
         </w:tcPr>
         <w:p>
           <w:pPr>
-            <w:pStyle w:val="Encabezado"/>
+            <w:pStyle w:val="Header"/>
             <w:ind w:right="-115"/>
             <w:jc w:val="right"/>
           </w:pPr>
@@ -4069,7 +5484,7 @@
   </w:tbl>
   <w:p>
     <w:pPr>
-      <w:pStyle w:val="Encabezado"/>
+      <w:pStyle w:val="Header"/>
     </w:pPr>
   </w:p>
 </w:hdr>
@@ -4079,7 +5494,7 @@
 <w:hdr xmlns:wpc="http://schemas.microsoft.com/office/word/2010/wordprocessingCanvas" xmlns:cx="http://schemas.microsoft.com/office/drawing/2014/chartex" xmlns:cx1="http://schemas.microsoft.com/office/drawing/2015/9/8/chartex" xmlns:cx2="http://schemas.microsoft.com/office/drawing/2015/10/21/chartex" xmlns:cx3="http://schemas.microsoft.com/office/drawing/2016/5/9/chartex" xmlns:cx4="http://schemas.microsoft.com/office/drawing/2016/5/10/chartex" xmlns:cx5="http://schemas.microsoft.com/office/drawing/2016/5/11/chartex" xmlns:cx6="http://schemas.microsoft.com/office/drawing/2016/5/12/chartex" xmlns:cx7="http://schemas.microsoft.com/office/drawing/2016/5/13/chartex" xmlns:cx8="http://schemas.microsoft.com/office/drawing/2016/5/14/chartex" xmlns:mc="http://schemas.openxmlformats.org/markup-compatibility/2006" xmlns:aink="http://schemas.microsoft.com/office/drawing/2016/ink" xmlns:am3d="http://schemas.microsoft.com/office/drawing/2017/model3d" xmlns:o="urn:schemas-microsoft-com:office:office" xmlns:oel="http://schemas.microsoft.com/office/2019/extlst" xmlns:r="http://schemas.openxmlformats.org/officeDocument/2006/relationships" xmlns:m="http://schemas.openxmlformats.org/officeDocument/2006/math" xmlns:v="urn:schemas-microsoft-com:vml" xmlns:wp14="http://schemas.microsoft.com/office/word/2010/wordprocessingDrawing" xmlns:wp="http://schemas.openxmlformats.org/drawingml/2006/wordprocessingDrawing" xmlns:w10="urn:schemas-microsoft-com:office:word" xmlns:w="http://schemas.openxmlformats.org/wordprocessingml/2006/main" xmlns:w14="http://schemas.microsoft.com/office/word/2010/wordml" xmlns:w15="http://schemas.microsoft.com/office/word/2012/wordml" xmlns:w16cex="http://schemas.microsoft.com/office/word/2018/wordml/cex" xmlns:w16cid="http://schemas.microsoft.com/office/word/2016/wordml/cid" xmlns:w16="http://schemas.microsoft.com/office/word/2018/wordml" xmlns:w16du="http://schemas.microsoft.com/office/word/2023/wordml/word16du" xmlns:w16sdtdh="http://schemas.microsoft.com/office/word/2020/wordml/sdtdatahash" xmlns:w16sdtfl="http://schemas.microsoft.com/office/word/2024/wordml/sdtformatlock" xmlns:w16se="http://schemas.microsoft.com/office/word/2015/wordml/symex" xmlns:wpg="http://schemas.microsoft.com/office/word/2010/wordprocessingGroup" xmlns:wpi="http://schemas.microsoft.com/office/word/2010/wordprocessingInk" xmlns:wne="http://schemas.microsoft.com/office/word/2006/wordml" xmlns:wps="http://schemas.microsoft.com/office/word/2010/wordprocessingShape" mc:Ignorable="w14 w15 w16se w16cid w16 w16cex w16sdtdh w16sdtfl w16du wp14">
   <w:tbl>
     <w:tblPr>
-      <w:tblStyle w:val="Tablaconcuadrcula"/>
+      <w:tblStyle w:val="TableGrid"/>
       <w:tblW w:w="10060" w:type="dxa"/>
       <w:jc w:val="center"/>
       <w:tblBorders>
@@ -4283,7 +5698,7 @@
   </w:tbl>
   <w:p>
     <w:pPr>
-      <w:pStyle w:val="Encabezado"/>
+      <w:pStyle w:val="Header"/>
     </w:pPr>
   </w:p>
 </w:hdr>
@@ -5409,6 +6824,95 @@
     </w:lvl>
   </w:abstractNum>
   <w:abstractNum w:abstractNumId="11" w15:restartNumberingAfterBreak="0">
+    <w:nsid w:val="600F63CA"/>
+    <w:multiLevelType w:val="hybridMultilevel"/>
+    <w:tmpl w:val="A5A4FF62"/>
+    <w:lvl w:ilvl="0" w:tplc="0409000F">
+      <w:start w:val="1"/>
+      <w:numFmt w:val="decimal"/>
+      <w:lvlText w:val="%1."/>
+      <w:lvlJc w:val="left"/>
+      <w:pPr>
+        <w:ind w:left="720" w:hanging="360"/>
+      </w:pPr>
+      <w:rPr>
+        <w:rFonts w:hint="default"/>
+      </w:rPr>
+    </w:lvl>
+    <w:lvl w:ilvl="1" w:tplc="04090019" w:tentative="1">
+      <w:start w:val="1"/>
+      <w:numFmt w:val="lowerLetter"/>
+      <w:lvlText w:val="%2."/>
+      <w:lvlJc w:val="left"/>
+      <w:pPr>
+        <w:ind w:left="1440" w:hanging="360"/>
+      </w:pPr>
+    </w:lvl>
+    <w:lvl w:ilvl="2" w:tplc="0409001B" w:tentative="1">
+      <w:start w:val="1"/>
+      <w:numFmt w:val="lowerRoman"/>
+      <w:lvlText w:val="%3."/>
+      <w:lvlJc w:val="right"/>
+      <w:pPr>
+        <w:ind w:left="2160" w:hanging="180"/>
+      </w:pPr>
+    </w:lvl>
+    <w:lvl w:ilvl="3" w:tplc="0409000F" w:tentative="1">
+      <w:start w:val="1"/>
+      <w:numFmt w:val="decimal"/>
+      <w:lvlText w:val="%4."/>
+      <w:lvlJc w:val="left"/>
+      <w:pPr>
+        <w:ind w:left="2880" w:hanging="360"/>
+      </w:pPr>
+    </w:lvl>
+    <w:lvl w:ilvl="4" w:tplc="04090019" w:tentative="1">
+      <w:start w:val="1"/>
+      <w:numFmt w:val="lowerLetter"/>
+      <w:lvlText w:val="%5."/>
+      <w:lvlJc w:val="left"/>
+      <w:pPr>
+        <w:ind w:left="3600" w:hanging="360"/>
+      </w:pPr>
+    </w:lvl>
+    <w:lvl w:ilvl="5" w:tplc="0409001B" w:tentative="1">
+      <w:start w:val="1"/>
+      <w:numFmt w:val="lowerRoman"/>
+      <w:lvlText w:val="%6."/>
+      <w:lvlJc w:val="right"/>
+      <w:pPr>
+        <w:ind w:left="4320" w:hanging="180"/>
+      </w:pPr>
+    </w:lvl>
+    <w:lvl w:ilvl="6" w:tplc="0409000F" w:tentative="1">
+      <w:start w:val="1"/>
+      <w:numFmt w:val="decimal"/>
+      <w:lvlText w:val="%7."/>
+      <w:lvlJc w:val="left"/>
+      <w:pPr>
+        <w:ind w:left="5040" w:hanging="360"/>
+      </w:pPr>
+    </w:lvl>
+    <w:lvl w:ilvl="7" w:tplc="04090019" w:tentative="1">
+      <w:start w:val="1"/>
+      <w:numFmt w:val="lowerLetter"/>
+      <w:lvlText w:val="%8."/>
+      <w:lvlJc w:val="left"/>
+      <w:pPr>
+        <w:ind w:left="5760" w:hanging="360"/>
+      </w:pPr>
+    </w:lvl>
+    <w:lvl w:ilvl="8" w:tplc="0409001B" w:tentative="1">
+      <w:start w:val="1"/>
+      <w:numFmt w:val="lowerRoman"/>
+      <w:lvlText w:val="%9."/>
+      <w:lvlJc w:val="right"/>
+      <w:pPr>
+        <w:ind w:left="6480" w:hanging="180"/>
+      </w:pPr>
+    </w:lvl>
+  </w:abstractNum>
+  <w:abstractNum w:abstractNumId="12" w15:restartNumberingAfterBreak="0">
     <w:nsid w:val="62E07DB4"/>
     <w:multiLevelType w:val="hybridMultilevel"/>
     <w:tmpl w:val="5B3ED38C"/>
@@ -5521,7 +7025,7 @@
       </w:rPr>
     </w:lvl>
   </w:abstractNum>
-  <w:abstractNum w:abstractNumId="12" w15:restartNumberingAfterBreak="0">
+  <w:abstractNum w:abstractNumId="13" w15:restartNumberingAfterBreak="0">
     <w:nsid w:val="72F204F4"/>
     <w:multiLevelType w:val="hybridMultilevel"/>
     <w:tmpl w:val="979A7680"/>
@@ -5610,7 +7114,7 @@
       </w:pPr>
     </w:lvl>
   </w:abstractNum>
-  <w:abstractNum w:abstractNumId="13" w15:restartNumberingAfterBreak="0">
+  <w:abstractNum w:abstractNumId="14" w15:restartNumberingAfterBreak="0">
     <w:nsid w:val="7A782887"/>
     <w:multiLevelType w:val="hybridMultilevel"/>
     <w:tmpl w:val="C1E297A4"/>
@@ -5696,7 +7200,7 @@
       </w:pPr>
     </w:lvl>
   </w:abstractNum>
-  <w:abstractNum w:abstractNumId="14" w15:restartNumberingAfterBreak="0">
+  <w:abstractNum w:abstractNumId="15" w15:restartNumberingAfterBreak="0">
     <w:nsid w:val="7B1B7BF6"/>
     <w:multiLevelType w:val="hybridMultilevel"/>
     <w:tmpl w:val="AB9875EE"/>
@@ -5809,7 +7313,7 @@
       </w:rPr>
     </w:lvl>
   </w:abstractNum>
-  <w:abstractNum w:abstractNumId="15" w15:restartNumberingAfterBreak="0">
+  <w:abstractNum w:abstractNumId="16" w15:restartNumberingAfterBreak="0">
     <w:nsid w:val="7D306817"/>
     <w:multiLevelType w:val="hybridMultilevel"/>
     <w:tmpl w:val="58E0050E"/>
@@ -5895,7 +7399,7 @@
       </w:pPr>
     </w:lvl>
   </w:abstractNum>
-  <w:abstractNum w:abstractNumId="16" w15:restartNumberingAfterBreak="0">
+  <w:abstractNum w:abstractNumId="17" w15:restartNumberingAfterBreak="0">
     <w:nsid w:val="7E932F65"/>
     <w:multiLevelType w:val="hybridMultilevel"/>
     <w:tmpl w:val="71241596"/>
@@ -5996,7 +7500,7 @@
     <w:abstractNumId w:val="3"/>
   </w:num>
   <w:num w:numId="4" w16cid:durableId="1364287550">
-    <w:abstractNumId w:val="12"/>
+    <w:abstractNumId w:val="13"/>
   </w:num>
   <w:num w:numId="5" w16cid:durableId="533228022">
     <w:abstractNumId w:val="0"/>
@@ -6011,10 +7515,10 @@
     <w:abstractNumId w:val="4"/>
   </w:num>
   <w:num w:numId="9" w16cid:durableId="237330710">
-    <w:abstractNumId w:val="13"/>
+    <w:abstractNumId w:val="14"/>
   </w:num>
   <w:num w:numId="10" w16cid:durableId="474373757">
-    <w:abstractNumId w:val="15"/>
+    <w:abstractNumId w:val="16"/>
   </w:num>
   <w:num w:numId="11" w16cid:durableId="829714030">
     <w:abstractNumId w:val="8"/>
@@ -6023,19 +7527,22 @@
     <w:abstractNumId w:val="10"/>
   </w:num>
   <w:num w:numId="13" w16cid:durableId="1821573983">
-    <w:abstractNumId w:val="16"/>
+    <w:abstractNumId w:val="17"/>
   </w:num>
   <w:num w:numId="14" w16cid:durableId="2020885365">
-    <w:abstractNumId w:val="11"/>
+    <w:abstractNumId w:val="12"/>
   </w:num>
   <w:num w:numId="15" w16cid:durableId="1978410333">
     <w:abstractNumId w:val="7"/>
   </w:num>
   <w:num w:numId="16" w16cid:durableId="479730601">
-    <w:abstractNumId w:val="14"/>
+    <w:abstractNumId w:val="15"/>
   </w:num>
   <w:num w:numId="17" w16cid:durableId="1615481842">
     <w:abstractNumId w:val="2"/>
+  </w:num>
+  <w:num w:numId="18" w16cid:durableId="1564367479">
+    <w:abstractNumId w:val="11"/>
   </w:num>
   <w:numIdMacAtCleanup w:val="8"/>
 </w:numbering>
@@ -6444,11 +7951,11 @@
       <w:lang w:val="es-CO"/>
     </w:rPr>
   </w:style>
-  <w:style w:type="paragraph" w:styleId="Ttulo1">
+  <w:style w:type="paragraph" w:styleId="Heading1">
     <w:name w:val="heading 1"/>
     <w:basedOn w:val="Normal"/>
     <w:next w:val="Normal"/>
-    <w:link w:val="Ttulo1Car"/>
+    <w:link w:val="Heading1Char"/>
     <w:uiPriority w:val="9"/>
     <w:qFormat/>
     <w:rsid w:val="002B5D65"/>
@@ -6465,11 +7972,11 @@
       <w:szCs w:val="36"/>
     </w:rPr>
   </w:style>
-  <w:style w:type="paragraph" w:styleId="Ttulo2">
+  <w:style w:type="paragraph" w:styleId="Heading2">
     <w:name w:val="heading 2"/>
     <w:basedOn w:val="Normal"/>
     <w:next w:val="Normal"/>
-    <w:link w:val="Ttulo2Car"/>
+    <w:link w:val="Heading2Char"/>
     <w:uiPriority w:val="9"/>
     <w:unhideWhenUsed/>
     <w:qFormat/>
@@ -6487,11 +7994,11 @@
       <w:szCs w:val="32"/>
     </w:rPr>
   </w:style>
-  <w:style w:type="paragraph" w:styleId="Ttulo3">
+  <w:style w:type="paragraph" w:styleId="Heading3">
     <w:name w:val="heading 3"/>
     <w:basedOn w:val="Normal"/>
     <w:next w:val="Normal"/>
-    <w:link w:val="Ttulo3Car"/>
+    <w:link w:val="Heading3Char"/>
     <w:uiPriority w:val="9"/>
     <w:unhideWhenUsed/>
     <w:qFormat/>
@@ -6509,11 +8016,11 @@
       <w:szCs w:val="28"/>
     </w:rPr>
   </w:style>
-  <w:style w:type="paragraph" w:styleId="Ttulo4">
+  <w:style w:type="paragraph" w:styleId="Heading4">
     <w:name w:val="heading 4"/>
     <w:basedOn w:val="Normal"/>
     <w:next w:val="Normal"/>
-    <w:link w:val="Ttulo4Car"/>
+    <w:link w:val="Heading4Char"/>
     <w:uiPriority w:val="9"/>
     <w:unhideWhenUsed/>
     <w:qFormat/>
@@ -6531,11 +8038,11 @@
       <w:szCs w:val="24"/>
     </w:rPr>
   </w:style>
-  <w:style w:type="paragraph" w:styleId="Ttulo5">
+  <w:style w:type="paragraph" w:styleId="Heading5">
     <w:name w:val="heading 5"/>
     <w:basedOn w:val="Normal"/>
     <w:next w:val="Normal"/>
-    <w:link w:val="Ttulo5Car"/>
+    <w:link w:val="Heading5Char"/>
     <w:uiPriority w:val="9"/>
     <w:semiHidden/>
     <w:unhideWhenUsed/>
@@ -6553,11 +8060,11 @@
       <w:color w:val="2F5496" w:themeColor="accent1" w:themeShade="BF"/>
     </w:rPr>
   </w:style>
-  <w:style w:type="paragraph" w:styleId="Ttulo6">
+  <w:style w:type="paragraph" w:styleId="Heading6">
     <w:name w:val="heading 6"/>
     <w:basedOn w:val="Normal"/>
     <w:next w:val="Normal"/>
-    <w:link w:val="Ttulo6Car"/>
+    <w:link w:val="Heading6Char"/>
     <w:uiPriority w:val="9"/>
     <w:semiHidden/>
     <w:unhideWhenUsed/>
@@ -6577,11 +8084,11 @@
       <w:color w:val="1F3864" w:themeColor="accent1" w:themeShade="80"/>
     </w:rPr>
   </w:style>
-  <w:style w:type="paragraph" w:styleId="Ttulo7">
+  <w:style w:type="paragraph" w:styleId="Heading7">
     <w:name w:val="heading 7"/>
     <w:basedOn w:val="Normal"/>
     <w:next w:val="Normal"/>
-    <w:link w:val="Ttulo7Car"/>
+    <w:link w:val="Heading7Char"/>
     <w:uiPriority w:val="9"/>
     <w:semiHidden/>
     <w:unhideWhenUsed/>
@@ -6600,11 +8107,11 @@
       <w:color w:val="1F3864" w:themeColor="accent1" w:themeShade="80"/>
     </w:rPr>
   </w:style>
-  <w:style w:type="paragraph" w:styleId="Ttulo8">
+  <w:style w:type="paragraph" w:styleId="Heading8">
     <w:name w:val="heading 8"/>
     <w:basedOn w:val="Normal"/>
     <w:next w:val="Normal"/>
-    <w:link w:val="Ttulo8Car"/>
+    <w:link w:val="Heading8Char"/>
     <w:uiPriority w:val="9"/>
     <w:semiHidden/>
     <w:unhideWhenUsed/>
@@ -6625,11 +8132,11 @@
       <w:color w:val="1F3864" w:themeColor="accent1" w:themeShade="80"/>
     </w:rPr>
   </w:style>
-  <w:style w:type="paragraph" w:styleId="Ttulo9">
+  <w:style w:type="paragraph" w:styleId="Heading9">
     <w:name w:val="heading 9"/>
     <w:basedOn w:val="Normal"/>
     <w:next w:val="Normal"/>
-    <w:link w:val="Ttulo9Car"/>
+    <w:link w:val="Heading9Char"/>
     <w:uiPriority w:val="9"/>
     <w:semiHidden/>
     <w:unhideWhenUsed/>
@@ -6648,12 +8155,13 @@
       <w:color w:val="1F3864" w:themeColor="accent1" w:themeShade="80"/>
     </w:rPr>
   </w:style>
-  <w:style w:type="character" w:default="1" w:styleId="Fuentedeprrafopredeter">
+  <w:style w:type="character" w:default="1" w:styleId="DefaultParagraphFont">
     <w:name w:val="Default Paragraph Font"/>
     <w:uiPriority w:val="1"/>
+    <w:semiHidden/>
     <w:unhideWhenUsed/>
   </w:style>
-  <w:style w:type="table" w:default="1" w:styleId="Tablanormal">
+  <w:style w:type="table" w:default="1" w:styleId="TableNormal">
     <w:name w:val="Normal Table"/>
     <w:uiPriority w:val="99"/>
     <w:semiHidden/>
@@ -6668,17 +8176,17 @@
       </w:tblCellMar>
     </w:tblPr>
   </w:style>
-  <w:style w:type="numbering" w:default="1" w:styleId="Sinlista">
+  <w:style w:type="numbering" w:default="1" w:styleId="NoList">
     <w:name w:val="No List"/>
     <w:uiPriority w:val="99"/>
     <w:semiHidden/>
     <w:unhideWhenUsed/>
   </w:style>
-  <w:style w:type="paragraph" w:styleId="Ttulo">
+  <w:style w:type="paragraph" w:styleId="Title">
     <w:name w:val="Title"/>
     <w:basedOn w:val="Normal"/>
     <w:next w:val="Normal"/>
-    <w:link w:val="TtuloCar"/>
+    <w:link w:val="TitleChar"/>
     <w:uiPriority w:val="10"/>
     <w:qFormat/>
     <w:rsid w:val="002B5D65"/>
@@ -6697,7 +8205,7 @@
   </w:style>
   <w:style w:type="character" w:customStyle="1" w:styleId="TitleChar1">
     <w:name w:val="Title Char1"/>
-    <w:basedOn w:val="Fuentedeprrafopredeter"/>
+    <w:basedOn w:val="DefaultParagraphFont"/>
     <w:uiPriority w:val="10"/>
     <w:rsid w:val="00F96056"/>
     <w:rPr>
@@ -6709,7 +8217,7 @@
   </w:style>
   <w:style w:type="character" w:customStyle="1" w:styleId="Heading1Char1">
     <w:name w:val="Heading 1 Char1"/>
-    <w:basedOn w:val="Fuentedeprrafopredeter"/>
+    <w:basedOn w:val="DefaultParagraphFont"/>
     <w:uiPriority w:val="9"/>
     <w:rsid w:val="00F96056"/>
     <w:rPr>
@@ -6722,10 +8230,10 @@
       <w:szCs w:val="36"/>
     </w:rPr>
   </w:style>
-  <w:style w:type="character" w:customStyle="1" w:styleId="Ttulo2Car">
-    <w:name w:val="Título 2 Car"/>
-    <w:basedOn w:val="Fuentedeprrafopredeter"/>
-    <w:link w:val="Ttulo2"/>
+  <w:style w:type="character" w:customStyle="1" w:styleId="Heading2Char">
+    <w:name w:val="Heading 2 Char"/>
+    <w:basedOn w:val="DefaultParagraphFont"/>
+    <w:link w:val="Heading2"/>
     <w:uiPriority w:val="9"/>
     <w:rsid w:val="002B5D65"/>
     <w:rPr>
@@ -6735,7 +8243,7 @@
       <w:szCs w:val="32"/>
     </w:rPr>
   </w:style>
-  <w:style w:type="paragraph" w:styleId="Prrafodelista">
+  <w:style w:type="paragraph" w:styleId="ListParagraph">
     <w:name w:val="List Paragraph"/>
     <w:basedOn w:val="Normal"/>
     <w:uiPriority w:val="34"/>
@@ -6746,10 +8254,10 @@
       <w:contextualSpacing/>
     </w:pPr>
   </w:style>
-  <w:style w:type="character" w:customStyle="1" w:styleId="Ttulo3Car">
-    <w:name w:val="Título 3 Car"/>
-    <w:basedOn w:val="Fuentedeprrafopredeter"/>
-    <w:link w:val="Ttulo3"/>
+  <w:style w:type="character" w:customStyle="1" w:styleId="Heading3Char">
+    <w:name w:val="Heading 3 Char"/>
+    <w:basedOn w:val="DefaultParagraphFont"/>
+    <w:link w:val="Heading3"/>
     <w:uiPriority w:val="9"/>
     <w:rsid w:val="002B5D65"/>
     <w:rPr>
@@ -6759,10 +8267,10 @@
       <w:szCs w:val="28"/>
     </w:rPr>
   </w:style>
-  <w:style w:type="character" w:customStyle="1" w:styleId="Ttulo4Car">
-    <w:name w:val="Título 4 Car"/>
-    <w:basedOn w:val="Fuentedeprrafopredeter"/>
-    <w:link w:val="Ttulo4"/>
+  <w:style w:type="character" w:customStyle="1" w:styleId="Heading4Char">
+    <w:name w:val="Heading 4 Char"/>
+    <w:basedOn w:val="DefaultParagraphFont"/>
+    <w:link w:val="Heading4"/>
     <w:uiPriority w:val="9"/>
     <w:rsid w:val="002B5D65"/>
     <w:rPr>
@@ -6772,10 +8280,10 @@
       <w:szCs w:val="24"/>
     </w:rPr>
   </w:style>
-  <w:style w:type="character" w:customStyle="1" w:styleId="Ttulo5Car">
-    <w:name w:val="Título 5 Car"/>
-    <w:basedOn w:val="Fuentedeprrafopredeter"/>
-    <w:link w:val="Ttulo5"/>
+  <w:style w:type="character" w:customStyle="1" w:styleId="Heading5Char">
+    <w:name w:val="Heading 5 Char"/>
+    <w:basedOn w:val="DefaultParagraphFont"/>
+    <w:link w:val="Heading5"/>
     <w:uiPriority w:val="9"/>
     <w:semiHidden/>
     <w:rsid w:val="002B5D65"/>
@@ -6785,10 +8293,10 @@
       <w:color w:val="2F5496" w:themeColor="accent1" w:themeShade="BF"/>
     </w:rPr>
   </w:style>
-  <w:style w:type="character" w:customStyle="1" w:styleId="Ttulo6Car">
-    <w:name w:val="Título 6 Car"/>
-    <w:basedOn w:val="Fuentedeprrafopredeter"/>
-    <w:link w:val="Ttulo6"/>
+  <w:style w:type="character" w:customStyle="1" w:styleId="Heading6Char">
+    <w:name w:val="Heading 6 Char"/>
+    <w:basedOn w:val="DefaultParagraphFont"/>
+    <w:link w:val="Heading6"/>
     <w:uiPriority w:val="9"/>
     <w:semiHidden/>
     <w:rsid w:val="002B5D65"/>
@@ -6800,10 +8308,10 @@
       <w:color w:val="1F3864" w:themeColor="accent1" w:themeShade="80"/>
     </w:rPr>
   </w:style>
-  <w:style w:type="character" w:customStyle="1" w:styleId="Ttulo7Car">
-    <w:name w:val="Título 7 Car"/>
-    <w:basedOn w:val="Fuentedeprrafopredeter"/>
-    <w:link w:val="Ttulo7"/>
+  <w:style w:type="character" w:customStyle="1" w:styleId="Heading7Char">
+    <w:name w:val="Heading 7 Char"/>
+    <w:basedOn w:val="DefaultParagraphFont"/>
+    <w:link w:val="Heading7"/>
     <w:uiPriority w:val="9"/>
     <w:semiHidden/>
     <w:rsid w:val="002B5D65"/>
@@ -6814,10 +8322,10 @@
       <w:color w:val="1F3864" w:themeColor="accent1" w:themeShade="80"/>
     </w:rPr>
   </w:style>
-  <w:style w:type="character" w:customStyle="1" w:styleId="Ttulo8Car">
-    <w:name w:val="Título 8 Car"/>
-    <w:basedOn w:val="Fuentedeprrafopredeter"/>
-    <w:link w:val="Ttulo8"/>
+  <w:style w:type="character" w:customStyle="1" w:styleId="Heading8Char">
+    <w:name w:val="Heading 8 Char"/>
+    <w:basedOn w:val="DefaultParagraphFont"/>
+    <w:link w:val="Heading8"/>
     <w:uiPriority w:val="9"/>
     <w:semiHidden/>
     <w:rsid w:val="002B5D65"/>
@@ -6830,10 +8338,10 @@
       <w:color w:val="1F3864" w:themeColor="accent1" w:themeShade="80"/>
     </w:rPr>
   </w:style>
-  <w:style w:type="character" w:customStyle="1" w:styleId="Ttulo9Car">
-    <w:name w:val="Título 9 Car"/>
-    <w:basedOn w:val="Fuentedeprrafopredeter"/>
-    <w:link w:val="Ttulo9"/>
+  <w:style w:type="character" w:customStyle="1" w:styleId="Heading9Char">
+    <w:name w:val="Heading 9 Char"/>
+    <w:basedOn w:val="DefaultParagraphFont"/>
+    <w:link w:val="Heading9"/>
     <w:uiPriority w:val="9"/>
     <w:semiHidden/>
     <w:rsid w:val="002B5D65"/>
@@ -6844,7 +8352,7 @@
       <w:color w:val="1F3864" w:themeColor="accent1" w:themeShade="80"/>
     </w:rPr>
   </w:style>
-  <w:style w:type="paragraph" w:styleId="Descripcin">
+  <w:style w:type="paragraph" w:styleId="Caption">
     <w:name w:val="caption"/>
     <w:basedOn w:val="Normal"/>
     <w:next w:val="Normal"/>
@@ -6862,11 +8370,11 @@
       <w:color w:val="44546A" w:themeColor="text2"/>
     </w:rPr>
   </w:style>
-  <w:style w:type="paragraph" w:styleId="Subttulo">
+  <w:style w:type="paragraph" w:styleId="Subtitle">
     <w:name w:val="Subtitle"/>
     <w:basedOn w:val="Normal"/>
     <w:next w:val="Normal"/>
-    <w:link w:val="SubttuloCar"/>
+    <w:link w:val="SubtitleChar"/>
     <w:uiPriority w:val="11"/>
     <w:qFormat/>
     <w:rsid w:val="002B5D65"/>
@@ -6883,10 +8391,10 @@
       <w:szCs w:val="28"/>
     </w:rPr>
   </w:style>
-  <w:style w:type="character" w:customStyle="1" w:styleId="SubttuloCar">
-    <w:name w:val="Subtítulo Car"/>
-    <w:basedOn w:val="Fuentedeprrafopredeter"/>
-    <w:link w:val="Subttulo"/>
+  <w:style w:type="character" w:customStyle="1" w:styleId="SubtitleChar">
+    <w:name w:val="Subtitle Char"/>
+    <w:basedOn w:val="DefaultParagraphFont"/>
+    <w:link w:val="Subtitle"/>
     <w:uiPriority w:val="11"/>
     <w:rsid w:val="002B5D65"/>
     <w:rPr>
@@ -6896,9 +8404,9 @@
       <w:szCs w:val="28"/>
     </w:rPr>
   </w:style>
-  <w:style w:type="character" w:styleId="Fuerte">
+  <w:style w:type="character" w:styleId="Strong">
     <w:name w:val="Strong"/>
-    <w:basedOn w:val="Fuentedeprrafopredeter"/>
+    <w:basedOn w:val="DefaultParagraphFont"/>
     <w:uiPriority w:val="22"/>
     <w:qFormat/>
     <w:rsid w:val="002B5D65"/>
@@ -6907,9 +8415,9 @@
       <w:bCs/>
     </w:rPr>
   </w:style>
-  <w:style w:type="character" w:styleId="nfasis">
+  <w:style w:type="character" w:styleId="Emphasis">
     <w:name w:val="Emphasis"/>
-    <w:basedOn w:val="Fuentedeprrafopredeter"/>
+    <w:basedOn w:val="DefaultParagraphFont"/>
     <w:uiPriority w:val="20"/>
     <w:qFormat/>
     <w:rsid w:val="002B5D65"/>
@@ -6918,7 +8426,7 @@
       <w:iCs/>
     </w:rPr>
   </w:style>
-  <w:style w:type="paragraph" w:styleId="Sinespaciado">
+  <w:style w:type="paragraph" w:styleId="NoSpacing">
     <w:name w:val="No Spacing"/>
     <w:uiPriority w:val="1"/>
     <w:qFormat/>
@@ -6927,11 +8435,11 @@
       <w:spacing w:after="0" w:line="240" w:lineRule="auto"/>
     </w:pPr>
   </w:style>
-  <w:style w:type="paragraph" w:styleId="Cita">
+  <w:style w:type="paragraph" w:styleId="Quote">
     <w:name w:val="Quote"/>
     <w:basedOn w:val="Normal"/>
     <w:next w:val="Normal"/>
-    <w:link w:val="CitaCar"/>
+    <w:link w:val="QuoteChar"/>
     <w:uiPriority w:val="29"/>
     <w:qFormat/>
     <w:rsid w:val="002B5D65"/>
@@ -6945,10 +8453,10 @@
       <w:szCs w:val="24"/>
     </w:rPr>
   </w:style>
-  <w:style w:type="character" w:customStyle="1" w:styleId="CitaCar">
-    <w:name w:val="Cita Car"/>
-    <w:basedOn w:val="Fuentedeprrafopredeter"/>
-    <w:link w:val="Cita"/>
+  <w:style w:type="character" w:customStyle="1" w:styleId="QuoteChar">
+    <w:name w:val="Quote Char"/>
+    <w:basedOn w:val="DefaultParagraphFont"/>
+    <w:link w:val="Quote"/>
     <w:uiPriority w:val="29"/>
     <w:rsid w:val="002B5D65"/>
     <w:rPr>
@@ -6957,11 +8465,11 @@
       <w:szCs w:val="24"/>
     </w:rPr>
   </w:style>
-  <w:style w:type="paragraph" w:styleId="Citadestacada">
+  <w:style w:type="paragraph" w:styleId="IntenseQuote">
     <w:name w:val="Intense Quote"/>
     <w:basedOn w:val="Normal"/>
     <w:next w:val="Normal"/>
-    <w:link w:val="CitadestacadaCar"/>
+    <w:link w:val="IntenseQuoteChar"/>
     <w:uiPriority w:val="30"/>
     <w:qFormat/>
     <w:rsid w:val="002B5D65"/>
@@ -6978,10 +8486,10 @@
       <w:szCs w:val="32"/>
     </w:rPr>
   </w:style>
-  <w:style w:type="character" w:customStyle="1" w:styleId="CitadestacadaCar">
-    <w:name w:val="Cita destacada Car"/>
-    <w:basedOn w:val="Fuentedeprrafopredeter"/>
-    <w:link w:val="Citadestacada"/>
+  <w:style w:type="character" w:customStyle="1" w:styleId="IntenseQuoteChar">
+    <w:name w:val="Intense Quote Char"/>
+    <w:basedOn w:val="DefaultParagraphFont"/>
+    <w:link w:val="IntenseQuote"/>
     <w:uiPriority w:val="30"/>
     <w:rsid w:val="002B5D65"/>
     <w:rPr>
@@ -6992,9 +8500,9 @@
       <w:szCs w:val="32"/>
     </w:rPr>
   </w:style>
-  <w:style w:type="character" w:styleId="nfasissutil">
+  <w:style w:type="character" w:styleId="SubtleEmphasis">
     <w:name w:val="Subtle Emphasis"/>
-    <w:basedOn w:val="Fuentedeprrafopredeter"/>
+    <w:basedOn w:val="DefaultParagraphFont"/>
     <w:uiPriority w:val="19"/>
     <w:qFormat/>
     <w:rsid w:val="002B5D65"/>
@@ -7004,9 +8512,9 @@
       <w:color w:val="595959" w:themeColor="text1" w:themeTint="A6"/>
     </w:rPr>
   </w:style>
-  <w:style w:type="character" w:styleId="nfasisintenso">
+  <w:style w:type="character" w:styleId="IntenseEmphasis">
     <w:name w:val="Intense Emphasis"/>
-    <w:basedOn w:val="Fuentedeprrafopredeter"/>
+    <w:basedOn w:val="DefaultParagraphFont"/>
     <w:uiPriority w:val="21"/>
     <w:qFormat/>
     <w:rsid w:val="002B5D65"/>
@@ -7017,9 +8525,9 @@
       <w:iCs/>
     </w:rPr>
   </w:style>
-  <w:style w:type="character" w:styleId="Referenciasutil">
+  <w:style w:type="character" w:styleId="SubtleReference">
     <w:name w:val="Subtle Reference"/>
-    <w:basedOn w:val="Fuentedeprrafopredeter"/>
+    <w:basedOn w:val="DefaultParagraphFont"/>
     <w:uiPriority w:val="31"/>
     <w:qFormat/>
     <w:rsid w:val="002B5D65"/>
@@ -7030,9 +8538,9 @@
       <w:bdr w:val="none" w:sz="0" w:space="0" w:color="auto"/>
     </w:rPr>
   </w:style>
-  <w:style w:type="character" w:styleId="Referenciaintensa">
+  <w:style w:type="character" w:styleId="IntenseReference">
     <w:name w:val="Intense Reference"/>
-    <w:basedOn w:val="Fuentedeprrafopredeter"/>
+    <w:basedOn w:val="DefaultParagraphFont"/>
     <w:uiPriority w:val="32"/>
     <w:qFormat/>
     <w:rsid w:val="002B5D65"/>
@@ -7044,9 +8552,9 @@
       <w:u w:val="single"/>
     </w:rPr>
   </w:style>
-  <w:style w:type="character" w:styleId="Ttulodellibro">
+  <w:style w:type="character" w:styleId="BookTitle">
     <w:name w:val="Book Title"/>
-    <w:basedOn w:val="Fuentedeprrafopredeter"/>
+    <w:basedOn w:val="DefaultParagraphFont"/>
     <w:uiPriority w:val="33"/>
     <w:qFormat/>
     <w:rsid w:val="002B5D65"/>
@@ -7057,9 +8565,9 @@
       <w:spacing w:val="10"/>
     </w:rPr>
   </w:style>
-  <w:style w:type="paragraph" w:styleId="TtuloTDC">
+  <w:style w:type="paragraph" w:styleId="TOCHeading">
     <w:name w:val="TOC Heading"/>
-    <w:basedOn w:val="Ttulo1"/>
+    <w:basedOn w:val="Heading1"/>
     <w:next w:val="Normal"/>
     <w:uiPriority w:val="39"/>
     <w:semiHidden/>
@@ -7070,10 +8578,10 @@
       <w:outlineLvl w:val="9"/>
     </w:pPr>
   </w:style>
-  <w:style w:type="paragraph" w:styleId="Textodeglobo">
+  <w:style w:type="paragraph" w:styleId="BalloonText">
     <w:name w:val="Balloon Text"/>
     <w:basedOn w:val="Normal"/>
-    <w:link w:val="TextodegloboCar"/>
+    <w:link w:val="BalloonTextChar"/>
     <w:uiPriority w:val="99"/>
     <w:semiHidden/>
     <w:unhideWhenUsed/>
@@ -7087,10 +8595,10 @@
       <w:szCs w:val="18"/>
     </w:rPr>
   </w:style>
-  <w:style w:type="character" w:customStyle="1" w:styleId="TextodegloboCar">
-    <w:name w:val="Texto de globo Car"/>
-    <w:basedOn w:val="Fuentedeprrafopredeter"/>
-    <w:link w:val="Textodeglobo"/>
+  <w:style w:type="character" w:customStyle="1" w:styleId="BalloonTextChar">
+    <w:name w:val="Balloon Text Char"/>
+    <w:basedOn w:val="DefaultParagraphFont"/>
+    <w:link w:val="BalloonText"/>
     <w:uiPriority w:val="99"/>
     <w:semiHidden/>
     <w:rsid w:val="00C52DE4"/>
@@ -7100,9 +8608,9 @@
       <w:szCs w:val="18"/>
     </w:rPr>
   </w:style>
-  <w:style w:type="table" w:styleId="Tablaconcuadrcula">
+  <w:style w:type="table" w:styleId="TableGrid">
     <w:name w:val="Table Grid"/>
-    <w:basedOn w:val="Tablanormal"/>
+    <w:basedOn w:val="TableNormal"/>
     <w:uiPriority w:val="59"/>
     <w:rsid w:val="00787D14"/>
     <w:pPr>
@@ -7119,9 +8627,9 @@
       </w:tblBorders>
     </w:tblPr>
   </w:style>
-  <w:style w:type="table" w:styleId="Tabladelista6concolores">
+  <w:style w:type="table" w:styleId="ListTable6Colorful">
     <w:name w:val="List Table 6 Colorful"/>
-    <w:basedOn w:val="Tablanormal"/>
+    <w:basedOn w:val="TableNormal"/>
     <w:uiPriority w:val="51"/>
     <w:rsid w:val="00BB305F"/>
     <w:pPr>
@@ -7187,9 +8695,9 @@
       </w:tcPr>
     </w:tblStylePr>
   </w:style>
-  <w:style w:type="table" w:styleId="Tabladelista6concolores-nfasis3">
+  <w:style w:type="table" w:styleId="ListTable6Colorful-Accent3">
     <w:name w:val="List Table 6 Colorful Accent 3"/>
-    <w:basedOn w:val="Tablanormal"/>
+    <w:basedOn w:val="TableNormal"/>
     <w:uiPriority w:val="51"/>
     <w:rsid w:val="00BB305F"/>
     <w:pPr>
@@ -7255,9 +8763,9 @@
       </w:tcPr>
     </w:tblStylePr>
   </w:style>
-  <w:style w:type="character" w:styleId="Hipervnculo">
+  <w:style w:type="character" w:styleId="Hyperlink">
     <w:name w:val="Hyperlink"/>
-    <w:basedOn w:val="Fuentedeprrafopredeter"/>
+    <w:basedOn w:val="DefaultParagraphFont"/>
     <w:uiPriority w:val="99"/>
     <w:unhideWhenUsed/>
     <w:rsid w:val="009B0A35"/>
@@ -7268,7 +8776,7 @@
   </w:style>
   <w:style w:type="character" w:customStyle="1" w:styleId="UnresolvedMention1">
     <w:name w:val="Unresolved Mention1"/>
-    <w:basedOn w:val="Fuentedeprrafopredeter"/>
+    <w:basedOn w:val="DefaultParagraphFont"/>
     <w:uiPriority w:val="99"/>
     <w:semiHidden/>
     <w:unhideWhenUsed/>
@@ -7278,9 +8786,9 @@
       <w:shd w:val="clear" w:color="auto" w:fill="E1DFDD"/>
     </w:rPr>
   </w:style>
-  <w:style w:type="character" w:styleId="Hipervnculovisitado">
+  <w:style w:type="character" w:styleId="FollowedHyperlink">
     <w:name w:val="FollowedHyperlink"/>
-    <w:basedOn w:val="Fuentedeprrafopredeter"/>
+    <w:basedOn w:val="DefaultParagraphFont"/>
     <w:uiPriority w:val="99"/>
     <w:semiHidden/>
     <w:unhideWhenUsed/>
@@ -7290,10 +8798,10 @@
       <w:u w:val="single"/>
     </w:rPr>
   </w:style>
-  <w:style w:type="paragraph" w:styleId="Encabezado">
+  <w:style w:type="paragraph" w:styleId="Header">
     <w:name w:val="header"/>
     <w:basedOn w:val="Normal"/>
-    <w:link w:val="EncabezadoCar"/>
+    <w:link w:val="HeaderChar"/>
     <w:uiPriority w:val="99"/>
     <w:unhideWhenUsed/>
     <w:rsid w:val="00480688"/>
@@ -7305,17 +8813,17 @@
       <w:spacing w:after="0" w:line="240" w:lineRule="auto"/>
     </w:pPr>
   </w:style>
-  <w:style w:type="character" w:customStyle="1" w:styleId="EncabezadoCar">
-    <w:name w:val="Encabezado Car"/>
-    <w:basedOn w:val="Fuentedeprrafopredeter"/>
-    <w:link w:val="Encabezado"/>
+  <w:style w:type="character" w:customStyle="1" w:styleId="HeaderChar">
+    <w:name w:val="Header Char"/>
+    <w:basedOn w:val="DefaultParagraphFont"/>
+    <w:link w:val="Header"/>
     <w:uiPriority w:val="99"/>
     <w:rsid w:val="00480688"/>
   </w:style>
-  <w:style w:type="paragraph" w:styleId="Piedepgina">
+  <w:style w:type="paragraph" w:styleId="Footer">
     <w:name w:val="footer"/>
     <w:basedOn w:val="Normal"/>
-    <w:link w:val="PiedepginaCar"/>
+    <w:link w:val="FooterChar"/>
     <w:uiPriority w:val="99"/>
     <w:unhideWhenUsed/>
     <w:rsid w:val="00480688"/>
@@ -7327,10 +8835,10 @@
       <w:spacing w:after="0" w:line="240" w:lineRule="auto"/>
     </w:pPr>
   </w:style>
-  <w:style w:type="character" w:customStyle="1" w:styleId="PiedepginaCar">
-    <w:name w:val="Pie de página Car"/>
-    <w:basedOn w:val="Fuentedeprrafopredeter"/>
-    <w:link w:val="Piedepgina"/>
+  <w:style w:type="character" w:customStyle="1" w:styleId="FooterChar">
+    <w:name w:val="Footer Char"/>
+    <w:basedOn w:val="DefaultParagraphFont"/>
+    <w:link w:val="Footer"/>
     <w:uiPriority w:val="99"/>
     <w:rsid w:val="00480688"/>
   </w:style>
@@ -7358,10 +8866,10 @@
       <w:lang w:val="es-ES" w:eastAsia="es-CO"/>
     </w:rPr>
   </w:style>
-  <w:style w:type="character" w:customStyle="1" w:styleId="TtuloCar">
-    <w:name w:val="Título Car"/>
-    <w:basedOn w:val="Fuentedeprrafopredeter"/>
-    <w:link w:val="Ttulo"/>
+  <w:style w:type="character" w:customStyle="1" w:styleId="TitleChar">
+    <w:name w:val="Title Char"/>
+    <w:basedOn w:val="DefaultParagraphFont"/>
+    <w:link w:val="Title"/>
     <w:uiPriority w:val="10"/>
     <w:rsid w:val="002B5D65"/>
     <w:rPr>
@@ -7396,10 +8904,10 @@
       <w:lang w:val="es-ES" w:eastAsia="es-CO"/>
     </w:rPr>
   </w:style>
-  <w:style w:type="character" w:customStyle="1" w:styleId="Ttulo1Car">
-    <w:name w:val="Título 1 Car"/>
-    <w:basedOn w:val="Fuentedeprrafopredeter"/>
-    <w:link w:val="Ttulo1"/>
+  <w:style w:type="character" w:customStyle="1" w:styleId="Heading1Char">
+    <w:name w:val="Heading 1 Char"/>
+    <w:basedOn w:val="DefaultParagraphFont"/>
+    <w:link w:val="Heading1"/>
     <w:uiPriority w:val="9"/>
     <w:rsid w:val="002B5D65"/>
     <w:rPr>
@@ -7425,7 +8933,7 @@
   </w:style>
   <w:style w:type="character" w:customStyle="1" w:styleId="UnresolvedMention2">
     <w:name w:val="Unresolved Mention2"/>
-    <w:basedOn w:val="Fuentedeprrafopredeter"/>
+    <w:basedOn w:val="DefaultParagraphFont"/>
     <w:uiPriority w:val="99"/>
     <w:semiHidden/>
     <w:unhideWhenUsed/>
@@ -7435,9 +8943,9 @@
       <w:shd w:val="clear" w:color="auto" w:fill="E1DFDD"/>
     </w:rPr>
   </w:style>
-  <w:style w:type="character" w:styleId="Refdecomentario">
+  <w:style w:type="character" w:styleId="CommentReference">
     <w:name w:val="annotation reference"/>
-    <w:basedOn w:val="Fuentedeprrafopredeter"/>
+    <w:basedOn w:val="DefaultParagraphFont"/>
     <w:uiPriority w:val="99"/>
     <w:semiHidden/>
     <w:unhideWhenUsed/>
@@ -7447,10 +8955,10 @@
       <w:szCs w:val="16"/>
     </w:rPr>
   </w:style>
-  <w:style w:type="paragraph" w:styleId="Textocomentario">
+  <w:style w:type="paragraph" w:styleId="CommentText">
     <w:name w:val="annotation text"/>
     <w:basedOn w:val="Normal"/>
-    <w:link w:val="TextocomentarioCar"/>
+    <w:link w:val="CommentTextChar"/>
     <w:uiPriority w:val="99"/>
     <w:semiHidden/>
     <w:unhideWhenUsed/>
@@ -7463,10 +8971,10 @@
       <w:szCs w:val="20"/>
     </w:rPr>
   </w:style>
-  <w:style w:type="character" w:customStyle="1" w:styleId="TextocomentarioCar">
-    <w:name w:val="Texto comentario Car"/>
-    <w:basedOn w:val="Fuentedeprrafopredeter"/>
-    <w:link w:val="Textocomentario"/>
+  <w:style w:type="character" w:customStyle="1" w:styleId="CommentTextChar">
+    <w:name w:val="Comment Text Char"/>
+    <w:basedOn w:val="DefaultParagraphFont"/>
+    <w:link w:val="CommentText"/>
     <w:uiPriority w:val="99"/>
     <w:semiHidden/>
     <w:rsid w:val="00FC7D79"/>
@@ -7475,11 +8983,11 @@
       <w:szCs w:val="20"/>
     </w:rPr>
   </w:style>
-  <w:style w:type="paragraph" w:styleId="Asuntodelcomentario">
+  <w:style w:type="paragraph" w:styleId="CommentSubject">
     <w:name w:val="annotation subject"/>
-    <w:basedOn w:val="Textocomentario"/>
-    <w:next w:val="Textocomentario"/>
-    <w:link w:val="AsuntodelcomentarioCar"/>
+    <w:basedOn w:val="CommentText"/>
+    <w:next w:val="CommentText"/>
+    <w:link w:val="CommentSubjectChar"/>
     <w:uiPriority w:val="99"/>
     <w:semiHidden/>
     <w:unhideWhenUsed/>
@@ -7489,10 +8997,10 @@
       <w:bCs/>
     </w:rPr>
   </w:style>
-  <w:style w:type="character" w:customStyle="1" w:styleId="AsuntodelcomentarioCar">
-    <w:name w:val="Asunto del comentario Car"/>
-    <w:basedOn w:val="TextocomentarioCar"/>
-    <w:link w:val="Asuntodelcomentario"/>
+  <w:style w:type="character" w:customStyle="1" w:styleId="CommentSubjectChar">
+    <w:name w:val="Comment Subject Char"/>
+    <w:basedOn w:val="CommentTextChar"/>
+    <w:link w:val="CommentSubject"/>
     <w:uiPriority w:val="99"/>
     <w:semiHidden/>
     <w:rsid w:val="00FC7D79"/>
@@ -7503,7 +9011,7 @@
       <w:szCs w:val="20"/>
     </w:rPr>
   </w:style>
-  <w:style w:type="paragraph" w:styleId="Revisin">
+  <w:style w:type="paragraph" w:styleId="Revision">
     <w:name w:val="Revision"/>
     <w:hidden/>
     <w:uiPriority w:val="99"/>
@@ -7513,9 +9021,9 @@
       <w:spacing w:after="0" w:line="240" w:lineRule="auto"/>
     </w:pPr>
   </w:style>
-  <w:style w:type="table" w:styleId="Tabladecuadrcula2">
+  <w:style w:type="table" w:styleId="GridTable2">
     <w:name w:val="Grid Table 2"/>
-    <w:basedOn w:val="Tablanormal"/>
+    <w:basedOn w:val="TableNormal"/>
     <w:uiPriority w:val="47"/>
     <w:rsid w:val="008B1D2B"/>
     <w:pPr>
@@ -7588,9 +9096,9 @@
       </w:tcPr>
     </w:tblStylePr>
   </w:style>
-  <w:style w:type="table" w:styleId="Tablanormal3">
+  <w:style w:type="table" w:styleId="PlainTable3">
     <w:name w:val="Plain Table 3"/>
-    <w:basedOn w:val="Tablanormal"/>
+    <w:basedOn w:val="TableNormal"/>
     <w:uiPriority w:val="43"/>
     <w:rsid w:val="004078BE"/>
     <w:pPr>
@@ -7681,9 +9189,9 @@
       </w:tcPr>
     </w:tblStylePr>
   </w:style>
-  <w:style w:type="table" w:styleId="Tablaconcuadrcula2-nfasis3">
+  <w:style w:type="table" w:styleId="GridTable2-Accent3">
     <w:name w:val="Grid Table 2 Accent 3"/>
-    <w:basedOn w:val="Tablanormal"/>
+    <w:basedOn w:val="TableNormal"/>
     <w:uiPriority w:val="47"/>
     <w:rsid w:val="004078BE"/>
     <w:pPr>
@@ -7756,9 +9264,9 @@
       </w:tcPr>
     </w:tblStylePr>
   </w:style>
-  <w:style w:type="character" w:styleId="Mencinsinresolver">
+  <w:style w:type="character" w:styleId="UnresolvedMention">
     <w:name w:val="Unresolved Mention"/>
-    <w:basedOn w:val="Fuentedeprrafopredeter"/>
+    <w:basedOn w:val="DefaultParagraphFont"/>
     <w:uiPriority w:val="99"/>
     <w:semiHidden/>
     <w:unhideWhenUsed/>
@@ -7784,8 +9292,21 @@
   </w:style>
   <w:style w:type="character" w:customStyle="1" w:styleId="selectable-text1">
     <w:name w:val="selectable-text1"/>
-    <w:basedOn w:val="Fuentedeprrafopredeter"/>
+    <w:basedOn w:val="DefaultParagraphFont"/>
     <w:rsid w:val="00A63B69"/>
+  </w:style>
+  <w:style w:type="character" w:styleId="HTMLCode">
+    <w:name w:val="HTML Code"/>
+    <w:basedOn w:val="DefaultParagraphFont"/>
+    <w:uiPriority w:val="99"/>
+    <w:semiHidden/>
+    <w:unhideWhenUsed/>
+    <w:rsid w:val="001250AC"/>
+    <w:rPr>
+      <w:rFonts w:ascii="Courier New" w:eastAsia="Times New Roman" w:hAnsi="Courier New" w:cs="Courier New"/>
+      <w:sz w:val="20"/>
+      <w:szCs w:val="20"/>
+    </w:rPr>
   </w:style>
 </w:styles>
 </file>
@@ -8086,6 +9607,15 @@
 </file>
 
 <file path=customXml/item1.xml><?xml version="1.0" encoding="utf-8"?>
+<?mso-contentType ?>
+<FormTemplates xmlns="http://schemas.microsoft.com/sharepoint/v3/contenttype/forms">
+  <Display>DocumentLibraryForm</Display>
+  <Edit>DocumentLibraryForm</Edit>
+  <New>DocumentLibraryForm</New>
+</FormTemplates>
+</file>
+
+<file path=customXml/item2.xml><?xml version="1.0" encoding="utf-8"?>
 <p:properties xmlns:p="http://schemas.microsoft.com/office/2006/metadata/properties" xmlns:xsi="http://www.w3.org/2001/XMLSchema-instance" xmlns:pc="http://schemas.microsoft.com/office/infopath/2007/PartnerControls">
   <documentManagement>
     <SharedWithUsers xmlns="85e30bcc-d76c-4413-8e4d-2dce22fb0743">
@@ -8133,20 +9663,7 @@
 </p:properties>
 </file>
 
-<file path=customXml/item2.xml><?xml version="1.0" encoding="utf-8"?>
-<?mso-contentType ?>
-<FormTemplates xmlns="http://schemas.microsoft.com/sharepoint/v3/contenttype/forms">
-  <Display>DocumentLibraryForm</Display>
-  <Edit>DocumentLibraryForm</Edit>
-  <New>DocumentLibraryForm</New>
-</FormTemplates>
-</file>
-
 <file path=customXml/item3.xml><?xml version="1.0" encoding="utf-8"?>
-<b:Sources xmlns:b="http://schemas.openxmlformats.org/officeDocument/2006/bibliography" xmlns="http://schemas.openxmlformats.org/officeDocument/2006/bibliography" SelectedStyle="\APASixthEditionOfficeOnline.xsl" StyleName="APA" Version="6"/>
-</file>
-
-<file path=customXml/item4.xml><?xml version="1.0" encoding="utf-8"?>
 <ct:contentTypeSchema xmlns:ct="http://schemas.microsoft.com/office/2006/metadata/contentType" xmlns:ma="http://schemas.microsoft.com/office/2006/metadata/properties/metaAttributes" ct:_="" ma:_="" ma:contentTypeName="Documento" ma:contentTypeID="0x01010023858CF01A2EF24688B692775F4C60A4" ma:contentTypeVersion="15" ma:contentTypeDescription="Crear nuevo documento." ma:contentTypeScope="" ma:versionID="a4df9e4b793c0fa050084ef4feafa589">
   <xsd:schema xmlns:xsd="http://www.w3.org/2001/XMLSchema" xmlns:xs="http://www.w3.org/2001/XMLSchema" xmlns:p="http://schemas.microsoft.com/office/2006/metadata/properties" xmlns:ns2="164883f8-7691-4ecf-b54a-664c0d0edefe" xmlns:ns3="85e30bcc-d76c-4413-8e4d-2dce22fb0743" targetNamespace="http://schemas.microsoft.com/office/2006/metadata/properties" ma:root="true" ma:fieldsID="067b7080d2289f9ba15465beea7d18a8" ns2:_="" ns3:_="">
     <xsd:import namespace="164883f8-7691-4ecf-b54a-664c0d0edefe"/>
@@ -8383,7 +9900,19 @@
 </ct:contentTypeSchema>
 </file>
 
+<file path=customXml/item4.xml><?xml version="1.0" encoding="utf-8"?>
+<b:Sources xmlns:b="http://schemas.openxmlformats.org/officeDocument/2006/bibliography" xmlns="http://schemas.openxmlformats.org/officeDocument/2006/bibliography" SelectedStyle="\APASixthEditionOfficeOnline.xsl" StyleName="APA" Version="6"/>
+</file>
+
 <file path=customXml/itemProps1.xml><?xml version="1.0" encoding="utf-8"?>
+<ds:datastoreItem xmlns:ds="http://schemas.openxmlformats.org/officeDocument/2006/customXml" ds:itemID="{58AFF83A-2C1F-4B0C-9BCE-EE49F5226348}">
+  <ds:schemaRefs>
+    <ds:schemaRef ds:uri="http://schemas.microsoft.com/sharepoint/v3/contenttype/forms"/>
+  </ds:schemaRefs>
+</ds:datastoreItem>
+</file>
+
+<file path=customXml/itemProps2.xml><?xml version="1.0" encoding="utf-8"?>
 <ds:datastoreItem xmlns:ds="http://schemas.openxmlformats.org/officeDocument/2006/customXml" ds:itemID="{D3B4676A-CA48-4E6B-BABE-1535A7A288F6}">
   <ds:schemaRefs>
     <ds:schemaRef ds:uri="http://schemas.microsoft.com/office/2006/metadata/properties"/>
@@ -8394,23 +9923,7 @@
 </ds:datastoreItem>
 </file>
 
-<file path=customXml/itemProps2.xml><?xml version="1.0" encoding="utf-8"?>
-<ds:datastoreItem xmlns:ds="http://schemas.openxmlformats.org/officeDocument/2006/customXml" ds:itemID="{58AFF83A-2C1F-4B0C-9BCE-EE49F5226348}">
-  <ds:schemaRefs>
-    <ds:schemaRef ds:uri="http://schemas.microsoft.com/sharepoint/v3/contenttype/forms"/>
-  </ds:schemaRefs>
-</ds:datastoreItem>
-</file>
-
 <file path=customXml/itemProps3.xml><?xml version="1.0" encoding="utf-8"?>
-<ds:datastoreItem xmlns:ds="http://schemas.openxmlformats.org/officeDocument/2006/customXml" ds:itemID="{794BE61C-5254-4531-868C-EC2590174185}">
-  <ds:schemaRefs>
-    <ds:schemaRef ds:uri="http://schemas.openxmlformats.org/officeDocument/2006/bibliography"/>
-  </ds:schemaRefs>
-</ds:datastoreItem>
-</file>
-
-<file path=customXml/itemProps4.xml><?xml version="1.0" encoding="utf-8"?>
 <ds:datastoreItem xmlns:ds="http://schemas.openxmlformats.org/officeDocument/2006/customXml" ds:itemID="{62F3E371-4CEE-4871-A936-27DA1639FADD}">
   <ds:schemaRefs>
     <ds:schemaRef ds:uri="http://schemas.microsoft.com/office/2006/metadata/contentType"/>
@@ -8427,4 +9940,12 @@
     <ds:schemaRef ds:uri="http://schemas.microsoft.com/internal/obd"/>
   </ds:schemaRefs>
 </ds:datastoreItem>
+</file>
+
+<file path=customXml/itemProps4.xml><?xml version="1.0" encoding="utf-8"?>
+<ds:datastoreItem xmlns:ds="http://schemas.openxmlformats.org/officeDocument/2006/customXml" ds:itemID="{794BE61C-5254-4531-868C-EC2590174185}">
+  <ds:schemaRefs>
+    <ds:schemaRef ds:uri="http://schemas.openxmlformats.org/officeDocument/2006/bibliography"/>
+  </ds:schemaRefs>
+</ds:datastoreItem>
 </file>
</xml_diff>

<commit_message>
Final REQ2 y REQ5
</commit_message>
<xml_diff>
--- a/Docs/ISIS1225 - AnalisisReto-TEMPLATE RETO.docx
+++ b/Docs/ISIS1225 - AnalisisReto-TEMPLATE RETO.docx
@@ -1939,22 +1939,7 @@
     <w:p/>
     <w:p>
       <w:r>
-        <w:t>El Req2 tiene una complejidad de O(</w:t>
-      </w:r>
-      <w:r>
-        <w:t>a</w:t>
-      </w:r>
-      <w:r>
-        <w:t xml:space="preserve"> + m log m), donde </w:t>
-      </w:r>
-      <w:r>
-        <w:t>a</w:t>
-      </w:r>
-      <w:r>
-        <w:t xml:space="preserve"> es el número de pedidos del país </w:t>
-      </w:r>
-      <w:r>
-        <w:t>busca</w:t>
+        <w:t>El Req2 tiene una complejidad de O(a + m log m), donde a es el número de pedidos del país busca</w:t>
       </w:r>
       <w:r>
         <w:t>do</w:t>
@@ -2122,6 +2107,90 @@
       </w:r>
       <w:r>
         <w:t>implementación y no de orden de complejidad.</w:t>
+      </w:r>
+    </w:p>
+    <w:p>
+      <w:r>
+        <w:lastRenderedPageBreak/>
+        <w:drawing>
+          <wp:inline distT="0" distB="0" distL="0" distR="0" wp14:anchorId="19DA7271" wp14:editId="7159C6FB">
+            <wp:extent cx="5943600" cy="6831330"/>
+            <wp:effectExtent l="0" t="0" r="0" b="1270"/>
+            <wp:docPr id="1018867096" name="Picture 1"/>
+            <wp:cNvGraphicFramePr>
+              <a:graphicFrameLocks xmlns:a="http://schemas.openxmlformats.org/drawingml/2006/main" noChangeAspect="1"/>
+            </wp:cNvGraphicFramePr>
+            <a:graphic xmlns:a="http://schemas.openxmlformats.org/drawingml/2006/main">
+              <a:graphicData uri="http://schemas.openxmlformats.org/drawingml/2006/picture">
+                <pic:pic xmlns:pic="http://schemas.openxmlformats.org/drawingml/2006/picture">
+                  <pic:nvPicPr>
+                    <pic:cNvPr id="1018867096" name=""/>
+                    <pic:cNvPicPr/>
+                  </pic:nvPicPr>
+                  <pic:blipFill>
+                    <a:blip r:embed="rId11"/>
+                    <a:stretch>
+                      <a:fillRect/>
+                    </a:stretch>
+                  </pic:blipFill>
+                  <pic:spPr>
+                    <a:xfrm>
+                      <a:off x="0" y="0"/>
+                      <a:ext cx="5943600" cy="6831330"/>
+                    </a:xfrm>
+                    <a:prstGeom prst="rect">
+                      <a:avLst/>
+                    </a:prstGeom>
+                  </pic:spPr>
+                </pic:pic>
+              </a:graphicData>
+            </a:graphic>
+          </wp:inline>
+        </w:drawing>
+      </w:r>
+      <w:r>
+        <w:rPr>
+          <w:noProof/>
+        </w:rPr>
+        <w:t xml:space="preserve"> </w:t>
+      </w:r>
+      <w:r>
+        <w:lastRenderedPageBreak/>
+        <w:drawing>
+          <wp:inline distT="0" distB="0" distL="0" distR="0" wp14:anchorId="28526A7D" wp14:editId="1523082B">
+            <wp:extent cx="5943600" cy="5193030"/>
+            <wp:effectExtent l="0" t="0" r="0" b="1270"/>
+            <wp:docPr id="257146123" name="Picture 1"/>
+            <wp:cNvGraphicFramePr>
+              <a:graphicFrameLocks xmlns:a="http://schemas.openxmlformats.org/drawingml/2006/main" noChangeAspect="1"/>
+            </wp:cNvGraphicFramePr>
+            <a:graphic xmlns:a="http://schemas.openxmlformats.org/drawingml/2006/main">
+              <a:graphicData uri="http://schemas.openxmlformats.org/drawingml/2006/picture">
+                <pic:pic xmlns:pic="http://schemas.openxmlformats.org/drawingml/2006/picture">
+                  <pic:nvPicPr>
+                    <pic:cNvPr id="257146123" name=""/>
+                    <pic:cNvPicPr/>
+                  </pic:nvPicPr>
+                  <pic:blipFill>
+                    <a:blip r:embed="rId12"/>
+                    <a:stretch>
+                      <a:fillRect/>
+                    </a:stretch>
+                  </pic:blipFill>
+                  <pic:spPr>
+                    <a:xfrm>
+                      <a:off x="0" y="0"/>
+                      <a:ext cx="5943600" cy="5193030"/>
+                    </a:xfrm>
+                    <a:prstGeom prst="rect">
+                      <a:avLst/>
+                    </a:prstGeom>
+                  </pic:spPr>
+                </pic:pic>
+              </a:graphicData>
+            </a:graphic>
+          </wp:inline>
+        </w:drawing>
       </w:r>
     </w:p>
     <w:p/>
@@ -2161,7 +2230,7 @@
                     <pic:cNvPicPr/>
                   </pic:nvPicPr>
                   <pic:blipFill>
-                    <a:blip r:embed="rId11"/>
+                    <a:blip r:embed="rId13"/>
                     <a:stretch>
                       <a:fillRect/>
                     </a:stretch>
@@ -2201,7 +2270,7 @@
                     <pic:cNvPicPr/>
                   </pic:nvPicPr>
                   <pic:blipFill>
-                    <a:blip r:embed="rId12"/>
+                    <a:blip r:embed="rId14"/>
                     <a:stretch>
                       <a:fillRect/>
                     </a:stretch>
@@ -2244,7 +2313,7 @@
                     <pic:cNvPicPr/>
                   </pic:nvPicPr>
                   <pic:blipFill>
-                    <a:blip r:embed="rId13"/>
+                    <a:blip r:embed="rId15"/>
                     <a:stretch>
                       <a:fillRect/>
                     </a:stretch>
@@ -4592,6 +4661,85 @@
       </w:r>
       <w:r>
         <w:t>implementación y no al orden de complejidad.</w:t>
+      </w:r>
+    </w:p>
+    <w:p>
+      <w:r>
+        <w:drawing>
+          <wp:inline distT="0" distB="0" distL="0" distR="0" wp14:anchorId="51B40F16" wp14:editId="1EDC7F8B">
+            <wp:extent cx="5943600" cy="6192520"/>
+            <wp:effectExtent l="0" t="0" r="0" b="5080"/>
+            <wp:docPr id="1127058280" name="Picture 1"/>
+            <wp:cNvGraphicFramePr>
+              <a:graphicFrameLocks xmlns:a="http://schemas.openxmlformats.org/drawingml/2006/main" noChangeAspect="1"/>
+            </wp:cNvGraphicFramePr>
+            <a:graphic xmlns:a="http://schemas.openxmlformats.org/drawingml/2006/main">
+              <a:graphicData uri="http://schemas.openxmlformats.org/drawingml/2006/picture">
+                <pic:pic xmlns:pic="http://schemas.openxmlformats.org/drawingml/2006/picture">
+                  <pic:nvPicPr>
+                    <pic:cNvPr id="1127058280" name=""/>
+                    <pic:cNvPicPr/>
+                  </pic:nvPicPr>
+                  <pic:blipFill>
+                    <a:blip r:embed="rId16"/>
+                    <a:stretch>
+                      <a:fillRect/>
+                    </a:stretch>
+                  </pic:blipFill>
+                  <pic:spPr>
+                    <a:xfrm>
+                      <a:off x="0" y="0"/>
+                      <a:ext cx="5943600" cy="6192520"/>
+                    </a:xfrm>
+                    <a:prstGeom prst="rect">
+                      <a:avLst/>
+                    </a:prstGeom>
+                  </pic:spPr>
+                </pic:pic>
+              </a:graphicData>
+            </a:graphic>
+          </wp:inline>
+        </w:drawing>
+      </w:r>
+    </w:p>
+    <w:p>
+      <w:r>
+        <w:lastRenderedPageBreak/>
+        <w:drawing>
+          <wp:inline distT="0" distB="0" distL="0" distR="0" wp14:anchorId="20546BD0" wp14:editId="71D302B1">
+            <wp:extent cx="5943600" cy="3882390"/>
+            <wp:effectExtent l="0" t="0" r="0" b="3810"/>
+            <wp:docPr id="162847154" name="Picture 1"/>
+            <wp:cNvGraphicFramePr>
+              <a:graphicFrameLocks xmlns:a="http://schemas.openxmlformats.org/drawingml/2006/main" noChangeAspect="1"/>
+            </wp:cNvGraphicFramePr>
+            <a:graphic xmlns:a="http://schemas.openxmlformats.org/drawingml/2006/main">
+              <a:graphicData uri="http://schemas.openxmlformats.org/drawingml/2006/picture">
+                <pic:pic xmlns:pic="http://schemas.openxmlformats.org/drawingml/2006/picture">
+                  <pic:nvPicPr>
+                    <pic:cNvPr id="162847154" name=""/>
+                    <pic:cNvPicPr/>
+                  </pic:nvPicPr>
+                  <pic:blipFill>
+                    <a:blip r:embed="rId17"/>
+                    <a:stretch>
+                      <a:fillRect/>
+                    </a:stretch>
+                  </pic:blipFill>
+                  <pic:spPr>
+                    <a:xfrm>
+                      <a:off x="0" y="0"/>
+                      <a:ext cx="5943600" cy="3882390"/>
+                    </a:xfrm>
+                    <a:prstGeom prst="rect">
+                      <a:avLst/>
+                    </a:prstGeom>
+                  </pic:spPr>
+                </pic:pic>
+              </a:graphicData>
+            </a:graphic>
+          </wp:inline>
+        </w:drawing>
       </w:r>
     </w:p>
     <w:p>
@@ -4632,7 +4780,7 @@
                     <pic:cNvPicPr/>
                   </pic:nvPicPr>
                   <pic:blipFill>
-                    <a:blip r:embed="rId14"/>
+                    <a:blip r:embed="rId18"/>
                     <a:stretch>
                       <a:fillRect/>
                     </a:stretch>
@@ -4675,7 +4823,7 @@
                     <pic:cNvPicPr/>
                   </pic:nvPicPr>
                   <pic:blipFill>
-                    <a:blip r:embed="rId15"/>
+                    <a:blip r:embed="rId19"/>
                     <a:stretch>
                       <a:fillRect/>
                     </a:stretch>
@@ -4717,7 +4865,7 @@
                     <pic:cNvPicPr/>
                   </pic:nvPicPr>
                   <pic:blipFill>
-                    <a:blip r:embed="rId16"/>
+                    <a:blip r:embed="rId20"/>
                     <a:stretch>
                       <a:fillRect/>
                     </a:stretch>
@@ -5238,10 +5386,10 @@
       </w:r>
     </w:p>
     <w:sectPr>
-      <w:headerReference w:type="default" r:id="rId17"/>
-      <w:footerReference w:type="default" r:id="rId18"/>
-      <w:headerReference w:type="first" r:id="rId19"/>
-      <w:footerReference w:type="first" r:id="rId20"/>
+      <w:headerReference w:type="default" r:id="rId21"/>
+      <w:footerReference w:type="default" r:id="rId22"/>
+      <w:headerReference w:type="first" r:id="rId23"/>
+      <w:footerReference w:type="first" r:id="rId24"/>
       <w:pgSz w:w="12240" w:h="15840"/>
       <w:pgMar w:top="1440" w:right="1440" w:bottom="1440" w:left="1440" w:header="720" w:footer="720" w:gutter="0"/>
       <w:cols w:space="720"/>
@@ -9607,63 +9755,10 @@
 </file>
 
 <file path=customXml/item1.xml><?xml version="1.0" encoding="utf-8"?>
-<?mso-contentType ?>
-<FormTemplates xmlns="http://schemas.microsoft.com/sharepoint/v3/contenttype/forms">
-  <Display>DocumentLibraryForm</Display>
-  <Edit>DocumentLibraryForm</Edit>
-  <New>DocumentLibraryForm</New>
-</FormTemplates>
+<b:Sources xmlns:b="http://schemas.openxmlformats.org/officeDocument/2006/bibliography" xmlns="http://schemas.openxmlformats.org/officeDocument/2006/bibliography" SelectedStyle="\APASixthEditionOfficeOnline.xsl" StyleName="APA" Version="6"/>
 </file>
 
 <file path=customXml/item2.xml><?xml version="1.0" encoding="utf-8"?>
-<p:properties xmlns:p="http://schemas.microsoft.com/office/2006/metadata/properties" xmlns:xsi="http://www.w3.org/2001/XMLSchema-instance" xmlns:pc="http://schemas.microsoft.com/office/infopath/2007/PartnerControls">
-  <documentManagement>
-    <SharedWithUsers xmlns="85e30bcc-d76c-4413-8e4d-2dce22fb0743">
-      <UserInfo>
-        <DisplayName>Dario Ernesto Correal Torres</DisplayName>
-        <AccountId>15</AccountId>
-        <AccountType/>
-      </UserInfo>
-      <UserInfo>
-        <DisplayName>Carlos Andres Lozano Garzon</DisplayName>
-        <AccountId>13</AccountId>
-        <AccountType/>
-      </UserInfo>
-      <UserInfo>
-        <DisplayName>Mario  Fernando De la rosa Rosero</DisplayName>
-        <AccountId>16</AccountId>
-        <AccountType/>
-      </UserInfo>
-      <UserInfo>
-        <DisplayName>Arturo Henao Chaparro</DisplayName>
-        <AccountId>48</AccountId>
-        <AccountType/>
-      </UserInfo>
-      <UserInfo>
-        <DisplayName>Luis Esteban Florez Salamanca</DisplayName>
-        <AccountId>33</AccountId>
-        <AccountType/>
-      </UserInfo>
-      <UserInfo>
-        <DisplayName>Christian Camilo Aparicio Baquen</DisplayName>
-        <AccountId>50</AccountId>
-        <AccountType/>
-      </UserInfo>
-      <UserInfo>
-        <DisplayName>Ivan David Salazar Cardenas</DisplayName>
-        <AccountId>52</AccountId>
-        <AccountType/>
-      </UserInfo>
-    </SharedWithUsers>
-    <TaxCatchAll xmlns="85e30bcc-d76c-4413-8e4d-2dce22fb0743" xsi:nil="true"/>
-    <lcf76f155ced4ddcb4097134ff3c332f xmlns="164883f8-7691-4ecf-b54a-664c0d0edefe">
-      <Terms xmlns="http://schemas.microsoft.com/office/infopath/2007/PartnerControls"/>
-    </lcf76f155ced4ddcb4097134ff3c332f>
-  </documentManagement>
-</p:properties>
-</file>
-
-<file path=customXml/item3.xml><?xml version="1.0" encoding="utf-8"?>
 <ct:contentTypeSchema xmlns:ct="http://schemas.microsoft.com/office/2006/metadata/contentType" xmlns:ma="http://schemas.microsoft.com/office/2006/metadata/properties/metaAttributes" ct:_="" ma:_="" ma:contentTypeName="Documento" ma:contentTypeID="0x01010023858CF01A2EF24688B692775F4C60A4" ma:contentTypeVersion="15" ma:contentTypeDescription="Crear nuevo documento." ma:contentTypeScope="" ma:versionID="a4df9e4b793c0fa050084ef4feafa589">
   <xsd:schema xmlns:xsd="http://www.w3.org/2001/XMLSchema" xmlns:xs="http://www.w3.org/2001/XMLSchema" xmlns:p="http://schemas.microsoft.com/office/2006/metadata/properties" xmlns:ns2="164883f8-7691-4ecf-b54a-664c0d0edefe" xmlns:ns3="85e30bcc-d76c-4413-8e4d-2dce22fb0743" targetNamespace="http://schemas.microsoft.com/office/2006/metadata/properties" ma:root="true" ma:fieldsID="067b7080d2289f9ba15465beea7d18a8" ns2:_="" ns3:_="">
     <xsd:import namespace="164883f8-7691-4ecf-b54a-664c0d0edefe"/>
@@ -9900,30 +9995,72 @@
 </ct:contentTypeSchema>
 </file>
 
+<file path=customXml/item3.xml><?xml version="1.0" encoding="utf-8"?>
+<p:properties xmlns:p="http://schemas.microsoft.com/office/2006/metadata/properties" xmlns:xsi="http://www.w3.org/2001/XMLSchema-instance" xmlns:pc="http://schemas.microsoft.com/office/infopath/2007/PartnerControls">
+  <documentManagement>
+    <SharedWithUsers xmlns="85e30bcc-d76c-4413-8e4d-2dce22fb0743">
+      <UserInfo>
+        <DisplayName>Dario Ernesto Correal Torres</DisplayName>
+        <AccountId>15</AccountId>
+        <AccountType/>
+      </UserInfo>
+      <UserInfo>
+        <DisplayName>Carlos Andres Lozano Garzon</DisplayName>
+        <AccountId>13</AccountId>
+        <AccountType/>
+      </UserInfo>
+      <UserInfo>
+        <DisplayName>Mario  Fernando De la rosa Rosero</DisplayName>
+        <AccountId>16</AccountId>
+        <AccountType/>
+      </UserInfo>
+      <UserInfo>
+        <DisplayName>Arturo Henao Chaparro</DisplayName>
+        <AccountId>48</AccountId>
+        <AccountType/>
+      </UserInfo>
+      <UserInfo>
+        <DisplayName>Luis Esteban Florez Salamanca</DisplayName>
+        <AccountId>33</AccountId>
+        <AccountType/>
+      </UserInfo>
+      <UserInfo>
+        <DisplayName>Christian Camilo Aparicio Baquen</DisplayName>
+        <AccountId>50</AccountId>
+        <AccountType/>
+      </UserInfo>
+      <UserInfo>
+        <DisplayName>Ivan David Salazar Cardenas</DisplayName>
+        <AccountId>52</AccountId>
+        <AccountType/>
+      </UserInfo>
+    </SharedWithUsers>
+    <TaxCatchAll xmlns="85e30bcc-d76c-4413-8e4d-2dce22fb0743" xsi:nil="true"/>
+    <lcf76f155ced4ddcb4097134ff3c332f xmlns="164883f8-7691-4ecf-b54a-664c0d0edefe">
+      <Terms xmlns="http://schemas.microsoft.com/office/infopath/2007/PartnerControls"/>
+    </lcf76f155ced4ddcb4097134ff3c332f>
+  </documentManagement>
+</p:properties>
+</file>
+
 <file path=customXml/item4.xml><?xml version="1.0" encoding="utf-8"?>
-<b:Sources xmlns:b="http://schemas.openxmlformats.org/officeDocument/2006/bibliography" xmlns="http://schemas.openxmlformats.org/officeDocument/2006/bibliography" SelectedStyle="\APASixthEditionOfficeOnline.xsl" StyleName="APA" Version="6"/>
+<?mso-contentType ?>
+<FormTemplates xmlns="http://schemas.microsoft.com/sharepoint/v3/contenttype/forms">
+  <Display>DocumentLibraryForm</Display>
+  <Edit>DocumentLibraryForm</Edit>
+  <New>DocumentLibraryForm</New>
+</FormTemplates>
 </file>
 
 <file path=customXml/itemProps1.xml><?xml version="1.0" encoding="utf-8"?>
-<ds:datastoreItem xmlns:ds="http://schemas.openxmlformats.org/officeDocument/2006/customXml" ds:itemID="{58AFF83A-2C1F-4B0C-9BCE-EE49F5226348}">
+<ds:datastoreItem xmlns:ds="http://schemas.openxmlformats.org/officeDocument/2006/customXml" ds:itemID="{794BE61C-5254-4531-868C-EC2590174185}">
   <ds:schemaRefs>
-    <ds:schemaRef ds:uri="http://schemas.microsoft.com/sharepoint/v3/contenttype/forms"/>
+    <ds:schemaRef ds:uri="http://schemas.openxmlformats.org/officeDocument/2006/bibliography"/>
   </ds:schemaRefs>
 </ds:datastoreItem>
 </file>
 
 <file path=customXml/itemProps2.xml><?xml version="1.0" encoding="utf-8"?>
-<ds:datastoreItem xmlns:ds="http://schemas.openxmlformats.org/officeDocument/2006/customXml" ds:itemID="{D3B4676A-CA48-4E6B-BABE-1535A7A288F6}">
-  <ds:schemaRefs>
-    <ds:schemaRef ds:uri="http://schemas.microsoft.com/office/2006/metadata/properties"/>
-    <ds:schemaRef ds:uri="http://schemas.microsoft.com/office/infopath/2007/PartnerControls"/>
-    <ds:schemaRef ds:uri="85e30bcc-d76c-4413-8e4d-2dce22fb0743"/>
-    <ds:schemaRef ds:uri="164883f8-7691-4ecf-b54a-664c0d0edefe"/>
-  </ds:schemaRefs>
-</ds:datastoreItem>
-</file>
-
-<file path=customXml/itemProps3.xml><?xml version="1.0" encoding="utf-8"?>
 <ds:datastoreItem xmlns:ds="http://schemas.openxmlformats.org/officeDocument/2006/customXml" ds:itemID="{62F3E371-4CEE-4871-A936-27DA1639FADD}">
   <ds:schemaRefs>
     <ds:schemaRef ds:uri="http://schemas.microsoft.com/office/2006/metadata/contentType"/>
@@ -9942,10 +10079,21 @@
 </ds:datastoreItem>
 </file>
 
+<file path=customXml/itemProps3.xml><?xml version="1.0" encoding="utf-8"?>
+<ds:datastoreItem xmlns:ds="http://schemas.openxmlformats.org/officeDocument/2006/customXml" ds:itemID="{D3B4676A-CA48-4E6B-BABE-1535A7A288F6}">
+  <ds:schemaRefs>
+    <ds:schemaRef ds:uri="http://schemas.microsoft.com/office/2006/metadata/properties"/>
+    <ds:schemaRef ds:uri="http://schemas.microsoft.com/office/infopath/2007/PartnerControls"/>
+    <ds:schemaRef ds:uri="85e30bcc-d76c-4413-8e4d-2dce22fb0743"/>
+    <ds:schemaRef ds:uri="164883f8-7691-4ecf-b54a-664c0d0edefe"/>
+  </ds:schemaRefs>
+</ds:datastoreItem>
+</file>
+
 <file path=customXml/itemProps4.xml><?xml version="1.0" encoding="utf-8"?>
-<ds:datastoreItem xmlns:ds="http://schemas.openxmlformats.org/officeDocument/2006/customXml" ds:itemID="{794BE61C-5254-4531-868C-EC2590174185}">
+<ds:datastoreItem xmlns:ds="http://schemas.openxmlformats.org/officeDocument/2006/customXml" ds:itemID="{58AFF83A-2C1F-4B0C-9BCE-EE49F5226348}">
   <ds:schemaRefs>
-    <ds:schemaRef ds:uri="http://schemas.openxmlformats.org/officeDocument/2006/bibliography"/>
+    <ds:schemaRef ds:uri="http://schemas.microsoft.com/sharepoint/v3/contenttype/forms"/>
   </ds:schemaRefs>
 </ds:datastoreItem>
 </file>
</xml_diff>

<commit_message>
cambios print req 5
</commit_message>
<xml_diff>
--- a/Docs/ISIS1225 - AnalisisReto-TEMPLATE RETO.docx
+++ b/Docs/ISIS1225 - AnalisisReto-TEMPLATE RETO.docx
@@ -4,7 +4,7 @@
   <w:body>
     <w:p>
       <w:pPr>
-        <w:pStyle w:val="Title"/>
+        <w:pStyle w:val="Ttulo"/>
         <w:jc w:val="center"/>
         <w:rPr>
           <w:b/>
@@ -55,7 +55,7 @@
     </w:p>
     <w:p>
       <w:pPr>
-        <w:pStyle w:val="Heading1"/>
+        <w:pStyle w:val="Ttulo1"/>
         <w:rPr>
           <w:b/>
           <w:bCs/>
@@ -83,7 +83,7 @@
     </w:p>
     <w:tbl>
       <w:tblPr>
-        <w:tblStyle w:val="TableGrid"/>
+        <w:tblStyle w:val="Tablaconcuadrcula"/>
         <w:tblW w:w="9360" w:type="dxa"/>
         <w:tblLayout w:type="fixed"/>
         <w:tblLook w:val="06A0" w:firstRow="1" w:lastRow="0" w:firstColumn="1" w:lastColumn="0" w:noHBand="1" w:noVBand="1"/>
@@ -118,38 +118,15 @@
             <w:tcW w:w="6300" w:type="dxa"/>
           </w:tcPr>
           <w:p>
-            <w:proofErr w:type="spellStart"/>
             <w:r>
               <w:t>Catalog</w:t>
             </w:r>
-            <w:proofErr w:type="spellEnd"/>
             <w:r>
               <w:t xml:space="preserve"> </w:t>
             </w:r>
             <w:r>
-              <w:t xml:space="preserve">, </w:t>
-            </w:r>
-            <w:proofErr w:type="spellStart"/>
-            <w:r>
-              <w:t>anio</w:t>
-            </w:r>
-            <w:proofErr w:type="spellEnd"/>
-            <w:r>
-              <w:t xml:space="preserve">, mes, </w:t>
-            </w:r>
-            <w:proofErr w:type="spellStart"/>
-            <w:r>
-              <w:t>descuento_min</w:t>
-            </w:r>
-            <w:proofErr w:type="spellEnd"/>
-            <w:r>
-              <w:t xml:space="preserve">, </w:t>
-            </w:r>
-            <w:proofErr w:type="spellStart"/>
-            <w:r>
-              <w:t>descuento_max</w:t>
-            </w:r>
-            <w:proofErr w:type="spellEnd"/>
+              <w:t>, anio, mes, descuento_min, descuento_max</w:t>
+            </w:r>
           </w:p>
         </w:tc>
       </w:tr>
@@ -180,55 +157,7 @@
           </w:tcPr>
           <w:p>
             <w:r>
-              <w:t xml:space="preserve">Lista “resultado” con tiempo de ejecución del requerimiento en milisegundos, número total de pedidos que cumplieron el filtro, precio promedio de </w:t>
-            </w:r>
-            <w:proofErr w:type="spellStart"/>
-            <w:r>
-              <w:t>Price_per_Box</w:t>
-            </w:r>
-            <w:proofErr w:type="spellEnd"/>
-            <w:r>
-              <w:t xml:space="preserve">, promedio de </w:t>
-            </w:r>
-            <w:proofErr w:type="spellStart"/>
-            <w:r>
-              <w:t>Discount_Pct</w:t>
-            </w:r>
-            <w:proofErr w:type="spellEnd"/>
-            <w:r>
-              <w:t xml:space="preserve">, promedio de </w:t>
-            </w:r>
-            <w:proofErr w:type="spellStart"/>
-            <w:r>
-              <w:t>Marketing_Spend</w:t>
-            </w:r>
-            <w:proofErr w:type="spellEnd"/>
-            <w:r>
-              <w:t xml:space="preserve">, promedio de </w:t>
-            </w:r>
-            <w:proofErr w:type="spellStart"/>
-            <w:r>
-              <w:t>Boxes_Shipped</w:t>
-            </w:r>
-            <w:proofErr w:type="spellEnd"/>
-            <w:r>
-              <w:t xml:space="preserve"> y los dos criterios con mayor </w:t>
-            </w:r>
-            <w:proofErr w:type="spellStart"/>
-            <w:r>
-              <w:t>amount</w:t>
-            </w:r>
-            <w:proofErr w:type="spellEnd"/>
-            <w:r>
-              <w:t xml:space="preserve"> de los que cumplen el criterio con los datos </w:t>
-            </w:r>
-            <w:proofErr w:type="spellStart"/>
-            <w:r>
-              <w:t>Order_ID</w:t>
-            </w:r>
-            <w:proofErr w:type="spellEnd"/>
-            <w:r>
-              <w:t xml:space="preserve">, </w:t>
+              <w:t xml:space="preserve">Lista “resultado” con tiempo de ejecución del requerimiento en milisegundos, número total de pedidos que cumplieron el filtro, precio promedio de Price_per_Box, promedio de Discount_Pct, promedio de Marketing_Spend, promedio de Boxes_Shipped y los dos criterios con mayor amount de los que cumplen el criterio con los datos Order_ID, </w:t>
             </w:r>
             <w:r>
               <w:t>Canal (Channel)</w:t>
@@ -237,34 +166,10 @@
               <w:t>,</w:t>
             </w:r>
             <w:r>
-              <w:t xml:space="preserve"> Fecha (</w:t>
-            </w:r>
-            <w:proofErr w:type="spellStart"/>
-            <w:r>
-              <w:t>Order_Date</w:t>
-            </w:r>
-            <w:proofErr w:type="spellEnd"/>
-            <w:r>
-              <w:t>)</w:t>
-            </w:r>
-            <w:r>
-              <w:t>, Cajas enviadas (</w:t>
-            </w:r>
-            <w:proofErr w:type="spellStart"/>
-            <w:r>
-              <w:t>Boxes_Shipped</w:t>
-            </w:r>
-            <w:proofErr w:type="spellEnd"/>
-            <w:r>
-              <w:t>) y Monto (</w:t>
-            </w:r>
-            <w:proofErr w:type="spellStart"/>
-            <w:r>
-              <w:t>Amount</w:t>
-            </w:r>
-            <w:proofErr w:type="spellEnd"/>
-            <w:r>
-              <w:t>)</w:t>
+              <w:t xml:space="preserve"> Fecha (Order_Date)</w:t>
+            </w:r>
+            <w:r>
+              <w:t>, Cajas enviadas (Boxes_Shipped) y Monto (Amount)</w:t>
             </w:r>
           </w:p>
         </w:tc>
@@ -296,15 +201,7 @@
           </w:tcPr>
           <w:p>
             <w:r>
-              <w:t xml:space="preserve">Si, </w:t>
-            </w:r>
-            <w:proofErr w:type="spellStart"/>
-            <w:r>
-              <w:t>Jose</w:t>
-            </w:r>
-            <w:proofErr w:type="spellEnd"/>
-            <w:r>
-              <w:t xml:space="preserve"> Alexander Santos Cobos</w:t>
+              <w:t>Si, Jose Alexander Santos Cobos</w:t>
             </w:r>
           </w:p>
         </w:tc>
@@ -313,7 +210,7 @@
     <w:p/>
     <w:p>
       <w:pPr>
-        <w:pStyle w:val="Heading2"/>
+        <w:pStyle w:val="Ttulo2"/>
         <w:rPr>
           <w:b/>
           <w:bCs/>
@@ -340,7 +237,7 @@
     </w:p>
     <w:tbl>
       <w:tblPr>
-        <w:tblStyle w:val="TableGrid"/>
+        <w:tblStyle w:val="Tablaconcuadrcula"/>
         <w:tblW w:w="0" w:type="auto"/>
         <w:tblLayout w:type="fixed"/>
         <w:tblLook w:val="06A0" w:firstRow="1" w:lastRow="0" w:firstColumn="1" w:lastColumn="0" w:noHBand="1" w:noVBand="1"/>
@@ -456,9 +353,21 @@
                 <w:szCs w:val="20"/>
                 <w:lang w:eastAsia="es-CO"/>
               </w:rPr>
-              <w:t xml:space="preserve">Paso 2: Se busca la llave en la tabla de hash de Linear </w:t>
-            </w:r>
-            <w:proofErr w:type="spellStart"/>
+              <w:t>Paso 2: Se busca la llave en la tabla de hash de Linear Probing y se obtiene la lista de pedidos de ese mes</w:t>
+            </w:r>
+          </w:p>
+        </w:tc>
+        <w:tc>
+          <w:tcPr>
+            <w:tcW w:w="4275" w:type="dxa"/>
+          </w:tcPr>
+          <w:p>
+            <w:pPr>
+              <w:rPr>
+                <w:b/>
+                <w:bCs/>
+              </w:rPr>
+            </w:pPr>
             <w:r>
               <w:rPr>
                 <w:rFonts w:ascii="Arial" w:eastAsia="Times New Roman" w:hAnsi="Arial" w:cs="Arial"/>
@@ -466,9 +375,23 @@
                 <w:szCs w:val="20"/>
                 <w:lang w:eastAsia="es-CO"/>
               </w:rPr>
-              <w:t>Probing</w:t>
-            </w:r>
-            <w:proofErr w:type="spellEnd"/>
+              <w:t xml:space="preserve">O(1) </w:t>
+            </w:r>
+          </w:p>
+        </w:tc>
+      </w:tr>
+      <w:tr>
+        <w:tc>
+          <w:tcPr>
+            <w:tcW w:w="5070" w:type="dxa"/>
+          </w:tcPr>
+          <w:p>
+            <w:pPr>
+              <w:rPr>
+                <w:b/>
+                <w:bCs/>
+              </w:rPr>
+            </w:pPr>
             <w:r>
               <w:rPr>
                 <w:rFonts w:ascii="Arial" w:eastAsia="Times New Roman" w:hAnsi="Arial" w:cs="Arial"/>
@@ -476,7 +399,7 @@
                 <w:szCs w:val="20"/>
                 <w:lang w:eastAsia="es-CO"/>
               </w:rPr>
-              <w:t xml:space="preserve"> y se obtiene la lista de pedidos de ese mes</w:t>
+              <w:t>Paso 3: Se crea la lista vacía de filtrados y se inicializa el acumulador del monto</w:t>
             </w:r>
           </w:p>
         </w:tc>
@@ -498,7 +421,7 @@
                 <w:szCs w:val="20"/>
                 <w:lang w:eastAsia="es-CO"/>
               </w:rPr>
-              <w:t xml:space="preserve">O(1) </w:t>
+              <w:t>O(1)</w:t>
             </w:r>
           </w:p>
         </w:tc>
@@ -522,21 +445,8 @@
                 <w:szCs w:val="20"/>
                 <w:lang w:eastAsia="es-CO"/>
               </w:rPr>
-              <w:t>Paso 3: Se crea la lista vacía de filtrados y se inicializa el acumulador del monto</w:t>
-            </w:r>
-          </w:p>
-        </w:tc>
-        <w:tc>
-          <w:tcPr>
-            <w:tcW w:w="4275" w:type="dxa"/>
-          </w:tcPr>
-          <w:p>
-            <w:pPr>
-              <w:rPr>
-                <w:b/>
-                <w:bCs/>
-              </w:rPr>
-            </w:pPr>
+              <w:t>Paso 4: Se recorren los m pedidos del mes</w:t>
+            </w:r>
             <w:r>
               <w:rPr>
                 <w:rFonts w:ascii="Arial" w:eastAsia="Times New Roman" w:hAnsi="Arial" w:cs="Arial"/>
@@ -544,23 +454,8 @@
                 <w:szCs w:val="20"/>
                 <w:lang w:eastAsia="es-CO"/>
               </w:rPr>
-              <w:t>O(1)</w:t>
-            </w:r>
-          </w:p>
-        </w:tc>
-      </w:tr>
-      <w:tr>
-        <w:tc>
-          <w:tcPr>
-            <w:tcW w:w="5070" w:type="dxa"/>
-          </w:tcPr>
-          <w:p>
-            <w:pPr>
-              <w:rPr>
-                <w:b/>
-                <w:bCs/>
-              </w:rPr>
-            </w:pPr>
+              <w:t xml:space="preserve">, se </w:t>
+            </w:r>
             <w:r>
               <w:rPr>
                 <w:rFonts w:ascii="Arial" w:eastAsia="Times New Roman" w:hAnsi="Arial" w:cs="Arial"/>
@@ -568,8 +463,21 @@
                 <w:szCs w:val="20"/>
                 <w:lang w:eastAsia="es-CO"/>
               </w:rPr>
-              <w:t>Paso 4: Se recorren los m pedidos del mes</w:t>
-            </w:r>
+              <w:t>lee el descuento, se compara con el rango y, si cumple, se agrega al final de filtrados y se suma su Amount</w:t>
+            </w:r>
+          </w:p>
+        </w:tc>
+        <w:tc>
+          <w:tcPr>
+            <w:tcW w:w="4275" w:type="dxa"/>
+          </w:tcPr>
+          <w:p>
+            <w:pPr>
+              <w:rPr>
+                <w:b/>
+                <w:bCs/>
+              </w:rPr>
+            </w:pPr>
             <w:r>
               <w:rPr>
                 <w:rFonts w:ascii="Arial" w:eastAsia="Times New Roman" w:hAnsi="Arial" w:cs="Arial"/>
@@ -577,7 +485,7 @@
                 <w:szCs w:val="20"/>
                 <w:lang w:eastAsia="es-CO"/>
               </w:rPr>
-              <w:t xml:space="preserve">, se </w:t>
+              <w:t>O(m)</w:t>
             </w:r>
             <w:r>
               <w:rPr>
@@ -586,9 +494,23 @@
                 <w:szCs w:val="20"/>
                 <w:lang w:eastAsia="es-CO"/>
               </w:rPr>
-              <w:t xml:space="preserve">lee el descuento, se compara con el rango y, si cumple, se agrega al final de filtrados y se suma su </w:t>
-            </w:r>
-            <w:proofErr w:type="spellStart"/>
+              <w:t>, donde m = pedidos filtrados del mes</w:t>
+            </w:r>
+          </w:p>
+        </w:tc>
+      </w:tr>
+      <w:tr>
+        <w:tc>
+          <w:tcPr>
+            <w:tcW w:w="5070" w:type="dxa"/>
+          </w:tcPr>
+          <w:p>
+            <w:pPr>
+              <w:rPr>
+                <w:b/>
+                <w:bCs/>
+              </w:rPr>
+            </w:pPr>
             <w:r>
               <w:rPr>
                 <w:rFonts w:ascii="Arial" w:eastAsia="Times New Roman" w:hAnsi="Arial" w:cs="Arial"/>
@@ -596,9 +518,8 @@
                 <w:szCs w:val="20"/>
                 <w:lang w:eastAsia="es-CO"/>
               </w:rPr>
-              <w:t>Amount</w:t>
-            </w:r>
-            <w:proofErr w:type="spellEnd"/>
+              <w:t>Paso 5: Se arma el diccionario de resultado con el total y el monto acumulado</w:t>
+            </w:r>
           </w:p>
         </w:tc>
         <w:tc>
@@ -619,8 +540,23 @@
                 <w:szCs w:val="20"/>
                 <w:lang w:eastAsia="es-CO"/>
               </w:rPr>
-              <w:t>O(m)</w:t>
-            </w:r>
+              <w:t>O(1)</w:t>
+            </w:r>
+          </w:p>
+        </w:tc>
+      </w:tr>
+      <w:tr>
+        <w:tc>
+          <w:tcPr>
+            <w:tcW w:w="5070" w:type="dxa"/>
+          </w:tcPr>
+          <w:p>
+            <w:pPr>
+              <w:rPr>
+                <w:b/>
+                <w:bCs/>
+              </w:rPr>
+            </w:pPr>
             <w:r>
               <w:rPr>
                 <w:rFonts w:ascii="Arial" w:eastAsia="Times New Roman" w:hAnsi="Arial" w:cs="Arial"/>
@@ -628,44 +564,22 @@
                 <w:szCs w:val="20"/>
                 <w:lang w:eastAsia="es-CO"/>
               </w:rPr>
-              <w:t>, donde m = pedidos filtrados del mes</w:t>
-            </w:r>
-          </w:p>
-        </w:tc>
-      </w:tr>
-      <w:tr>
-        <w:tc>
-          <w:tcPr>
-            <w:tcW w:w="5070" w:type="dxa"/>
+              <w:t>Paso 6: Se recorren los pedidos filtrados para sumar Price_per_Box y Boxes_Shipped</w:t>
+            </w:r>
+          </w:p>
+        </w:tc>
+        <w:tc>
+          <w:tcPr>
+            <w:tcW w:w="4275" w:type="dxa"/>
           </w:tcPr>
           <w:p>
             <w:pPr>
-              <w:rPr>
-                <w:b/>
-                <w:bCs/>
-              </w:rPr>
-            </w:pPr>
-            <w:r>
               <w:rPr>
                 <w:rFonts w:ascii="Arial" w:eastAsia="Times New Roman" w:hAnsi="Arial" w:cs="Arial"/>
                 <w:sz w:val="20"/>
                 <w:szCs w:val="20"/>
                 <w:lang w:eastAsia="es-CO"/>
               </w:rPr>
-              <w:t>Paso 5: Se arma el diccionario de resultado con el total y el monto acumulado</w:t>
-            </w:r>
-          </w:p>
-        </w:tc>
-        <w:tc>
-          <w:tcPr>
-            <w:tcW w:w="4275" w:type="dxa"/>
-          </w:tcPr>
-          <w:p>
-            <w:pPr>
-              <w:rPr>
-                <w:b/>
-                <w:bCs/>
-              </w:rPr>
             </w:pPr>
             <w:r>
               <w:rPr>
@@ -674,23 +588,8 @@
                 <w:szCs w:val="20"/>
                 <w:lang w:eastAsia="es-CO"/>
               </w:rPr>
-              <w:t>O(1)</w:t>
-            </w:r>
-          </w:p>
-        </w:tc>
-      </w:tr>
-      <w:tr>
-        <w:tc>
-          <w:tcPr>
-            <w:tcW w:w="5070" w:type="dxa"/>
-          </w:tcPr>
-          <w:p>
-            <w:pPr>
-              <w:rPr>
-                <w:b/>
-                <w:bCs/>
-              </w:rPr>
-            </w:pPr>
+              <w:t>O(</w:t>
+            </w:r>
             <w:r>
               <w:rPr>
                 <w:rFonts w:ascii="Arial" w:eastAsia="Times New Roman" w:hAnsi="Arial" w:cs="Arial"/>
@@ -698,9 +597,8 @@
                 <w:szCs w:val="20"/>
                 <w:lang w:eastAsia="es-CO"/>
               </w:rPr>
-              <w:t xml:space="preserve">Paso 6: Se recorren los pedidos filtrados para sumar </w:t>
-            </w:r>
-            <w:proofErr w:type="spellStart"/>
+              <w:t>n</w:t>
+            </w:r>
             <w:r>
               <w:rPr>
                 <w:rFonts w:ascii="Arial" w:eastAsia="Times New Roman" w:hAnsi="Arial" w:cs="Arial"/>
@@ -708,9 +606,8 @@
                 <w:szCs w:val="20"/>
                 <w:lang w:eastAsia="es-CO"/>
               </w:rPr>
-              <w:t>Price_per_Box</w:t>
-            </w:r>
-            <w:proofErr w:type="spellEnd"/>
+              <w:t>)</w:t>
+            </w:r>
             <w:r>
               <w:rPr>
                 <w:rFonts w:ascii="Arial" w:eastAsia="Times New Roman" w:hAnsi="Arial" w:cs="Arial"/>
@@ -718,9 +615,50 @@
                 <w:szCs w:val="20"/>
                 <w:lang w:eastAsia="es-CO"/>
               </w:rPr>
-              <w:t xml:space="preserve"> y </w:t>
-            </w:r>
-            <w:proofErr w:type="spellStart"/>
+              <w:t xml:space="preserve">, donde n = pedidos filtrados para </w:t>
+            </w:r>
+          </w:p>
+          <w:p>
+            <w:pPr>
+              <w:rPr>
+                <w:b/>
+                <w:bCs/>
+                <w:lang w:val="en-US"/>
+              </w:rPr>
+            </w:pPr>
+            <w:r>
+              <w:rPr>
+                <w:rFonts w:ascii="Arial" w:eastAsia="Times New Roman" w:hAnsi="Arial" w:cs="Arial"/>
+                <w:sz w:val="20"/>
+                <w:szCs w:val="20"/>
+                <w:lang w:val="en-US" w:eastAsia="es-CO"/>
+              </w:rPr>
+              <w:t>Price_per_Box y Boxes_Shipped</w:t>
+            </w:r>
+            <w:r>
+              <w:rPr>
+                <w:rFonts w:ascii="Arial" w:eastAsia="Times New Roman" w:hAnsi="Arial" w:cs="Arial"/>
+                <w:sz w:val="20"/>
+                <w:szCs w:val="20"/>
+                <w:lang w:val="en-US" w:eastAsia="es-CO"/>
+              </w:rPr>
+              <w:t xml:space="preserve"> </w:t>
+            </w:r>
+          </w:p>
+        </w:tc>
+      </w:tr>
+      <w:tr>
+        <w:tc>
+          <w:tcPr>
+            <w:tcW w:w="5070" w:type="dxa"/>
+          </w:tcPr>
+          <w:p>
+            <w:pPr>
+              <w:rPr>
+                <w:b/>
+                <w:bCs/>
+              </w:rPr>
+            </w:pPr>
             <w:r>
               <w:rPr>
                 <w:rFonts w:ascii="Arial" w:eastAsia="Times New Roman" w:hAnsi="Arial" w:cs="Arial"/>
@@ -728,9 +666,8 @@
                 <w:szCs w:val="20"/>
                 <w:lang w:eastAsia="es-CO"/>
               </w:rPr>
-              <w:t>Boxes_Shipped</w:t>
-            </w:r>
-            <w:proofErr w:type="spellEnd"/>
+              <w:t>Paso 7: Se calculan los dos promedios con una división cada uno</w:t>
+            </w:r>
           </w:p>
         </w:tc>
         <w:tc>
@@ -739,13 +676,29 @@
           </w:tcPr>
           <w:p>
             <w:pPr>
+              <w:rPr>
+                <w:b/>
+                <w:bCs/>
+              </w:rPr>
+            </w:pPr>
+            <w:r>
               <w:rPr>
                 <w:rFonts w:ascii="Arial" w:eastAsia="Times New Roman" w:hAnsi="Arial" w:cs="Arial"/>
                 <w:sz w:val="20"/>
                 <w:szCs w:val="20"/>
                 <w:lang w:eastAsia="es-CO"/>
               </w:rPr>
-            </w:pPr>
+              <w:t>O(1)</w:t>
+            </w:r>
+          </w:p>
+        </w:tc>
+      </w:tr>
+      <w:tr>
+        <w:tc>
+          <w:tcPr>
+            <w:tcW w:w="5070" w:type="dxa"/>
+          </w:tcPr>
+          <w:p>
             <w:r>
               <w:rPr>
                 <w:rFonts w:ascii="Arial" w:eastAsia="Times New Roman" w:hAnsi="Arial" w:cs="Arial"/>
@@ -753,7 +706,8 @@
                 <w:szCs w:val="20"/>
                 <w:lang w:eastAsia="es-CO"/>
               </w:rPr>
-              <w:t>O(</w:t>
+              <w:lastRenderedPageBreak/>
+              <w:t xml:space="preserve">Paso 8: Se ordenan los filtrados con Merge Sort </w:t>
             </w:r>
             <w:r>
               <w:rPr>
@@ -762,7 +716,7 @@
                 <w:szCs w:val="20"/>
                 <w:lang w:eastAsia="es-CO"/>
               </w:rPr>
-              <w:t>n</w:t>
+              <w:t xml:space="preserve">con el criterio </w:t>
             </w:r>
             <w:r>
               <w:rPr>
@@ -771,7 +725,7 @@
                 <w:szCs w:val="20"/>
                 <w:lang w:eastAsia="es-CO"/>
               </w:rPr>
-              <w:t>)</w:t>
+              <w:t>Discount_Pct descendente,</w:t>
             </w:r>
             <w:r>
               <w:rPr>
@@ -780,18 +734,102 @@
                 <w:szCs w:val="20"/>
                 <w:lang w:eastAsia="es-CO"/>
               </w:rPr>
-              <w:t xml:space="preserve">, donde n = pedidos filtrados para </w:t>
-            </w:r>
-          </w:p>
+              <w:t xml:space="preserve"> si son iguales</w:t>
+            </w:r>
+            <w:r>
+              <w:rPr>
+                <w:rFonts w:ascii="Arial" w:eastAsia="Times New Roman" w:hAnsi="Arial" w:cs="Arial"/>
+                <w:sz w:val="20"/>
+                <w:szCs w:val="20"/>
+                <w:lang w:eastAsia="es-CO"/>
+              </w:rPr>
+              <w:t xml:space="preserve"> Amount descendente,</w:t>
+            </w:r>
+            <w:r>
+              <w:rPr>
+                <w:rFonts w:ascii="Arial" w:eastAsia="Times New Roman" w:hAnsi="Arial" w:cs="Arial"/>
+                <w:sz w:val="20"/>
+                <w:szCs w:val="20"/>
+                <w:lang w:eastAsia="es-CO"/>
+              </w:rPr>
+              <w:t xml:space="preserve"> y si siguen siendo iguales</w:t>
+            </w:r>
+            <w:r>
+              <w:rPr>
+                <w:rFonts w:ascii="Arial" w:eastAsia="Times New Roman" w:hAnsi="Arial" w:cs="Arial"/>
+                <w:sz w:val="20"/>
+                <w:szCs w:val="20"/>
+                <w:lang w:eastAsia="es-CO"/>
+              </w:rPr>
+              <w:t xml:space="preserve"> luego Order_ID ascendente</w:t>
+            </w:r>
+          </w:p>
+        </w:tc>
+        <w:tc>
+          <w:tcPr>
+            <w:tcW w:w="4275" w:type="dxa"/>
+          </w:tcPr>
           <w:p>
             <w:pPr>
               <w:rPr>
-                <w:b/>
-                <w:bCs/>
+                <w:rFonts w:ascii="Arial" w:eastAsia="Times New Roman" w:hAnsi="Arial" w:cs="Arial"/>
+                <w:sz w:val="20"/>
+                <w:szCs w:val="20"/>
+                <w:lang w:eastAsia="es-CO"/>
+              </w:rPr>
+            </w:pPr>
+            <w:r>
+              <w:rPr>
+                <w:rFonts w:ascii="Arial" w:eastAsia="Times New Roman" w:hAnsi="Arial" w:cs="Arial"/>
+                <w:sz w:val="20"/>
+                <w:szCs w:val="20"/>
+                <w:lang w:eastAsia="es-CO"/>
+              </w:rPr>
+              <w:t>O</w:t>
+            </w:r>
+            <w:r>
+              <w:rPr>
+                <w:rFonts w:ascii="Arial" w:eastAsia="Times New Roman" w:hAnsi="Arial" w:cs="Arial"/>
+                <w:sz w:val="20"/>
+                <w:szCs w:val="20"/>
+                <w:lang w:eastAsia="es-CO"/>
+              </w:rPr>
+              <w:t>(n log n</w:t>
+            </w:r>
+            <w:r>
+              <w:rPr>
+                <w:rFonts w:ascii="Arial" w:eastAsia="Times New Roman" w:hAnsi="Arial" w:cs="Arial"/>
+                <w:sz w:val="20"/>
+                <w:szCs w:val="20"/>
+                <w:lang w:eastAsia="es-CO"/>
+              </w:rPr>
+              <w:t>)</w:t>
+            </w:r>
+            <w:r>
+              <w:rPr>
+                <w:rFonts w:ascii="Arial" w:eastAsia="Times New Roman" w:hAnsi="Arial" w:cs="Arial"/>
+                <w:sz w:val="20"/>
+                <w:szCs w:val="20"/>
+                <w:lang w:eastAsia="es-CO"/>
+              </w:rPr>
+              <w:t xml:space="preserve">, donde n = pedidos filtrados </w:t>
+            </w:r>
+            <w:r>
+              <w:rPr>
+                <w:rFonts w:ascii="Arial" w:eastAsia="Times New Roman" w:hAnsi="Arial" w:cs="Arial"/>
+                <w:sz w:val="20"/>
+                <w:szCs w:val="20"/>
+                <w:lang w:eastAsia="es-CO"/>
+              </w:rPr>
+              <w:t xml:space="preserve">para </w:t>
+            </w:r>
+          </w:p>
+          <w:p>
+            <w:pPr>
+              <w:rPr>
                 <w:lang w:val="en-US"/>
               </w:rPr>
             </w:pPr>
-            <w:proofErr w:type="spellStart"/>
             <w:r>
               <w:rPr>
                 <w:rFonts w:ascii="Arial" w:eastAsia="Times New Roman" w:hAnsi="Arial" w:cs="Arial"/>
@@ -799,37 +837,7 @@
                 <w:szCs w:val="20"/>
                 <w:lang w:val="en-US" w:eastAsia="es-CO"/>
               </w:rPr>
-              <w:t>Price_per_Box</w:t>
-            </w:r>
-            <w:proofErr w:type="spellEnd"/>
-            <w:r>
-              <w:rPr>
-                <w:rFonts w:ascii="Arial" w:eastAsia="Times New Roman" w:hAnsi="Arial" w:cs="Arial"/>
-                <w:sz w:val="20"/>
-                <w:szCs w:val="20"/>
-                <w:lang w:val="en-US" w:eastAsia="es-CO"/>
-              </w:rPr>
-              <w:t xml:space="preserve"> y </w:t>
-            </w:r>
-            <w:proofErr w:type="spellStart"/>
-            <w:r>
-              <w:rPr>
-                <w:rFonts w:ascii="Arial" w:eastAsia="Times New Roman" w:hAnsi="Arial" w:cs="Arial"/>
-                <w:sz w:val="20"/>
-                <w:szCs w:val="20"/>
-                <w:lang w:val="en-US" w:eastAsia="es-CO"/>
-              </w:rPr>
-              <w:t>Boxes_Shipped</w:t>
-            </w:r>
-            <w:proofErr w:type="spellEnd"/>
-            <w:r>
-              <w:rPr>
-                <w:rFonts w:ascii="Arial" w:eastAsia="Times New Roman" w:hAnsi="Arial" w:cs="Arial"/>
-                <w:sz w:val="20"/>
-                <w:szCs w:val="20"/>
-                <w:lang w:val="en-US" w:eastAsia="es-CO"/>
-              </w:rPr>
-              <w:t xml:space="preserve"> </w:t>
+              <w:t>Price_per_Box y Boxes_Shipped</w:t>
             </w:r>
           </w:p>
         </w:tc>
@@ -840,12 +848,6 @@
             <w:tcW w:w="5070" w:type="dxa"/>
           </w:tcPr>
           <w:p>
-            <w:pPr>
-              <w:rPr>
-                <w:b/>
-                <w:bCs/>
-              </w:rPr>
-            </w:pPr>
             <w:r>
               <w:rPr>
                 <w:rFonts w:ascii="Arial" w:eastAsia="Times New Roman" w:hAnsi="Arial" w:cs="Arial"/>
@@ -853,7 +855,7 @@
                 <w:szCs w:val="20"/>
                 <w:lang w:eastAsia="es-CO"/>
               </w:rPr>
-              <w:t>Paso 7: Se calculan los dos promedios con una división cada uno</w:t>
+              <w:t xml:space="preserve">Paso 9: Si hay más de 20, se toman los primeros 10 y los últimos 10 con sub_list. </w:t>
             </w:r>
           </w:p>
         </w:tc>
@@ -862,12 +864,6 @@
             <w:tcW w:w="4275" w:type="dxa"/>
           </w:tcPr>
           <w:p>
-            <w:pPr>
-              <w:rPr>
-                <w:b/>
-                <w:bCs/>
-              </w:rPr>
-            </w:pPr>
             <w:r>
               <w:rPr>
                 <w:rFonts w:ascii="Arial" w:eastAsia="Times New Roman" w:hAnsi="Arial" w:cs="Arial"/>
@@ -893,10 +889,15 @@
                 <w:szCs w:val="20"/>
                 <w:lang w:eastAsia="es-CO"/>
               </w:rPr>
-              <w:lastRenderedPageBreak/>
-              <w:t xml:space="preserve">Paso 8: Se ordenan los filtrados con </w:t>
-            </w:r>
-            <w:proofErr w:type="spellStart"/>
+              <w:t>Paso 10: Se detiene el cronómetro y se calcula el tiempo</w:t>
+            </w:r>
+          </w:p>
+        </w:tc>
+        <w:tc>
+          <w:tcPr>
+            <w:tcW w:w="4275" w:type="dxa"/>
+          </w:tcPr>
+          <w:p>
             <w:r>
               <w:rPr>
                 <w:rFonts w:ascii="Arial" w:eastAsia="Times New Roman" w:hAnsi="Arial" w:cs="Arial"/>
@@ -904,307 +905,6 @@
                 <w:szCs w:val="20"/>
                 <w:lang w:eastAsia="es-CO"/>
               </w:rPr>
-              <w:t>Merge</w:t>
-            </w:r>
-            <w:proofErr w:type="spellEnd"/>
-            <w:r>
-              <w:rPr>
-                <w:rFonts w:ascii="Arial" w:eastAsia="Times New Roman" w:hAnsi="Arial" w:cs="Arial"/>
-                <w:sz w:val="20"/>
-                <w:szCs w:val="20"/>
-                <w:lang w:eastAsia="es-CO"/>
-              </w:rPr>
-              <w:t xml:space="preserve"> Sort </w:t>
-            </w:r>
-            <w:r>
-              <w:rPr>
-                <w:rFonts w:ascii="Arial" w:eastAsia="Times New Roman" w:hAnsi="Arial" w:cs="Arial"/>
-                <w:sz w:val="20"/>
-                <w:szCs w:val="20"/>
-                <w:lang w:eastAsia="es-CO"/>
-              </w:rPr>
-              <w:t xml:space="preserve">con el criterio </w:t>
-            </w:r>
-            <w:proofErr w:type="spellStart"/>
-            <w:r>
-              <w:rPr>
-                <w:rFonts w:ascii="Arial" w:eastAsia="Times New Roman" w:hAnsi="Arial" w:cs="Arial"/>
-                <w:sz w:val="20"/>
-                <w:szCs w:val="20"/>
-                <w:lang w:eastAsia="es-CO"/>
-              </w:rPr>
-              <w:t>Discount_Pct</w:t>
-            </w:r>
-            <w:proofErr w:type="spellEnd"/>
-            <w:r>
-              <w:rPr>
-                <w:rFonts w:ascii="Arial" w:eastAsia="Times New Roman" w:hAnsi="Arial" w:cs="Arial"/>
-                <w:sz w:val="20"/>
-                <w:szCs w:val="20"/>
-                <w:lang w:eastAsia="es-CO"/>
-              </w:rPr>
-              <w:t xml:space="preserve"> descendente,</w:t>
-            </w:r>
-            <w:r>
-              <w:rPr>
-                <w:rFonts w:ascii="Arial" w:eastAsia="Times New Roman" w:hAnsi="Arial" w:cs="Arial"/>
-                <w:sz w:val="20"/>
-                <w:szCs w:val="20"/>
-                <w:lang w:eastAsia="es-CO"/>
-              </w:rPr>
-              <w:t xml:space="preserve"> si son iguales</w:t>
-            </w:r>
-            <w:r>
-              <w:rPr>
-                <w:rFonts w:ascii="Arial" w:eastAsia="Times New Roman" w:hAnsi="Arial" w:cs="Arial"/>
-                <w:sz w:val="20"/>
-                <w:szCs w:val="20"/>
-                <w:lang w:eastAsia="es-CO"/>
-              </w:rPr>
-              <w:t xml:space="preserve"> </w:t>
-            </w:r>
-            <w:proofErr w:type="spellStart"/>
-            <w:r>
-              <w:rPr>
-                <w:rFonts w:ascii="Arial" w:eastAsia="Times New Roman" w:hAnsi="Arial" w:cs="Arial"/>
-                <w:sz w:val="20"/>
-                <w:szCs w:val="20"/>
-                <w:lang w:eastAsia="es-CO"/>
-              </w:rPr>
-              <w:t>Amount</w:t>
-            </w:r>
-            <w:proofErr w:type="spellEnd"/>
-            <w:r>
-              <w:rPr>
-                <w:rFonts w:ascii="Arial" w:eastAsia="Times New Roman" w:hAnsi="Arial" w:cs="Arial"/>
-                <w:sz w:val="20"/>
-                <w:szCs w:val="20"/>
-                <w:lang w:eastAsia="es-CO"/>
-              </w:rPr>
-              <w:t xml:space="preserve"> descendente,</w:t>
-            </w:r>
-            <w:r>
-              <w:rPr>
-                <w:rFonts w:ascii="Arial" w:eastAsia="Times New Roman" w:hAnsi="Arial" w:cs="Arial"/>
-                <w:sz w:val="20"/>
-                <w:szCs w:val="20"/>
-                <w:lang w:eastAsia="es-CO"/>
-              </w:rPr>
-              <w:t xml:space="preserve"> y si siguen siendo iguales</w:t>
-            </w:r>
-            <w:r>
-              <w:rPr>
-                <w:rFonts w:ascii="Arial" w:eastAsia="Times New Roman" w:hAnsi="Arial" w:cs="Arial"/>
-                <w:sz w:val="20"/>
-                <w:szCs w:val="20"/>
-                <w:lang w:eastAsia="es-CO"/>
-              </w:rPr>
-              <w:t xml:space="preserve"> luego </w:t>
-            </w:r>
-            <w:proofErr w:type="spellStart"/>
-            <w:r>
-              <w:rPr>
-                <w:rFonts w:ascii="Arial" w:eastAsia="Times New Roman" w:hAnsi="Arial" w:cs="Arial"/>
-                <w:sz w:val="20"/>
-                <w:szCs w:val="20"/>
-                <w:lang w:eastAsia="es-CO"/>
-              </w:rPr>
-              <w:t>Order_ID</w:t>
-            </w:r>
-            <w:proofErr w:type="spellEnd"/>
-            <w:r>
-              <w:rPr>
-                <w:rFonts w:ascii="Arial" w:eastAsia="Times New Roman" w:hAnsi="Arial" w:cs="Arial"/>
-                <w:sz w:val="20"/>
-                <w:szCs w:val="20"/>
-                <w:lang w:eastAsia="es-CO"/>
-              </w:rPr>
-              <w:t xml:space="preserve"> ascendente</w:t>
-            </w:r>
-          </w:p>
-        </w:tc>
-        <w:tc>
-          <w:tcPr>
-            <w:tcW w:w="4275" w:type="dxa"/>
-          </w:tcPr>
-          <w:p>
-            <w:pPr>
-              <w:rPr>
-                <w:rFonts w:ascii="Arial" w:eastAsia="Times New Roman" w:hAnsi="Arial" w:cs="Arial"/>
-                <w:sz w:val="20"/>
-                <w:szCs w:val="20"/>
-                <w:lang w:eastAsia="es-CO"/>
-              </w:rPr>
-            </w:pPr>
-            <w:r>
-              <w:rPr>
-                <w:rFonts w:ascii="Arial" w:eastAsia="Times New Roman" w:hAnsi="Arial" w:cs="Arial"/>
-                <w:sz w:val="20"/>
-                <w:szCs w:val="20"/>
-                <w:lang w:eastAsia="es-CO"/>
-              </w:rPr>
-              <w:t>O</w:t>
-            </w:r>
-            <w:r>
-              <w:rPr>
-                <w:rFonts w:ascii="Arial" w:eastAsia="Times New Roman" w:hAnsi="Arial" w:cs="Arial"/>
-                <w:sz w:val="20"/>
-                <w:szCs w:val="20"/>
-                <w:lang w:eastAsia="es-CO"/>
-              </w:rPr>
-              <w:t>(n log n</w:t>
-            </w:r>
-            <w:r>
-              <w:rPr>
-                <w:rFonts w:ascii="Arial" w:eastAsia="Times New Roman" w:hAnsi="Arial" w:cs="Arial"/>
-                <w:sz w:val="20"/>
-                <w:szCs w:val="20"/>
-                <w:lang w:eastAsia="es-CO"/>
-              </w:rPr>
-              <w:t>)</w:t>
-            </w:r>
-            <w:r>
-              <w:rPr>
-                <w:rFonts w:ascii="Arial" w:eastAsia="Times New Roman" w:hAnsi="Arial" w:cs="Arial"/>
-                <w:sz w:val="20"/>
-                <w:szCs w:val="20"/>
-                <w:lang w:eastAsia="es-CO"/>
-              </w:rPr>
-              <w:t xml:space="preserve">, donde n = pedidos filtrados </w:t>
-            </w:r>
-            <w:r>
-              <w:rPr>
-                <w:rFonts w:ascii="Arial" w:eastAsia="Times New Roman" w:hAnsi="Arial" w:cs="Arial"/>
-                <w:sz w:val="20"/>
-                <w:szCs w:val="20"/>
-                <w:lang w:eastAsia="es-CO"/>
-              </w:rPr>
-              <w:t xml:space="preserve">para </w:t>
-            </w:r>
-          </w:p>
-          <w:p>
-            <w:pPr>
-              <w:rPr>
-                <w:lang w:val="en-US"/>
-              </w:rPr>
-            </w:pPr>
-            <w:proofErr w:type="spellStart"/>
-            <w:r>
-              <w:rPr>
-                <w:rFonts w:ascii="Arial" w:eastAsia="Times New Roman" w:hAnsi="Arial" w:cs="Arial"/>
-                <w:sz w:val="20"/>
-                <w:szCs w:val="20"/>
-                <w:lang w:val="en-US" w:eastAsia="es-CO"/>
-              </w:rPr>
-              <w:t>Price_per_Box</w:t>
-            </w:r>
-            <w:proofErr w:type="spellEnd"/>
-            <w:r>
-              <w:rPr>
-                <w:rFonts w:ascii="Arial" w:eastAsia="Times New Roman" w:hAnsi="Arial" w:cs="Arial"/>
-                <w:sz w:val="20"/>
-                <w:szCs w:val="20"/>
-                <w:lang w:val="en-US" w:eastAsia="es-CO"/>
-              </w:rPr>
-              <w:t xml:space="preserve"> y </w:t>
-            </w:r>
-            <w:proofErr w:type="spellStart"/>
-            <w:r>
-              <w:rPr>
-                <w:rFonts w:ascii="Arial" w:eastAsia="Times New Roman" w:hAnsi="Arial" w:cs="Arial"/>
-                <w:sz w:val="20"/>
-                <w:szCs w:val="20"/>
-                <w:lang w:val="en-US" w:eastAsia="es-CO"/>
-              </w:rPr>
-              <w:t>Boxes_Shipped</w:t>
-            </w:r>
-            <w:proofErr w:type="spellEnd"/>
-          </w:p>
-        </w:tc>
-      </w:tr>
-      <w:tr>
-        <w:tc>
-          <w:tcPr>
-            <w:tcW w:w="5070" w:type="dxa"/>
-          </w:tcPr>
-          <w:p>
-            <w:r>
-              <w:rPr>
-                <w:rFonts w:ascii="Arial" w:eastAsia="Times New Roman" w:hAnsi="Arial" w:cs="Arial"/>
-                <w:sz w:val="20"/>
-                <w:szCs w:val="20"/>
-                <w:lang w:eastAsia="es-CO"/>
-              </w:rPr>
-              <w:t xml:space="preserve">Paso 9: Si hay más de 20, se toman los primeros 10 y los últimos 10 con </w:t>
-            </w:r>
-            <w:proofErr w:type="spellStart"/>
-            <w:r>
-              <w:rPr>
-                <w:rFonts w:ascii="Arial" w:eastAsia="Times New Roman" w:hAnsi="Arial" w:cs="Arial"/>
-                <w:sz w:val="20"/>
-                <w:szCs w:val="20"/>
-                <w:lang w:eastAsia="es-CO"/>
-              </w:rPr>
-              <w:t>sub_list</w:t>
-            </w:r>
-            <w:proofErr w:type="spellEnd"/>
-            <w:r>
-              <w:rPr>
-                <w:rFonts w:ascii="Arial" w:eastAsia="Times New Roman" w:hAnsi="Arial" w:cs="Arial"/>
-                <w:sz w:val="20"/>
-                <w:szCs w:val="20"/>
-                <w:lang w:eastAsia="es-CO"/>
-              </w:rPr>
-              <w:t xml:space="preserve">. </w:t>
-            </w:r>
-          </w:p>
-        </w:tc>
-        <w:tc>
-          <w:tcPr>
-            <w:tcW w:w="4275" w:type="dxa"/>
-          </w:tcPr>
-          <w:p>
-            <w:r>
-              <w:rPr>
-                <w:rFonts w:ascii="Arial" w:eastAsia="Times New Roman" w:hAnsi="Arial" w:cs="Arial"/>
-                <w:sz w:val="20"/>
-                <w:szCs w:val="20"/>
-                <w:lang w:eastAsia="es-CO"/>
-              </w:rPr>
-              <w:t>O(1)</w:t>
-            </w:r>
-          </w:p>
-        </w:tc>
-      </w:tr>
-      <w:tr>
-        <w:tc>
-          <w:tcPr>
-            <w:tcW w:w="5070" w:type="dxa"/>
-          </w:tcPr>
-          <w:p>
-            <w:r>
-              <w:rPr>
-                <w:rFonts w:ascii="Arial" w:eastAsia="Times New Roman" w:hAnsi="Arial" w:cs="Arial"/>
-                <w:sz w:val="20"/>
-                <w:szCs w:val="20"/>
-                <w:lang w:eastAsia="es-CO"/>
-              </w:rPr>
-              <w:t>Paso 10: Se detiene el cronómetro y se calcula el tiempo</w:t>
-            </w:r>
-          </w:p>
-        </w:tc>
-        <w:tc>
-          <w:tcPr>
-            <w:tcW w:w="4275" w:type="dxa"/>
-          </w:tcPr>
-          <w:p>
-            <w:r>
-              <w:rPr>
-                <w:rFonts w:ascii="Arial" w:eastAsia="Times New Roman" w:hAnsi="Arial" w:cs="Arial"/>
-                <w:sz w:val="20"/>
-                <w:szCs w:val="20"/>
-                <w:lang w:eastAsia="es-CO"/>
-              </w:rPr>
               <w:t>O(1)</w:t>
             </w:r>
           </w:p>
@@ -1315,7 +1015,7 @@
     </w:p>
     <w:p>
       <w:pPr>
-        <w:pStyle w:val="Heading2"/>
+        <w:pStyle w:val="Ttulo2"/>
         <w:rPr>
           <w:b/>
           <w:bCs/>
@@ -1342,7 +1042,7 @@
     </w:p>
     <w:p>
       <w:pPr>
-        <w:pStyle w:val="Heading1"/>
+        <w:pStyle w:val="Ttulo1"/>
         <w:rPr>
           <w:b/>
           <w:bCs/>
@@ -1363,7 +1063,7 @@
     </w:p>
     <w:p>
       <w:pPr>
-        <w:pStyle w:val="Heading2"/>
+        <w:pStyle w:val="Ttulo2"/>
         <w:rPr>
           <w:b/>
           <w:bCs/>
@@ -1384,7 +1084,7 @@
     </w:p>
     <w:tbl>
       <w:tblPr>
-        <w:tblStyle w:val="TableGrid"/>
+        <w:tblStyle w:val="Tablaconcuadrcula"/>
         <w:tblW w:w="9360" w:type="dxa"/>
         <w:tblLayout w:type="fixed"/>
         <w:tblLook w:val="06A0" w:firstRow="1" w:lastRow="0" w:firstColumn="1" w:lastColumn="0" w:noHBand="1" w:noVBand="1"/>
@@ -1419,27 +1119,9 @@
             <w:tcW w:w="6300" w:type="dxa"/>
           </w:tcPr>
           <w:p>
-            <w:proofErr w:type="spellStart"/>
-            <w:r>
-              <w:t>Catalog</w:t>
-            </w:r>
-            <w:proofErr w:type="spellEnd"/>
-            <w:r>
-              <w:t xml:space="preserve">, país, </w:t>
-            </w:r>
-            <w:proofErr w:type="spellStart"/>
-            <w:r>
-              <w:t>min_cajas</w:t>
-            </w:r>
-            <w:proofErr w:type="spellEnd"/>
-            <w:r>
-              <w:t xml:space="preserve">, </w:t>
-            </w:r>
-            <w:proofErr w:type="spellStart"/>
-            <w:r>
-              <w:t>max_cajas</w:t>
-            </w:r>
-            <w:proofErr w:type="spellEnd"/>
+            <w:r>
+              <w:t>Catalog, país, min_cajas, max_cajas</w:t>
+            </w:r>
           </w:p>
         </w:tc>
       </w:tr>
@@ -1470,87 +1152,10 @@
           </w:tcPr>
           <w:p>
             <w:r>
-              <w:t xml:space="preserve">Un diccionario con el tiempo de ejecución, número total de pedidos que pasaron el filtro, número de productos diferentes presentes en el resultado, promedios de </w:t>
-            </w:r>
-            <w:proofErr w:type="spellStart"/>
-            <w:r>
-              <w:t>marketing_spend</w:t>
-            </w:r>
-            <w:proofErr w:type="spellEnd"/>
-            <w:r>
-              <w:t xml:space="preserve"> y </w:t>
-            </w:r>
-            <w:proofErr w:type="spellStart"/>
-            <w:r>
-              <w:t>amount</w:t>
-            </w:r>
-            <w:proofErr w:type="spellEnd"/>
-            <w:r>
-              <w:t xml:space="preserve">, producto más frecuente, entre los pedidos filtrados y número de pedidos de este producto, para cada pedido que cumple la consulta, mostrar ordenado ascendentemente por </w:t>
-            </w:r>
-            <w:proofErr w:type="spellStart"/>
-            <w:r>
-              <w:t>Boxes_Shipped</w:t>
-            </w:r>
-            <w:proofErr w:type="spellEnd"/>
-            <w:r>
-              <w:t xml:space="preserve"> con lo siguiente: </w:t>
-            </w:r>
-            <w:proofErr w:type="spellStart"/>
-            <w:r>
-              <w:t>Order_ID</w:t>
-            </w:r>
-            <w:proofErr w:type="spellEnd"/>
-            <w:r>
-              <w:t xml:space="preserve">, </w:t>
-            </w:r>
-            <w:proofErr w:type="spellStart"/>
-            <w:r>
-              <w:t>Product</w:t>
-            </w:r>
-            <w:proofErr w:type="spellEnd"/>
-            <w:r>
-              <w:t xml:space="preserve">, Channel, </w:t>
-            </w:r>
-            <w:proofErr w:type="spellStart"/>
-            <w:r>
-              <w:t>Order_date</w:t>
-            </w:r>
-            <w:proofErr w:type="spellEnd"/>
-            <w:r>
-              <w:t xml:space="preserve">, </w:t>
-            </w:r>
-            <w:proofErr w:type="spellStart"/>
-            <w:r>
-              <w:t>Boxes_Shipped</w:t>
-            </w:r>
-            <w:proofErr w:type="spellEnd"/>
-            <w:r>
-              <w:t xml:space="preserve">, </w:t>
-            </w:r>
-            <w:proofErr w:type="spellStart"/>
-            <w:r>
-              <w:t>Price_per_box</w:t>
-            </w:r>
-            <w:proofErr w:type="spellEnd"/>
-            <w:r>
-              <w:t xml:space="preserve">, </w:t>
-            </w:r>
-            <w:proofErr w:type="spellStart"/>
-            <w:r>
-              <w:t>Marketing_Spend</w:t>
-            </w:r>
-            <w:proofErr w:type="spellEnd"/>
-            <w:r>
-              <w:t xml:space="preserve"> y el </w:t>
-            </w:r>
-            <w:proofErr w:type="spellStart"/>
-            <w:r>
-              <w:t>amount</w:t>
-            </w:r>
-            <w:proofErr w:type="spellEnd"/>
-            <w:r>
-              <w:t xml:space="preserve">. </w:t>
+              <w:t>Un diccionario con el tiempo de ejecución, número total de pedidos que pasaron el filtro, número de productos diferentes presentes en el resultado, promedios de marketing_spend y amount, producto más frecuente, entre los pedidos filtrados y número de pedidos de este producto, para cada pedido que cumple la consulta, mostrar ordenado ascendentemente por Boxes_Shipped</w:t>
+            </w:r>
+            <w:r>
+              <w:t xml:space="preserve"> con lo siguiente: Order_ID, Product, Channel, Order_date, Boxes_Shipped, Price_per_box, Marketing_Spend y el amount. </w:t>
             </w:r>
           </w:p>
         </w:tc>
@@ -1612,7 +1217,7 @@
     <w:p/>
     <w:p>
       <w:pPr>
-        <w:pStyle w:val="Heading2"/>
+        <w:pStyle w:val="Ttulo2"/>
         <w:rPr>
           <w:b/>
           <w:bCs/>
@@ -1633,7 +1238,7 @@
     </w:p>
     <w:tbl>
       <w:tblPr>
-        <w:tblStyle w:val="TableGrid"/>
+        <w:tblStyle w:val="Tablaconcuadrcula"/>
         <w:tblW w:w="0" w:type="auto"/>
         <w:tblLayout w:type="fixed"/>
         <w:tblLook w:val="06A0" w:firstRow="1" w:lastRow="0" w:firstColumn="1" w:lastColumn="0" w:noHBand="1" w:noVBand="1"/>
@@ -1775,15 +1380,7 @@
           </w:tcPr>
           <w:p>
             <w:r>
-              <w:t xml:space="preserve">Ordenar con </w:t>
-            </w:r>
-            <w:proofErr w:type="spellStart"/>
-            <w:r>
-              <w:t>merge_sort</w:t>
-            </w:r>
-            <w:proofErr w:type="spellEnd"/>
-            <w:r>
-              <w:t>()</w:t>
+              <w:t>Ordenar con merge_sort()</w:t>
             </w:r>
           </w:p>
         </w:tc>
@@ -1910,7 +1507,7 @@
     </w:p>
     <w:p>
       <w:pPr>
-        <w:pStyle w:val="Heading2"/>
+        <w:pStyle w:val="Ttulo2"/>
         <w:rPr>
           <w:b/>
           <w:bCs/>
@@ -1961,106 +1558,34 @@
         <w:t>, usamos la filtrada</w:t>
       </w:r>
       <w:r>
-        <w:t xml:space="preserve">), y el </w:t>
-      </w:r>
-      <w:proofErr w:type="spellStart"/>
-      <w:r>
-        <w:t>merge</w:t>
-      </w:r>
-      <w:proofErr w:type="spellEnd"/>
+        <w:t xml:space="preserve">), y el merge sort ordena los m pedidos filtrados </w:t>
+      </w:r>
+      <w:r>
+        <w:t xml:space="preserve">con complejidad </w:t>
+      </w:r>
+      <w:r>
+        <w:t xml:space="preserve">O(m log m). En las pruebas realizadas con el archivo del 100%, la </w:t>
+      </w:r>
+      <w:r>
+        <w:t xml:space="preserve">implementación con Separate Chaining resultó aproximadamente 5 ms más rápida que la de Linear Probing. Esto se </w:t>
+      </w:r>
+      <w:r>
+        <w:t xml:space="preserve">debe a que </w:t>
+      </w:r>
+      <w:r>
+        <w:t>por cada pedido filtrado</w:t>
+      </w:r>
       <w:r>
         <w:t xml:space="preserve"> </w:t>
       </w:r>
-      <w:proofErr w:type="spellStart"/>
-      <w:r>
-        <w:t>sort</w:t>
-      </w:r>
-      <w:proofErr w:type="spellEnd"/>
-      <w:r>
-        <w:t xml:space="preserve"> ordena los m pedidos filtrados </w:t>
-      </w:r>
-      <w:r>
-        <w:t xml:space="preserve">con complejidad </w:t>
-      </w:r>
-      <w:r>
-        <w:t xml:space="preserve">O(m log m). En las pruebas realizadas con el archivo del 100%, la </w:t>
-      </w:r>
-      <w:r>
-        <w:t xml:space="preserve">implementación con </w:t>
-      </w:r>
-      <w:proofErr w:type="spellStart"/>
-      <w:r>
-        <w:t>Separate</w:t>
-      </w:r>
-      <w:proofErr w:type="spellEnd"/>
-      <w:r>
-        <w:t xml:space="preserve"> </w:t>
-      </w:r>
-      <w:proofErr w:type="spellStart"/>
-      <w:r>
-        <w:t>Chaining</w:t>
-      </w:r>
-      <w:proofErr w:type="spellEnd"/>
-      <w:r>
-        <w:t xml:space="preserve"> resultó aproximadamente 5 ms más rápida que la de Linear </w:t>
-      </w:r>
-      <w:proofErr w:type="spellStart"/>
-      <w:r>
-        <w:t>Probing</w:t>
-      </w:r>
-      <w:proofErr w:type="spellEnd"/>
-      <w:r>
-        <w:t xml:space="preserve">. Esto se </w:t>
-      </w:r>
-      <w:r>
-        <w:t xml:space="preserve">debe a que </w:t>
-      </w:r>
-      <w:r>
-        <w:t>por cada pedido filtrado</w:t>
-      </w:r>
-      <w:r>
-        <w:t xml:space="preserve"> </w:t>
-      </w:r>
-      <w:r>
-        <w:t xml:space="preserve">el requerimiento hace un </w:t>
-      </w:r>
-      <w:proofErr w:type="spellStart"/>
-      <w:r>
-        <w:t>get</w:t>
-      </w:r>
-      <w:proofErr w:type="spellEnd"/>
-      <w:r>
-        <w:t xml:space="preserve"> y un </w:t>
-      </w:r>
-      <w:proofErr w:type="spellStart"/>
-      <w:r>
-        <w:t>put</w:t>
-      </w:r>
-      <w:proofErr w:type="spellEnd"/>
-      <w:r>
-        <w:t xml:space="preserve"> sobre el mapa auxiliar de conteo por producto, y el </w:t>
-      </w:r>
-      <w:proofErr w:type="spellStart"/>
-      <w:r>
-        <w:t>put</w:t>
-      </w:r>
-      <w:proofErr w:type="spellEnd"/>
-      <w:r>
-        <w:t xml:space="preserve"> sobre una llave </w:t>
+      <w:r>
+        <w:t xml:space="preserve">el requerimiento hace un get y un put sobre el mapa auxiliar de conteo por producto, y el put sobre una llave </w:t>
       </w:r>
       <w:r>
         <w:t xml:space="preserve">que ya existe </w:t>
       </w:r>
       <w:r>
-        <w:t xml:space="preserve">en Linear </w:t>
-      </w:r>
-      <w:proofErr w:type="spellStart"/>
-      <w:r>
-        <w:t>Probing</w:t>
-      </w:r>
-      <w:proofErr w:type="spellEnd"/>
-      <w:r>
-        <w:t xml:space="preserve"> implica más llamadas </w:t>
+        <w:t xml:space="preserve">en Linear Probing implica más llamadas </w:t>
       </w:r>
       <w:r>
         <w:t xml:space="preserve">por dentro </w:t>
@@ -2078,23 +1603,7 @@
         <w:t>SLL</w:t>
       </w:r>
       <w:r>
-        <w:t xml:space="preserve"> corta en </w:t>
-      </w:r>
-      <w:proofErr w:type="spellStart"/>
-      <w:r>
-        <w:t>Separate</w:t>
-      </w:r>
-      <w:proofErr w:type="spellEnd"/>
-      <w:r>
-        <w:t xml:space="preserve"> </w:t>
-      </w:r>
-      <w:proofErr w:type="spellStart"/>
-      <w:r>
-        <w:t>Chaining</w:t>
-      </w:r>
-      <w:proofErr w:type="spellEnd"/>
-      <w:r>
-        <w:t xml:space="preserve">. Como ambas </w:t>
+        <w:t xml:space="preserve"> corta en Separate Chaining. Como ambas </w:t>
       </w:r>
       <w:r>
         <w:t>implementaciones</w:t>
@@ -2111,6 +1620,9 @@
     </w:p>
     <w:p>
       <w:r>
+        <w:rPr>
+          <w:noProof/>
+        </w:rPr>
         <w:lastRenderedPageBreak/>
         <w:drawing>
           <wp:inline distT="0" distB="0" distL="0" distR="0" wp14:anchorId="19DA7271" wp14:editId="7159C6FB">
@@ -2155,6 +1667,9 @@
         <w:t xml:space="preserve"> </w:t>
       </w:r>
       <w:r>
+        <w:rPr>
+          <w:noProof/>
+        </w:rPr>
         <w:lastRenderedPageBreak/>
         <w:drawing>
           <wp:inline distT="0" distB="0" distL="0" distR="0" wp14:anchorId="28526A7D" wp14:editId="1523082B">
@@ -2196,7 +1711,7 @@
     <w:p/>
     <w:p>
       <w:pPr>
-        <w:pStyle w:val="Heading1"/>
+        <w:pStyle w:val="Ttulo1"/>
         <w:rPr>
           <w:b/>
           <w:bCs/>
@@ -2336,7 +1851,7 @@
     </w:p>
     <w:p>
       <w:pPr>
-        <w:pStyle w:val="Heading2"/>
+        <w:pStyle w:val="Ttulo2"/>
         <w:rPr>
           <w:b/>
           <w:bCs/>
@@ -2352,7 +1867,7 @@
     </w:p>
     <w:p>
       <w:pPr>
-        <w:pStyle w:val="Heading2"/>
+        <w:pStyle w:val="Ttulo2"/>
         <w:rPr>
           <w:rFonts w:asciiTheme="minorHAnsi" w:eastAsiaTheme="minorEastAsia" w:hAnsiTheme="minorHAnsi" w:cstheme="minorBidi"/>
           <w:color w:val="auto"/>
@@ -2435,7 +1950,7 @@
     </w:p>
     <w:tbl>
       <w:tblPr>
-        <w:tblStyle w:val="TableGrid"/>
+        <w:tblStyle w:val="Tablaconcuadrcula"/>
         <w:tblW w:w="9360" w:type="dxa"/>
         <w:tblLayout w:type="fixed"/>
         <w:tblLook w:val="06A0" w:firstRow="1" w:lastRow="0" w:firstColumn="1" w:lastColumn="0" w:noHBand="1" w:noVBand="1"/>
@@ -2479,44 +1994,8 @@
               <w:rPr>
                 <w:lang w:val="en-US"/>
               </w:rPr>
-              <w:t xml:space="preserve">catalog, </w:t>
-            </w:r>
-            <w:proofErr w:type="spellStart"/>
-            <w:r>
-              <w:rPr>
-                <w:lang w:val="en-US"/>
-              </w:rPr>
-              <w:t>fecha</w:t>
-            </w:r>
-            <w:proofErr w:type="spellEnd"/>
-            <w:r>
-              <w:rPr>
-                <w:lang w:val="en-US"/>
-              </w:rPr>
-              <w:t xml:space="preserve">, </w:t>
-            </w:r>
-            <w:proofErr w:type="spellStart"/>
-            <w:r>
-              <w:rPr>
-                <w:lang w:val="en-US"/>
-              </w:rPr>
-              <w:t>min_amount</w:t>
-            </w:r>
-            <w:proofErr w:type="spellEnd"/>
-            <w:r>
-              <w:rPr>
-                <w:lang w:val="en-US"/>
-              </w:rPr>
-              <w:t xml:space="preserve">, </w:t>
-            </w:r>
-            <w:proofErr w:type="spellStart"/>
-            <w:r>
-              <w:rPr>
-                <w:lang w:val="en-US"/>
-              </w:rPr>
-              <w:t>max_amount</w:t>
-            </w:r>
-            <w:proofErr w:type="spellEnd"/>
+              <w:t>catalog, fecha, min_amount, max_amount</w:t>
+            </w:r>
           </w:p>
         </w:tc>
       </w:tr>
@@ -2599,7 +2078,7 @@
     <w:p/>
     <w:p>
       <w:pPr>
-        <w:pStyle w:val="Heading2"/>
+        <w:pStyle w:val="Ttulo2"/>
         <w:rPr>
           <w:b/>
           <w:bCs/>
@@ -2620,7 +2099,7 @@
     </w:p>
     <w:tbl>
       <w:tblPr>
-        <w:tblStyle w:val="TableGrid"/>
+        <w:tblStyle w:val="Tablaconcuadrcula"/>
         <w:tblW w:w="0" w:type="auto"/>
         <w:tblLayout w:type="fixed"/>
         <w:tblLook w:val="06A0" w:firstRow="1" w:lastRow="0" w:firstColumn="1" w:lastColumn="0" w:noHBand="1" w:noVBand="1"/>
@@ -2765,21 +2244,8 @@
               <w:t>Ordenar los pedidos filtrados</w:t>
             </w:r>
             <w:r>
-              <w:t xml:space="preserve"> con </w:t>
-            </w:r>
-            <w:proofErr w:type="spellStart"/>
-            <w:r>
-              <w:t>merge</w:t>
-            </w:r>
-            <w:proofErr w:type="spellEnd"/>
-            <w:r>
-              <w:t xml:space="preserve"> </w:t>
-            </w:r>
-            <w:proofErr w:type="spellStart"/>
-            <w:r>
-              <w:t>sort</w:t>
-            </w:r>
-            <w:proofErr w:type="spellEnd"/>
+              <w:t xml:space="preserve"> con merge sort</w:t>
+            </w:r>
           </w:p>
         </w:tc>
         <w:tc>
@@ -2887,7 +2353,7 @@
     </w:p>
     <w:p>
       <w:pPr>
-        <w:pStyle w:val="Heading2"/>
+        <w:pStyle w:val="Ttulo2"/>
         <w:rPr>
           <w:b/>
           <w:bCs/>
@@ -2904,45 +2370,13 @@
     <w:p/>
     <w:p>
       <w:r>
-        <w:t xml:space="preserve">Al usar un mapa de hash que definimos desde la carga de datos nos ayuda a reducir la complejidad, ya que aunque en el peor de los casos igualmente se filtran todos los pedidos </w:t>
-      </w:r>
-      <w:proofErr w:type="spellStart"/>
-      <w:r>
-        <w:t>seria</w:t>
-      </w:r>
-      <w:proofErr w:type="spellEnd"/>
-      <w:r>
-        <w:t xml:space="preserve"> un caso muy raro ya que en la mayoría de los casos los pedidos </w:t>
-      </w:r>
-      <w:r>
-        <w:t xml:space="preserve">no tienen la misma fecha, lo que permite que el mapa de hash si le quite complejidad al algoritmo, el resto </w:t>
-      </w:r>
-      <w:proofErr w:type="spellStart"/>
-      <w:r>
-        <w:t xml:space="preserve">de </w:t>
-      </w:r>
-      <w:r>
-        <w:t>el</w:t>
-      </w:r>
-      <w:proofErr w:type="spellEnd"/>
-      <w:r>
-        <w:t xml:space="preserve"> algoritmo si mantiene complejidad lineal y el </w:t>
-      </w:r>
-      <w:proofErr w:type="spellStart"/>
-      <w:r>
-        <w:t>merge</w:t>
-      </w:r>
-      <w:proofErr w:type="spellEnd"/>
-      <w:r>
-        <w:t xml:space="preserve"> </w:t>
-      </w:r>
-      <w:proofErr w:type="spellStart"/>
-      <w:r>
-        <w:t>sort</w:t>
-      </w:r>
-      <w:proofErr w:type="spellEnd"/>
-      <w:r>
-        <w:t xml:space="preserve"> </w:t>
+        <w:t xml:space="preserve">Al usar un mapa de hash que definimos desde la carga de datos nos ayuda a reducir la complejidad, ya que aunque en el peor de los casos igualmente se filtran todos los pedidos seria un caso muy raro ya que en la mayoría de los casos los pedidos </w:t>
+      </w:r>
+      <w:r>
+        <w:t xml:space="preserve">no tienen la misma fecha, lo que permite que el mapa de hash si le quite complejidad al algoritmo, el resto de </w:t>
+      </w:r>
+      <w:r>
+        <w:t xml:space="preserve">el algoritmo si mantiene complejidad lineal y el merge sort </w:t>
       </w:r>
       <w:r>
         <w:t>usa una complejidad de n log n en todos los casos, lo que hace que la complejidad final sea de n log n</w:t>
@@ -2950,7 +2384,7 @@
     </w:p>
     <w:p>
       <w:pPr>
-        <w:pStyle w:val="Heading1"/>
+        <w:pStyle w:val="Ttulo1"/>
         <w:rPr>
           <w:b/>
           <w:bCs/>
@@ -2972,7 +2406,7 @@
     </w:p>
     <w:tbl>
       <w:tblPr>
-        <w:tblStyle w:val="TableGrid"/>
+        <w:tblStyle w:val="Tablaconcuadrcula"/>
         <w:tblW w:w="9360" w:type="dxa"/>
         <w:tblLayout w:type="fixed"/>
         <w:tblLook w:val="06A0" w:firstRow="1" w:lastRow="0" w:firstColumn="1" w:lastColumn="0" w:noHBand="1" w:noVBand="1"/>
@@ -3022,30 +2456,8 @@
               <w:rPr>
                 <w:lang w:val="en-US"/>
               </w:rPr>
-              <w:t xml:space="preserve"> </w:t>
-            </w:r>
-            <w:proofErr w:type="spellStart"/>
-            <w:r>
-              <w:rPr>
-                <w:lang w:val="en-US"/>
-              </w:rPr>
-              <w:t>producto</w:t>
-            </w:r>
-            <w:proofErr w:type="spellEnd"/>
-            <w:r>
-              <w:rPr>
-                <w:lang w:val="en-US"/>
-              </w:rPr>
-              <w:t xml:space="preserve">, </w:t>
-            </w:r>
-            <w:proofErr w:type="spellStart"/>
-            <w:r>
-              <w:rPr>
-                <w:lang w:val="en-US"/>
-              </w:rPr>
-              <w:t>pais</w:t>
-            </w:r>
-            <w:proofErr w:type="spellEnd"/>
+              <w:t xml:space="preserve"> producto, pais</w:t>
+            </w:r>
           </w:p>
         </w:tc>
       </w:tr>
@@ -3079,52 +2491,15 @@
               <w:t>Número total de pedidos que cumplen el filtro, p</w:t>
             </w:r>
             <w:r>
-              <w:t xml:space="preserve">romedio de </w:t>
-            </w:r>
-            <w:proofErr w:type="spellStart"/>
-            <w:r>
-              <w:t>Price_per_Box</w:t>
-            </w:r>
-            <w:proofErr w:type="spellEnd"/>
-            <w:r>
-              <w:t xml:space="preserve">, </w:t>
-            </w:r>
-            <w:proofErr w:type="spellStart"/>
-            <w:r>
-              <w:t>Discount_Pct</w:t>
-            </w:r>
-            <w:proofErr w:type="spellEnd"/>
-            <w:r>
-              <w:t xml:space="preserve">, </w:t>
-            </w:r>
-            <w:proofErr w:type="spellStart"/>
-            <w:r>
-              <w:t>Marketing_Spend</w:t>
-            </w:r>
-            <w:proofErr w:type="spellEnd"/>
-            <w:r>
-              <w:t xml:space="preserve"> y </w:t>
-            </w:r>
-            <w:proofErr w:type="spellStart"/>
-            <w:r>
-              <w:t>Boxes_Shipped</w:t>
-            </w:r>
-            <w:proofErr w:type="spellEnd"/>
+              <w:t>romedio de Price_per_Box, Discount_Pct, Marketing_Spend y Boxes_Shipped</w:t>
+            </w:r>
             <w:r>
               <w:t>,</w:t>
             </w:r>
           </w:p>
           <w:p>
             <w:r>
-              <w:t xml:space="preserve">los dos pedidos de mayor </w:t>
-            </w:r>
-            <w:proofErr w:type="spellStart"/>
-            <w:r>
-              <w:t>Amount</w:t>
-            </w:r>
-            <w:proofErr w:type="spellEnd"/>
-            <w:r>
-              <w:t>, tiempo de ejecución del algoritmo</w:t>
+              <w:t>los dos pedidos de mayor Amount, tiempo de ejecución del algoritmo</w:t>
             </w:r>
           </w:p>
         </w:tc>
@@ -3158,13 +2533,8 @@
             <w:r>
               <w:t xml:space="preserve">Si, </w:t>
             </w:r>
-            <w:proofErr w:type="spellStart"/>
-            <w:r>
-              <w:t>Jose</w:t>
-            </w:r>
-            <w:proofErr w:type="spellEnd"/>
-            <w:r>
-              <w:t xml:space="preserve"> Alexander Santos Cobos</w:t>
+            <w:r>
+              <w:t>Jose Alexander Santos Cobos</w:t>
             </w:r>
           </w:p>
         </w:tc>
@@ -3173,7 +2543,7 @@
     <w:p/>
     <w:p>
       <w:pPr>
-        <w:pStyle w:val="Heading2"/>
+        <w:pStyle w:val="Ttulo2"/>
         <w:rPr>
           <w:b/>
           <w:bCs/>
@@ -3196,7 +2566,7 @@
     <w:p/>
     <w:p>
       <w:pPr>
-        <w:pStyle w:val="Heading2"/>
+        <w:pStyle w:val="Ttulo2"/>
         <w:rPr>
           <w:b/>
           <w:bCs/>
@@ -3217,7 +2587,7 @@
     </w:p>
     <w:tbl>
       <w:tblPr>
-        <w:tblStyle w:val="TableGrid"/>
+        <w:tblStyle w:val="Tablaconcuadrcula"/>
         <w:tblW w:w="0" w:type="auto"/>
         <w:tblLayout w:type="fixed"/>
         <w:tblLook w:val="06A0" w:firstRow="1" w:lastRow="0" w:firstColumn="1" w:lastColumn="0" w:noHBand="1" w:noVBand="1"/>
@@ -3294,13 +2664,8 @@
             <w:r>
               <w:t xml:space="preserve"> - </w:t>
             </w:r>
-            <w:proofErr w:type="spellStart"/>
-            <w:r>
-              <w:t>pais</w:t>
-            </w:r>
-            <w:proofErr w:type="spellEnd"/>
-            <w:r>
-              <w:t>" concatenando dos textos</w:t>
+            <w:r>
+              <w:t>pais" concatenando dos textos</w:t>
             </w:r>
           </w:p>
         </w:tc>
@@ -3344,15 +2709,7 @@
               </w:rPr>
             </w:pPr>
             <w:r>
-              <w:t xml:space="preserve">Paso 2: Se busca la llave en la tabla de hash de Linear </w:t>
-            </w:r>
-            <w:proofErr w:type="spellStart"/>
-            <w:r>
-              <w:t>Probing</w:t>
-            </w:r>
-            <w:proofErr w:type="spellEnd"/>
-            <w:r>
-              <w:t xml:space="preserve"> y se obtiene la lista de pedidos de esa combinación</w:t>
+              <w:t>Paso 2: Se busca la llave en la tabla de hash de Linear Probing y se obtiene la lista de pedidos de esa combinación</w:t>
             </w:r>
           </w:p>
         </w:tc>
@@ -3446,86 +2803,8 @@
               <w:rPr>
                 <w:lang w:val="en-US"/>
               </w:rPr>
-              <w:t xml:space="preserve">Por </w:t>
-            </w:r>
-            <w:proofErr w:type="spellStart"/>
-            <w:r>
-              <w:rPr>
-                <w:lang w:val="en-US"/>
-              </w:rPr>
-              <w:t>cada</w:t>
-            </w:r>
-            <w:proofErr w:type="spellEnd"/>
-            <w:r>
-              <w:rPr>
-                <w:lang w:val="en-US"/>
-              </w:rPr>
-              <w:t xml:space="preserve"> uno se suman, </w:t>
-            </w:r>
-            <w:proofErr w:type="spellStart"/>
-            <w:r>
-              <w:rPr>
-                <w:lang w:val="en-US"/>
-              </w:rPr>
-              <w:t>si</w:t>
-            </w:r>
-            <w:proofErr w:type="spellEnd"/>
-            <w:r>
-              <w:rPr>
-                <w:lang w:val="en-US"/>
-              </w:rPr>
-              <w:t xml:space="preserve"> no son None, </w:t>
-            </w:r>
-            <w:proofErr w:type="spellStart"/>
-            <w:r>
-              <w:rPr>
-                <w:lang w:val="en-US"/>
-              </w:rPr>
-              <w:t>Price_per_Box</w:t>
-            </w:r>
-            <w:proofErr w:type="spellEnd"/>
-            <w:r>
-              <w:rPr>
-                <w:lang w:val="en-US"/>
-              </w:rPr>
-              <w:t xml:space="preserve">, </w:t>
-            </w:r>
-            <w:proofErr w:type="spellStart"/>
-            <w:r>
-              <w:rPr>
-                <w:lang w:val="en-US"/>
-              </w:rPr>
-              <w:t>Discount_Pct</w:t>
-            </w:r>
-            <w:proofErr w:type="spellEnd"/>
-            <w:r>
-              <w:rPr>
-                <w:lang w:val="en-US"/>
-              </w:rPr>
-              <w:t xml:space="preserve">, </w:t>
-            </w:r>
-            <w:proofErr w:type="spellStart"/>
-            <w:r>
-              <w:rPr>
-                <w:lang w:val="en-US"/>
-              </w:rPr>
-              <w:t>Marketing_Spend</w:t>
-            </w:r>
-            <w:proofErr w:type="spellEnd"/>
-            <w:r>
-              <w:rPr>
-                <w:lang w:val="en-US"/>
-              </w:rPr>
-              <w:t xml:space="preserve"> y </w:t>
-            </w:r>
-            <w:proofErr w:type="spellStart"/>
-            <w:r>
-              <w:rPr>
-                <w:lang w:val="en-US"/>
-              </w:rPr>
-              <w:t>Boxes_Shipped</w:t>
-            </w:r>
-            <w:proofErr w:type="spellEnd"/>
+              <w:t>Por cada uno se suman, si no son None, Price_per_Box, Discount_Pct, Marketing_Spend y Boxes_Shipped</w:t>
+            </w:r>
           </w:p>
         </w:tc>
         <w:tc>
@@ -3612,54 +2891,25 @@
               </w:rPr>
             </w:pPr>
             <w:r>
-              <w:t xml:space="preserve">Paso 6: Se ordenan los p pedidos con </w:t>
-            </w:r>
-            <w:proofErr w:type="spellStart"/>
-            <w:r>
-              <w:t>Merge</w:t>
-            </w:r>
-            <w:proofErr w:type="spellEnd"/>
-            <w:r>
-              <w:t xml:space="preserve"> Sort </w:t>
+              <w:t xml:space="preserve">Paso 6: Se ordenan los p pedidos con Merge Sort </w:t>
             </w:r>
             <w:r>
               <w:t xml:space="preserve"> en orden </w:t>
             </w:r>
-            <w:proofErr w:type="spellStart"/>
-            <w:r>
-              <w:t>Amount</w:t>
-            </w:r>
-            <w:proofErr w:type="spellEnd"/>
-            <w:r>
-              <w:t xml:space="preserve"> descendente, </w:t>
+            <w:r>
+              <w:t xml:space="preserve">Amount descendente, </w:t>
             </w:r>
             <w:r>
               <w:t xml:space="preserve">si es igual, </w:t>
             </w:r>
             <w:r>
-              <w:t xml:space="preserve">luego </w:t>
-            </w:r>
-            <w:proofErr w:type="spellStart"/>
-            <w:r>
-              <w:t>Marketing_Spend</w:t>
-            </w:r>
-            <w:proofErr w:type="spellEnd"/>
-            <w:r>
-              <w:t xml:space="preserve"> ascendente, </w:t>
+              <w:t xml:space="preserve">luego Marketing_Spend ascendente, </w:t>
             </w:r>
             <w:r>
               <w:t xml:space="preserve">si es igual, </w:t>
             </w:r>
             <w:r>
-              <w:t xml:space="preserve">luego </w:t>
-            </w:r>
-            <w:proofErr w:type="spellStart"/>
-            <w:r>
-              <w:t>Order_ID</w:t>
-            </w:r>
-            <w:proofErr w:type="spellEnd"/>
-            <w:r>
-              <w:t xml:space="preserve"> ascendente)</w:t>
+              <w:t>luego Order_ID ascendente)</w:t>
             </w:r>
           </w:p>
         </w:tc>
@@ -3703,13 +2953,8 @@
               </w:rPr>
             </w:pPr>
             <w:r>
-              <w:t xml:space="preserve">Paso 7: Se toman los dos primeros con </w:t>
-            </w:r>
-            <w:proofErr w:type="spellStart"/>
-            <w:r>
-              <w:t>sub_list</w:t>
-            </w:r>
-            <w:proofErr w:type="spellEnd"/>
+              <w:t>Paso 7: Se toman los dos primeros con sub_list</w:t>
+            </w:r>
           </w:p>
         </w:tc>
         <w:tc>
@@ -3886,7 +3131,7 @@
     </w:p>
     <w:p>
       <w:pPr>
-        <w:pStyle w:val="Heading2"/>
+        <w:pStyle w:val="Ttulo2"/>
         <w:rPr>
           <w:b/>
           <w:bCs/>
@@ -3902,20 +3147,12 @@
     </w:p>
     <w:p>
       <w:r>
-        <w:t xml:space="preserve">Análisis de resultados de la implementación, tener cuenta las pruebas realizadas y el </w:t>
-      </w:r>
-      <w:proofErr w:type="spellStart"/>
-      <w:r>
-        <w:t>analisis</w:t>
-      </w:r>
-      <w:proofErr w:type="spellEnd"/>
-      <w:r>
-        <w:t xml:space="preserve"> de complejidad.</w:t>
+        <w:t>Análisis de resultados de la implementación, tener cuenta las pruebas realizadas y el analisis de complejidad.</w:t>
       </w:r>
     </w:p>
     <w:p>
       <w:pPr>
-        <w:pStyle w:val="Heading1"/>
+        <w:pStyle w:val="Ttulo1"/>
         <w:rPr>
           <w:b/>
           <w:bCs/>
@@ -3936,7 +3173,7 @@
     </w:p>
     <w:p>
       <w:pPr>
-        <w:pStyle w:val="Heading2"/>
+        <w:pStyle w:val="Ttulo2"/>
         <w:rPr>
           <w:b/>
           <w:bCs/>
@@ -3957,7 +3194,7 @@
     </w:p>
     <w:tbl>
       <w:tblPr>
-        <w:tblStyle w:val="TableGrid"/>
+        <w:tblStyle w:val="Tablaconcuadrcula"/>
         <w:tblW w:w="9360" w:type="dxa"/>
         <w:tblLayout w:type="fixed"/>
         <w:tblLook w:val="06A0" w:firstRow="1" w:lastRow="0" w:firstColumn="1" w:lastColumn="0" w:noHBand="1" w:noVBand="1"/>
@@ -3992,33 +3229,15 @@
             <w:tcW w:w="6300" w:type="dxa"/>
           </w:tcPr>
           <w:p>
-            <w:proofErr w:type="spellStart"/>
-            <w:r>
-              <w:t>Catalog</w:t>
-            </w:r>
-            <w:proofErr w:type="spellEnd"/>
-            <w:r>
-              <w:t xml:space="preserve">, </w:t>
+            <w:r>
+              <w:t xml:space="preserve">Catalog, </w:t>
             </w:r>
             <w:r>
               <w:t>N</w:t>
             </w:r>
             <w:r>
-              <w:t xml:space="preserve"> (productos a consultar), país, </w:t>
-            </w:r>
-            <w:proofErr w:type="spellStart"/>
-            <w:r>
-              <w:t>fecha_inicio</w:t>
-            </w:r>
-            <w:proofErr w:type="spellEnd"/>
-            <w:r>
-              <w:t xml:space="preserve">, </w:t>
-            </w:r>
-            <w:proofErr w:type="spellStart"/>
-            <w:r>
-              <w:t>fecha_fin</w:t>
-            </w:r>
-            <w:proofErr w:type="spellEnd"/>
+              <w:t xml:space="preserve"> (productos a consultar), país, fecha_inicio, fecha_fin</w:t>
+            </w:r>
           </w:p>
         </w:tc>
       </w:tr>
@@ -4052,39 +3271,7 @@
               <w:t>Tiempo de ejecución en MS, número total de pedidos que cumplen el filtro por país y el rango de las fechas, número total de producto</w:t>
             </w:r>
             <w:r>
-              <w:t xml:space="preserve">s diferentes encontrados, la suma de </w:t>
-            </w:r>
-            <w:proofErr w:type="spellStart"/>
-            <w:r>
-              <w:t>amount</w:t>
-            </w:r>
-            <w:proofErr w:type="spellEnd"/>
-            <w:r>
-              <w:t xml:space="preserve"> de todos los pedidos filtrados, cada producto del top N por recaudo, mostrar el producto, el número de pedidos, el recaudo total, el </w:t>
-            </w:r>
-            <w:proofErr w:type="spellStart"/>
-            <w:r>
-              <w:t>Price_per_box</w:t>
-            </w:r>
-            <w:proofErr w:type="spellEnd"/>
-            <w:r>
-              <w:t xml:space="preserve"> promedio, el </w:t>
-            </w:r>
-            <w:proofErr w:type="spellStart"/>
-            <w:r>
-              <w:t>discount_pct</w:t>
-            </w:r>
-            <w:proofErr w:type="spellEnd"/>
-            <w:r>
-              <w:t xml:space="preserve"> y el marketing </w:t>
-            </w:r>
-            <w:proofErr w:type="spellStart"/>
-            <w:r>
-              <w:t>spend</w:t>
-            </w:r>
-            <w:proofErr w:type="spellEnd"/>
-            <w:r>
-              <w:t xml:space="preserve"> total. </w:t>
+              <w:t xml:space="preserve">s diferentes encontrados, la suma de amount de todos los pedidos filtrados, cada producto del top N por recaudo, mostrar el producto, el número de pedidos, el recaudo total, el Price_per_box promedio, el discount_pct y el marketing spend total. </w:t>
             </w:r>
           </w:p>
         </w:tc>
@@ -4125,7 +3312,7 @@
     <w:p/>
     <w:p>
       <w:pPr>
-        <w:pStyle w:val="Heading2"/>
+        <w:pStyle w:val="Ttulo2"/>
         <w:rPr>
           <w:b/>
           <w:bCs/>
@@ -4146,7 +3333,7 @@
     </w:p>
     <w:tbl>
       <w:tblPr>
-        <w:tblStyle w:val="TableGrid"/>
+        <w:tblStyle w:val="Tablaconcuadrcula"/>
         <w:tblW w:w="0" w:type="auto"/>
         <w:tblLayout w:type="fixed"/>
         <w:tblLook w:val="06A0" w:firstRow="1" w:lastRow="0" w:firstColumn="1" w:lastColumn="0" w:noHBand="1" w:noVBand="1"/>
@@ -4288,15 +3475,7 @@
           </w:tcPr>
           <w:p>
             <w:r>
-              <w:t xml:space="preserve">Ordenar con </w:t>
-            </w:r>
-            <w:proofErr w:type="spellStart"/>
-            <w:r>
-              <w:t>merge_sort</w:t>
-            </w:r>
-            <w:proofErr w:type="spellEnd"/>
-            <w:r>
-              <w:t>()</w:t>
+              <w:t>Ordenar con merge_sort()</w:t>
             </w:r>
           </w:p>
         </w:tc>
@@ -4417,7 +3596,7 @@
     </w:p>
     <w:p>
       <w:pPr>
-        <w:pStyle w:val="Heading2"/>
+        <w:pStyle w:val="Ttulo2"/>
         <w:rPr>
           <w:b/>
           <w:bCs/>
@@ -4445,15 +3624,7 @@
     <w:p/>
     <w:p>
       <w:r>
-        <w:t xml:space="preserve">El </w:t>
-      </w:r>
-      <w:proofErr w:type="spellStart"/>
-      <w:r>
-        <w:t>Req</w:t>
-      </w:r>
-      <w:proofErr w:type="spellEnd"/>
-      <w:r>
-        <w:t>. 5 tiene una complejidad de O(</w:t>
+        <w:t>El Req. 5 tiene una complejidad de O(</w:t>
       </w:r>
       <w:r>
         <w:t>a</w:t>
@@ -4495,84 +3666,47 @@
         <w:t xml:space="preserve"> </w:t>
       </w:r>
       <w:r>
-        <w:t xml:space="preserve">y el </w:t>
-      </w:r>
-      <w:proofErr w:type="spellStart"/>
-      <w:r>
-        <w:t>merge</w:t>
-      </w:r>
-      <w:proofErr w:type="spellEnd"/>
+        <w:t xml:space="preserve">y el merge sort se aplica solo sobre los </w:t>
+      </w:r>
+      <w:r>
+        <w:t>n</w:t>
+      </w:r>
+      <w:r>
+        <w:t xml:space="preserve"> acumuladores</w:t>
+      </w:r>
+      <w:r>
+        <w:t xml:space="preserve"> y </w:t>
+      </w:r>
+      <w:r>
+        <w:t>no sobre los pedidos</w:t>
+      </w:r>
       <w:r>
         <w:t xml:space="preserve"> </w:t>
       </w:r>
-      <w:proofErr w:type="spellStart"/>
-      <w:r>
-        <w:t>sort</w:t>
-      </w:r>
-      <w:proofErr w:type="spellEnd"/>
-      <w:r>
-        <w:t xml:space="preserve"> se aplica solo sobre los </w:t>
+      <w:r>
+        <w:t>con un</w:t>
+      </w:r>
+      <w:r>
+        <w:t xml:space="preserve">a complejidad </w:t>
+      </w:r>
+      <w:r>
+        <w:t>de O(</w:t>
       </w:r>
       <w:r>
         <w:t>n</w:t>
       </w:r>
       <w:r>
-        <w:t xml:space="preserve"> acumuladores</w:t>
-      </w:r>
-      <w:r>
-        <w:t xml:space="preserve"> y </w:t>
-      </w:r>
-      <w:r>
-        <w:t>no sobre los pedidos</w:t>
-      </w:r>
-      <w:r>
-        <w:t xml:space="preserve"> </w:t>
-      </w:r>
-      <w:r>
-        <w:t>con un</w:t>
-      </w:r>
-      <w:r>
-        <w:t xml:space="preserve">a complejidad </w:t>
-      </w:r>
-      <w:r>
-        <w:t>de O(</w:t>
+        <w:t xml:space="preserve"> log </w:t>
       </w:r>
       <w:r>
         <w:t>n</w:t>
       </w:r>
       <w:r>
-        <w:t xml:space="preserve"> log </w:t>
-      </w:r>
-      <w:r>
-        <w:t>n</w:t>
-      </w:r>
-      <w:r>
-        <w:t xml:space="preserve">). En las pruebas con el archivo del 100%, la implementación con Linear </w:t>
-      </w:r>
-      <w:proofErr w:type="spellStart"/>
-      <w:r>
-        <w:t>Probing</w:t>
-      </w:r>
-      <w:proofErr w:type="spellEnd"/>
-      <w:r>
-        <w:t xml:space="preserve"> fue entre 20 y 30 ms más rápida que la de </w:t>
-      </w:r>
-      <w:proofErr w:type="spellStart"/>
-      <w:r>
-        <w:t>Separate</w:t>
-      </w:r>
-      <w:proofErr w:type="spellEnd"/>
-      <w:r>
-        <w:t xml:space="preserve"> </w:t>
-      </w:r>
-      <w:proofErr w:type="spellStart"/>
+        <w:t xml:space="preserve">). En las pruebas con el archivo del 100%, la implementación con Linear Probing fue entre 20 y 30 ms más rápida que la de Separate </w:t>
+      </w:r>
       <w:r>
         <w:lastRenderedPageBreak/>
-        <w:t>Chaining</w:t>
-      </w:r>
-      <w:proofErr w:type="spellEnd"/>
-      <w:r>
-        <w:t xml:space="preserve">. Esto </w:t>
+        <w:t xml:space="preserve">Chaining. Esto </w:t>
       </w:r>
       <w:r>
         <w:t xml:space="preserve">es gracias a que </w:t>
@@ -4584,59 +3718,19 @@
         <w:t>hace</w:t>
       </w:r>
       <w:r>
-        <w:t xml:space="preserve"> casi solo operaciones </w:t>
-      </w:r>
-      <w:proofErr w:type="spellStart"/>
-      <w:r>
-        <w:t>get</w:t>
-      </w:r>
-      <w:proofErr w:type="spellEnd"/>
-      <w:r>
-        <w:t xml:space="preserve"> sobre el mapa de acumuladores (el </w:t>
-      </w:r>
-      <w:proofErr w:type="spellStart"/>
-      <w:r>
-        <w:t>put</w:t>
-      </w:r>
-      <w:proofErr w:type="spellEnd"/>
-      <w:r>
-        <w:t xml:space="preserve"> ocurre únicamente la primera vez que aparece cada producto), y con pocas llaves y factor de carga bajo</w:t>
+        <w:t xml:space="preserve"> casi solo operaciones get sobre el mapa de acumuladores (el put ocurre únicamente la primera vez que aparece cada producto), y con pocas llaves y factor de carga bajo</w:t>
       </w:r>
       <w:r>
         <w:t xml:space="preserve"> pues</w:t>
       </w:r>
       <w:r>
-        <w:t xml:space="preserve"> Linear </w:t>
-      </w:r>
-      <w:proofErr w:type="spellStart"/>
-      <w:r>
-        <w:t>Probing</w:t>
-      </w:r>
-      <w:proofErr w:type="spellEnd"/>
-      <w:r>
-        <w:t xml:space="preserve"> </w:t>
+        <w:t xml:space="preserve"> Linear Probing </w:t>
       </w:r>
       <w:r>
         <w:t>tiende a</w:t>
       </w:r>
       <w:r>
-        <w:t xml:space="preserve"> encontrar el producto en la primera casilla, mientras que </w:t>
-      </w:r>
-      <w:proofErr w:type="spellStart"/>
-      <w:r>
-        <w:t>Separate</w:t>
-      </w:r>
-      <w:proofErr w:type="spellEnd"/>
-      <w:r>
-        <w:t xml:space="preserve"> </w:t>
-      </w:r>
-      <w:proofErr w:type="spellStart"/>
-      <w:r>
-        <w:t>Chaining</w:t>
-      </w:r>
-      <w:proofErr w:type="spellEnd"/>
-      <w:r>
-        <w:t xml:space="preserve"> debe recorrer </w:t>
+        <w:t xml:space="preserve"> encontrar el producto en la primera casilla, mientras que Separate Chaining debe recorrer </w:t>
       </w:r>
       <w:r>
         <w:t xml:space="preserve">los </w:t>
@@ -4665,6 +3759,9 @@
     </w:p>
     <w:p>
       <w:r>
+        <w:rPr>
+          <w:noProof/>
+        </w:rPr>
         <w:drawing>
           <wp:inline distT="0" distB="0" distL="0" distR="0" wp14:anchorId="51B40F16" wp14:editId="1EDC7F8B">
             <wp:extent cx="5943600" cy="6192520"/>
@@ -4706,10 +3803,10 @@
       <w:r>
         <w:lastRenderedPageBreak/>
         <w:drawing>
-          <wp:inline distT="0" distB="0" distL="0" distR="0" wp14:anchorId="20546BD0" wp14:editId="71D302B1">
-            <wp:extent cx="5943600" cy="3882390"/>
-            <wp:effectExtent l="0" t="0" r="0" b="3810"/>
-            <wp:docPr id="162847154" name="Picture 1"/>
+          <wp:inline distT="0" distB="0" distL="0" distR="0" wp14:anchorId="27CB5FEE" wp14:editId="65C03224">
+            <wp:extent cx="5943600" cy="4298950"/>
+            <wp:effectExtent l="0" t="0" r="0" b="6350"/>
+            <wp:docPr id="729735467" name="Imagen 1"/>
             <wp:cNvGraphicFramePr>
               <a:graphicFrameLocks xmlns:a="http://schemas.openxmlformats.org/drawingml/2006/main" noChangeAspect="1"/>
             </wp:cNvGraphicFramePr>
@@ -4717,7 +3814,7 @@
               <a:graphicData uri="http://schemas.openxmlformats.org/drawingml/2006/picture">
                 <pic:pic xmlns:pic="http://schemas.openxmlformats.org/drawingml/2006/picture">
                   <pic:nvPicPr>
-                    <pic:cNvPr id="162847154" name=""/>
+                    <pic:cNvPr id="729735467" name=""/>
                     <pic:cNvPicPr/>
                   </pic:nvPicPr>
                   <pic:blipFill>
@@ -4729,7 +3826,7 @@
                   <pic:spPr>
                     <a:xfrm>
                       <a:off x="0" y="0"/>
-                      <a:ext cx="5943600" cy="3882390"/>
+                      <a:ext cx="5943600" cy="4298950"/>
                     </a:xfrm>
                     <a:prstGeom prst="rect">
                       <a:avLst/>
@@ -4742,9 +3839,10 @@
         </w:drawing>
       </w:r>
     </w:p>
+    <w:p/>
     <w:p>
       <w:pPr>
-        <w:pStyle w:val="Heading1"/>
+        <w:pStyle w:val="Ttulo1"/>
         <w:rPr>
           <w:b/>
           <w:bCs/>
@@ -4801,6 +3899,7 @@
         </w:drawing>
       </w:r>
     </w:p>
+    <w:p/>
     <w:p>
       <w:r>
         <w:rPr>
@@ -4888,7 +3987,7 @@
     </w:p>
     <w:p>
       <w:pPr>
-        <w:pStyle w:val="Heading2"/>
+        <w:pStyle w:val="Ttulo2"/>
         <w:rPr>
           <w:b/>
           <w:bCs/>
@@ -4910,7 +4009,7 @@
     </w:p>
     <w:tbl>
       <w:tblPr>
-        <w:tblStyle w:val="TableGrid"/>
+        <w:tblStyle w:val="Tablaconcuadrcula"/>
         <w:tblW w:w="9360" w:type="dxa"/>
         <w:tblLayout w:type="fixed"/>
         <w:tblLook w:val="06A0" w:firstRow="1" w:lastRow="0" w:firstColumn="1" w:lastColumn="0" w:noHBand="1" w:noVBand="1"/>
@@ -5095,7 +4194,7 @@
     <w:p/>
     <w:p>
       <w:pPr>
-        <w:pStyle w:val="Heading2"/>
+        <w:pStyle w:val="Ttulo2"/>
         <w:rPr>
           <w:b/>
           <w:bCs/>
@@ -5116,7 +4215,7 @@
     </w:p>
     <w:tbl>
       <w:tblPr>
-        <w:tblStyle w:val="TableGrid"/>
+        <w:tblStyle w:val="Tablaconcuadrcula"/>
         <w:tblW w:w="0" w:type="auto"/>
         <w:tblLayout w:type="fixed"/>
         <w:tblLook w:val="06A0" w:firstRow="1" w:lastRow="0" w:firstColumn="1" w:lastColumn="0" w:noHBand="1" w:noVBand="1"/>
@@ -5333,7 +4432,7 @@
     </w:p>
     <w:p>
       <w:pPr>
-        <w:pStyle w:val="Heading2"/>
+        <w:pStyle w:val="Ttulo2"/>
         <w:rPr>
           <w:b/>
           <w:bCs/>
@@ -5349,37 +4448,13 @@
     </w:p>
     <w:p>
       <w:r>
-        <w:t xml:space="preserve">En el algoritmo usamos </w:t>
-      </w:r>
-      <w:proofErr w:type="spellStart"/>
-      <w:r>
-        <w:t>separate</w:t>
-      </w:r>
-      <w:proofErr w:type="spellEnd"/>
-      <w:r>
-        <w:t xml:space="preserve"> </w:t>
-      </w:r>
-      <w:proofErr w:type="spellStart"/>
-      <w:r>
-        <w:t>chaining</w:t>
-      </w:r>
-      <w:proofErr w:type="spellEnd"/>
-      <w:r>
-        <w:t xml:space="preserve"> para organizar los </w:t>
+        <w:t xml:space="preserve">En el algoritmo usamos separate chaining para organizar los </w:t>
       </w:r>
       <w:r>
         <w:t xml:space="preserve">pedidos por productos, lo que nos ayuda a mantener el filtro de por productos en una complejidad O(1), lo que ya reduce en buena parte la complejidad, el otro filtro se mantiene en O(N) y </w:t>
       </w:r>
       <w:r>
-        <w:t xml:space="preserve">al final el organizar por países la complejidad pasa a ser la </w:t>
-      </w:r>
-      <w:proofErr w:type="spellStart"/>
-      <w:r>
-        <w:t>de el</w:t>
-      </w:r>
-      <w:proofErr w:type="spellEnd"/>
-      <w:r>
-        <w:t xml:space="preserve"> algoritmo de ordenamiento, </w:t>
+        <w:t xml:space="preserve">al final el organizar por países la complejidad pasa a ser la de el algoritmo de ordenamiento, </w:t>
       </w:r>
       <w:r>
         <w:t>lo tomamos como un numero diferente porque consideramos muy raro que para cada producto que se encuentre sea de un país diferente, por eso la complejidad final seria O(N+ M LOG M)</w:t>
@@ -5452,7 +4527,7 @@
         </w:tcPr>
         <w:p>
           <w:pPr>
-            <w:pStyle w:val="Header"/>
+            <w:pStyle w:val="Encabezado"/>
             <w:ind w:left="-115"/>
           </w:pPr>
         </w:p>
@@ -5463,7 +4538,7 @@
         </w:tcPr>
         <w:p>
           <w:pPr>
-            <w:pStyle w:val="Header"/>
+            <w:pStyle w:val="Encabezado"/>
             <w:jc w:val="center"/>
           </w:pPr>
         </w:p>
@@ -5474,7 +4549,7 @@
         </w:tcPr>
         <w:p>
           <w:pPr>
-            <w:pStyle w:val="Header"/>
+            <w:pStyle w:val="Encabezado"/>
             <w:ind w:right="-115"/>
             <w:jc w:val="right"/>
           </w:pPr>
@@ -5484,7 +4559,7 @@
   </w:tbl>
   <w:p>
     <w:pPr>
-      <w:pStyle w:val="Footer"/>
+      <w:pStyle w:val="Piedepgina"/>
     </w:pPr>
   </w:p>
 </w:ftr>
@@ -5510,7 +4585,7 @@
         </w:tcPr>
         <w:p>
           <w:pPr>
-            <w:pStyle w:val="Header"/>
+            <w:pStyle w:val="Encabezado"/>
             <w:ind w:left="-115"/>
           </w:pPr>
         </w:p>
@@ -5521,7 +4596,7 @@
         </w:tcPr>
         <w:p>
           <w:pPr>
-            <w:pStyle w:val="Header"/>
+            <w:pStyle w:val="Encabezado"/>
             <w:jc w:val="center"/>
           </w:pPr>
         </w:p>
@@ -5532,7 +4607,7 @@
         </w:tcPr>
         <w:p>
           <w:pPr>
-            <w:pStyle w:val="Header"/>
+            <w:pStyle w:val="Encabezado"/>
             <w:ind w:right="-115"/>
             <w:jc w:val="right"/>
           </w:pPr>
@@ -5542,7 +4617,7 @@
   </w:tbl>
   <w:p>
     <w:pPr>
-      <w:pStyle w:val="Footer"/>
+      <w:pStyle w:val="Piedepgina"/>
     </w:pPr>
   </w:p>
 </w:ftr>
@@ -5600,7 +4675,7 @@
         </w:tcPr>
         <w:p>
           <w:pPr>
-            <w:pStyle w:val="Header"/>
+            <w:pStyle w:val="Encabezado"/>
             <w:ind w:left="-115"/>
           </w:pPr>
         </w:p>
@@ -5611,7 +4686,7 @@
         </w:tcPr>
         <w:p>
           <w:pPr>
-            <w:pStyle w:val="Header"/>
+            <w:pStyle w:val="Encabezado"/>
             <w:jc w:val="center"/>
           </w:pPr>
         </w:p>
@@ -5622,7 +4697,7 @@
         </w:tcPr>
         <w:p>
           <w:pPr>
-            <w:pStyle w:val="Header"/>
+            <w:pStyle w:val="Encabezado"/>
             <w:ind w:right="-115"/>
             <w:jc w:val="right"/>
           </w:pPr>
@@ -5632,7 +4707,7 @@
   </w:tbl>
   <w:p>
     <w:pPr>
-      <w:pStyle w:val="Header"/>
+      <w:pStyle w:val="Encabezado"/>
     </w:pPr>
   </w:p>
 </w:hdr>
@@ -5642,7 +4717,7 @@
 <w:hdr xmlns:wpc="http://schemas.microsoft.com/office/word/2010/wordprocessingCanvas" xmlns:cx="http://schemas.microsoft.com/office/drawing/2014/chartex" xmlns:cx1="http://schemas.microsoft.com/office/drawing/2015/9/8/chartex" xmlns:cx2="http://schemas.microsoft.com/office/drawing/2015/10/21/chartex" xmlns:cx3="http://schemas.microsoft.com/office/drawing/2016/5/9/chartex" xmlns:cx4="http://schemas.microsoft.com/office/drawing/2016/5/10/chartex" xmlns:cx5="http://schemas.microsoft.com/office/drawing/2016/5/11/chartex" xmlns:cx6="http://schemas.microsoft.com/office/drawing/2016/5/12/chartex" xmlns:cx7="http://schemas.microsoft.com/office/drawing/2016/5/13/chartex" xmlns:cx8="http://schemas.microsoft.com/office/drawing/2016/5/14/chartex" xmlns:mc="http://schemas.openxmlformats.org/markup-compatibility/2006" xmlns:aink="http://schemas.microsoft.com/office/drawing/2016/ink" xmlns:am3d="http://schemas.microsoft.com/office/drawing/2017/model3d" xmlns:o="urn:schemas-microsoft-com:office:office" xmlns:oel="http://schemas.microsoft.com/office/2019/extlst" xmlns:r="http://schemas.openxmlformats.org/officeDocument/2006/relationships" xmlns:m="http://schemas.openxmlformats.org/officeDocument/2006/math" xmlns:v="urn:schemas-microsoft-com:vml" xmlns:wp14="http://schemas.microsoft.com/office/word/2010/wordprocessingDrawing" xmlns:wp="http://schemas.openxmlformats.org/drawingml/2006/wordprocessingDrawing" xmlns:w10="urn:schemas-microsoft-com:office:word" xmlns:w="http://schemas.openxmlformats.org/wordprocessingml/2006/main" xmlns:w14="http://schemas.microsoft.com/office/word/2010/wordml" xmlns:w15="http://schemas.microsoft.com/office/word/2012/wordml" xmlns:w16cex="http://schemas.microsoft.com/office/word/2018/wordml/cex" xmlns:w16cid="http://schemas.microsoft.com/office/word/2016/wordml/cid" xmlns:w16="http://schemas.microsoft.com/office/word/2018/wordml" xmlns:w16du="http://schemas.microsoft.com/office/word/2023/wordml/word16du" xmlns:w16sdtdh="http://schemas.microsoft.com/office/word/2020/wordml/sdtdatahash" xmlns:w16sdtfl="http://schemas.microsoft.com/office/word/2024/wordml/sdtformatlock" xmlns:w16se="http://schemas.microsoft.com/office/word/2015/wordml/symex" xmlns:wpg="http://schemas.microsoft.com/office/word/2010/wordprocessingGroup" xmlns:wpi="http://schemas.microsoft.com/office/word/2010/wordprocessingInk" xmlns:wne="http://schemas.microsoft.com/office/word/2006/wordml" xmlns:wps="http://schemas.microsoft.com/office/word/2010/wordprocessingShape" mc:Ignorable="w14 w15 w16se w16cid w16 w16cex w16sdtdh w16sdtfl w16du wp14">
   <w:tbl>
     <w:tblPr>
-      <w:tblStyle w:val="TableGrid"/>
+      <w:tblStyle w:val="Tablaconcuadrcula"/>
       <w:tblW w:w="10060" w:type="dxa"/>
       <w:jc w:val="center"/>
       <w:tblBorders>
@@ -5846,7 +4921,7 @@
   </w:tbl>
   <w:p>
     <w:pPr>
-      <w:pStyle w:val="Header"/>
+      <w:pStyle w:val="Encabezado"/>
     </w:pPr>
   </w:p>
 </w:hdr>
@@ -8099,11 +7174,11 @@
       <w:lang w:val="es-CO"/>
     </w:rPr>
   </w:style>
-  <w:style w:type="paragraph" w:styleId="Heading1">
+  <w:style w:type="paragraph" w:styleId="Ttulo1">
     <w:name w:val="heading 1"/>
     <w:basedOn w:val="Normal"/>
     <w:next w:val="Normal"/>
-    <w:link w:val="Heading1Char"/>
+    <w:link w:val="Ttulo1Car"/>
     <w:uiPriority w:val="9"/>
     <w:qFormat/>
     <w:rsid w:val="002B5D65"/>
@@ -8120,11 +7195,11 @@
       <w:szCs w:val="36"/>
     </w:rPr>
   </w:style>
-  <w:style w:type="paragraph" w:styleId="Heading2">
+  <w:style w:type="paragraph" w:styleId="Ttulo2">
     <w:name w:val="heading 2"/>
     <w:basedOn w:val="Normal"/>
     <w:next w:val="Normal"/>
-    <w:link w:val="Heading2Char"/>
+    <w:link w:val="Ttulo2Car"/>
     <w:uiPriority w:val="9"/>
     <w:unhideWhenUsed/>
     <w:qFormat/>
@@ -8142,11 +7217,11 @@
       <w:szCs w:val="32"/>
     </w:rPr>
   </w:style>
-  <w:style w:type="paragraph" w:styleId="Heading3">
+  <w:style w:type="paragraph" w:styleId="Ttulo3">
     <w:name w:val="heading 3"/>
     <w:basedOn w:val="Normal"/>
     <w:next w:val="Normal"/>
-    <w:link w:val="Heading3Char"/>
+    <w:link w:val="Ttulo3Car"/>
     <w:uiPriority w:val="9"/>
     <w:unhideWhenUsed/>
     <w:qFormat/>
@@ -8164,11 +7239,11 @@
       <w:szCs w:val="28"/>
     </w:rPr>
   </w:style>
-  <w:style w:type="paragraph" w:styleId="Heading4">
+  <w:style w:type="paragraph" w:styleId="Ttulo4">
     <w:name w:val="heading 4"/>
     <w:basedOn w:val="Normal"/>
     <w:next w:val="Normal"/>
-    <w:link w:val="Heading4Char"/>
+    <w:link w:val="Ttulo4Car"/>
     <w:uiPriority w:val="9"/>
     <w:unhideWhenUsed/>
     <w:qFormat/>
@@ -8186,11 +7261,11 @@
       <w:szCs w:val="24"/>
     </w:rPr>
   </w:style>
-  <w:style w:type="paragraph" w:styleId="Heading5">
+  <w:style w:type="paragraph" w:styleId="Ttulo5">
     <w:name w:val="heading 5"/>
     <w:basedOn w:val="Normal"/>
     <w:next w:val="Normal"/>
-    <w:link w:val="Heading5Char"/>
+    <w:link w:val="Ttulo5Car"/>
     <w:uiPriority w:val="9"/>
     <w:semiHidden/>
     <w:unhideWhenUsed/>
@@ -8208,11 +7283,11 @@
       <w:color w:val="2F5496" w:themeColor="accent1" w:themeShade="BF"/>
     </w:rPr>
   </w:style>
-  <w:style w:type="paragraph" w:styleId="Heading6">
+  <w:style w:type="paragraph" w:styleId="Ttulo6">
     <w:name w:val="heading 6"/>
     <w:basedOn w:val="Normal"/>
     <w:next w:val="Normal"/>
-    <w:link w:val="Heading6Char"/>
+    <w:link w:val="Ttulo6Car"/>
     <w:uiPriority w:val="9"/>
     <w:semiHidden/>
     <w:unhideWhenUsed/>
@@ -8232,11 +7307,11 @@
       <w:color w:val="1F3864" w:themeColor="accent1" w:themeShade="80"/>
     </w:rPr>
   </w:style>
-  <w:style w:type="paragraph" w:styleId="Heading7">
+  <w:style w:type="paragraph" w:styleId="Ttulo7">
     <w:name w:val="heading 7"/>
     <w:basedOn w:val="Normal"/>
     <w:next w:val="Normal"/>
-    <w:link w:val="Heading7Char"/>
+    <w:link w:val="Ttulo7Car"/>
     <w:uiPriority w:val="9"/>
     <w:semiHidden/>
     <w:unhideWhenUsed/>
@@ -8255,11 +7330,11 @@
       <w:color w:val="1F3864" w:themeColor="accent1" w:themeShade="80"/>
     </w:rPr>
   </w:style>
-  <w:style w:type="paragraph" w:styleId="Heading8">
+  <w:style w:type="paragraph" w:styleId="Ttulo8">
     <w:name w:val="heading 8"/>
     <w:basedOn w:val="Normal"/>
     <w:next w:val="Normal"/>
-    <w:link w:val="Heading8Char"/>
+    <w:link w:val="Ttulo8Car"/>
     <w:uiPriority w:val="9"/>
     <w:semiHidden/>
     <w:unhideWhenUsed/>
@@ -8280,11 +7355,11 @@
       <w:color w:val="1F3864" w:themeColor="accent1" w:themeShade="80"/>
     </w:rPr>
   </w:style>
-  <w:style w:type="paragraph" w:styleId="Heading9">
+  <w:style w:type="paragraph" w:styleId="Ttulo9">
     <w:name w:val="heading 9"/>
     <w:basedOn w:val="Normal"/>
     <w:next w:val="Normal"/>
-    <w:link w:val="Heading9Char"/>
+    <w:link w:val="Ttulo9Car"/>
     <w:uiPriority w:val="9"/>
     <w:semiHidden/>
     <w:unhideWhenUsed/>
@@ -8303,13 +7378,13 @@
       <w:color w:val="1F3864" w:themeColor="accent1" w:themeShade="80"/>
     </w:rPr>
   </w:style>
-  <w:style w:type="character" w:default="1" w:styleId="DefaultParagraphFont">
+  <w:style w:type="character" w:default="1" w:styleId="Fuentedeprrafopredeter">
     <w:name w:val="Default Paragraph Font"/>
     <w:uiPriority w:val="1"/>
     <w:semiHidden/>
     <w:unhideWhenUsed/>
   </w:style>
-  <w:style w:type="table" w:default="1" w:styleId="TableNormal">
+  <w:style w:type="table" w:default="1" w:styleId="Tablanormal">
     <w:name w:val="Normal Table"/>
     <w:uiPriority w:val="99"/>
     <w:semiHidden/>
@@ -8324,17 +7399,17 @@
       </w:tblCellMar>
     </w:tblPr>
   </w:style>
-  <w:style w:type="numbering" w:default="1" w:styleId="NoList">
+  <w:style w:type="numbering" w:default="1" w:styleId="Sinlista">
     <w:name w:val="No List"/>
     <w:uiPriority w:val="99"/>
     <w:semiHidden/>
     <w:unhideWhenUsed/>
   </w:style>
-  <w:style w:type="paragraph" w:styleId="Title">
+  <w:style w:type="paragraph" w:styleId="Ttulo">
     <w:name w:val="Title"/>
     <w:basedOn w:val="Normal"/>
     <w:next w:val="Normal"/>
-    <w:link w:val="TitleChar"/>
+    <w:link w:val="TtuloCar"/>
     <w:uiPriority w:val="10"/>
     <w:qFormat/>
     <w:rsid w:val="002B5D65"/>
@@ -8353,7 +7428,7 @@
   </w:style>
   <w:style w:type="character" w:customStyle="1" w:styleId="TitleChar1">
     <w:name w:val="Title Char1"/>
-    <w:basedOn w:val="DefaultParagraphFont"/>
+    <w:basedOn w:val="Fuentedeprrafopredeter"/>
     <w:uiPriority w:val="10"/>
     <w:rsid w:val="00F96056"/>
     <w:rPr>
@@ -8365,7 +7440,7 @@
   </w:style>
   <w:style w:type="character" w:customStyle="1" w:styleId="Heading1Char1">
     <w:name w:val="Heading 1 Char1"/>
-    <w:basedOn w:val="DefaultParagraphFont"/>
+    <w:basedOn w:val="Fuentedeprrafopredeter"/>
     <w:uiPriority w:val="9"/>
     <w:rsid w:val="00F96056"/>
     <w:rPr>
@@ -8378,10 +7453,10 @@
       <w:szCs w:val="36"/>
     </w:rPr>
   </w:style>
-  <w:style w:type="character" w:customStyle="1" w:styleId="Heading2Char">
-    <w:name w:val="Heading 2 Char"/>
-    <w:basedOn w:val="DefaultParagraphFont"/>
-    <w:link w:val="Heading2"/>
+  <w:style w:type="character" w:customStyle="1" w:styleId="Ttulo2Car">
+    <w:name w:val="Título 2 Car"/>
+    <w:basedOn w:val="Fuentedeprrafopredeter"/>
+    <w:link w:val="Ttulo2"/>
     <w:uiPriority w:val="9"/>
     <w:rsid w:val="002B5D65"/>
     <w:rPr>
@@ -8391,7 +7466,7 @@
       <w:szCs w:val="32"/>
     </w:rPr>
   </w:style>
-  <w:style w:type="paragraph" w:styleId="ListParagraph">
+  <w:style w:type="paragraph" w:styleId="Prrafodelista">
     <w:name w:val="List Paragraph"/>
     <w:basedOn w:val="Normal"/>
     <w:uiPriority w:val="34"/>
@@ -8402,10 +7477,10 @@
       <w:contextualSpacing/>
     </w:pPr>
   </w:style>
-  <w:style w:type="character" w:customStyle="1" w:styleId="Heading3Char">
-    <w:name w:val="Heading 3 Char"/>
-    <w:basedOn w:val="DefaultParagraphFont"/>
-    <w:link w:val="Heading3"/>
+  <w:style w:type="character" w:customStyle="1" w:styleId="Ttulo3Car">
+    <w:name w:val="Título 3 Car"/>
+    <w:basedOn w:val="Fuentedeprrafopredeter"/>
+    <w:link w:val="Ttulo3"/>
     <w:uiPriority w:val="9"/>
     <w:rsid w:val="002B5D65"/>
     <w:rPr>
@@ -8415,10 +7490,10 @@
       <w:szCs w:val="28"/>
     </w:rPr>
   </w:style>
-  <w:style w:type="character" w:customStyle="1" w:styleId="Heading4Char">
-    <w:name w:val="Heading 4 Char"/>
-    <w:basedOn w:val="DefaultParagraphFont"/>
-    <w:link w:val="Heading4"/>
+  <w:style w:type="character" w:customStyle="1" w:styleId="Ttulo4Car">
+    <w:name w:val="Título 4 Car"/>
+    <w:basedOn w:val="Fuentedeprrafopredeter"/>
+    <w:link w:val="Ttulo4"/>
     <w:uiPriority w:val="9"/>
     <w:rsid w:val="002B5D65"/>
     <w:rPr>
@@ -8428,10 +7503,10 @@
       <w:szCs w:val="24"/>
     </w:rPr>
   </w:style>
-  <w:style w:type="character" w:customStyle="1" w:styleId="Heading5Char">
-    <w:name w:val="Heading 5 Char"/>
-    <w:basedOn w:val="DefaultParagraphFont"/>
-    <w:link w:val="Heading5"/>
+  <w:style w:type="character" w:customStyle="1" w:styleId="Ttulo5Car">
+    <w:name w:val="Título 5 Car"/>
+    <w:basedOn w:val="Fuentedeprrafopredeter"/>
+    <w:link w:val="Ttulo5"/>
     <w:uiPriority w:val="9"/>
     <w:semiHidden/>
     <w:rsid w:val="002B5D65"/>
@@ -8441,10 +7516,10 @@
       <w:color w:val="2F5496" w:themeColor="accent1" w:themeShade="BF"/>
     </w:rPr>
   </w:style>
-  <w:style w:type="character" w:customStyle="1" w:styleId="Heading6Char">
-    <w:name w:val="Heading 6 Char"/>
-    <w:basedOn w:val="DefaultParagraphFont"/>
-    <w:link w:val="Heading6"/>
+  <w:style w:type="character" w:customStyle="1" w:styleId="Ttulo6Car">
+    <w:name w:val="Título 6 Car"/>
+    <w:basedOn w:val="Fuentedeprrafopredeter"/>
+    <w:link w:val="Ttulo6"/>
     <w:uiPriority w:val="9"/>
     <w:semiHidden/>
     <w:rsid w:val="002B5D65"/>
@@ -8456,10 +7531,10 @@
       <w:color w:val="1F3864" w:themeColor="accent1" w:themeShade="80"/>
     </w:rPr>
   </w:style>
-  <w:style w:type="character" w:customStyle="1" w:styleId="Heading7Char">
-    <w:name w:val="Heading 7 Char"/>
-    <w:basedOn w:val="DefaultParagraphFont"/>
-    <w:link w:val="Heading7"/>
+  <w:style w:type="character" w:customStyle="1" w:styleId="Ttulo7Car">
+    <w:name w:val="Título 7 Car"/>
+    <w:basedOn w:val="Fuentedeprrafopredeter"/>
+    <w:link w:val="Ttulo7"/>
     <w:uiPriority w:val="9"/>
     <w:semiHidden/>
     <w:rsid w:val="002B5D65"/>
@@ -8470,10 +7545,10 @@
       <w:color w:val="1F3864" w:themeColor="accent1" w:themeShade="80"/>
     </w:rPr>
   </w:style>
-  <w:style w:type="character" w:customStyle="1" w:styleId="Heading8Char">
-    <w:name w:val="Heading 8 Char"/>
-    <w:basedOn w:val="DefaultParagraphFont"/>
-    <w:link w:val="Heading8"/>
+  <w:style w:type="character" w:customStyle="1" w:styleId="Ttulo8Car">
+    <w:name w:val="Título 8 Car"/>
+    <w:basedOn w:val="Fuentedeprrafopredeter"/>
+    <w:link w:val="Ttulo8"/>
     <w:uiPriority w:val="9"/>
     <w:semiHidden/>
     <w:rsid w:val="002B5D65"/>
@@ -8486,10 +7561,10 @@
       <w:color w:val="1F3864" w:themeColor="accent1" w:themeShade="80"/>
     </w:rPr>
   </w:style>
-  <w:style w:type="character" w:customStyle="1" w:styleId="Heading9Char">
-    <w:name w:val="Heading 9 Char"/>
-    <w:basedOn w:val="DefaultParagraphFont"/>
-    <w:link w:val="Heading9"/>
+  <w:style w:type="character" w:customStyle="1" w:styleId="Ttulo9Car">
+    <w:name w:val="Título 9 Car"/>
+    <w:basedOn w:val="Fuentedeprrafopredeter"/>
+    <w:link w:val="Ttulo9"/>
     <w:uiPriority w:val="9"/>
     <w:semiHidden/>
     <w:rsid w:val="002B5D65"/>
@@ -8500,7 +7575,7 @@
       <w:color w:val="1F3864" w:themeColor="accent1" w:themeShade="80"/>
     </w:rPr>
   </w:style>
-  <w:style w:type="paragraph" w:styleId="Caption">
+  <w:style w:type="paragraph" w:styleId="Descripcin">
     <w:name w:val="caption"/>
     <w:basedOn w:val="Normal"/>
     <w:next w:val="Normal"/>
@@ -8518,11 +7593,11 @@
       <w:color w:val="44546A" w:themeColor="text2"/>
     </w:rPr>
   </w:style>
-  <w:style w:type="paragraph" w:styleId="Subtitle">
+  <w:style w:type="paragraph" w:styleId="Subttulo">
     <w:name w:val="Subtitle"/>
     <w:basedOn w:val="Normal"/>
     <w:next w:val="Normal"/>
-    <w:link w:val="SubtitleChar"/>
+    <w:link w:val="SubttuloCar"/>
     <w:uiPriority w:val="11"/>
     <w:qFormat/>
     <w:rsid w:val="002B5D65"/>
@@ -8539,10 +7614,10 @@
       <w:szCs w:val="28"/>
     </w:rPr>
   </w:style>
-  <w:style w:type="character" w:customStyle="1" w:styleId="SubtitleChar">
-    <w:name w:val="Subtitle Char"/>
-    <w:basedOn w:val="DefaultParagraphFont"/>
-    <w:link w:val="Subtitle"/>
+  <w:style w:type="character" w:customStyle="1" w:styleId="SubttuloCar">
+    <w:name w:val="Subtítulo Car"/>
+    <w:basedOn w:val="Fuentedeprrafopredeter"/>
+    <w:link w:val="Subttulo"/>
     <w:uiPriority w:val="11"/>
     <w:rsid w:val="002B5D65"/>
     <w:rPr>
@@ -8552,9 +7627,9 @@
       <w:szCs w:val="28"/>
     </w:rPr>
   </w:style>
-  <w:style w:type="character" w:styleId="Strong">
+  <w:style w:type="character" w:styleId="Fuerte">
     <w:name w:val="Strong"/>
-    <w:basedOn w:val="DefaultParagraphFont"/>
+    <w:basedOn w:val="Fuentedeprrafopredeter"/>
     <w:uiPriority w:val="22"/>
     <w:qFormat/>
     <w:rsid w:val="002B5D65"/>
@@ -8563,9 +7638,9 @@
       <w:bCs/>
     </w:rPr>
   </w:style>
-  <w:style w:type="character" w:styleId="Emphasis">
+  <w:style w:type="character" w:styleId="nfasis">
     <w:name w:val="Emphasis"/>
-    <w:basedOn w:val="DefaultParagraphFont"/>
+    <w:basedOn w:val="Fuentedeprrafopredeter"/>
     <w:uiPriority w:val="20"/>
     <w:qFormat/>
     <w:rsid w:val="002B5D65"/>
@@ -8574,7 +7649,7 @@
       <w:iCs/>
     </w:rPr>
   </w:style>
-  <w:style w:type="paragraph" w:styleId="NoSpacing">
+  <w:style w:type="paragraph" w:styleId="Sinespaciado">
     <w:name w:val="No Spacing"/>
     <w:uiPriority w:val="1"/>
     <w:qFormat/>
@@ -8583,11 +7658,11 @@
       <w:spacing w:after="0" w:line="240" w:lineRule="auto"/>
     </w:pPr>
   </w:style>
-  <w:style w:type="paragraph" w:styleId="Quote">
+  <w:style w:type="paragraph" w:styleId="Cita">
     <w:name w:val="Quote"/>
     <w:basedOn w:val="Normal"/>
     <w:next w:val="Normal"/>
-    <w:link w:val="QuoteChar"/>
+    <w:link w:val="CitaCar"/>
     <w:uiPriority w:val="29"/>
     <w:qFormat/>
     <w:rsid w:val="002B5D65"/>
@@ -8601,10 +7676,10 @@
       <w:szCs w:val="24"/>
     </w:rPr>
   </w:style>
-  <w:style w:type="character" w:customStyle="1" w:styleId="QuoteChar">
-    <w:name w:val="Quote Char"/>
-    <w:basedOn w:val="DefaultParagraphFont"/>
-    <w:link w:val="Quote"/>
+  <w:style w:type="character" w:customStyle="1" w:styleId="CitaCar">
+    <w:name w:val="Cita Car"/>
+    <w:basedOn w:val="Fuentedeprrafopredeter"/>
+    <w:link w:val="Cita"/>
     <w:uiPriority w:val="29"/>
     <w:rsid w:val="002B5D65"/>
     <w:rPr>
@@ -8613,11 +7688,11 @@
       <w:szCs w:val="24"/>
     </w:rPr>
   </w:style>
-  <w:style w:type="paragraph" w:styleId="IntenseQuote">
+  <w:style w:type="paragraph" w:styleId="Citadestacada">
     <w:name w:val="Intense Quote"/>
     <w:basedOn w:val="Normal"/>
     <w:next w:val="Normal"/>
-    <w:link w:val="IntenseQuoteChar"/>
+    <w:link w:val="CitadestacadaCar"/>
     <w:uiPriority w:val="30"/>
     <w:qFormat/>
     <w:rsid w:val="002B5D65"/>
@@ -8634,10 +7709,10 @@
       <w:szCs w:val="32"/>
     </w:rPr>
   </w:style>
-  <w:style w:type="character" w:customStyle="1" w:styleId="IntenseQuoteChar">
-    <w:name w:val="Intense Quote Char"/>
-    <w:basedOn w:val="DefaultParagraphFont"/>
-    <w:link w:val="IntenseQuote"/>
+  <w:style w:type="character" w:customStyle="1" w:styleId="CitadestacadaCar">
+    <w:name w:val="Cita destacada Car"/>
+    <w:basedOn w:val="Fuentedeprrafopredeter"/>
+    <w:link w:val="Citadestacada"/>
     <w:uiPriority w:val="30"/>
     <w:rsid w:val="002B5D65"/>
     <w:rPr>
@@ -8648,9 +7723,9 @@
       <w:szCs w:val="32"/>
     </w:rPr>
   </w:style>
-  <w:style w:type="character" w:styleId="SubtleEmphasis">
+  <w:style w:type="character" w:styleId="nfasissutil">
     <w:name w:val="Subtle Emphasis"/>
-    <w:basedOn w:val="DefaultParagraphFont"/>
+    <w:basedOn w:val="Fuentedeprrafopredeter"/>
     <w:uiPriority w:val="19"/>
     <w:qFormat/>
     <w:rsid w:val="002B5D65"/>
@@ -8660,9 +7735,9 @@
       <w:color w:val="595959" w:themeColor="text1" w:themeTint="A6"/>
     </w:rPr>
   </w:style>
-  <w:style w:type="character" w:styleId="IntenseEmphasis">
+  <w:style w:type="character" w:styleId="nfasisintenso">
     <w:name w:val="Intense Emphasis"/>
-    <w:basedOn w:val="DefaultParagraphFont"/>
+    <w:basedOn w:val="Fuentedeprrafopredeter"/>
     <w:uiPriority w:val="21"/>
     <w:qFormat/>
     <w:rsid w:val="002B5D65"/>
@@ -8673,9 +7748,9 @@
       <w:iCs/>
     </w:rPr>
   </w:style>
-  <w:style w:type="character" w:styleId="SubtleReference">
+  <w:style w:type="character" w:styleId="Referenciasutil">
     <w:name w:val="Subtle Reference"/>
-    <w:basedOn w:val="DefaultParagraphFont"/>
+    <w:basedOn w:val="Fuentedeprrafopredeter"/>
     <w:uiPriority w:val="31"/>
     <w:qFormat/>
     <w:rsid w:val="002B5D65"/>
@@ -8686,9 +7761,9 @@
       <w:bdr w:val="none" w:sz="0" w:space="0" w:color="auto"/>
     </w:rPr>
   </w:style>
-  <w:style w:type="character" w:styleId="IntenseReference">
+  <w:style w:type="character" w:styleId="Referenciaintensa">
     <w:name w:val="Intense Reference"/>
-    <w:basedOn w:val="DefaultParagraphFont"/>
+    <w:basedOn w:val="Fuentedeprrafopredeter"/>
     <w:uiPriority w:val="32"/>
     <w:qFormat/>
     <w:rsid w:val="002B5D65"/>
@@ -8700,9 +7775,9 @@
       <w:u w:val="single"/>
     </w:rPr>
   </w:style>
-  <w:style w:type="character" w:styleId="BookTitle">
+  <w:style w:type="character" w:styleId="Ttulodellibro">
     <w:name w:val="Book Title"/>
-    <w:basedOn w:val="DefaultParagraphFont"/>
+    <w:basedOn w:val="Fuentedeprrafopredeter"/>
     <w:uiPriority w:val="33"/>
     <w:qFormat/>
     <w:rsid w:val="002B5D65"/>
@@ -8713,9 +7788,9 @@
       <w:spacing w:val="10"/>
     </w:rPr>
   </w:style>
-  <w:style w:type="paragraph" w:styleId="TOCHeading">
+  <w:style w:type="paragraph" w:styleId="TtuloTDC">
     <w:name w:val="TOC Heading"/>
-    <w:basedOn w:val="Heading1"/>
+    <w:basedOn w:val="Ttulo1"/>
     <w:next w:val="Normal"/>
     <w:uiPriority w:val="39"/>
     <w:semiHidden/>
@@ -8726,10 +7801,10 @@
       <w:outlineLvl w:val="9"/>
     </w:pPr>
   </w:style>
-  <w:style w:type="paragraph" w:styleId="BalloonText">
+  <w:style w:type="paragraph" w:styleId="Textodeglobo">
     <w:name w:val="Balloon Text"/>
     <w:basedOn w:val="Normal"/>
-    <w:link w:val="BalloonTextChar"/>
+    <w:link w:val="TextodegloboCar"/>
     <w:uiPriority w:val="99"/>
     <w:semiHidden/>
     <w:unhideWhenUsed/>
@@ -8743,10 +7818,10 @@
       <w:szCs w:val="18"/>
     </w:rPr>
   </w:style>
-  <w:style w:type="character" w:customStyle="1" w:styleId="BalloonTextChar">
-    <w:name w:val="Balloon Text Char"/>
-    <w:basedOn w:val="DefaultParagraphFont"/>
-    <w:link w:val="BalloonText"/>
+  <w:style w:type="character" w:customStyle="1" w:styleId="TextodegloboCar">
+    <w:name w:val="Texto de globo Car"/>
+    <w:basedOn w:val="Fuentedeprrafopredeter"/>
+    <w:link w:val="Textodeglobo"/>
     <w:uiPriority w:val="99"/>
     <w:semiHidden/>
     <w:rsid w:val="00C52DE4"/>
@@ -8756,9 +7831,9 @@
       <w:szCs w:val="18"/>
     </w:rPr>
   </w:style>
-  <w:style w:type="table" w:styleId="TableGrid">
+  <w:style w:type="table" w:styleId="Tablaconcuadrcula">
     <w:name w:val="Table Grid"/>
-    <w:basedOn w:val="TableNormal"/>
+    <w:basedOn w:val="Tablanormal"/>
     <w:uiPriority w:val="59"/>
     <w:rsid w:val="00787D14"/>
     <w:pPr>
@@ -8775,9 +7850,9 @@
       </w:tblBorders>
     </w:tblPr>
   </w:style>
-  <w:style w:type="table" w:styleId="ListTable6Colorful">
+  <w:style w:type="table" w:styleId="Tabladelista6concolores">
     <w:name w:val="List Table 6 Colorful"/>
-    <w:basedOn w:val="TableNormal"/>
+    <w:basedOn w:val="Tablanormal"/>
     <w:uiPriority w:val="51"/>
     <w:rsid w:val="00BB305F"/>
     <w:pPr>
@@ -8843,9 +7918,9 @@
       </w:tcPr>
     </w:tblStylePr>
   </w:style>
-  <w:style w:type="table" w:styleId="ListTable6Colorful-Accent3">
+  <w:style w:type="table" w:styleId="Tabladelista6concolores-nfasis3">
     <w:name w:val="List Table 6 Colorful Accent 3"/>
-    <w:basedOn w:val="TableNormal"/>
+    <w:basedOn w:val="Tablanormal"/>
     <w:uiPriority w:val="51"/>
     <w:rsid w:val="00BB305F"/>
     <w:pPr>
@@ -8911,9 +7986,9 @@
       </w:tcPr>
     </w:tblStylePr>
   </w:style>
-  <w:style w:type="character" w:styleId="Hyperlink">
+  <w:style w:type="character" w:styleId="Hipervnculo">
     <w:name w:val="Hyperlink"/>
-    <w:basedOn w:val="DefaultParagraphFont"/>
+    <w:basedOn w:val="Fuentedeprrafopredeter"/>
     <w:uiPriority w:val="99"/>
     <w:unhideWhenUsed/>
     <w:rsid w:val="009B0A35"/>
@@ -8924,7 +7999,7 @@
   </w:style>
   <w:style w:type="character" w:customStyle="1" w:styleId="UnresolvedMention1">
     <w:name w:val="Unresolved Mention1"/>
-    <w:basedOn w:val="DefaultParagraphFont"/>
+    <w:basedOn w:val="Fuentedeprrafopredeter"/>
     <w:uiPriority w:val="99"/>
     <w:semiHidden/>
     <w:unhideWhenUsed/>
@@ -8934,9 +8009,9 @@
       <w:shd w:val="clear" w:color="auto" w:fill="E1DFDD"/>
     </w:rPr>
   </w:style>
-  <w:style w:type="character" w:styleId="FollowedHyperlink">
+  <w:style w:type="character" w:styleId="Hipervnculovisitado">
     <w:name w:val="FollowedHyperlink"/>
-    <w:basedOn w:val="DefaultParagraphFont"/>
+    <w:basedOn w:val="Fuentedeprrafopredeter"/>
     <w:uiPriority w:val="99"/>
     <w:semiHidden/>
     <w:unhideWhenUsed/>
@@ -8946,10 +8021,10 @@
       <w:u w:val="single"/>
     </w:rPr>
   </w:style>
-  <w:style w:type="paragraph" w:styleId="Header">
+  <w:style w:type="paragraph" w:styleId="Encabezado">
     <w:name w:val="header"/>
     <w:basedOn w:val="Normal"/>
-    <w:link w:val="HeaderChar"/>
+    <w:link w:val="EncabezadoCar"/>
     <w:uiPriority w:val="99"/>
     <w:unhideWhenUsed/>
     <w:rsid w:val="00480688"/>
@@ -8961,17 +8036,17 @@
       <w:spacing w:after="0" w:line="240" w:lineRule="auto"/>
     </w:pPr>
   </w:style>
-  <w:style w:type="character" w:customStyle="1" w:styleId="HeaderChar">
-    <w:name w:val="Header Char"/>
-    <w:basedOn w:val="DefaultParagraphFont"/>
-    <w:link w:val="Header"/>
+  <w:style w:type="character" w:customStyle="1" w:styleId="EncabezadoCar">
+    <w:name w:val="Encabezado Car"/>
+    <w:basedOn w:val="Fuentedeprrafopredeter"/>
+    <w:link w:val="Encabezado"/>
     <w:uiPriority w:val="99"/>
     <w:rsid w:val="00480688"/>
   </w:style>
-  <w:style w:type="paragraph" w:styleId="Footer">
+  <w:style w:type="paragraph" w:styleId="Piedepgina">
     <w:name w:val="footer"/>
     <w:basedOn w:val="Normal"/>
-    <w:link w:val="FooterChar"/>
+    <w:link w:val="PiedepginaCar"/>
     <w:uiPriority w:val="99"/>
     <w:unhideWhenUsed/>
     <w:rsid w:val="00480688"/>
@@ -8983,10 +8058,10 @@
       <w:spacing w:after="0" w:line="240" w:lineRule="auto"/>
     </w:pPr>
   </w:style>
-  <w:style w:type="character" w:customStyle="1" w:styleId="FooterChar">
-    <w:name w:val="Footer Char"/>
-    <w:basedOn w:val="DefaultParagraphFont"/>
-    <w:link w:val="Footer"/>
+  <w:style w:type="character" w:customStyle="1" w:styleId="PiedepginaCar">
+    <w:name w:val="Pie de página Car"/>
+    <w:basedOn w:val="Fuentedeprrafopredeter"/>
+    <w:link w:val="Piedepgina"/>
     <w:uiPriority w:val="99"/>
     <w:rsid w:val="00480688"/>
   </w:style>
@@ -9014,10 +8089,10 @@
       <w:lang w:val="es-ES" w:eastAsia="es-CO"/>
     </w:rPr>
   </w:style>
-  <w:style w:type="character" w:customStyle="1" w:styleId="TitleChar">
-    <w:name w:val="Title Char"/>
-    <w:basedOn w:val="DefaultParagraphFont"/>
-    <w:link w:val="Title"/>
+  <w:style w:type="character" w:customStyle="1" w:styleId="TtuloCar">
+    <w:name w:val="Título Car"/>
+    <w:basedOn w:val="Fuentedeprrafopredeter"/>
+    <w:link w:val="Ttulo"/>
     <w:uiPriority w:val="10"/>
     <w:rsid w:val="002B5D65"/>
     <w:rPr>
@@ -9052,10 +8127,10 @@
       <w:lang w:val="es-ES" w:eastAsia="es-CO"/>
     </w:rPr>
   </w:style>
-  <w:style w:type="character" w:customStyle="1" w:styleId="Heading1Char">
-    <w:name w:val="Heading 1 Char"/>
-    <w:basedOn w:val="DefaultParagraphFont"/>
-    <w:link w:val="Heading1"/>
+  <w:style w:type="character" w:customStyle="1" w:styleId="Ttulo1Car">
+    <w:name w:val="Título 1 Car"/>
+    <w:basedOn w:val="Fuentedeprrafopredeter"/>
+    <w:link w:val="Ttulo1"/>
     <w:uiPriority w:val="9"/>
     <w:rsid w:val="002B5D65"/>
     <w:rPr>
@@ -9081,7 +8156,7 @@
   </w:style>
   <w:style w:type="character" w:customStyle="1" w:styleId="UnresolvedMention2">
     <w:name w:val="Unresolved Mention2"/>
-    <w:basedOn w:val="DefaultParagraphFont"/>
+    <w:basedOn w:val="Fuentedeprrafopredeter"/>
     <w:uiPriority w:val="99"/>
     <w:semiHidden/>
     <w:unhideWhenUsed/>
@@ -9091,9 +8166,9 @@
       <w:shd w:val="clear" w:color="auto" w:fill="E1DFDD"/>
     </w:rPr>
   </w:style>
-  <w:style w:type="character" w:styleId="CommentReference">
+  <w:style w:type="character" w:styleId="Refdecomentario">
     <w:name w:val="annotation reference"/>
-    <w:basedOn w:val="DefaultParagraphFont"/>
+    <w:basedOn w:val="Fuentedeprrafopredeter"/>
     <w:uiPriority w:val="99"/>
     <w:semiHidden/>
     <w:unhideWhenUsed/>
@@ -9103,10 +8178,10 @@
       <w:szCs w:val="16"/>
     </w:rPr>
   </w:style>
-  <w:style w:type="paragraph" w:styleId="CommentText">
+  <w:style w:type="paragraph" w:styleId="Textocomentario">
     <w:name w:val="annotation text"/>
     <w:basedOn w:val="Normal"/>
-    <w:link w:val="CommentTextChar"/>
+    <w:link w:val="TextocomentarioCar"/>
     <w:uiPriority w:val="99"/>
     <w:semiHidden/>
     <w:unhideWhenUsed/>
@@ -9119,10 +8194,10 @@
       <w:szCs w:val="20"/>
     </w:rPr>
   </w:style>
-  <w:style w:type="character" w:customStyle="1" w:styleId="CommentTextChar">
-    <w:name w:val="Comment Text Char"/>
-    <w:basedOn w:val="DefaultParagraphFont"/>
-    <w:link w:val="CommentText"/>
+  <w:style w:type="character" w:customStyle="1" w:styleId="TextocomentarioCar">
+    <w:name w:val="Texto comentario Car"/>
+    <w:basedOn w:val="Fuentedeprrafopredeter"/>
+    <w:link w:val="Textocomentario"/>
     <w:uiPriority w:val="99"/>
     <w:semiHidden/>
     <w:rsid w:val="00FC7D79"/>
@@ -9131,11 +8206,11 @@
       <w:szCs w:val="20"/>
     </w:rPr>
   </w:style>
-  <w:style w:type="paragraph" w:styleId="CommentSubject">
+  <w:style w:type="paragraph" w:styleId="Asuntodelcomentario">
     <w:name w:val="annotation subject"/>
-    <w:basedOn w:val="CommentText"/>
-    <w:next w:val="CommentText"/>
-    <w:link w:val="CommentSubjectChar"/>
+    <w:basedOn w:val="Textocomentario"/>
+    <w:next w:val="Textocomentario"/>
+    <w:link w:val="AsuntodelcomentarioCar"/>
     <w:uiPriority w:val="99"/>
     <w:semiHidden/>
     <w:unhideWhenUsed/>
@@ -9145,10 +8220,10 @@
       <w:bCs/>
     </w:rPr>
   </w:style>
-  <w:style w:type="character" w:customStyle="1" w:styleId="CommentSubjectChar">
-    <w:name w:val="Comment Subject Char"/>
-    <w:basedOn w:val="CommentTextChar"/>
-    <w:link w:val="CommentSubject"/>
+  <w:style w:type="character" w:customStyle="1" w:styleId="AsuntodelcomentarioCar">
+    <w:name w:val="Asunto del comentario Car"/>
+    <w:basedOn w:val="TextocomentarioCar"/>
+    <w:link w:val="Asuntodelcomentario"/>
     <w:uiPriority w:val="99"/>
     <w:semiHidden/>
     <w:rsid w:val="00FC7D79"/>
@@ -9159,7 +8234,7 @@
       <w:szCs w:val="20"/>
     </w:rPr>
   </w:style>
-  <w:style w:type="paragraph" w:styleId="Revision">
+  <w:style w:type="paragraph" w:styleId="Revisin">
     <w:name w:val="Revision"/>
     <w:hidden/>
     <w:uiPriority w:val="99"/>
@@ -9169,9 +8244,9 @@
       <w:spacing w:after="0" w:line="240" w:lineRule="auto"/>
     </w:pPr>
   </w:style>
-  <w:style w:type="table" w:styleId="GridTable2">
+  <w:style w:type="table" w:styleId="Tabladecuadrcula2">
     <w:name w:val="Grid Table 2"/>
-    <w:basedOn w:val="TableNormal"/>
+    <w:basedOn w:val="Tablanormal"/>
     <w:uiPriority w:val="47"/>
     <w:rsid w:val="008B1D2B"/>
     <w:pPr>
@@ -9244,9 +8319,9 @@
       </w:tcPr>
     </w:tblStylePr>
   </w:style>
-  <w:style w:type="table" w:styleId="PlainTable3">
+  <w:style w:type="table" w:styleId="Tablanormal3">
     <w:name w:val="Plain Table 3"/>
-    <w:basedOn w:val="TableNormal"/>
+    <w:basedOn w:val="Tablanormal"/>
     <w:uiPriority w:val="43"/>
     <w:rsid w:val="004078BE"/>
     <w:pPr>
@@ -9337,9 +8412,9 @@
       </w:tcPr>
     </w:tblStylePr>
   </w:style>
-  <w:style w:type="table" w:styleId="GridTable2-Accent3">
+  <w:style w:type="table" w:styleId="Tablaconcuadrcula2-nfasis3">
     <w:name w:val="Grid Table 2 Accent 3"/>
-    <w:basedOn w:val="TableNormal"/>
+    <w:basedOn w:val="Tablanormal"/>
     <w:uiPriority w:val="47"/>
     <w:rsid w:val="004078BE"/>
     <w:pPr>
@@ -9412,9 +8487,9 @@
       </w:tcPr>
     </w:tblStylePr>
   </w:style>
-  <w:style w:type="character" w:styleId="UnresolvedMention">
+  <w:style w:type="character" w:styleId="Mencinsinresolver">
     <w:name w:val="Unresolved Mention"/>
-    <w:basedOn w:val="DefaultParagraphFont"/>
+    <w:basedOn w:val="Fuentedeprrafopredeter"/>
     <w:uiPriority w:val="99"/>
     <w:semiHidden/>
     <w:unhideWhenUsed/>
@@ -9440,12 +8515,12 @@
   </w:style>
   <w:style w:type="character" w:customStyle="1" w:styleId="selectable-text1">
     <w:name w:val="selectable-text1"/>
-    <w:basedOn w:val="DefaultParagraphFont"/>
+    <w:basedOn w:val="Fuentedeprrafopredeter"/>
     <w:rsid w:val="00A63B69"/>
   </w:style>
-  <w:style w:type="character" w:styleId="HTMLCode">
+  <w:style w:type="character" w:styleId="CdigoHTML">
     <w:name w:val="HTML Code"/>
-    <w:basedOn w:val="DefaultParagraphFont"/>
+    <w:basedOn w:val="Fuentedeprrafopredeter"/>
     <w:uiPriority w:val="99"/>
     <w:semiHidden/>
     <w:unhideWhenUsed/>
@@ -9755,10 +8830,6 @@
 </file>
 
 <file path=customXml/item1.xml><?xml version="1.0" encoding="utf-8"?>
-<b:Sources xmlns:b="http://schemas.openxmlformats.org/officeDocument/2006/bibliography" xmlns="http://schemas.openxmlformats.org/officeDocument/2006/bibliography" SelectedStyle="\APASixthEditionOfficeOnline.xsl" StyleName="APA" Version="6"/>
-</file>
-
-<file path=customXml/item2.xml><?xml version="1.0" encoding="utf-8"?>
 <ct:contentTypeSchema xmlns:ct="http://schemas.microsoft.com/office/2006/metadata/contentType" xmlns:ma="http://schemas.microsoft.com/office/2006/metadata/properties/metaAttributes" ct:_="" ma:_="" ma:contentTypeName="Documento" ma:contentTypeID="0x01010023858CF01A2EF24688B692775F4C60A4" ma:contentTypeVersion="15" ma:contentTypeDescription="Crear nuevo documento." ma:contentTypeScope="" ma:versionID="a4df9e4b793c0fa050084ef4feafa589">
   <xsd:schema xmlns:xsd="http://www.w3.org/2001/XMLSchema" xmlns:xs="http://www.w3.org/2001/XMLSchema" xmlns:p="http://schemas.microsoft.com/office/2006/metadata/properties" xmlns:ns2="164883f8-7691-4ecf-b54a-664c0d0edefe" xmlns:ns3="85e30bcc-d76c-4413-8e4d-2dce22fb0743" targetNamespace="http://schemas.microsoft.com/office/2006/metadata/properties" ma:root="true" ma:fieldsID="067b7080d2289f9ba15465beea7d18a8" ns2:_="" ns3:_="">
     <xsd:import namespace="164883f8-7691-4ecf-b54a-664c0d0edefe"/>
@@ -9995,7 +9066,20 @@
 </ct:contentTypeSchema>
 </file>
 
+<file path=customXml/item2.xml><?xml version="1.0" encoding="utf-8"?>
+<b:Sources xmlns:b="http://schemas.openxmlformats.org/officeDocument/2006/bibliography" xmlns="http://schemas.openxmlformats.org/officeDocument/2006/bibliography" SelectedStyle="\APASixthEditionOfficeOnline.xsl" StyleName="APA" Version="6"/>
+</file>
+
 <file path=customXml/item3.xml><?xml version="1.0" encoding="utf-8"?>
+<?mso-contentType ?>
+<FormTemplates xmlns="http://schemas.microsoft.com/sharepoint/v3/contenttype/forms">
+  <Display>DocumentLibraryForm</Display>
+  <Edit>DocumentLibraryForm</Edit>
+  <New>DocumentLibraryForm</New>
+</FormTemplates>
+</file>
+
+<file path=customXml/item4.xml><?xml version="1.0" encoding="utf-8"?>
 <p:properties xmlns:p="http://schemas.microsoft.com/office/2006/metadata/properties" xmlns:xsi="http://www.w3.org/2001/XMLSchema-instance" xmlns:pc="http://schemas.microsoft.com/office/infopath/2007/PartnerControls">
   <documentManagement>
     <SharedWithUsers xmlns="85e30bcc-d76c-4413-8e4d-2dce22fb0743">
@@ -10043,24 +9127,7 @@
 </p:properties>
 </file>
 
-<file path=customXml/item4.xml><?xml version="1.0" encoding="utf-8"?>
-<?mso-contentType ?>
-<FormTemplates xmlns="http://schemas.microsoft.com/sharepoint/v3/contenttype/forms">
-  <Display>DocumentLibraryForm</Display>
-  <Edit>DocumentLibraryForm</Edit>
-  <New>DocumentLibraryForm</New>
-</FormTemplates>
-</file>
-
 <file path=customXml/itemProps1.xml><?xml version="1.0" encoding="utf-8"?>
-<ds:datastoreItem xmlns:ds="http://schemas.openxmlformats.org/officeDocument/2006/customXml" ds:itemID="{794BE61C-5254-4531-868C-EC2590174185}">
-  <ds:schemaRefs>
-    <ds:schemaRef ds:uri="http://schemas.openxmlformats.org/officeDocument/2006/bibliography"/>
-  </ds:schemaRefs>
-</ds:datastoreItem>
-</file>
-
-<file path=customXml/itemProps2.xml><?xml version="1.0" encoding="utf-8"?>
 <ds:datastoreItem xmlns:ds="http://schemas.openxmlformats.org/officeDocument/2006/customXml" ds:itemID="{62F3E371-4CEE-4871-A936-27DA1639FADD}">
   <ds:schemaRefs>
     <ds:schemaRef ds:uri="http://schemas.microsoft.com/office/2006/metadata/contentType"/>
@@ -10079,7 +9146,23 @@
 </ds:datastoreItem>
 </file>
 
+<file path=customXml/itemProps2.xml><?xml version="1.0" encoding="utf-8"?>
+<ds:datastoreItem xmlns:ds="http://schemas.openxmlformats.org/officeDocument/2006/customXml" ds:itemID="{794BE61C-5254-4531-868C-EC2590174185}">
+  <ds:schemaRefs>
+    <ds:schemaRef ds:uri="http://schemas.openxmlformats.org/officeDocument/2006/bibliography"/>
+  </ds:schemaRefs>
+</ds:datastoreItem>
+</file>
+
 <file path=customXml/itemProps3.xml><?xml version="1.0" encoding="utf-8"?>
+<ds:datastoreItem xmlns:ds="http://schemas.openxmlformats.org/officeDocument/2006/customXml" ds:itemID="{58AFF83A-2C1F-4B0C-9BCE-EE49F5226348}">
+  <ds:schemaRefs>
+    <ds:schemaRef ds:uri="http://schemas.microsoft.com/sharepoint/v3/contenttype/forms"/>
+  </ds:schemaRefs>
+</ds:datastoreItem>
+</file>
+
+<file path=customXml/itemProps4.xml><?xml version="1.0" encoding="utf-8"?>
 <ds:datastoreItem xmlns:ds="http://schemas.openxmlformats.org/officeDocument/2006/customXml" ds:itemID="{D3B4676A-CA48-4E6B-BABE-1535A7A288F6}">
   <ds:schemaRefs>
     <ds:schemaRef ds:uri="http://schemas.microsoft.com/office/2006/metadata/properties"/>
@@ -10088,12 +9171,4 @@
     <ds:schemaRef ds:uri="164883f8-7691-4ecf-b54a-664c0d0edefe"/>
   </ds:schemaRefs>
 </ds:datastoreItem>
-</file>
-
-<file path=customXml/itemProps4.xml><?xml version="1.0" encoding="utf-8"?>
-<ds:datastoreItem xmlns:ds="http://schemas.openxmlformats.org/officeDocument/2006/customXml" ds:itemID="{58AFF83A-2C1F-4B0C-9BCE-EE49F5226348}">
-  <ds:schemaRefs>
-    <ds:schemaRef ds:uri="http://schemas.microsoft.com/sharepoint/v3/contenttype/forms"/>
-  </ds:schemaRefs>
-</ds:datastoreItem>
 </file>
</xml_diff>

<commit_message>
excel y word semicompletos
</commit_message>
<xml_diff>
--- a/Docs/ISIS1225 - AnalisisReto-TEMPLATE RETO.docx
+++ b/Docs/ISIS1225 - AnalisisReto-TEMPLATE RETO.docx
@@ -1,6 +1,6 @@
 
 <file path=word/document.xml><?xml version="1.0" encoding="utf-8"?>
-<w:document xmlns:wpc="http://schemas.microsoft.com/office/word/2010/wordprocessingCanvas" xmlns:cx="http://schemas.microsoft.com/office/drawing/2014/chartex" xmlns:cx1="http://schemas.microsoft.com/office/drawing/2015/9/8/chartex" xmlns:cx2="http://schemas.microsoft.com/office/drawing/2015/10/21/chartex" xmlns:cx3="http://schemas.microsoft.com/office/drawing/2016/5/9/chartex" xmlns:cx4="http://schemas.microsoft.com/office/drawing/2016/5/10/chartex" xmlns:cx5="http://schemas.microsoft.com/office/drawing/2016/5/11/chartex" xmlns:cx6="http://schemas.microsoft.com/office/drawing/2016/5/12/chartex" xmlns:cx7="http://schemas.microsoft.com/office/drawing/2016/5/13/chartex" xmlns:cx8="http://schemas.microsoft.com/office/drawing/2016/5/14/chartex" xmlns:mc="http://schemas.openxmlformats.org/markup-compatibility/2006" xmlns:aink="http://schemas.microsoft.com/office/drawing/2016/ink" xmlns:am3d="http://schemas.microsoft.com/office/drawing/2017/model3d" xmlns:o="urn:schemas-microsoft-com:office:office" xmlns:oel="http://schemas.microsoft.com/office/2019/extlst" xmlns:r="http://schemas.openxmlformats.org/officeDocument/2006/relationships" xmlns:m="http://schemas.openxmlformats.org/officeDocument/2006/math" xmlns:v="urn:schemas-microsoft-com:vml" xmlns:wp14="http://schemas.microsoft.com/office/word/2010/wordprocessingDrawing" xmlns:wp="http://schemas.openxmlformats.org/drawingml/2006/wordprocessingDrawing" xmlns:w10="urn:schemas-microsoft-com:office:word" xmlns:w="http://schemas.openxmlformats.org/wordprocessingml/2006/main" xmlns:w14="http://schemas.microsoft.com/office/word/2010/wordml" xmlns:w15="http://schemas.microsoft.com/office/word/2012/wordml" xmlns:w16cex="http://schemas.microsoft.com/office/word/2018/wordml/cex" xmlns:w16cid="http://schemas.microsoft.com/office/word/2016/wordml/cid" xmlns:w16="http://schemas.microsoft.com/office/word/2018/wordml" xmlns:w16du="http://schemas.microsoft.com/office/word/2023/wordml/word16du" xmlns:w16sdtdh="http://schemas.microsoft.com/office/word/2020/wordml/sdtdatahash" xmlns:w16sdtfl="http://schemas.microsoft.com/office/word/2024/wordml/sdtformatlock" xmlns:w16se="http://schemas.microsoft.com/office/word/2015/wordml/symex" xmlns:wpg="http://schemas.microsoft.com/office/word/2010/wordprocessingGroup" xmlns:wpi="http://schemas.microsoft.com/office/word/2010/wordprocessingInk" xmlns:wne="http://schemas.microsoft.com/office/word/2006/wordml" xmlns:wps="http://schemas.microsoft.com/office/word/2010/wordprocessingShape" mc:Ignorable="w14 w15 w16se w16cid w16 w16cex w16sdtdh w16sdtfl w16du wp14">
+<w:document xmlns:wpc="http://schemas.microsoft.com/office/word/2010/wordprocessingCanvas" xmlns:cx="http://schemas.microsoft.com/office/drawing/2014/chartex" xmlns:cx1="http://schemas.microsoft.com/office/drawing/2015/9/8/chartex" xmlns:cx2="http://schemas.microsoft.com/office/drawing/2015/10/21/chartex" xmlns:cx3="http://schemas.microsoft.com/office/drawing/2016/5/9/chartex" xmlns:cx4="http://schemas.microsoft.com/office/drawing/2016/5/10/chartex" xmlns:cx5="http://schemas.microsoft.com/office/drawing/2016/5/11/chartex" xmlns:cx6="http://schemas.microsoft.com/office/drawing/2016/5/12/chartex" xmlns:cx7="http://schemas.microsoft.com/office/drawing/2016/5/13/chartex" xmlns:cx8="http://schemas.microsoft.com/office/drawing/2016/5/14/chartex" xmlns:mc="http://schemas.openxmlformats.org/markup-compatibility/2006" xmlns:aink="http://schemas.microsoft.com/office/drawing/2016/ink" xmlns:am3d="http://schemas.microsoft.com/office/drawing/2017/model3d" xmlns:o="urn:schemas-microsoft-com:office:office" xmlns:r="http://schemas.openxmlformats.org/officeDocument/2006/relationships" xmlns:m="http://schemas.openxmlformats.org/officeDocument/2006/math" xmlns:v="urn:schemas-microsoft-com:vml" xmlns:wp14="http://schemas.microsoft.com/office/word/2010/wordprocessingDrawing" xmlns:wp="http://schemas.openxmlformats.org/drawingml/2006/wordprocessingDrawing" xmlns:w10="urn:schemas-microsoft-com:office:word" xmlns:w="http://schemas.openxmlformats.org/wordprocessingml/2006/main" xmlns:w14="http://schemas.microsoft.com/office/word/2010/wordml" xmlns:w15="http://schemas.microsoft.com/office/word/2012/wordml" xmlns:w16cex="http://schemas.microsoft.com/office/word/2018/wordml/cex" xmlns:w16cid="http://schemas.microsoft.com/office/word/2016/wordml/cid" xmlns:w16="http://schemas.microsoft.com/office/word/2018/wordml" xmlns:w16sdtdh="http://schemas.microsoft.com/office/word/2020/wordml/sdtdatahash" xmlns:w16se="http://schemas.microsoft.com/office/word/2015/wordml/symex" xmlns:wpg="http://schemas.microsoft.com/office/word/2010/wordprocessingGroup" xmlns:wpi="http://schemas.microsoft.com/office/word/2010/wordprocessingInk" xmlns:wne="http://schemas.microsoft.com/office/word/2006/wordml" xmlns:wps="http://schemas.microsoft.com/office/word/2010/wordprocessingShape" mc:Ignorable="w14 w15 w16se w16cid w16 w16cex w16sdtdh wp14">
   <w:body>
     <w:p>
       <w:pPr>
@@ -1031,13 +1031,7 @@
     </w:p>
     <w:p>
       <w:r>
-        <w:t xml:space="preserve">Análisis de resultados de la implementación, tener cuenta las pruebas realizadas y el </w:t>
-      </w:r>
-      <w:r>
-        <w:t>análisis</w:t>
-      </w:r>
-      <w:r>
-        <w:t xml:space="preserve"> de complejidad.</w:t>
+        <w:t>Se ejecutó entregando los resultados que coincidían con el filtro, la complejidad de m + n log n resultó ser buena, demostrando un corto tiempo de ejecución y al cambiar los parámetros los datos seguían funcionando</w:t>
       </w:r>
     </w:p>
     <w:p>
@@ -3146,8 +3140,65 @@
       </w:r>
     </w:p>
     <w:p>
-      <w:r>
-        <w:t>Análisis de resultados de la implementación, tener cuenta las pruebas realizadas y el analisis de complejidad.</w:t>
+      <w:pPr>
+        <w:pStyle w:val="Ttulo1"/>
+        <w:rPr>
+          <w:b/>
+          <w:bCs/>
+        </w:rPr>
+      </w:pPr>
+      <w:r>
+        <w:rPr>
+          <w:noProof/>
+        </w:rPr>
+        <w:drawing>
+          <wp:inline distT="0" distB="0" distL="0" distR="0" wp14:anchorId="5F46CAA0" wp14:editId="6073367D">
+            <wp:extent cx="5943600" cy="3881120"/>
+            <wp:effectExtent l="0" t="0" r="0" b="5080"/>
+            <wp:docPr id="1" name="Gráfico 1">
+              <a:extLst xmlns:a="http://schemas.openxmlformats.org/drawingml/2006/main">
+                <a:ext uri="{FF2B5EF4-FFF2-40B4-BE49-F238E27FC236}">
+                  <a16:creationId xmlns:a16="http://schemas.microsoft.com/office/drawing/2014/main" id="{E62ACB43-BF23-44E0-A2C1-1BE0D48E226C}"/>
+                </a:ext>
+              </a:extLst>
+            </wp:docPr>
+            <wp:cNvGraphicFramePr/>
+            <a:graphic xmlns:a="http://schemas.openxmlformats.org/drawingml/2006/main">
+              <a:graphicData uri="http://schemas.openxmlformats.org/drawingml/2006/chart">
+                <c:chart xmlns:c="http://schemas.openxmlformats.org/drawingml/2006/chart" xmlns:r="http://schemas.openxmlformats.org/officeDocument/2006/relationships" r:id="rId16"/>
+              </a:graphicData>
+            </a:graphic>
+          </wp:inline>
+        </w:drawing>
+      </w:r>
+    </w:p>
+    <w:p>
+      <w:pPr>
+        <w:pStyle w:val="Ttulo1"/>
+        <w:rPr>
+          <w:rFonts w:asciiTheme="minorHAnsi" w:hAnsiTheme="minorHAnsi" w:cstheme="minorHAnsi"/>
+          <w:color w:val="auto"/>
+          <w:sz w:val="22"/>
+          <w:szCs w:val="22"/>
+        </w:rPr>
+      </w:pPr>
+      <w:r>
+        <w:rPr>
+          <w:rFonts w:asciiTheme="minorHAnsi" w:hAnsiTheme="minorHAnsi" w:cstheme="minorHAnsi"/>
+          <w:color w:val="auto"/>
+          <w:sz w:val="22"/>
+          <w:szCs w:val="22"/>
+        </w:rPr>
+        <w:t>Descubrimos que con</w:t>
+      </w:r>
+      <w:r>
+        <w:rPr>
+          <w:rFonts w:asciiTheme="minorHAnsi" w:hAnsiTheme="minorHAnsi" w:cstheme="minorHAnsi"/>
+          <w:color w:val="auto"/>
+          <w:sz w:val="22"/>
+          <w:szCs w:val="22"/>
+        </w:rPr>
+        <w:t xml:space="preserve"> las tablas de hash se redujo considerablemente el tiempo de carga de los datos, demostrando que el método es más eficiente con hashing y más específicamente con linear probing</w:t>
       </w:r>
     </w:p>
     <w:p>
@@ -3293,6 +3344,7 @@
                 <w:b/>
                 <w:bCs/>
               </w:rPr>
+              <w:lastRenderedPageBreak/>
               <w:t>Implementado (Sí/No)</w:t>
             </w:r>
           </w:p>
@@ -3702,11 +3754,7 @@
         <w:t>n</w:t>
       </w:r>
       <w:r>
-        <w:t xml:space="preserve">). En las pruebas con el archivo del 100%, la implementación con Linear Probing fue entre 20 y 30 ms más rápida que la de Separate </w:t>
-      </w:r>
-      <w:r>
-        <w:lastRenderedPageBreak/>
-        <w:t xml:space="preserve">Chaining. Esto </w:t>
+        <w:t xml:space="preserve">). En las pruebas con el archivo del 100%, la implementación con Linear Probing fue entre 20 y 30 ms más rápida que la de Separate Chaining. Esto </w:t>
       </w:r>
       <w:r>
         <w:t xml:space="preserve">es gracias a que </w:t>
@@ -3762,6 +3810,7 @@
         <w:rPr>
           <w:noProof/>
         </w:rPr>
+        <w:lastRenderedPageBreak/>
         <w:drawing>
           <wp:inline distT="0" distB="0" distL="0" distR="0" wp14:anchorId="51B40F16" wp14:editId="1EDC7F8B">
             <wp:extent cx="5943600" cy="6192520"/>
@@ -3778,7 +3827,7 @@
                     <pic:cNvPicPr/>
                   </pic:nvPicPr>
                   <pic:blipFill>
-                    <a:blip r:embed="rId16"/>
+                    <a:blip r:embed="rId17"/>
                     <a:stretch>
                       <a:fillRect/>
                     </a:stretch>
@@ -3801,6 +3850,9 @@
     </w:p>
     <w:p>
       <w:r>
+        <w:rPr>
+          <w:noProof/>
+        </w:rPr>
         <w:lastRenderedPageBreak/>
         <w:drawing>
           <wp:inline distT="0" distB="0" distL="0" distR="0" wp14:anchorId="27CB5FEE" wp14:editId="65C03224">
@@ -3818,7 +3870,7 @@
                     <pic:cNvPicPr/>
                   </pic:nvPicPr>
                   <pic:blipFill>
-                    <a:blip r:embed="rId17"/>
+                    <a:blip r:embed="rId18"/>
                     <a:stretch>
                       <a:fillRect/>
                     </a:stretch>
@@ -3878,7 +3930,7 @@
                     <pic:cNvPicPr/>
                   </pic:nvPicPr>
                   <pic:blipFill>
-                    <a:blip r:embed="rId18"/>
+                    <a:blip r:embed="rId19"/>
                     <a:stretch>
                       <a:fillRect/>
                     </a:stretch>
@@ -3922,7 +3974,7 @@
                     <pic:cNvPicPr/>
                   </pic:nvPicPr>
                   <pic:blipFill>
-                    <a:blip r:embed="rId19"/>
+                    <a:blip r:embed="rId20"/>
                     <a:stretch>
                       <a:fillRect/>
                     </a:stretch>
@@ -3964,7 +4016,7 @@
                     <pic:cNvPicPr/>
                   </pic:nvPicPr>
                   <pic:blipFill>
-                    <a:blip r:embed="rId20"/>
+                    <a:blip r:embed="rId21"/>
                     <a:stretch>
                       <a:fillRect/>
                     </a:stretch>
@@ -4461,10 +4513,10 @@
       </w:r>
     </w:p>
     <w:sectPr>
-      <w:headerReference w:type="default" r:id="rId21"/>
-      <w:footerReference w:type="default" r:id="rId22"/>
-      <w:headerReference w:type="first" r:id="rId23"/>
-      <w:footerReference w:type="first" r:id="rId24"/>
+      <w:headerReference w:type="default" r:id="rId22"/>
+      <w:footerReference w:type="default" r:id="rId23"/>
+      <w:headerReference w:type="first" r:id="rId24"/>
+      <w:footerReference w:type="first" r:id="rId25"/>
       <w:pgSz w:w="12240" w:h="15840"/>
       <w:pgMar w:top="1440" w:right="1440" w:bottom="1440" w:left="1440" w:header="720" w:footer="720" w:gutter="0"/>
       <w:cols w:space="720"/>
@@ -4476,7 +4528,7 @@
 </file>
 
 <file path=word/endnotes.xml><?xml version="1.0" encoding="utf-8"?>
-<w:endnotes xmlns:wpc="http://schemas.microsoft.com/office/word/2010/wordprocessingCanvas" xmlns:cx="http://schemas.microsoft.com/office/drawing/2014/chartex" xmlns:cx1="http://schemas.microsoft.com/office/drawing/2015/9/8/chartex" xmlns:cx2="http://schemas.microsoft.com/office/drawing/2015/10/21/chartex" xmlns:cx3="http://schemas.microsoft.com/office/drawing/2016/5/9/chartex" xmlns:cx4="http://schemas.microsoft.com/office/drawing/2016/5/10/chartex" xmlns:cx5="http://schemas.microsoft.com/office/drawing/2016/5/11/chartex" xmlns:cx6="http://schemas.microsoft.com/office/drawing/2016/5/12/chartex" xmlns:cx7="http://schemas.microsoft.com/office/drawing/2016/5/13/chartex" xmlns:cx8="http://schemas.microsoft.com/office/drawing/2016/5/14/chartex" xmlns:mc="http://schemas.openxmlformats.org/markup-compatibility/2006" xmlns:aink="http://schemas.microsoft.com/office/drawing/2016/ink" xmlns:am3d="http://schemas.microsoft.com/office/drawing/2017/model3d" xmlns:o="urn:schemas-microsoft-com:office:office" xmlns:oel="http://schemas.microsoft.com/office/2019/extlst" xmlns:r="http://schemas.openxmlformats.org/officeDocument/2006/relationships" xmlns:m="http://schemas.openxmlformats.org/officeDocument/2006/math" xmlns:v="urn:schemas-microsoft-com:vml" xmlns:wp14="http://schemas.microsoft.com/office/word/2010/wordprocessingDrawing" xmlns:wp="http://schemas.openxmlformats.org/drawingml/2006/wordprocessingDrawing" xmlns:w10="urn:schemas-microsoft-com:office:word" xmlns:w="http://schemas.openxmlformats.org/wordprocessingml/2006/main" xmlns:w14="http://schemas.microsoft.com/office/word/2010/wordml" xmlns:w15="http://schemas.microsoft.com/office/word/2012/wordml" xmlns:w16cex="http://schemas.microsoft.com/office/word/2018/wordml/cex" xmlns:w16cid="http://schemas.microsoft.com/office/word/2016/wordml/cid" xmlns:w16="http://schemas.microsoft.com/office/word/2018/wordml" xmlns:w16du="http://schemas.microsoft.com/office/word/2023/wordml/word16du" xmlns:w16sdtdh="http://schemas.microsoft.com/office/word/2020/wordml/sdtdatahash" xmlns:w16sdtfl="http://schemas.microsoft.com/office/word/2024/wordml/sdtformatlock" xmlns:w16se="http://schemas.microsoft.com/office/word/2015/wordml/symex" xmlns:wpg="http://schemas.microsoft.com/office/word/2010/wordprocessingGroup" xmlns:wpi="http://schemas.microsoft.com/office/word/2010/wordprocessingInk" xmlns:wne="http://schemas.microsoft.com/office/word/2006/wordml" xmlns:wps="http://schemas.microsoft.com/office/word/2010/wordprocessingShape" mc:Ignorable="w14 w15 w16se w16cid w16 w16cex w16sdtdh w16sdtfl w16du wp14">
+<w:endnotes xmlns:wpc="http://schemas.microsoft.com/office/word/2010/wordprocessingCanvas" xmlns:cx="http://schemas.microsoft.com/office/drawing/2014/chartex" xmlns:cx1="http://schemas.microsoft.com/office/drawing/2015/9/8/chartex" xmlns:cx2="http://schemas.microsoft.com/office/drawing/2015/10/21/chartex" xmlns:cx3="http://schemas.microsoft.com/office/drawing/2016/5/9/chartex" xmlns:cx4="http://schemas.microsoft.com/office/drawing/2016/5/10/chartex" xmlns:cx5="http://schemas.microsoft.com/office/drawing/2016/5/11/chartex" xmlns:cx6="http://schemas.microsoft.com/office/drawing/2016/5/12/chartex" xmlns:cx7="http://schemas.microsoft.com/office/drawing/2016/5/13/chartex" xmlns:cx8="http://schemas.microsoft.com/office/drawing/2016/5/14/chartex" xmlns:mc="http://schemas.openxmlformats.org/markup-compatibility/2006" xmlns:aink="http://schemas.microsoft.com/office/drawing/2016/ink" xmlns:am3d="http://schemas.microsoft.com/office/drawing/2017/model3d" xmlns:o="urn:schemas-microsoft-com:office:office" xmlns:r="http://schemas.openxmlformats.org/officeDocument/2006/relationships" xmlns:m="http://schemas.openxmlformats.org/officeDocument/2006/math" xmlns:v="urn:schemas-microsoft-com:vml" xmlns:wp14="http://schemas.microsoft.com/office/word/2010/wordprocessingDrawing" xmlns:wp="http://schemas.openxmlformats.org/drawingml/2006/wordprocessingDrawing" xmlns:w10="urn:schemas-microsoft-com:office:word" xmlns:w="http://schemas.openxmlformats.org/wordprocessingml/2006/main" xmlns:w14="http://schemas.microsoft.com/office/word/2010/wordml" xmlns:w15="http://schemas.microsoft.com/office/word/2012/wordml" xmlns:w16cex="http://schemas.microsoft.com/office/word/2018/wordml/cex" xmlns:w16cid="http://schemas.microsoft.com/office/word/2016/wordml/cid" xmlns:w16="http://schemas.microsoft.com/office/word/2018/wordml" xmlns:w16sdtdh="http://schemas.microsoft.com/office/word/2020/wordml/sdtdatahash" xmlns:w16se="http://schemas.microsoft.com/office/word/2015/wordml/symex" xmlns:wpg="http://schemas.microsoft.com/office/word/2010/wordprocessingGroup" xmlns:wpi="http://schemas.microsoft.com/office/word/2010/wordprocessingInk" xmlns:wne="http://schemas.microsoft.com/office/word/2006/wordml" xmlns:wps="http://schemas.microsoft.com/office/word/2010/wordprocessingShape" mc:Ignorable="w14 w15 w16se w16cid w16 w16cex w16sdtdh wp14">
   <w:endnote w:type="separator" w:id="-1">
     <w:p>
       <w:pPr>
@@ -4508,7 +4560,7 @@
 </file>
 
 <file path=word/footer1.xml><?xml version="1.0" encoding="utf-8"?>
-<w:ftr xmlns:wpc="http://schemas.microsoft.com/office/word/2010/wordprocessingCanvas" xmlns:cx="http://schemas.microsoft.com/office/drawing/2014/chartex" xmlns:cx1="http://schemas.microsoft.com/office/drawing/2015/9/8/chartex" xmlns:cx2="http://schemas.microsoft.com/office/drawing/2015/10/21/chartex" xmlns:cx3="http://schemas.microsoft.com/office/drawing/2016/5/9/chartex" xmlns:cx4="http://schemas.microsoft.com/office/drawing/2016/5/10/chartex" xmlns:cx5="http://schemas.microsoft.com/office/drawing/2016/5/11/chartex" xmlns:cx6="http://schemas.microsoft.com/office/drawing/2016/5/12/chartex" xmlns:cx7="http://schemas.microsoft.com/office/drawing/2016/5/13/chartex" xmlns:cx8="http://schemas.microsoft.com/office/drawing/2016/5/14/chartex" xmlns:mc="http://schemas.openxmlformats.org/markup-compatibility/2006" xmlns:aink="http://schemas.microsoft.com/office/drawing/2016/ink" xmlns:am3d="http://schemas.microsoft.com/office/drawing/2017/model3d" xmlns:o="urn:schemas-microsoft-com:office:office" xmlns:oel="http://schemas.microsoft.com/office/2019/extlst" xmlns:r="http://schemas.openxmlformats.org/officeDocument/2006/relationships" xmlns:m="http://schemas.openxmlformats.org/officeDocument/2006/math" xmlns:v="urn:schemas-microsoft-com:vml" xmlns:wp14="http://schemas.microsoft.com/office/word/2010/wordprocessingDrawing" xmlns:wp="http://schemas.openxmlformats.org/drawingml/2006/wordprocessingDrawing" xmlns:w10="urn:schemas-microsoft-com:office:word" xmlns:w="http://schemas.openxmlformats.org/wordprocessingml/2006/main" xmlns:w14="http://schemas.microsoft.com/office/word/2010/wordml" xmlns:w15="http://schemas.microsoft.com/office/word/2012/wordml" xmlns:w16cex="http://schemas.microsoft.com/office/word/2018/wordml/cex" xmlns:w16cid="http://schemas.microsoft.com/office/word/2016/wordml/cid" xmlns:w16="http://schemas.microsoft.com/office/word/2018/wordml" xmlns:w16du="http://schemas.microsoft.com/office/word/2023/wordml/word16du" xmlns:w16sdtdh="http://schemas.microsoft.com/office/word/2020/wordml/sdtdatahash" xmlns:w16sdtfl="http://schemas.microsoft.com/office/word/2024/wordml/sdtformatlock" xmlns:w16se="http://schemas.microsoft.com/office/word/2015/wordml/symex" xmlns:wpg="http://schemas.microsoft.com/office/word/2010/wordprocessingGroup" xmlns:wpi="http://schemas.microsoft.com/office/word/2010/wordprocessingInk" xmlns:wne="http://schemas.microsoft.com/office/word/2006/wordml" xmlns:wps="http://schemas.microsoft.com/office/word/2010/wordprocessingShape" mc:Ignorable="w14 w15 w16se w16cid w16 w16cex w16sdtdh w16sdtfl w16du wp14">
+<w:ftr xmlns:wpc="http://schemas.microsoft.com/office/word/2010/wordprocessingCanvas" xmlns:cx="http://schemas.microsoft.com/office/drawing/2014/chartex" xmlns:cx1="http://schemas.microsoft.com/office/drawing/2015/9/8/chartex" xmlns:cx2="http://schemas.microsoft.com/office/drawing/2015/10/21/chartex" xmlns:cx3="http://schemas.microsoft.com/office/drawing/2016/5/9/chartex" xmlns:cx4="http://schemas.microsoft.com/office/drawing/2016/5/10/chartex" xmlns:cx5="http://schemas.microsoft.com/office/drawing/2016/5/11/chartex" xmlns:cx6="http://schemas.microsoft.com/office/drawing/2016/5/12/chartex" xmlns:cx7="http://schemas.microsoft.com/office/drawing/2016/5/13/chartex" xmlns:cx8="http://schemas.microsoft.com/office/drawing/2016/5/14/chartex" xmlns:mc="http://schemas.openxmlformats.org/markup-compatibility/2006" xmlns:aink="http://schemas.microsoft.com/office/drawing/2016/ink" xmlns:am3d="http://schemas.microsoft.com/office/drawing/2017/model3d" xmlns:o="urn:schemas-microsoft-com:office:office" xmlns:r="http://schemas.openxmlformats.org/officeDocument/2006/relationships" xmlns:m="http://schemas.openxmlformats.org/officeDocument/2006/math" xmlns:v="urn:schemas-microsoft-com:vml" xmlns:wp14="http://schemas.microsoft.com/office/word/2010/wordprocessingDrawing" xmlns:wp="http://schemas.openxmlformats.org/drawingml/2006/wordprocessingDrawing" xmlns:w10="urn:schemas-microsoft-com:office:word" xmlns:w="http://schemas.openxmlformats.org/wordprocessingml/2006/main" xmlns:w14="http://schemas.microsoft.com/office/word/2010/wordml" xmlns:w15="http://schemas.microsoft.com/office/word/2012/wordml" xmlns:w16cex="http://schemas.microsoft.com/office/word/2018/wordml/cex" xmlns:w16cid="http://schemas.microsoft.com/office/word/2016/wordml/cid" xmlns:w16="http://schemas.microsoft.com/office/word/2018/wordml" xmlns:w16sdtdh="http://schemas.microsoft.com/office/word/2020/wordml/sdtdatahash" xmlns:w16se="http://schemas.microsoft.com/office/word/2015/wordml/symex" xmlns:wpg="http://schemas.microsoft.com/office/word/2010/wordprocessingGroup" xmlns:wpi="http://schemas.microsoft.com/office/word/2010/wordprocessingInk" xmlns:wne="http://schemas.microsoft.com/office/word/2006/wordml" xmlns:wps="http://schemas.microsoft.com/office/word/2010/wordprocessingShape" mc:Ignorable="w14 w15 w16se w16cid w16 w16cex w16sdtdh wp14">
   <w:tbl>
     <w:tblPr>
       <w:tblW w:w="0" w:type="auto"/>
@@ -4566,7 +4618,7 @@
 </file>
 
 <file path=word/footer2.xml><?xml version="1.0" encoding="utf-8"?>
-<w:ftr xmlns:wpc="http://schemas.microsoft.com/office/word/2010/wordprocessingCanvas" xmlns:cx="http://schemas.microsoft.com/office/drawing/2014/chartex" xmlns:cx1="http://schemas.microsoft.com/office/drawing/2015/9/8/chartex" xmlns:cx2="http://schemas.microsoft.com/office/drawing/2015/10/21/chartex" xmlns:cx3="http://schemas.microsoft.com/office/drawing/2016/5/9/chartex" xmlns:cx4="http://schemas.microsoft.com/office/drawing/2016/5/10/chartex" xmlns:cx5="http://schemas.microsoft.com/office/drawing/2016/5/11/chartex" xmlns:cx6="http://schemas.microsoft.com/office/drawing/2016/5/12/chartex" xmlns:cx7="http://schemas.microsoft.com/office/drawing/2016/5/13/chartex" xmlns:cx8="http://schemas.microsoft.com/office/drawing/2016/5/14/chartex" xmlns:mc="http://schemas.openxmlformats.org/markup-compatibility/2006" xmlns:aink="http://schemas.microsoft.com/office/drawing/2016/ink" xmlns:am3d="http://schemas.microsoft.com/office/drawing/2017/model3d" xmlns:o="urn:schemas-microsoft-com:office:office" xmlns:oel="http://schemas.microsoft.com/office/2019/extlst" xmlns:r="http://schemas.openxmlformats.org/officeDocument/2006/relationships" xmlns:m="http://schemas.openxmlformats.org/officeDocument/2006/math" xmlns:v="urn:schemas-microsoft-com:vml" xmlns:wp14="http://schemas.microsoft.com/office/word/2010/wordprocessingDrawing" xmlns:wp="http://schemas.openxmlformats.org/drawingml/2006/wordprocessingDrawing" xmlns:w10="urn:schemas-microsoft-com:office:word" xmlns:w="http://schemas.openxmlformats.org/wordprocessingml/2006/main" xmlns:w14="http://schemas.microsoft.com/office/word/2010/wordml" xmlns:w15="http://schemas.microsoft.com/office/word/2012/wordml" xmlns:w16cex="http://schemas.microsoft.com/office/word/2018/wordml/cex" xmlns:w16cid="http://schemas.microsoft.com/office/word/2016/wordml/cid" xmlns:w16="http://schemas.microsoft.com/office/word/2018/wordml" xmlns:w16du="http://schemas.microsoft.com/office/word/2023/wordml/word16du" xmlns:w16sdtdh="http://schemas.microsoft.com/office/word/2020/wordml/sdtdatahash" xmlns:w16sdtfl="http://schemas.microsoft.com/office/word/2024/wordml/sdtformatlock" xmlns:w16se="http://schemas.microsoft.com/office/word/2015/wordml/symex" xmlns:wpg="http://schemas.microsoft.com/office/word/2010/wordprocessingGroup" xmlns:wpi="http://schemas.microsoft.com/office/word/2010/wordprocessingInk" xmlns:wne="http://schemas.microsoft.com/office/word/2006/wordml" xmlns:wps="http://schemas.microsoft.com/office/word/2010/wordprocessingShape" mc:Ignorable="w14 w15 w16se w16cid w16 w16cex w16sdtdh w16sdtfl w16du wp14">
+<w:ftr xmlns:wpc="http://schemas.microsoft.com/office/word/2010/wordprocessingCanvas" xmlns:cx="http://schemas.microsoft.com/office/drawing/2014/chartex" xmlns:cx1="http://schemas.microsoft.com/office/drawing/2015/9/8/chartex" xmlns:cx2="http://schemas.microsoft.com/office/drawing/2015/10/21/chartex" xmlns:cx3="http://schemas.microsoft.com/office/drawing/2016/5/9/chartex" xmlns:cx4="http://schemas.microsoft.com/office/drawing/2016/5/10/chartex" xmlns:cx5="http://schemas.microsoft.com/office/drawing/2016/5/11/chartex" xmlns:cx6="http://schemas.microsoft.com/office/drawing/2016/5/12/chartex" xmlns:cx7="http://schemas.microsoft.com/office/drawing/2016/5/13/chartex" xmlns:cx8="http://schemas.microsoft.com/office/drawing/2016/5/14/chartex" xmlns:mc="http://schemas.openxmlformats.org/markup-compatibility/2006" xmlns:aink="http://schemas.microsoft.com/office/drawing/2016/ink" xmlns:am3d="http://schemas.microsoft.com/office/drawing/2017/model3d" xmlns:o="urn:schemas-microsoft-com:office:office" xmlns:r="http://schemas.openxmlformats.org/officeDocument/2006/relationships" xmlns:m="http://schemas.openxmlformats.org/officeDocument/2006/math" xmlns:v="urn:schemas-microsoft-com:vml" xmlns:wp14="http://schemas.microsoft.com/office/word/2010/wordprocessingDrawing" xmlns:wp="http://schemas.openxmlformats.org/drawingml/2006/wordprocessingDrawing" xmlns:w10="urn:schemas-microsoft-com:office:word" xmlns:w="http://schemas.openxmlformats.org/wordprocessingml/2006/main" xmlns:w14="http://schemas.microsoft.com/office/word/2010/wordml" xmlns:w15="http://schemas.microsoft.com/office/word/2012/wordml" xmlns:w16cex="http://schemas.microsoft.com/office/word/2018/wordml/cex" xmlns:w16cid="http://schemas.microsoft.com/office/word/2016/wordml/cid" xmlns:w16="http://schemas.microsoft.com/office/word/2018/wordml" xmlns:w16sdtdh="http://schemas.microsoft.com/office/word/2020/wordml/sdtdatahash" xmlns:w16se="http://schemas.microsoft.com/office/word/2015/wordml/symex" xmlns:wpg="http://schemas.microsoft.com/office/word/2010/wordprocessingGroup" xmlns:wpi="http://schemas.microsoft.com/office/word/2010/wordprocessingInk" xmlns:wne="http://schemas.microsoft.com/office/word/2006/wordml" xmlns:wps="http://schemas.microsoft.com/office/word/2010/wordprocessingShape" mc:Ignorable="w14 w15 w16se w16cid w16 w16cex w16sdtdh wp14">
   <w:tbl>
     <w:tblPr>
       <w:tblW w:w="0" w:type="auto"/>
@@ -4624,7 +4676,7 @@
 </file>
 
 <file path=word/footnotes.xml><?xml version="1.0" encoding="utf-8"?>
-<w:footnotes xmlns:wpc="http://schemas.microsoft.com/office/word/2010/wordprocessingCanvas" xmlns:cx="http://schemas.microsoft.com/office/drawing/2014/chartex" xmlns:cx1="http://schemas.microsoft.com/office/drawing/2015/9/8/chartex" xmlns:cx2="http://schemas.microsoft.com/office/drawing/2015/10/21/chartex" xmlns:cx3="http://schemas.microsoft.com/office/drawing/2016/5/9/chartex" xmlns:cx4="http://schemas.microsoft.com/office/drawing/2016/5/10/chartex" xmlns:cx5="http://schemas.microsoft.com/office/drawing/2016/5/11/chartex" xmlns:cx6="http://schemas.microsoft.com/office/drawing/2016/5/12/chartex" xmlns:cx7="http://schemas.microsoft.com/office/drawing/2016/5/13/chartex" xmlns:cx8="http://schemas.microsoft.com/office/drawing/2016/5/14/chartex" xmlns:mc="http://schemas.openxmlformats.org/markup-compatibility/2006" xmlns:aink="http://schemas.microsoft.com/office/drawing/2016/ink" xmlns:am3d="http://schemas.microsoft.com/office/drawing/2017/model3d" xmlns:o="urn:schemas-microsoft-com:office:office" xmlns:oel="http://schemas.microsoft.com/office/2019/extlst" xmlns:r="http://schemas.openxmlformats.org/officeDocument/2006/relationships" xmlns:m="http://schemas.openxmlformats.org/officeDocument/2006/math" xmlns:v="urn:schemas-microsoft-com:vml" xmlns:wp14="http://schemas.microsoft.com/office/word/2010/wordprocessingDrawing" xmlns:wp="http://schemas.openxmlformats.org/drawingml/2006/wordprocessingDrawing" xmlns:w10="urn:schemas-microsoft-com:office:word" xmlns:w="http://schemas.openxmlformats.org/wordprocessingml/2006/main" xmlns:w14="http://schemas.microsoft.com/office/word/2010/wordml" xmlns:w15="http://schemas.microsoft.com/office/word/2012/wordml" xmlns:w16cex="http://schemas.microsoft.com/office/word/2018/wordml/cex" xmlns:w16cid="http://schemas.microsoft.com/office/word/2016/wordml/cid" xmlns:w16="http://schemas.microsoft.com/office/word/2018/wordml" xmlns:w16du="http://schemas.microsoft.com/office/word/2023/wordml/word16du" xmlns:w16sdtdh="http://schemas.microsoft.com/office/word/2020/wordml/sdtdatahash" xmlns:w16sdtfl="http://schemas.microsoft.com/office/word/2024/wordml/sdtformatlock" xmlns:w16se="http://schemas.microsoft.com/office/word/2015/wordml/symex" xmlns:wpg="http://schemas.microsoft.com/office/word/2010/wordprocessingGroup" xmlns:wpi="http://schemas.microsoft.com/office/word/2010/wordprocessingInk" xmlns:wne="http://schemas.microsoft.com/office/word/2006/wordml" xmlns:wps="http://schemas.microsoft.com/office/word/2010/wordprocessingShape" mc:Ignorable="w14 w15 w16se w16cid w16 w16cex w16sdtdh w16sdtfl w16du wp14">
+<w:footnotes xmlns:wpc="http://schemas.microsoft.com/office/word/2010/wordprocessingCanvas" xmlns:cx="http://schemas.microsoft.com/office/drawing/2014/chartex" xmlns:cx1="http://schemas.microsoft.com/office/drawing/2015/9/8/chartex" xmlns:cx2="http://schemas.microsoft.com/office/drawing/2015/10/21/chartex" xmlns:cx3="http://schemas.microsoft.com/office/drawing/2016/5/9/chartex" xmlns:cx4="http://schemas.microsoft.com/office/drawing/2016/5/10/chartex" xmlns:cx5="http://schemas.microsoft.com/office/drawing/2016/5/11/chartex" xmlns:cx6="http://schemas.microsoft.com/office/drawing/2016/5/12/chartex" xmlns:cx7="http://schemas.microsoft.com/office/drawing/2016/5/13/chartex" xmlns:cx8="http://schemas.microsoft.com/office/drawing/2016/5/14/chartex" xmlns:mc="http://schemas.openxmlformats.org/markup-compatibility/2006" xmlns:aink="http://schemas.microsoft.com/office/drawing/2016/ink" xmlns:am3d="http://schemas.microsoft.com/office/drawing/2017/model3d" xmlns:o="urn:schemas-microsoft-com:office:office" xmlns:r="http://schemas.openxmlformats.org/officeDocument/2006/relationships" xmlns:m="http://schemas.openxmlformats.org/officeDocument/2006/math" xmlns:v="urn:schemas-microsoft-com:vml" xmlns:wp14="http://schemas.microsoft.com/office/word/2010/wordprocessingDrawing" xmlns:wp="http://schemas.openxmlformats.org/drawingml/2006/wordprocessingDrawing" xmlns:w10="urn:schemas-microsoft-com:office:word" xmlns:w="http://schemas.openxmlformats.org/wordprocessingml/2006/main" xmlns:w14="http://schemas.microsoft.com/office/word/2010/wordml" xmlns:w15="http://schemas.microsoft.com/office/word/2012/wordml" xmlns:w16cex="http://schemas.microsoft.com/office/word/2018/wordml/cex" xmlns:w16cid="http://schemas.microsoft.com/office/word/2016/wordml/cid" xmlns:w16="http://schemas.microsoft.com/office/word/2018/wordml" xmlns:w16sdtdh="http://schemas.microsoft.com/office/word/2020/wordml/sdtdatahash" xmlns:w16se="http://schemas.microsoft.com/office/word/2015/wordml/symex" xmlns:wpg="http://schemas.microsoft.com/office/word/2010/wordprocessingGroup" xmlns:wpi="http://schemas.microsoft.com/office/word/2010/wordprocessingInk" xmlns:wne="http://schemas.microsoft.com/office/word/2006/wordml" xmlns:wps="http://schemas.microsoft.com/office/word/2010/wordprocessingShape" mc:Ignorable="w14 w15 w16se w16cid w16 w16cex w16sdtdh wp14">
   <w:footnote w:type="separator" w:id="-1">
     <w:p>
       <w:pPr>
@@ -4656,7 +4708,7 @@
 </file>
 
 <file path=word/header1.xml><?xml version="1.0" encoding="utf-8"?>
-<w:hdr xmlns:wpc="http://schemas.microsoft.com/office/word/2010/wordprocessingCanvas" xmlns:cx="http://schemas.microsoft.com/office/drawing/2014/chartex" xmlns:cx1="http://schemas.microsoft.com/office/drawing/2015/9/8/chartex" xmlns:cx2="http://schemas.microsoft.com/office/drawing/2015/10/21/chartex" xmlns:cx3="http://schemas.microsoft.com/office/drawing/2016/5/9/chartex" xmlns:cx4="http://schemas.microsoft.com/office/drawing/2016/5/10/chartex" xmlns:cx5="http://schemas.microsoft.com/office/drawing/2016/5/11/chartex" xmlns:cx6="http://schemas.microsoft.com/office/drawing/2016/5/12/chartex" xmlns:cx7="http://schemas.microsoft.com/office/drawing/2016/5/13/chartex" xmlns:cx8="http://schemas.microsoft.com/office/drawing/2016/5/14/chartex" xmlns:mc="http://schemas.openxmlformats.org/markup-compatibility/2006" xmlns:aink="http://schemas.microsoft.com/office/drawing/2016/ink" xmlns:am3d="http://schemas.microsoft.com/office/drawing/2017/model3d" xmlns:o="urn:schemas-microsoft-com:office:office" xmlns:oel="http://schemas.microsoft.com/office/2019/extlst" xmlns:r="http://schemas.openxmlformats.org/officeDocument/2006/relationships" xmlns:m="http://schemas.openxmlformats.org/officeDocument/2006/math" xmlns:v="urn:schemas-microsoft-com:vml" xmlns:wp14="http://schemas.microsoft.com/office/word/2010/wordprocessingDrawing" xmlns:wp="http://schemas.openxmlformats.org/drawingml/2006/wordprocessingDrawing" xmlns:w10="urn:schemas-microsoft-com:office:word" xmlns:w="http://schemas.openxmlformats.org/wordprocessingml/2006/main" xmlns:w14="http://schemas.microsoft.com/office/word/2010/wordml" xmlns:w15="http://schemas.microsoft.com/office/word/2012/wordml" xmlns:w16cex="http://schemas.microsoft.com/office/word/2018/wordml/cex" xmlns:w16cid="http://schemas.microsoft.com/office/word/2016/wordml/cid" xmlns:w16="http://schemas.microsoft.com/office/word/2018/wordml" xmlns:w16du="http://schemas.microsoft.com/office/word/2023/wordml/word16du" xmlns:w16sdtdh="http://schemas.microsoft.com/office/word/2020/wordml/sdtdatahash" xmlns:w16sdtfl="http://schemas.microsoft.com/office/word/2024/wordml/sdtformatlock" xmlns:w16se="http://schemas.microsoft.com/office/word/2015/wordml/symex" xmlns:wpg="http://schemas.microsoft.com/office/word/2010/wordprocessingGroup" xmlns:wpi="http://schemas.microsoft.com/office/word/2010/wordprocessingInk" xmlns:wne="http://schemas.microsoft.com/office/word/2006/wordml" xmlns:wps="http://schemas.microsoft.com/office/word/2010/wordprocessingShape" mc:Ignorable="w14 w15 w16se w16cid w16 w16cex w16sdtdh w16sdtfl w16du wp14">
+<w:hdr xmlns:wpc="http://schemas.microsoft.com/office/word/2010/wordprocessingCanvas" xmlns:cx="http://schemas.microsoft.com/office/drawing/2014/chartex" xmlns:cx1="http://schemas.microsoft.com/office/drawing/2015/9/8/chartex" xmlns:cx2="http://schemas.microsoft.com/office/drawing/2015/10/21/chartex" xmlns:cx3="http://schemas.microsoft.com/office/drawing/2016/5/9/chartex" xmlns:cx4="http://schemas.microsoft.com/office/drawing/2016/5/10/chartex" xmlns:cx5="http://schemas.microsoft.com/office/drawing/2016/5/11/chartex" xmlns:cx6="http://schemas.microsoft.com/office/drawing/2016/5/12/chartex" xmlns:cx7="http://schemas.microsoft.com/office/drawing/2016/5/13/chartex" xmlns:cx8="http://schemas.microsoft.com/office/drawing/2016/5/14/chartex" xmlns:mc="http://schemas.openxmlformats.org/markup-compatibility/2006" xmlns:aink="http://schemas.microsoft.com/office/drawing/2016/ink" xmlns:am3d="http://schemas.microsoft.com/office/drawing/2017/model3d" xmlns:o="urn:schemas-microsoft-com:office:office" xmlns:r="http://schemas.openxmlformats.org/officeDocument/2006/relationships" xmlns:m="http://schemas.openxmlformats.org/officeDocument/2006/math" xmlns:v="urn:schemas-microsoft-com:vml" xmlns:wp14="http://schemas.microsoft.com/office/word/2010/wordprocessingDrawing" xmlns:wp="http://schemas.openxmlformats.org/drawingml/2006/wordprocessingDrawing" xmlns:w10="urn:schemas-microsoft-com:office:word" xmlns:w="http://schemas.openxmlformats.org/wordprocessingml/2006/main" xmlns:w14="http://schemas.microsoft.com/office/word/2010/wordml" xmlns:w15="http://schemas.microsoft.com/office/word/2012/wordml" xmlns:w16cex="http://schemas.microsoft.com/office/word/2018/wordml/cex" xmlns:w16cid="http://schemas.microsoft.com/office/word/2016/wordml/cid" xmlns:w16="http://schemas.microsoft.com/office/word/2018/wordml" xmlns:w16sdtdh="http://schemas.microsoft.com/office/word/2020/wordml/sdtdatahash" xmlns:w16se="http://schemas.microsoft.com/office/word/2015/wordml/symex" xmlns:wpg="http://schemas.microsoft.com/office/word/2010/wordprocessingGroup" xmlns:wpi="http://schemas.microsoft.com/office/word/2010/wordprocessingInk" xmlns:wne="http://schemas.microsoft.com/office/word/2006/wordml" xmlns:wps="http://schemas.microsoft.com/office/word/2010/wordprocessingShape" mc:Ignorable="w14 w15 w16se w16cid w16 w16cex w16sdtdh wp14">
   <w:tbl>
     <w:tblPr>
       <w:tblW w:w="0" w:type="auto"/>
@@ -4714,7 +4766,7 @@
 </file>
 
 <file path=word/header2.xml><?xml version="1.0" encoding="utf-8"?>
-<w:hdr xmlns:wpc="http://schemas.microsoft.com/office/word/2010/wordprocessingCanvas" xmlns:cx="http://schemas.microsoft.com/office/drawing/2014/chartex" xmlns:cx1="http://schemas.microsoft.com/office/drawing/2015/9/8/chartex" xmlns:cx2="http://schemas.microsoft.com/office/drawing/2015/10/21/chartex" xmlns:cx3="http://schemas.microsoft.com/office/drawing/2016/5/9/chartex" xmlns:cx4="http://schemas.microsoft.com/office/drawing/2016/5/10/chartex" xmlns:cx5="http://schemas.microsoft.com/office/drawing/2016/5/11/chartex" xmlns:cx6="http://schemas.microsoft.com/office/drawing/2016/5/12/chartex" xmlns:cx7="http://schemas.microsoft.com/office/drawing/2016/5/13/chartex" xmlns:cx8="http://schemas.microsoft.com/office/drawing/2016/5/14/chartex" xmlns:mc="http://schemas.openxmlformats.org/markup-compatibility/2006" xmlns:aink="http://schemas.microsoft.com/office/drawing/2016/ink" xmlns:am3d="http://schemas.microsoft.com/office/drawing/2017/model3d" xmlns:o="urn:schemas-microsoft-com:office:office" xmlns:oel="http://schemas.microsoft.com/office/2019/extlst" xmlns:r="http://schemas.openxmlformats.org/officeDocument/2006/relationships" xmlns:m="http://schemas.openxmlformats.org/officeDocument/2006/math" xmlns:v="urn:schemas-microsoft-com:vml" xmlns:wp14="http://schemas.microsoft.com/office/word/2010/wordprocessingDrawing" xmlns:wp="http://schemas.openxmlformats.org/drawingml/2006/wordprocessingDrawing" xmlns:w10="urn:schemas-microsoft-com:office:word" xmlns:w="http://schemas.openxmlformats.org/wordprocessingml/2006/main" xmlns:w14="http://schemas.microsoft.com/office/word/2010/wordml" xmlns:w15="http://schemas.microsoft.com/office/word/2012/wordml" xmlns:w16cex="http://schemas.microsoft.com/office/word/2018/wordml/cex" xmlns:w16cid="http://schemas.microsoft.com/office/word/2016/wordml/cid" xmlns:w16="http://schemas.microsoft.com/office/word/2018/wordml" xmlns:w16du="http://schemas.microsoft.com/office/word/2023/wordml/word16du" xmlns:w16sdtdh="http://schemas.microsoft.com/office/word/2020/wordml/sdtdatahash" xmlns:w16sdtfl="http://schemas.microsoft.com/office/word/2024/wordml/sdtformatlock" xmlns:w16se="http://schemas.microsoft.com/office/word/2015/wordml/symex" xmlns:wpg="http://schemas.microsoft.com/office/word/2010/wordprocessingGroup" xmlns:wpi="http://schemas.microsoft.com/office/word/2010/wordprocessingInk" xmlns:wne="http://schemas.microsoft.com/office/word/2006/wordml" xmlns:wps="http://schemas.microsoft.com/office/word/2010/wordprocessingShape" mc:Ignorable="w14 w15 w16se w16cid w16 w16cex w16sdtdh w16sdtfl w16du wp14">
+<w:hdr xmlns:wpc="http://schemas.microsoft.com/office/word/2010/wordprocessingCanvas" xmlns:cx="http://schemas.microsoft.com/office/drawing/2014/chartex" xmlns:cx1="http://schemas.microsoft.com/office/drawing/2015/9/8/chartex" xmlns:cx2="http://schemas.microsoft.com/office/drawing/2015/10/21/chartex" xmlns:cx3="http://schemas.microsoft.com/office/drawing/2016/5/9/chartex" xmlns:cx4="http://schemas.microsoft.com/office/drawing/2016/5/10/chartex" xmlns:cx5="http://schemas.microsoft.com/office/drawing/2016/5/11/chartex" xmlns:cx6="http://schemas.microsoft.com/office/drawing/2016/5/12/chartex" xmlns:cx7="http://schemas.microsoft.com/office/drawing/2016/5/13/chartex" xmlns:cx8="http://schemas.microsoft.com/office/drawing/2016/5/14/chartex" xmlns:mc="http://schemas.openxmlformats.org/markup-compatibility/2006" xmlns:aink="http://schemas.microsoft.com/office/drawing/2016/ink" xmlns:am3d="http://schemas.microsoft.com/office/drawing/2017/model3d" xmlns:o="urn:schemas-microsoft-com:office:office" xmlns:r="http://schemas.openxmlformats.org/officeDocument/2006/relationships" xmlns:m="http://schemas.openxmlformats.org/officeDocument/2006/math" xmlns:v="urn:schemas-microsoft-com:vml" xmlns:wp14="http://schemas.microsoft.com/office/word/2010/wordprocessingDrawing" xmlns:wp="http://schemas.openxmlformats.org/drawingml/2006/wordprocessingDrawing" xmlns:w10="urn:schemas-microsoft-com:office:word" xmlns:w="http://schemas.openxmlformats.org/wordprocessingml/2006/main" xmlns:w14="http://schemas.microsoft.com/office/word/2010/wordml" xmlns:w15="http://schemas.microsoft.com/office/word/2012/wordml" xmlns:w16cex="http://schemas.microsoft.com/office/word/2018/wordml/cex" xmlns:w16cid="http://schemas.microsoft.com/office/word/2016/wordml/cid" xmlns:w16="http://schemas.microsoft.com/office/word/2018/wordml" xmlns:w16sdtdh="http://schemas.microsoft.com/office/word/2020/wordml/sdtdatahash" xmlns:w16se="http://schemas.microsoft.com/office/word/2015/wordml/symex" xmlns:wpg="http://schemas.microsoft.com/office/word/2010/wordprocessingGroup" xmlns:wpi="http://schemas.microsoft.com/office/word/2010/wordprocessingInk" xmlns:wne="http://schemas.microsoft.com/office/word/2006/wordml" xmlns:wps="http://schemas.microsoft.com/office/word/2010/wordprocessingShape" mc:Ignorable="w14 w15 w16se w16cid w16 w16cex w16sdtdh wp14">
   <w:tbl>
     <w:tblPr>
       <w:tblStyle w:val="Tablaconcuadrcula"/>
@@ -4962,7 +5014,7 @@
 </file>
 
 <file path=word/numbering.xml><?xml version="1.0" encoding="utf-8"?>
-<w:numbering xmlns:wpc="http://schemas.microsoft.com/office/word/2010/wordprocessingCanvas" xmlns:cx="http://schemas.microsoft.com/office/drawing/2014/chartex" xmlns:cx1="http://schemas.microsoft.com/office/drawing/2015/9/8/chartex" xmlns:cx2="http://schemas.microsoft.com/office/drawing/2015/10/21/chartex" xmlns:cx3="http://schemas.microsoft.com/office/drawing/2016/5/9/chartex" xmlns:cx4="http://schemas.microsoft.com/office/drawing/2016/5/10/chartex" xmlns:cx5="http://schemas.microsoft.com/office/drawing/2016/5/11/chartex" xmlns:cx6="http://schemas.microsoft.com/office/drawing/2016/5/12/chartex" xmlns:cx7="http://schemas.microsoft.com/office/drawing/2016/5/13/chartex" xmlns:cx8="http://schemas.microsoft.com/office/drawing/2016/5/14/chartex" xmlns:mc="http://schemas.openxmlformats.org/markup-compatibility/2006" xmlns:aink="http://schemas.microsoft.com/office/drawing/2016/ink" xmlns:am3d="http://schemas.microsoft.com/office/drawing/2017/model3d" xmlns:o="urn:schemas-microsoft-com:office:office" xmlns:oel="http://schemas.microsoft.com/office/2019/extlst" xmlns:r="http://schemas.openxmlformats.org/officeDocument/2006/relationships" xmlns:m="http://schemas.openxmlformats.org/officeDocument/2006/math" xmlns:v="urn:schemas-microsoft-com:vml" xmlns:wp14="http://schemas.microsoft.com/office/word/2010/wordprocessingDrawing" xmlns:wp="http://schemas.openxmlformats.org/drawingml/2006/wordprocessingDrawing" xmlns:w10="urn:schemas-microsoft-com:office:word" xmlns:w="http://schemas.openxmlformats.org/wordprocessingml/2006/main" xmlns:w14="http://schemas.microsoft.com/office/word/2010/wordml" xmlns:w15="http://schemas.microsoft.com/office/word/2012/wordml" xmlns:w16cex="http://schemas.microsoft.com/office/word/2018/wordml/cex" xmlns:w16cid="http://schemas.microsoft.com/office/word/2016/wordml/cid" xmlns:w16="http://schemas.microsoft.com/office/word/2018/wordml" xmlns:w16du="http://schemas.microsoft.com/office/word/2023/wordml/word16du" xmlns:w16sdtdh="http://schemas.microsoft.com/office/word/2020/wordml/sdtdatahash" xmlns:w16sdtfl="http://schemas.microsoft.com/office/word/2024/wordml/sdtformatlock" xmlns:w16se="http://schemas.microsoft.com/office/word/2015/wordml/symex" xmlns:wpg="http://schemas.microsoft.com/office/word/2010/wordprocessingGroup" xmlns:wpi="http://schemas.microsoft.com/office/word/2010/wordprocessingInk" xmlns:wne="http://schemas.microsoft.com/office/word/2006/wordml" xmlns:wps="http://schemas.microsoft.com/office/word/2010/wordprocessingShape" mc:Ignorable="w14 w15 w16se w16cid w16 w16cex w16sdtdh w16sdtfl w16du wp14">
+<w:numbering xmlns:wpc="http://schemas.microsoft.com/office/word/2010/wordprocessingCanvas" xmlns:cx="http://schemas.microsoft.com/office/drawing/2014/chartex" xmlns:cx1="http://schemas.microsoft.com/office/drawing/2015/9/8/chartex" xmlns:cx2="http://schemas.microsoft.com/office/drawing/2015/10/21/chartex" xmlns:cx3="http://schemas.microsoft.com/office/drawing/2016/5/9/chartex" xmlns:cx4="http://schemas.microsoft.com/office/drawing/2016/5/10/chartex" xmlns:cx5="http://schemas.microsoft.com/office/drawing/2016/5/11/chartex" xmlns:cx6="http://schemas.microsoft.com/office/drawing/2016/5/12/chartex" xmlns:cx7="http://schemas.microsoft.com/office/drawing/2016/5/13/chartex" xmlns:cx8="http://schemas.microsoft.com/office/drawing/2016/5/14/chartex" xmlns:mc="http://schemas.openxmlformats.org/markup-compatibility/2006" xmlns:aink="http://schemas.microsoft.com/office/drawing/2016/ink" xmlns:am3d="http://schemas.microsoft.com/office/drawing/2017/model3d" xmlns:o="urn:schemas-microsoft-com:office:office" xmlns:r="http://schemas.openxmlformats.org/officeDocument/2006/relationships" xmlns:m="http://schemas.openxmlformats.org/officeDocument/2006/math" xmlns:v="urn:schemas-microsoft-com:vml" xmlns:wp14="http://schemas.microsoft.com/office/word/2010/wordprocessingDrawing" xmlns:wp="http://schemas.openxmlformats.org/drawingml/2006/wordprocessingDrawing" xmlns:w10="urn:schemas-microsoft-com:office:word" xmlns:w="http://schemas.openxmlformats.org/wordprocessingml/2006/main" xmlns:w14="http://schemas.microsoft.com/office/word/2010/wordml" xmlns:w15="http://schemas.microsoft.com/office/word/2012/wordml" xmlns:w16cex="http://schemas.microsoft.com/office/word/2018/wordml/cex" xmlns:w16cid="http://schemas.microsoft.com/office/word/2016/wordml/cid" xmlns:w16="http://schemas.microsoft.com/office/word/2018/wordml" xmlns:w16sdtdh="http://schemas.microsoft.com/office/word/2020/wordml/sdtdatahash" xmlns:w16se="http://schemas.microsoft.com/office/word/2015/wordml/symex" xmlns:wpg="http://schemas.microsoft.com/office/word/2010/wordprocessingGroup" xmlns:wpi="http://schemas.microsoft.com/office/word/2010/wordprocessingInk" xmlns:wne="http://schemas.microsoft.com/office/word/2006/wordml" xmlns:wps="http://schemas.microsoft.com/office/word/2010/wordprocessingShape" mc:Ignorable="w14 w15 w16se w16cid w16 w16cex w16sdtdh wp14">
   <w:abstractNum w:abstractNumId="0" w15:restartNumberingAfterBreak="0">
     <w:nsid w:val="02646EBE"/>
     <w:multiLevelType w:val="hybridMultilevel"/>
@@ -6713,58 +6765,58 @@
       </w:pPr>
     </w:lvl>
   </w:abstractNum>
-  <w:num w:numId="1" w16cid:durableId="632256094">
+  <w:num w:numId="1">
     <w:abstractNumId w:val="9"/>
   </w:num>
-  <w:num w:numId="2" w16cid:durableId="1756122770">
+  <w:num w:numId="2">
     <w:abstractNumId w:val="5"/>
   </w:num>
-  <w:num w:numId="3" w16cid:durableId="355430894">
+  <w:num w:numId="3">
     <w:abstractNumId w:val="3"/>
   </w:num>
-  <w:num w:numId="4" w16cid:durableId="1364287550">
+  <w:num w:numId="4">
     <w:abstractNumId w:val="13"/>
   </w:num>
-  <w:num w:numId="5" w16cid:durableId="533228022">
+  <w:num w:numId="5">
     <w:abstractNumId w:val="0"/>
   </w:num>
-  <w:num w:numId="6" w16cid:durableId="1599096272">
+  <w:num w:numId="6">
     <w:abstractNumId w:val="1"/>
   </w:num>
-  <w:num w:numId="7" w16cid:durableId="1296178246">
+  <w:num w:numId="7">
     <w:abstractNumId w:val="6"/>
   </w:num>
-  <w:num w:numId="8" w16cid:durableId="1350063515">
+  <w:num w:numId="8">
     <w:abstractNumId w:val="4"/>
   </w:num>
-  <w:num w:numId="9" w16cid:durableId="237330710">
+  <w:num w:numId="9">
     <w:abstractNumId w:val="14"/>
   </w:num>
-  <w:num w:numId="10" w16cid:durableId="474373757">
+  <w:num w:numId="10">
     <w:abstractNumId w:val="16"/>
   </w:num>
-  <w:num w:numId="11" w16cid:durableId="829714030">
+  <w:num w:numId="11">
     <w:abstractNumId w:val="8"/>
   </w:num>
-  <w:num w:numId="12" w16cid:durableId="1523394689">
+  <w:num w:numId="12">
     <w:abstractNumId w:val="10"/>
   </w:num>
-  <w:num w:numId="13" w16cid:durableId="1821573983">
+  <w:num w:numId="13">
     <w:abstractNumId w:val="17"/>
   </w:num>
-  <w:num w:numId="14" w16cid:durableId="2020885365">
+  <w:num w:numId="14">
     <w:abstractNumId w:val="12"/>
   </w:num>
-  <w:num w:numId="15" w16cid:durableId="1978410333">
+  <w:num w:numId="15">
     <w:abstractNumId w:val="7"/>
   </w:num>
-  <w:num w:numId="16" w16cid:durableId="479730601">
+  <w:num w:numId="16">
     <w:abstractNumId w:val="15"/>
   </w:num>
-  <w:num w:numId="17" w16cid:durableId="1615481842">
+  <w:num w:numId="17">
     <w:abstractNumId w:val="2"/>
   </w:num>
-  <w:num w:numId="18" w16cid:durableId="1564367479">
+  <w:num w:numId="18">
     <w:abstractNumId w:val="11"/>
   </w:num>
   <w:numIdMacAtCleanup w:val="8"/>
@@ -6772,7 +6824,7 @@
 </file>
 
 <file path=word/styles.xml><?xml version="1.0" encoding="utf-8"?>
-<w:styles xmlns:mc="http://schemas.openxmlformats.org/markup-compatibility/2006" xmlns:r="http://schemas.openxmlformats.org/officeDocument/2006/relationships" xmlns:w="http://schemas.openxmlformats.org/wordprocessingml/2006/main" xmlns:w14="http://schemas.microsoft.com/office/word/2010/wordml" xmlns:w15="http://schemas.microsoft.com/office/word/2012/wordml" xmlns:w16cex="http://schemas.microsoft.com/office/word/2018/wordml/cex" xmlns:w16cid="http://schemas.microsoft.com/office/word/2016/wordml/cid" xmlns:w16="http://schemas.microsoft.com/office/word/2018/wordml" xmlns:w16du="http://schemas.microsoft.com/office/word/2023/wordml/word16du" xmlns:w16sdtdh="http://schemas.microsoft.com/office/word/2020/wordml/sdtdatahash" xmlns:w16sdtfl="http://schemas.microsoft.com/office/word/2024/wordml/sdtformatlock" xmlns:w16se="http://schemas.microsoft.com/office/word/2015/wordml/symex" mc:Ignorable="w14 w15 w16se w16cid w16 w16cex w16sdtdh w16sdtfl w16du">
+<w:styles xmlns:mc="http://schemas.openxmlformats.org/markup-compatibility/2006" xmlns:r="http://schemas.openxmlformats.org/officeDocument/2006/relationships" xmlns:w="http://schemas.openxmlformats.org/wordprocessingml/2006/main" xmlns:w14="http://schemas.microsoft.com/office/word/2010/wordml" xmlns:w15="http://schemas.microsoft.com/office/word/2012/wordml" xmlns:w16cex="http://schemas.microsoft.com/office/word/2018/wordml/cex" xmlns:w16cid="http://schemas.microsoft.com/office/word/2016/wordml/cid" xmlns:w16="http://schemas.microsoft.com/office/word/2018/wordml" xmlns:w16sdtdh="http://schemas.microsoft.com/office/word/2020/wordml/sdtdatahash" xmlns:w16se="http://schemas.microsoft.com/office/word/2015/wordml/symex" mc:Ignorable="w14 w15 w16se w16cid w16 w16cex w16sdtdh">
   <w:docDefaults>
     <w:rPrDefault>
       <w:rPr>
@@ -7627,7 +7679,7 @@
       <w:szCs w:val="28"/>
     </w:rPr>
   </w:style>
-  <w:style w:type="character" w:styleId="Fuerte">
+  <w:style w:type="character" w:styleId="Textoennegrita">
     <w:name w:val="Strong"/>
     <w:basedOn w:val="Fuentedeprrafopredeter"/>
     <w:uiPriority w:val="22"/>
@@ -8534,6 +8586,1319 @@
 </w:styles>
 </file>
 
+<file path=word/charts/chart1.xml><?xml version="1.0" encoding="utf-8"?>
+<c:chartSpace xmlns:c="http://schemas.openxmlformats.org/drawingml/2006/chart" xmlns:a="http://schemas.openxmlformats.org/drawingml/2006/main" xmlns:r="http://schemas.openxmlformats.org/officeDocument/2006/relationships" xmlns:c16r2="http://schemas.microsoft.com/office/drawing/2015/06/chart">
+  <c:date1904 val="0"/>
+  <c:lang val="es-ES"/>
+  <c:roundedCorners val="0"/>
+  <mc:AlternateContent xmlns:mc="http://schemas.openxmlformats.org/markup-compatibility/2006">
+    <mc:Choice xmlns:c14="http://schemas.microsoft.com/office/drawing/2007/8/2/chart" Requires="c14">
+      <c14:style val="102"/>
+    </mc:Choice>
+    <mc:Fallback>
+      <c:style val="2"/>
+    </mc:Fallback>
+  </mc:AlternateContent>
+  <c:chart>
+    <c:title>
+      <c:tx>
+        <c:rich>
+          <a:bodyPr rot="0" spcFirstLastPara="1" vertOverflow="ellipsis" vert="horz" wrap="square" anchor="ctr" anchorCtr="1"/>
+          <a:lstStyle/>
+          <a:p>
+            <a:pPr>
+              <a:defRPr sz="1400" b="0" i="0" u="none" strike="noStrike" kern="1200" spc="0" baseline="0">
+                <a:solidFill>
+                  <a:schemeClr val="tx1">
+                    <a:lumMod val="65000"/>
+                    <a:lumOff val="35000"/>
+                  </a:schemeClr>
+                </a:solidFill>
+                <a:latin typeface="+mn-lt"/>
+                <a:ea typeface="+mn-ea"/>
+                <a:cs typeface="+mn-cs"/>
+              </a:defRPr>
+            </a:pPr>
+            <a:r>
+              <a:rPr lang="en-US" b="1"/>
+              <a:t>Comparación de tiempos de ejecucion para</a:t>
+            </a:r>
+            <a:r>
+              <a:rPr lang="en-US" b="1" baseline="0"/>
+              <a:t> el Requerimiento 4</a:t>
+            </a:r>
+            <a:endParaRPr lang="en-US" b="1"/>
+          </a:p>
+        </c:rich>
+      </c:tx>
+      <c:overlay val="0"/>
+      <c:spPr>
+        <a:noFill/>
+        <a:ln>
+          <a:noFill/>
+        </a:ln>
+        <a:effectLst/>
+      </c:spPr>
+      <c:txPr>
+        <a:bodyPr rot="0" spcFirstLastPara="1" vertOverflow="ellipsis" vert="horz" wrap="square" anchor="ctr" anchorCtr="1"/>
+        <a:lstStyle/>
+        <a:p>
+          <a:pPr>
+            <a:defRPr sz="1400" b="0" i="0" u="none" strike="noStrike" kern="1200" spc="0" baseline="0">
+              <a:solidFill>
+                <a:schemeClr val="tx1">
+                  <a:lumMod val="65000"/>
+                  <a:lumOff val="35000"/>
+                </a:schemeClr>
+              </a:solidFill>
+              <a:latin typeface="+mn-lt"/>
+              <a:ea typeface="+mn-ea"/>
+              <a:cs typeface="+mn-cs"/>
+            </a:defRPr>
+          </a:pPr>
+          <a:endParaRPr lang="es-CO"/>
+        </a:p>
+      </c:txPr>
+    </c:title>
+    <c:autoTitleDeleted val="0"/>
+    <c:plotArea>
+      <c:layout/>
+      <c:scatterChart>
+        <c:scatterStyle val="smoothMarker"/>
+        <c:varyColors val="0"/>
+        <c:ser>
+          <c:idx val="0"/>
+          <c:order val="0"/>
+          <c:tx>
+            <c:strRef>
+              <c:f>'01-Data Req. 4'!$H$2</c:f>
+              <c:strCache>
+                <c:ptCount val="1"/>
+                <c:pt idx="0">
+                  <c:v>Tiempo promedio (Reto 1)</c:v>
+                </c:pt>
+              </c:strCache>
+            </c:strRef>
+          </c:tx>
+          <c:spPr>
+            <a:ln w="19050" cap="rnd">
+              <a:solidFill>
+                <a:schemeClr val="accent1"/>
+              </a:solidFill>
+              <a:round/>
+            </a:ln>
+            <a:effectLst/>
+          </c:spPr>
+          <c:marker>
+            <c:symbol val="circle"/>
+            <c:size val="5"/>
+            <c:spPr>
+              <a:solidFill>
+                <a:schemeClr val="accent1"/>
+              </a:solidFill>
+              <a:ln w="9525">
+                <a:solidFill>
+                  <a:schemeClr val="accent1"/>
+                </a:solidFill>
+              </a:ln>
+              <a:effectLst/>
+            </c:spPr>
+          </c:marker>
+          <c:trendline>
+            <c:spPr>
+              <a:ln w="19050" cap="rnd">
+                <a:solidFill>
+                  <a:schemeClr val="accent1"/>
+                </a:solidFill>
+                <a:prstDash val="sysDot"/>
+              </a:ln>
+              <a:effectLst/>
+            </c:spPr>
+            <c:trendlineType val="linear"/>
+            <c:dispRSqr val="1"/>
+            <c:dispEq val="1"/>
+            <c:trendlineLbl>
+              <c:layout>
+                <c:manualLayout>
+                  <c:x val="-0.1363811854896437"/>
+                  <c:y val="-3.2945200031814204E-3"/>
+                </c:manualLayout>
+              </c:layout>
+              <c:numFmt formatCode="General" sourceLinked="0"/>
+              <c:spPr>
+                <a:noFill/>
+                <a:ln>
+                  <a:noFill/>
+                </a:ln>
+                <a:effectLst/>
+              </c:spPr>
+              <c:txPr>
+                <a:bodyPr rot="0" spcFirstLastPara="1" vertOverflow="ellipsis" vert="horz" wrap="square" anchor="ctr" anchorCtr="1"/>
+                <a:lstStyle/>
+                <a:p>
+                  <a:pPr>
+                    <a:defRPr sz="900" b="0" i="0" u="none" strike="noStrike" kern="1200" baseline="0">
+                      <a:solidFill>
+                        <a:schemeClr val="tx1">
+                          <a:lumMod val="65000"/>
+                          <a:lumOff val="35000"/>
+                        </a:schemeClr>
+                      </a:solidFill>
+                      <a:latin typeface="+mn-lt"/>
+                      <a:ea typeface="+mn-ea"/>
+                      <a:cs typeface="+mn-cs"/>
+                    </a:defRPr>
+                  </a:pPr>
+                  <a:endParaRPr lang="es-CO"/>
+                </a:p>
+              </c:txPr>
+            </c:trendlineLbl>
+          </c:trendline>
+          <c:xVal>
+            <c:numRef>
+              <c:f>'01-Data Req. 4'!$A$3:$A$14</c:f>
+              <c:numCache>
+                <c:formatCode>0.00%</c:formatCode>
+                <c:ptCount val="12"/>
+                <c:pt idx="0">
+                  <c:v>0.1</c:v>
+                </c:pt>
+                <c:pt idx="1">
+                  <c:v>0.2</c:v>
+                </c:pt>
+                <c:pt idx="2">
+                  <c:v>0.3</c:v>
+                </c:pt>
+                <c:pt idx="3">
+                  <c:v>0.4</c:v>
+                </c:pt>
+                <c:pt idx="4">
+                  <c:v>0.5</c:v>
+                </c:pt>
+                <c:pt idx="5">
+                  <c:v>0.6</c:v>
+                </c:pt>
+                <c:pt idx="6">
+                  <c:v>0.7</c:v>
+                </c:pt>
+                <c:pt idx="7">
+                  <c:v>0.8</c:v>
+                </c:pt>
+                <c:pt idx="8">
+                  <c:v>0.9</c:v>
+                </c:pt>
+                <c:pt idx="9">
+                  <c:v>1</c:v>
+                </c:pt>
+              </c:numCache>
+            </c:numRef>
+          </c:xVal>
+          <c:yVal>
+            <c:numRef>
+              <c:f>'01-Data Req. 4'!$C$3:$C$14</c:f>
+              <c:numCache>
+                <c:formatCode>0.00</c:formatCode>
+                <c:ptCount val="12"/>
+                <c:pt idx="0">
+                  <c:v>0.1147</c:v>
+                </c:pt>
+                <c:pt idx="1">
+                  <c:v>9.3816000000000006</c:v>
+                </c:pt>
+                <c:pt idx="2">
+                  <c:v>17.235299999999999</c:v>
+                </c:pt>
+                <c:pt idx="3">
+                  <c:v>28.8857</c:v>
+                </c:pt>
+                <c:pt idx="4">
+                  <c:v>48.176900000000003</c:v>
+                </c:pt>
+                <c:pt idx="5">
+                  <c:v>51.407699999999998</c:v>
+                </c:pt>
+                <c:pt idx="6">
+                  <c:v>68.365899999999996</c:v>
+                </c:pt>
+                <c:pt idx="7">
+                  <c:v>85.055099999999996</c:v>
+                </c:pt>
+                <c:pt idx="8">
+                  <c:v>90.106300000000005</c:v>
+                </c:pt>
+                <c:pt idx="9">
+                  <c:v>127.274</c:v>
+                </c:pt>
+              </c:numCache>
+            </c:numRef>
+          </c:yVal>
+          <c:smooth val="1"/>
+          <c:extLst>
+            <c:ext xmlns:c16="http://schemas.microsoft.com/office/drawing/2014/chart" uri="{C3380CC4-5D6E-409C-BE32-E72D297353CC}">
+              <c16:uniqueId val="{00000001-813D-4349-83EF-82FF2E3123BC}"/>
+            </c:ext>
+          </c:extLst>
+        </c:ser>
+        <c:ser>
+          <c:idx val="1"/>
+          <c:order val="1"/>
+          <c:tx>
+            <c:strRef>
+              <c:f>'01-Data Req. 4'!$H$16</c:f>
+              <c:strCache>
+                <c:ptCount val="1"/>
+                <c:pt idx="0">
+                  <c:v>Tiempo promedio (Reto 2)</c:v>
+                </c:pt>
+              </c:strCache>
+            </c:strRef>
+          </c:tx>
+          <c:spPr>
+            <a:ln w="19050" cap="rnd">
+              <a:solidFill>
+                <a:schemeClr val="accent2"/>
+              </a:solidFill>
+              <a:round/>
+            </a:ln>
+            <a:effectLst/>
+          </c:spPr>
+          <c:marker>
+            <c:symbol val="circle"/>
+            <c:size val="5"/>
+            <c:spPr>
+              <a:solidFill>
+                <a:schemeClr val="accent2"/>
+              </a:solidFill>
+              <a:ln w="9525">
+                <a:solidFill>
+                  <a:schemeClr val="accent2"/>
+                </a:solidFill>
+              </a:ln>
+              <a:effectLst/>
+            </c:spPr>
+          </c:marker>
+          <c:trendline>
+            <c:spPr>
+              <a:ln w="19050" cap="rnd">
+                <a:solidFill>
+                  <a:schemeClr val="accent2"/>
+                </a:solidFill>
+                <a:prstDash val="sysDot"/>
+              </a:ln>
+              <a:effectLst/>
+            </c:spPr>
+            <c:trendlineType val="linear"/>
+            <c:dispRSqr val="1"/>
+            <c:dispEq val="1"/>
+            <c:trendlineLbl>
+              <c:layout>
+                <c:manualLayout>
+                  <c:x val="9.593553005287829E-2"/>
+                  <c:y val="0.12376727909011373"/>
+                </c:manualLayout>
+              </c:layout>
+              <c:numFmt formatCode="General" sourceLinked="0"/>
+              <c:spPr>
+                <a:noFill/>
+                <a:ln>
+                  <a:noFill/>
+                </a:ln>
+                <a:effectLst/>
+              </c:spPr>
+              <c:txPr>
+                <a:bodyPr rot="0" spcFirstLastPara="1" vertOverflow="ellipsis" vert="horz" wrap="square" anchor="ctr" anchorCtr="1"/>
+                <a:lstStyle/>
+                <a:p>
+                  <a:pPr>
+                    <a:defRPr sz="900" b="0" i="0" u="none" strike="noStrike" kern="1200" baseline="0">
+                      <a:solidFill>
+                        <a:schemeClr val="tx1">
+                          <a:lumMod val="65000"/>
+                          <a:lumOff val="35000"/>
+                        </a:schemeClr>
+                      </a:solidFill>
+                      <a:latin typeface="+mn-lt"/>
+                      <a:ea typeface="+mn-ea"/>
+                      <a:cs typeface="+mn-cs"/>
+                    </a:defRPr>
+                  </a:pPr>
+                  <a:endParaRPr lang="es-CO"/>
+                </a:p>
+              </c:txPr>
+            </c:trendlineLbl>
+          </c:trendline>
+          <c:xVal>
+            <c:numRef>
+              <c:f>'01-Data Req. 4'!$A$17:$A$26</c:f>
+              <c:numCache>
+                <c:formatCode>0.00%</c:formatCode>
+                <c:ptCount val="10"/>
+                <c:pt idx="0">
+                  <c:v>0.1</c:v>
+                </c:pt>
+                <c:pt idx="1">
+                  <c:v>0.2</c:v>
+                </c:pt>
+                <c:pt idx="2">
+                  <c:v>0.3</c:v>
+                </c:pt>
+                <c:pt idx="3">
+                  <c:v>0.4</c:v>
+                </c:pt>
+                <c:pt idx="4">
+                  <c:v>0.5</c:v>
+                </c:pt>
+                <c:pt idx="5">
+                  <c:v>0.6</c:v>
+                </c:pt>
+                <c:pt idx="6">
+                  <c:v>0.7</c:v>
+                </c:pt>
+                <c:pt idx="7">
+                  <c:v>0.8</c:v>
+                </c:pt>
+                <c:pt idx="8">
+                  <c:v>0.9</c:v>
+                </c:pt>
+                <c:pt idx="9">
+                  <c:v>1</c:v>
+                </c:pt>
+              </c:numCache>
+            </c:numRef>
+          </c:xVal>
+          <c:yVal>
+            <c:numRef>
+              <c:f>'01-Data Req. 4'!$H$17:$H$26</c:f>
+              <c:numCache>
+                <c:formatCode>General</c:formatCode>
+                <c:ptCount val="10"/>
+                <c:pt idx="0">
+                  <c:v>0</c:v>
+                </c:pt>
+                <c:pt idx="1">
+                  <c:v>4.3148999214172319</c:v>
+                </c:pt>
+                <c:pt idx="2">
+                  <c:v>6.1424201011657686</c:v>
+                </c:pt>
+                <c:pt idx="3">
+                  <c:v>6.1981198310851999</c:v>
+                </c:pt>
+                <c:pt idx="4">
+                  <c:v>8.6322199821472143</c:v>
+                </c:pt>
+                <c:pt idx="5">
+                  <c:v>10.21958003044127</c:v>
+                </c:pt>
+                <c:pt idx="6">
+                  <c:v>11.634040021896318</c:v>
+                </c:pt>
+                <c:pt idx="7">
+                  <c:v>13.982019996643022</c:v>
+                </c:pt>
+                <c:pt idx="8">
+                  <c:v>13.683559942245441</c:v>
+                </c:pt>
+                <c:pt idx="9">
+                  <c:v>17.169700002670218</c:v>
+                </c:pt>
+              </c:numCache>
+            </c:numRef>
+          </c:yVal>
+          <c:smooth val="1"/>
+          <c:extLst>
+            <c:ext xmlns:c16="http://schemas.microsoft.com/office/drawing/2014/chart" uri="{C3380CC4-5D6E-409C-BE32-E72D297353CC}">
+              <c16:uniqueId val="{00000003-813D-4349-83EF-82FF2E3123BC}"/>
+            </c:ext>
+          </c:extLst>
+        </c:ser>
+        <c:dLbls>
+          <c:showLegendKey val="0"/>
+          <c:showVal val="0"/>
+          <c:showCatName val="0"/>
+          <c:showSerName val="0"/>
+          <c:showPercent val="0"/>
+          <c:showBubbleSize val="0"/>
+        </c:dLbls>
+        <c:axId val="1328118000"/>
+        <c:axId val="1328121328"/>
+      </c:scatterChart>
+      <c:valAx>
+        <c:axId val="1328118000"/>
+        <c:scaling>
+          <c:orientation val="minMax"/>
+        </c:scaling>
+        <c:delete val="0"/>
+        <c:axPos val="b"/>
+        <c:majorGridlines>
+          <c:spPr>
+            <a:ln w="9525" cap="flat" cmpd="sng" algn="ctr">
+              <a:solidFill>
+                <a:schemeClr val="tx1">
+                  <a:lumMod val="15000"/>
+                  <a:lumOff val="85000"/>
+                </a:schemeClr>
+              </a:solidFill>
+              <a:round/>
+            </a:ln>
+            <a:effectLst/>
+          </c:spPr>
+        </c:majorGridlines>
+        <c:title>
+          <c:tx>
+            <c:rich>
+              <a:bodyPr rot="0" spcFirstLastPara="1" vertOverflow="ellipsis" vert="horz" wrap="square" anchor="ctr" anchorCtr="1"/>
+              <a:lstStyle/>
+              <a:p>
+                <a:pPr>
+                  <a:defRPr sz="1000" b="1" i="0" u="none" strike="noStrike" kern="1200" baseline="0">
+                    <a:solidFill>
+                      <a:schemeClr val="tx1">
+                        <a:lumMod val="65000"/>
+                        <a:lumOff val="35000"/>
+                      </a:schemeClr>
+                    </a:solidFill>
+                    <a:latin typeface="+mn-lt"/>
+                    <a:ea typeface="+mn-ea"/>
+                    <a:cs typeface="+mn-cs"/>
+                  </a:defRPr>
+                </a:pPr>
+                <a:r>
+                  <a:rPr lang="en-US" b="1"/>
+                  <a:t>Tamaño</a:t>
+                </a:r>
+                <a:r>
+                  <a:rPr lang="en-US" b="1" baseline="0"/>
+                  <a:t> de la muestra [Porcentaje]</a:t>
+                </a:r>
+                <a:endParaRPr lang="en-US" b="1"/>
+              </a:p>
+            </c:rich>
+          </c:tx>
+          <c:overlay val="0"/>
+          <c:spPr>
+            <a:noFill/>
+            <a:ln>
+              <a:noFill/>
+            </a:ln>
+            <a:effectLst/>
+          </c:spPr>
+          <c:txPr>
+            <a:bodyPr rot="0" spcFirstLastPara="1" vertOverflow="ellipsis" vert="horz" wrap="square" anchor="ctr" anchorCtr="1"/>
+            <a:lstStyle/>
+            <a:p>
+              <a:pPr>
+                <a:defRPr sz="1000" b="1" i="0" u="none" strike="noStrike" kern="1200" baseline="0">
+                  <a:solidFill>
+                    <a:schemeClr val="tx1">
+                      <a:lumMod val="65000"/>
+                      <a:lumOff val="35000"/>
+                    </a:schemeClr>
+                  </a:solidFill>
+                  <a:latin typeface="+mn-lt"/>
+                  <a:ea typeface="+mn-ea"/>
+                  <a:cs typeface="+mn-cs"/>
+                </a:defRPr>
+              </a:pPr>
+              <a:endParaRPr lang="es-CO"/>
+            </a:p>
+          </c:txPr>
+        </c:title>
+        <c:numFmt formatCode="0.00%" sourceLinked="1"/>
+        <c:majorTickMark val="none"/>
+        <c:minorTickMark val="none"/>
+        <c:tickLblPos val="nextTo"/>
+        <c:spPr>
+          <a:noFill/>
+          <a:ln w="9525" cap="flat" cmpd="sng" algn="ctr">
+            <a:solidFill>
+              <a:schemeClr val="tx1">
+                <a:lumMod val="25000"/>
+                <a:lumOff val="75000"/>
+              </a:schemeClr>
+            </a:solidFill>
+            <a:round/>
+          </a:ln>
+          <a:effectLst/>
+        </c:spPr>
+        <c:txPr>
+          <a:bodyPr rot="-60000000" spcFirstLastPara="1" vertOverflow="ellipsis" vert="horz" wrap="square" anchor="ctr" anchorCtr="1"/>
+          <a:lstStyle/>
+          <a:p>
+            <a:pPr>
+              <a:defRPr sz="900" b="0" i="0" u="none" strike="noStrike" kern="1200" baseline="0">
+                <a:solidFill>
+                  <a:schemeClr val="tx1">
+                    <a:lumMod val="65000"/>
+                    <a:lumOff val="35000"/>
+                  </a:schemeClr>
+                </a:solidFill>
+                <a:latin typeface="+mn-lt"/>
+                <a:ea typeface="+mn-ea"/>
+                <a:cs typeface="+mn-cs"/>
+              </a:defRPr>
+            </a:pPr>
+            <a:endParaRPr lang="es-CO"/>
+          </a:p>
+        </c:txPr>
+        <c:crossAx val="1328121328"/>
+        <c:crosses val="autoZero"/>
+        <c:crossBetween val="midCat"/>
+      </c:valAx>
+      <c:valAx>
+        <c:axId val="1328121328"/>
+        <c:scaling>
+          <c:orientation val="minMax"/>
+        </c:scaling>
+        <c:delete val="0"/>
+        <c:axPos val="l"/>
+        <c:majorGridlines>
+          <c:spPr>
+            <a:ln w="9525" cap="flat" cmpd="sng" algn="ctr">
+              <a:solidFill>
+                <a:schemeClr val="tx1">
+                  <a:lumMod val="15000"/>
+                  <a:lumOff val="85000"/>
+                </a:schemeClr>
+              </a:solidFill>
+              <a:round/>
+            </a:ln>
+            <a:effectLst/>
+          </c:spPr>
+        </c:majorGridlines>
+        <c:title>
+          <c:tx>
+            <c:rich>
+              <a:bodyPr rot="-5400000" spcFirstLastPara="1" vertOverflow="ellipsis" vert="horz" wrap="square" anchor="ctr" anchorCtr="1"/>
+              <a:lstStyle/>
+              <a:p>
+                <a:pPr>
+                  <a:defRPr sz="1000" b="1" i="0" u="none" strike="noStrike" kern="1200" baseline="0">
+                    <a:solidFill>
+                      <a:schemeClr val="tx1">
+                        <a:lumMod val="65000"/>
+                        <a:lumOff val="35000"/>
+                      </a:schemeClr>
+                    </a:solidFill>
+                    <a:latin typeface="+mn-lt"/>
+                    <a:ea typeface="+mn-ea"/>
+                    <a:cs typeface="+mn-cs"/>
+                  </a:defRPr>
+                </a:pPr>
+                <a:r>
+                  <a:rPr lang="en-US" b="1"/>
+                  <a:t>Tiempo de Ejecución [ms]</a:t>
+                </a:r>
+              </a:p>
+            </c:rich>
+          </c:tx>
+          <c:overlay val="0"/>
+          <c:spPr>
+            <a:noFill/>
+            <a:ln>
+              <a:noFill/>
+            </a:ln>
+            <a:effectLst/>
+          </c:spPr>
+          <c:txPr>
+            <a:bodyPr rot="-5400000" spcFirstLastPara="1" vertOverflow="ellipsis" vert="horz" wrap="square" anchor="ctr" anchorCtr="1"/>
+            <a:lstStyle/>
+            <a:p>
+              <a:pPr>
+                <a:defRPr sz="1000" b="1" i="0" u="none" strike="noStrike" kern="1200" baseline="0">
+                  <a:solidFill>
+                    <a:schemeClr val="tx1">
+                      <a:lumMod val="65000"/>
+                      <a:lumOff val="35000"/>
+                    </a:schemeClr>
+                  </a:solidFill>
+                  <a:latin typeface="+mn-lt"/>
+                  <a:ea typeface="+mn-ea"/>
+                  <a:cs typeface="+mn-cs"/>
+                </a:defRPr>
+              </a:pPr>
+              <a:endParaRPr lang="es-CO"/>
+            </a:p>
+          </c:txPr>
+        </c:title>
+        <c:numFmt formatCode="0.00" sourceLinked="1"/>
+        <c:majorTickMark val="none"/>
+        <c:minorTickMark val="none"/>
+        <c:tickLblPos val="nextTo"/>
+        <c:spPr>
+          <a:noFill/>
+          <a:ln w="9525" cap="flat" cmpd="sng" algn="ctr">
+            <a:solidFill>
+              <a:schemeClr val="tx1">
+                <a:lumMod val="25000"/>
+                <a:lumOff val="75000"/>
+              </a:schemeClr>
+            </a:solidFill>
+            <a:round/>
+          </a:ln>
+          <a:effectLst/>
+        </c:spPr>
+        <c:txPr>
+          <a:bodyPr rot="-60000000" spcFirstLastPara="1" vertOverflow="ellipsis" vert="horz" wrap="square" anchor="ctr" anchorCtr="1"/>
+          <a:lstStyle/>
+          <a:p>
+            <a:pPr>
+              <a:defRPr sz="900" b="0" i="0" u="none" strike="noStrike" kern="1200" baseline="0">
+                <a:solidFill>
+                  <a:schemeClr val="tx1">
+                    <a:lumMod val="65000"/>
+                    <a:lumOff val="35000"/>
+                  </a:schemeClr>
+                </a:solidFill>
+                <a:latin typeface="+mn-lt"/>
+                <a:ea typeface="+mn-ea"/>
+                <a:cs typeface="+mn-cs"/>
+              </a:defRPr>
+            </a:pPr>
+            <a:endParaRPr lang="es-CO"/>
+          </a:p>
+        </c:txPr>
+        <c:crossAx val="1328118000"/>
+        <c:crosses val="autoZero"/>
+        <c:crossBetween val="midCat"/>
+      </c:valAx>
+      <c:spPr>
+        <a:noFill/>
+        <a:ln>
+          <a:noFill/>
+        </a:ln>
+        <a:effectLst/>
+      </c:spPr>
+    </c:plotArea>
+    <c:legend>
+      <c:legendPos val="b"/>
+      <c:overlay val="0"/>
+      <c:spPr>
+        <a:noFill/>
+        <a:ln>
+          <a:noFill/>
+        </a:ln>
+        <a:effectLst/>
+      </c:spPr>
+      <c:txPr>
+        <a:bodyPr rot="0" spcFirstLastPara="1" vertOverflow="ellipsis" vert="horz" wrap="square" anchor="ctr" anchorCtr="1"/>
+        <a:lstStyle/>
+        <a:p>
+          <a:pPr>
+            <a:defRPr sz="900" b="0" i="0" u="none" strike="noStrike" kern="1200" baseline="0">
+              <a:solidFill>
+                <a:schemeClr val="tx1">
+                  <a:lumMod val="65000"/>
+                  <a:lumOff val="35000"/>
+                </a:schemeClr>
+              </a:solidFill>
+              <a:latin typeface="+mn-lt"/>
+              <a:ea typeface="+mn-ea"/>
+              <a:cs typeface="+mn-cs"/>
+            </a:defRPr>
+          </a:pPr>
+          <a:endParaRPr lang="es-CO"/>
+        </a:p>
+      </c:txPr>
+    </c:legend>
+    <c:plotVisOnly val="1"/>
+    <c:dispBlanksAs val="gap"/>
+    <c:extLst>
+      <c:ext xmlns:c16r3="http://schemas.microsoft.com/office/drawing/2017/03/chart" uri="{56B9EC1D-385E-4148-901F-78D8002777C0}">
+        <c16r3:dataDisplayOptions16>
+          <c16r3:dispNaAsBlank val="1"/>
+        </c16r3:dataDisplayOptions16>
+      </c:ext>
+    </c:extLst>
+    <c:showDLblsOverMax val="0"/>
+  </c:chart>
+  <c:spPr>
+    <a:solidFill>
+      <a:schemeClr val="bg1"/>
+    </a:solidFill>
+    <a:ln w="9525" cap="flat" cmpd="sng" algn="ctr">
+      <a:solidFill>
+        <a:schemeClr val="tx1">
+          <a:lumMod val="15000"/>
+          <a:lumOff val="85000"/>
+        </a:schemeClr>
+      </a:solidFill>
+      <a:round/>
+    </a:ln>
+    <a:effectLst/>
+  </c:spPr>
+  <c:txPr>
+    <a:bodyPr/>
+    <a:lstStyle/>
+    <a:p>
+      <a:pPr>
+        <a:defRPr/>
+      </a:pPr>
+      <a:endParaRPr lang="es-CO"/>
+    </a:p>
+  </c:txPr>
+  <c:externalData r:id="rId3">
+    <c:autoUpdate val="0"/>
+  </c:externalData>
+</c:chartSpace>
+</file>
+
+<file path=word/charts/colors1.xml><?xml version="1.0" encoding="utf-8"?>
+<cs:colorStyle xmlns:cs="http://schemas.microsoft.com/office/drawing/2012/chartStyle" xmlns:a="http://schemas.openxmlformats.org/drawingml/2006/main" meth="cycle" id="10">
+  <a:schemeClr val="accent1"/>
+  <a:schemeClr val="accent2"/>
+  <a:schemeClr val="accent3"/>
+  <a:schemeClr val="accent4"/>
+  <a:schemeClr val="accent5"/>
+  <a:schemeClr val="accent6"/>
+  <cs:variation/>
+  <cs:variation>
+    <a:lumMod val="60000"/>
+  </cs:variation>
+  <cs:variation>
+    <a:lumMod val="80000"/>
+    <a:lumOff val="20000"/>
+  </cs:variation>
+  <cs:variation>
+    <a:lumMod val="80000"/>
+  </cs:variation>
+  <cs:variation>
+    <a:lumMod val="60000"/>
+    <a:lumOff val="40000"/>
+  </cs:variation>
+  <cs:variation>
+    <a:lumMod val="50000"/>
+  </cs:variation>
+  <cs:variation>
+    <a:lumMod val="70000"/>
+    <a:lumOff val="30000"/>
+  </cs:variation>
+  <cs:variation>
+    <a:lumMod val="70000"/>
+  </cs:variation>
+  <cs:variation>
+    <a:lumMod val="50000"/>
+    <a:lumOff val="50000"/>
+  </cs:variation>
+</cs:colorStyle>
+</file>
+
+<file path=word/charts/style1.xml><?xml version="1.0" encoding="utf-8"?>
+<cs:chartStyle xmlns:cs="http://schemas.microsoft.com/office/drawing/2012/chartStyle" xmlns:a="http://schemas.openxmlformats.org/drawingml/2006/main" id="240">
+  <cs:axisTitle>
+    <cs:lnRef idx="0"/>
+    <cs:fillRef idx="0"/>
+    <cs:effectRef idx="0"/>
+    <cs:fontRef idx="minor">
+      <a:schemeClr val="tx1">
+        <a:lumMod val="65000"/>
+        <a:lumOff val="35000"/>
+      </a:schemeClr>
+    </cs:fontRef>
+    <cs:defRPr sz="1000" kern="1200"/>
+  </cs:axisTitle>
+  <cs:categoryAxis>
+    <cs:lnRef idx="0"/>
+    <cs:fillRef idx="0"/>
+    <cs:effectRef idx="0"/>
+    <cs:fontRef idx="minor">
+      <a:schemeClr val="tx1">
+        <a:lumMod val="65000"/>
+        <a:lumOff val="35000"/>
+      </a:schemeClr>
+    </cs:fontRef>
+    <cs:spPr>
+      <a:ln w="9525" cap="flat" cmpd="sng" algn="ctr">
+        <a:solidFill>
+          <a:schemeClr val="tx1">
+            <a:lumMod val="25000"/>
+            <a:lumOff val="75000"/>
+          </a:schemeClr>
+        </a:solidFill>
+        <a:round/>
+      </a:ln>
+    </cs:spPr>
+    <cs:defRPr sz="900" kern="1200"/>
+  </cs:categoryAxis>
+  <cs:chartArea mods="allowNoFillOverride allowNoLineOverride">
+    <cs:lnRef idx="0"/>
+    <cs:fillRef idx="0"/>
+    <cs:effectRef idx="0"/>
+    <cs:fontRef idx="minor">
+      <a:schemeClr val="tx1"/>
+    </cs:fontRef>
+    <cs:spPr>
+      <a:solidFill>
+        <a:schemeClr val="bg1"/>
+      </a:solidFill>
+      <a:ln w="9525" cap="flat" cmpd="sng" algn="ctr">
+        <a:solidFill>
+          <a:schemeClr val="tx1">
+            <a:lumMod val="15000"/>
+            <a:lumOff val="85000"/>
+          </a:schemeClr>
+        </a:solidFill>
+        <a:round/>
+      </a:ln>
+    </cs:spPr>
+    <cs:defRPr sz="1000" kern="1200"/>
+  </cs:chartArea>
+  <cs:dataLabel>
+    <cs:lnRef idx="0"/>
+    <cs:fillRef idx="0"/>
+    <cs:effectRef idx="0"/>
+    <cs:fontRef idx="minor">
+      <a:schemeClr val="tx1">
+        <a:lumMod val="75000"/>
+        <a:lumOff val="25000"/>
+      </a:schemeClr>
+    </cs:fontRef>
+    <cs:defRPr sz="900" kern="1200"/>
+  </cs:dataLabel>
+  <cs:dataLabelCallout>
+    <cs:lnRef idx="0"/>
+    <cs:fillRef idx="0"/>
+    <cs:effectRef idx="0"/>
+    <cs:fontRef idx="minor">
+      <a:schemeClr val="dk1">
+        <a:lumMod val="65000"/>
+        <a:lumOff val="35000"/>
+      </a:schemeClr>
+    </cs:fontRef>
+    <cs:spPr>
+      <a:solidFill>
+        <a:schemeClr val="lt1"/>
+      </a:solidFill>
+      <a:ln>
+        <a:solidFill>
+          <a:schemeClr val="dk1">
+            <a:lumMod val="25000"/>
+            <a:lumOff val="75000"/>
+          </a:schemeClr>
+        </a:solidFill>
+      </a:ln>
+    </cs:spPr>
+    <cs:defRPr sz="900" kern="1200"/>
+    <cs:bodyPr rot="0" spcFirstLastPara="1" vertOverflow="clip" horzOverflow="clip" vert="horz" wrap="square" lIns="36576" tIns="18288" rIns="36576" bIns="18288" anchor="ctr" anchorCtr="1">
+      <a:spAutoFit/>
+    </cs:bodyPr>
+  </cs:dataLabelCallout>
+  <cs:dataPoint>
+    <cs:lnRef idx="0"/>
+    <cs:fillRef idx="1">
+      <cs:styleClr val="auto"/>
+    </cs:fillRef>
+    <cs:effectRef idx="0"/>
+    <cs:fontRef idx="minor">
+      <a:schemeClr val="tx1"/>
+    </cs:fontRef>
+  </cs:dataPoint>
+  <cs:dataPoint3D>
+    <cs:lnRef idx="0"/>
+    <cs:fillRef idx="1">
+      <cs:styleClr val="auto"/>
+    </cs:fillRef>
+    <cs:effectRef idx="0"/>
+    <cs:fontRef idx="minor">
+      <a:schemeClr val="tx1"/>
+    </cs:fontRef>
+  </cs:dataPoint3D>
+  <cs:dataPointLine>
+    <cs:lnRef idx="0">
+      <cs:styleClr val="auto"/>
+    </cs:lnRef>
+    <cs:fillRef idx="1"/>
+    <cs:effectRef idx="0"/>
+    <cs:fontRef idx="minor">
+      <a:schemeClr val="tx1"/>
+    </cs:fontRef>
+    <cs:spPr>
+      <a:ln w="19050" cap="rnd">
+        <a:solidFill>
+          <a:schemeClr val="phClr"/>
+        </a:solidFill>
+        <a:round/>
+      </a:ln>
+    </cs:spPr>
+  </cs:dataPointLine>
+  <cs:dataPointMarker>
+    <cs:lnRef idx="0">
+      <cs:styleClr val="auto"/>
+    </cs:lnRef>
+    <cs:fillRef idx="1">
+      <cs:styleClr val="auto"/>
+    </cs:fillRef>
+    <cs:effectRef idx="0"/>
+    <cs:fontRef idx="minor">
+      <a:schemeClr val="tx1"/>
+    </cs:fontRef>
+    <cs:spPr>
+      <a:ln w="9525">
+        <a:solidFill>
+          <a:schemeClr val="phClr"/>
+        </a:solidFill>
+      </a:ln>
+    </cs:spPr>
+  </cs:dataPointMarker>
+  <cs:dataPointMarkerLayout symbol="circle" size="5"/>
+  <cs:dataPointWireframe>
+    <cs:lnRef idx="0">
+      <cs:styleClr val="auto"/>
+    </cs:lnRef>
+    <cs:fillRef idx="0"/>
+    <cs:effectRef idx="0"/>
+    <cs:fontRef idx="minor">
+      <a:schemeClr val="dk1"/>
+    </cs:fontRef>
+    <cs:spPr>
+      <a:ln w="9525" cap="rnd">
+        <a:solidFill>
+          <a:schemeClr val="phClr"/>
+        </a:solidFill>
+        <a:round/>
+      </a:ln>
+    </cs:spPr>
+  </cs:dataPointWireframe>
+  <cs:dataTable>
+    <cs:lnRef idx="0"/>
+    <cs:fillRef idx="0"/>
+    <cs:effectRef idx="0"/>
+    <cs:fontRef idx="minor">
+      <a:schemeClr val="tx1">
+        <a:lumMod val="65000"/>
+        <a:lumOff val="35000"/>
+      </a:schemeClr>
+    </cs:fontRef>
+    <cs:spPr>
+      <a:noFill/>
+      <a:ln w="9525" cap="flat" cmpd="sng" algn="ctr">
+        <a:solidFill>
+          <a:schemeClr val="tx1">
+            <a:lumMod val="15000"/>
+            <a:lumOff val="85000"/>
+          </a:schemeClr>
+        </a:solidFill>
+        <a:round/>
+      </a:ln>
+    </cs:spPr>
+    <cs:defRPr sz="900" kern="1200"/>
+  </cs:dataTable>
+  <cs:downBar>
+    <cs:lnRef idx="0"/>
+    <cs:fillRef idx="0"/>
+    <cs:effectRef idx="0"/>
+    <cs:fontRef idx="minor">
+      <a:schemeClr val="tx1"/>
+    </cs:fontRef>
+    <cs:spPr>
+      <a:solidFill>
+        <a:schemeClr val="dk1">
+          <a:lumMod val="75000"/>
+          <a:lumOff val="25000"/>
+        </a:schemeClr>
+      </a:solidFill>
+      <a:ln w="9525" cap="flat" cmpd="sng" algn="ctr">
+        <a:solidFill>
+          <a:schemeClr val="tx1">
+            <a:lumMod val="65000"/>
+            <a:lumOff val="35000"/>
+          </a:schemeClr>
+        </a:solidFill>
+        <a:round/>
+      </a:ln>
+    </cs:spPr>
+  </cs:downBar>
+  <cs:dropLine>
+    <cs:lnRef idx="0"/>
+    <cs:fillRef idx="0"/>
+    <cs:effectRef idx="0"/>
+    <cs:fontRef idx="minor">
+      <a:schemeClr val="tx1"/>
+    </cs:fontRef>
+    <cs:spPr>
+      <a:ln w="9525" cap="flat" cmpd="sng" algn="ctr">
+        <a:solidFill>
+          <a:schemeClr val="tx1">
+            <a:lumMod val="35000"/>
+            <a:lumOff val="65000"/>
+          </a:schemeClr>
+        </a:solidFill>
+        <a:round/>
+      </a:ln>
+    </cs:spPr>
+  </cs:dropLine>
+  <cs:errorBar>
+    <cs:lnRef idx="0"/>
+    <cs:fillRef idx="0"/>
+    <cs:effectRef idx="0"/>
+    <cs:fontRef idx="minor">
+      <a:schemeClr val="tx1"/>
+    </cs:fontRef>
+    <cs:spPr>
+      <a:ln w="9525" cap="flat" cmpd="sng" algn="ctr">
+        <a:solidFill>
+          <a:schemeClr val="tx1">
+            <a:lumMod val="65000"/>
+            <a:lumOff val="35000"/>
+          </a:schemeClr>
+        </a:solidFill>
+        <a:round/>
+      </a:ln>
+    </cs:spPr>
+  </cs:errorBar>
+  <cs:floor>
+    <cs:lnRef idx="0"/>
+    <cs:fillRef idx="0"/>
+    <cs:effectRef idx="0"/>
+    <cs:fontRef idx="minor">
+      <a:schemeClr val="tx1"/>
+    </cs:fontRef>
+    <cs:spPr>
+      <a:noFill/>
+      <a:ln>
+        <a:noFill/>
+      </a:ln>
+    </cs:spPr>
+  </cs:floor>
+  <cs:gridlineMajor>
+    <cs:lnRef idx="0"/>
+    <cs:fillRef idx="0"/>
+    <cs:effectRef idx="0"/>
+    <cs:fontRef idx="minor">
+      <a:schemeClr val="tx1"/>
+    </cs:fontRef>
+    <cs:spPr>
+      <a:ln w="9525" cap="flat" cmpd="sng" algn="ctr">
+        <a:solidFill>
+          <a:schemeClr val="tx1">
+            <a:lumMod val="15000"/>
+            <a:lumOff val="85000"/>
+          </a:schemeClr>
+        </a:solidFill>
+        <a:round/>
+      </a:ln>
+    </cs:spPr>
+  </cs:gridlineMajor>
+  <cs:gridlineMinor>
+    <cs:lnRef idx="0"/>
+    <cs:fillRef idx="0"/>
+    <cs:effectRef idx="0"/>
+    <cs:fontRef idx="minor">
+      <a:schemeClr val="tx1"/>
+    </cs:fontRef>
+    <cs:spPr>
+      <a:ln w="9525" cap="flat" cmpd="sng" algn="ctr">
+        <a:solidFill>
+          <a:schemeClr val="tx1">
+            <a:lumMod val="5000"/>
+            <a:lumOff val="95000"/>
+          </a:schemeClr>
+        </a:solidFill>
+        <a:round/>
+      </a:ln>
+    </cs:spPr>
+  </cs:gridlineMinor>
+  <cs:hiLoLine>
+    <cs:lnRef idx="0"/>
+    <cs:fillRef idx="0"/>
+    <cs:effectRef idx="0"/>
+    <cs:fontRef idx="minor">
+      <a:schemeClr val="tx1"/>
+    </cs:fontRef>
+    <cs:spPr>
+      <a:ln w="9525" cap="flat" cmpd="sng" algn="ctr">
+        <a:solidFill>
+          <a:schemeClr val="tx1">
+            <a:lumMod val="50000"/>
+            <a:lumOff val="50000"/>
+          </a:schemeClr>
+        </a:solidFill>
+        <a:round/>
+      </a:ln>
+    </cs:spPr>
+  </cs:hiLoLine>
+  <cs:leaderLine>
+    <cs:lnRef idx="0"/>
+    <cs:fillRef idx="0"/>
+    <cs:effectRef idx="0"/>
+    <cs:fontRef idx="minor">
+      <a:schemeClr val="tx1"/>
+    </cs:fontRef>
+    <cs:spPr>
+      <a:ln w="9525" cap="flat" cmpd="sng" algn="ctr">
+        <a:solidFill>
+          <a:schemeClr val="tx1">
+            <a:lumMod val="35000"/>
+            <a:lumOff val="65000"/>
+          </a:schemeClr>
+        </a:solidFill>
+        <a:round/>
+      </a:ln>
+    </cs:spPr>
+  </cs:leaderLine>
+  <cs:legend>
+    <cs:lnRef idx="0"/>
+    <cs:fillRef idx="0"/>
+    <cs:effectRef idx="0"/>
+    <cs:fontRef idx="minor">
+      <a:schemeClr val="tx1">
+        <a:lumMod val="65000"/>
+        <a:lumOff val="35000"/>
+      </a:schemeClr>
+    </cs:fontRef>
+    <cs:defRPr sz="900" kern="1200"/>
+  </cs:legend>
+  <cs:plotArea mods="allowNoFillOverride allowNoLineOverride">
+    <cs:lnRef idx="0"/>
+    <cs:fillRef idx="0"/>
+    <cs:effectRef idx="0"/>
+    <cs:fontRef idx="minor">
+      <a:schemeClr val="tx1"/>
+    </cs:fontRef>
+  </cs:plotArea>
+  <cs:plotArea3D mods="allowNoFillOverride allowNoLineOverride">
+    <cs:lnRef idx="0"/>
+    <cs:fillRef idx="0"/>
+    <cs:effectRef idx="0"/>
+    <cs:fontRef idx="minor">
+      <a:schemeClr val="tx1"/>
+    </cs:fontRef>
+  </cs:plotArea3D>
+  <cs:seriesAxis>
+    <cs:lnRef idx="0"/>
+    <cs:fillRef idx="0"/>
+    <cs:effectRef idx="0"/>
+    <cs:fontRef idx="minor">
+      <a:schemeClr val="tx1">
+        <a:lumMod val="65000"/>
+        <a:lumOff val="35000"/>
+      </a:schemeClr>
+    </cs:fontRef>
+    <cs:defRPr sz="900" kern="1200"/>
+  </cs:seriesAxis>
+  <cs:seriesLine>
+    <cs:lnRef idx="0"/>
+    <cs:fillRef idx="0"/>
+    <cs:effectRef idx="0"/>
+    <cs:fontRef idx="minor">
+      <a:schemeClr val="tx1"/>
+    </cs:fontRef>
+    <cs:spPr>
+      <a:ln w="9525" cap="flat" cmpd="sng" algn="ctr">
+        <a:solidFill>
+          <a:schemeClr val="tx1">
+            <a:lumMod val="35000"/>
+            <a:lumOff val="65000"/>
+          </a:schemeClr>
+        </a:solidFill>
+        <a:round/>
+      </a:ln>
+    </cs:spPr>
+  </cs:seriesLine>
+  <cs:title>
+    <cs:lnRef idx="0"/>
+    <cs:fillRef idx="0"/>
+    <cs:effectRef idx="0"/>
+    <cs:fontRef idx="minor">
+      <a:schemeClr val="tx1">
+        <a:lumMod val="65000"/>
+        <a:lumOff val="35000"/>
+      </a:schemeClr>
+    </cs:fontRef>
+    <cs:defRPr sz="1400" b="0" kern="1200" spc="0" baseline="0"/>
+  </cs:title>
+  <cs:trendline>
+    <cs:lnRef idx="0">
+      <cs:styleClr val="auto"/>
+    </cs:lnRef>
+    <cs:fillRef idx="0"/>
+    <cs:effectRef idx="0"/>
+    <cs:fontRef idx="minor">
+      <a:schemeClr val="tx1"/>
+    </cs:fontRef>
+    <cs:spPr>
+      <a:ln w="19050" cap="rnd">
+        <a:solidFill>
+          <a:schemeClr val="phClr"/>
+        </a:solidFill>
+        <a:prstDash val="sysDot"/>
+      </a:ln>
+    </cs:spPr>
+  </cs:trendline>
+  <cs:trendlineLabel>
+    <cs:lnRef idx="0"/>
+    <cs:fillRef idx="0"/>
+    <cs:effectRef idx="0"/>
+    <cs:fontRef idx="minor">
+      <a:schemeClr val="tx1">
+        <a:lumMod val="65000"/>
+        <a:lumOff val="35000"/>
+      </a:schemeClr>
+    </cs:fontRef>
+    <cs:defRPr sz="900" kern="1200"/>
+  </cs:trendlineLabel>
+  <cs:upBar>
+    <cs:lnRef idx="0"/>
+    <cs:fillRef idx="0"/>
+    <cs:effectRef idx="0"/>
+    <cs:fontRef idx="minor">
+      <a:schemeClr val="tx1"/>
+    </cs:fontRef>
+    <cs:spPr>
+      <a:solidFill>
+        <a:schemeClr val="lt1"/>
+      </a:solidFill>
+      <a:ln w="9525" cap="flat" cmpd="sng" algn="ctr">
+        <a:solidFill>
+          <a:schemeClr val="tx1">
+            <a:lumMod val="65000"/>
+            <a:lumOff val="35000"/>
+          </a:schemeClr>
+        </a:solidFill>
+        <a:round/>
+      </a:ln>
+    </cs:spPr>
+  </cs:upBar>
+  <cs:valueAxis>
+    <cs:lnRef idx="0"/>
+    <cs:fillRef idx="0"/>
+    <cs:effectRef idx="0"/>
+    <cs:fontRef idx="minor">
+      <a:schemeClr val="tx1">
+        <a:lumMod val="65000"/>
+        <a:lumOff val="35000"/>
+      </a:schemeClr>
+    </cs:fontRef>
+    <cs:spPr>
+      <a:ln w="9525" cap="flat" cmpd="sng" algn="ctr">
+        <a:solidFill>
+          <a:schemeClr val="tx1">
+            <a:lumMod val="25000"/>
+            <a:lumOff val="75000"/>
+          </a:schemeClr>
+        </a:solidFill>
+        <a:round/>
+      </a:ln>
+    </cs:spPr>
+    <cs:defRPr sz="900" kern="1200"/>
+  </cs:valueAxis>
+  <cs:wall>
+    <cs:lnRef idx="0"/>
+    <cs:fillRef idx="0"/>
+    <cs:effectRef idx="0"/>
+    <cs:fontRef idx="minor">
+      <a:schemeClr val="tx1"/>
+    </cs:fontRef>
+    <cs:spPr>
+      <a:noFill/>
+      <a:ln>
+        <a:noFill/>
+      </a:ln>
+    </cs:spPr>
+  </cs:wall>
+</cs:chartStyle>
+</file>
+
 <file path=word/theme/theme1.xml><?xml version="1.0" encoding="utf-8"?>
 <a:theme xmlns:a="http://schemas.openxmlformats.org/drawingml/2006/main" name="Office Theme">
   <a:themeElements>
@@ -8830,6 +10195,67 @@
 </file>
 
 <file path=customXml/item1.xml><?xml version="1.0" encoding="utf-8"?>
+<p:properties xmlns:p="http://schemas.microsoft.com/office/2006/metadata/properties" xmlns:xsi="http://www.w3.org/2001/XMLSchema-instance" xmlns:pc="http://schemas.microsoft.com/office/infopath/2007/PartnerControls">
+  <documentManagement>
+    <SharedWithUsers xmlns="85e30bcc-d76c-4413-8e4d-2dce22fb0743">
+      <UserInfo>
+        <DisplayName>Dario Ernesto Correal Torres</DisplayName>
+        <AccountId>15</AccountId>
+        <AccountType/>
+      </UserInfo>
+      <UserInfo>
+        <DisplayName>Carlos Andres Lozano Garzon</DisplayName>
+        <AccountId>13</AccountId>
+        <AccountType/>
+      </UserInfo>
+      <UserInfo>
+        <DisplayName>Mario  Fernando De la rosa Rosero</DisplayName>
+        <AccountId>16</AccountId>
+        <AccountType/>
+      </UserInfo>
+      <UserInfo>
+        <DisplayName>Arturo Henao Chaparro</DisplayName>
+        <AccountId>48</AccountId>
+        <AccountType/>
+      </UserInfo>
+      <UserInfo>
+        <DisplayName>Luis Esteban Florez Salamanca</DisplayName>
+        <AccountId>33</AccountId>
+        <AccountType/>
+      </UserInfo>
+      <UserInfo>
+        <DisplayName>Christian Camilo Aparicio Baquen</DisplayName>
+        <AccountId>50</AccountId>
+        <AccountType/>
+      </UserInfo>
+      <UserInfo>
+        <DisplayName>Ivan David Salazar Cardenas</DisplayName>
+        <AccountId>52</AccountId>
+        <AccountType/>
+      </UserInfo>
+    </SharedWithUsers>
+    <TaxCatchAll xmlns="85e30bcc-d76c-4413-8e4d-2dce22fb0743" xsi:nil="true"/>
+    <lcf76f155ced4ddcb4097134ff3c332f xmlns="164883f8-7691-4ecf-b54a-664c0d0edefe">
+      <Terms xmlns="http://schemas.microsoft.com/office/infopath/2007/PartnerControls"/>
+    </lcf76f155ced4ddcb4097134ff3c332f>
+  </documentManagement>
+</p:properties>
+</file>
+
+<file path=customXml/item2.xml><?xml version="1.0" encoding="utf-8"?>
+<?mso-contentType ?>
+<FormTemplates xmlns="http://schemas.microsoft.com/sharepoint/v3/contenttype/forms">
+  <Display>DocumentLibraryForm</Display>
+  <Edit>DocumentLibraryForm</Edit>
+  <New>DocumentLibraryForm</New>
+</FormTemplates>
+</file>
+
+<file path=customXml/item3.xml><?xml version="1.0" encoding="utf-8"?>
+<b:Sources xmlns:b="http://schemas.openxmlformats.org/officeDocument/2006/bibliography" xmlns="http://schemas.openxmlformats.org/officeDocument/2006/bibliography" SelectedStyle="\APASixthEditionOfficeOnline.xsl" StyleName="APA" Version="6"/>
+</file>
+
+<file path=customXml/item4.xml><?xml version="1.0" encoding="utf-8"?>
 <ct:contentTypeSchema xmlns:ct="http://schemas.microsoft.com/office/2006/metadata/contentType" xmlns:ma="http://schemas.microsoft.com/office/2006/metadata/properties/metaAttributes" ct:_="" ma:_="" ma:contentTypeName="Documento" ma:contentTypeID="0x01010023858CF01A2EF24688B692775F4C60A4" ma:contentTypeVersion="15" ma:contentTypeDescription="Crear nuevo documento." ma:contentTypeScope="" ma:versionID="a4df9e4b793c0fa050084ef4feafa589">
   <xsd:schema xmlns:xsd="http://www.w3.org/2001/XMLSchema" xmlns:xs="http://www.w3.org/2001/XMLSchema" xmlns:p="http://schemas.microsoft.com/office/2006/metadata/properties" xmlns:ns2="164883f8-7691-4ecf-b54a-664c0d0edefe" xmlns:ns3="85e30bcc-d76c-4413-8e4d-2dce22fb0743" targetNamespace="http://schemas.microsoft.com/office/2006/metadata/properties" ma:root="true" ma:fieldsID="067b7080d2289f9ba15465beea7d18a8" ns2:_="" ns3:_="">
     <xsd:import namespace="164883f8-7691-4ecf-b54a-664c0d0edefe"/>
@@ -9066,68 +10492,34 @@
 </ct:contentTypeSchema>
 </file>
 
-<file path=customXml/item2.xml><?xml version="1.0" encoding="utf-8"?>
-<b:Sources xmlns:b="http://schemas.openxmlformats.org/officeDocument/2006/bibliography" xmlns="http://schemas.openxmlformats.org/officeDocument/2006/bibliography" SelectedStyle="\APASixthEditionOfficeOnline.xsl" StyleName="APA" Version="6"/>
+<file path=customXml/itemProps1.xml><?xml version="1.0" encoding="utf-8"?>
+<ds:datastoreItem xmlns:ds="http://schemas.openxmlformats.org/officeDocument/2006/customXml" ds:itemID="{D3B4676A-CA48-4E6B-BABE-1535A7A288F6}">
+  <ds:schemaRefs>
+    <ds:schemaRef ds:uri="http://schemas.microsoft.com/office/2006/metadata/properties"/>
+    <ds:schemaRef ds:uri="http://schemas.microsoft.com/office/infopath/2007/PartnerControls"/>
+    <ds:schemaRef ds:uri="85e30bcc-d76c-4413-8e4d-2dce22fb0743"/>
+    <ds:schemaRef ds:uri="164883f8-7691-4ecf-b54a-664c0d0edefe"/>
+  </ds:schemaRefs>
+</ds:datastoreItem>
 </file>
 
-<file path=customXml/item3.xml><?xml version="1.0" encoding="utf-8"?>
-<?mso-contentType ?>
-<FormTemplates xmlns="http://schemas.microsoft.com/sharepoint/v3/contenttype/forms">
-  <Display>DocumentLibraryForm</Display>
-  <Edit>DocumentLibraryForm</Edit>
-  <New>DocumentLibraryForm</New>
-</FormTemplates>
+<file path=customXml/itemProps2.xml><?xml version="1.0" encoding="utf-8"?>
+<ds:datastoreItem xmlns:ds="http://schemas.openxmlformats.org/officeDocument/2006/customXml" ds:itemID="{58AFF83A-2C1F-4B0C-9BCE-EE49F5226348}">
+  <ds:schemaRefs>
+    <ds:schemaRef ds:uri="http://schemas.microsoft.com/sharepoint/v3/contenttype/forms"/>
+  </ds:schemaRefs>
+</ds:datastoreItem>
 </file>
 
-<file path=customXml/item4.xml><?xml version="1.0" encoding="utf-8"?>
-<p:properties xmlns:p="http://schemas.microsoft.com/office/2006/metadata/properties" xmlns:xsi="http://www.w3.org/2001/XMLSchema-instance" xmlns:pc="http://schemas.microsoft.com/office/infopath/2007/PartnerControls">
-  <documentManagement>
-    <SharedWithUsers xmlns="85e30bcc-d76c-4413-8e4d-2dce22fb0743">
-      <UserInfo>
-        <DisplayName>Dario Ernesto Correal Torres</DisplayName>
-        <AccountId>15</AccountId>
-        <AccountType/>
-      </UserInfo>
-      <UserInfo>
-        <DisplayName>Carlos Andres Lozano Garzon</DisplayName>
-        <AccountId>13</AccountId>
-        <AccountType/>
-      </UserInfo>
-      <UserInfo>
-        <DisplayName>Mario  Fernando De la rosa Rosero</DisplayName>
-        <AccountId>16</AccountId>
-        <AccountType/>
-      </UserInfo>
-      <UserInfo>
-        <DisplayName>Arturo Henao Chaparro</DisplayName>
-        <AccountId>48</AccountId>
-        <AccountType/>
-      </UserInfo>
-      <UserInfo>
-        <DisplayName>Luis Esteban Florez Salamanca</DisplayName>
-        <AccountId>33</AccountId>
-        <AccountType/>
-      </UserInfo>
-      <UserInfo>
-        <DisplayName>Christian Camilo Aparicio Baquen</DisplayName>
-        <AccountId>50</AccountId>
-        <AccountType/>
-      </UserInfo>
-      <UserInfo>
-        <DisplayName>Ivan David Salazar Cardenas</DisplayName>
-        <AccountId>52</AccountId>
-        <AccountType/>
-      </UserInfo>
-    </SharedWithUsers>
-    <TaxCatchAll xmlns="85e30bcc-d76c-4413-8e4d-2dce22fb0743" xsi:nil="true"/>
-    <lcf76f155ced4ddcb4097134ff3c332f xmlns="164883f8-7691-4ecf-b54a-664c0d0edefe">
-      <Terms xmlns="http://schemas.microsoft.com/office/infopath/2007/PartnerControls"/>
-    </lcf76f155ced4ddcb4097134ff3c332f>
-  </documentManagement>
-</p:properties>
+<file path=customXml/itemProps3.xml><?xml version="1.0" encoding="utf-8"?>
+<ds:datastoreItem xmlns:ds="http://schemas.openxmlformats.org/officeDocument/2006/customXml" ds:itemID="{794BE61C-5254-4531-868C-EC2590174185}">
+  <ds:schemaRefs>
+    <ds:schemaRef ds:uri="http://schemas.openxmlformats.org/officeDocument/2006/bibliography"/>
+  </ds:schemaRefs>
+</ds:datastoreItem>
 </file>
 
-<file path=customXml/itemProps1.xml><?xml version="1.0" encoding="utf-8"?>
+<file path=customXml/itemProps4.xml><?xml version="1.0" encoding="utf-8"?>
 <ds:datastoreItem xmlns:ds="http://schemas.openxmlformats.org/officeDocument/2006/customXml" ds:itemID="{62F3E371-4CEE-4871-A936-27DA1639FADD}">
   <ds:schemaRefs>
     <ds:schemaRef ds:uri="http://schemas.microsoft.com/office/2006/metadata/contentType"/>
@@ -9144,31 +10536,4 @@
     <ds:schemaRef ds:uri="http://schemas.microsoft.com/internal/obd"/>
   </ds:schemaRefs>
 </ds:datastoreItem>
-</file>
-
-<file path=customXml/itemProps2.xml><?xml version="1.0" encoding="utf-8"?>
-<ds:datastoreItem xmlns:ds="http://schemas.openxmlformats.org/officeDocument/2006/customXml" ds:itemID="{794BE61C-5254-4531-868C-EC2590174185}">
-  <ds:schemaRefs>
-    <ds:schemaRef ds:uri="http://schemas.openxmlformats.org/officeDocument/2006/bibliography"/>
-  </ds:schemaRefs>
-</ds:datastoreItem>
-</file>
-
-<file path=customXml/itemProps3.xml><?xml version="1.0" encoding="utf-8"?>
-<ds:datastoreItem xmlns:ds="http://schemas.openxmlformats.org/officeDocument/2006/customXml" ds:itemID="{58AFF83A-2C1F-4B0C-9BCE-EE49F5226348}">
-  <ds:schemaRefs>
-    <ds:schemaRef ds:uri="http://schemas.microsoft.com/sharepoint/v3/contenttype/forms"/>
-  </ds:schemaRefs>
-</ds:datastoreItem>
-</file>
-
-<file path=customXml/itemProps4.xml><?xml version="1.0" encoding="utf-8"?>
-<ds:datastoreItem xmlns:ds="http://schemas.openxmlformats.org/officeDocument/2006/customXml" ds:itemID="{D3B4676A-CA48-4E6B-BABE-1535A7A288F6}">
-  <ds:schemaRefs>
-    <ds:schemaRef ds:uri="http://schemas.microsoft.com/office/2006/metadata/properties"/>
-    <ds:schemaRef ds:uri="http://schemas.microsoft.com/office/infopath/2007/PartnerControls"/>
-    <ds:schemaRef ds:uri="85e30bcc-d76c-4413-8e4d-2dce22fb0743"/>
-    <ds:schemaRef ds:uri="164883f8-7691-4ecf-b54a-664c0d0edefe"/>
-  </ds:schemaRefs>
-</ds:datastoreItem>
 </file>
</xml_diff>